<commit_message>
docs: cover market demand entry in the member-unit guide
Market demand was the one screen a member unit fills in that the guide skipped.
Adds a section for it — free-text entry rather than figures — and notes that it
is the only entry screen without the Excel import, so nobody goes looking for the
template there.

Re-captures the menu screenshot so all five entry screens are numbered, and
renumbers the Excel section accordingly.

Co-Authored-By: Claude Opus 4.8 <noreply@anthropic.com>
</commit_message>
<xml_diff>
--- a/docs/huong-dan/nhap-lieu-don-vi-thanh-vien/Huong-dan-nhap-lieu-don-vi-thanh-vien.docx
+++ b/docs/huong-dan/nhap-lieu-don-vi-thanh-vien/Huong-dan-nhap-lieu-don-vi-thanh-vien.docx
@@ -16,7 +16,7 @@
         <w:spacing w:after="200"/>
       </w:pPr>
       <w:r>
-        <w:t xml:space="preserve">Tài liệu dành cho cán bộ đơn vị thành viên VRG nhập số liệu hằng ngày trên Hệ thống Dự báo &amp; Quản trị Giá Cao su. Tài khoản đơn vị chỉ thấy và chỉ nhập được số liệu của chính đơn vị mình. Có 4 mục cần nhập: Báo cáo thu mua, Báo cáo tiêu thụ, Báo cáo tồn kho (nhập theo NGÀY) và Kế hoạch năm (nhập 1 lần cho cả năm). Mỗi mục đều có 2 cách nhập: gõ trực tiếp trên màn hình, hoặc tải mẫu Excel về điền rồi nhập lên (xem mục 8).</w:t>
+        <w:t xml:space="preserve">Tài liệu dành cho cán bộ đơn vị thành viên VRG nhập số liệu hằng ngày trên Hệ thống Dự báo &amp; Quản trị Giá Cao su. Tài khoản đơn vị chỉ thấy và chỉ nhập được số liệu của chính đơn vị mình. Có 5 mục cần nhập: Báo cáo thu mua, Báo cáo tiêu thụ, Báo cáo tồn kho và Nhu cầu thị trường (nhập theo NGÀY), cùng Kế hoạch năm (nhập 1 lần cho cả năm). Riêng 4 mục báo cáo còn có thể tải mẫu Excel về điền rồi nhập lên thay vì gõ tay (xem mục 9).</w:t>
       </w:r>
     </w:p>
     <w:p>
@@ -117,7 +117,7 @@
         <w:spacing w:after="100"/>
       </w:pPr>
       <w:r>
-        <w:t xml:space="preserve">Bốn mục cần nhập:</w:t>
+        <w:t xml:space="preserve">Năm mục cần nhập:</w:t>
       </w:r>
     </w:p>
     <w:p>
@@ -247,6 +247,36 @@
           <w:bCs/>
         </w:rPr>
         <w:t xml:space="preserve">nhập 1 lần cho cả năm</w:t>
+      </w:r>
+      <w:r>
+        <w:t xml:space="preserve">.</w:t>
+      </w:r>
+    </w:p>
+    <w:p>
+      <w:pPr>
+        <w:pStyle w:val="ListParagraph"/>
+        <w:numPr>
+          <w:ilvl w:val="0"/>
+          <w:numId w:val="2"/>
+        </w:numPr>
+        <w:spacing w:after="100"/>
+      </w:pPr>
+      <w:r>
+        <w:rPr>
+          <w:b/>
+          <w:bCs/>
+        </w:rPr>
+        <w:t xml:space="preserve">Nhu cầu thị trường</w:t>
+      </w:r>
+      <w:r>
+        <w:t xml:space="preserve"> — ghi nhận nhu cầu/tín hiệu thị trường của đơn vị, nhập </w:t>
+      </w:r>
+      <w:r>
+        <w:rPr>
+          <w:b/>
+          <w:bCs/>
+        </w:rPr>
+        <w:t xml:space="preserve">tự do bằng chữ</w:t>
       </w:r>
       <w:r>
         <w:t xml:space="preserve">.</w:t>
@@ -2121,7 +2151,7 @@
         <w:pageBreakBefore/>
       </w:pPr>
       <w:r>
-        <w:t xml:space="preserve">8. Nhập nhanh bằng Excel (tải mẫu → nhập lên)</w:t>
+        <w:t xml:space="preserve">8. Nhập Nhu cầu thị trường</w:t>
       </w:r>
     </w:p>
     <w:p>
@@ -2136,7 +2166,7 @@
         <w:t xml:space="preserve">Vị trí: </w:t>
       </w:r>
       <w:r>
-        <w:t xml:space="preserve">Có ở cả 4 màn: Báo cáo thu mua / tiêu thụ / tồn kho / Kế hoạch năm</w:t>
+        <w:t xml:space="preserve">Menu → Nhu cầu thị trường</w:t>
       </w:r>
     </w:p>
     <w:p>
@@ -2144,7 +2174,17 @@
         <w:spacing w:after="140"/>
       </w:pPr>
       <w:r>
-        <w:t xml:space="preserve">Khi cần nhập nhiều ngày cùng lúc, nên dùng Excel thay vì gõ từng phiếu. Quy trình 3 bước: tải mẫu → điền ngoại tuyến → nhập lên và xem trước.</w:t>
+        <w:t xml:space="preserve">Mục này ghi lại nhu cầu và tín hiệu thị trường mà đơn vị nắm được: khách hỏi mua, chào giá, đơn hàng sắp ký… Đây là phần nhập </w:t>
+      </w:r>
+      <w:r>
+        <w:rPr>
+          <w:b/>
+          <w:bCs/>
+        </w:rPr>
+        <w:t xml:space="preserve">tự do bằng chữ</w:t>
+      </w:r>
+      <w:r>
+        <w:t xml:space="preserve">, không có ô số liệu, giúp Ban Thị trường Kinh doanh nắm tình hình thực tế tại đơn vị.</w:t>
       </w:r>
     </w:p>
     <w:p>
@@ -2157,7 +2197,7 @@
           <wp:inline distT="0" distB="0" distL="0" distR="0">
             <wp:extent cx="6191250" cy="3714750"/>
             <wp:effectExtent t="0" r="0" b="0" l="0"/>
-            <wp:docPr id="1" name="img" descr="Ảnh hướng dẫn có đánh số bước" title="img/08-import-xem-truoc.png"/>
+            <wp:docPr id="1" name="img" descr="Ảnh hướng dẫn có đánh số bước" title="img/09-nhu-cau-thi-truong.png"/>
             <wp:cNvGraphicFramePr>
               <a:graphicFrameLocks xmlns:a="http://schemas.openxmlformats.org/drawingml/2006/main" noChangeAspect="1"/>
             </wp:cNvGraphicFramePr>
@@ -2206,6 +2246,344 @@
           <w:sz w:val="17"/>
           <w:szCs w:val="17"/>
         </w:rPr>
+        <w:t xml:space="preserve">Hình 9. Nhập Nhu cầu thị trường</w:t>
+      </w:r>
+    </w:p>
+    <w:p>
+      <w:pPr>
+        <w:spacing w:after="80"/>
+      </w:pPr>
+      <w:r>
+        <w:rPr>
+          <w:b/>
+          <w:bCs/>
+        </w:rPr>
+        <w:t xml:space="preserve">Các bước:</w:t>
+      </w:r>
+    </w:p>
+    <w:p>
+      <w:pPr>
+        <w:pStyle w:val="ListParagraph"/>
+        <w:numPr>
+          <w:ilvl w:val="0"/>
+          <w:numId w:val="10"/>
+        </w:numPr>
+        <w:spacing w:after="100"/>
+      </w:pPr>
+      <w:r>
+        <w:t xml:space="preserve">Bấm </w:t>
+      </w:r>
+      <w:r>
+        <w:rPr>
+          <w:b/>
+          <w:bCs/>
+        </w:rPr>
+        <w:t xml:space="preserve">Thêm nhu cầu</w:t>
+      </w:r>
+      <w:r>
+        <w:t xml:space="preserve"> để mở ô nhập.</w:t>
+      </w:r>
+    </w:p>
+    <w:p>
+      <w:pPr>
+        <w:pStyle w:val="ListParagraph"/>
+        <w:numPr>
+          <w:ilvl w:val="0"/>
+          <w:numId w:val="10"/>
+        </w:numPr>
+        <w:spacing w:after="100"/>
+      </w:pPr>
+      <w:r>
+        <w:t xml:space="preserve">Chọn </w:t>
+      </w:r>
+      <w:r>
+        <w:rPr>
+          <w:b/>
+          <w:bCs/>
+        </w:rPr>
+        <w:t xml:space="preserve">ngày</w:t>
+      </w:r>
+      <w:r>
+        <w:t xml:space="preserve"> ghi nhận nhu cầu.</w:t>
+      </w:r>
+    </w:p>
+    <w:p>
+      <w:pPr>
+        <w:pStyle w:val="ListParagraph"/>
+        <w:numPr>
+          <w:ilvl w:val="0"/>
+          <w:numId w:val="10"/>
+        </w:numPr>
+        <w:spacing w:after="100"/>
+      </w:pPr>
+      <w:r>
+        <w:t xml:space="preserve">Chọn </w:t>
+      </w:r>
+      <w:r>
+        <w:rPr>
+          <w:b/>
+          <w:bCs/>
+        </w:rPr>
+        <w:t xml:space="preserve">đơn vị</w:t>
+      </w:r>
+      <w:r>
+        <w:t xml:space="preserve"> (tài khoản chỉ có đơn vị của mình).</w:t>
+      </w:r>
+    </w:p>
+    <w:p>
+      <w:pPr>
+        <w:pStyle w:val="ListParagraph"/>
+        <w:numPr>
+          <w:ilvl w:val="0"/>
+          <w:numId w:val="10"/>
+        </w:numPr>
+        <w:spacing w:after="100"/>
+      </w:pPr>
+      <w:r>
+        <w:t xml:space="preserve">Nhập </w:t>
+      </w:r>
+      <w:r>
+        <w:rPr>
+          <w:b/>
+          <w:bCs/>
+        </w:rPr>
+        <w:t xml:space="preserve">nội dung</w:t>
+      </w:r>
+      <w:r>
+        <w:t xml:space="preserve"> — viết tự do, nên ghi rõ: khách hàng, chủng loại, số lượng, giá chào và thời điểm giao.</w:t>
+      </w:r>
+    </w:p>
+    <w:p>
+      <w:pPr>
+        <w:pStyle w:val="ListParagraph"/>
+        <w:numPr>
+          <w:ilvl w:val="0"/>
+          <w:numId w:val="10"/>
+        </w:numPr>
+        <w:spacing w:after="100"/>
+      </w:pPr>
+      <w:r>
+        <w:t xml:space="preserve">Bấm </w:t>
+      </w:r>
+      <w:r>
+        <w:rPr>
+          <w:b/>
+          <w:bCs/>
+        </w:rPr>
+        <w:t xml:space="preserve">Lưu</w:t>
+      </w:r>
+      <w:r>
+        <w:t xml:space="preserve">.</w:t>
+      </w:r>
+    </w:p>
+    <w:p>
+      <w:pPr>
+        <w:pStyle w:val="ListParagraph"/>
+        <w:numPr>
+          <w:ilvl w:val="0"/>
+          <w:numId w:val="10"/>
+        </w:numPr>
+        <w:spacing w:after="100"/>
+      </w:pPr>
+      <w:r>
+        <w:t xml:space="preserve">Muốn sửa nội dung đã ghi: bấm </w:t>
+      </w:r>
+      <w:r>
+        <w:rPr>
+          <w:b/>
+          <w:bCs/>
+        </w:rPr>
+        <w:t xml:space="preserve">biểu tượng bút</w:t>
+      </w:r>
+      <w:r>
+        <w:t xml:space="preserve"> ở dòng tương ứng trong danh sách bên dưới.</w:t>
+      </w:r>
+    </w:p>
+    <w:p>
+      <w:pPr>
+        <w:spacing w:after="80" w:before="140"/>
+      </w:pPr>
+      <w:r>
+        <w:rPr>
+          <w:b/>
+          <w:bCs/>
+        </w:rPr>
+        <w:t xml:space="preserve">Lưu ý:</w:t>
+      </w:r>
+    </w:p>
+    <w:p>
+      <w:pPr>
+        <w:pStyle w:val="ListParagraph"/>
+        <w:numPr>
+          <w:ilvl w:val="0"/>
+          <w:numId w:val="3"/>
+        </w:numPr>
+        <w:spacing w:after="80"/>
+      </w:pPr>
+      <w:r>
+        <w:t xml:space="preserve">Danh sách bên dưới xếp theo </w:t>
+      </w:r>
+      <w:r>
+        <w:rPr>
+          <w:b/>
+          <w:bCs/>
+        </w:rPr>
+        <w:t xml:space="preserve">dòng thời gian</w:t>
+      </w:r>
+      <w:r>
+        <w:t xml:space="preserve">, chỉ hiện những ngày đã có nhập.</w:t>
+      </w:r>
+    </w:p>
+    <w:p>
+      <w:pPr>
+        <w:pStyle w:val="ListParagraph"/>
+        <w:numPr>
+          <w:ilvl w:val="0"/>
+          <w:numId w:val="3"/>
+        </w:numPr>
+        <w:spacing w:after="80"/>
+      </w:pPr>
+      <w:r>
+        <w:t xml:space="preserve">Mỗi ngày mỗi đơn vị chỉ có </w:t>
+      </w:r>
+      <w:r>
+        <w:rPr>
+          <w:b/>
+          <w:bCs/>
+        </w:rPr>
+        <w:t xml:space="preserve">một nội dung</w:t>
+      </w:r>
+      <w:r>
+        <w:t xml:space="preserve">; nhập lại cho ngày đã có sẽ được nhắc dùng chức năng Sửa.</w:t>
+      </w:r>
+    </w:p>
+    <w:p>
+      <w:pPr>
+        <w:pStyle w:val="ListParagraph"/>
+        <w:numPr>
+          <w:ilvl w:val="0"/>
+          <w:numId w:val="3"/>
+        </w:numPr>
+        <w:spacing w:after="80"/>
+      </w:pPr>
+      <w:r>
+        <w:t xml:space="preserve">Mục này </w:t>
+      </w:r>
+      <w:r>
+        <w:rPr>
+          <w:b/>
+          <w:bCs/>
+        </w:rPr>
+        <w:t xml:space="preserve">không có nhập bằng Excel</w:t>
+      </w:r>
+      <w:r>
+        <w:t xml:space="preserve"> — chỉ nhập trực tiếp trên màn hình.</w:t>
+      </w:r>
+    </w:p>
+    <w:p>
+      <w:pPr>
+        <w:pStyle w:val="ListParagraph"/>
+        <w:numPr>
+          <w:ilvl w:val="0"/>
+          <w:numId w:val="3"/>
+        </w:numPr>
+        <w:spacing w:after="80"/>
+      </w:pPr>
+      <w:r>
+        <w:t xml:space="preserve">Cũng áp dụng cửa sổ thời gian như các báo cáo khác: ngày quá cũ chỉ để xem.</w:t>
+      </w:r>
+    </w:p>
+    <w:p>
+      <w:pPr>
+        <w:pStyle w:val="Heading2"/>
+        <w:pageBreakBefore/>
+      </w:pPr>
+      <w:r>
+        <w:t xml:space="preserve">9. Nhập nhanh bằng Excel (tải mẫu → nhập lên)</w:t>
+      </w:r>
+    </w:p>
+    <w:p>
+      <w:pPr>
+        <w:spacing w:after="60"/>
+      </w:pPr>
+      <w:r>
+        <w:rPr>
+          <w:b/>
+          <w:bCs/>
+        </w:rPr>
+        <w:t xml:space="preserve">Vị trí: </w:t>
+      </w:r>
+      <w:r>
+        <w:t xml:space="preserve">Có ở 4 màn báo cáo: Thu mua / Tiêu thụ / Tồn kho / Kế hoạch năm</w:t>
+      </w:r>
+    </w:p>
+    <w:p>
+      <w:pPr>
+        <w:spacing w:after="140"/>
+      </w:pPr>
+      <w:r>
+        <w:t xml:space="preserve">Khi cần nhập nhiều ngày cùng lúc, nên dùng Excel thay vì gõ từng phiếu. Quy trình 3 bước: tải mẫu → điền ngoại tuyến → nhập lên và xem trước.</w:t>
+      </w:r>
+    </w:p>
+    <w:p>
+      <w:pPr>
+        <w:spacing w:after="60" w:before="60"/>
+        <w:jc w:val="center"/>
+      </w:pPr>
+      <w:r>
+        <w:drawing>
+          <wp:inline distT="0" distB="0" distL="0" distR="0">
+            <wp:extent cx="6191250" cy="3714750"/>
+            <wp:effectExtent t="0" r="0" b="0" l="0"/>
+            <wp:docPr id="1" name="img" descr="Ảnh hướng dẫn có đánh số bước" title="img/08-import-xem-truoc.png"/>
+            <wp:cNvGraphicFramePr>
+              <a:graphicFrameLocks xmlns:a="http://schemas.openxmlformats.org/drawingml/2006/main" noChangeAspect="1"/>
+            </wp:cNvGraphicFramePr>
+            <a:graphic xmlns:a="http://schemas.openxmlformats.org/drawingml/2006/main">
+              <a:graphicData uri="http://schemas.openxmlformats.org/drawingml/2006/picture">
+                <pic:pic xmlns:pic="http://schemas.openxmlformats.org/drawingml/2006/picture">
+                  <pic:nvPicPr>
+                    <pic:cNvPr id="0" name="" descr=""/>
+                    <pic:cNvPicPr>
+                      <a:picLocks noChangeAspect="1" noChangeArrowheads="1"/>
+                    </pic:cNvPicPr>
+                  </pic:nvPicPr>
+                  <pic:blipFill>
+                    <a:blip r:embed="rId16" cstate="none"/>
+                    <a:srcRect/>
+                    <a:stretch>
+                      <a:fillRect/>
+                    </a:stretch>
+                  </pic:blipFill>
+                  <pic:spPr bwMode="auto">
+                    <a:xfrm>
+                      <a:off x="0" y="0"/>
+                      <a:ext cx="6191250" cy="3714750"/>
+                    </a:xfrm>
+                    <a:prstGeom prst="rect">
+                      <a:avLst/>
+                    </a:prstGeom>
+                  </pic:spPr>
+                </pic:pic>
+              </a:graphicData>
+            </a:graphic>
+          </wp:inline>
+        </w:drawing>
+      </w:r>
+    </w:p>
+    <w:p>
+      <w:pPr>
+        <w:spacing w:after="180"/>
+        <w:jc w:val="center"/>
+      </w:pPr>
+      <w:r>
+        <w:rPr>
+          <w:i/>
+          <w:iCs/>
+          <w:color w:val="888888"/>
+          <w:sz w:val="17"/>
+          <w:szCs w:val="17"/>
+        </w:rPr>
         <w:t xml:space="preserve">Hình 8. Bảng xem trước trước khi ghi vào hệ thống</w:t>
       </w:r>
     </w:p>
@@ -2234,7 +2612,7 @@
         <w:pStyle w:val="ListParagraph"/>
         <w:numPr>
           <w:ilvl w:val="0"/>
-          <w:numId w:val="10"/>
+          <w:numId w:val="11"/>
         </w:numPr>
         <w:spacing w:after="100"/>
       </w:pPr>
@@ -2267,7 +2645,7 @@
         <w:pStyle w:val="ListParagraph"/>
         <w:numPr>
           <w:ilvl w:val="0"/>
-          <w:numId w:val="10"/>
+          <w:numId w:val="11"/>
         </w:numPr>
         <w:spacing w:after="100"/>
       </w:pPr>
@@ -2300,7 +2678,7 @@
         <w:pStyle w:val="ListParagraph"/>
         <w:numPr>
           <w:ilvl w:val="0"/>
-          <w:numId w:val="10"/>
+          <w:numId w:val="11"/>
         </w:numPr>
         <w:spacing w:after="100"/>
       </w:pPr>
@@ -2323,7 +2701,7 @@
         <w:pStyle w:val="ListParagraph"/>
         <w:numPr>
           <w:ilvl w:val="0"/>
-          <w:numId w:val="10"/>
+          <w:numId w:val="11"/>
         </w:numPr>
         <w:spacing w:after="100"/>
       </w:pPr>
@@ -2356,7 +2734,7 @@
         <w:pStyle w:val="ListParagraph"/>
         <w:numPr>
           <w:ilvl w:val="0"/>
-          <w:numId w:val="10"/>
+          <w:numId w:val="11"/>
         </w:numPr>
         <w:spacing w:after="100"/>
       </w:pPr>
@@ -2389,7 +2767,7 @@
         <w:pStyle w:val="ListParagraph"/>
         <w:numPr>
           <w:ilvl w:val="0"/>
-          <w:numId w:val="10"/>
+          <w:numId w:val="11"/>
         </w:numPr>
         <w:spacing w:after="100"/>
       </w:pPr>
@@ -2837,6 +3215,18 @@
     <w:multiLevelType w:val="hybridMultilevel"/>
     <w:lvl w:ilvl="0" w15:tentative="1">
       <w:start w:val="1"/>
+      <w:numFmt w:val="decimal"/>
+      <w:lvlText w:val="%1."/>
+      <w:lvlJc w:val="left"/>
+      <w:pPr>
+        <w:ind w:left="620" w:hanging="360"/>
+      </w:pPr>
+    </w:lvl>
+  </w:abstractNum>
+  <w:abstractNum w:abstractNumId="11" w15:restartNumberingAfterBreak="0">
+    <w:multiLevelType w:val="hybridMultilevel"/>
+    <w:lvl w:ilvl="0" w15:tentative="1">
+      <w:start w:val="1"/>
       <w:numFmt w:val="bullet"/>
       <w:lvlText w:val="•"/>
       <w:lvlJc w:val="left"/>
@@ -2858,7 +3248,7 @@
     </w:lvlOverride>
   </w:num>
   <w:num w:numId="3">
-    <w:abstractNumId w:val="10"/>
+    <w:abstractNumId w:val="11"/>
     <w:lvlOverride w:ilvl="0">
       <w:startOverride w:val="1"/>
     </w:lvlOverride>
@@ -2901,6 +3291,12 @@
   </w:num>
   <w:num w:numId="10">
     <w:abstractNumId w:val="9"/>
+    <w:lvlOverride w:ilvl="0">
+      <w:startOverride w:val="1"/>
+    </w:lvlOverride>
+  </w:num>
+  <w:num w:numId="11">
+    <w:abstractNumId w:val="10"/>
     <w:lvlOverride w:ilvl="0">
       <w:startOverride w:val="1"/>
     </w:lvlOverride>

</xml_diff>

<commit_message>
docs: update the member-unit guide for the 0.2.69 entry screens
Covers the TSC/DRC basis on cup latex, the VND/USD choice with its exchange
rate, the invoice date and contract attachment on each sale line, and the
four stock blocks measured in tonnes with the copy-yesterday button.

Also warns that the Excel templates changed columns, so units must download
them again rather than reuse an older file.
</commit_message>
<xml_diff>
--- a/docs/huong-dan/nhap-lieu-don-vi-thanh-vien/Huong-dan-nhap-lieu-don-vi-thanh-vien.docx
+++ b/docs/huong-dan/nhap-lieu-don-vi-thanh-vien/Huong-dan-nhap-lieu-don-vi-thanh-vien.docx
@@ -16,7 +16,7 @@
         <w:spacing w:after="200"/>
       </w:pPr>
       <w:r>
-        <w:t xml:space="preserve">Tài liệu dành cho cán bộ đơn vị thành viên VRG nhập số liệu hằng ngày trên Hệ thống Dự báo &amp; Quản trị Giá Cao su. Tài khoản đơn vị chỉ thấy và chỉ nhập được số liệu của chính đơn vị mình. Có 5 mục cần nhập: Báo cáo thu mua, Báo cáo tiêu thụ, Báo cáo tồn kho và Nhu cầu thị trường (nhập theo NGÀY), cùng Kế hoạch năm (nhập 1 lần cho cả năm). Riêng 4 mục báo cáo còn có thể tải mẫu Excel về điền rồi nhập lên thay vì gõ tay (xem mục 9).</w:t>
+        <w:t xml:space="preserve">Tài liệu dành cho cán bộ đơn vị thành viên VRG nhập số liệu hằng ngày trên Hệ thống Dự báo &amp; Quản trị Giá Cao su. Tài khoản đơn vị chỉ thấy và chỉ nhập được số liệu của chính đơn vị mình. Có 5 mục cần nhập: Báo cáo thu mua, Báo cáo tiêu thụ, Báo cáo tồn kho và Nhu cầu thị trường (nhập theo NGÀY), cùng Kế hoạch năm (nhập 1 lần cho cả năm). Tài liệu bám theo phiên bản 0.2.69. Riêng 4 mục báo cáo còn có thể tải mẫu Excel về điền rồi nhập lên thay vì gõ tay (xem mục 9).</w:t>
       </w:r>
     </w:p>
     <w:p>
@@ -580,7 +580,7 @@
         <w:spacing w:after="140"/>
       </w:pPr>
       <w:r>
-        <w:t xml:space="preserve">Áp dụng cho các đơn vị tại Việt Nam (giao dịch bằng đồng Việt Nam). Phiếu chia theo loại mủ: mỗi loại nhập sản lượng và đơn giá đi liền nhau.</w:t>
+        <w:t xml:space="preserve">Áp dụng cho các đơn vị tại Việt Nam (giao dịch bằng đồng Việt Nam). Phiếu chia theo loại mủ: mỗi loại nhập sản lượng và đơn giá đi liền nhau. Riêng mủ chén phải chọn đơn giá tính theo độ TSC hay độ DRC trước khi nhập giá.</w:t>
       </w:r>
     </w:p>
     <w:p>
@@ -754,10 +754,30 @@
           <w:b/>
           <w:bCs/>
         </w:rPr>
+        <w:t xml:space="preserve">Mủ chén — Đơn giá tính theo</w:t>
+      </w:r>
+      <w:r>
+        <w:t xml:space="preserve">: chọn *Độ TSC* hoặc *Độ DRC* theo cách đơn vị đang tính.</w:t>
+      </w:r>
+    </w:p>
+    <w:p>
+      <w:pPr>
+        <w:pStyle w:val="ListParagraph"/>
+        <w:numPr>
+          <w:ilvl w:val="0"/>
+          <w:numId w:val="5"/>
+        </w:numPr>
+        <w:spacing w:after="100"/>
+      </w:pPr>
+      <w:r>
+        <w:rPr>
+          <w:b/>
+          <w:bCs/>
+        </w:rPr>
         <w:t xml:space="preserve">Mủ chén — Đơn giá thu mua</w:t>
       </w:r>
       <w:r>
-        <w:t xml:space="preserve"> (đồng/độ TSC).</w:t>
+        <w:t xml:space="preserve">: nhãn ô này đổi theo bước 5 (*đồng/độ TSC* hoặc *đồng/độ DRC*).</w:t>
       </w:r>
     </w:p>
     <w:p>
@@ -797,20 +817,7 @@
         <w:t xml:space="preserve">Doanh thu</w:t>
       </w:r>
       <w:r>
-        <w:t xml:space="preserve"> (tỷ đồng) — doanh thu đã xuất hóa đơn.</w:t>
-      </w:r>
-    </w:p>
-    <w:p>
-      <w:pPr>
-        <w:pStyle w:val="ListParagraph"/>
-        <w:numPr>
-          <w:ilvl w:val="0"/>
-          <w:numId w:val="5"/>
-        </w:numPr>
-        <w:spacing w:after="100"/>
-      </w:pPr>
-      <w:r>
-        <w:t xml:space="preserve">Bấm </w:t>
+        <w:t xml:space="preserve"> (tỷ đồng) — doanh thu đã xuất hóa đơn. Xong bấm </w:t>
       </w:r>
       <w:r>
         <w:rPr>
@@ -878,7 +885,30 @@
         <w:spacing w:after="80"/>
       </w:pPr>
       <w:r>
-        <w:t xml:space="preserve">Đơn giá nhập ở đây đồng thời được ghi vào kho “Giá mủ nguyên liệu”, không phải nhập lại ở nơi khác.</w:t>
+        <w:t xml:space="preserve">Đơn giá nhập ở đây đồng thời được ghi vào kho “Giá mủ nguyên liệu”, không phải nhập lại ở nơi khác. Đơn vị tính (TSC hay DRC) được lưu kèm giá nên về sau vẫn biết giá đó tính theo độ nào.</w:t>
+      </w:r>
+    </w:p>
+    <w:p>
+      <w:pPr>
+        <w:pStyle w:val="ListParagraph"/>
+        <w:numPr>
+          <w:ilvl w:val="0"/>
+          <w:numId w:val="3"/>
+        </w:numPr>
+        <w:spacing w:after="80"/>
+      </w:pPr>
+      <w:r>
+        <w:t xml:space="preserve">Mủ nước luôn tính theo </w:t>
+      </w:r>
+      <w:r>
+        <w:rPr>
+          <w:b/>
+          <w:bCs/>
+        </w:rPr>
+        <w:t xml:space="preserve">độ TSC</w:t>
+      </w:r>
+      <w:r>
+        <w:t xml:space="preserve"> — chỉ mủ chén mới có lựa chọn TSC/DRC.</w:t>
       </w:r>
     </w:p>
     <w:p>
@@ -1012,7 +1042,7 @@
         <w:t xml:space="preserve">Đơn giá thu mua theo nội tệ</w:t>
       </w:r>
       <w:r>
-        <w:t xml:space="preserve"> (LAK/độ TSC) — nhập giá mua thực tế tại nước sở tại.</w:t>
+        <w:t xml:space="preserve"> (LAK/KHR trên độ) — nhập giá mua thực tế tại nước sở tại.</w:t>
       </w:r>
     </w:p>
     <w:p>
@@ -1029,20 +1059,10 @@
           <w:b/>
           <w:bCs/>
         </w:rPr>
-        <w:t xml:space="preserve">Đơn giá quy ra đồng</w:t>
-      </w:r>
-      <w:r>
-        <w:t xml:space="preserve"> (đồng/độ TSC) — hệ thống </w:t>
-      </w:r>
-      <w:r>
-        <w:rPr>
-          <w:b/>
-          <w:bCs/>
-        </w:rPr>
-        <w:t xml:space="preserve">tự quy đổi</w:t>
-      </w:r>
-      <w:r>
-        <w:t xml:space="preserve">, chỉ để xem.</w:t>
+        <w:t xml:space="preserve">Mủ chén — Đơn giá tính theo</w:t>
+      </w:r>
+      <w:r>
+        <w:t xml:space="preserve">: chọn *Độ TSC* hoặc *Độ DRC* (giống đơn vị trong nước).</w:t>
       </w:r>
     </w:p>
     <w:p>
@@ -1062,7 +1082,7 @@
         <w:t xml:space="preserve">Tỷ giá thu mua</w:t>
       </w:r>
       <w:r>
-        <w:t xml:space="preserve"> (1 LAK = ? VND) — dùng để quy đổi đơn giá ở bước 2.</w:t>
+        <w:t xml:space="preserve"> (1 nội tệ = ? VND) — dùng để quy đơn giá về đồng.</w:t>
       </w:r>
     </w:p>
     <w:p>
@@ -1102,7 +1122,7 @@
         <w:t xml:space="preserve">Tỷ giá USD</w:t>
       </w:r>
       <w:r>
-        <w:t xml:space="preserve"> (1 USD = ? VND) — dùng để quy đổi doanh thu.</w:t>
+        <w:t xml:space="preserve"> (1 USD = ? VND) — dùng để quy doanh thu về đồng.</w:t>
       </w:r>
     </w:p>
     <w:p>
@@ -1127,36 +1147,6 @@
     </w:p>
     <w:p>
       <w:pPr>
-        <w:pStyle w:val="ListParagraph"/>
-        <w:numPr>
-          <w:ilvl w:val="0"/>
-          <w:numId w:val="6"/>
-        </w:numPr>
-        <w:spacing w:after="100"/>
-      </w:pPr>
-      <w:r>
-        <w:rPr>
-          <w:b/>
-          <w:bCs/>
-        </w:rPr>
-        <w:t xml:space="preserve">Doanh thu quy ra tỷ đồng</w:t>
-      </w:r>
-      <w:r>
-        <w:t xml:space="preserve"> — hệ thống </w:t>
-      </w:r>
-      <w:r>
-        <w:rPr>
-          <w:b/>
-          <w:bCs/>
-        </w:rPr>
-        <w:t xml:space="preserve">tự quy đổi</w:t>
-      </w:r>
-      <w:r>
-        <w:t xml:space="preserve">, đây là số dùng cho báo cáo.</w:t>
-      </w:r>
-    </w:p>
-    <w:p>
-      <w:pPr>
         <w:spacing w:after="80" w:before="140"/>
       </w:pPr>
       <w:r>
@@ -1188,6 +1178,39 @@
       </w:r>
       <w:r>
         <w:t xml:space="preserve">: tỷ giá nội tệ dùng cho đơn giá thu mua, tỷ giá USD dùng cho doanh thu.</w:t>
+      </w:r>
+    </w:p>
+    <w:p>
+      <w:pPr>
+        <w:pStyle w:val="ListParagraph"/>
+        <w:numPr>
+          <w:ilvl w:val="0"/>
+          <w:numId w:val="3"/>
+        </w:numPr>
+        <w:spacing w:after="80"/>
+      </w:pPr>
+      <w:r>
+        <w:t xml:space="preserve">Các ô nền xám (</w:t>
+      </w:r>
+      <w:r>
+        <w:rPr>
+          <w:b/>
+          <w:bCs/>
+        </w:rPr>
+        <w:t xml:space="preserve">đơn giá quy ra đồng</w:t>
+      </w:r>
+      <w:r>
+        <w:t xml:space="preserve">, </w:t>
+      </w:r>
+      <w:r>
+        <w:rPr>
+          <w:b/>
+          <w:bCs/>
+        </w:rPr>
+        <w:t xml:space="preserve">doanh thu quy ra tỷ đồng</w:t>
+      </w:r>
+      <w:r>
+        <w:t xml:space="preserve">) là hệ thống tự quy đổi, chỉ để xem.</w:t>
       </w:r>
     </w:p>
     <w:p>
@@ -1255,7 +1278,7 @@
         <w:spacing w:after="140"/>
       </w:pPr>
       <w:r>
-        <w:t xml:space="preserve">Mỗi hợp đồng bán là một dòng. Trong ngày bán bao nhiêu hợp đồng thì thêm bấy nhiêu dòng, hệ thống tự cộng lại.</w:t>
+        <w:t xml:space="preserve">Mỗi hợp đồng bán là một dòng. Trong ngày bán bao nhiêu hợp đồng thì thêm bấy nhiêu dòng, hệ thống tự cộng lại. Mỗi dòng ghi kèm ngày xuất hoá đơn và file bộ Hợp đồng.</w:t>
       </w:r>
     </w:p>
     <w:p>
@@ -1342,14 +1365,31 @@
         <w:spacing w:after="100"/>
       </w:pPr>
       <w:r>
-        <w:t xml:space="preserve">Đang ở tab </w:t>
-      </w:r>
-      <w:r>
-        <w:rPr>
-          <w:b/>
-          <w:bCs/>
-        </w:rPr>
-        <w:t xml:space="preserve">Tiêu thụ</w:t>
+        <w:rPr>
+          <w:b/>
+          <w:bCs/>
+        </w:rPr>
+        <w:t xml:space="preserve">Loại HĐ</w:t>
+      </w:r>
+      <w:r>
+        <w:t xml:space="preserve"> (Dài hạn / Chuyến) · </w:t>
+      </w:r>
+      <w:r>
+        <w:rPr>
+          <w:b/>
+          <w:bCs/>
+        </w:rPr>
+        <w:t xml:space="preserve">Hình thức</w:t>
+      </w:r>
+      <w:r>
+        <w:t xml:space="preserve"> (XK-UTXK / Nội tiêu) · </w:t>
+      </w:r>
+      <w:r>
+        <w:rPr>
+          <w:b/>
+          <w:bCs/>
+        </w:rPr>
+        <w:t xml:space="preserve">Loại mủ</w:t>
       </w:r>
       <w:r>
         <w:t xml:space="preserve">.</w:t>
@@ -1369,10 +1409,10 @@
           <w:b/>
           <w:bCs/>
         </w:rPr>
-        <w:t xml:space="preserve">Loại HĐ</w:t>
-      </w:r>
-      <w:r>
-        <w:t xml:space="preserve"> — chọn Dài hạn hoặc Chuyến.</w:t>
+        <w:t xml:space="preserve">SL (tấn)</w:t>
+      </w:r>
+      <w:r>
+        <w:t xml:space="preserve"> — số lượng bán của dòng này.</w:t>
       </w:r>
     </w:p>
     <w:p>
@@ -1389,10 +1429,10 @@
           <w:b/>
           <w:bCs/>
         </w:rPr>
-        <w:t xml:space="preserve">Hình thức</w:t>
-      </w:r>
-      <w:r>
-        <w:t xml:space="preserve"> — chọn XK / UTXK hoặc Nội tiêu.</w:t>
+        <w:t xml:space="preserve">Giá bán</w:t>
+      </w:r>
+      <w:r>
+        <w:t xml:space="preserve"> — đơn vị tính theo loại tiền chọn ở bước 7 (triệu đ/tấn hoặc USD/tấn).</w:t>
       </w:r>
     </w:p>
     <w:p>
@@ -1409,10 +1449,10 @@
           <w:b/>
           <w:bCs/>
         </w:rPr>
-        <w:t xml:space="preserve">Loại mủ</w:t>
-      </w:r>
-      <w:r>
-        <w:t xml:space="preserve"> — chọn chủng loại bán.</w:t>
+        <w:t xml:space="preserve">Ngày xuất hoá đơn</w:t>
+      </w:r>
+      <w:r>
+        <w:t xml:space="preserve"> — ngày hoá đơn của dòng bán này; chưa xuất thì để trống.</w:t>
       </w:r>
     </w:p>
     <w:p>
@@ -1429,10 +1469,10 @@
           <w:b/>
           <w:bCs/>
         </w:rPr>
-        <w:t xml:space="preserve">SL (tấn)</w:t>
-      </w:r>
-      <w:r>
-        <w:t xml:space="preserve"> — số lượng bán của dòng này.</w:t>
+        <w:t xml:space="preserve">Bộ Hợp đồng</w:t>
+      </w:r>
+      <w:r>
+        <w:t xml:space="preserve"> — bấm *Chọn* để đính kèm file (PDF hoặc ảnh); bấm vào tên file để mở lại.</w:t>
       </w:r>
     </w:p>
     <w:p>
@@ -1449,10 +1489,10 @@
           <w:b/>
           <w:bCs/>
         </w:rPr>
-        <w:t xml:space="preserve">Giá bán</w:t>
-      </w:r>
-      <w:r>
-        <w:t xml:space="preserve"> — đơn vị trong nước nhập triệu đ/tấn; đơn vị nước ngoài nhập USD/tấn.</w:t>
+        <w:t xml:space="preserve">Thêm dòng</w:t>
+      </w:r>
+      <w:r>
+        <w:t xml:space="preserve"> nếu trong ngày có nhiều hợp đồng.</w:t>
       </w:r>
     </w:p>
     <w:p>
@@ -1465,17 +1505,24 @@
         <w:spacing w:after="100"/>
       </w:pPr>
       <w:r>
-        <w:t xml:space="preserve">Bấm </w:t>
-      </w:r>
-      <w:r>
-        <w:rPr>
-          <w:b/>
-          <w:bCs/>
-        </w:rPr>
-        <w:t xml:space="preserve">Thêm dòng</w:t>
-      </w:r>
-      <w:r>
-        <w:t xml:space="preserve"> nếu trong ngày có nhiều hợp đồng, rồi </w:t>
+        <w:rPr>
+          <w:b/>
+          <w:bCs/>
+        </w:rPr>
+        <w:t xml:space="preserve">Giá bán nhập bằng</w:t>
+      </w:r>
+      <w:r>
+        <w:t xml:space="preserve"> — chọn *VND* hoặc *USD*. Chọn USD thì hiện thêm ô </w:t>
+      </w:r>
+      <w:r>
+        <w:rPr>
+          <w:b/>
+          <w:bCs/>
+        </w:rPr>
+        <w:t xml:space="preserve">Tỷ giá</w:t>
+      </w:r>
+      <w:r>
+        <w:t xml:space="preserve"> (có nút lấy tỷ giá Vietcombank). Xong bấm </w:t>
       </w:r>
       <w:r>
         <w:rPr>
@@ -1530,7 +1577,7 @@
         <w:t xml:space="preserve">Tổng hợp tiêu thụ</w:t>
       </w:r>
       <w:r>
-        <w:t xml:space="preserve"> (tổng tiêu thụ, tổng XK, tổng nội tiêu, giá bán bình quân…) đều </w:t>
+        <w:t xml:space="preserve"> đều </w:t>
       </w:r>
       <w:r>
         <w:rPr>
@@ -1541,6 +1588,52 @@
       </w:r>
       <w:r>
         <w:t xml:space="preserve"> — không nhập tay.</w:t>
+      </w:r>
+    </w:p>
+    <w:p>
+      <w:pPr>
+        <w:pStyle w:val="ListParagraph"/>
+        <w:numPr>
+          <w:ilvl w:val="0"/>
+          <w:numId w:val="3"/>
+        </w:numPr>
+        <w:spacing w:after="80"/>
+      </w:pPr>
+      <w:r>
+        <w:t xml:space="preserve">Chọn USD mà </w:t>
+      </w:r>
+      <w:r>
+        <w:rPr>
+          <w:b/>
+          <w:bCs/>
+        </w:rPr>
+        <w:t xml:space="preserve">chưa nhập tỷ giá</w:t>
+      </w:r>
+      <w:r>
+        <w:t xml:space="preserve"> thì doanh thu để trống, hệ thống không tự đoán tỷ giá.</w:t>
+      </w:r>
+    </w:p>
+    <w:p>
+      <w:pPr>
+        <w:pStyle w:val="ListParagraph"/>
+        <w:numPr>
+          <w:ilvl w:val="0"/>
+          <w:numId w:val="3"/>
+        </w:numPr>
+        <w:spacing w:after="80"/>
+      </w:pPr>
+      <w:r>
+        <w:t xml:space="preserve">Loại tiền áp cho </w:t>
+      </w:r>
+      <w:r>
+        <w:rPr>
+          <w:b/>
+          <w:bCs/>
+        </w:rPr>
+        <w:t xml:space="preserve">cả phiếu</w:t>
+      </w:r>
+      <w:r>
+        <w:t xml:space="preserve">, không phải từng dòng — trong ngày có cả bán USD lẫn VNĐ thì nhập thành 2 ngày phiếu hoặc quy về một loại tiền.</w:t>
       </w:r>
     </w:p>
     <w:p>
@@ -1585,7 +1678,27 @@
         <w:spacing w:after="140"/>
       </w:pPr>
       <w:r>
-        <w:t xml:space="preserve">Tồn kho là số liệu tại thời điểm cuối ngày, tách thành hai bảng theo tình trạng hợp đồng.</w:t>
+        <w:t xml:space="preserve">Tồn kho là số liệu </w:t>
+      </w:r>
+      <w:r>
+        <w:rPr>
+          <w:b/>
+          <w:bCs/>
+        </w:rPr>
+        <w:t xml:space="preserve">tại thời điểm cuối ngày</w:t>
+      </w:r>
+      <w:r>
+        <w:t xml:space="preserve"> (không cộng dồn giữa các ngày), đơn vị tính là </w:t>
+      </w:r>
+      <w:r>
+        <w:rPr>
+          <w:b/>
+          <w:bCs/>
+        </w:rPr>
+        <w:t xml:space="preserve">tấn</w:t>
+      </w:r>
+      <w:r>
+        <w:t xml:space="preserve">. Phiếu chia thành 4 khối theo tình trạng hàng.</w:t>
       </w:r>
     </w:p>
     <w:p>
@@ -1652,6 +1765,14 @@
     </w:p>
     <w:p>
       <w:pPr>
+        <w:spacing w:after="100"/>
+      </w:pPr>
+      <w:r>
+        <w:t xml:space="preserve">Bốn khối tồn kho:</w:t>
+      </w:r>
+    </w:p>
+    <w:p>
+      <w:pPr>
         <w:spacing w:after="80"/>
       </w:pPr>
       <w:r>
@@ -1672,14 +1793,81 @@
         <w:spacing w:after="100"/>
       </w:pPr>
       <w:r>
-        <w:t xml:space="preserve">Chuyển sang tab </w:t>
-      </w:r>
-      <w:r>
-        <w:rPr>
-          <w:b/>
-          <w:bCs/>
-        </w:rPr>
-        <w:t xml:space="preserve">Tồn kho</w:t>
+        <w:rPr>
+          <w:b/>
+          <w:bCs/>
+        </w:rPr>
+        <w:t xml:space="preserve">Lấy tồn ngày trước</w:t>
+      </w:r>
+      <w:r>
+        <w:t xml:space="preserve"> — chép toàn bộ tồn kho của ngày gần nhất sang, rồi sửa lại cho đúng ngày này.</w:t>
+      </w:r>
+    </w:p>
+    <w:p>
+      <w:pPr>
+        <w:pStyle w:val="ListParagraph"/>
+        <w:numPr>
+          <w:ilvl w:val="0"/>
+          <w:numId w:val="8"/>
+        </w:numPr>
+        <w:spacing w:after="100"/>
+      </w:pPr>
+      <w:r>
+        <w:rPr>
+          <w:b/>
+          <w:bCs/>
+        </w:rPr>
+        <w:t xml:space="preserve">1. Tồn kho thành phẩm chế biến chưa nhập kho</w:t>
+      </w:r>
+      <w:r>
+        <w:t xml:space="preserve"> — chủng loại + số lượng (tấn).</w:t>
+      </w:r>
+    </w:p>
+    <w:p>
+      <w:pPr>
+        <w:pStyle w:val="ListParagraph"/>
+        <w:numPr>
+          <w:ilvl w:val="0"/>
+          <w:numId w:val="8"/>
+        </w:numPr>
+        <w:spacing w:after="100"/>
+      </w:pPr>
+      <w:r>
+        <w:rPr>
+          <w:b/>
+          <w:bCs/>
+        </w:rPr>
+        <w:t xml:space="preserve">2. Tồn kho thành phẩm đã nhập kho</w:t>
+      </w:r>
+      <w:r>
+        <w:t xml:space="preserve"> — chủng loại + số lượng (tấn).</w:t>
+      </w:r>
+    </w:p>
+    <w:p>
+      <w:pPr>
+        <w:pStyle w:val="ListParagraph"/>
+        <w:numPr>
+          <w:ilvl w:val="0"/>
+          <w:numId w:val="8"/>
+        </w:numPr>
+        <w:spacing w:after="100"/>
+      </w:pPr>
+      <w:r>
+        <w:rPr>
+          <w:b/>
+          <w:bCs/>
+        </w:rPr>
+        <w:t xml:space="preserve">3. Số lượng đã ký hợp đồng chưa giao</w:t>
+      </w:r>
+      <w:r>
+        <w:t xml:space="preserve"> — thêm đơn giá, lịch giao và </w:t>
+      </w:r>
+      <w:r>
+        <w:rPr>
+          <w:b/>
+          <w:bCs/>
+        </w:rPr>
+        <w:t xml:space="preserve">file Hợp đồng đã ký scan có đóng dấu</w:t>
       </w:r>
       <w:r>
         <w:t xml:space="preserve">.</w:t>
@@ -1695,17 +1883,14 @@
         <w:spacing w:after="100"/>
       </w:pPr>
       <w:r>
-        <w:t xml:space="preserve">Bảng </w:t>
-      </w:r>
-      <w:r>
-        <w:rPr>
-          <w:b/>
-          <w:bCs/>
-        </w:rPr>
-        <w:t xml:space="preserve">CHƯA có hợp đồng</w:t>
-      </w:r>
-      <w:r>
-        <w:t xml:space="preserve"> — mỗi dòng: chủng loại, loại bành, số lượng (kg).</w:t>
+        <w:rPr>
+          <w:b/>
+          <w:bCs/>
+        </w:rPr>
+        <w:t xml:space="preserve">Đơn giá nhập bằng</w:t>
+      </w:r>
+      <w:r>
+        <w:t xml:space="preserve"> — chọn *VND* hoặc *USD* cho đơn giá ở khối 3 (chọn USD thì hiện ô tỷ giá).</w:t>
       </w:r>
     </w:p>
     <w:p>
@@ -1718,47 +1903,21 @@
         <w:spacing w:after="100"/>
       </w:pPr>
       <w:r>
-        <w:t xml:space="preserve">Bấm </w:t>
-      </w:r>
-      <w:r>
-        <w:rPr>
-          <w:b/>
-          <w:bCs/>
-        </w:rPr>
-        <w:t xml:space="preserve">Thêm dòng</w:t>
-      </w:r>
-      <w:r>
-        <w:t xml:space="preserve"> để khai thêm chủng loại.</w:t>
-      </w:r>
-    </w:p>
-    <w:p>
-      <w:pPr>
-        <w:pStyle w:val="ListParagraph"/>
-        <w:numPr>
-          <w:ilvl w:val="0"/>
-          <w:numId w:val="8"/>
-        </w:numPr>
-        <w:spacing w:after="100"/>
-      </w:pPr>
-      <w:r>
-        <w:t xml:space="preserve">Bảng </w:t>
-      </w:r>
-      <w:r>
-        <w:rPr>
-          <w:b/>
-          <w:bCs/>
-        </w:rPr>
-        <w:t xml:space="preserve">ĐÃ có hợp đồng</w:t>
-      </w:r>
-      <w:r>
-        <w:t xml:space="preserve"> — mỗi dòng khai chi tiết hơn: chủng loại, số lượng, đơn giá, lịch giao và </w:t>
-      </w:r>
-      <w:r>
-        <w:rPr>
-          <w:b/>
-          <w:bCs/>
-        </w:rPr>
-        <w:t xml:space="preserve">đính kèm file hợp đồng</w:t>
+        <w:rPr>
+          <w:b/>
+          <w:bCs/>
+        </w:rPr>
+        <w:t xml:space="preserve">4. Tồn kho nguyên liệu chưa sản xuất</w:t>
+      </w:r>
+      <w:r>
+        <w:t xml:space="preserve"> — 1 ô số lượng (tấn). Xong bấm </w:t>
+      </w:r>
+      <w:r>
+        <w:rPr>
+          <w:b/>
+          <w:bCs/>
+        </w:rPr>
+        <w:t xml:space="preserve">Lưu số liệu</w:t>
       </w:r>
       <w:r>
         <w:t xml:space="preserve">.</w:t>
@@ -1766,39 +1925,6 @@
     </w:p>
     <w:p>
       <w:pPr>
-        <w:pStyle w:val="ListParagraph"/>
-        <w:numPr>
-          <w:ilvl w:val="0"/>
-          <w:numId w:val="8"/>
-        </w:numPr>
-        <w:spacing w:after="100"/>
-      </w:pPr>
-      <w:r>
-        <w:t xml:space="preserve">Bấm </w:t>
-      </w:r>
-      <w:r>
-        <w:rPr>
-          <w:b/>
-          <w:bCs/>
-        </w:rPr>
-        <w:t xml:space="preserve">Thêm dòng</w:t>
-      </w:r>
-      <w:r>
-        <w:t xml:space="preserve"> rồi </w:t>
-      </w:r>
-      <w:r>
-        <w:rPr>
-          <w:b/>
-          <w:bCs/>
-        </w:rPr>
-        <w:t xml:space="preserve">Lưu số liệu</w:t>
-      </w:r>
-      <w:r>
-        <w:t xml:space="preserve">.</w:t>
-      </w:r>
-    </w:p>
-    <w:p>
-      <w:pPr>
         <w:spacing w:after="80" w:before="140"/>
       </w:pPr>
       <w:r>
@@ -1826,10 +1952,76 @@
           <w:b/>
           <w:bCs/>
         </w:rPr>
+        <w:t xml:space="preserve">4</w:t>
+      </w:r>
+      <w:r>
+        <w:t xml:space="preserve"> chỉ hiện với </w:t>
+      </w:r>
+      <w:r>
+        <w:rPr>
+          <w:b/>
+          <w:bCs/>
+        </w:rPr>
+        <w:t xml:space="preserve">đơn vị chưa có nhà máy chế biến</w:t>
+      </w:r>
+      <w:r>
+        <w:t xml:space="preserve">. Đơn vị có nhà máy sẽ không thấy khối này — nếu đơn vị mình cần nhập mà không thấy, báo quản trị viên đặt lại ở mục *Đơn vị thành viên*.</w:t>
+      </w:r>
+    </w:p>
+    <w:p>
+      <w:pPr>
+        <w:pStyle w:val="ListParagraph"/>
+        <w:numPr>
+          <w:ilvl w:val="0"/>
+          <w:numId w:val="3"/>
+        </w:numPr>
+        <w:spacing w:after="80"/>
+      </w:pPr>
+      <w:r>
+        <w:t xml:space="preserve">Nút </w:t>
+      </w:r>
+      <w:r>
+        <w:rPr>
+          <w:b/>
+          <w:bCs/>
+        </w:rPr>
+        <w:t xml:space="preserve">Lấy tồn ngày trước</w:t>
+      </w:r>
+      <w:r>
+        <w:t xml:space="preserve"> chỉ chép </w:t>
+      </w:r>
+      <w:r>
+        <w:rPr>
+          <w:b/>
+          <w:bCs/>
+        </w:rPr>
+        <w:t xml:space="preserve">tồn kho</w:t>
+      </w:r>
+      <w:r>
+        <w:t xml:space="preserve">, KHÔNG chép các dòng bán ở tab Tiêu thụ — vì tiêu thụ là số phát sinh trong ngày, chép sang sẽ thành khai khống.</w:t>
+      </w:r>
+    </w:p>
+    <w:p>
+      <w:pPr>
+        <w:pStyle w:val="ListParagraph"/>
+        <w:numPr>
+          <w:ilvl w:val="0"/>
+          <w:numId w:val="3"/>
+        </w:numPr>
+        <w:spacing w:after="80"/>
+      </w:pPr>
+      <w:r>
+        <w:t xml:space="preserve">Khối </w:t>
+      </w:r>
+      <w:r>
+        <w:rPr>
+          <w:b/>
+          <w:bCs/>
+        </w:rPr>
         <w:t xml:space="preserve">Tổng hợp tồn kho</w:t>
       </w:r>
       <w:r>
-        <w:t xml:space="preserve"> ở cuối phiếu tự cộng, không nhập tay.</w:t>
+        <w:t xml:space="preserve"> tự tính: *Tồn kho thành phẩm* = khối 1 + khối 2.</w:t>
       </w:r>
     </w:p>
     <w:p>
@@ -1842,50 +2034,27 @@
         <w:spacing w:after="80"/>
       </w:pPr>
       <w:r>
-        <w:t xml:space="preserve">Ô </w:t>
-      </w:r>
-      <w:r>
-        <w:rPr>
-          <w:b/>
-          <w:bCs/>
-        </w:rPr>
-        <w:t xml:space="preserve">Tồn kho nguyên liệu</w:t>
-      </w:r>
-      <w:r>
-        <w:t xml:space="preserve"> chỉ hiện với đơn vị </w:t>
-      </w:r>
-      <w:r>
-        <w:rPr>
-          <w:b/>
-          <w:bCs/>
-        </w:rPr>
-        <w:t xml:space="preserve">chưa có nhà máy chế biến</w:t>
-      </w:r>
-      <w:r>
-        <w:t xml:space="preserve">. Nếu đơn vị anh/chị có nhà máy thì không thấy ô này — đó là đúng.</w:t>
-      </w:r>
-    </w:p>
-    <w:p>
-      <w:pPr>
-        <w:pStyle w:val="ListParagraph"/>
-        <w:numPr>
-          <w:ilvl w:val="0"/>
-          <w:numId w:val="3"/>
-        </w:numPr>
-        <w:spacing w:after="80"/>
-      </w:pPr>
-      <w:r>
-        <w:t xml:space="preserve">File hợp đồng nhận định dạng PDF hoặc ảnh; bấm </w:t>
-      </w:r>
-      <w:r>
-        <w:rPr>
-          <w:b/>
-          <w:bCs/>
-        </w:rPr>
-        <w:t xml:space="preserve">Chọn</w:t>
-      </w:r>
-      <w:r>
-        <w:t xml:space="preserve"> để tải lên.</w:t>
+        <w:t xml:space="preserve">Chủng loại tách theo từng loại giống bảng Giá sàn Tập đoàn — </w:t>
+      </w:r>
+      <w:r>
+        <w:rPr>
+          <w:b/>
+          <w:bCs/>
+        </w:rPr>
+        <w:t xml:space="preserve">SVR CV 50</w:t>
+      </w:r>
+      <w:r>
+        <w:t xml:space="preserve"> và </w:t>
+      </w:r>
+      <w:r>
+        <w:rPr>
+          <w:b/>
+          <w:bCs/>
+        </w:rPr>
+        <w:t xml:space="preserve">SVR CV60</w:t>
+      </w:r>
+      <w:r>
+        <w:t xml:space="preserve"> là 2 loại riêng.</w:t>
       </w:r>
     </w:p>
     <w:p>
@@ -2864,6 +3033,92 @@
       </w:pPr>
       <w:r>
         <w:t xml:space="preserve">Nhập Tiêu thụ không làm mất số Tồn kho của cùng ngày và ngược lại.</w:t>
+      </w:r>
+    </w:p>
+    <w:p>
+      <w:pPr>
+        <w:pStyle w:val="ListParagraph"/>
+        <w:numPr>
+          <w:ilvl w:val="0"/>
+          <w:numId w:val="3"/>
+        </w:numPr>
+        <w:spacing w:after="80"/>
+      </w:pPr>
+      <w:r>
+        <w:rPr>
+          <w:b/>
+          <w:bCs/>
+        </w:rPr>
+        <w:t xml:space="preserve">Mẫu Excel đã đổi cột ở bản mới</w:t>
+      </w:r>
+      <w:r>
+        <w:t xml:space="preserve"> — luôn bấm *Tải mẫu Excel* để lấy file mới nhất, đừng dùng lại file mẫu tải từ trước (sai cột sẽ báo lỗi khi nhập lên).</w:t>
+      </w:r>
+    </w:p>
+    <w:p>
+      <w:pPr>
+        <w:pStyle w:val="ListParagraph"/>
+        <w:numPr>
+          <w:ilvl w:val="0"/>
+          <w:numId w:val="3"/>
+        </w:numPr>
+        <w:spacing w:after="80"/>
+      </w:pPr>
+      <w:r>
+        <w:t xml:space="preserve">Mẫu </w:t>
+      </w:r>
+      <w:r>
+        <w:rPr>
+          <w:b/>
+          <w:bCs/>
+        </w:rPr>
+        <w:t xml:space="preserve">Tồn kho</w:t>
+      </w:r>
+      <w:r>
+        <w:t xml:space="preserve"> có cột *Nhóm* với 3 lựa chọn: Chế biến chưa nhập kho · Đã nhập kho · Đã ký HĐ chưa giao. Số lượng tính bằng </w:t>
+      </w:r>
+      <w:r>
+        <w:rPr>
+          <w:b/>
+          <w:bCs/>
+        </w:rPr>
+        <w:t xml:space="preserve">tấn</w:t>
+      </w:r>
+      <w:r>
+        <w:t xml:space="preserve">.</w:t>
+      </w:r>
+    </w:p>
+    <w:p>
+      <w:pPr>
+        <w:pStyle w:val="ListParagraph"/>
+        <w:numPr>
+          <w:ilvl w:val="0"/>
+          <w:numId w:val="3"/>
+        </w:numPr>
+        <w:spacing w:after="80"/>
+      </w:pPr>
+      <w:r>
+        <w:t xml:space="preserve">Mẫu </w:t>
+      </w:r>
+      <w:r>
+        <w:rPr>
+          <w:b/>
+          <w:bCs/>
+        </w:rPr>
+        <w:t xml:space="preserve">Tiêu thụ</w:t>
+      </w:r>
+      <w:r>
+        <w:t xml:space="preserve"> có thêm cột *Ngày xuất hoá đơn*. Riêng </w:t>
+      </w:r>
+      <w:r>
+        <w:rPr>
+          <w:b/>
+          <w:bCs/>
+        </w:rPr>
+        <w:t xml:space="preserve">file bộ Hợp đồng phải đính kèm trên web</w:t>
+      </w:r>
+      <w:r>
+        <w:t xml:space="preserve"> — file Excel không mang theo file đính kèm được.</w:t>
       </w:r>
     </w:p>
     <w:sectPr>

</xml_diff>

<commit_message>
docs: correct the member guide for the 0.2.71 stock and Excel changes
The guide still told units that the raw-material block only appears for sites
without a processing plant and to ask an admin if they could not see it — it
now shows for everyone, so that instruction would have sent people chasing a
setting that no longer exists.

Also documents the three new template dropdowns (TSC/DRC basis, sale currency,
stock-price currency) and that signed-undelivered contracts stand outside
finished stock, so signing more than is on hand is not an error.
</commit_message>
<xml_diff>
--- a/docs/huong-dan/nhap-lieu-don-vi-thanh-vien/Huong-dan-nhap-lieu-don-vi-thanh-vien.docx
+++ b/docs/huong-dan/nhap-lieu-don-vi-thanh-vien/Huong-dan-nhap-lieu-don-vi-thanh-vien.docx
@@ -16,7 +16,7 @@
         <w:spacing w:after="200"/>
       </w:pPr>
       <w:r>
-        <w:t xml:space="preserve">Tài liệu dành cho cán bộ đơn vị thành viên VRG nhập số liệu hằng ngày trên Hệ thống Dự báo &amp; Quản trị Giá Cao su. Tài khoản đơn vị chỉ thấy và chỉ nhập được số liệu của chính đơn vị mình. Có 5 mục cần nhập: Báo cáo thu mua, Báo cáo tiêu thụ, Báo cáo tồn kho và Nhu cầu thị trường (nhập theo NGÀY), cùng Kế hoạch năm (nhập 1 lần cho cả năm). Tài liệu bám theo phiên bản 0.2.69. Riêng 4 mục báo cáo còn có thể tải mẫu Excel về điền rồi nhập lên thay vì gõ tay (xem mục 9).</w:t>
+        <w:t xml:space="preserve">Tài liệu dành cho cán bộ đơn vị thành viên VRG nhập số liệu hằng ngày trên Hệ thống Dự báo &amp; Quản trị Giá Cao su. Tài khoản đơn vị chỉ thấy và chỉ nhập được số liệu của chính đơn vị mình. Có 5 mục cần nhập: Báo cáo thu mua, Báo cáo tiêu thụ, Báo cáo tồn kho và Nhu cầu thị trường (nhập theo NGÀY), cùng Kế hoạch năm (nhập 1 lần cho cả năm). Tài liệu bám theo phiên bản 0.2.71. Riêng 4 mục báo cáo còn có thể tải mẫu Excel về điền rồi nhập lên thay vì gõ tay (xem mục 9).</w:t>
       </w:r>
     </w:p>
     <w:p>
@@ -1955,17 +1955,27 @@
         <w:t xml:space="preserve">4</w:t>
       </w:r>
       <w:r>
-        <w:t xml:space="preserve"> chỉ hiện với </w:t>
-      </w:r>
-      <w:r>
-        <w:rPr>
-          <w:b/>
-          <w:bCs/>
-        </w:rPr>
-        <w:t xml:space="preserve">đơn vị chưa có nhà máy chế biến</w:t>
-      </w:r>
-      <w:r>
-        <w:t xml:space="preserve">. Đơn vị có nhà máy sẽ không thấy khối này — nếu đơn vị mình cần nhập mà không thấy, báo quản trị viên đặt lại ở mục *Đơn vị thành viên*.</w:t>
+        <w:t xml:space="preserve"> hiện với </w:t>
+      </w:r>
+      <w:r>
+        <w:rPr>
+          <w:b/>
+          <w:bCs/>
+        </w:rPr>
+        <w:t xml:space="preserve">mọi đơn vị</w:t>
+      </w:r>
+      <w:r>
+        <w:t xml:space="preserve">. Câu “đối với các đơn vị chưa có nhà máy chế biến” là ghi chú của biểu mẫu cho biết ai thường có số này — đơn vị đã có nhà máy cứ </w:t>
+      </w:r>
+      <w:r>
+        <w:rPr>
+          <w:b/>
+          <w:bCs/>
+        </w:rPr>
+        <w:t xml:space="preserve">để trống ô đó</w:t>
+      </w:r>
+      <w:r>
+        <w:t xml:space="preserve">.</w:t>
       </w:r>
     </w:p>
     <w:p>
@@ -2021,7 +2031,27 @@
         <w:t xml:space="preserve">Tổng hợp tồn kho</w:t>
       </w:r>
       <w:r>
-        <w:t xml:space="preserve"> tự tính: *Tồn kho thành phẩm* = khối 1 + khối 2.</w:t>
+        <w:t xml:space="preserve"> tự tính: *Tồn kho thành phẩm* = khối 1 + khối 2. Khối 3 (</w:t>
+      </w:r>
+      <w:r>
+        <w:rPr>
+          <w:b/>
+          <w:bCs/>
+        </w:rPr>
+        <w:t xml:space="preserve">đã ký HĐ chưa giao</w:t>
+      </w:r>
+      <w:r>
+        <w:t xml:space="preserve">) là </w:t>
+      </w:r>
+      <w:r>
+        <w:rPr>
+          <w:b/>
+          <w:bCs/>
+        </w:rPr>
+        <w:t xml:space="preserve">cam kết giao hàng</w:t>
+      </w:r>
+      <w:r>
+        <w:t xml:space="preserve">, đứng riêng — không cộng vào và không trừ khỏi tồn kho thành phẩm, nên ký nhiều hơn lượng đang có cũng không sao.</w:t>
       </w:r>
     </w:p>
     <w:p>
@@ -2691,7 +2721,17 @@
         <w:spacing w:after="140"/>
       </w:pPr>
       <w:r>
-        <w:t xml:space="preserve">Khi cần nhập nhiều ngày cùng lúc, nên dùng Excel thay vì gõ từng phiếu. Quy trình 3 bước: tải mẫu → điền ngoại tuyến → nhập lên và xem trước.</w:t>
+        <w:t xml:space="preserve">Thay vì gõ tay từng ngày, có thể tải file Excel mẫu về điền rồi nhập lên. Hệ thống đọc file và cho </w:t>
+      </w:r>
+      <w:r>
+        <w:rPr>
+          <w:b/>
+          <w:bCs/>
+        </w:rPr>
+        <w:t xml:space="preserve">xem trước</w:t>
+      </w:r>
+      <w:r>
+        <w:t xml:space="preserve"> — dòng nào sai sẽ chỉ rõ sai ở đâu, chỉ những dòng hợp lệ mới được ghi.</w:t>
       </w:r>
     </w:p>
     <w:p>
@@ -2753,7 +2793,7 @@
           <w:sz w:val="17"/>
           <w:szCs w:val="17"/>
         </w:rPr>
-        <w:t xml:space="preserve">Hình 8. Bảng xem trước trước khi ghi vào hệ thống</w:t>
+        <w:t xml:space="preserve">Hình 9. Bảng xem trước trước khi ghi</w:t>
       </w:r>
     </w:p>
     <w:p>
@@ -2786,6 +2826,125 @@
         <w:spacing w:after="100"/>
       </w:pPr>
       <w:r>
+        <w:rPr>
+          <w:b/>
+          <w:bCs/>
+        </w:rPr>
+        <w:t xml:space="preserve">Tải mẫu Excel</w:t>
+      </w:r>
+      <w:r>
+        <w:t xml:space="preserve"> ở màn danh sách → điền số vào file (mỗi biểu một mẫu riêng).</w:t>
+      </w:r>
+    </w:p>
+    <w:p>
+      <w:pPr>
+        <w:pStyle w:val="ListParagraph"/>
+        <w:numPr>
+          <w:ilvl w:val="0"/>
+          <w:numId w:val="11"/>
+        </w:numPr>
+        <w:spacing w:after="100"/>
+      </w:pPr>
+      <w:r>
+        <w:rPr>
+          <w:b/>
+          <w:bCs/>
+        </w:rPr>
+        <w:t xml:space="preserve">Nhập từ Excel</w:t>
+      </w:r>
+      <w:r>
+        <w:t xml:space="preserve"> → chọn file vừa điền, hệ thống mở bảng </w:t>
+      </w:r>
+      <w:r>
+        <w:rPr>
+          <w:b/>
+          <w:bCs/>
+        </w:rPr>
+        <w:t xml:space="preserve">xem trước</w:t>
+      </w:r>
+      <w:r>
+        <w:t xml:space="preserve">.</w:t>
+      </w:r>
+    </w:p>
+    <w:p>
+      <w:pPr>
+        <w:pStyle w:val="ListParagraph"/>
+        <w:numPr>
+          <w:ilvl w:val="0"/>
+          <w:numId w:val="11"/>
+        </w:numPr>
+        <w:spacing w:after="100"/>
+      </w:pPr>
+      <w:r>
+        <w:t xml:space="preserve">Dòng tóm tắt cho biết đọc được bao nhiêu dòng, </w:t>
+      </w:r>
+      <w:r>
+        <w:rPr>
+          <w:b/>
+          <w:bCs/>
+        </w:rPr>
+        <w:t xml:space="preserve">bao nhiêu hợp lệ / bao nhiêu lỗi</w:t>
+      </w:r>
+      <w:r>
+        <w:t xml:space="preserve">.</w:t>
+      </w:r>
+    </w:p>
+    <w:p>
+      <w:pPr>
+        <w:pStyle w:val="ListParagraph"/>
+        <w:numPr>
+          <w:ilvl w:val="0"/>
+          <w:numId w:val="11"/>
+        </w:numPr>
+        <w:spacing w:after="100"/>
+      </w:pPr>
+      <w:r>
+        <w:t xml:space="preserve">Các cột </w:t>
+      </w:r>
+      <w:r>
+        <w:rPr>
+          <w:b/>
+          <w:bCs/>
+        </w:rPr>
+        <w:t xml:space="preserve">chọn từ danh sách</w:t>
+      </w:r>
+      <w:r>
+        <w:t xml:space="preserve"> (vd *Đơn giá mủ chén tính theo*) hiện đúng giá trị đã điền — để trống thì hệ thống dùng mặc định ghi ngay trên tiêu đề cột.</w:t>
+      </w:r>
+    </w:p>
+    <w:p>
+      <w:pPr>
+        <w:pStyle w:val="ListParagraph"/>
+        <w:numPr>
+          <w:ilvl w:val="0"/>
+          <w:numId w:val="11"/>
+        </w:numPr>
+        <w:spacing w:after="100"/>
+      </w:pPr>
+      <w:r>
+        <w:t xml:space="preserve">Cột </w:t>
+      </w:r>
+      <w:r>
+        <w:rPr>
+          <w:b/>
+          <w:bCs/>
+        </w:rPr>
+        <w:t xml:space="preserve">Ghi chú</w:t>
+      </w:r>
+      <w:r>
+        <w:t xml:space="preserve"> nói rõ dòng lỗi sai ở đâu (vd *Ngày: ngày không hợp lệ*).</w:t>
+      </w:r>
+    </w:p>
+    <w:p>
+      <w:pPr>
+        <w:pStyle w:val="ListParagraph"/>
+        <w:numPr>
+          <w:ilvl w:val="0"/>
+          <w:numId w:val="11"/>
+        </w:numPr>
+        <w:spacing w:after="100"/>
+      </w:pPr>
+      <w:r>
         <w:t xml:space="preserve">Bấm </w:t>
       </w:r>
       <w:r>
@@ -2793,165 +2952,10 @@
           <w:b/>
           <w:bCs/>
         </w:rPr>
-        <w:t xml:space="preserve">Tải mẫu Excel</w:t>
-      </w:r>
-      <w:r>
-        <w:t xml:space="preserve"> ở màn tương ứng, mở file và điền số liệu. Cột tô đỏ là </w:t>
-      </w:r>
-      <w:r>
-        <w:rPr>
-          <w:b/>
-          <w:bCs/>
-        </w:rPr>
-        <w:t xml:space="preserve">bắt buộc</w:t>
-      </w:r>
-      <w:r>
-        <w:t xml:space="preserve">; các ô Đơn vị / Loại HĐ / Chủng loại có sẵn danh sách chọn.</w:t>
-      </w:r>
-    </w:p>
-    <w:p>
-      <w:pPr>
-        <w:pStyle w:val="ListParagraph"/>
-        <w:numPr>
-          <w:ilvl w:val="0"/>
-          <w:numId w:val="11"/>
-        </w:numPr>
-        <w:spacing w:after="100"/>
-      </w:pPr>
-      <w:r>
-        <w:t xml:space="preserve">Bấm </w:t>
-      </w:r>
-      <w:r>
-        <w:rPr>
-          <w:b/>
-          <w:bCs/>
-        </w:rPr>
-        <w:t xml:space="preserve">Nhập từ Excel</w:t>
-      </w:r>
-      <w:r>
-        <w:t xml:space="preserve"> và chọn file vừa điền. Hệ thống đọc file và hiện </w:t>
-      </w:r>
-      <w:r>
-        <w:rPr>
-          <w:b/>
-          <w:bCs/>
-        </w:rPr>
-        <w:t xml:space="preserve">bảng xem trước</w:t>
-      </w:r>
-      <w:r>
-        <w:t xml:space="preserve"> — chưa ghi gì.</w:t>
-      </w:r>
-    </w:p>
-    <w:p>
-      <w:pPr>
-        <w:pStyle w:val="ListParagraph"/>
-        <w:numPr>
-          <w:ilvl w:val="0"/>
-          <w:numId w:val="11"/>
-        </w:numPr>
-        <w:spacing w:after="100"/>
-      </w:pPr>
-      <w:r>
-        <w:t xml:space="preserve">Đọc dòng tóm tắt: </w:t>
-      </w:r>
-      <w:r>
-        <w:rPr>
-          <w:b/>
-          <w:bCs/>
-        </w:rPr>
-        <w:t xml:space="preserve">số dòng hợp lệ và số dòng lỗi</w:t>
-      </w:r>
-      <w:r>
-        <w:t xml:space="preserve">.</w:t>
-      </w:r>
-    </w:p>
-    <w:p>
-      <w:pPr>
-        <w:pStyle w:val="ListParagraph"/>
-        <w:numPr>
-          <w:ilvl w:val="0"/>
-          <w:numId w:val="11"/>
-        </w:numPr>
-        <w:spacing w:after="100"/>
-      </w:pPr>
-      <w:r>
-        <w:t xml:space="preserve">Dòng ghi </w:t>
-      </w:r>
-      <w:r>
-        <w:rPr>
-          <w:b/>
-          <w:bCs/>
-        </w:rPr>
-        <w:t xml:space="preserve">“Tạo mới”</w:t>
-      </w:r>
-      <w:r>
-        <w:t xml:space="preserve"> là ngày chưa có số liệu; dòng ghi </w:t>
-      </w:r>
-      <w:r>
-        <w:rPr>
-          <w:b/>
-          <w:bCs/>
-        </w:rPr>
-        <w:t xml:space="preserve">“Ghi đè”</w:t>
-      </w:r>
-      <w:r>
-        <w:t xml:space="preserve"> sẽ thay số đã có của ngày đó.</w:t>
-      </w:r>
-    </w:p>
-    <w:p>
-      <w:pPr>
-        <w:pStyle w:val="ListParagraph"/>
-        <w:numPr>
-          <w:ilvl w:val="0"/>
-          <w:numId w:val="11"/>
-        </w:numPr>
-        <w:spacing w:after="100"/>
-      </w:pPr>
-      <w:r>
-        <w:t xml:space="preserve">Dòng nền đỏ ghi </w:t>
-      </w:r>
-      <w:r>
-        <w:rPr>
-          <w:b/>
-          <w:bCs/>
-        </w:rPr>
-        <w:t xml:space="preserve">“Lỗi”</w:t>
-      </w:r>
-      <w:r>
-        <w:t xml:space="preserve"> kèm lý do ở cột Ghi chú (ví dụ ngày sai định dạng). Các dòng này </w:t>
-      </w:r>
-      <w:r>
-        <w:rPr>
-          <w:b/>
-          <w:bCs/>
-        </w:rPr>
-        <w:t xml:space="preserve">sẽ bị bỏ qua</w:t>
-      </w:r>
-      <w:r>
-        <w:t xml:space="preserve">.</w:t>
-      </w:r>
-    </w:p>
-    <w:p>
-      <w:pPr>
-        <w:pStyle w:val="ListParagraph"/>
-        <w:numPr>
-          <w:ilvl w:val="0"/>
-          <w:numId w:val="11"/>
-        </w:numPr>
-        <w:spacing w:after="100"/>
-      </w:pPr>
-      <w:r>
-        <w:t xml:space="preserve">Bấm </w:t>
-      </w:r>
-      <w:r>
-        <w:rPr>
-          <w:b/>
-          <w:bCs/>
-        </w:rPr>
-        <w:t xml:space="preserve">Xác nhận ghi</w:t>
-      </w:r>
-      <w:r>
-        <w:t xml:space="preserve"> để lưu các dòng hợp lệ vào hệ thống.</w:t>
+        <w:t xml:space="preserve">Xác nhận ghi N dòng</w:t>
+      </w:r>
+      <w:r>
+        <w:t xml:space="preserve"> — chỉ ghi các dòng hợp lệ, dòng lỗi bị bỏ qua.</w:t>
       </w:r>
     </w:p>
     <w:p>
@@ -3049,10 +3053,10 @@
           <w:b/>
           <w:bCs/>
         </w:rPr>
-        <w:t xml:space="preserve">Mẫu Excel đã đổi cột ở bản mới</w:t>
-      </w:r>
-      <w:r>
-        <w:t xml:space="preserve"> — luôn bấm *Tải mẫu Excel* để lấy file mới nhất, đừng dùng lại file mẫu tải từ trước (sai cột sẽ báo lỗi khi nhập lên).</w:t>
+        <w:t xml:space="preserve">Mẫu Excel đã đổi cột</w:t>
+      </w:r>
+      <w:r>
+        <w:t xml:space="preserve"> — luôn bấm *Tải mẫu Excel* để lấy file mới nhất, đừng dùng lại file tải từ trước (sai cột sẽ báo lỗi khi nhập lên).</w:t>
       </w:r>
     </w:p>
     <w:p>
@@ -3065,6 +3069,59 @@
         <w:spacing w:after="80"/>
       </w:pPr>
       <w:r>
+        <w:t xml:space="preserve">Ba cột </w:t>
+      </w:r>
+      <w:r>
+        <w:rPr>
+          <w:b/>
+          <w:bCs/>
+        </w:rPr>
+        <w:t xml:space="preserve">chọn từ danh sách</w:t>
+      </w:r>
+      <w:r>
+        <w:t xml:space="preserve"> mới có, phải điền đúng thì số mới vào đúng đơn vị tính: *Đơn giá mủ chén tính theo* (Độ TSC / Độ DRC) ở mẫu </w:t>
+      </w:r>
+      <w:r>
+        <w:rPr>
+          <w:b/>
+          <w:bCs/>
+        </w:rPr>
+        <w:t xml:space="preserve">Thu mua</w:t>
+      </w:r>
+      <w:r>
+        <w:t xml:space="preserve">; *Giá bán bằng* (VND / USD) ở mẫu </w:t>
+      </w:r>
+      <w:r>
+        <w:rPr>
+          <w:b/>
+          <w:bCs/>
+        </w:rPr>
+        <w:t xml:space="preserve">Tiêu thụ</w:t>
+      </w:r>
+      <w:r>
+        <w:t xml:space="preserve">; *Đơn giá bằng* (VND / USD) ở mẫu </w:t>
+      </w:r>
+      <w:r>
+        <w:rPr>
+          <w:b/>
+          <w:bCs/>
+        </w:rPr>
+        <w:t xml:space="preserve">Tồn kho</w:t>
+      </w:r>
+      <w:r>
+        <w:t xml:space="preserve">. Bỏ trống thì hệ thống hiểu là Độ TSC và VND.</w:t>
+      </w:r>
+    </w:p>
+    <w:p>
+      <w:pPr>
+        <w:pStyle w:val="ListParagraph"/>
+        <w:numPr>
+          <w:ilvl w:val="0"/>
+          <w:numId w:val="3"/>
+        </w:numPr>
+        <w:spacing w:after="80"/>
+      </w:pPr>
+      <w:r>
         <w:t xml:space="preserve">Mẫu </w:t>
       </w:r>
       <w:r>
@@ -3075,7 +3132,7 @@
         <w:t xml:space="preserve">Tồn kho</w:t>
       </w:r>
       <w:r>
-        <w:t xml:space="preserve"> có cột *Nhóm* với 3 lựa chọn: Chế biến chưa nhập kho · Đã nhập kho · Đã ký HĐ chưa giao. Số lượng tính bằng </w:t>
+        <w:t xml:space="preserve">: cột *Nhóm* có 3 lựa chọn — Chế biến chưa nhập kho · Đã nhập kho · Đã ký HĐ chưa giao. Số lượng tính bằng </w:t>
       </w:r>
       <w:r>
         <w:rPr>
@@ -3085,7 +3142,7 @@
         <w:t xml:space="preserve">tấn</w:t>
       </w:r>
       <w:r>
-        <w:t xml:space="preserve">.</w:t>
+        <w:t xml:space="preserve">. Riêng *Tồn kho nguyên liệu chưa sản xuất* là cột cuối, điền ở 1 dòng bất kỳ của ngày đó.</w:t>
       </w:r>
     </w:p>
     <w:p>
@@ -3108,7 +3165,7 @@
         <w:t xml:space="preserve">Tiêu thụ</w:t>
       </w:r>
       <w:r>
-        <w:t xml:space="preserve"> có thêm cột *Ngày xuất hoá đơn*. Riêng </w:t>
+        <w:t xml:space="preserve"> có cột *Ngày xuất hoá đơn*. Riêng </w:t>
       </w:r>
       <w:r>
         <w:rPr>

</xml_diff>

<commit_message>
docs: cover per-line currency, demand content, and the no-purchase day
Explains the distinction that matters most for reporting: a day with published
prices but nothing bought is entered as zero tonnes against that price, while a
day with no buying organised is ticked instead — and the two are counted
differently in the roll-up.

Also documents currency and rate now sitting on each sale line, and spells out
what belongs in market demand: offers from customers and producers.
</commit_message>
<xml_diff>
--- a/docs/huong-dan/nhap-lieu-don-vi-thanh-vien/Huong-dan-nhap-lieu-don-vi-thanh-vien.docx
+++ b/docs/huong-dan/nhap-lieu-don-vi-thanh-vien/Huong-dan-nhap-lieu-don-vi-thanh-vien.docx
@@ -16,7 +16,7 @@
         <w:spacing w:after="200"/>
       </w:pPr>
       <w:r>
-        <w:t xml:space="preserve">Tài liệu dành cho cán bộ đơn vị thành viên VRG nhập số liệu hằng ngày trên Hệ thống Dự báo &amp; Quản trị Giá Cao su. Tài khoản đơn vị chỉ thấy và chỉ nhập được số liệu của chính đơn vị mình. Có 5 mục cần nhập: Báo cáo thu mua, Báo cáo tiêu thụ, Báo cáo tồn kho và Nhu cầu thị trường (nhập theo NGÀY), cùng Kế hoạch năm (nhập 1 lần cho cả năm). Tài liệu bám theo phiên bản 0.2.71. Riêng 4 mục báo cáo còn có thể tải mẫu Excel về điền rồi nhập lên thay vì gõ tay (xem mục 9).</w:t>
+        <w:t xml:space="preserve">Tài liệu dành cho cán bộ đơn vị thành viên VRG nhập số liệu hằng ngày trên Hệ thống Dự báo &amp; Quản trị Giá Cao su. Tài khoản đơn vị chỉ thấy và chỉ nhập được số liệu của chính đơn vị mình. Có 5 mục cần nhập: Báo cáo thu mua, Báo cáo tiêu thụ, Báo cáo tồn kho và Nhu cầu thị trường (nhập theo NGÀY), cùng Kế hoạch năm (nhập 1 lần cho cả năm). Tài liệu bám theo phiên bản 0.2.72. Riêng 4 mục báo cáo còn có thể tải mẫu Excel về điền rồi nhập lên thay vì gõ tay (xem mục 9).</w:t>
       </w:r>
     </w:p>
     <w:p>
@@ -580,7 +580,17 @@
         <w:spacing w:after="140"/>
       </w:pPr>
       <w:r>
-        <w:t xml:space="preserve">Áp dụng cho các đơn vị tại Việt Nam (giao dịch bằng đồng Việt Nam). Phiếu chia theo loại mủ: mỗi loại nhập sản lượng và đơn giá đi liền nhau. Riêng mủ chén phải chọn đơn giá tính theo độ TSC hay độ DRC trước khi nhập giá.</w:t>
+        <w:t xml:space="preserve">Áp dụng cho các đơn vị tại Việt Nam (giao dịch bằng đồng Việt Nam). Trước khi nhập số, xác định rõ hôm nay đơn vị </w:t>
+      </w:r>
+      <w:r>
+        <w:rPr>
+          <w:b/>
+          <w:bCs/>
+        </w:rPr>
+        <w:t xml:space="preserve">có tổ chức thu mua hay không</w:t>
+      </w:r>
+      <w:r>
+        <w:t xml:space="preserve"> — hai trường hợp ghi khác nhau.</w:t>
       </w:r>
     </w:p>
     <w:p>
@@ -667,14 +677,134 @@
         <w:spacing w:after="100"/>
       </w:pPr>
       <w:r>
-        <w:t xml:space="preserve">Chọn </w:t>
-      </w:r>
-      <w:r>
-        <w:rPr>
-          <w:b/>
-          <w:bCs/>
-        </w:rPr>
-        <w:t xml:space="preserve">ngày báo cáo</w:t>
+        <w:rPr>
+          <w:b/>
+          <w:bCs/>
+        </w:rPr>
+        <w:t xml:space="preserve">Hôm nay đơn vị KHÔNG tổ chức thu mua</w:t>
+      </w:r>
+      <w:r>
+        <w:t xml:space="preserve"> — chỉ tích ô này khi thật sự không tổ chức mua.</w:t>
+      </w:r>
+    </w:p>
+    <w:p>
+      <w:pPr>
+        <w:pStyle w:val="ListParagraph"/>
+        <w:numPr>
+          <w:ilvl w:val="0"/>
+          <w:numId w:val="5"/>
+        </w:numPr>
+        <w:spacing w:after="100"/>
+      </w:pPr>
+      <w:r>
+        <w:rPr>
+          <w:b/>
+          <w:bCs/>
+        </w:rPr>
+        <w:t xml:space="preserve">Mủ nước — Sản lượng thu mua</w:t>
+      </w:r>
+      <w:r>
+        <w:t xml:space="preserve"> (tấn, quy khô).</w:t>
+      </w:r>
+    </w:p>
+    <w:p>
+      <w:pPr>
+        <w:pStyle w:val="ListParagraph"/>
+        <w:numPr>
+          <w:ilvl w:val="0"/>
+          <w:numId w:val="5"/>
+        </w:numPr>
+        <w:spacing w:after="100"/>
+      </w:pPr>
+      <w:r>
+        <w:rPr>
+          <w:b/>
+          <w:bCs/>
+        </w:rPr>
+        <w:t xml:space="preserve">Mủ nước — Đơn giá thu mua</w:t>
+      </w:r>
+      <w:r>
+        <w:t xml:space="preserve"> (đồng/độ TSC).</w:t>
+      </w:r>
+    </w:p>
+    <w:p>
+      <w:pPr>
+        <w:pStyle w:val="ListParagraph"/>
+        <w:numPr>
+          <w:ilvl w:val="0"/>
+          <w:numId w:val="5"/>
+        </w:numPr>
+        <w:spacing w:after="100"/>
+      </w:pPr>
+      <w:r>
+        <w:rPr>
+          <w:b/>
+          <w:bCs/>
+        </w:rPr>
+        <w:t xml:space="preserve">Mủ chén — Đơn giá tính theo</w:t>
+      </w:r>
+      <w:r>
+        <w:t xml:space="preserve">: chọn *Độ TSC* hoặc *Độ DRC* theo cách đơn vị đang tính.</w:t>
+      </w:r>
+    </w:p>
+    <w:p>
+      <w:pPr>
+        <w:pStyle w:val="ListParagraph"/>
+        <w:numPr>
+          <w:ilvl w:val="0"/>
+          <w:numId w:val="5"/>
+        </w:numPr>
+        <w:spacing w:after="100"/>
+      </w:pPr>
+      <w:r>
+        <w:rPr>
+          <w:b/>
+          <w:bCs/>
+        </w:rPr>
+        <w:t xml:space="preserve">Mủ chén — Đơn giá thu mua</w:t>
+      </w:r>
+      <w:r>
+        <w:t xml:space="preserve">: nhãn ô đổi theo lựa chọn ở bước 4.</w:t>
+      </w:r>
+    </w:p>
+    <w:p>
+      <w:pPr>
+        <w:pStyle w:val="ListParagraph"/>
+        <w:numPr>
+          <w:ilvl w:val="0"/>
+          <w:numId w:val="5"/>
+        </w:numPr>
+        <w:spacing w:after="100"/>
+      </w:pPr>
+      <w:r>
+        <w:t xml:space="preserve">Nhập nốt </w:t>
+      </w:r>
+      <w:r>
+        <w:rPr>
+          <w:b/>
+          <w:bCs/>
+        </w:rPr>
+        <w:t xml:space="preserve">Sản lượng tiêu thụ</w:t>
+      </w:r>
+      <w:r>
+        <w:t xml:space="preserve"> và </w:t>
+      </w:r>
+      <w:r>
+        <w:rPr>
+          <w:b/>
+          <w:bCs/>
+        </w:rPr>
+        <w:t xml:space="preserve">Doanh thu</w:t>
+      </w:r>
+      <w:r>
+        <w:t xml:space="preserve">, rồi bấm </w:t>
+      </w:r>
+      <w:r>
+        <w:rPr>
+          <w:b/>
+          <w:bCs/>
+        </w:rPr>
+        <w:t xml:space="preserve">Lưu số liệu</w:t>
       </w:r>
       <w:r>
         <w:t xml:space="preserve">.</w:t>
@@ -682,156 +812,6 @@
     </w:p>
     <w:p>
       <w:pPr>
-        <w:pStyle w:val="ListParagraph"/>
-        <w:numPr>
-          <w:ilvl w:val="0"/>
-          <w:numId w:val="5"/>
-        </w:numPr>
-        <w:spacing w:after="100"/>
-      </w:pPr>
-      <w:r>
-        <w:rPr>
-          <w:b/>
-          <w:bCs/>
-        </w:rPr>
-        <w:t xml:space="preserve">Mủ nước — Sản lượng thu mua</w:t>
-      </w:r>
-      <w:r>
-        <w:t xml:space="preserve"> (tấn, quy khô).</w:t>
-      </w:r>
-    </w:p>
-    <w:p>
-      <w:pPr>
-        <w:pStyle w:val="ListParagraph"/>
-        <w:numPr>
-          <w:ilvl w:val="0"/>
-          <w:numId w:val="5"/>
-        </w:numPr>
-        <w:spacing w:after="100"/>
-      </w:pPr>
-      <w:r>
-        <w:rPr>
-          <w:b/>
-          <w:bCs/>
-        </w:rPr>
-        <w:t xml:space="preserve">Mủ nước — Đơn giá thu mua</w:t>
-      </w:r>
-      <w:r>
-        <w:t xml:space="preserve"> (đồng/độ TSC).</w:t>
-      </w:r>
-    </w:p>
-    <w:p>
-      <w:pPr>
-        <w:pStyle w:val="ListParagraph"/>
-        <w:numPr>
-          <w:ilvl w:val="0"/>
-          <w:numId w:val="5"/>
-        </w:numPr>
-        <w:spacing w:after="100"/>
-      </w:pPr>
-      <w:r>
-        <w:rPr>
-          <w:b/>
-          <w:bCs/>
-        </w:rPr>
-        <w:t xml:space="preserve">Mủ chén — Sản lượng thu mua</w:t>
-      </w:r>
-      <w:r>
-        <w:t xml:space="preserve"> (tấn, quy khô).</w:t>
-      </w:r>
-    </w:p>
-    <w:p>
-      <w:pPr>
-        <w:pStyle w:val="ListParagraph"/>
-        <w:numPr>
-          <w:ilvl w:val="0"/>
-          <w:numId w:val="5"/>
-        </w:numPr>
-        <w:spacing w:after="100"/>
-      </w:pPr>
-      <w:r>
-        <w:rPr>
-          <w:b/>
-          <w:bCs/>
-        </w:rPr>
-        <w:t xml:space="preserve">Mủ chén — Đơn giá tính theo</w:t>
-      </w:r>
-      <w:r>
-        <w:t xml:space="preserve">: chọn *Độ TSC* hoặc *Độ DRC* theo cách đơn vị đang tính.</w:t>
-      </w:r>
-    </w:p>
-    <w:p>
-      <w:pPr>
-        <w:pStyle w:val="ListParagraph"/>
-        <w:numPr>
-          <w:ilvl w:val="0"/>
-          <w:numId w:val="5"/>
-        </w:numPr>
-        <w:spacing w:after="100"/>
-      </w:pPr>
-      <w:r>
-        <w:rPr>
-          <w:b/>
-          <w:bCs/>
-        </w:rPr>
-        <w:t xml:space="preserve">Mủ chén — Đơn giá thu mua</w:t>
-      </w:r>
-      <w:r>
-        <w:t xml:space="preserve">: nhãn ô này đổi theo bước 5 (*đồng/độ TSC* hoặc *đồng/độ DRC*).</w:t>
-      </w:r>
-    </w:p>
-    <w:p>
-      <w:pPr>
-        <w:pStyle w:val="ListParagraph"/>
-        <w:numPr>
-          <w:ilvl w:val="0"/>
-          <w:numId w:val="5"/>
-        </w:numPr>
-        <w:spacing w:after="100"/>
-      </w:pPr>
-      <w:r>
-        <w:rPr>
-          <w:b/>
-          <w:bCs/>
-        </w:rPr>
-        <w:t xml:space="preserve">Sản lượng tiêu thụ mủ thu mua</w:t>
-      </w:r>
-      <w:r>
-        <w:t xml:space="preserve"> (tấn).</w:t>
-      </w:r>
-    </w:p>
-    <w:p>
-      <w:pPr>
-        <w:pStyle w:val="ListParagraph"/>
-        <w:numPr>
-          <w:ilvl w:val="0"/>
-          <w:numId w:val="5"/>
-        </w:numPr>
-        <w:spacing w:after="100"/>
-      </w:pPr>
-      <w:r>
-        <w:rPr>
-          <w:b/>
-          <w:bCs/>
-        </w:rPr>
-        <w:t xml:space="preserve">Doanh thu</w:t>
-      </w:r>
-      <w:r>
-        <w:t xml:space="preserve"> (tỷ đồng) — doanh thu đã xuất hóa đơn. Xong bấm </w:t>
-      </w:r>
-      <w:r>
-        <w:rPr>
-          <w:b/>
-          <w:bCs/>
-        </w:rPr>
-        <w:t xml:space="preserve">Lưu số liệu</w:t>
-      </w:r>
-      <w:r>
-        <w:t xml:space="preserve">.</w:t>
-      </w:r>
-    </w:p>
-    <w:p>
-      <w:pPr>
         <w:spacing w:after="80" w:before="140"/>
       </w:pPr>
       <w:r>
@@ -852,6 +832,89 @@
         <w:spacing w:after="80"/>
       </w:pPr>
       <w:r>
+        <w:rPr>
+          <w:b/>
+          <w:bCs/>
+        </w:rPr>
+        <w:t xml:space="preserve">Có công bố giá, có tổ chức mua nhưng KHÔNG mua được</w:t>
+      </w:r>
+      <w:r>
+        <w:t xml:space="preserve"> → </w:t>
+      </w:r>
+      <w:r>
+        <w:rPr>
+          <w:b/>
+          <w:bCs/>
+        </w:rPr>
+        <w:t xml:space="preserve">đừng tích</w:t>
+      </w:r>
+      <w:r>
+        <w:t xml:space="preserve"> ô ở bước 1. Hãy nhập </w:t>
+      </w:r>
+      <w:r>
+        <w:rPr>
+          <w:b/>
+          <w:bCs/>
+        </w:rPr>
+        <w:t xml:space="preserve">sản lượng 0</w:t>
+      </w:r>
+      <w:r>
+        <w:t xml:space="preserve"> kèm </w:t>
+      </w:r>
+      <w:r>
+        <w:rPr>
+          <w:b/>
+          <w:bCs/>
+        </w:rPr>
+        <w:t xml:space="preserve">đúng mức giá đã công bố</w:t>
+      </w:r>
+      <w:r>
+        <w:t xml:space="preserve">. Không mua được ở mọi mức giá thì nhập 0 với </w:t>
+      </w:r>
+      <w:r>
+        <w:rPr>
+          <w:b/>
+          <w:bCs/>
+        </w:rPr>
+        <w:t xml:space="preserve">mức giá thấp nhất</w:t>
+      </w:r>
+      <w:r>
+        <w:t xml:space="preserve"> đang công bố.</w:t>
+      </w:r>
+    </w:p>
+    <w:p>
+      <w:pPr>
+        <w:pStyle w:val="ListParagraph"/>
+        <w:numPr>
+          <w:ilvl w:val="0"/>
+          <w:numId w:val="3"/>
+        </w:numPr>
+        <w:spacing w:after="80"/>
+      </w:pPr>
+      <w:r>
+        <w:t xml:space="preserve">Hai tình huống này </w:t>
+      </w:r>
+      <w:r>
+        <w:rPr>
+          <w:b/>
+          <w:bCs/>
+        </w:rPr>
+        <w:t xml:space="preserve">khác nhau khi tổng hợp báo cáo</w:t>
+      </w:r>
+      <w:r>
+        <w:t xml:space="preserve">: ngày không tổ chức mua được đếm riêng, còn ngày mua 0 tấn vẫn giữ lại mức giá đã công bố để theo dõi mặt bằng giá.</w:t>
+      </w:r>
+    </w:p>
+    <w:p>
+      <w:pPr>
+        <w:pStyle w:val="ListParagraph"/>
+        <w:numPr>
+          <w:ilvl w:val="0"/>
+          <w:numId w:val="3"/>
+        </w:numPr>
+        <w:spacing w:after="80"/>
+      </w:pPr>
+      <w:r>
         <w:t xml:space="preserve">Ô </w:t>
       </w:r>
       <w:r>
@@ -872,7 +935,7 @@
         <w:t xml:space="preserve">tự tính</w:t>
       </w:r>
       <w:r>
-        <w:t xml:space="preserve"> = Doanh thu ÷ Sản lượng tiêu thụ — không cần nhập.</w:t>
+        <w:t xml:space="preserve"> = Doanh thu ÷ Sản lượng tiêu thụ.</w:t>
       </w:r>
     </w:p>
     <w:p>
@@ -885,7 +948,7 @@
         <w:spacing w:after="80"/>
       </w:pPr>
       <w:r>
-        <w:t xml:space="preserve">Đơn giá nhập ở đây đồng thời được ghi vào kho “Giá mủ nguyên liệu”, không phải nhập lại ở nơi khác. Đơn vị tính (TSC hay DRC) được lưu kèm giá nên về sau vẫn biết giá đó tính theo độ nào.</w:t>
+        <w:t xml:space="preserve">Đơn giá nhập ở đây đồng thời ghi vào kho “Giá mủ nguyên liệu”, kèm đúng đơn vị tính (TSC hay DRC).</w:t>
       </w:r>
     </w:p>
     <w:p>
@@ -1278,7 +1341,17 @@
         <w:spacing w:after="140"/>
       </w:pPr>
       <w:r>
-        <w:t xml:space="preserve">Mỗi hợp đồng bán là một dòng. Trong ngày bán bao nhiêu hợp đồng thì thêm bấy nhiêu dòng, hệ thống tự cộng lại. Mỗi dòng ghi kèm ngày xuất hoá đơn và file bộ Hợp đồng.</w:t>
+        <w:t xml:space="preserve">Mỗi hợp đồng bán là một dòng. </w:t>
+      </w:r>
+      <w:r>
+        <w:rPr>
+          <w:b/>
+          <w:bCs/>
+        </w:rPr>
+        <w:t xml:space="preserve">Loại tiền và tỷ giá đặt riêng cho từng dòng</w:t>
+      </w:r>
+      <w:r>
+        <w:t xml:space="preserve">, nên trong cùng một ngày vừa bán USD vừa bán VNĐ vẫn nhập chung một phiếu.</w:t>
       </w:r>
     </w:p>
     <w:p>
@@ -1369,27 +1442,77 @@
           <w:b/>
           <w:bCs/>
         </w:rPr>
-        <w:t xml:space="preserve">Loại HĐ</w:t>
-      </w:r>
-      <w:r>
-        <w:t xml:space="preserve"> (Dài hạn / Chuyến) · </w:t>
-      </w:r>
-      <w:r>
-        <w:rPr>
-          <w:b/>
-          <w:bCs/>
-        </w:rPr>
-        <w:t xml:space="preserve">Hình thức</w:t>
-      </w:r>
-      <w:r>
-        <w:t xml:space="preserve"> (XK-UTXK / Nội tiêu) · </w:t>
-      </w:r>
-      <w:r>
-        <w:rPr>
-          <w:b/>
-          <w:bCs/>
-        </w:rPr>
-        <w:t xml:space="preserve">Loại mủ</w:t>
+        <w:t xml:space="preserve">Giá bán</w:t>
+      </w:r>
+      <w:r>
+        <w:t xml:space="preserve"> của dòng — đơn vị tính theo loại tiền chọn ở cột kế bên.</w:t>
+      </w:r>
+    </w:p>
+    <w:p>
+      <w:pPr>
+        <w:pStyle w:val="ListParagraph"/>
+        <w:numPr>
+          <w:ilvl w:val="0"/>
+          <w:numId w:val="7"/>
+        </w:numPr>
+        <w:spacing w:after="100"/>
+      </w:pPr>
+      <w:r>
+        <w:rPr>
+          <w:b/>
+          <w:bCs/>
+        </w:rPr>
+        <w:t xml:space="preserve">Tiền</w:t>
+      </w:r>
+      <w:r>
+        <w:t xml:space="preserve"> — chọn *VND* (giá tính bằng triệu đ/tấn) hoặc *USD* (giá tính bằng USD/tấn).</w:t>
+      </w:r>
+    </w:p>
+    <w:p>
+      <w:pPr>
+        <w:pStyle w:val="ListParagraph"/>
+        <w:numPr>
+          <w:ilvl w:val="0"/>
+          <w:numId w:val="7"/>
+        </w:numPr>
+        <w:spacing w:after="100"/>
+      </w:pPr>
+      <w:r>
+        <w:rPr>
+          <w:b/>
+          <w:bCs/>
+        </w:rPr>
+        <w:t xml:space="preserve">Tỷ giá</w:t>
+      </w:r>
+      <w:r>
+        <w:t xml:space="preserve"> — chỉ hiện khi dòng đó chọn USD; dòng VND để dấu gạch ngang.</w:t>
+      </w:r>
+    </w:p>
+    <w:p>
+      <w:pPr>
+        <w:pStyle w:val="ListParagraph"/>
+        <w:numPr>
+          <w:ilvl w:val="0"/>
+          <w:numId w:val="7"/>
+        </w:numPr>
+        <w:spacing w:after="100"/>
+      </w:pPr>
+      <w:r>
+        <w:rPr>
+          <w:b/>
+          <w:bCs/>
+        </w:rPr>
+        <w:t xml:space="preserve">Doanh thu</w:t>
+      </w:r>
+      <w:r>
+        <w:t xml:space="preserve"> của dòng hệ thống </w:t>
+      </w:r>
+      <w:r>
+        <w:rPr>
+          <w:b/>
+          <w:bCs/>
+        </w:rPr>
+        <w:t xml:space="preserve">tự tính</w:t>
       </w:r>
       <w:r>
         <w:t xml:space="preserve">.</w:t>
@@ -1409,10 +1532,10 @@
           <w:b/>
           <w:bCs/>
         </w:rPr>
-        <w:t xml:space="preserve">SL (tấn)</w:t>
-      </w:r>
-      <w:r>
-        <w:t xml:space="preserve"> — số lượng bán của dòng này.</w:t>
+        <w:t xml:space="preserve">Lấy tỷ giá VCB cho các dòng USD</w:t>
+      </w:r>
+      <w:r>
+        <w:t xml:space="preserve"> — điền tỷ giá Vietcombank vào mọi dòng đang chọn USD một lượt.</w:t>
       </w:r>
     </w:p>
     <w:p>
@@ -1425,25 +1548,8 @@
         <w:spacing w:after="100"/>
       </w:pPr>
       <w:r>
-        <w:rPr>
-          <w:b/>
-          <w:bCs/>
-        </w:rPr>
-        <w:t xml:space="preserve">Giá bán</w:t>
-      </w:r>
-      <w:r>
-        <w:t xml:space="preserve"> — đơn vị tính theo loại tiền chọn ở bước 7 (triệu đ/tấn hoặc USD/tấn).</w:t>
-      </w:r>
-    </w:p>
-    <w:p>
-      <w:pPr>
-        <w:pStyle w:val="ListParagraph"/>
-        <w:numPr>
-          <w:ilvl w:val="0"/>
-          <w:numId w:val="7"/>
-        </w:numPr>
-        <w:spacing w:after="100"/>
-      </w:pPr>
+        <w:t xml:space="preserve">Nhập nốt </w:t>
+      </w:r>
       <w:r>
         <w:rPr>
           <w:b/>
@@ -1452,18 +1558,8 @@
         <w:t xml:space="preserve">Ngày xuất hoá đơn</w:t>
       </w:r>
       <w:r>
-        <w:t xml:space="preserve"> — ngày hoá đơn của dòng bán này; chưa xuất thì để trống.</w:t>
-      </w:r>
-    </w:p>
-    <w:p>
-      <w:pPr>
-        <w:pStyle w:val="ListParagraph"/>
-        <w:numPr>
-          <w:ilvl w:val="0"/>
-          <w:numId w:val="7"/>
-        </w:numPr>
-        <w:spacing w:after="100"/>
-      </w:pPr>
+        <w:t xml:space="preserve"> và đính kèm </w:t>
+      </w:r>
       <w:r>
         <w:rPr>
           <w:b/>
@@ -1472,57 +1568,7 @@
         <w:t xml:space="preserve">Bộ Hợp đồng</w:t>
       </w:r>
       <w:r>
-        <w:t xml:space="preserve"> — bấm *Chọn* để đính kèm file (PDF hoặc ảnh); bấm vào tên file để mở lại.</w:t>
-      </w:r>
-    </w:p>
-    <w:p>
-      <w:pPr>
-        <w:pStyle w:val="ListParagraph"/>
-        <w:numPr>
-          <w:ilvl w:val="0"/>
-          <w:numId w:val="7"/>
-        </w:numPr>
-        <w:spacing w:after="100"/>
-      </w:pPr>
-      <w:r>
-        <w:rPr>
-          <w:b/>
-          <w:bCs/>
-        </w:rPr>
-        <w:t xml:space="preserve">Thêm dòng</w:t>
-      </w:r>
-      <w:r>
-        <w:t xml:space="preserve"> nếu trong ngày có nhiều hợp đồng.</w:t>
-      </w:r>
-    </w:p>
-    <w:p>
-      <w:pPr>
-        <w:pStyle w:val="ListParagraph"/>
-        <w:numPr>
-          <w:ilvl w:val="0"/>
-          <w:numId w:val="7"/>
-        </w:numPr>
-        <w:spacing w:after="100"/>
-      </w:pPr>
-      <w:r>
-        <w:rPr>
-          <w:b/>
-          <w:bCs/>
-        </w:rPr>
-        <w:t xml:space="preserve">Giá bán nhập bằng</w:t>
-      </w:r>
-      <w:r>
-        <w:t xml:space="preserve"> — chọn *VND* hoặc *USD*. Chọn USD thì hiện thêm ô </w:t>
-      </w:r>
-      <w:r>
-        <w:rPr>
-          <w:b/>
-          <w:bCs/>
-        </w:rPr>
-        <w:t xml:space="preserve">Tỷ giá</w:t>
-      </w:r>
-      <w:r>
-        <w:t xml:space="preserve"> (có nút lấy tỷ giá Vietcombank). Xong bấm </w:t>
+        <w:t xml:space="preserve">, rồi bấm </w:t>
       </w:r>
       <w:r>
         <w:rPr>
@@ -1557,6 +1603,52 @@
         <w:spacing w:after="80"/>
       </w:pPr>
       <w:r>
+        <w:t xml:space="preserve">Dòng chọn USD mà </w:t>
+      </w:r>
+      <w:r>
+        <w:rPr>
+          <w:b/>
+          <w:bCs/>
+        </w:rPr>
+        <w:t xml:space="preserve">chưa nhập tỷ giá</w:t>
+      </w:r>
+      <w:r>
+        <w:t xml:space="preserve"> thì doanh thu dòng đó để trống — hệ thống không tự đoán tỷ giá.</w:t>
+      </w:r>
+    </w:p>
+    <w:p>
+      <w:pPr>
+        <w:pStyle w:val="ListParagraph"/>
+        <w:numPr>
+          <w:ilvl w:val="0"/>
+          <w:numId w:val="3"/>
+        </w:numPr>
+        <w:spacing w:after="80"/>
+      </w:pPr>
+      <w:r>
+        <w:t xml:space="preserve">Bảng </w:t>
+      </w:r>
+      <w:r>
+        <w:rPr>
+          <w:b/>
+          <w:bCs/>
+        </w:rPr>
+        <w:t xml:space="preserve">Tồn kho đã ký HĐ chưa giao</w:t>
+      </w:r>
+      <w:r>
+        <w:t xml:space="preserve"> cũng có cột *Tiền* và *Tỷ giá* riêng cho từng dòng.</w:t>
+      </w:r>
+    </w:p>
+    <w:p>
+      <w:pPr>
+        <w:pStyle w:val="ListParagraph"/>
+        <w:numPr>
+          <w:ilvl w:val="0"/>
+          <w:numId w:val="3"/>
+        </w:numPr>
+        <w:spacing w:after="80"/>
+      </w:pPr>
+      <w:r>
         <w:t xml:space="preserve">Cột </w:t>
       </w:r>
       <w:r>
@@ -1567,7 +1659,7 @@
         <w:t xml:space="preserve">Doanh thu</w:t>
       </w:r>
       <w:r>
-        <w:t xml:space="preserve"> của từng dòng và toàn bộ khối </w:t>
+        <w:t xml:space="preserve"> từng dòng và khối </w:t>
       </w:r>
       <w:r>
         <w:rPr>
@@ -1577,63 +1669,7 @@
         <w:t xml:space="preserve">Tổng hợp tiêu thụ</w:t>
       </w:r>
       <w:r>
-        <w:t xml:space="preserve"> đều </w:t>
-      </w:r>
-      <w:r>
-        <w:rPr>
-          <w:b/>
-          <w:bCs/>
-        </w:rPr>
-        <w:t xml:space="preserve">tự tính</w:t>
-      </w:r>
-      <w:r>
-        <w:t xml:space="preserve"> — không nhập tay.</w:t>
-      </w:r>
-    </w:p>
-    <w:p>
-      <w:pPr>
-        <w:pStyle w:val="ListParagraph"/>
-        <w:numPr>
-          <w:ilvl w:val="0"/>
-          <w:numId w:val="3"/>
-        </w:numPr>
-        <w:spacing w:after="80"/>
-      </w:pPr>
-      <w:r>
-        <w:t xml:space="preserve">Chọn USD mà </w:t>
-      </w:r>
-      <w:r>
-        <w:rPr>
-          <w:b/>
-          <w:bCs/>
-        </w:rPr>
-        <w:t xml:space="preserve">chưa nhập tỷ giá</w:t>
-      </w:r>
-      <w:r>
-        <w:t xml:space="preserve"> thì doanh thu để trống, hệ thống không tự đoán tỷ giá.</w:t>
-      </w:r>
-    </w:p>
-    <w:p>
-      <w:pPr>
-        <w:pStyle w:val="ListParagraph"/>
-        <w:numPr>
-          <w:ilvl w:val="0"/>
-          <w:numId w:val="3"/>
-        </w:numPr>
-        <w:spacing w:after="80"/>
-      </w:pPr>
-      <w:r>
-        <w:t xml:space="preserve">Loại tiền áp cho </w:t>
-      </w:r>
-      <w:r>
-        <w:rPr>
-          <w:b/>
-          <w:bCs/>
-        </w:rPr>
-        <w:t xml:space="preserve">cả phiếu</w:t>
-      </w:r>
-      <w:r>
-        <w:t xml:space="preserve">, không phải từng dòng — trong ngày có cả bán USD lẫn VNĐ thì nhập thành 2 ngày phiếu hoặc quy về một loại tiền.</w:t>
+        <w:t xml:space="preserve"> đều tự tính — không nhập tay.</w:t>
       </w:r>
     </w:p>
     <w:p>
@@ -2373,17 +2409,27 @@
         <w:spacing w:after="140"/>
       </w:pPr>
       <w:r>
-        <w:t xml:space="preserve">Mục này ghi lại nhu cầu và tín hiệu thị trường mà đơn vị nắm được: khách hỏi mua, chào giá, đơn hàng sắp ký… Đây là phần nhập </w:t>
-      </w:r>
-      <w:r>
-        <w:rPr>
-          <w:b/>
-          <w:bCs/>
-        </w:rPr>
-        <w:t xml:space="preserve">tự do bằng chữ</w:t>
-      </w:r>
-      <w:r>
-        <w:t xml:space="preserve">, không có ô số liệu, giúp Ban Thị trường Kinh doanh nắm tình hình thực tế tại đơn vị.</w:t>
+        <w:t xml:space="preserve">Ghi nhận </w:t>
+      </w:r>
+      <w:r>
+        <w:rPr>
+          <w:b/>
+          <w:bCs/>
+        </w:rPr>
+        <w:t xml:space="preserve">các lời chào hàng từ khách hàng, nhà sản xuất</w:t>
+      </w:r>
+      <w:r>
+        <w:t xml:space="preserve"> và nhu cầu thị trường mà đơn vị nắm được trong ngày — dùng để phân tích yếu tố </w:t>
+      </w:r>
+      <w:r>
+        <w:rPr>
+          <w:b/>
+          <w:bCs/>
+        </w:rPr>
+        <w:t xml:space="preserve">Cầu</w:t>
+      </w:r>
+      <w:r>
+        <w:t xml:space="preserve"> trong quan hệ Cung – Cầu.</w:t>
       </w:r>
     </w:p>
     <w:p>
@@ -2620,17 +2666,17 @@
         <w:spacing w:after="80"/>
       </w:pPr>
       <w:r>
-        <w:t xml:space="preserve">Danh sách bên dưới xếp theo </w:t>
-      </w:r>
-      <w:r>
-        <w:rPr>
-          <w:b/>
-          <w:bCs/>
-        </w:rPr>
-        <w:t xml:space="preserve">dòng thời gian</w:t>
-      </w:r>
-      <w:r>
-        <w:t xml:space="preserve">, chỉ hiện những ngày đã có nhập.</w:t>
+        <w:t xml:space="preserve">Nên ghi rõ: </w:t>
+      </w:r>
+      <w:r>
+        <w:rPr>
+          <w:b/>
+          <w:bCs/>
+        </w:rPr>
+        <w:t xml:space="preserve">khách hàng hoặc nhà sản xuất nào · chủng loại · số lượng · mức giá chào · thời điểm giao hàng</w:t>
+      </w:r>
+      <w:r>
+        <w:t xml:space="preserve">. Càng cụ thể thì phần phân tích Cung – Cầu càng dùng được.</w:t>
       </w:r>
     </w:p>
     <w:p>
@@ -2643,6 +2689,29 @@
         <w:spacing w:after="80"/>
       </w:pPr>
       <w:r>
+        <w:t xml:space="preserve">Đây là mục nhập </w:t>
+      </w:r>
+      <w:r>
+        <w:rPr>
+          <w:b/>
+          <w:bCs/>
+        </w:rPr>
+        <w:t xml:space="preserve">tự do bằng chữ</w:t>
+      </w:r>
+      <w:r>
+        <w:t xml:space="preserve">, không có ô số liệu.</w:t>
+      </w:r>
+    </w:p>
+    <w:p>
+      <w:pPr>
+        <w:pStyle w:val="ListParagraph"/>
+        <w:numPr>
+          <w:ilvl w:val="0"/>
+          <w:numId w:val="3"/>
+        </w:numPr>
+        <w:spacing w:after="80"/>
+      </w:pPr>
+      <w:r>
         <w:t xml:space="preserve">Mỗi ngày mỗi đơn vị chỉ có </w:t>
       </w:r>
       <w:r>
@@ -2653,7 +2722,7 @@
         <w:t xml:space="preserve">một nội dung</w:t>
       </w:r>
       <w:r>
-        <w:t xml:space="preserve">; nhập lại cho ngày đã có sẽ được nhắc dùng chức năng Sửa.</w:t>
+        <w:t xml:space="preserve"> — nhập lại ngày đã có sẽ được nhắc dùng chức năng Sửa.</w:t>
       </w:r>
     </w:p>
     <w:p>
@@ -2676,20 +2745,7 @@
         <w:t xml:space="preserve">không có nhập bằng Excel</w:t>
       </w:r>
       <w:r>
-        <w:t xml:space="preserve"> — chỉ nhập trực tiếp trên màn hình.</w:t>
-      </w:r>
-    </w:p>
-    <w:p>
-      <w:pPr>
-        <w:pStyle w:val="ListParagraph"/>
-        <w:numPr>
-          <w:ilvl w:val="0"/>
-          <w:numId w:val="3"/>
-        </w:numPr>
-        <w:spacing w:after="80"/>
-      </w:pPr>
-      <w:r>
-        <w:t xml:space="preserve">Cũng áp dụng cửa sổ thời gian như các báo cáo khác: ngày quá cũ chỉ để xem.</w:t>
+        <w:t xml:space="preserve">.</w:t>
       </w:r>
     </w:p>
     <w:p>

</xml_diff>

<commit_message>
fix(unit-daily): reload the purchased/finished sale figures when reopening a day
The consumption form wrote those fields but never read them back, so reopening
a saved day showed them blank and the next save wiped what was there.

The consumption modal also widens: the sale table gained currency, rate,
invoice date and contract columns, which squeezed quantity and price down to
one illegible character each.

Guide updated for the reviewer's wording — the signed-contract block loses
"chưa giao" and raw material reads "(quy khô)" with no factory distinction —
plus the reshot screens for finished-rubber purchase and its sale.
</commit_message>
<xml_diff>
--- a/docs/huong-dan/nhap-lieu-don-vi-thanh-vien/Huong-dan-nhap-lieu-don-vi-thanh-vien.docx
+++ b/docs/huong-dan/nhap-lieu-don-vi-thanh-vien/Huong-dan-nhap-lieu-don-vi-thanh-vien.docx
@@ -16,7 +16,7 @@
         <w:spacing w:after="200"/>
       </w:pPr>
       <w:r>
-        <w:t xml:space="preserve">Tài liệu dành cho cán bộ đơn vị thành viên VRG nhập số liệu hằng ngày trên Hệ thống Dự báo &amp; Quản trị Giá Cao su. Tài khoản đơn vị chỉ thấy và chỉ nhập được số liệu của chính đơn vị mình. Có 5 mục cần nhập: Báo cáo thu mua, Báo cáo tiêu thụ, Báo cáo tồn kho và Nhu cầu thị trường (nhập theo NGÀY), cùng Kế hoạch năm (nhập 1 lần cho cả năm). Tài liệu bám theo phiên bản 0.2.72. Riêng 4 mục báo cáo còn có thể tải mẫu Excel về điền rồi nhập lên thay vì gõ tay (xem mục 9).</w:t>
+        <w:t xml:space="preserve">Tài liệu dành cho cán bộ đơn vị thành viên VRG nhập số liệu hằng ngày trên Hệ thống Dự báo &amp; Quản trị Giá Cao su. Tài khoản đơn vị chỉ thấy và chỉ nhập được số liệu của chính đơn vị mình. Có 5 mục cần nhập: Báo cáo thu mua, Báo cáo tiêu thụ, Báo cáo tồn kho và Nhu cầu thị trường (nhập theo NGÀY), cùng Kế hoạch năm (nhập 1 lần cho cả năm). Tài liệu bám theo phiên bản 0.2.74. Riêng 4 mục báo cáo còn có thể tải mẫu Excel về điền rồi nhập lên thay vì gõ tay (xem mục 9).</w:t>
       </w:r>
     </w:p>
     <w:p>
@@ -580,17 +580,7 @@
         <w:spacing w:after="140"/>
       </w:pPr>
       <w:r>
-        <w:t xml:space="preserve">Áp dụng cho các đơn vị tại Việt Nam (giao dịch bằng đồng Việt Nam). Trước khi nhập số, xác định rõ hôm nay đơn vị </w:t>
-      </w:r>
-      <w:r>
-        <w:rPr>
-          <w:b/>
-          <w:bCs/>
-        </w:rPr>
-        <w:t xml:space="preserve">có tổ chức thu mua hay không</w:t>
-      </w:r>
-      <w:r>
-        <w:t xml:space="preserve"> — hai trường hợp ghi khác nhau.</w:t>
+        <w:t xml:space="preserve">Áp dụng cho các đơn vị tại Việt Nam. Phiếu chia theo loại mủ: mỗi loại nhập sản lượng và đơn giá đi liền nhau. Mủ chén phải chọn tính theo độ TSC hay độ DRC. Cuối phiếu là khối thu mua THÀNH PHẨM (mua lại mủ đã chế biến).</w:t>
       </w:r>
     </w:p>
     <w:p>
@@ -677,6 +667,197 @@
         <w:spacing w:after="100"/>
       </w:pPr>
       <w:r>
+        <w:t xml:space="preserve">Chọn </w:t>
+      </w:r>
+      <w:r>
+        <w:rPr>
+          <w:b/>
+          <w:bCs/>
+        </w:rPr>
+        <w:t xml:space="preserve">ngày báo cáo</w:t>
+      </w:r>
+      <w:r>
+        <w:t xml:space="preserve">.</w:t>
+      </w:r>
+    </w:p>
+    <w:p>
+      <w:pPr>
+        <w:pStyle w:val="ListParagraph"/>
+        <w:numPr>
+          <w:ilvl w:val="0"/>
+          <w:numId w:val="5"/>
+        </w:numPr>
+        <w:spacing w:after="100"/>
+      </w:pPr>
+      <w:r>
+        <w:rPr>
+          <w:b/>
+          <w:bCs/>
+        </w:rPr>
+        <w:t xml:space="preserve">Mủ nước</w:t>
+      </w:r>
+      <w:r>
+        <w:t xml:space="preserve"> — sản lượng (tấn, quy khô) và đơn giá (đồng/độ TSC).</w:t>
+      </w:r>
+    </w:p>
+    <w:p>
+      <w:pPr>
+        <w:pStyle w:val="ListParagraph"/>
+        <w:numPr>
+          <w:ilvl w:val="0"/>
+          <w:numId w:val="5"/>
+        </w:numPr>
+        <w:spacing w:after="100"/>
+      </w:pPr>
+      <w:r>
+        <w:rPr>
+          <w:b/>
+          <w:bCs/>
+        </w:rPr>
+        <w:t xml:space="preserve">Mủ chén — Đơn giá tính theo</w:t>
+      </w:r>
+      <w:r>
+        <w:t xml:space="preserve">: chọn *Độ TSC* hoặc *Độ DRC*; nhãn ô đơn giá đổi theo lựa chọn này.</w:t>
+      </w:r>
+    </w:p>
+    <w:p>
+      <w:pPr>
+        <w:pStyle w:val="ListParagraph"/>
+        <w:numPr>
+          <w:ilvl w:val="0"/>
+          <w:numId w:val="5"/>
+        </w:numPr>
+        <w:spacing w:after="100"/>
+      </w:pPr>
+      <w:r>
+        <w:rPr>
+          <w:b/>
+          <w:bCs/>
+        </w:rPr>
+        <w:t xml:space="preserve">Thu mua thành phẩm</w:t>
+      </w:r>
+      <w:r>
+        <w:t xml:space="preserve"> — sản lượng mủ thành phẩm mua vào (tấn).</w:t>
+      </w:r>
+    </w:p>
+    <w:p>
+      <w:pPr>
+        <w:pStyle w:val="ListParagraph"/>
+        <w:numPr>
+          <w:ilvl w:val="0"/>
+          <w:numId w:val="5"/>
+        </w:numPr>
+        <w:spacing w:after="100"/>
+      </w:pPr>
+      <w:r>
+        <w:rPr>
+          <w:b/>
+          <w:bCs/>
+        </w:rPr>
+        <w:t xml:space="preserve">Đơn giá (VNĐ)</w:t>
+      </w:r>
+      <w:r>
+        <w:t xml:space="preserve"> — triệu đ/tấn.</w:t>
+      </w:r>
+    </w:p>
+    <w:p>
+      <w:pPr>
+        <w:pStyle w:val="ListParagraph"/>
+        <w:numPr>
+          <w:ilvl w:val="0"/>
+          <w:numId w:val="5"/>
+        </w:numPr>
+        <w:spacing w:after="100"/>
+      </w:pPr>
+      <w:r>
+        <w:rPr>
+          <w:b/>
+          <w:bCs/>
+        </w:rPr>
+        <w:t xml:space="preserve">Đơn giá (ngoại tệ)</w:t>
+      </w:r>
+      <w:r>
+        <w:t xml:space="preserve"> — USD/tấn; kèm ô </w:t>
+      </w:r>
+      <w:r>
+        <w:rPr>
+          <w:b/>
+          <w:bCs/>
+        </w:rPr>
+        <w:t xml:space="preserve">Tỷ giá</w:t>
+      </w:r>
+      <w:r>
+        <w:t xml:space="preserve"> có nút *Lấy tỷ giá hiện tại* (Vietcombank). Xong bấm </w:t>
+      </w:r>
+      <w:r>
+        <w:rPr>
+          <w:b/>
+          <w:bCs/>
+        </w:rPr>
+        <w:t xml:space="preserve">Lưu số liệu</w:t>
+      </w:r>
+      <w:r>
+        <w:t xml:space="preserve">.</w:t>
+      </w:r>
+    </w:p>
+    <w:p>
+      <w:pPr>
+        <w:spacing w:after="80" w:before="140"/>
+      </w:pPr>
+      <w:r>
+        <w:rPr>
+          <w:b/>
+          <w:bCs/>
+        </w:rPr>
+        <w:t xml:space="preserve">Lưu ý:</w:t>
+      </w:r>
+    </w:p>
+    <w:p>
+      <w:pPr>
+        <w:pStyle w:val="ListParagraph"/>
+        <w:numPr>
+          <w:ilvl w:val="0"/>
+          <w:numId w:val="3"/>
+        </w:numPr>
+        <w:spacing w:after="80"/>
+      </w:pPr>
+      <w:r>
+        <w:t xml:space="preserve">Đơn giá mủ nước/mủ chén nhập ở đây đồng thời ghi vào kho “Giá mủ nguyên liệu”, kèm đúng đơn vị tính (độ TSC hay độ DRC) đã chọn.</w:t>
+      </w:r>
+    </w:p>
+    <w:p>
+      <w:pPr>
+        <w:pStyle w:val="ListParagraph"/>
+        <w:numPr>
+          <w:ilvl w:val="0"/>
+          <w:numId w:val="3"/>
+        </w:numPr>
+        <w:spacing w:after="80"/>
+      </w:pPr>
+      <w:r>
+        <w:rPr>
+          <w:b/>
+          <w:bCs/>
+        </w:rPr>
+        <w:t xml:space="preserve">Sản lượng tiêu thụ và doanh thu đã chuyển sang biểu Tiêu thụ</w:t>
+      </w:r>
+      <w:r>
+        <w:t xml:space="preserve"> — không còn nhập ở phiếu Thu mua nữa.</w:t>
+      </w:r>
+    </w:p>
+    <w:p>
+      <w:pPr>
+        <w:pStyle w:val="ListParagraph"/>
+        <w:numPr>
+          <w:ilvl w:val="0"/>
+          <w:numId w:val="3"/>
+        </w:numPr>
+        <w:spacing w:after="80"/>
+      </w:pPr>
+      <w:r>
+        <w:t xml:space="preserve">Ô </w:t>
+      </w:r>
+      <w:r>
         <w:rPr>
           <w:b/>
           <w:bCs/>
@@ -684,162 +865,7 @@
         <w:t xml:space="preserve">Hôm nay đơn vị KHÔNG tổ chức thu mua</w:t>
       </w:r>
       <w:r>
-        <w:t xml:space="preserve"> — chỉ tích ô này khi thật sự không tổ chức mua.</w:t>
-      </w:r>
-    </w:p>
-    <w:p>
-      <w:pPr>
-        <w:pStyle w:val="ListParagraph"/>
-        <w:numPr>
-          <w:ilvl w:val="0"/>
-          <w:numId w:val="5"/>
-        </w:numPr>
-        <w:spacing w:after="100"/>
-      </w:pPr>
-      <w:r>
-        <w:rPr>
-          <w:b/>
-          <w:bCs/>
-        </w:rPr>
-        <w:t xml:space="preserve">Mủ nước — Sản lượng thu mua</w:t>
-      </w:r>
-      <w:r>
-        <w:t xml:space="preserve"> (tấn, quy khô).</w:t>
-      </w:r>
-    </w:p>
-    <w:p>
-      <w:pPr>
-        <w:pStyle w:val="ListParagraph"/>
-        <w:numPr>
-          <w:ilvl w:val="0"/>
-          <w:numId w:val="5"/>
-        </w:numPr>
-        <w:spacing w:after="100"/>
-      </w:pPr>
-      <w:r>
-        <w:rPr>
-          <w:b/>
-          <w:bCs/>
-        </w:rPr>
-        <w:t xml:space="preserve">Mủ nước — Đơn giá thu mua</w:t>
-      </w:r>
-      <w:r>
-        <w:t xml:space="preserve"> (đồng/độ TSC).</w:t>
-      </w:r>
-    </w:p>
-    <w:p>
-      <w:pPr>
-        <w:pStyle w:val="ListParagraph"/>
-        <w:numPr>
-          <w:ilvl w:val="0"/>
-          <w:numId w:val="5"/>
-        </w:numPr>
-        <w:spacing w:after="100"/>
-      </w:pPr>
-      <w:r>
-        <w:rPr>
-          <w:b/>
-          <w:bCs/>
-        </w:rPr>
-        <w:t xml:space="preserve">Mủ chén — Đơn giá tính theo</w:t>
-      </w:r>
-      <w:r>
-        <w:t xml:space="preserve">: chọn *Độ TSC* hoặc *Độ DRC* theo cách đơn vị đang tính.</w:t>
-      </w:r>
-    </w:p>
-    <w:p>
-      <w:pPr>
-        <w:pStyle w:val="ListParagraph"/>
-        <w:numPr>
-          <w:ilvl w:val="0"/>
-          <w:numId w:val="5"/>
-        </w:numPr>
-        <w:spacing w:after="100"/>
-      </w:pPr>
-      <w:r>
-        <w:rPr>
-          <w:b/>
-          <w:bCs/>
-        </w:rPr>
-        <w:t xml:space="preserve">Mủ chén — Đơn giá thu mua</w:t>
-      </w:r>
-      <w:r>
-        <w:t xml:space="preserve">: nhãn ô đổi theo lựa chọn ở bước 4.</w:t>
-      </w:r>
-    </w:p>
-    <w:p>
-      <w:pPr>
-        <w:pStyle w:val="ListParagraph"/>
-        <w:numPr>
-          <w:ilvl w:val="0"/>
-          <w:numId w:val="5"/>
-        </w:numPr>
-        <w:spacing w:after="100"/>
-      </w:pPr>
-      <w:r>
-        <w:t xml:space="preserve">Nhập nốt </w:t>
-      </w:r>
-      <w:r>
-        <w:rPr>
-          <w:b/>
-          <w:bCs/>
-        </w:rPr>
-        <w:t xml:space="preserve">Sản lượng tiêu thụ</w:t>
-      </w:r>
-      <w:r>
-        <w:t xml:space="preserve"> và </w:t>
-      </w:r>
-      <w:r>
-        <w:rPr>
-          <w:b/>
-          <w:bCs/>
-        </w:rPr>
-        <w:t xml:space="preserve">Doanh thu</w:t>
-      </w:r>
-      <w:r>
-        <w:t xml:space="preserve">, rồi bấm </w:t>
-      </w:r>
-      <w:r>
-        <w:rPr>
-          <w:b/>
-          <w:bCs/>
-        </w:rPr>
-        <w:t xml:space="preserve">Lưu số liệu</w:t>
-      </w:r>
-      <w:r>
-        <w:t xml:space="preserve">.</w:t>
-      </w:r>
-    </w:p>
-    <w:p>
-      <w:pPr>
-        <w:spacing w:after="80" w:before="140"/>
-      </w:pPr>
-      <w:r>
-        <w:rPr>
-          <w:b/>
-          <w:bCs/>
-        </w:rPr>
-        <w:t xml:space="preserve">Lưu ý:</w:t>
-      </w:r>
-    </w:p>
-    <w:p>
-      <w:pPr>
-        <w:pStyle w:val="ListParagraph"/>
-        <w:numPr>
-          <w:ilvl w:val="0"/>
-          <w:numId w:val="3"/>
-        </w:numPr>
-        <w:spacing w:after="80"/>
-      </w:pPr>
-      <w:r>
-        <w:rPr>
-          <w:b/>
-          <w:bCs/>
-        </w:rPr>
-        <w:t xml:space="preserve">Có công bố giá, có tổ chức mua nhưng KHÔNG mua được</w:t>
-      </w:r>
-      <w:r>
-        <w:t xml:space="preserve"> → </w:t>
+        <w:t xml:space="preserve"> chỉ tích khi thật sự không tổ chức mua. Có công bố giá, có tổ chức mua nhưng không mua được thì </w:t>
       </w:r>
       <w:r>
         <w:rPr>
@@ -849,7 +875,7 @@
         <w:t xml:space="preserve">đừng tích</w:t>
       </w:r>
       <w:r>
-        <w:t xml:space="preserve"> ô ở bước 1. Hãy nhập </w:t>
+        <w:t xml:space="preserve"> — nhập </w:t>
       </w:r>
       <w:r>
         <w:rPr>
@@ -869,7 +895,7 @@
         <w:t xml:space="preserve">đúng mức giá đã công bố</w:t>
       </w:r>
       <w:r>
-        <w:t xml:space="preserve">. Không mua được ở mọi mức giá thì nhập 0 với </w:t>
+        <w:t xml:space="preserve"> (không mua được ở mọi mức thì nhập 0 với </w:t>
       </w:r>
       <w:r>
         <w:rPr>
@@ -879,99 +905,7 @@
         <w:t xml:space="preserve">mức giá thấp nhất</w:t>
       </w:r>
       <w:r>
-        <w:t xml:space="preserve"> đang công bố.</w:t>
-      </w:r>
-    </w:p>
-    <w:p>
-      <w:pPr>
-        <w:pStyle w:val="ListParagraph"/>
-        <w:numPr>
-          <w:ilvl w:val="0"/>
-          <w:numId w:val="3"/>
-        </w:numPr>
-        <w:spacing w:after="80"/>
-      </w:pPr>
-      <w:r>
-        <w:t xml:space="preserve">Hai tình huống này </w:t>
-      </w:r>
-      <w:r>
-        <w:rPr>
-          <w:b/>
-          <w:bCs/>
-        </w:rPr>
-        <w:t xml:space="preserve">khác nhau khi tổng hợp báo cáo</w:t>
-      </w:r>
-      <w:r>
-        <w:t xml:space="preserve">: ngày không tổ chức mua được đếm riêng, còn ngày mua 0 tấn vẫn giữ lại mức giá đã công bố để theo dõi mặt bằng giá.</w:t>
-      </w:r>
-    </w:p>
-    <w:p>
-      <w:pPr>
-        <w:pStyle w:val="ListParagraph"/>
-        <w:numPr>
-          <w:ilvl w:val="0"/>
-          <w:numId w:val="3"/>
-        </w:numPr>
-        <w:spacing w:after="80"/>
-      </w:pPr>
-      <w:r>
-        <w:t xml:space="preserve">Ô </w:t>
-      </w:r>
-      <w:r>
-        <w:rPr>
-          <w:b/>
-          <w:bCs/>
-        </w:rPr>
-        <w:t xml:space="preserve">Giá bán bình quân</w:t>
-      </w:r>
-      <w:r>
-        <w:t xml:space="preserve"> hệ thống </w:t>
-      </w:r>
-      <w:r>
-        <w:rPr>
-          <w:b/>
-          <w:bCs/>
-        </w:rPr>
-        <w:t xml:space="preserve">tự tính</w:t>
-      </w:r>
-      <w:r>
-        <w:t xml:space="preserve"> = Doanh thu ÷ Sản lượng tiêu thụ.</w:t>
-      </w:r>
-    </w:p>
-    <w:p>
-      <w:pPr>
-        <w:pStyle w:val="ListParagraph"/>
-        <w:numPr>
-          <w:ilvl w:val="0"/>
-          <w:numId w:val="3"/>
-        </w:numPr>
-        <w:spacing w:after="80"/>
-      </w:pPr>
-      <w:r>
-        <w:t xml:space="preserve">Đơn giá nhập ở đây đồng thời ghi vào kho “Giá mủ nguyên liệu”, kèm đúng đơn vị tính (TSC hay DRC).</w:t>
-      </w:r>
-    </w:p>
-    <w:p>
-      <w:pPr>
-        <w:pStyle w:val="ListParagraph"/>
-        <w:numPr>
-          <w:ilvl w:val="0"/>
-          <w:numId w:val="3"/>
-        </w:numPr>
-        <w:spacing w:after="80"/>
-      </w:pPr>
-      <w:r>
-        <w:t xml:space="preserve">Mủ nước luôn tính theo </w:t>
-      </w:r>
-      <w:r>
-        <w:rPr>
-          <w:b/>
-          <w:bCs/>
-        </w:rPr>
-        <w:t xml:space="preserve">độ TSC</w:t>
-      </w:r>
-      <w:r>
-        <w:t xml:space="preserve"> — chỉ mủ chén mới có lựa chọn TSC/DRC.</w:t>
+        <w:t xml:space="preserve">). Hai trường hợp này khác nhau khi tổng hợp báo cáo.</w:t>
       </w:r>
     </w:p>
     <w:p>
@@ -1102,10 +1036,10 @@
           <w:b/>
           <w:bCs/>
         </w:rPr>
-        <w:t xml:space="preserve">Đơn giá thu mua theo nội tệ</w:t>
-      </w:r>
-      <w:r>
-        <w:t xml:space="preserve"> (LAK/KHR trên độ) — nhập giá mua thực tế tại nước sở tại.</w:t>
+        <w:t xml:space="preserve">Đơn giá theo nội tệ</w:t>
+      </w:r>
+      <w:r>
+        <w:t xml:space="preserve"> (LAK/KHR trên độ) — giá mua thực tế tại nước sở tại.</w:t>
       </w:r>
     </w:p>
     <w:p>
@@ -1125,7 +1059,7 @@
         <w:t xml:space="preserve">Mủ chén — Đơn giá tính theo</w:t>
       </w:r>
       <w:r>
-        <w:t xml:space="preserve">: chọn *Độ TSC* hoặc *Độ DRC* (giống đơn vị trong nước).</w:t>
+        <w:t xml:space="preserve">: *Độ TSC* hoặc *Độ DRC*.</w:t>
       </w:r>
     </w:p>
     <w:p>
@@ -1145,7 +1079,7 @@
         <w:t xml:space="preserve">Tỷ giá thu mua</w:t>
       </w:r>
       <w:r>
-        <w:t xml:space="preserve"> (1 nội tệ = ? VND) — dùng để quy đơn giá về đồng.</w:t>
+        <w:t xml:space="preserve"> (1 nội tệ = ? VND) — quy đơn giá về đồng.</w:t>
       </w:r>
     </w:p>
     <w:p>
@@ -1162,10 +1096,10 @@
           <w:b/>
           <w:bCs/>
         </w:rPr>
-        <w:t xml:space="preserve">Doanh thu theo USD</w:t>
-      </w:r>
-      <w:r>
-        <w:t xml:space="preserve"> — doanh thu bán hàng tính bằng đô-la Mỹ.</w:t>
+        <w:t xml:space="preserve">Đơn giá thành phẩm (ngoại tệ)</w:t>
+      </w:r>
+      <w:r>
+        <w:t xml:space="preserve"> — USD/tấn cho phần thu mua thành phẩm.</w:t>
       </w:r>
     </w:p>
     <w:p>
@@ -1182,30 +1116,10 @@
           <w:b/>
           <w:bCs/>
         </w:rPr>
-        <w:t xml:space="preserve">Tỷ giá USD</w:t>
-      </w:r>
-      <w:r>
-        <w:t xml:space="preserve"> (1 USD = ? VND) — dùng để quy doanh thu về đồng.</w:t>
-      </w:r>
-    </w:p>
-    <w:p>
-      <w:pPr>
-        <w:pStyle w:val="ListParagraph"/>
-        <w:numPr>
-          <w:ilvl w:val="0"/>
-          <w:numId w:val="6"/>
-        </w:numPr>
-        <w:spacing w:after="100"/>
-      </w:pPr>
-      <w:r>
-        <w:rPr>
-          <w:b/>
-          <w:bCs/>
-        </w:rPr>
-        <w:t xml:space="preserve">Lấy tỷ giá hiện tại</w:t>
-      </w:r>
-      <w:r>
-        <w:t xml:space="preserve"> — bấm để hệ thống tự điền tỷ giá USD của Vietcombank.</w:t>
+        <w:t xml:space="preserve">Tỷ giá</w:t>
+      </w:r>
+      <w:r>
+        <w:t xml:space="preserve"> (1 USD = ? VND) — có nút *Lấy tỷ giá hiện tại*.</w:t>
       </w:r>
     </w:p>
     <w:p>
@@ -1230,7 +1144,7 @@
         <w:spacing w:after="80"/>
       </w:pPr>
       <w:r>
-        <w:t xml:space="preserve">Hai tỷ giá là </w:t>
+        <w:t xml:space="preserve">Hai tỷ giá </w:t>
       </w:r>
       <w:r>
         <w:rPr>
@@ -1240,7 +1154,7 @@
         <w:t xml:space="preserve">khác nhau và độc lập</w:t>
       </w:r>
       <w:r>
-        <w:t xml:space="preserve">: tỷ giá nội tệ dùng cho đơn giá thu mua, tỷ giá USD dùng cho doanh thu.</w:t>
+        <w:t xml:space="preserve">: tỷ giá nội tệ cho đơn giá mủ nước/mủ chén; tỷ giá USD cho thành phẩm.</w:t>
       </w:r>
     </w:p>
     <w:p>
@@ -1253,27 +1167,17 @@
         <w:spacing w:after="80"/>
       </w:pPr>
       <w:r>
-        <w:t xml:space="preserve">Các ô nền xám (</w:t>
-      </w:r>
-      <w:r>
-        <w:rPr>
-          <w:b/>
-          <w:bCs/>
-        </w:rPr>
-        <w:t xml:space="preserve">đơn giá quy ra đồng</w:t>
-      </w:r>
-      <w:r>
-        <w:t xml:space="preserve">, </w:t>
-      </w:r>
-      <w:r>
-        <w:rPr>
-          <w:b/>
-          <w:bCs/>
-        </w:rPr>
-        <w:t xml:space="preserve">doanh thu quy ra tỷ đồng</w:t>
-      </w:r>
-      <w:r>
-        <w:t xml:space="preserve">) là hệ thống tự quy đổi, chỉ để xem.</w:t>
+        <w:t xml:space="preserve">Ô nền xám là hệ thống </w:t>
+      </w:r>
+      <w:r>
+        <w:rPr>
+          <w:b/>
+          <w:bCs/>
+        </w:rPr>
+        <w:t xml:space="preserve">tự quy đổi</w:t>
+      </w:r>
+      <w:r>
+        <w:t xml:space="preserve">, chỉ để xem.</w:t>
       </w:r>
     </w:p>
     <w:p>
@@ -1286,30 +1190,7 @@
         <w:spacing w:after="80"/>
       </w:pPr>
       <w:r>
-        <w:t xml:space="preserve">Nếu chưa nhập tỷ giá USD thì hệ thống </w:t>
-      </w:r>
-      <w:r>
-        <w:rPr>
-          <w:b/>
-          <w:bCs/>
-        </w:rPr>
-        <w:t xml:space="preserve">để trống doanh thu</w:t>
-      </w:r>
-      <w:r>
-        <w:t xml:space="preserve"> chứ không tự suy đoán.</w:t>
-      </w:r>
-    </w:p>
-    <w:p>
-      <w:pPr>
-        <w:pStyle w:val="ListParagraph"/>
-        <w:numPr>
-          <w:ilvl w:val="0"/>
-          <w:numId w:val="3"/>
-        </w:numPr>
-        <w:spacing w:after="80"/>
-      </w:pPr>
-      <w:r>
-        <w:t xml:space="preserve">Sản lượng, sản lượng tiêu thụ và cách lưu vẫn giống đơn vị trong nước (mục 3).</w:t>
+        <w:t xml:space="preserve">Sản lượng và cách lưu giống đơn vị trong nước (mục 3).</w:t>
       </w:r>
     </w:p>
     <w:p>
@@ -1341,17 +1222,7 @@
         <w:spacing w:after="140"/>
       </w:pPr>
       <w:r>
-        <w:t xml:space="preserve">Mỗi hợp đồng bán là một dòng. </w:t>
-      </w:r>
-      <w:r>
-        <w:rPr>
-          <w:b/>
-          <w:bCs/>
-        </w:rPr>
-        <w:t xml:space="preserve">Loại tiền và tỷ giá đặt riêng cho từng dòng</w:t>
-      </w:r>
-      <w:r>
-        <w:t xml:space="preserve">, nên trong cùng một ngày vừa bán USD vừa bán VNĐ vẫn nhập chung một phiếu.</w:t>
+        <w:t xml:space="preserve">Mỗi hợp đồng bán là một dòng, hệ thống tự cộng lại. Bên dưới là bảng tiêu thụ mủ thu mua và mủ thành phẩm (phần này trước nằm ở phiếu Thu mua).</w:t>
       </w:r>
     </w:p>
     <w:p>
@@ -1442,10 +1313,50 @@
           <w:b/>
           <w:bCs/>
         </w:rPr>
+        <w:t xml:space="preserve">Loại HĐ</w:t>
+      </w:r>
+      <w:r>
+        <w:t xml:space="preserve"> (Dài hạn / Chuyến) · </w:t>
+      </w:r>
+      <w:r>
+        <w:rPr>
+          <w:b/>
+          <w:bCs/>
+        </w:rPr>
+        <w:t xml:space="preserve">Hình thức</w:t>
+      </w:r>
+      <w:r>
+        <w:t xml:space="preserve"> (XK-UTXK / Nội tiêu) · </w:t>
+      </w:r>
+      <w:r>
+        <w:rPr>
+          <w:b/>
+          <w:bCs/>
+        </w:rPr>
+        <w:t xml:space="preserve">Loại mủ</w:t>
+      </w:r>
+      <w:r>
+        <w:t xml:space="preserve"> · </w:t>
+      </w:r>
+      <w:r>
+        <w:rPr>
+          <w:b/>
+          <w:bCs/>
+        </w:rPr>
+        <w:t xml:space="preserve">SL (tấn)</w:t>
+      </w:r>
+      <w:r>
+        <w:t xml:space="preserve"> · </w:t>
+      </w:r>
+      <w:r>
+        <w:rPr>
+          <w:b/>
+          <w:bCs/>
+        </w:rPr>
         <w:t xml:space="preserve">Giá bán</w:t>
       </w:r>
       <w:r>
-        <w:t xml:space="preserve"> của dòng — đơn vị tính theo loại tiền chọn ở cột kế bên.</w:t>
+        <w:t xml:space="preserve">.</w:t>
       </w:r>
     </w:p>
     <w:p>
@@ -1462,10 +1373,10 @@
           <w:b/>
           <w:bCs/>
         </w:rPr>
-        <w:t xml:space="preserve">Tiền</w:t>
-      </w:r>
-      <w:r>
-        <w:t xml:space="preserve"> — chọn *VND* (giá tính bằng triệu đ/tấn) hoặc *USD* (giá tính bằng USD/tấn).</w:t>
+        <w:t xml:space="preserve">Ngày xuất hoá đơn</w:t>
+      </w:r>
+      <w:r>
+        <w:t xml:space="preserve"> — chưa xuất thì để trống.</w:t>
       </w:r>
     </w:p>
     <w:p>
@@ -1482,10 +1393,70 @@
           <w:b/>
           <w:bCs/>
         </w:rPr>
+        <w:t xml:space="preserve">Bộ Hợp đồng</w:t>
+      </w:r>
+      <w:r>
+        <w:t xml:space="preserve"> — đính kèm PDF hoặc ảnh; bấm tên file để mở lại.</w:t>
+      </w:r>
+    </w:p>
+    <w:p>
+      <w:pPr>
+        <w:pStyle w:val="ListParagraph"/>
+        <w:numPr>
+          <w:ilvl w:val="0"/>
+          <w:numId w:val="7"/>
+        </w:numPr>
+        <w:spacing w:after="100"/>
+      </w:pPr>
+      <w:r>
+        <w:rPr>
+          <w:b/>
+          <w:bCs/>
+        </w:rPr>
+        <w:t xml:space="preserve">Tiêu thụ mủ thu mua &amp; mủ thành phẩm</w:t>
+      </w:r>
+      <w:r>
+        <w:t xml:space="preserve"> — bảng 2 dòng cố định, nhập SL tiêu thụ và doanh thu cho từng loại.</w:t>
+      </w:r>
+    </w:p>
+    <w:p>
+      <w:pPr>
+        <w:pStyle w:val="ListParagraph"/>
+        <w:numPr>
+          <w:ilvl w:val="0"/>
+          <w:numId w:val="7"/>
+        </w:numPr>
+        <w:spacing w:after="100"/>
+      </w:pPr>
+      <w:r>
+        <w:rPr>
+          <w:b/>
+          <w:bCs/>
+        </w:rPr>
+        <w:t xml:space="preserve">Loại tiền</w:t>
+      </w:r>
+      <w:r>
+        <w:t xml:space="preserve"> — chọn VND hoặc USD </w:t>
+      </w:r>
+      <w:r>
+        <w:rPr>
+          <w:b/>
+          <w:bCs/>
+        </w:rPr>
+        <w:t xml:space="preserve">cho từng dòng</w:t>
+      </w:r>
+      <w:r>
+        <w:t xml:space="preserve">; chọn USD thì nhập </w:t>
+      </w:r>
+      <w:r>
+        <w:rPr>
+          <w:b/>
+          <w:bCs/>
+        </w:rPr>
         <w:t xml:space="preserve">Tỷ giá</w:t>
       </w:r>
       <w:r>
-        <w:t xml:space="preserve"> — chỉ hiện khi dòng đó chọn USD; dòng VND để dấu gạch ngang.</w:t>
+        <w:t xml:space="preserve"> ngay ở dòng đó.</w:t>
       </w:r>
     </w:p>
     <w:p>
@@ -1502,187 +1473,141 @@
           <w:b/>
           <w:bCs/>
         </w:rPr>
+        <w:t xml:space="preserve">Giá BQ</w:t>
+      </w:r>
+      <w:r>
+        <w:t xml:space="preserve"> hệ thống tự tính = doanh thu ÷ sản lượng. Xong bấm </w:t>
+      </w:r>
+      <w:r>
+        <w:rPr>
+          <w:b/>
+          <w:bCs/>
+        </w:rPr>
+        <w:t xml:space="preserve">Lưu số liệu</w:t>
+      </w:r>
+      <w:r>
+        <w:t xml:space="preserve">.</w:t>
+      </w:r>
+    </w:p>
+    <w:p>
+      <w:pPr>
+        <w:spacing w:after="80" w:before="140"/>
+      </w:pPr>
+      <w:r>
+        <w:rPr>
+          <w:b/>
+          <w:bCs/>
+        </w:rPr>
+        <w:t xml:space="preserve">Lưu ý:</w:t>
+      </w:r>
+    </w:p>
+    <w:p>
+      <w:pPr>
+        <w:pStyle w:val="ListParagraph"/>
+        <w:numPr>
+          <w:ilvl w:val="0"/>
+          <w:numId w:val="3"/>
+        </w:numPr>
+        <w:spacing w:after="80"/>
+      </w:pPr>
+      <w:r>
+        <w:rPr>
+          <w:b/>
+          <w:bCs/>
+        </w:rPr>
+        <w:t xml:space="preserve">Loại tiền chọn theo từng dòng</w:t>
+      </w:r>
+      <w:r>
+        <w:t xml:space="preserve"> — trong ngày vừa bán USD vừa bán VNĐ vẫn nhập chung một phiếu.</w:t>
+      </w:r>
+    </w:p>
+    <w:p>
+      <w:pPr>
+        <w:pStyle w:val="ListParagraph"/>
+        <w:numPr>
+          <w:ilvl w:val="0"/>
+          <w:numId w:val="3"/>
+        </w:numPr>
+        <w:spacing w:after="80"/>
+      </w:pPr>
+      <w:r>
+        <w:t xml:space="preserve">Nút </w:t>
+      </w:r>
+      <w:r>
+        <w:rPr>
+          <w:b/>
+          <w:bCs/>
+        </w:rPr>
+        <w:t xml:space="preserve">Lấy tỷ giá VCB cho các dòng USD</w:t>
+      </w:r>
+      <w:r>
+        <w:t xml:space="preserve"> điền tỷ giá Vietcombank cho mọi dòng đang chọn USD.</w:t>
+      </w:r>
+    </w:p>
+    <w:p>
+      <w:pPr>
+        <w:pStyle w:val="ListParagraph"/>
+        <w:numPr>
+          <w:ilvl w:val="0"/>
+          <w:numId w:val="3"/>
+        </w:numPr>
+        <w:spacing w:after="80"/>
+      </w:pPr>
+      <w:r>
+        <w:t xml:space="preserve">Doanh thu nhập theo </w:t>
+      </w:r>
+      <w:r>
+        <w:rPr>
+          <w:b/>
+          <w:bCs/>
+        </w:rPr>
+        <w:t xml:space="preserve">tỷ đồng</w:t>
+      </w:r>
+      <w:r>
+        <w:t xml:space="preserve"> khi chọn VND, theo </w:t>
+      </w:r>
+      <w:r>
+        <w:rPr>
+          <w:b/>
+          <w:bCs/>
+        </w:rPr>
+        <w:t xml:space="preserve">USD</w:t>
+      </w:r>
+      <w:r>
+        <w:t xml:space="preserve"> khi chọn USD (thiếu tỷ giá thì để trống, hệ thống không tự đoán).</w:t>
+      </w:r>
+    </w:p>
+    <w:p>
+      <w:pPr>
+        <w:pStyle w:val="ListParagraph"/>
+        <w:numPr>
+          <w:ilvl w:val="0"/>
+          <w:numId w:val="3"/>
+        </w:numPr>
+        <w:spacing w:after="80"/>
+      </w:pPr>
+      <w:r>
+        <w:t xml:space="preserve">Khối </w:t>
+      </w:r>
+      <w:r>
+        <w:rPr>
+          <w:b/>
+          <w:bCs/>
+        </w:rPr>
+        <w:t xml:space="preserve">Tổng hợp tiêu thụ</w:t>
+      </w:r>
+      <w:r>
+        <w:t xml:space="preserve"> và cột </w:t>
+      </w:r>
+      <w:r>
+        <w:rPr>
+          <w:b/>
+          <w:bCs/>
+        </w:rPr>
         <w:t xml:space="preserve">Doanh thu</w:t>
       </w:r>
       <w:r>
-        <w:t xml:space="preserve"> của dòng hệ thống </w:t>
-      </w:r>
-      <w:r>
-        <w:rPr>
-          <w:b/>
-          <w:bCs/>
-        </w:rPr>
-        <w:t xml:space="preserve">tự tính</w:t>
-      </w:r>
-      <w:r>
-        <w:t xml:space="preserve">.</w:t>
-      </w:r>
-    </w:p>
-    <w:p>
-      <w:pPr>
-        <w:pStyle w:val="ListParagraph"/>
-        <w:numPr>
-          <w:ilvl w:val="0"/>
-          <w:numId w:val="7"/>
-        </w:numPr>
-        <w:spacing w:after="100"/>
-      </w:pPr>
-      <w:r>
-        <w:rPr>
-          <w:b/>
-          <w:bCs/>
-        </w:rPr>
-        <w:t xml:space="preserve">Lấy tỷ giá VCB cho các dòng USD</w:t>
-      </w:r>
-      <w:r>
-        <w:t xml:space="preserve"> — điền tỷ giá Vietcombank vào mọi dòng đang chọn USD một lượt.</w:t>
-      </w:r>
-    </w:p>
-    <w:p>
-      <w:pPr>
-        <w:pStyle w:val="ListParagraph"/>
-        <w:numPr>
-          <w:ilvl w:val="0"/>
-          <w:numId w:val="7"/>
-        </w:numPr>
-        <w:spacing w:after="100"/>
-      </w:pPr>
-      <w:r>
-        <w:t xml:space="preserve">Nhập nốt </w:t>
-      </w:r>
-      <w:r>
-        <w:rPr>
-          <w:b/>
-          <w:bCs/>
-        </w:rPr>
-        <w:t xml:space="preserve">Ngày xuất hoá đơn</w:t>
-      </w:r>
-      <w:r>
-        <w:t xml:space="preserve"> và đính kèm </w:t>
-      </w:r>
-      <w:r>
-        <w:rPr>
-          <w:b/>
-          <w:bCs/>
-        </w:rPr>
-        <w:t xml:space="preserve">Bộ Hợp đồng</w:t>
-      </w:r>
-      <w:r>
-        <w:t xml:space="preserve">, rồi bấm </w:t>
-      </w:r>
-      <w:r>
-        <w:rPr>
-          <w:b/>
-          <w:bCs/>
-        </w:rPr>
-        <w:t xml:space="preserve">Lưu số liệu</w:t>
-      </w:r>
-      <w:r>
-        <w:t xml:space="preserve">.</w:t>
-      </w:r>
-    </w:p>
-    <w:p>
-      <w:pPr>
-        <w:spacing w:after="80" w:before="140"/>
-      </w:pPr>
-      <w:r>
-        <w:rPr>
-          <w:b/>
-          <w:bCs/>
-        </w:rPr>
-        <w:t xml:space="preserve">Lưu ý:</w:t>
-      </w:r>
-    </w:p>
-    <w:p>
-      <w:pPr>
-        <w:pStyle w:val="ListParagraph"/>
-        <w:numPr>
-          <w:ilvl w:val="0"/>
-          <w:numId w:val="3"/>
-        </w:numPr>
-        <w:spacing w:after="80"/>
-      </w:pPr>
-      <w:r>
-        <w:t xml:space="preserve">Dòng chọn USD mà </w:t>
-      </w:r>
-      <w:r>
-        <w:rPr>
-          <w:b/>
-          <w:bCs/>
-        </w:rPr>
-        <w:t xml:space="preserve">chưa nhập tỷ giá</w:t>
-      </w:r>
-      <w:r>
-        <w:t xml:space="preserve"> thì doanh thu dòng đó để trống — hệ thống không tự đoán tỷ giá.</w:t>
-      </w:r>
-    </w:p>
-    <w:p>
-      <w:pPr>
-        <w:pStyle w:val="ListParagraph"/>
-        <w:numPr>
-          <w:ilvl w:val="0"/>
-          <w:numId w:val="3"/>
-        </w:numPr>
-        <w:spacing w:after="80"/>
-      </w:pPr>
-      <w:r>
-        <w:t xml:space="preserve">Bảng </w:t>
-      </w:r>
-      <w:r>
-        <w:rPr>
-          <w:b/>
-          <w:bCs/>
-        </w:rPr>
-        <w:t xml:space="preserve">Tồn kho đã ký HĐ chưa giao</w:t>
-      </w:r>
-      <w:r>
-        <w:t xml:space="preserve"> cũng có cột *Tiền* và *Tỷ giá* riêng cho từng dòng.</w:t>
-      </w:r>
-    </w:p>
-    <w:p>
-      <w:pPr>
-        <w:pStyle w:val="ListParagraph"/>
-        <w:numPr>
-          <w:ilvl w:val="0"/>
-          <w:numId w:val="3"/>
-        </w:numPr>
-        <w:spacing w:after="80"/>
-      </w:pPr>
-      <w:r>
-        <w:t xml:space="preserve">Cột </w:t>
-      </w:r>
-      <w:r>
-        <w:rPr>
-          <w:b/>
-          <w:bCs/>
-        </w:rPr>
-        <w:t xml:space="preserve">Doanh thu</w:t>
-      </w:r>
-      <w:r>
-        <w:t xml:space="preserve"> từng dòng và khối </w:t>
-      </w:r>
-      <w:r>
-        <w:rPr>
-          <w:b/>
-          <w:bCs/>
-        </w:rPr>
-        <w:t xml:space="preserve">Tổng hợp tiêu thụ</w:t>
-      </w:r>
-      <w:r>
-        <w:t xml:space="preserve"> đều tự tính — không nhập tay.</w:t>
-      </w:r>
-    </w:p>
-    <w:p>
-      <w:pPr>
-        <w:pStyle w:val="ListParagraph"/>
-        <w:numPr>
-          <w:ilvl w:val="0"/>
-          <w:numId w:val="3"/>
-        </w:numPr>
-        <w:spacing w:after="80"/>
-      </w:pPr>
-      <w:r>
-        <w:t xml:space="preserve">Xoá một dòng bằng biểu tượng thùng rác ở cuối dòng.</w:t>
+        <w:t xml:space="preserve"> từng dòng đều tự tính — không nhập tay.</w:t>
       </w:r>
     </w:p>
     <w:p>
@@ -1836,7 +1761,7 @@
         <w:t xml:space="preserve">Lấy tồn ngày trước</w:t>
       </w:r>
       <w:r>
-        <w:t xml:space="preserve"> — chép toàn bộ tồn kho của ngày gần nhất sang, rồi sửa lại cho đúng ngày này.</w:t>
+        <w:t xml:space="preserve"> — chép toàn bộ tồn kho ngày gần nhất sang rồi sửa lại cho đúng ngày này.</w:t>
       </w:r>
     </w:p>
     <w:p>
@@ -1893,7 +1818,7 @@
           <w:b/>
           <w:bCs/>
         </w:rPr>
-        <w:t xml:space="preserve">3. Số lượng đã ký hợp đồng chưa giao</w:t>
+        <w:t xml:space="preserve">3. Số lượng đã ký hợp đồng</w:t>
       </w:r>
       <w:r>
         <w:t xml:space="preserve"> — thêm đơn giá, lịch giao và </w:t>
@@ -1926,7 +1851,7 @@
         <w:t xml:space="preserve">Đơn giá nhập bằng</w:t>
       </w:r>
       <w:r>
-        <w:t xml:space="preserve"> — chọn *VND* hoặc *USD* cho đơn giá ở khối 3 (chọn USD thì hiện ô tỷ giá).</w:t>
+        <w:t xml:space="preserve"> — chọn VND hoặc USD cho đơn giá ở khối 3.</w:t>
       </w:r>
     </w:p>
     <w:p>
@@ -1943,7 +1868,7 @@
           <w:b/>
           <w:bCs/>
         </w:rPr>
-        <w:t xml:space="preserve">4. Tồn kho nguyên liệu chưa sản xuất</w:t>
+        <w:t xml:space="preserve">4. Tồn kho nguyên liệu chưa sản xuất (quy khô)</w:t>
       </w:r>
       <w:r>
         <w:t xml:space="preserve"> — 1 ô số lượng (tấn). Xong bấm </w:t>
@@ -2001,17 +1926,17 @@
         <w:t xml:space="preserve">mọi đơn vị</w:t>
       </w:r>
       <w:r>
-        <w:t xml:space="preserve">. Câu “đối với các đơn vị chưa có nhà máy chế biến” là ghi chú của biểu mẫu cho biết ai thường có số này — đơn vị đã có nhà máy cứ </w:t>
-      </w:r>
-      <w:r>
-        <w:rPr>
-          <w:b/>
-          <w:bCs/>
-        </w:rPr>
-        <w:t xml:space="preserve">để trống ô đó</w:t>
-      </w:r>
-      <w:r>
-        <w:t xml:space="preserve">.</w:t>
+        <w:t xml:space="preserve">, </w:t>
+      </w:r>
+      <w:r>
+        <w:rPr>
+          <w:b/>
+          <w:bCs/>
+        </w:rPr>
+        <w:t xml:space="preserve">không phân biệt</w:t>
+      </w:r>
+      <w:r>
+        <w:t xml:space="preserve"> đơn vị có nhà máy hay không. Đơn vị nào không có số thì để trống.</w:t>
       </w:r>
     </w:p>
     <w:p>
@@ -2067,17 +1992,7 @@
         <w:t xml:space="preserve">Tổng hợp tồn kho</w:t>
       </w:r>
       <w:r>
-        <w:t xml:space="preserve"> tự tính: *Tồn kho thành phẩm* = khối 1 + khối 2. Khối 3 (</w:t>
-      </w:r>
-      <w:r>
-        <w:rPr>
-          <w:b/>
-          <w:bCs/>
-        </w:rPr>
-        <w:t xml:space="preserve">đã ký HĐ chưa giao</w:t>
-      </w:r>
-      <w:r>
-        <w:t xml:space="preserve">) là </w:t>
+        <w:t xml:space="preserve">: *Tồn kho thành phẩm* = khối 1 + khối 2. Khối 3 là </w:t>
       </w:r>
       <w:r>
         <w:rPr>
@@ -2087,7 +2002,7 @@
         <w:t xml:space="preserve">cam kết giao hàng</w:t>
       </w:r>
       <w:r>
-        <w:t xml:space="preserve">, đứng riêng — không cộng vào và không trừ khỏi tồn kho thành phẩm, nên ký nhiều hơn lượng đang có cũng không sao.</w:t>
+        <w:t xml:space="preserve">, đứng riêng — không cộng vào và không trừ khỏi tồn kho, nên ký nhiều hơn lượng đang có cũng không sao.</w:t>
       </w:r>
     </w:p>
     <w:p>
@@ -3185,10 +3100,43 @@
           <w:b/>
           <w:bCs/>
         </w:rPr>
+        <w:t xml:space="preserve">Thu mua</w:t>
+      </w:r>
+      <w:r>
+        <w:t xml:space="preserve"> đã bỏ 2 cột *SL tiêu thụ* và *Doanh thu* (chuyển sang biểu Tiêu thụ), thêm 3 cột: *SL thu mua thành phẩm* · *Đơn giá thành phẩm (VNĐ)* · *Đơn giá thành phẩm (ngoại tệ)*.</w:t>
+      </w:r>
+    </w:p>
+    <w:p>
+      <w:pPr>
+        <w:pStyle w:val="ListParagraph"/>
+        <w:numPr>
+          <w:ilvl w:val="0"/>
+          <w:numId w:val="3"/>
+        </w:numPr>
+        <w:spacing w:after="80"/>
+      </w:pPr>
+      <w:r>
+        <w:t xml:space="preserve">Mẫu </w:t>
+      </w:r>
+      <w:r>
+        <w:rPr>
+          <w:b/>
+          <w:bCs/>
+        </w:rPr>
         <w:t xml:space="preserve">Tồn kho</w:t>
       </w:r>
       <w:r>
-        <w:t xml:space="preserve">: cột *Nhóm* có 3 lựa chọn — Chế biến chưa nhập kho · Đã nhập kho · Đã ký HĐ chưa giao. Số lượng tính bằng </w:t>
+        <w:t xml:space="preserve">: cột *Nhóm* có 3 lựa chọn — Chế biến chưa nhập kho · Đã nhập kho · </w:t>
+      </w:r>
+      <w:r>
+        <w:rPr>
+          <w:b/>
+          <w:bCs/>
+        </w:rPr>
+        <w:t xml:space="preserve">Đã ký HĐ</w:t>
+      </w:r>
+      <w:r>
+        <w:t xml:space="preserve">. Số lượng tính bằng </w:t>
       </w:r>
       <w:r>
         <w:rPr>
@@ -3198,7 +3146,7 @@
         <w:t xml:space="preserve">tấn</w:t>
       </w:r>
       <w:r>
-        <w:t xml:space="preserve">. Riêng *Tồn kho nguyên liệu chưa sản xuất* là cột cuối, điền ở 1 dòng bất kỳ của ngày đó.</w:t>
+        <w:t xml:space="preserve">.</w:t>
       </w:r>
     </w:p>
     <w:p>

</xml_diff>

<commit_message>
docs(huong-dan): cover the two sales tables in the member guide
spec.json is what builds the Word file, so leaving it behind meant the
document handed to the member units still described the old single-table
form. It now matches README.md, and figure 5 was reshot against the
current screen: two tables, the two-row record, seven callouts following
the reading order.

Also fixes three older slips found while checking: section 2 pointed at
"mục 8" for the Excel part (it is 9), two figures were both numbered 9,
and the Excel note said three dropdown columns when there are now four.
</commit_message>
<xml_diff>
--- a/docs/huong-dan/nhap-lieu-don-vi-thanh-vien/Huong-dan-nhap-lieu-don-vi-thanh-vien.docx
+++ b/docs/huong-dan/nhap-lieu-don-vi-thanh-vien/Huong-dan-nhap-lieu-don-vi-thanh-vien.docx
@@ -473,7 +473,7 @@
         <w:t xml:space="preserve">Tải mẫu Excel</w:t>
       </w:r>
       <w:r>
-        <w:t xml:space="preserve"> — tải file mẫu về để điền ngoại tuyến (xem mục 8).</w:t>
+        <w:t xml:space="preserve"> — tải file mẫu về để điền ngoại tuyến (xem mục 9).</w:t>
       </w:r>
     </w:p>
     <w:p>
@@ -493,7 +493,7 @@
         <w:t xml:space="preserve">Nhập từ Excel</w:t>
       </w:r>
       <w:r>
-        <w:t xml:space="preserve"> — nhập file đã điền lên hệ thống (xem mục 8).</w:t>
+        <w:t xml:space="preserve"> — nhập file đã điền lên hệ thống (xem mục 9).</w:t>
       </w:r>
     </w:p>
     <w:p>
@@ -1222,7 +1222,47 @@
         <w:spacing w:after="140"/>
       </w:pPr>
       <w:r>
-        <w:t xml:space="preserve">Mỗi hợp đồng bán là một dòng, hệ thống tự cộng lại. Bên dưới là bảng tiêu thụ mủ thu mua và mủ thành phẩm (phần này trước nằm ở phiếu Thu mua).</w:t>
+        <w:t xml:space="preserve">Mỗi hợp đồng bán là một dòng, hệ thống tự cộng lại. Phiếu có 2 bảng nhập tách riêng — </w:t>
+      </w:r>
+      <w:r>
+        <w:rPr>
+          <w:b/>
+          <w:bCs/>
+        </w:rPr>
+        <w:t xml:space="preserve">Tiêu thụ mủ thu mua</w:t>
+      </w:r>
+      <w:r>
+        <w:t xml:space="preserve"> và </w:t>
+      </w:r>
+      <w:r>
+        <w:rPr>
+          <w:b/>
+          <w:bCs/>
+        </w:rPr>
+        <w:t xml:space="preserve">Tiêu thụ mủ khai thác</w:t>
+      </w:r>
+      <w:r>
+        <w:t xml:space="preserve"> — để lưu trữ riêng từng nguồn mủ; phần </w:t>
+      </w:r>
+      <w:r>
+        <w:rPr>
+          <w:b/>
+          <w:bCs/>
+        </w:rPr>
+        <w:t xml:space="preserve">Tổng hợp tiêu thụ</w:t>
+      </w:r>
+      <w:r>
+        <w:t xml:space="preserve"> vẫn cộng chung cả hai. Vì mỗi hợp đồng có nhiều thông tin nên một bản ghi được bố trí </w:t>
+      </w:r>
+      <w:r>
+        <w:rPr>
+          <w:b/>
+          <w:bCs/>
+        </w:rPr>
+        <w:t xml:space="preserve">2 hàng</w:t>
+      </w:r>
+      <w:r>
+        <w:t xml:space="preserve">: hàng trên là số liệu bán, hàng dưới là chứng từ đi kèm. Bên dưới là bảng tiêu thụ mủ thu mua và mủ thành phẩm (phần này trước nằm ở phiếu Thu mua).</w:t>
       </w:r>
     </w:p>
     <w:p>
@@ -1284,7 +1324,7 @@
           <w:sz w:val="17"/>
           <w:szCs w:val="17"/>
         </w:rPr>
-        <w:t xml:space="preserve">Hình 5. Phiếu Tiêu thụ — bảng nhiều dòng</w:t>
+        <w:t xml:space="preserve">Hình 5. Phiếu Tiêu thụ — 2 bảng theo nguồn mủ, mỗi bản ghi 2 hàng</w:t>
       </w:r>
     </w:p>
     <w:p>
@@ -1309,6 +1349,9 @@
         <w:spacing w:after="100"/>
       </w:pPr>
       <w:r>
+        <w:t xml:space="preserve">*(Hàng trên)* </w:t>
+      </w:r>
+      <w:r>
         <w:rPr>
           <w:b/>
           <w:bCs/>
@@ -1369,6 +1412,62 @@
         <w:spacing w:after="100"/>
       </w:pPr>
       <w:r>
+        <w:t xml:space="preserve">*(Hàng trên)* </w:t>
+      </w:r>
+      <w:r>
+        <w:rPr>
+          <w:b/>
+          <w:bCs/>
+        </w:rPr>
+        <w:t xml:space="preserve">Loại tiền</w:t>
+      </w:r>
+      <w:r>
+        <w:t xml:space="preserve"> — chọn VND hoặc USD </w:t>
+      </w:r>
+      <w:r>
+        <w:rPr>
+          <w:b/>
+          <w:bCs/>
+        </w:rPr>
+        <w:t xml:space="preserve">cho từng dòng</w:t>
+      </w:r>
+      <w:r>
+        <w:t xml:space="preserve">; chọn USD thì nhập </w:t>
+      </w:r>
+      <w:r>
+        <w:rPr>
+          <w:b/>
+          <w:bCs/>
+        </w:rPr>
+        <w:t xml:space="preserve">Tỷ giá</w:t>
+      </w:r>
+      <w:r>
+        <w:t xml:space="preserve"> ngay ở dòng đó.</w:t>
+      </w:r>
+    </w:p>
+    <w:p>
+      <w:pPr>
+        <w:pStyle w:val="ListParagraph"/>
+        <w:numPr>
+          <w:ilvl w:val="0"/>
+          <w:numId w:val="7"/>
+        </w:numPr>
+        <w:spacing w:after="100"/>
+      </w:pPr>
+      <w:r>
+        <w:t xml:space="preserve">*(Hàng dưới)* </w:t>
+      </w:r>
+      <w:r>
+        <w:rPr>
+          <w:b/>
+          <w:bCs/>
+        </w:rPr>
+        <w:t xml:space="preserve">Ngày xuất kho</w:t>
+      </w:r>
+      <w:r>
+        <w:t xml:space="preserve"> và </w:t>
+      </w:r>
+      <w:r>
         <w:rPr>
           <w:b/>
           <w:bCs/>
@@ -1376,7 +1475,7 @@
         <w:t xml:space="preserve">Ngày xuất hoá đơn</w:t>
       </w:r>
       <w:r>
-        <w:t xml:space="preserve"> — chưa xuất thì để trống.</w:t>
+        <w:t xml:space="preserve"> — chưa có thì để trống.</w:t>
       </w:r>
     </w:p>
     <w:p>
@@ -1389,6 +1488,9 @@
         <w:spacing w:after="100"/>
       </w:pPr>
       <w:r>
+        <w:t xml:space="preserve">*(Hàng dưới)* 3 chứng từ đính kèm: </w:t>
+      </w:r>
+      <w:r>
         <w:rPr>
           <w:b/>
           <w:bCs/>
@@ -1396,7 +1498,27 @@
         <w:t xml:space="preserve">Bộ Hợp đồng</w:t>
       </w:r>
       <w:r>
-        <w:t xml:space="preserve"> — đính kèm PDF hoặc ảnh; bấm tên file để mở lại.</w:t>
+        <w:t xml:space="preserve"> · </w:t>
+      </w:r>
+      <w:r>
+        <w:rPr>
+          <w:b/>
+          <w:bCs/>
+        </w:rPr>
+        <w:t xml:space="preserve">Phiếu xuất kho</w:t>
+      </w:r>
+      <w:r>
+        <w:t xml:space="preserve"> · </w:t>
+      </w:r>
+      <w:r>
+        <w:rPr>
+          <w:b/>
+          <w:bCs/>
+        </w:rPr>
+        <w:t xml:space="preserve">Hoá đơn</w:t>
+      </w:r>
+      <w:r>
+        <w:t xml:space="preserve"> — PDF hoặc ảnh; bấm tên file để mở lại.</w:t>
       </w:r>
     </w:p>
     <w:p>
@@ -1413,6 +1535,26 @@
           <w:b/>
           <w:bCs/>
         </w:rPr>
+        <w:t xml:space="preserve">Tiêu thụ mủ khai thác</w:t>
+      </w:r>
+      <w:r>
+        <w:t xml:space="preserve"> — bảng riêng ngay bên dưới, nhập y hệt bảng mủ thu mua.</w:t>
+      </w:r>
+    </w:p>
+    <w:p>
+      <w:pPr>
+        <w:pStyle w:val="ListParagraph"/>
+        <w:numPr>
+          <w:ilvl w:val="0"/>
+          <w:numId w:val="7"/>
+        </w:numPr>
+        <w:spacing w:after="100"/>
+      </w:pPr>
+      <w:r>
+        <w:rPr>
+          <w:b/>
+          <w:bCs/>
+        </w:rPr>
         <w:t xml:space="preserve">Tiêu thụ mủ thu mua &amp; mủ thành phẩm</w:t>
       </w:r>
       <w:r>
@@ -1433,46 +1575,6 @@
           <w:b/>
           <w:bCs/>
         </w:rPr>
-        <w:t xml:space="preserve">Loại tiền</w:t>
-      </w:r>
-      <w:r>
-        <w:t xml:space="preserve"> — chọn VND hoặc USD </w:t>
-      </w:r>
-      <w:r>
-        <w:rPr>
-          <w:b/>
-          <w:bCs/>
-        </w:rPr>
-        <w:t xml:space="preserve">cho từng dòng</w:t>
-      </w:r>
-      <w:r>
-        <w:t xml:space="preserve">; chọn USD thì nhập </w:t>
-      </w:r>
-      <w:r>
-        <w:rPr>
-          <w:b/>
-          <w:bCs/>
-        </w:rPr>
-        <w:t xml:space="preserve">Tỷ giá</w:t>
-      </w:r>
-      <w:r>
-        <w:t xml:space="preserve"> ngay ở dòng đó.</w:t>
-      </w:r>
-    </w:p>
-    <w:p>
-      <w:pPr>
-        <w:pStyle w:val="ListParagraph"/>
-        <w:numPr>
-          <w:ilvl w:val="0"/>
-          <w:numId w:val="7"/>
-        </w:numPr>
-        <w:spacing w:after="100"/>
-      </w:pPr>
-      <w:r>
-        <w:rPr>
-          <w:b/>
-          <w:bCs/>
-        </w:rPr>
         <w:t xml:space="preserve">Giá BQ</w:t>
       </w:r>
       <w:r>
@@ -1515,6 +1617,26 @@
           <w:b/>
           <w:bCs/>
         </w:rPr>
+        <w:t xml:space="preserve">Mủ thu mua và mủ khai thác nhập ở 2 bảng riêng</w:t>
+      </w:r>
+      <w:r>
+        <w:t xml:space="preserve"> để lưu trữ tách bạch, nhưng mọi số tổng (SL · doanh thu · giá BQ) đều cộng chung cả hai.</w:t>
+      </w:r>
+    </w:p>
+    <w:p>
+      <w:pPr>
+        <w:pStyle w:val="ListParagraph"/>
+        <w:numPr>
+          <w:ilvl w:val="0"/>
+          <w:numId w:val="3"/>
+        </w:numPr>
+        <w:spacing w:after="80"/>
+      </w:pPr>
+      <w:r>
+        <w:rPr>
+          <w:b/>
+          <w:bCs/>
+        </w:rPr>
         <w:t xml:space="preserve">Loại tiền chọn theo từng dòng</w:t>
       </w:r>
       <w:r>
@@ -1541,7 +1663,17 @@
         <w:t xml:space="preserve">Lấy tỷ giá VCB cho các dòng USD</w:t>
       </w:r>
       <w:r>
-        <w:t xml:space="preserve"> điền tỷ giá Vietcombank cho mọi dòng đang chọn USD.</w:t>
+        <w:t xml:space="preserve"> điền tỷ giá Vietcombank cho mọi dòng đang chọn USD của </w:t>
+      </w:r>
+      <w:r>
+        <w:rPr>
+          <w:b/>
+          <w:bCs/>
+        </w:rPr>
+        <w:t xml:space="preserve">cả 2 bảng</w:t>
+      </w:r>
+      <w:r>
+        <w:t xml:space="preserve">.</w:t>
       </w:r>
     </w:p>
     <w:p>
@@ -2406,7 +2538,7 @@
           <w:sz w:val="17"/>
           <w:szCs w:val="17"/>
         </w:rPr>
-        <w:t xml:space="preserve">Hình 9. Nhập Nhu cầu thị trường</w:t>
+        <w:t xml:space="preserve">Hình 8. Nhập Nhu cầu thị trường</w:t>
       </w:r>
     </w:p>
     <w:p>
@@ -3020,6 +3152,49 @@
         <w:spacing w:after="80"/>
       </w:pPr>
       <w:r>
+        <w:t xml:space="preserve">⚠️ File </w:t>
+      </w:r>
+      <w:r>
+        <w:rPr>
+          <w:b/>
+          <w:bCs/>
+        </w:rPr>
+        <w:t xml:space="preserve">Tiêu thụ</w:t>
+      </w:r>
+      <w:r>
+        <w:t xml:space="preserve"> ghi đè </w:t>
+      </w:r>
+      <w:r>
+        <w:rPr>
+          <w:b/>
+          <w:bCs/>
+        </w:rPr>
+        <w:t xml:space="preserve">toàn bộ</w:t>
+      </w:r>
+      <w:r>
+        <w:t xml:space="preserve"> phần tiêu thụ của ngày đó, </w:t>
+      </w:r>
+      <w:r>
+        <w:rPr>
+          <w:b/>
+          <w:bCs/>
+        </w:rPr>
+        <w:t xml:space="preserve">cả mủ thu mua lẫn mủ khai thác</w:t>
+      </w:r>
+      <w:r>
+        <w:t xml:space="preserve">. Dòng nào đã nhập trên web mà không có trong file sẽ bị xoá — nên chép đủ cả 2 nguồn mủ vào file trước khi nhập lên.</w:t>
+      </w:r>
+    </w:p>
+    <w:p>
+      <w:pPr>
+        <w:pStyle w:val="ListParagraph"/>
+        <w:numPr>
+          <w:ilvl w:val="0"/>
+          <w:numId w:val="3"/>
+        </w:numPr>
+        <w:spacing w:after="80"/>
+      </w:pPr>
+      <w:r>
         <w:rPr>
           <w:b/>
           <w:bCs/>
@@ -3040,7 +3215,7 @@
         <w:spacing w:after="80"/>
       </w:pPr>
       <w:r>
-        <w:t xml:space="preserve">Ba cột </w:t>
+        <w:t xml:space="preserve">Bốn cột </w:t>
       </w:r>
       <w:r>
         <w:rPr>
@@ -3050,7 +3225,7 @@
         <w:t xml:space="preserve">chọn từ danh sách</w:t>
       </w:r>
       <w:r>
-        <w:t xml:space="preserve"> mới có, phải điền đúng thì số mới vào đúng đơn vị tính: *Đơn giá mủ chén tính theo* (Độ TSC / Độ DRC) ở mẫu </w:t>
+        <w:t xml:space="preserve"> để trống được, nhưng phải điền đúng thì số mới vào đúng chỗ: *Đơn giá mủ chén tính theo* (Độ TSC / Độ DRC) ở mẫu </w:t>
       </w:r>
       <w:r>
         <w:rPr>
@@ -3060,7 +3235,7 @@
         <w:t xml:space="preserve">Thu mua</w:t>
       </w:r>
       <w:r>
-        <w:t xml:space="preserve">; *Giá bán bằng* (VND / USD) ở mẫu </w:t>
+        <w:t xml:space="preserve">; *Nguồn mủ* (Mủ thu mua / Mủ khai thác) và *Giá bán bằng* (VND / USD) ở mẫu </w:t>
       </w:r>
       <w:r>
         <w:rPr>
@@ -3080,7 +3255,7 @@
         <w:t xml:space="preserve">Tồn kho</w:t>
       </w:r>
       <w:r>
-        <w:t xml:space="preserve">. Bỏ trống thì hệ thống hiểu là Độ TSC và VND.</w:t>
+        <w:t xml:space="preserve">. Bỏ trống thì hệ thống hiểu là Độ TSC · Mủ thu mua · VND.</w:t>
       </w:r>
     </w:p>
     <w:p>
@@ -3169,17 +3344,27 @@
         <w:t xml:space="preserve">Tiêu thụ</w:t>
       </w:r>
       <w:r>
-        <w:t xml:space="preserve"> có cột *Ngày xuất hoá đơn*. Riêng </w:t>
-      </w:r>
-      <w:r>
-        <w:rPr>
-          <w:b/>
-          <w:bCs/>
-        </w:rPr>
-        <w:t xml:space="preserve">file bộ Hợp đồng phải đính kèm trên web</w:t>
-      </w:r>
-      <w:r>
-        <w:t xml:space="preserve"> — file Excel không mang theo file đính kèm được.</w:t>
+        <w:t xml:space="preserve"> có cột *Nguồn mủ* (chọn *Mủ thu mua* hoặc *Mủ khai thác* — để trống thì hiểu là </w:t>
+      </w:r>
+      <w:r>
+        <w:rPr>
+          <w:b/>
+          <w:bCs/>
+        </w:rPr>
+        <w:t xml:space="preserve">mủ thu mua</w:t>
+      </w:r>
+      <w:r>
+        <w:t xml:space="preserve">), cùng 2 cột ngày: *Ngày xuất kho* và *Ngày xuất hoá đơn*. Riêng </w:t>
+      </w:r>
+      <w:r>
+        <w:rPr>
+          <w:b/>
+          <w:bCs/>
+        </w:rPr>
+        <w:t xml:space="preserve">3 file đính kèm — bộ Hợp đồng · phiếu xuất kho · hoá đơn — phải tải lên trên web</w:t>
+      </w:r>
+      <w:r>
+        <w:t xml:space="preserve">, file Excel không mang theo file đính kèm được.</w:t>
       </w:r>
     </w:p>
     <w:sectPr>

</xml_diff>

<commit_message>
docs(huong-dan): add the Excel import guide with the three templates
The three report templates had no written guide: what each column means,
which ones are compulsory, and what the values in the preview table are
telling you. This adds one, with the templates themselves attached for
practice, and links to it from the member guide.

Every column description was read off the running template spec, and all
three attached files were filled in and imported back to check the
figures survive the round trip.
</commit_message>
<xml_diff>
--- a/docs/huong-dan/nhap-lieu-don-vi-thanh-vien/Huong-dan-nhap-lieu-don-vi-thanh-vien.docx
+++ b/docs/huong-dan/nhap-lieu-don-vi-thanh-vien/Huong-dan-nhap-lieu-don-vi-thanh-vien.docx
@@ -3071,6 +3071,29 @@
           <w:bCs/>
         </w:rPr>
         <w:t xml:space="preserve">Lưu ý:</w:t>
+      </w:r>
+    </w:p>
+    <w:p>
+      <w:pPr>
+        <w:pStyle w:val="ListParagraph"/>
+        <w:numPr>
+          <w:ilvl w:val="0"/>
+          <w:numId w:val="3"/>
+        </w:numPr>
+        <w:spacing w:after="80"/>
+      </w:pPr>
+      <w:r>
+        <w:t xml:space="preserve">Chi tiết từng cột của ba biểu mẫu (kèm file mẫu và cách xử lý dòng lỗi): xem tài liệu riêng </w:t>
+      </w:r>
+      <w:r>
+        <w:rPr>
+          <w:b/>
+          <w:bCs/>
+        </w:rPr>
+        <w:t xml:space="preserve">Hướng dẫn nhập liệu bằng Excel</w:t>
+      </w:r>
+      <w:r>
+        <w:t xml:space="preserve"> trong thư mục `docs/huong-dan/nhap-lieu-bang-excel/`.</w:t>
       </w:r>
     </w:p>
     <w:p>

</xml_diff>

<commit_message>
docs(huong-dan): refresh the member-unit guide for the current screens
Follow the menu order by moving market demand ahead of the year plan,
and retake every screenshot on the current build.

Update the consumption section: the harvested-latex table now comes
first and the redundant purchased/finished block is gone. Note that the
stock section picks its currency per row, and that the year-plan screen
only lists units that were given a purchase plan.

Declare the real pixel size of each image so Word stops stretching the
taller screenshots.
</commit_message>
<xml_diff>
--- a/docs/huong-dan/nhap-lieu-don-vi-thanh-vien/Huong-dan-nhap-lieu-don-vi-thanh-vien.docx
+++ b/docs/huong-dan/nhap-lieu-don-vi-thanh-vien/Huong-dan-nhap-lieu-don-vi-thanh-vien.docx
@@ -16,7 +16,7 @@
         <w:spacing w:after="200"/>
       </w:pPr>
       <w:r>
-        <w:t xml:space="preserve">Tài liệu dành cho cán bộ đơn vị thành viên VRG nhập số liệu hằng ngày trên Hệ thống Dự báo &amp; Quản trị Giá Cao su. Tài khoản đơn vị chỉ thấy và chỉ nhập được số liệu của chính đơn vị mình. Có 5 mục cần nhập: Báo cáo thu mua, Báo cáo tiêu thụ, Báo cáo tồn kho và Nhu cầu thị trường (nhập theo NGÀY), cùng Kế hoạch năm (nhập 1 lần cho cả năm). Tài liệu bám theo phiên bản 0.2.74. Riêng 4 mục báo cáo còn có thể tải mẫu Excel về điền rồi nhập lên thay vì gõ tay (xem mục 9).</w:t>
+        <w:t xml:space="preserve">Tài liệu dành cho cán bộ đơn vị thành viên VRG nhập số liệu hằng ngày trên Hệ thống Dự báo &amp; Quản trị Giá Cao su. Tài khoản đơn vị chỉ thấy và chỉ nhập được số liệu của chính đơn vị mình. Có 5 mục cần nhập: Báo cáo thu mua, Báo cáo tiêu thụ, Báo cáo tồn kho và Nhu cầu thị trường (nhập theo NGÀY), cùng Kế hoạch năm (nhập 1 lần cho cả năm). Tài liệu bám theo phiên bản 0.2.76. Riêng 4 mục báo cáo còn có thể tải mẫu Excel về điền rồi nhập lên thay vì gõ tay (xem mục 9).</w:t>
       </w:r>
     </w:p>
     <w:p>
@@ -236,6 +236,36 @@
           <w:b/>
           <w:bCs/>
         </w:rPr>
+        <w:t xml:space="preserve">Nhu cầu thị trường</w:t>
+      </w:r>
+      <w:r>
+        <w:t xml:space="preserve"> — ghi nhận nhu cầu/tín hiệu thị trường của đơn vị, nhập </w:t>
+      </w:r>
+      <w:r>
+        <w:rPr>
+          <w:b/>
+          <w:bCs/>
+        </w:rPr>
+        <w:t xml:space="preserve">tự do bằng chữ</w:t>
+      </w:r>
+      <w:r>
+        <w:t xml:space="preserve">.</w:t>
+      </w:r>
+    </w:p>
+    <w:p>
+      <w:pPr>
+        <w:pStyle w:val="ListParagraph"/>
+        <w:numPr>
+          <w:ilvl w:val="0"/>
+          <w:numId w:val="2"/>
+        </w:numPr>
+        <w:spacing w:after="100"/>
+      </w:pPr>
+      <w:r>
+        <w:rPr>
+          <w:b/>
+          <w:bCs/>
+        </w:rPr>
         <w:t xml:space="preserve">Kế hoạch năm</w:t>
       </w:r>
       <w:r>
@@ -247,36 +277,6 @@
           <w:bCs/>
         </w:rPr>
         <w:t xml:space="preserve">nhập 1 lần cho cả năm</w:t>
-      </w:r>
-      <w:r>
-        <w:t xml:space="preserve">.</w:t>
-      </w:r>
-    </w:p>
-    <w:p>
-      <w:pPr>
-        <w:pStyle w:val="ListParagraph"/>
-        <w:numPr>
-          <w:ilvl w:val="0"/>
-          <w:numId w:val="2"/>
-        </w:numPr>
-        <w:spacing w:after="100"/>
-      </w:pPr>
-      <w:r>
-        <w:rPr>
-          <w:b/>
-          <w:bCs/>
-        </w:rPr>
-        <w:t xml:space="preserve">Nhu cầu thị trường</w:t>
-      </w:r>
-      <w:r>
-        <w:t xml:space="preserve"> — ghi nhận nhu cầu/tín hiệu thị trường của đơn vị, nhập </w:t>
-      </w:r>
-      <w:r>
-        <w:rPr>
-          <w:b/>
-          <w:bCs/>
-        </w:rPr>
-        <w:t xml:space="preserve">tự do bằng chữ</w:t>
       </w:r>
       <w:r>
         <w:t xml:space="preserve">.</w:t>
@@ -591,7 +591,7 @@
       <w:r>
         <w:drawing>
           <wp:inline distT="0" distB="0" distL="0" distR="0">
-            <wp:extent cx="6191250" cy="3714750"/>
+            <wp:extent cx="6191250" cy="4543425"/>
             <wp:effectExtent t="0" r="0" b="0" l="0"/>
             <wp:docPr id="1" name="img" descr="Ảnh hướng dẫn có đánh số bước" title="img/03-thu-mua-vn.png"/>
             <wp:cNvGraphicFramePr>
@@ -616,7 +616,7 @@
                   <pic:spPr bwMode="auto">
                     <a:xfrm>
                       <a:off x="0" y="0"/>
-                      <a:ext cx="6191250" cy="3714750"/>
+                      <a:ext cx="6191250" cy="4543425"/>
                     </a:xfrm>
                     <a:prstGeom prst="rect">
                       <a:avLst/>
@@ -948,7 +948,7 @@
       <w:r>
         <w:drawing>
           <wp:inline distT="0" distB="0" distL="0" distR="0">
-            <wp:extent cx="6191250" cy="3714750"/>
+            <wp:extent cx="6191250" cy="4543425"/>
             <wp:effectExtent t="0" r="0" b="0" l="0"/>
             <wp:docPr id="1" name="img" descr="Ảnh hướng dẫn có đánh số bước" title="img/04-thu-mua-nuoc-ngoai.png"/>
             <wp:cNvGraphicFramePr>
@@ -973,7 +973,7 @@
                   <pic:spPr bwMode="auto">
                     <a:xfrm>
                       <a:off x="0" y="0"/>
-                      <a:ext cx="6191250" cy="3714750"/>
+                      <a:ext cx="6191250" cy="4543425"/>
                     </a:xfrm>
                     <a:prstGeom prst="rect">
                       <a:avLst/>
@@ -1229,19 +1229,19 @@
           <w:b/>
           <w:bCs/>
         </w:rPr>
+        <w:t xml:space="preserve">Tiêu thụ mủ khai thác</w:t>
+      </w:r>
+      <w:r>
+        <w:t xml:space="preserve"> và </w:t>
+      </w:r>
+      <w:r>
+        <w:rPr>
+          <w:b/>
+          <w:bCs/>
+        </w:rPr>
         <w:t xml:space="preserve">Tiêu thụ mủ thu mua</w:t>
       </w:r>
       <w:r>
-        <w:t xml:space="preserve"> và </w:t>
-      </w:r>
-      <w:r>
-        <w:rPr>
-          <w:b/>
-          <w:bCs/>
-        </w:rPr>
-        <w:t xml:space="preserve">Tiêu thụ mủ khai thác</w:t>
-      </w:r>
-      <w:r>
         <w:t xml:space="preserve"> — để lưu trữ riêng từng nguồn mủ; phần </w:t>
       </w:r>
       <w:r>
@@ -1262,7 +1262,7 @@
         <w:t xml:space="preserve">2 hàng</w:t>
       </w:r>
       <w:r>
-        <w:t xml:space="preserve">: hàng trên là số liệu bán, hàng dưới là chứng từ đi kèm. Bên dưới là bảng tiêu thụ mủ thu mua và mủ thành phẩm (phần này trước nằm ở phiếu Thu mua).</w:t>
+        <w:t xml:space="preserve">: hàng trên là số liệu bán, hàng dưới là chứng từ đi kèm.</w:t>
       </w:r>
     </w:p>
     <w:p>
@@ -1273,7 +1273,7 @@
       <w:r>
         <w:drawing>
           <wp:inline distT="0" distB="0" distL="0" distR="0">
-            <wp:extent cx="6191250" cy="3714750"/>
+            <wp:extent cx="6191250" cy="4953000"/>
             <wp:effectExtent t="0" r="0" b="0" l="0"/>
             <wp:docPr id="1" name="img" descr="Ảnh hướng dẫn có đánh số bước" title="img/05-tieu-thu.png"/>
             <wp:cNvGraphicFramePr>
@@ -1298,7 +1298,7 @@
                   <pic:spPr bwMode="auto">
                     <a:xfrm>
                       <a:off x="0" y="0"/>
-                      <a:ext cx="6191250" cy="3714750"/>
+                      <a:ext cx="6191250" cy="4953000"/>
                     </a:xfrm>
                     <a:prstGeom prst="rect">
                       <a:avLst/>
@@ -1465,7 +1465,7 @@
         <w:t xml:space="preserve">Ngày xuất kho</w:t>
       </w:r>
       <w:r>
-        <w:t xml:space="preserve"> và </w:t>
+        <w:t xml:space="preserve"> · </w:t>
       </w:r>
       <w:r>
         <w:rPr>
@@ -1475,7 +1475,37 @@
         <w:t xml:space="preserve">Ngày xuất hoá đơn</w:t>
       </w:r>
       <w:r>
-        <w:t xml:space="preserve"> — chưa có thì để trống.</w:t>
+        <w:t xml:space="preserve"> và 3 chứng từ đính kèm </w:t>
+      </w:r>
+      <w:r>
+        <w:rPr>
+          <w:b/>
+          <w:bCs/>
+        </w:rPr>
+        <w:t xml:space="preserve">Bộ Hợp đồng</w:t>
+      </w:r>
+      <w:r>
+        <w:t xml:space="preserve"> · </w:t>
+      </w:r>
+      <w:r>
+        <w:rPr>
+          <w:b/>
+          <w:bCs/>
+        </w:rPr>
+        <w:t xml:space="preserve">Phiếu xuất kho</w:t>
+      </w:r>
+      <w:r>
+        <w:t xml:space="preserve"> · </w:t>
+      </w:r>
+      <w:r>
+        <w:rPr>
+          <w:b/>
+          <w:bCs/>
+        </w:rPr>
+        <w:t xml:space="preserve">Hoá đơn</w:t>
+      </w:r>
+      <w:r>
+        <w:t xml:space="preserve"> (PDF hoặc ảnh) — chưa có thì để trống; bấm tên file để mở lại.</w:t>
       </w:r>
     </w:p>
     <w:p>
@@ -1488,37 +1518,14 @@
         <w:spacing w:after="100"/>
       </w:pPr>
       <w:r>
-        <w:t xml:space="preserve">*(Hàng dưới)* 3 chứng từ đính kèm: </w:t>
-      </w:r>
-      <w:r>
-        <w:rPr>
-          <w:b/>
-          <w:bCs/>
-        </w:rPr>
-        <w:t xml:space="preserve">Bộ Hợp đồng</w:t>
-      </w:r>
-      <w:r>
-        <w:t xml:space="preserve"> · </w:t>
-      </w:r>
-      <w:r>
-        <w:rPr>
-          <w:b/>
-          <w:bCs/>
-        </w:rPr>
-        <w:t xml:space="preserve">Phiếu xuất kho</w:t>
-      </w:r>
-      <w:r>
-        <w:t xml:space="preserve"> · </w:t>
-      </w:r>
-      <w:r>
-        <w:rPr>
-          <w:b/>
-          <w:bCs/>
-        </w:rPr>
-        <w:t xml:space="preserve">Hoá đơn</w:t>
-      </w:r>
-      <w:r>
-        <w:t xml:space="preserve"> — PDF hoặc ảnh; bấm tên file để mở lại.</w:t>
+        <w:rPr>
+          <w:b/>
+          <w:bCs/>
+        </w:rPr>
+        <w:t xml:space="preserve">Tiêu thụ mủ thu mua</w:t>
+      </w:r>
+      <w:r>
+        <w:t xml:space="preserve"> — bảng riêng ngay bên dưới, nhập y hệt bảng mủ khai thác.</w:t>
       </w:r>
     </w:p>
     <w:p>
@@ -1535,41 +1542,11 @@
           <w:b/>
           <w:bCs/>
         </w:rPr>
-        <w:t xml:space="preserve">Tiêu thụ mủ khai thác</w:t>
-      </w:r>
-      <w:r>
-        <w:t xml:space="preserve"> — bảng riêng ngay bên dưới, nhập y hệt bảng mủ thu mua.</w:t>
-      </w:r>
-    </w:p>
-    <w:p>
-      <w:pPr>
-        <w:pStyle w:val="ListParagraph"/>
-        <w:numPr>
-          <w:ilvl w:val="0"/>
-          <w:numId w:val="7"/>
-        </w:numPr>
-        <w:spacing w:after="100"/>
-      </w:pPr>
-      <w:r>
-        <w:rPr>
-          <w:b/>
-          <w:bCs/>
-        </w:rPr>
-        <w:t xml:space="preserve">Tiêu thụ mủ thu mua &amp; mủ thành phẩm</w:t>
-      </w:r>
-      <w:r>
-        <w:t xml:space="preserve"> — bảng 2 dòng cố định, nhập SL tiêu thụ và doanh thu cho từng loại.</w:t>
-      </w:r>
-    </w:p>
-    <w:p>
-      <w:pPr>
-        <w:pStyle w:val="ListParagraph"/>
-        <w:numPr>
-          <w:ilvl w:val="0"/>
-          <w:numId w:val="7"/>
-        </w:numPr>
-        <w:spacing w:after="100"/>
-      </w:pPr>
+        <w:t xml:space="preserve">Tổng hợp tiêu thụ</w:t>
+      </w:r>
+      <w:r>
+        <w:t xml:space="preserve"> — hệ thống tự cộng cả 2 bảng; </w:t>
+      </w:r>
       <w:r>
         <w:rPr>
           <w:b/>
@@ -1578,7 +1555,7 @@
         <w:t xml:space="preserve">Giá BQ</w:t>
       </w:r>
       <w:r>
-        <w:t xml:space="preserve"> hệ thống tự tính = doanh thu ÷ sản lượng. Xong bấm </w:t>
+        <w:t xml:space="preserve"> = doanh thu ÷ sản lượng. Xong bấm </w:t>
       </w:r>
       <w:r>
         <w:rPr>
@@ -1617,7 +1594,7 @@
           <w:b/>
           <w:bCs/>
         </w:rPr>
-        <w:t xml:space="preserve">Mủ thu mua và mủ khai thác nhập ở 2 bảng riêng</w:t>
+        <w:t xml:space="preserve">Mủ khai thác và mủ thu mua nhập ở 2 bảng riêng</w:t>
       </w:r>
       <w:r>
         <w:t xml:space="preserve"> để lưu trữ tách bạch, nhưng mọi số tổng (SL · doanh thu · giá BQ) đều cộng chung cả hai.</w:t>
@@ -1674,39 +1651,6 @@
       </w:r>
       <w:r>
         <w:t xml:space="preserve">.</w:t>
-      </w:r>
-    </w:p>
-    <w:p>
-      <w:pPr>
-        <w:pStyle w:val="ListParagraph"/>
-        <w:numPr>
-          <w:ilvl w:val="0"/>
-          <w:numId w:val="3"/>
-        </w:numPr>
-        <w:spacing w:after="80"/>
-      </w:pPr>
-      <w:r>
-        <w:t xml:space="preserve">Doanh thu nhập theo </w:t>
-      </w:r>
-      <w:r>
-        <w:rPr>
-          <w:b/>
-          <w:bCs/>
-        </w:rPr>
-        <w:t xml:space="preserve">tỷ đồng</w:t>
-      </w:r>
-      <w:r>
-        <w:t xml:space="preserve"> khi chọn VND, theo </w:t>
-      </w:r>
-      <w:r>
-        <w:rPr>
-          <w:b/>
-          <w:bCs/>
-        </w:rPr>
-        <w:t xml:space="preserve">USD</w:t>
-      </w:r>
-      <w:r>
-        <w:t xml:space="preserve"> khi chọn USD (thiếu tỷ giá thì để trống, hệ thống không tự đoán).</w:t>
       </w:r>
     </w:p>
     <w:p>
@@ -1802,7 +1746,7 @@
       <w:r>
         <w:drawing>
           <wp:inline distT="0" distB="0" distL="0" distR="0">
-            <wp:extent cx="6191250" cy="3714750"/>
+            <wp:extent cx="6191250" cy="5362575"/>
             <wp:effectExtent t="0" r="0" b="0" l="0"/>
             <wp:docPr id="1" name="img" descr="Ảnh hướng dẫn có đánh số bước" title="img/06-ton-kho.png"/>
             <wp:cNvGraphicFramePr>
@@ -1827,7 +1771,7 @@
                   <pic:spPr bwMode="auto">
                     <a:xfrm>
                       <a:off x="0" y="0"/>
-                      <a:ext cx="6191250" cy="3714750"/>
+                      <a:ext cx="6191250" cy="5362575"/>
                     </a:xfrm>
                     <a:prstGeom prst="rect">
                       <a:avLst/>
@@ -1980,10 +1924,20 @@
           <w:b/>
           <w:bCs/>
         </w:rPr>
-        <w:t xml:space="preserve">Đơn giá nhập bằng</w:t>
-      </w:r>
-      <w:r>
-        <w:t xml:space="preserve"> — chọn VND hoặc USD cho đơn giá ở khối 3.</w:t>
+        <w:t xml:space="preserve">Tiền</w:t>
+      </w:r>
+      <w:r>
+        <w:t xml:space="preserve"> — mỗi dòng ở khối 3 tự chọn VND hoặc USD; chọn USD thì nhập </w:t>
+      </w:r>
+      <w:r>
+        <w:rPr>
+          <w:b/>
+          <w:bCs/>
+        </w:rPr>
+        <w:t xml:space="preserve">Tỷ giá</w:t>
+      </w:r>
+      <w:r>
+        <w:t xml:space="preserve"> ngay ở dòng đó.</w:t>
       </w:r>
     </w:p>
     <w:p>
@@ -2176,7 +2130,7 @@
         <w:pageBreakBefore/>
       </w:pPr>
       <w:r>
-        <w:t xml:space="preserve">7. Nhập Kế hoạch năm</w:t>
+        <w:t xml:space="preserve">7. Nhập Nhu cầu thị trường</w:t>
       </w:r>
     </w:p>
     <w:p>
@@ -2191,7 +2145,7 @@
         <w:t xml:space="preserve">Vị trí: </w:t>
       </w:r>
       <w:r>
-        <w:t xml:space="preserve">Menu → Kế hoạch năm</w:t>
+        <w:t xml:space="preserve">Menu → Nhu cầu thị trường</w:t>
       </w:r>
     </w:p>
     <w:p>
@@ -2199,7 +2153,27 @@
         <w:spacing w:after="140"/>
       </w:pPr>
       <w:r>
-        <w:t xml:space="preserve">Đây là số liệu của cả năm, chỉ nhập một lần và cập nhật lại khi có thay đổi — KHÔNG nhập hằng ngày. Số liệu này dùng để tính % thực hiện kế hoạch trong báo cáo.</w:t>
+        <w:t xml:space="preserve">Ghi nhận </w:t>
+      </w:r>
+      <w:r>
+        <w:rPr>
+          <w:b/>
+          <w:bCs/>
+        </w:rPr>
+        <w:t xml:space="preserve">các lời chào hàng từ khách hàng, nhà sản xuất</w:t>
+      </w:r>
+      <w:r>
+        <w:t xml:space="preserve"> và nhu cầu thị trường mà đơn vị nắm được trong ngày — dùng để phân tích yếu tố </w:t>
+      </w:r>
+      <w:r>
+        <w:rPr>
+          <w:b/>
+          <w:bCs/>
+        </w:rPr>
+        <w:t xml:space="preserve">Cầu</w:t>
+      </w:r>
+      <w:r>
+        <w:t xml:space="preserve"> trong quan hệ Cung – Cầu.</w:t>
       </w:r>
     </w:p>
     <w:p>
@@ -2210,9 +2184,9 @@
       <w:r>
         <w:drawing>
           <wp:inline distT="0" distB="0" distL="0" distR="0">
-            <wp:extent cx="6191250" cy="3714750"/>
+            <wp:extent cx="6191250" cy="4333875"/>
             <wp:effectExtent t="0" r="0" b="0" l="0"/>
-            <wp:docPr id="1" name="img" descr="Ảnh hướng dẫn có đánh số bước" title="img/07-ke-hoach-nam.png"/>
+            <wp:docPr id="1" name="img" descr="Ảnh hướng dẫn có đánh số bước" title="img/09-nhu-cau-thi-truong.png"/>
             <wp:cNvGraphicFramePr>
               <a:graphicFrameLocks xmlns:a="http://schemas.openxmlformats.org/drawingml/2006/main" noChangeAspect="1"/>
             </wp:cNvGraphicFramePr>
@@ -2235,7 +2209,7 @@
                   <pic:spPr bwMode="auto">
                     <a:xfrm>
                       <a:off x="0" y="0"/>
-                      <a:ext cx="6191250" cy="3714750"/>
+                      <a:ext cx="6191250" cy="4333875"/>
                     </a:xfrm>
                     <a:prstGeom prst="rect">
                       <a:avLst/>
@@ -2261,7 +2235,7 @@
           <w:sz w:val="17"/>
           <w:szCs w:val="17"/>
         </w:rPr>
-        <w:t xml:space="preserve">Hình 7. Màn Kế hoạch năm</w:t>
+        <w:t xml:space="preserve">Hình 7. Nhập Nhu cầu thị trường</w:t>
       </w:r>
     </w:p>
     <w:p>
@@ -2286,6 +2260,29 @@
         <w:spacing w:after="100"/>
       </w:pPr>
       <w:r>
+        <w:t xml:space="preserve">Bấm </w:t>
+      </w:r>
+      <w:r>
+        <w:rPr>
+          <w:b/>
+          <w:bCs/>
+        </w:rPr>
+        <w:t xml:space="preserve">Thêm nhu cầu</w:t>
+      </w:r>
+      <w:r>
+        <w:t xml:space="preserve"> để mở ô nhập.</w:t>
+      </w:r>
+    </w:p>
+    <w:p>
+      <w:pPr>
+        <w:pStyle w:val="ListParagraph"/>
+        <w:numPr>
+          <w:ilvl w:val="0"/>
+          <w:numId w:val="9"/>
+        </w:numPr>
+        <w:spacing w:after="100"/>
+      </w:pPr>
+      <w:r>
         <w:t xml:space="preserve">Chọn </w:t>
       </w:r>
       <w:r>
@@ -2293,10 +2290,10 @@
           <w:b/>
           <w:bCs/>
         </w:rPr>
-        <w:t xml:space="preserve">năm</w:t>
-      </w:r>
-      <w:r>
-        <w:t xml:space="preserve"> cần khai.</w:t>
+        <w:t xml:space="preserve">ngày</w:t>
+      </w:r>
+      <w:r>
+        <w:t xml:space="preserve"> ghi nhận nhu cầu.</w:t>
       </w:r>
     </w:p>
     <w:p>
@@ -2309,14 +2306,17 @@
         <w:spacing w:after="100"/>
       </w:pPr>
       <w:r>
-        <w:rPr>
-          <w:b/>
-          <w:bCs/>
-        </w:rPr>
-        <w:t xml:space="preserve">Kế hoạch thu mua</w:t>
-      </w:r>
-      <w:r>
-        <w:t xml:space="preserve"> (tấn) — chỉ tiêu Tập đoàn giao hoặc kế hoạch của công ty.</w:t>
+        <w:t xml:space="preserve">Chọn </w:t>
+      </w:r>
+      <w:r>
+        <w:rPr>
+          <w:b/>
+          <w:bCs/>
+        </w:rPr>
+        <w:t xml:space="preserve">đơn vị</w:t>
+      </w:r>
+      <w:r>
+        <w:t xml:space="preserve"> (tài khoản chỉ có đơn vị của mình).</w:t>
       </w:r>
     </w:p>
     <w:p>
@@ -2329,14 +2329,17 @@
         <w:spacing w:after="100"/>
       </w:pPr>
       <w:r>
-        <w:rPr>
-          <w:b/>
-          <w:bCs/>
-        </w:rPr>
-        <w:t xml:space="preserve">HĐ dài hạn đã ký</w:t>
-      </w:r>
-      <w:r>
-        <w:t xml:space="preserve"> (tấn) — tổng sản lượng đã ký hợp đồng dài hạn trong năm.</w:t>
+        <w:t xml:space="preserve">Nhập </w:t>
+      </w:r>
+      <w:r>
+        <w:rPr>
+          <w:b/>
+          <w:bCs/>
+        </w:rPr>
+        <w:t xml:space="preserve">nội dung</w:t>
+      </w:r>
+      <w:r>
+        <w:t xml:space="preserve"> — viết tự do, nên ghi rõ: khách hàng, chủng loại, số lượng, giá chào và thời điểm giao.</w:t>
       </w:r>
     </w:p>
     <w:p>
@@ -2349,14 +2352,17 @@
         <w:spacing w:after="100"/>
       </w:pPr>
       <w:r>
-        <w:rPr>
-          <w:b/>
-          <w:bCs/>
-        </w:rPr>
-        <w:t xml:space="preserve">HĐ dài hạn năm trước chuyển sang</w:t>
-      </w:r>
-      <w:r>
-        <w:t xml:space="preserve"> (tấn).</w:t>
+        <w:t xml:space="preserve">Bấm </w:t>
+      </w:r>
+      <w:r>
+        <w:rPr>
+          <w:b/>
+          <w:bCs/>
+        </w:rPr>
+        <w:t xml:space="preserve">Lưu</w:t>
+      </w:r>
+      <w:r>
+        <w:t xml:space="preserve">.</w:t>
       </w:r>
     </w:p>
     <w:p>
@@ -2369,37 +2375,17 @@
         <w:spacing w:after="100"/>
       </w:pPr>
       <w:r>
-        <w:rPr>
-          <w:b/>
-          <w:bCs/>
-        </w:rPr>
-        <w:t xml:space="preserve">HĐ chuyến năm trước chuyển sang</w:t>
-      </w:r>
-      <w:r>
-        <w:t xml:space="preserve"> (tấn).</w:t>
-      </w:r>
-    </w:p>
-    <w:p>
-      <w:pPr>
-        <w:pStyle w:val="ListParagraph"/>
-        <w:numPr>
-          <w:ilvl w:val="0"/>
-          <w:numId w:val="9"/>
-        </w:numPr>
-        <w:spacing w:after="100"/>
-      </w:pPr>
-      <w:r>
-        <w:t xml:space="preserve">Số liệu </w:t>
-      </w:r>
-      <w:r>
-        <w:rPr>
-          <w:b/>
-          <w:bCs/>
-        </w:rPr>
-        <w:t xml:space="preserve">tự lưu khi rời khỏi ô</w:t>
-      </w:r>
-      <w:r>
-        <w:t xml:space="preserve"> — không có nút Lưu riêng.</w:t>
+        <w:t xml:space="preserve">Muốn sửa nội dung đã ghi: bấm </w:t>
+      </w:r>
+      <w:r>
+        <w:rPr>
+          <w:b/>
+          <w:bCs/>
+        </w:rPr>
+        <w:t xml:space="preserve">biểu tượng bút</w:t>
+      </w:r>
+      <w:r>
+        <w:t xml:space="preserve"> ở dòng tương ứng trong danh sách bên dưới.</w:t>
       </w:r>
     </w:p>
     <w:p>
@@ -2424,7 +2410,86 @@
         <w:spacing w:after="80"/>
       </w:pPr>
       <w:r>
-        <w:t xml:space="preserve">Nếu tài khoản được giao nhiều đơn vị thì màn này hiện đủ các đơn vị đó.</w:t>
+        <w:t xml:space="preserve">Nên ghi rõ: </w:t>
+      </w:r>
+      <w:r>
+        <w:rPr>
+          <w:b/>
+          <w:bCs/>
+        </w:rPr>
+        <w:t xml:space="preserve">khách hàng hoặc nhà sản xuất nào · chủng loại · số lượng · mức giá chào · thời điểm giao hàng</w:t>
+      </w:r>
+      <w:r>
+        <w:t xml:space="preserve">. Càng cụ thể thì phần phân tích Cung – Cầu càng dùng được.</w:t>
+      </w:r>
+    </w:p>
+    <w:p>
+      <w:pPr>
+        <w:pStyle w:val="ListParagraph"/>
+        <w:numPr>
+          <w:ilvl w:val="0"/>
+          <w:numId w:val="3"/>
+        </w:numPr>
+        <w:spacing w:after="80"/>
+      </w:pPr>
+      <w:r>
+        <w:t xml:space="preserve">Đây là mục nhập </w:t>
+      </w:r>
+      <w:r>
+        <w:rPr>
+          <w:b/>
+          <w:bCs/>
+        </w:rPr>
+        <w:t xml:space="preserve">tự do bằng chữ</w:t>
+      </w:r>
+      <w:r>
+        <w:t xml:space="preserve">, không có ô số liệu.</w:t>
+      </w:r>
+    </w:p>
+    <w:p>
+      <w:pPr>
+        <w:pStyle w:val="ListParagraph"/>
+        <w:numPr>
+          <w:ilvl w:val="0"/>
+          <w:numId w:val="3"/>
+        </w:numPr>
+        <w:spacing w:after="80"/>
+      </w:pPr>
+      <w:r>
+        <w:t xml:space="preserve">Mỗi ngày mỗi đơn vị chỉ có </w:t>
+      </w:r>
+      <w:r>
+        <w:rPr>
+          <w:b/>
+          <w:bCs/>
+        </w:rPr>
+        <w:t xml:space="preserve">một nội dung</w:t>
+      </w:r>
+      <w:r>
+        <w:t xml:space="preserve"> — nhập lại ngày đã có sẽ được nhắc dùng chức năng Sửa.</w:t>
+      </w:r>
+    </w:p>
+    <w:p>
+      <w:pPr>
+        <w:pStyle w:val="ListParagraph"/>
+        <w:numPr>
+          <w:ilvl w:val="0"/>
+          <w:numId w:val="3"/>
+        </w:numPr>
+        <w:spacing w:after="80"/>
+      </w:pPr>
+      <w:r>
+        <w:t xml:space="preserve">Mục này </w:t>
+      </w:r>
+      <w:r>
+        <w:rPr>
+          <w:b/>
+          <w:bCs/>
+        </w:rPr>
+        <w:t xml:space="preserve">không có nhập bằng Excel</w:t>
+      </w:r>
+      <w:r>
+        <w:t xml:space="preserve">.</w:t>
       </w:r>
     </w:p>
     <w:p>
@@ -2433,7 +2498,7 @@
         <w:pageBreakBefore/>
       </w:pPr>
       <w:r>
-        <w:t xml:space="preserve">8. Nhập Nhu cầu thị trường</w:t>
+        <w:t xml:space="preserve">8. Nhập Kế hoạch năm</w:t>
       </w:r>
     </w:p>
     <w:p>
@@ -2448,7 +2513,7 @@
         <w:t xml:space="preserve">Vị trí: </w:t>
       </w:r>
       <w:r>
-        <w:t xml:space="preserve">Menu → Nhu cầu thị trường</w:t>
+        <w:t xml:space="preserve">Menu → Kế hoạch năm</w:t>
       </w:r>
     </w:p>
     <w:p>
@@ -2456,27 +2521,7 @@
         <w:spacing w:after="140"/>
       </w:pPr>
       <w:r>
-        <w:t xml:space="preserve">Ghi nhận </w:t>
-      </w:r>
-      <w:r>
-        <w:rPr>
-          <w:b/>
-          <w:bCs/>
-        </w:rPr>
-        <w:t xml:space="preserve">các lời chào hàng từ khách hàng, nhà sản xuất</w:t>
-      </w:r>
-      <w:r>
-        <w:t xml:space="preserve"> và nhu cầu thị trường mà đơn vị nắm được trong ngày — dùng để phân tích yếu tố </w:t>
-      </w:r>
-      <w:r>
-        <w:rPr>
-          <w:b/>
-          <w:bCs/>
-        </w:rPr>
-        <w:t xml:space="preserve">Cầu</w:t>
-      </w:r>
-      <w:r>
-        <w:t xml:space="preserve"> trong quan hệ Cung – Cầu.</w:t>
+        <w:t xml:space="preserve">Đây là số liệu của cả năm, chỉ nhập một lần và cập nhật lại khi có thay đổi — KHÔNG nhập hằng ngày. Số liệu này dùng để tính % thực hiện kế hoạch trong báo cáo.</w:t>
       </w:r>
     </w:p>
     <w:p>
@@ -2489,7 +2534,7 @@
           <wp:inline distT="0" distB="0" distL="0" distR="0">
             <wp:extent cx="6191250" cy="3714750"/>
             <wp:effectExtent t="0" r="0" b="0" l="0"/>
-            <wp:docPr id="1" name="img" descr="Ảnh hướng dẫn có đánh số bước" title="img/09-nhu-cau-thi-truong.png"/>
+            <wp:docPr id="1" name="img" descr="Ảnh hướng dẫn có đánh số bước" title="img/07-ke-hoach-nam.png"/>
             <wp:cNvGraphicFramePr>
               <a:graphicFrameLocks xmlns:a="http://schemas.openxmlformats.org/drawingml/2006/main" noChangeAspect="1"/>
             </wp:cNvGraphicFramePr>
@@ -2538,7 +2583,7 @@
           <w:sz w:val="17"/>
           <w:szCs w:val="17"/>
         </w:rPr>
-        <w:t xml:space="preserve">Hình 8. Nhập Nhu cầu thị trường</w:t>
+        <w:t xml:space="preserve">Hình 8. Màn Kế hoạch năm</w:t>
       </w:r>
     </w:p>
     <w:p>
@@ -2563,17 +2608,17 @@
         <w:spacing w:after="100"/>
       </w:pPr>
       <w:r>
-        <w:t xml:space="preserve">Bấm </w:t>
-      </w:r>
-      <w:r>
-        <w:rPr>
-          <w:b/>
-          <w:bCs/>
-        </w:rPr>
-        <w:t xml:space="preserve">Thêm nhu cầu</w:t>
-      </w:r>
-      <w:r>
-        <w:t xml:space="preserve"> để mở ô nhập.</w:t>
+        <w:t xml:space="preserve">Chọn </w:t>
+      </w:r>
+      <w:r>
+        <w:rPr>
+          <w:b/>
+          <w:bCs/>
+        </w:rPr>
+        <w:t xml:space="preserve">năm</w:t>
+      </w:r>
+      <w:r>
+        <w:t xml:space="preserve"> cần khai.</w:t>
       </w:r>
     </w:p>
     <w:p>
@@ -2586,17 +2631,14 @@
         <w:spacing w:after="100"/>
       </w:pPr>
       <w:r>
-        <w:t xml:space="preserve">Chọn </w:t>
-      </w:r>
-      <w:r>
-        <w:rPr>
-          <w:b/>
-          <w:bCs/>
-        </w:rPr>
-        <w:t xml:space="preserve">ngày</w:t>
-      </w:r>
-      <w:r>
-        <w:t xml:space="preserve"> ghi nhận nhu cầu.</w:t>
+        <w:rPr>
+          <w:b/>
+          <w:bCs/>
+        </w:rPr>
+        <w:t xml:space="preserve">Kế hoạch thu mua</w:t>
+      </w:r>
+      <w:r>
+        <w:t xml:space="preserve"> (tấn) — chỉ tiêu Tập đoàn giao hoặc kế hoạch của công ty.</w:t>
       </w:r>
     </w:p>
     <w:p>
@@ -2609,17 +2651,14 @@
         <w:spacing w:after="100"/>
       </w:pPr>
       <w:r>
-        <w:t xml:space="preserve">Chọn </w:t>
-      </w:r>
-      <w:r>
-        <w:rPr>
-          <w:b/>
-          <w:bCs/>
-        </w:rPr>
-        <w:t xml:space="preserve">đơn vị</w:t>
-      </w:r>
-      <w:r>
-        <w:t xml:space="preserve"> (tài khoản chỉ có đơn vị của mình).</w:t>
+        <w:rPr>
+          <w:b/>
+          <w:bCs/>
+        </w:rPr>
+        <w:t xml:space="preserve">HĐ dài hạn đã ký</w:t>
+      </w:r>
+      <w:r>
+        <w:t xml:space="preserve"> (tấn) — tổng sản lượng đã ký hợp đồng dài hạn trong năm.</w:t>
       </w:r>
     </w:p>
     <w:p>
@@ -2632,17 +2671,14 @@
         <w:spacing w:after="100"/>
       </w:pPr>
       <w:r>
-        <w:t xml:space="preserve">Nhập </w:t>
-      </w:r>
-      <w:r>
-        <w:rPr>
-          <w:b/>
-          <w:bCs/>
-        </w:rPr>
-        <w:t xml:space="preserve">nội dung</w:t>
-      </w:r>
-      <w:r>
-        <w:t xml:space="preserve"> — viết tự do, nên ghi rõ: khách hàng, chủng loại, số lượng, giá chào và thời điểm giao.</w:t>
+        <w:rPr>
+          <w:b/>
+          <w:bCs/>
+        </w:rPr>
+        <w:t xml:space="preserve">HĐ dài hạn năm trước chuyển sang</w:t>
+      </w:r>
+      <w:r>
+        <w:t xml:space="preserve"> (tấn).</w:t>
       </w:r>
     </w:p>
     <w:p>
@@ -2655,40 +2691,14 @@
         <w:spacing w:after="100"/>
       </w:pPr>
       <w:r>
-        <w:t xml:space="preserve">Bấm </w:t>
-      </w:r>
-      <w:r>
-        <w:rPr>
-          <w:b/>
-          <w:bCs/>
-        </w:rPr>
-        <w:t xml:space="preserve">Lưu</w:t>
-      </w:r>
-      <w:r>
-        <w:t xml:space="preserve">.</w:t>
-      </w:r>
-    </w:p>
-    <w:p>
-      <w:pPr>
-        <w:pStyle w:val="ListParagraph"/>
-        <w:numPr>
-          <w:ilvl w:val="0"/>
-          <w:numId w:val="10"/>
-        </w:numPr>
-        <w:spacing w:after="100"/>
-      </w:pPr>
-      <w:r>
-        <w:t xml:space="preserve">Muốn sửa nội dung đã ghi: bấm </w:t>
-      </w:r>
-      <w:r>
-        <w:rPr>
-          <w:b/>
-          <w:bCs/>
-        </w:rPr>
-        <w:t xml:space="preserve">biểu tượng bút</w:t>
-      </w:r>
-      <w:r>
-        <w:t xml:space="preserve"> ở dòng tương ứng trong danh sách bên dưới.</w:t>
+        <w:rPr>
+          <w:b/>
+          <w:bCs/>
+        </w:rPr>
+        <w:t xml:space="preserve">HĐ chuyến năm trước chuyển sang</w:t>
+      </w:r>
+      <w:r>
+        <w:t xml:space="preserve"> (tấn).</w:t>
       </w:r>
     </w:p>
     <w:p>
@@ -2713,17 +2723,17 @@
         <w:spacing w:after="80"/>
       </w:pPr>
       <w:r>
-        <w:t xml:space="preserve">Nên ghi rõ: </w:t>
-      </w:r>
-      <w:r>
-        <w:rPr>
-          <w:b/>
-          <w:bCs/>
-        </w:rPr>
-        <w:t xml:space="preserve">khách hàng hoặc nhà sản xuất nào · chủng loại · số lượng · mức giá chào · thời điểm giao hàng</w:t>
-      </w:r>
-      <w:r>
-        <w:t xml:space="preserve">. Càng cụ thể thì phần phân tích Cung – Cầu càng dùng được.</w:t>
+        <w:t xml:space="preserve">Số liệu </w:t>
+      </w:r>
+      <w:r>
+        <w:rPr>
+          <w:b/>
+          <w:bCs/>
+        </w:rPr>
+        <w:t xml:space="preserve">tự lưu khi rời khỏi ô</w:t>
+      </w:r>
+      <w:r>
+        <w:t xml:space="preserve"> — không có nút Lưu riêng.</w:t>
       </w:r>
     </w:p>
     <w:p>
@@ -2736,17 +2746,27 @@
         <w:spacing w:after="80"/>
       </w:pPr>
       <w:r>
-        <w:t xml:space="preserve">Đây là mục nhập </w:t>
-      </w:r>
-      <w:r>
-        <w:rPr>
-          <w:b/>
-          <w:bCs/>
-        </w:rPr>
-        <w:t xml:space="preserve">tự do bằng chữ</w:t>
-      </w:r>
-      <w:r>
-        <w:t xml:space="preserve">, không có ô số liệu.</w:t>
+        <w:t xml:space="preserve">Màn này </w:t>
+      </w:r>
+      <w:r>
+        <w:rPr>
+          <w:b/>
+          <w:bCs/>
+        </w:rPr>
+        <w:t xml:space="preserve">chỉ hiện những đơn vị được giao kế hoạch thu mua</w:t>
+      </w:r>
+      <w:r>
+        <w:t xml:space="preserve">. Nếu không thấy đơn vị của mình, đề nghị quản trị viên bật ô </w:t>
+      </w:r>
+      <w:r>
+        <w:rPr>
+          <w:b/>
+          <w:bCs/>
+        </w:rPr>
+        <w:t xml:space="preserve">Có giao KH</w:t>
+      </w:r>
+      <w:r>
+        <w:t xml:space="preserve"> ở Quản trị → Đơn vị thành viên.</w:t>
       </w:r>
     </w:p>
     <w:p>
@@ -2759,40 +2779,7 @@
         <w:spacing w:after="80"/>
       </w:pPr>
       <w:r>
-        <w:t xml:space="preserve">Mỗi ngày mỗi đơn vị chỉ có </w:t>
-      </w:r>
-      <w:r>
-        <w:rPr>
-          <w:b/>
-          <w:bCs/>
-        </w:rPr>
-        <w:t xml:space="preserve">một nội dung</w:t>
-      </w:r>
-      <w:r>
-        <w:t xml:space="preserve"> — nhập lại ngày đã có sẽ được nhắc dùng chức năng Sửa.</w:t>
-      </w:r>
-    </w:p>
-    <w:p>
-      <w:pPr>
-        <w:pStyle w:val="ListParagraph"/>
-        <w:numPr>
-          <w:ilvl w:val="0"/>
-          <w:numId w:val="3"/>
-        </w:numPr>
-        <w:spacing w:after="80"/>
-      </w:pPr>
-      <w:r>
-        <w:t xml:space="preserve">Mục này </w:t>
-      </w:r>
-      <w:r>
-        <w:rPr>
-          <w:b/>
-          <w:bCs/>
-        </w:rPr>
-        <w:t xml:space="preserve">không có nhập bằng Excel</w:t>
-      </w:r>
-      <w:r>
-        <w:t xml:space="preserve">.</w:t>
+        <w:t xml:space="preserve">Nếu tài khoản được giao nhiều đơn vị thì màn này hiện đủ các đơn vị đó (trừ đơn vị không được giao kế hoạch).</w:t>
       </w:r>
     </w:p>
     <w:p>
@@ -2845,7 +2832,7 @@
       <w:r>
         <w:drawing>
           <wp:inline distT="0" distB="0" distL="0" distR="0">
-            <wp:extent cx="6191250" cy="3714750"/>
+            <wp:extent cx="6191250" cy="3095625"/>
             <wp:effectExtent t="0" r="0" b="0" l="0"/>
             <wp:docPr id="1" name="img" descr="Ảnh hướng dẫn có đánh số bước" title="img/08-import-xem-truoc.png"/>
             <wp:cNvGraphicFramePr>
@@ -2870,7 +2857,7 @@
                   <pic:spPr bwMode="auto">
                     <a:xfrm>
                       <a:off x="0" y="0"/>
-                      <a:ext cx="6191250" cy="3714750"/>
+                      <a:ext cx="6191250" cy="3095625"/>
                     </a:xfrm>
                     <a:prstGeom prst="rect">
                       <a:avLst/>
@@ -3175,7 +3162,7 @@
         <w:spacing w:after="80"/>
       </w:pPr>
       <w:r>
-        <w:t xml:space="preserve">⚠️ File </w:t>
+        <w:t xml:space="preserve">File </w:t>
       </w:r>
       <w:r>
         <w:rPr>

</xml_diff>

<commit_message>
docs(huong-dan): update the member-unit guide for the 0.2.77 screens
Finished-goods purchase is now a table with one row per grade, and signed
stock contracts are entered once with a start date and a delivery date
instead of being retyped every day. Screenshots recaptured on 0.2.77.
</commit_message>
<xml_diff>
--- a/docs/huong-dan/nhap-lieu-don-vi-thanh-vien/Huong-dan-nhap-lieu-don-vi-thanh-vien.docx
+++ b/docs/huong-dan/nhap-lieu-don-vi-thanh-vien/Huong-dan-nhap-lieu-don-vi-thanh-vien.docx
@@ -16,7 +16,7 @@
         <w:spacing w:after="200"/>
       </w:pPr>
       <w:r>
-        <w:t xml:space="preserve">Tài liệu dành cho cán bộ đơn vị thành viên VRG nhập số liệu hằng ngày trên Hệ thống Dự báo &amp; Quản trị Giá Cao su. Tài khoản đơn vị chỉ thấy và chỉ nhập được số liệu của chính đơn vị mình. Có 5 mục cần nhập: Báo cáo thu mua, Báo cáo tiêu thụ, Báo cáo tồn kho và Nhu cầu thị trường (nhập theo NGÀY), cùng Kế hoạch năm (nhập 1 lần cho cả năm). Tài liệu bám theo phiên bản 0.2.76. Riêng 4 mục báo cáo còn có thể tải mẫu Excel về điền rồi nhập lên thay vì gõ tay (xem mục 9).</w:t>
+        <w:t xml:space="preserve">Tài liệu dành cho cán bộ đơn vị thành viên VRG nhập số liệu hằng ngày trên Hệ thống Dự báo &amp; Quản trị Giá Cao su. Tài khoản đơn vị chỉ thấy và chỉ nhập được số liệu của chính đơn vị mình. Có 5 mục cần nhập: Báo cáo thu mua, Báo cáo tiêu thụ, Báo cáo tồn kho và Nhu cầu thị trường (nhập theo NGÀY), cùng Kế hoạch năm (nhập 1 lần cho cả năm). Tài liệu bám theo phiên bản 0.2.77. Riêng 4 mục báo cáo còn có thể tải mẫu Excel về điền rồi nhập lên thay vì gõ tay (xem mục 9).</w:t>
       </w:r>
     </w:p>
     <w:p>
@@ -580,7 +580,17 @@
         <w:spacing w:after="140"/>
       </w:pPr>
       <w:r>
-        <w:t xml:space="preserve">Áp dụng cho các đơn vị tại Việt Nam. Phiếu chia theo loại mủ: mỗi loại nhập sản lượng và đơn giá đi liền nhau. Mủ chén phải chọn tính theo độ TSC hay độ DRC. Cuối phiếu là khối thu mua THÀNH PHẨM (mua lại mủ đã chế biến).</w:t>
+        <w:t xml:space="preserve">Áp dụng cho các đơn vị tại Việt Nam. Phiếu chia theo loại mủ: mỗi loại nhập sản lượng và đơn giá đi liền nhau. Mủ chén phải chọn tính theo độ TSC hay độ DRC. Cuối phiếu là khối thu mua THÀNH PHẨM (mua lại mủ đã chế biến) — nhập theo </w:t>
+      </w:r>
+      <w:r>
+        <w:rPr>
+          <w:b/>
+          <w:bCs/>
+        </w:rPr>
+        <w:t xml:space="preserve">bảng, mỗi chủng loại một dòng</w:t>
+      </w:r>
+      <w:r>
+        <w:t xml:space="preserve">.</w:t>
       </w:r>
     </w:p>
     <w:p>
@@ -591,7 +601,7 @@
       <w:r>
         <w:drawing>
           <wp:inline distT="0" distB="0" distL="0" distR="0">
-            <wp:extent cx="6191250" cy="4543425"/>
+            <wp:extent cx="6191250" cy="4743450"/>
             <wp:effectExtent t="0" r="0" b="0" l="0"/>
             <wp:docPr id="1" name="img" descr="Ảnh hướng dẫn có đánh số bước" title="img/03-thu-mua-vn.png"/>
             <wp:cNvGraphicFramePr>
@@ -616,7 +626,7 @@
                   <pic:spPr bwMode="auto">
                     <a:xfrm>
                       <a:off x="0" y="0"/>
-                      <a:ext cx="6191250" cy="4543425"/>
+                      <a:ext cx="6191250" cy="4743450"/>
                     </a:xfrm>
                     <a:prstGeom prst="rect">
                       <a:avLst/>
@@ -737,7 +747,17 @@
         <w:t xml:space="preserve">Thu mua thành phẩm</w:t>
       </w:r>
       <w:r>
-        <w:t xml:space="preserve"> — sản lượng mủ thành phẩm mua vào (tấn).</w:t>
+        <w:t xml:space="preserve"> — bảng nhập, </w:t>
+      </w:r>
+      <w:r>
+        <w:rPr>
+          <w:b/>
+          <w:bCs/>
+        </w:rPr>
+        <w:t xml:space="preserve">mỗi chủng loại mua trong ngày là một dòng riêng</w:t>
+      </w:r>
+      <w:r>
+        <w:t xml:space="preserve">.</w:t>
       </w:r>
     </w:p>
     <w:p>
@@ -754,10 +774,70 @@
           <w:b/>
           <w:bCs/>
         </w:rPr>
-        <w:t xml:space="preserve">Đơn giá (VNĐ)</w:t>
-      </w:r>
-      <w:r>
-        <w:t xml:space="preserve"> — triệu đ/tấn.</w:t>
+        <w:t xml:space="preserve">Một dòng chủng loại</w:t>
+      </w:r>
+      <w:r>
+        <w:t xml:space="preserve">: chọn </w:t>
+      </w:r>
+      <w:r>
+        <w:rPr>
+          <w:b/>
+          <w:bCs/>
+        </w:rPr>
+        <w:t xml:space="preserve">Chủng loại</w:t>
+      </w:r>
+      <w:r>
+        <w:t xml:space="preserve"> · </w:t>
+      </w:r>
+      <w:r>
+        <w:rPr>
+          <w:b/>
+          <w:bCs/>
+        </w:rPr>
+        <w:t xml:space="preserve">SL thu mua</w:t>
+      </w:r>
+      <w:r>
+        <w:t xml:space="preserve"> (tấn) · </w:t>
+      </w:r>
+      <w:r>
+        <w:rPr>
+          <w:b/>
+          <w:bCs/>
+        </w:rPr>
+        <w:t xml:space="preserve">Đơn giá</w:t>
+      </w:r>
+      <w:r>
+        <w:t xml:space="preserve"> · </w:t>
+      </w:r>
+      <w:r>
+        <w:rPr>
+          <w:b/>
+          <w:bCs/>
+        </w:rPr>
+        <w:t xml:space="preserve">Tiền</w:t>
+      </w:r>
+      <w:r>
+        <w:t xml:space="preserve"> (VNĐ hay USD) · </w:t>
+      </w:r>
+      <w:r>
+        <w:rPr>
+          <w:b/>
+          <w:bCs/>
+        </w:rPr>
+        <w:t xml:space="preserve">Tỷ giá</w:t>
+      </w:r>
+      <w:r>
+        <w:t xml:space="preserve"> (chỉ hiện khi dòng đó chọn USD). Cột </w:t>
+      </w:r>
+      <w:r>
+        <w:rPr>
+          <w:b/>
+          <w:bCs/>
+        </w:rPr>
+        <w:t xml:space="preserve">Thành tiền</w:t>
+      </w:r>
+      <w:r>
+        <w:t xml:space="preserve"> tự tính.</w:t>
       </w:r>
     </w:p>
     <w:p>
@@ -774,20 +854,30 @@
           <w:b/>
           <w:bCs/>
         </w:rPr>
-        <w:t xml:space="preserve">Đơn giá (ngoại tệ)</w:t>
-      </w:r>
-      <w:r>
-        <w:t xml:space="preserve"> — USD/tấn; kèm ô </w:t>
-      </w:r>
-      <w:r>
-        <w:rPr>
-          <w:b/>
-          <w:bCs/>
-        </w:rPr>
-        <w:t xml:space="preserve">Tỷ giá</w:t>
-      </w:r>
-      <w:r>
-        <w:t xml:space="preserve"> có nút *Lấy tỷ giá hiện tại* (Vietcombank). Xong bấm </w:t>
+        <w:t xml:space="preserve">Thêm chủng loại</w:t>
+      </w:r>
+      <w:r>
+        <w:t xml:space="preserve"> — mua mấy chủng loại thì thêm bấy nhiêu dòng; nút thùng rác ở cuối dòng để xoá.</w:t>
+      </w:r>
+    </w:p>
+    <w:p>
+      <w:pPr>
+        <w:pStyle w:val="ListParagraph"/>
+        <w:numPr>
+          <w:ilvl w:val="0"/>
+          <w:numId w:val="5"/>
+        </w:numPr>
+        <w:spacing w:after="100"/>
+      </w:pPr>
+      <w:r>
+        <w:rPr>
+          <w:b/>
+          <w:bCs/>
+        </w:rPr>
+        <w:t xml:space="preserve">Lấy tỷ giá VCB cho các dòng USD</w:t>
+      </w:r>
+      <w:r>
+        <w:t xml:space="preserve"> — điền tỷ giá Vietcombank cho mọi dòng đang chọn USD. Xong bấm </w:t>
       </w:r>
       <w:r>
         <w:rPr>
@@ -810,6 +900,69 @@
           <w:bCs/>
         </w:rPr>
         <w:t xml:space="preserve">Lưu ý:</w:t>
+      </w:r>
+    </w:p>
+    <w:p>
+      <w:pPr>
+        <w:pStyle w:val="ListParagraph"/>
+        <w:numPr>
+          <w:ilvl w:val="0"/>
+          <w:numId w:val="3"/>
+        </w:numPr>
+        <w:spacing w:after="80"/>
+      </w:pPr>
+      <w:r>
+        <w:rPr>
+          <w:b/>
+          <w:bCs/>
+        </w:rPr>
+        <w:t xml:space="preserve">Đơn giá đi theo loại tiền của từng dòng</w:t>
+      </w:r>
+      <w:r>
+        <w:t xml:space="preserve">: chọn VNĐ thì nhập </w:t>
+      </w:r>
+      <w:r>
+        <w:rPr>
+          <w:b/>
+          <w:bCs/>
+        </w:rPr>
+        <w:t xml:space="preserve">triệu đ/tấn</w:t>
+      </w:r>
+      <w:r>
+        <w:t xml:space="preserve">, chọn USD thì nhập </w:t>
+      </w:r>
+      <w:r>
+        <w:rPr>
+          <w:b/>
+          <w:bCs/>
+        </w:rPr>
+        <w:t xml:space="preserve">USD/tấn</w:t>
+      </w:r>
+      <w:r>
+        <w:t xml:space="preserve">. Trong một ngày có thể vừa mua bằng VNĐ vừa mua bằng USD.</w:t>
+      </w:r>
+    </w:p>
+    <w:p>
+      <w:pPr>
+        <w:pStyle w:val="ListParagraph"/>
+        <w:numPr>
+          <w:ilvl w:val="0"/>
+          <w:numId w:val="3"/>
+        </w:numPr>
+        <w:spacing w:after="80"/>
+      </w:pPr>
+      <w:r>
+        <w:t xml:space="preserve">Ba ô cuối khối — </w:t>
+      </w:r>
+      <w:r>
+        <w:rPr>
+          <w:b/>
+          <w:bCs/>
+        </w:rPr>
+        <w:t xml:space="preserve">Tổng SL thành phẩm · Tổng giá trị · Đơn giá bình quân</w:t>
+      </w:r>
+      <w:r>
+        <w:t xml:space="preserve"> — hệ thống tự cộng, không nhập tay.</w:t>
       </w:r>
     </w:p>
     <w:p>
@@ -948,7 +1101,7 @@
       <w:r>
         <w:drawing>
           <wp:inline distT="0" distB="0" distL="0" distR="0">
-            <wp:extent cx="6191250" cy="4543425"/>
+            <wp:extent cx="6191250" cy="4743450"/>
             <wp:effectExtent t="0" r="0" b="0" l="0"/>
             <wp:docPr id="1" name="img" descr="Ảnh hướng dẫn có đánh số bước" title="img/04-thu-mua-nuoc-ngoai.png"/>
             <wp:cNvGraphicFramePr>
@@ -973,7 +1126,7 @@
                   <pic:spPr bwMode="auto">
                     <a:xfrm>
                       <a:off x="0" y="0"/>
-                      <a:ext cx="6191250" cy="4543425"/>
+                      <a:ext cx="6191250" cy="4743450"/>
                     </a:xfrm>
                     <a:prstGeom prst="rect">
                       <a:avLst/>
@@ -1096,10 +1249,10 @@
           <w:b/>
           <w:bCs/>
         </w:rPr>
-        <w:t xml:space="preserve">Đơn giá thành phẩm (ngoại tệ)</w:t>
-      </w:r>
-      <w:r>
-        <w:t xml:space="preserve"> — USD/tấn cho phần thu mua thành phẩm.</w:t>
+        <w:t xml:space="preserve">Thu mua thành phẩm</w:t>
+      </w:r>
+      <w:r>
+        <w:t xml:space="preserve"> — bảng theo chủng loại, nhập y như đơn vị trong nước (mục 3).</w:t>
       </w:r>
     </w:p>
     <w:p>
@@ -1116,10 +1269,30 @@
           <w:b/>
           <w:bCs/>
         </w:rPr>
+        <w:t xml:space="preserve">Một dòng chủng loại</w:t>
+      </w:r>
+      <w:r>
+        <w:t xml:space="preserve">: chọn </w:t>
+      </w:r>
+      <w:r>
+        <w:rPr>
+          <w:b/>
+          <w:bCs/>
+        </w:rPr>
+        <w:t xml:space="preserve">Tiền</w:t>
+      </w:r>
+      <w:r>
+        <w:t xml:space="preserve"> là *USD* thì nhập </w:t>
+      </w:r>
+      <w:r>
+        <w:rPr>
+          <w:b/>
+          <w:bCs/>
+        </w:rPr>
         <w:t xml:space="preserve">Tỷ giá</w:t>
       </w:r>
       <w:r>
-        <w:t xml:space="preserve"> (1 USD = ? VND) — có nút *Lấy tỷ giá hiện tại*.</w:t>
+        <w:t xml:space="preserve"> (1 USD = ? VND) ngay ở dòng đó — hoặc bấm *Lấy tỷ giá VCB cho các dòng USD*.</w:t>
       </w:r>
     </w:p>
     <w:p>
@@ -1154,7 +1327,7 @@
         <w:t xml:space="preserve">khác nhau và độc lập</w:t>
       </w:r>
       <w:r>
-        <w:t xml:space="preserve">: tỷ giá nội tệ cho đơn giá mủ nước/mủ chén; tỷ giá USD cho thành phẩm.</w:t>
+        <w:t xml:space="preserve">: tỷ giá nội tệ cho đơn giá mủ nước/mủ chén; tỷ giá USD nằm trên từng dòng thành phẩm.</w:t>
       </w:r>
     </w:p>
     <w:p>
@@ -1735,7 +1908,37 @@
         <w:t xml:space="preserve">tấn</w:t>
       </w:r>
       <w:r>
-        <w:t xml:space="preserve">. Phiếu chia thành 4 khối theo tình trạng hàng.</w:t>
+        <w:t xml:space="preserve">. Phiếu chia thành 4 khối theo tình trạng hàng. Riêng khối 3 — </w:t>
+      </w:r>
+      <w:r>
+        <w:rPr>
+          <w:b/>
+          <w:bCs/>
+        </w:rPr>
+        <w:t xml:space="preserve">hợp đồng đã ký</w:t>
+      </w:r>
+      <w:r>
+        <w:t xml:space="preserve"> — </w:t>
+      </w:r>
+      <w:r>
+        <w:rPr>
+          <w:b/>
+          <w:bCs/>
+        </w:rPr>
+        <w:t xml:space="preserve">không phải nhập lại mỗi ngày</w:t>
+      </w:r>
+      <w:r>
+        <w:t xml:space="preserve">: mỗi hợp đồng nhập </w:t>
+      </w:r>
+      <w:r>
+        <w:rPr>
+          <w:b/>
+          <w:bCs/>
+        </w:rPr>
+        <w:t xml:space="preserve">một lần</w:t>
+      </w:r>
+      <w:r>
+        <w:t xml:space="preserve"> rồi hệ thống tự tính vào tồn kho cho tới khi giao hàng.</w:t>
       </w:r>
     </w:p>
     <w:p>
@@ -1746,7 +1949,7 @@
       <w:r>
         <w:drawing>
           <wp:inline distT="0" distB="0" distL="0" distR="0">
-            <wp:extent cx="6191250" cy="5362575"/>
+            <wp:extent cx="6191250" cy="5610225"/>
             <wp:effectExtent t="0" r="0" b="0" l="0"/>
             <wp:docPr id="1" name="img" descr="Ảnh hướng dẫn có đánh số bước" title="img/06-ton-kho.png"/>
             <wp:cNvGraphicFramePr>
@@ -1771,7 +1974,7 @@
                   <pic:spPr bwMode="auto">
                     <a:xfrm>
                       <a:off x="0" y="0"/>
-                      <a:ext cx="6191250" cy="5362575"/>
+                      <a:ext cx="6191250" cy="5610225"/>
                     </a:xfrm>
                     <a:prstGeom prst="rect">
                       <a:avLst/>
@@ -1797,7 +2000,7 @@
           <w:sz w:val="17"/>
           <w:szCs w:val="17"/>
         </w:rPr>
-        <w:t xml:space="preserve">Hình 6. Phiếu Tồn kho — hai bảng theo tình trạng hợp đồng</w:t>
+        <w:t xml:space="preserve">Hình 6. Phiếu Tồn kho — khối 3 là hợp đồng có vòng đời riêng</w:t>
       </w:r>
     </w:p>
     <w:p>
@@ -1837,7 +2040,7 @@
         <w:t xml:space="preserve">Lấy tồn ngày trước</w:t>
       </w:r>
       <w:r>
-        <w:t xml:space="preserve"> — chép toàn bộ tồn kho ngày gần nhất sang rồi sửa lại cho đúng ngày này.</w:t>
+        <w:t xml:space="preserve"> — chép khối 1, 2 và 4 của ngày gần nhất sang rồi sửa lại cho đúng ngày này.</w:t>
       </w:r>
     </w:p>
     <w:p>
@@ -1897,14 +2100,24 @@
         <w:t xml:space="preserve">3. Số lượng đã ký hợp đồng</w:t>
       </w:r>
       <w:r>
-        <w:t xml:space="preserve"> — thêm đơn giá, lịch giao và </w:t>
-      </w:r>
-      <w:r>
-        <w:rPr>
-          <w:b/>
-          <w:bCs/>
-        </w:rPr>
-        <w:t xml:space="preserve">file Hợp đồng đã ký scan có đóng dấu</w:t>
+        <w:t xml:space="preserve"> — nhập </w:t>
+      </w:r>
+      <w:r>
+        <w:rPr>
+          <w:b/>
+          <w:bCs/>
+        </w:rPr>
+        <w:t xml:space="preserve">một lần cho mỗi hợp đồng</w:t>
+      </w:r>
+      <w:r>
+        <w:t xml:space="preserve">, mỗi hợp đồng trải </w:t>
+      </w:r>
+      <w:r>
+        <w:rPr>
+          <w:b/>
+          <w:bCs/>
+        </w:rPr>
+        <w:t xml:space="preserve">2 hàng</w:t>
       </w:r>
       <w:r>
         <w:t xml:space="preserve">.</w:t>
@@ -1920,6 +2133,49 @@
         <w:spacing w:after="100"/>
       </w:pPr>
       <w:r>
+        <w:t xml:space="preserve">*(Hàng trên)* </w:t>
+      </w:r>
+      <w:r>
+        <w:rPr>
+          <w:b/>
+          <w:bCs/>
+        </w:rPr>
+        <w:t xml:space="preserve">Chủng loại</w:t>
+      </w:r>
+      <w:r>
+        <w:t xml:space="preserve"> · </w:t>
+      </w:r>
+      <w:r>
+        <w:rPr>
+          <w:b/>
+          <w:bCs/>
+        </w:rPr>
+        <w:t xml:space="preserve">Mã HĐ/PL</w:t>
+      </w:r>
+      <w:r>
+        <w:t xml:space="preserve"> · </w:t>
+      </w:r>
+      <w:r>
+        <w:rPr>
+          <w:b/>
+          <w:bCs/>
+        </w:rPr>
+        <w:t xml:space="preserve">SL (tấn)</w:t>
+      </w:r>
+      <w:r>
+        <w:t xml:space="preserve"> · </w:t>
+      </w:r>
+      <w:r>
+        <w:rPr>
+          <w:b/>
+          <w:bCs/>
+        </w:rPr>
+        <w:t xml:space="preserve">Đơn giá</w:t>
+      </w:r>
+      <w:r>
+        <w:t xml:space="preserve"> · </w:t>
+      </w:r>
+      <w:r>
         <w:rPr>
           <w:b/>
           <w:bCs/>
@@ -1927,7 +2183,7 @@
         <w:t xml:space="preserve">Tiền</w:t>
       </w:r>
       <w:r>
-        <w:t xml:space="preserve"> — mỗi dòng ở khối 3 tự chọn VND hoặc USD; chọn USD thì nhập </w:t>
+        <w:t xml:space="preserve"> (VND/USD) · </w:t>
       </w:r>
       <w:r>
         <w:rPr>
@@ -1937,7 +2193,37 @@
         <w:t xml:space="preserve">Tỷ giá</w:t>
       </w:r>
       <w:r>
-        <w:t xml:space="preserve"> ngay ở dòng đó.</w:t>
+        <w:t xml:space="preserve"> khi chọn USD; </w:t>
+      </w:r>
+      <w:r>
+        <w:rPr>
+          <w:b/>
+          <w:bCs/>
+        </w:rPr>
+        <w:t xml:space="preserve">Thành tiền</w:t>
+      </w:r>
+      <w:r>
+        <w:t xml:space="preserve"> tự tính. Cuối hàng có nút </w:t>
+      </w:r>
+      <w:r>
+        <w:rPr>
+          <w:b/>
+          <w:bCs/>
+        </w:rPr>
+        <w:t xml:space="preserve">lưu</w:t>
+      </w:r>
+      <w:r>
+        <w:t xml:space="preserve"> và </w:t>
+      </w:r>
+      <w:r>
+        <w:rPr>
+          <w:b/>
+          <w:bCs/>
+        </w:rPr>
+        <w:t xml:space="preserve">xoá</w:t>
+      </w:r>
+      <w:r>
+        <w:t xml:space="preserve"> của riêng hợp đồng đó.</w:t>
       </w:r>
     </w:p>
     <w:p>
@@ -1950,6 +2236,59 @@
         <w:spacing w:after="100"/>
       </w:pPr>
       <w:r>
+        <w:t xml:space="preserve">*(Hàng dưới)* </w:t>
+      </w:r>
+      <w:r>
+        <w:rPr>
+          <w:b/>
+          <w:bCs/>
+        </w:rPr>
+        <w:t xml:space="preserve">Bắt đầu tồn kho</w:t>
+      </w:r>
+      <w:r>
+        <w:t xml:space="preserve"> · </w:t>
+      </w:r>
+      <w:r>
+        <w:rPr>
+          <w:b/>
+          <w:bCs/>
+        </w:rPr>
+        <w:t xml:space="preserve">Lịch giao</w:t>
+      </w:r>
+      <w:r>
+        <w:t xml:space="preserve"> · </w:t>
+      </w:r>
+      <w:r>
+        <w:rPr>
+          <w:b/>
+          <w:bCs/>
+        </w:rPr>
+        <w:t xml:space="preserve">Ngày giao</w:t>
+      </w:r>
+      <w:r>
+        <w:t xml:space="preserve"> · </w:t>
+      </w:r>
+      <w:r>
+        <w:rPr>
+          <w:b/>
+          <w:bCs/>
+        </w:rPr>
+        <w:t xml:space="preserve">HĐ đã ký (scan)</w:t>
+      </w:r>
+      <w:r>
+        <w:t xml:space="preserve"> — đính kèm bản Hợp đồng đã ký có đóng dấu (PDF hoặc ảnh).</w:t>
+      </w:r>
+    </w:p>
+    <w:p>
+      <w:pPr>
+        <w:pStyle w:val="ListParagraph"/>
+        <w:numPr>
+          <w:ilvl w:val="0"/>
+          <w:numId w:val="8"/>
+        </w:numPr>
+        <w:spacing w:after="100"/>
+      </w:pPr>
+      <w:r>
         <w:rPr>
           <w:b/>
           <w:bCs/>
@@ -1992,6 +2331,78 @@
         <w:spacing w:after="80"/>
       </w:pPr>
       <w:r>
+        <w:t xml:space="preserve">**Hợp đồng đã ký tính vào tồn kho từ *Bắt đầu tồn kho* đến hết ngày TRƯỚC *Ngày giao*.** Lúc mới ký chỉ cần điền *Bắt đầu tồn kho* (để trống *Ngày giao*) — hợp đồng sẽ tự hiện ở tồn kho mọi ngày sau đó. Khi đã xuất kho thì **chỉ cần mở ra điền *Ngày giao*** là xong, không phải nhập lại gì nữa.</w:t>
+      </w:r>
+    </w:p>
+    <w:p>
+      <w:pPr>
+        <w:pStyle w:val="ListParagraph"/>
+        <w:numPr>
+          <w:ilvl w:val="0"/>
+          <w:numId w:val="3"/>
+        </w:numPr>
+        <w:spacing w:after="80"/>
+      </w:pPr>
+      <w:r>
+        <w:t xml:space="preserve">**Ngày bắt đầu phải trước *Ngày giao* (và *Lịch giao*) ít nhất 1 ngày** — nhập sai hệ thống sẽ báo và không cho lưu.</w:t>
+      </w:r>
+    </w:p>
+    <w:p>
+      <w:pPr>
+        <w:pStyle w:val="ListParagraph"/>
+        <w:numPr>
+          <w:ilvl w:val="0"/>
+          <w:numId w:val="3"/>
+        </w:numPr>
+        <w:spacing w:after="80"/>
+      </w:pPr>
+      <w:r>
+        <w:t xml:space="preserve">Mỗi hợp đồng </w:t>
+      </w:r>
+      <w:r>
+        <w:rPr>
+          <w:b/>
+          <w:bCs/>
+        </w:rPr>
+        <w:t xml:space="preserve">lưu riêng bằng nút lưu ở cuối hàng trên</w:t>
+      </w:r>
+      <w:r>
+        <w:t xml:space="preserve">, KHÔNG đi kèm nút *Lưu số liệu* của phiếu ngày (vì hợp đồng không thuộc riêng một ngày nào).</w:t>
+      </w:r>
+    </w:p>
+    <w:p>
+      <w:pPr>
+        <w:pStyle w:val="ListParagraph"/>
+        <w:numPr>
+          <w:ilvl w:val="0"/>
+          <w:numId w:val="3"/>
+        </w:numPr>
+        <w:spacing w:after="80"/>
+      </w:pPr>
+      <w:r>
+        <w:t xml:space="preserve">Nút </w:t>
+      </w:r>
+      <w:r>
+        <w:rPr>
+          <w:b/>
+          <w:bCs/>
+        </w:rPr>
+        <w:t xml:space="preserve">Lấy tồn ngày trước</w:t>
+      </w:r>
+      <w:r>
+        <w:t xml:space="preserve"> KHÔNG chép khối 3 — hợp đồng tự nối sang ngày mới theo vòng đời của nó, chép lại sẽ thành nhân đôi. Nút này cũng không chép các dòng bán ở tab Tiêu thụ, vì tiêu thụ là số phát sinh trong ngày.</w:t>
+      </w:r>
+    </w:p>
+    <w:p>
+      <w:pPr>
+        <w:pStyle w:val="ListParagraph"/>
+        <w:numPr>
+          <w:ilvl w:val="0"/>
+          <w:numId w:val="3"/>
+        </w:numPr>
+        <w:spacing w:after="80"/>
+      </w:pPr>
+      <w:r>
         <w:t xml:space="preserve">Khối </w:t>
       </w:r>
       <w:r>
@@ -2023,39 +2434,6 @@
       </w:r>
       <w:r>
         <w:t xml:space="preserve"> đơn vị có nhà máy hay không. Đơn vị nào không có số thì để trống.</w:t>
-      </w:r>
-    </w:p>
-    <w:p>
-      <w:pPr>
-        <w:pStyle w:val="ListParagraph"/>
-        <w:numPr>
-          <w:ilvl w:val="0"/>
-          <w:numId w:val="3"/>
-        </w:numPr>
-        <w:spacing w:after="80"/>
-      </w:pPr>
-      <w:r>
-        <w:t xml:space="preserve">Nút </w:t>
-      </w:r>
-      <w:r>
-        <w:rPr>
-          <w:b/>
-          <w:bCs/>
-        </w:rPr>
-        <w:t xml:space="preserve">Lấy tồn ngày trước</w:t>
-      </w:r>
-      <w:r>
-        <w:t xml:space="preserve"> chỉ chép </w:t>
-      </w:r>
-      <w:r>
-        <w:rPr>
-          <w:b/>
-          <w:bCs/>
-        </w:rPr>
-        <w:t xml:space="preserve">tồn kho</w:t>
-      </w:r>
-      <w:r>
-        <w:t xml:space="preserve">, KHÔNG chép các dòng bán ở tab Tiêu thụ — vì tiêu thụ là số phát sinh trong ngày, chép sang sẽ thành khai khống.</w:t>
       </w:r>
     </w:p>
     <w:p>

</xml_diff>

<commit_message>
docs(huong-dan): rename stock block 3 to signed-but-undelivered and bump to 0.2.78
Co-Authored-By: Claude Opus 4.8 <noreply@anthropic.com>
</commit_message>
<xml_diff>
--- a/docs/huong-dan/nhap-lieu-don-vi-thanh-vien/Huong-dan-nhap-lieu-don-vi-thanh-vien.docx
+++ b/docs/huong-dan/nhap-lieu-don-vi-thanh-vien/Huong-dan-nhap-lieu-don-vi-thanh-vien.docx
@@ -16,7 +16,7 @@
         <w:spacing w:after="200"/>
       </w:pPr>
       <w:r>
-        <w:t xml:space="preserve">Tài liệu dành cho cán bộ đơn vị thành viên VRG nhập số liệu hằng ngày trên Hệ thống Dự báo &amp; Quản trị Giá Cao su. Tài khoản đơn vị chỉ thấy và chỉ nhập được số liệu của chính đơn vị mình. Có 5 mục cần nhập: Báo cáo thu mua, Báo cáo tiêu thụ, Báo cáo tồn kho và Nhu cầu thị trường (nhập theo NGÀY), cùng Kế hoạch năm (nhập 1 lần cho cả năm). Tài liệu bám theo phiên bản 0.2.77. Riêng 4 mục báo cáo còn có thể tải mẫu Excel về điền rồi nhập lên thay vì gõ tay (xem mục 9).</w:t>
+        <w:t xml:space="preserve">Tài liệu dành cho cán bộ đơn vị thành viên VRG nhập số liệu hằng ngày trên Hệ thống Dự báo &amp; Quản trị Giá Cao su. Tài khoản đơn vị chỉ thấy và chỉ nhập được số liệu của chính đơn vị mình. Có 5 mục cần nhập: Báo cáo thu mua, Báo cáo tiêu thụ, Báo cáo tồn kho và Nhu cầu thị trường (nhập theo NGÀY), cùng Kế hoạch năm (nhập 1 lần cho cả năm). Tài liệu bám theo phiên bản 0.2.78. Riêng 4 mục báo cáo còn có thể tải mẫu Excel về điền rồi nhập lên thay vì gõ tay (xem mục 9).</w:t>
       </w:r>
     </w:p>
     <w:p>
@@ -2097,7 +2097,7 @@
           <w:b/>
           <w:bCs/>
         </w:rPr>
-        <w:t xml:space="preserve">3. Số lượng đã ký hợp đồng</w:t>
+        <w:t xml:space="preserve">3. Số lượng đã ký hợp đồng chưa giao</w:t>
       </w:r>
       <w:r>
         <w:t xml:space="preserve"> — nhập </w:t>

</xml_diff>

<commit_message>
docs(huong-dan): drop excel entry from the member guide, add number rules
Excel entry is turned off, so the guide no longer documents it. Add the
stock contract history screen, rename the contract code label, and add
the shared rule for typing numbers: comma for decimals, thousand dots
inserted by the form itself.

Rebuild the Word file from spec.json; it now carries real Word bold
instead of leftover markdown markers.
</commit_message>
<xml_diff>
--- a/docs/huong-dan/nhap-lieu-don-vi-thanh-vien/Huong-dan-nhap-lieu-don-vi-thanh-vien.docx
+++ b/docs/huong-dan/nhap-lieu-don-vi-thanh-vien/Huong-dan-nhap-lieu-don-vi-thanh-vien.docx
@@ -16,7 +16,7 @@
         <w:spacing w:after="200"/>
       </w:pPr>
       <w:r>
-        <w:t xml:space="preserve">Tài liệu dành cho cán bộ đơn vị thành viên VRG nhập số liệu hằng ngày trên Hệ thống Dự báo &amp; Quản trị Giá Cao su. Tài khoản đơn vị chỉ thấy và chỉ nhập được số liệu của chính đơn vị mình. Có 5 mục cần nhập: Báo cáo thu mua, Báo cáo tiêu thụ, Báo cáo tồn kho và Nhu cầu thị trường (nhập theo NGÀY), cùng Kế hoạch năm (nhập 1 lần cho cả năm). Riêng 4 mục báo cáo còn có thể tải mẫu Excel về điền rồi nhập lên thay vì gõ tay (xem mục 9).</w:t>
+        <w:t xml:space="preserve">Tài liệu dành cho cán bộ đơn vị thành viên VRG nhập số liệu hằng ngày trên Hệ thống Dự báo &amp; Quản trị Giá Cao su. Tài khoản đơn vị chỉ thấy và chỉ nhập được số liệu của chính đơn vị mình. Có 5 mục cần nhập: Báo cáo thu mua, Báo cáo tiêu thụ, Báo cáo tồn kho và Nhu cầu thị trường (nhập theo NGÀY), cùng Kế hoạch năm (nhập 1 lần cho cả năm); ngoài ra có mục Hợp đồng tồn kho chỉ để tra cứu.</w:t>
       </w:r>
     </w:p>
     <w:p>
@@ -304,6 +304,39 @@
         <w:spacing w:after="80"/>
       </w:pPr>
       <w:r>
+        <w:t xml:space="preserve">Ngoài 5 mục trên, menu còn mục </w:t>
+      </w:r>
+      <w:r>
+        <w:rPr>
+          <w:b/>
+          <w:bCs/>
+        </w:rPr>
+        <w:t xml:space="preserve">Hợp đồng tồn kho</w:t>
+      </w:r>
+      <w:r>
+        <w:t xml:space="preserve"> — </w:t>
+      </w:r>
+      <w:r>
+        <w:rPr>
+          <w:b/>
+          <w:bCs/>
+        </w:rPr>
+        <w:t xml:space="preserve">chỉ để tra cứu</w:t>
+      </w:r>
+      <w:r>
+        <w:t xml:space="preserve">, không nhập số liệu (xem mục 7).</w:t>
+      </w:r>
+    </w:p>
+    <w:p>
+      <w:pPr>
+        <w:pStyle w:val="ListParagraph"/>
+        <w:numPr>
+          <w:ilvl w:val="0"/>
+          <w:numId w:val="3"/>
+        </w:numPr>
+        <w:spacing w:after="80"/>
+      </w:pPr>
+      <w:r>
         <w:t xml:space="preserve">Báo cáo tiêu thụ và Báo cáo tồn kho là </w:t>
       </w:r>
       <w:r>
@@ -336,7 +369,7 @@
         <w:pageBreakBefore/>
       </w:pPr>
       <w:r>
-        <w:t xml:space="preserve">2. Màn hình danh sách và 3 nút thao tác</w:t>
+        <w:t xml:space="preserve">2. Màn hình danh sách và nút thao tác</w:t>
       </w:r>
     </w:p>
     <w:p>
@@ -359,7 +392,7 @@
         <w:spacing w:after="140"/>
       </w:pPr>
       <w:r>
-        <w:t xml:space="preserve">Mỗi màn báo cáo đều có danh sách các ngày đã nhập và 3 nút thao tác giống nhau.</w:t>
+        <w:t xml:space="preserve">Mỗi màn báo cáo đều có danh sách các ngày đã nhập và các nút thao tác giống nhau.</w:t>
       </w:r>
     </w:p>
     <w:p>
@@ -470,46 +503,6 @@
           <w:b/>
           <w:bCs/>
         </w:rPr>
-        <w:t xml:space="preserve">Tải mẫu Excel</w:t>
-      </w:r>
-      <w:r>
-        <w:t xml:space="preserve"> — tải file mẫu về để điền ngoại tuyến (xem mục 9).</w:t>
-      </w:r>
-    </w:p>
-    <w:p>
-      <w:pPr>
-        <w:pStyle w:val="ListParagraph"/>
-        <w:numPr>
-          <w:ilvl w:val="0"/>
-          <w:numId w:val="4"/>
-        </w:numPr>
-        <w:spacing w:after="100"/>
-      </w:pPr>
-      <w:r>
-        <w:rPr>
-          <w:b/>
-          <w:bCs/>
-        </w:rPr>
-        <w:t xml:space="preserve">Nhập từ Excel</w:t>
-      </w:r>
-      <w:r>
-        <w:t xml:space="preserve"> — nhập file đã điền lên hệ thống (xem mục 9).</w:t>
-      </w:r>
-    </w:p>
-    <w:p>
-      <w:pPr>
-        <w:pStyle w:val="ListParagraph"/>
-        <w:numPr>
-          <w:ilvl w:val="0"/>
-          <w:numId w:val="4"/>
-        </w:numPr>
-        <w:spacing w:after="100"/>
-      </w:pPr>
-      <w:r>
-        <w:rPr>
-          <w:b/>
-          <w:bCs/>
-        </w:rPr>
         <w:t xml:space="preserve">Biểu tượng bút</w:t>
       </w:r>
       <w:r>
@@ -727,7 +720,7 @@
         <w:t xml:space="preserve">Mủ chén — Đơn giá tính theo</w:t>
       </w:r>
       <w:r>
-        <w:t xml:space="preserve">: chọn *Độ TSC* hoặc *Độ DRC*; nhãn ô đơn giá đổi theo lựa chọn này.</w:t>
+        <w:t xml:space="preserve">: chọn “Độ TSC” hoặc “Độ DRC”; nhãn ô đơn giá đổi theo lựa chọn này.</w:t>
       </w:r>
     </w:p>
     <w:p>
@@ -1192,7 +1185,7 @@
         <w:t xml:space="preserve">Mủ chén — Đơn giá tính theo</w:t>
       </w:r>
       <w:r>
-        <w:t xml:space="preserve">: *Độ TSC* hoặc *Độ DRC*.</w:t>
+        <w:t xml:space="preserve">: “Độ TSC” hoặc “Độ DRC”.</w:t>
       </w:r>
     </w:p>
     <w:p>
@@ -1262,7 +1255,7 @@
         <w:t xml:space="preserve">Tiền</w:t>
       </w:r>
       <w:r>
-        <w:t xml:space="preserve"> là *USD* thì nhập </w:t>
+        <w:t xml:space="preserve"> là “USD” thì nhập </w:t>
       </w:r>
       <w:r>
         <w:rPr>
@@ -1272,7 +1265,7 @@
         <w:t xml:space="preserve">Tỷ giá</w:t>
       </w:r>
       <w:r>
-        <w:t xml:space="preserve"> (1 USD = ? VND) ngay ở dòng đó — hoặc bấm *Lấy tỷ giá VCB cho các dòng USD*.</w:t>
+        <w:t xml:space="preserve"> (1 USD = ? VND) ngay ở dòng đó — hoặc bấm “Lấy tỷ giá VCB cho các dòng USD”.</w:t>
       </w:r>
     </w:p>
     <w:p>
@@ -1502,7 +1495,7 @@
         <w:spacing w:after="100"/>
       </w:pPr>
       <w:r>
-        <w:t xml:space="preserve">*(Hàng trên)* </w:t>
+        <w:t xml:space="preserve">(Hàng trên) </w:t>
       </w:r>
       <w:r>
         <w:rPr>
@@ -1565,7 +1558,7 @@
         <w:spacing w:after="100"/>
       </w:pPr>
       <w:r>
-        <w:t xml:space="preserve">*(Hàng trên)* </w:t>
+        <w:t xml:space="preserve">(Hàng trên) </w:t>
       </w:r>
       <w:r>
         <w:rPr>
@@ -1608,7 +1601,7 @@
         <w:spacing w:after="100"/>
       </w:pPr>
       <w:r>
-        <w:t xml:space="preserve">*(Hàng dưới)* </w:t>
+        <w:t xml:space="preserve">(Hàng dưới) </w:t>
       </w:r>
       <w:r>
         <w:rPr>
@@ -2153,7 +2146,7 @@
         <w:spacing w:after="100"/>
       </w:pPr>
       <w:r>
-        <w:t xml:space="preserve">*(Hàng trên)* </w:t>
+        <w:t xml:space="preserve">(Hàng trên) </w:t>
       </w:r>
       <w:r>
         <w:rPr>
@@ -2170,7 +2163,7 @@
           <w:b/>
           <w:bCs/>
         </w:rPr>
-        <w:t xml:space="preserve">Mã HĐ/PL</w:t>
+        <w:t xml:space="preserve">Số HĐ/PL</w:t>
       </w:r>
       <w:r>
         <w:t xml:space="preserve"> · </w:t>
@@ -2256,7 +2249,7 @@
         <w:spacing w:after="100"/>
       </w:pPr>
       <w:r>
-        <w:t xml:space="preserve">*(Hàng dưới)* </w:t>
+        <w:t xml:space="preserve">(Hàng dưới) </w:t>
       </w:r>
       <w:r>
         <w:rPr>
@@ -2361,7 +2354,24 @@
         <w:spacing w:after="80"/>
       </w:pPr>
       <w:r>
-        <w:t xml:space="preserve">**Hợp đồng nằm ở khối 3 từ *Bắt đầu tồn kho* đến hết ngày TRƯỚC *Ngày giao*.** Lúc mới ký chỉ cần điền *Bắt đầu tồn kho* (để trống *Ngày giao*) — hợp đồng sẽ tự hiện ở khối 3 mọi ngày sau đó. Khi đã xuất kho thì **chỉ cần mở ra điền *Ngày giao*** là xong, không phải nhập lại gì nữa.</w:t>
+        <w:rPr>
+          <w:b/>
+          <w:bCs/>
+        </w:rPr>
+        <w:t xml:space="preserve">Hợp đồng nằm ở khối 3 từ “Bắt đầu tồn kho” đến hết ngày TRƯỚC “Ngày giao”.</w:t>
+      </w:r>
+      <w:r>
+        <w:t xml:space="preserve"> Lúc mới ký chỉ cần điền “Bắt đầu tồn kho” (để trống “Ngày giao”) — hợp đồng sẽ tự hiện ở khối 3 mọi ngày sau đó. Khi đã xuất kho thì </w:t>
+      </w:r>
+      <w:r>
+        <w:rPr>
+          <w:b/>
+          <w:bCs/>
+        </w:rPr>
+        <w:t xml:space="preserve">chỉ cần mở ra điền “Ngày giao</w:t>
+      </w:r>
+      <w:r>
+        <w:t xml:space="preserve">” là xong, không phải nhập lại gì nữa.</w:t>
       </w:r>
     </w:p>
     <w:p>
@@ -2374,7 +2384,14 @@
         <w:spacing w:after="80"/>
       </w:pPr>
       <w:r>
-        <w:t xml:space="preserve">**Ngày bắt đầu phải trước *Ngày giao* (và *Lịch giao*) ít nhất 1 ngày** — nhập sai hệ thống sẽ báo và không cho lưu.</w:t>
+        <w:rPr>
+          <w:b/>
+          <w:bCs/>
+        </w:rPr>
+        <w:t xml:space="preserve">Ngày bắt đầu phải trước “Ngày giao” (và “Lịch giao”) ít nhất 1 ngày</w:t>
+      </w:r>
+      <w:r>
+        <w:t xml:space="preserve"> — nhập sai hệ thống sẽ báo và không cho lưu.</w:t>
       </w:r>
     </w:p>
     <w:p>
@@ -2397,7 +2414,7 @@
         <w:t xml:space="preserve">lưu riêng bằng nút lưu ở cuối hàng trên</w:t>
       </w:r>
       <w:r>
-        <w:t xml:space="preserve">, KHÔNG đi kèm nút *Lưu số liệu* của phiếu ngày (vì hợp đồng không thuộc riêng một ngày nào).</w:t>
+        <w:t xml:space="preserve">, KHÔNG đi kèm nút “Lưu số liệu” của phiếu ngày (vì hợp đồng không thuộc riêng một ngày nào).</w:t>
       </w:r>
     </w:p>
     <w:p>
@@ -2486,7 +2503,7 @@
         <w:t xml:space="preserve">Tổng hợp tồn kho</w:t>
       </w:r>
       <w:r>
-        <w:t xml:space="preserve">: *Tồn kho thành phẩm* = khối 1 + khối 2. Khối 3 là </w:t>
+        <w:t xml:space="preserve">: “Tồn kho thành phẩm” = khối 1 + khối 2. Khối 3 là </w:t>
       </w:r>
       <w:r>
         <w:rPr>
@@ -2506,7 +2523,7 @@
         <w:t xml:space="preserve">không vượt quá</w:t>
       </w:r>
       <w:r>
-        <w:t xml:space="preserve"> *Tồn kho thành phẩm*.</w:t>
+        <w:t xml:space="preserve"> “Tồn kho thành phẩm”.</w:t>
       </w:r>
     </w:p>
     <w:p>
@@ -2548,7 +2565,213 @@
         <w:pageBreakBefore/>
       </w:pPr>
       <w:r>
-        <w:t xml:space="preserve">7. Nhập Nhu cầu thị trường</w:t>
+        <w:t xml:space="preserve">7. Xem Hợp đồng tồn kho</w:t>
+      </w:r>
+    </w:p>
+    <w:p>
+      <w:pPr>
+        <w:spacing w:after="60"/>
+      </w:pPr>
+      <w:r>
+        <w:rPr>
+          <w:b/>
+          <w:bCs/>
+        </w:rPr>
+        <w:t xml:space="preserve">Vị trí: </w:t>
+      </w:r>
+      <w:r>
+        <w:t xml:space="preserve">Menu → Hợp đồng tồn kho</w:t>
+      </w:r>
+    </w:p>
+    <w:p>
+      <w:pPr>
+        <w:spacing w:after="140"/>
+      </w:pPr>
+      <w:r>
+        <w:t xml:space="preserve">Màn này liệt kê </w:t>
+      </w:r>
+      <w:r>
+        <w:rPr>
+          <w:b/>
+          <w:bCs/>
+        </w:rPr>
+        <w:t xml:space="preserve">tất cả hợp đồng đã ký</w:t>
+      </w:r>
+      <w:r>
+        <w:t xml:space="preserve"> của đơn vị, </w:t>
+      </w:r>
+      <w:r>
+        <w:rPr>
+          <w:b/>
+          <w:bCs/>
+        </w:rPr>
+        <w:t xml:space="preserve">kể cả hợp đồng đã giao</w:t>
+      </w:r>
+      <w:r>
+        <w:t xml:space="preserve">. Khi một hợp đồng được điền </w:t>
+      </w:r>
+      <w:r>
+        <w:rPr>
+          <w:b/>
+          <w:bCs/>
+        </w:rPr>
+        <w:t xml:space="preserve">Ngày giao thực tế</w:t>
+      </w:r>
+      <w:r>
+        <w:t xml:space="preserve"> ở Báo cáo tồn kho thì nó không còn nằm trong tồn kho của những ngày sau nữa — vào đây để tra cứu lại toàn bộ.</w:t>
+      </w:r>
+    </w:p>
+    <w:p>
+      <w:pPr>
+        <w:spacing w:after="100"/>
+      </w:pPr>
+      <w:r>
+        <w:t xml:space="preserve">Cách dùng:</w:t>
+      </w:r>
+    </w:p>
+    <w:p>
+      <w:pPr>
+        <w:spacing w:after="80"/>
+      </w:pPr>
+      <w:r>
+        <w:rPr>
+          <w:b/>
+          <w:bCs/>
+        </w:rPr>
+        <w:t xml:space="preserve">Các bước:</w:t>
+      </w:r>
+    </w:p>
+    <w:p>
+      <w:pPr>
+        <w:pStyle w:val="ListParagraph"/>
+        <w:numPr>
+          <w:ilvl w:val="0"/>
+          <w:numId w:val="9"/>
+        </w:numPr>
+        <w:spacing w:after="100"/>
+      </w:pPr>
+      <w:r>
+        <w:t xml:space="preserve">Lọc theo </w:t>
+      </w:r>
+      <w:r>
+        <w:rPr>
+          <w:b/>
+          <w:bCs/>
+        </w:rPr>
+        <w:t xml:space="preserve">trạng thái</w:t>
+      </w:r>
+      <w:r>
+        <w:t xml:space="preserve"> (Tất cả / Chưa giao / Đã giao), theo </w:t>
+      </w:r>
+      <w:r>
+        <w:rPr>
+          <w:b/>
+          <w:bCs/>
+        </w:rPr>
+        <w:t xml:space="preserve">khoảng ngày</w:t>
+      </w:r>
+      <w:r>
+        <w:t xml:space="preserve">, hoặc gõ </w:t>
+      </w:r>
+      <w:r>
+        <w:rPr>
+          <w:b/>
+          <w:bCs/>
+        </w:rPr>
+        <w:t xml:space="preserve">Số HĐ/PL</w:t>
+      </w:r>
+      <w:r>
+        <w:t xml:space="preserve"> (hoặc chủng loại) vào ô tìm kiếm.</w:t>
+      </w:r>
+    </w:p>
+    <w:p>
+      <w:pPr>
+        <w:pStyle w:val="ListParagraph"/>
+        <w:numPr>
+          <w:ilvl w:val="0"/>
+          <w:numId w:val="9"/>
+        </w:numPr>
+        <w:spacing w:after="100"/>
+      </w:pPr>
+      <w:r>
+        <w:t xml:space="preserve">Bảng hiện: Số HĐ/PL · chủng loại · số lượng · đơn giá · ngày bắt đầu tồn kho · lịch giao · ngày giao thực tế · trạng thái · file hợp đồng đã đính kèm.</w:t>
+      </w:r>
+    </w:p>
+    <w:p>
+      <w:pPr>
+        <w:pStyle w:val="ListParagraph"/>
+        <w:numPr>
+          <w:ilvl w:val="0"/>
+          <w:numId w:val="9"/>
+        </w:numPr>
+        <w:spacing w:after="100"/>
+      </w:pPr>
+      <w:r>
+        <w:t xml:space="preserve">Dòng </w:t>
+      </w:r>
+      <w:r>
+        <w:rPr>
+          <w:b/>
+          <w:bCs/>
+        </w:rPr>
+        <w:t xml:space="preserve">Tổng cộng</w:t>
+      </w:r>
+      <w:r>
+        <w:t xml:space="preserve"> ở cuối bảng cộng số lượng và thành tiền của các dòng đang hiện.</w:t>
+      </w:r>
+    </w:p>
+    <w:p>
+      <w:pPr>
+        <w:spacing w:after="80" w:before="140"/>
+      </w:pPr>
+      <w:r>
+        <w:rPr>
+          <w:b/>
+          <w:bCs/>
+        </w:rPr>
+        <w:t xml:space="preserve">Lưu ý:</w:t>
+      </w:r>
+    </w:p>
+    <w:p>
+      <w:pPr>
+        <w:pStyle w:val="ListParagraph"/>
+        <w:numPr>
+          <w:ilvl w:val="0"/>
+          <w:numId w:val="3"/>
+        </w:numPr>
+        <w:spacing w:after="80"/>
+      </w:pPr>
+      <w:r>
+        <w:t xml:space="preserve">Màn này </w:t>
+      </w:r>
+      <w:r>
+        <w:rPr>
+          <w:b/>
+          <w:bCs/>
+        </w:rPr>
+        <w:t xml:space="preserve">chỉ để xem</w:t>
+      </w:r>
+      <w:r>
+        <w:t xml:space="preserve">. Muốn sửa hợp đồng (kể cả điền Ngày giao thực tế) thì vào </w:t>
+      </w:r>
+      <w:r>
+        <w:rPr>
+          <w:b/>
+          <w:bCs/>
+        </w:rPr>
+        <w:t xml:space="preserve">Báo cáo tồn kho</w:t>
+      </w:r>
+      <w:r>
+        <w:t xml:space="preserve"> của đúng ngày.</w:t>
+      </w:r>
+    </w:p>
+    <w:p>
+      <w:pPr>
+        <w:pStyle w:val="Heading2"/>
+        <w:pageBreakBefore/>
+      </w:pPr>
+      <w:r>
+        <w:t xml:space="preserve">8. Nhập Nhu cầu thị trường</w:t>
       </w:r>
     </w:p>
     <w:p>
@@ -2673,7 +2896,7 @@
         <w:pStyle w:val="ListParagraph"/>
         <w:numPr>
           <w:ilvl w:val="0"/>
-          <w:numId w:val="9"/>
+          <w:numId w:val="10"/>
         </w:numPr>
         <w:spacing w:after="100"/>
       </w:pPr>
@@ -2696,7 +2919,7 @@
         <w:pStyle w:val="ListParagraph"/>
         <w:numPr>
           <w:ilvl w:val="0"/>
-          <w:numId w:val="9"/>
+          <w:numId w:val="10"/>
         </w:numPr>
         <w:spacing w:after="100"/>
       </w:pPr>
@@ -2719,7 +2942,7 @@
         <w:pStyle w:val="ListParagraph"/>
         <w:numPr>
           <w:ilvl w:val="0"/>
-          <w:numId w:val="9"/>
+          <w:numId w:val="10"/>
         </w:numPr>
         <w:spacing w:after="100"/>
       </w:pPr>
@@ -2742,7 +2965,7 @@
         <w:pStyle w:val="ListParagraph"/>
         <w:numPr>
           <w:ilvl w:val="0"/>
-          <w:numId w:val="9"/>
+          <w:numId w:val="10"/>
         </w:numPr>
         <w:spacing w:after="100"/>
       </w:pPr>
@@ -2765,7 +2988,7 @@
         <w:pStyle w:val="ListParagraph"/>
         <w:numPr>
           <w:ilvl w:val="0"/>
-          <w:numId w:val="9"/>
+          <w:numId w:val="10"/>
         </w:numPr>
         <w:spacing w:after="100"/>
       </w:pPr>
@@ -2788,7 +3011,7 @@
         <w:pStyle w:val="ListParagraph"/>
         <w:numPr>
           <w:ilvl w:val="0"/>
-          <w:numId w:val="9"/>
+          <w:numId w:val="10"/>
         </w:numPr>
         <w:spacing w:after="100"/>
       </w:pPr>
@@ -2885,29 +3108,6 @@
       </w:r>
       <w:r>
         <w:t xml:space="preserve"> — nhập lại ngày đã có sẽ được nhắc dùng chức năng Sửa.</w:t>
-      </w:r>
-    </w:p>
-    <w:p>
-      <w:pPr>
-        <w:pStyle w:val="ListParagraph"/>
-        <w:numPr>
-          <w:ilvl w:val="0"/>
-          <w:numId w:val="3"/>
-        </w:numPr>
-        <w:spacing w:after="80"/>
-      </w:pPr>
-      <w:r>
-        <w:t xml:space="preserve">Mục này </w:t>
-      </w:r>
-      <w:r>
-        <w:rPr>
-          <w:b/>
-          <w:bCs/>
-        </w:rPr>
-        <w:t xml:space="preserve">không có nhập bằng Excel</w:t>
-      </w:r>
-      <w:r>
-        <w:t xml:space="preserve">.</w:t>
       </w:r>
     </w:p>
     <w:p>
@@ -2916,7 +3116,7 @@
         <w:pageBreakBefore/>
       </w:pPr>
       <w:r>
-        <w:t xml:space="preserve">8. Nhập Kế hoạch năm</w:t>
+        <w:t xml:space="preserve">9. Nhập Kế hoạch năm</w:t>
       </w:r>
     </w:p>
     <w:p>
@@ -3021,7 +3221,7 @@
         <w:pStyle w:val="ListParagraph"/>
         <w:numPr>
           <w:ilvl w:val="0"/>
-          <w:numId w:val="10"/>
+          <w:numId w:val="11"/>
         </w:numPr>
         <w:spacing w:after="100"/>
       </w:pPr>
@@ -3044,7 +3244,7 @@
         <w:pStyle w:val="ListParagraph"/>
         <w:numPr>
           <w:ilvl w:val="0"/>
-          <w:numId w:val="10"/>
+          <w:numId w:val="11"/>
         </w:numPr>
         <w:spacing w:after="100"/>
       </w:pPr>
@@ -3064,7 +3264,7 @@
         <w:pStyle w:val="ListParagraph"/>
         <w:numPr>
           <w:ilvl w:val="0"/>
-          <w:numId w:val="10"/>
+          <w:numId w:val="11"/>
         </w:numPr>
         <w:spacing w:after="100"/>
       </w:pPr>
@@ -3084,7 +3284,7 @@
         <w:pStyle w:val="ListParagraph"/>
         <w:numPr>
           <w:ilvl w:val="0"/>
-          <w:numId w:val="10"/>
+          <w:numId w:val="11"/>
         </w:numPr>
         <w:spacing w:after="100"/>
       </w:pPr>
@@ -3104,7 +3304,7 @@
         <w:pStyle w:val="ListParagraph"/>
         <w:numPr>
           <w:ilvl w:val="0"/>
-          <w:numId w:val="10"/>
+          <w:numId w:val="11"/>
         </w:numPr>
         <w:spacing w:after="100"/>
       </w:pPr>
@@ -3206,7 +3406,7 @@
         <w:pageBreakBefore/>
       </w:pPr>
       <w:r>
-        <w:t xml:space="preserve">9. Nhập nhanh bằng Excel (tải mẫu → nhập lên)</w:t>
+        <w:t xml:space="preserve">10. Lưu ý chung — Cách gõ số</w:t>
       </w:r>
     </w:p>
     <w:p>
@@ -3221,7 +3421,7 @@
         <w:t xml:space="preserve">Vị trí: </w:t>
       </w:r>
       <w:r>
-        <w:t xml:space="preserve">Có ở 4 màn báo cáo: Thu mua / Tiêu thụ / Tồn kho / Kế hoạch năm</w:t>
+        <w:t xml:space="preserve">Áp dụng cho MỌI ô nhập số trên hệ thống</w:t>
       </w:r>
     </w:p>
     <w:p>
@@ -3229,87 +3429,15 @@
         <w:spacing w:after="140"/>
       </w:pPr>
       <w:r>
-        <w:t xml:space="preserve">Thay vì gõ tay từng ngày, có thể tải file Excel mẫu về điền rồi nhập lên. Hệ thống đọc file và cho </w:t>
-      </w:r>
-      <w:r>
-        <w:rPr>
-          <w:b/>
-          <w:bCs/>
-        </w:rPr>
-        <w:t xml:space="preserve">xem trước</w:t>
-      </w:r>
-      <w:r>
-        <w:t xml:space="preserve"> — dòng nào sai sẽ chỉ rõ sai ở đâu, chỉ những dòng hợp lệ mới được ghi.</w:t>
-      </w:r>
-    </w:p>
-    <w:p>
-      <w:pPr>
-        <w:spacing w:after="60" w:before="60"/>
-        <w:jc w:val="center"/>
-      </w:pPr>
-      <w:r>
-        <w:drawing>
-          <wp:inline distT="0" distB="0" distL="0" distR="0">
-            <wp:extent cx="6191250" cy="3095625"/>
-            <wp:effectExtent t="0" r="0" b="0" l="0"/>
-            <wp:docPr id="1" name="img" descr="Ảnh hướng dẫn có đánh số bước" title="img/08-import-xem-truoc.png"/>
-            <wp:cNvGraphicFramePr>
-              <a:graphicFrameLocks xmlns:a="http://schemas.openxmlformats.org/drawingml/2006/main" noChangeAspect="1"/>
-            </wp:cNvGraphicFramePr>
-            <a:graphic xmlns:a="http://schemas.openxmlformats.org/drawingml/2006/main">
-              <a:graphicData uri="http://schemas.openxmlformats.org/drawingml/2006/picture">
-                <pic:pic xmlns:pic="http://schemas.openxmlformats.org/drawingml/2006/picture">
-                  <pic:nvPicPr>
-                    <pic:cNvPr id="0" name="" descr=""/>
-                    <pic:cNvPicPr>
-                      <a:picLocks noChangeAspect="1" noChangeArrowheads="1"/>
-                    </pic:cNvPicPr>
-                  </pic:nvPicPr>
-                  <pic:blipFill>
-                    <a:blip r:embed="rId16" cstate="none"/>
-                    <a:srcRect/>
-                    <a:stretch>
-                      <a:fillRect/>
-                    </a:stretch>
-                  </pic:blipFill>
-                  <pic:spPr bwMode="auto">
-                    <a:xfrm>
-                      <a:off x="0" y="0"/>
-                      <a:ext cx="6191250" cy="3095625"/>
-                    </a:xfrm>
-                    <a:prstGeom prst="rect">
-                      <a:avLst/>
-                    </a:prstGeom>
-                  </pic:spPr>
-                </pic:pic>
-              </a:graphicData>
-            </a:graphic>
-          </wp:inline>
-        </w:drawing>
-      </w:r>
-    </w:p>
-    <w:p>
-      <w:pPr>
-        <w:spacing w:after="180"/>
-        <w:jc w:val="center"/>
-      </w:pPr>
-      <w:r>
-        <w:rPr>
-          <w:i/>
-          <w:iCs/>
-          <w:color w:val="888888"/>
-          <w:sz w:val="17"/>
-          <w:szCs w:val="17"/>
-        </w:rPr>
-        <w:t xml:space="preserve">Hình 9. Bảng xem trước trước khi ghi</w:t>
-      </w:r>
-    </w:p>
-    <w:p>
-      <w:pPr>
-        <w:spacing w:after="100"/>
-      </w:pPr>
-      <w:r>
-        <w:t xml:space="preserve">Cách làm:</w:t>
+        <w:t xml:space="preserve">Hệ thống dùng cách viết số của Việt Nam. Gõ đúng 2 quy tắc dưới đây là số luôn được lưu đúng.</w:t>
+      </w:r>
+    </w:p>
+    <w:p>
+      <w:pPr>
+        <w:spacing w:after="100"/>
+      </w:pPr>
+      <w:r>
+        <w:t xml:space="preserve">Hai quy tắc:</w:t>
       </w:r>
     </w:p>
     <w:p>
@@ -3329,141 +3457,39 @@
         <w:pStyle w:val="ListParagraph"/>
         <w:numPr>
           <w:ilvl w:val="0"/>
-          <w:numId w:val="11"/>
-        </w:numPr>
-        <w:spacing w:after="100"/>
-      </w:pPr>
-      <w:r>
-        <w:rPr>
-          <w:b/>
-          <w:bCs/>
-        </w:rPr>
-        <w:t xml:space="preserve">Tải mẫu Excel</w:t>
-      </w:r>
-      <w:r>
-        <w:t xml:space="preserve"> ở màn danh sách → điền số vào file (mỗi biểu một mẫu riêng).</w:t>
-      </w:r>
-    </w:p>
-    <w:p>
-      <w:pPr>
-        <w:pStyle w:val="ListParagraph"/>
-        <w:numPr>
-          <w:ilvl w:val="0"/>
-          <w:numId w:val="11"/>
-        </w:numPr>
-        <w:spacing w:after="100"/>
-      </w:pPr>
-      <w:r>
-        <w:rPr>
-          <w:b/>
-          <w:bCs/>
-        </w:rPr>
-        <w:t xml:space="preserve">Nhập từ Excel</w:t>
-      </w:r>
-      <w:r>
-        <w:t xml:space="preserve"> → chọn file vừa điền, hệ thống mở bảng </w:t>
-      </w:r>
-      <w:r>
-        <w:rPr>
-          <w:b/>
-          <w:bCs/>
-        </w:rPr>
-        <w:t xml:space="preserve">xem trước</w:t>
-      </w:r>
-      <w:r>
-        <w:t xml:space="preserve">.</w:t>
-      </w:r>
-    </w:p>
-    <w:p>
-      <w:pPr>
-        <w:pStyle w:val="ListParagraph"/>
-        <w:numPr>
-          <w:ilvl w:val="0"/>
-          <w:numId w:val="11"/>
-        </w:numPr>
-        <w:spacing w:after="100"/>
-      </w:pPr>
-      <w:r>
-        <w:t xml:space="preserve">Dòng tóm tắt cho biết đọc được bao nhiêu dòng, </w:t>
-      </w:r>
-      <w:r>
-        <w:rPr>
-          <w:b/>
-          <w:bCs/>
-        </w:rPr>
-        <w:t xml:space="preserve">bao nhiêu hợp lệ / bao nhiêu lỗi</w:t>
-      </w:r>
-      <w:r>
-        <w:t xml:space="preserve">.</w:t>
-      </w:r>
-    </w:p>
-    <w:p>
-      <w:pPr>
-        <w:pStyle w:val="ListParagraph"/>
-        <w:numPr>
-          <w:ilvl w:val="0"/>
-          <w:numId w:val="11"/>
-        </w:numPr>
-        <w:spacing w:after="100"/>
-      </w:pPr>
-      <w:r>
-        <w:t xml:space="preserve">Các cột </w:t>
-      </w:r>
-      <w:r>
-        <w:rPr>
-          <w:b/>
-          <w:bCs/>
-        </w:rPr>
-        <w:t xml:space="preserve">chọn từ danh sách</w:t>
-      </w:r>
-      <w:r>
-        <w:t xml:space="preserve"> (vd *Đơn giá mủ chén tính theo*) hiện đúng giá trị đã điền — để trống thì hệ thống dùng mặc định ghi ngay trên tiêu đề cột.</w:t>
-      </w:r>
-    </w:p>
-    <w:p>
-      <w:pPr>
-        <w:pStyle w:val="ListParagraph"/>
-        <w:numPr>
-          <w:ilvl w:val="0"/>
-          <w:numId w:val="11"/>
-        </w:numPr>
-        <w:spacing w:after="100"/>
-      </w:pPr>
-      <w:r>
-        <w:t xml:space="preserve">Cột </w:t>
-      </w:r>
-      <w:r>
-        <w:rPr>
-          <w:b/>
-          <w:bCs/>
-        </w:rPr>
-        <w:t xml:space="preserve">Ghi chú</w:t>
-      </w:r>
-      <w:r>
-        <w:t xml:space="preserve"> nói rõ dòng lỗi sai ở đâu (vd *Ngày: ngày không hợp lệ*).</w:t>
-      </w:r>
-    </w:p>
-    <w:p>
-      <w:pPr>
-        <w:pStyle w:val="ListParagraph"/>
-        <w:numPr>
-          <w:ilvl w:val="0"/>
-          <w:numId w:val="11"/>
-        </w:numPr>
-        <w:spacing w:after="100"/>
-      </w:pPr>
-      <w:r>
-        <w:t xml:space="preserve">Bấm </w:t>
-      </w:r>
-      <w:r>
-        <w:rPr>
-          <w:b/>
-          <w:bCs/>
-        </w:rPr>
-        <w:t xml:space="preserve">Xác nhận ghi N dòng</w:t>
-      </w:r>
-      <w:r>
-        <w:t xml:space="preserve"> — chỉ ghi các dòng hợp lệ, dòng lỗi bị bỏ qua.</w:t>
+          <w:numId w:val="12"/>
+        </w:numPr>
+        <w:spacing w:after="100"/>
+      </w:pPr>
+      <w:r>
+        <w:rPr>
+          <w:b/>
+          <w:bCs/>
+        </w:rPr>
+        <w:t xml:space="preserve">Phần thập phân dùng DẤU PHẨY</w:t>
+      </w:r>
+      <w:r>
+        <w:t xml:space="preserve"> — ví dụ “2.238,5” là hai nghìn hai trăm ba tám phẩy năm. Đừng dùng dấu chấm cho phần thập phân.</w:t>
+      </w:r>
+    </w:p>
+    <w:p>
+      <w:pPr>
+        <w:pStyle w:val="ListParagraph"/>
+        <w:numPr>
+          <w:ilvl w:val="0"/>
+          <w:numId w:val="12"/>
+        </w:numPr>
+        <w:spacing w:after="100"/>
+      </w:pPr>
+      <w:r>
+        <w:rPr>
+          <w:b/>
+          <w:bCs/>
+        </w:rPr>
+        <w:t xml:space="preserve">Dấu chấm phân cách hàng nghìn do hệ thống TỰ THÊM</w:t>
+      </w:r>
+      <w:r>
+        <w:t xml:space="preserve"> khi gõ — chỉ cần gõ “2238”, ô nhập sẽ tự hiện thành “2.238”.</w:t>
       </w:r>
     </w:p>
     <w:p>
@@ -3488,304 +3514,7 @@
         <w:spacing w:after="80"/>
       </w:pPr>
       <w:r>
-        <w:t xml:space="preserve">Chi tiết từng cột của ba biểu mẫu (kèm file mẫu và cách xử lý dòng lỗi): xem tài liệu riêng </w:t>
-      </w:r>
-      <w:r>
-        <w:rPr>
-          <w:b/>
-          <w:bCs/>
-        </w:rPr>
-        <w:t xml:space="preserve">Hướng dẫn nhập liệu bằng Excel</w:t>
-      </w:r>
-      <w:r>
-        <w:t xml:space="preserve"> trong thư mục `docs/huong-dan/nhap-lieu-bang-excel/`.</w:t>
-      </w:r>
-    </w:p>
-    <w:p>
-      <w:pPr>
-        <w:pStyle w:val="ListParagraph"/>
-        <w:numPr>
-          <w:ilvl w:val="0"/>
-          <w:numId w:val="3"/>
-        </w:numPr>
-        <w:spacing w:after="80"/>
-      </w:pPr>
-      <w:r>
-        <w:t xml:space="preserve">File mẫu của đơn vị </w:t>
-      </w:r>
-      <w:r>
-        <w:rPr>
-          <w:b/>
-          <w:bCs/>
-        </w:rPr>
-        <w:t xml:space="preserve">không có cột “Đơn vị”</w:t>
-      </w:r>
-      <w:r>
-        <w:t xml:space="preserve"> — hệ thống tự gán đúng đơn vị của tài khoản, không cần gõ tên.</w:t>
-      </w:r>
-    </w:p>
-    <w:p>
-      <w:pPr>
-        <w:pStyle w:val="ListParagraph"/>
-        <w:numPr>
-          <w:ilvl w:val="0"/>
-          <w:numId w:val="3"/>
-        </w:numPr>
-        <w:spacing w:after="80"/>
-      </w:pPr>
-      <w:r>
-        <w:rPr>
-          <w:b/>
-          <w:bCs/>
-        </w:rPr>
-        <w:t xml:space="preserve">Không đổi tên hoặc xoá dòng tiêu đề</w:t>
-      </w:r>
-      <w:r>
-        <w:t xml:space="preserve"> của file mẫu; nếu thiếu cột bắt buộc hệ thống sẽ báo và không đọc file.</w:t>
-      </w:r>
-    </w:p>
-    <w:p>
-      <w:pPr>
-        <w:pStyle w:val="ListParagraph"/>
-        <w:numPr>
-          <w:ilvl w:val="0"/>
-          <w:numId w:val="3"/>
-        </w:numPr>
-        <w:spacing w:after="80"/>
-      </w:pPr>
-      <w:r>
-        <w:t xml:space="preserve">Muốn sửa dòng lỗi: sửa lại trong file Excel rồi nhập lên lần nữa — các dòng đã ghi đúng sẽ được ghi đè, không bị nhân đôi.</w:t>
-      </w:r>
-    </w:p>
-    <w:p>
-      <w:pPr>
-        <w:pStyle w:val="ListParagraph"/>
-        <w:numPr>
-          <w:ilvl w:val="0"/>
-          <w:numId w:val="3"/>
-        </w:numPr>
-        <w:spacing w:after="80"/>
-      </w:pPr>
-      <w:r>
-        <w:t xml:space="preserve">Nhập Tiêu thụ không làm mất số Tồn kho của cùng ngày và ngược lại.</w:t>
-      </w:r>
-    </w:p>
-    <w:p>
-      <w:pPr>
-        <w:pStyle w:val="ListParagraph"/>
-        <w:numPr>
-          <w:ilvl w:val="0"/>
-          <w:numId w:val="3"/>
-        </w:numPr>
-        <w:spacing w:after="80"/>
-      </w:pPr>
-      <w:r>
-        <w:t xml:space="preserve">File </w:t>
-      </w:r>
-      <w:r>
-        <w:rPr>
-          <w:b/>
-          <w:bCs/>
-        </w:rPr>
-        <w:t xml:space="preserve">Tiêu thụ</w:t>
-      </w:r>
-      <w:r>
-        <w:t xml:space="preserve"> ghi đè </w:t>
-      </w:r>
-      <w:r>
-        <w:rPr>
-          <w:b/>
-          <w:bCs/>
-        </w:rPr>
-        <w:t xml:space="preserve">toàn bộ</w:t>
-      </w:r>
-      <w:r>
-        <w:t xml:space="preserve"> phần tiêu thụ của ngày đó, </w:t>
-      </w:r>
-      <w:r>
-        <w:rPr>
-          <w:b/>
-          <w:bCs/>
-        </w:rPr>
-        <w:t xml:space="preserve">cả mủ thu mua lẫn mủ khai thác</w:t>
-      </w:r>
-      <w:r>
-        <w:t xml:space="preserve">. Dòng nào đã nhập trên web mà không có trong file sẽ bị xoá — nên chép đủ cả 2 nguồn mủ vào file trước khi nhập lên.</w:t>
-      </w:r>
-    </w:p>
-    <w:p>
-      <w:pPr>
-        <w:pStyle w:val="ListParagraph"/>
-        <w:numPr>
-          <w:ilvl w:val="0"/>
-          <w:numId w:val="3"/>
-        </w:numPr>
-        <w:spacing w:after="80"/>
-      </w:pPr>
-      <w:r>
-        <w:t xml:space="preserve">**Mỗi lần nhập hãy bấm *Tải mẫu Excel* để lấy file mẫu hiện hành**, đừng dùng lại file đang giữ trong máy (khác cột sẽ báo lỗi khi nhập lên).</w:t>
-      </w:r>
-    </w:p>
-    <w:p>
-      <w:pPr>
-        <w:pStyle w:val="ListParagraph"/>
-        <w:numPr>
-          <w:ilvl w:val="0"/>
-          <w:numId w:val="3"/>
-        </w:numPr>
-        <w:spacing w:after="80"/>
-      </w:pPr>
-      <w:r>
-        <w:t xml:space="preserve">Bốn cột </w:t>
-      </w:r>
-      <w:r>
-        <w:rPr>
-          <w:b/>
-          <w:bCs/>
-        </w:rPr>
-        <w:t xml:space="preserve">chọn từ danh sách</w:t>
-      </w:r>
-      <w:r>
-        <w:t xml:space="preserve"> để trống được, nhưng phải điền đúng thì số mới vào đúng chỗ: *Đơn giá mủ chén tính theo* (Độ TSC / Độ DRC) ở mẫu </w:t>
-      </w:r>
-      <w:r>
-        <w:rPr>
-          <w:b/>
-          <w:bCs/>
-        </w:rPr>
-        <w:t xml:space="preserve">Thu mua</w:t>
-      </w:r>
-      <w:r>
-        <w:t xml:space="preserve">; *Nguồn mủ* (Mủ thu mua / Mủ khai thác) và *Giá bán bằng* (VND / USD) ở mẫu </w:t>
-      </w:r>
-      <w:r>
-        <w:rPr>
-          <w:b/>
-          <w:bCs/>
-        </w:rPr>
-        <w:t xml:space="preserve">Tiêu thụ</w:t>
-      </w:r>
-      <w:r>
-        <w:t xml:space="preserve">; *Đơn giá bằng* (VND / USD) ở mẫu </w:t>
-      </w:r>
-      <w:r>
-        <w:rPr>
-          <w:b/>
-          <w:bCs/>
-        </w:rPr>
-        <w:t xml:space="preserve">Tồn kho</w:t>
-      </w:r>
-      <w:r>
-        <w:t xml:space="preserve">. Bỏ trống thì hệ thống hiểu là Độ TSC · Mủ thu mua · VND.</w:t>
-      </w:r>
-    </w:p>
-    <w:p>
-      <w:pPr>
-        <w:pStyle w:val="ListParagraph"/>
-        <w:numPr>
-          <w:ilvl w:val="0"/>
-          <w:numId w:val="3"/>
-        </w:numPr>
-        <w:spacing w:after="80"/>
-      </w:pPr>
-      <w:r>
-        <w:t xml:space="preserve">Mẫu </w:t>
-      </w:r>
-      <w:r>
-        <w:rPr>
-          <w:b/>
-          <w:bCs/>
-        </w:rPr>
-        <w:t xml:space="preserve">Thu mua</w:t>
-      </w:r>
-      <w:r>
-        <w:t xml:space="preserve"> gồm: *SL thu mua mủ nước* · *SL thu mua mủ chén* · *Đơn giá mủ nước* · *Đơn giá mủ chén* · *Đơn giá mủ chén tính theo*, và phần thu mua thành phẩm *Chủng loại thành phẩm* · *SL thu mua thành phẩm* · *Đơn giá thành phẩm* · *Đơn giá thành phẩm bằng*.</w:t>
-      </w:r>
-    </w:p>
-    <w:p>
-      <w:pPr>
-        <w:pStyle w:val="ListParagraph"/>
-        <w:numPr>
-          <w:ilvl w:val="0"/>
-          <w:numId w:val="3"/>
-        </w:numPr>
-        <w:spacing w:after="80"/>
-      </w:pPr>
-      <w:r>
-        <w:t xml:space="preserve">Mẫu </w:t>
-      </w:r>
-      <w:r>
-        <w:rPr>
-          <w:b/>
-          <w:bCs/>
-        </w:rPr>
-        <w:t xml:space="preserve">Tồn kho</w:t>
-      </w:r>
-      <w:r>
-        <w:t xml:space="preserve">: cột *Nhóm* có 3 lựa chọn — Chế biến chưa nhập kho · Đã nhập kho · </w:t>
-      </w:r>
-      <w:r>
-        <w:rPr>
-          <w:b/>
-          <w:bCs/>
-        </w:rPr>
-        <w:t xml:space="preserve">Đã ký HĐ</w:t>
-      </w:r>
-      <w:r>
-        <w:t xml:space="preserve">. Số lượng tính bằng </w:t>
-      </w:r>
-      <w:r>
-        <w:rPr>
-          <w:b/>
-          <w:bCs/>
-        </w:rPr>
-        <w:t xml:space="preserve">tấn</w:t>
-      </w:r>
-      <w:r>
-        <w:t xml:space="preserve">.</w:t>
-      </w:r>
-    </w:p>
-    <w:p>
-      <w:pPr>
-        <w:pStyle w:val="ListParagraph"/>
-        <w:numPr>
-          <w:ilvl w:val="0"/>
-          <w:numId w:val="3"/>
-        </w:numPr>
-        <w:spacing w:after="80"/>
-      </w:pPr>
-      <w:r>
-        <w:t xml:space="preserve">Mẫu </w:t>
-      </w:r>
-      <w:r>
-        <w:rPr>
-          <w:b/>
-          <w:bCs/>
-        </w:rPr>
-        <w:t xml:space="preserve">Tiêu thụ</w:t>
-      </w:r>
-      <w:r>
-        <w:t xml:space="preserve"> có cột *Nguồn mủ* (chọn *Mủ thu mua* hoặc *Mủ khai thác* — để trống thì hiểu là </w:t>
-      </w:r>
-      <w:r>
-        <w:rPr>
-          <w:b/>
-          <w:bCs/>
-        </w:rPr>
-        <w:t xml:space="preserve">mủ thu mua</w:t>
-      </w:r>
-      <w:r>
-        <w:t xml:space="preserve">), cùng 2 cột ngày: *Ngày xuất kho* và *Ngày xuất hoá đơn*. Riêng </w:t>
-      </w:r>
-      <w:r>
-        <w:rPr>
-          <w:b/>
-          <w:bCs/>
-        </w:rPr>
-        <w:t xml:space="preserve">3 file đính kèm — bộ Hợp đồng · phiếu xuất kho · hoá đơn — phải tải lên trên web</w:t>
-      </w:r>
-      <w:r>
-        <w:t xml:space="preserve">, file Excel không mang theo file đính kèm được.</w:t>
+        <w:t xml:space="preserve">Đơn vị tính ghi ngay cạnh tên ô (tấn · triệu đ/tấn · đồng/độ TSC…) — nhập theo đúng đơn vị đó, không nhân chia thêm.</w:t>
       </w:r>
     </w:p>
     <w:sectPr>
@@ -4149,6 +3878,18 @@
     <w:multiLevelType w:val="hybridMultilevel"/>
     <w:lvl w:ilvl="0" w15:tentative="1">
       <w:start w:val="1"/>
+      <w:numFmt w:val="decimal"/>
+      <w:lvlText w:val="%1."/>
+      <w:lvlJc w:val="left"/>
+      <w:pPr>
+        <w:ind w:left="620" w:hanging="360"/>
+      </w:pPr>
+    </w:lvl>
+  </w:abstractNum>
+  <w:abstractNum w:abstractNumId="12" w15:restartNumberingAfterBreak="0">
+    <w:multiLevelType w:val="hybridMultilevel"/>
+    <w:lvl w:ilvl="0" w15:tentative="1">
+      <w:start w:val="1"/>
       <w:numFmt w:val="bullet"/>
       <w:lvlText w:val="•"/>
       <w:lvlJc w:val="left"/>
@@ -4170,7 +3911,7 @@
     </w:lvlOverride>
   </w:num>
   <w:num w:numId="3">
-    <w:abstractNumId w:val="11"/>
+    <w:abstractNumId w:val="12"/>
     <w:lvlOverride w:ilvl="0">
       <w:startOverride w:val="1"/>
     </w:lvlOverride>
@@ -4219,6 +3960,12 @@
   </w:num>
   <w:num w:numId="11">
     <w:abstractNumId w:val="10"/>
+    <w:lvlOverride w:ilvl="0">
+      <w:startOverride w:val="1"/>
+    </w:lvlOverride>
+  </w:num>
+  <w:num w:numId="12">
+    <w:abstractNumId w:val="11"/>
     <w:lvlOverride w:ilvl="0">
       <w:startOverride w:val="1"/>
     </w:lvlOverride>

</xml_diff>

<commit_message>
refactor(unit-daily): rename the contract screen to "Thống kê hợp đồng"
Rename the menu entry, page title and route slug, and follow through in
the member guide and its Word build. The screen has not shipped yet, so
no saved link depends on the old path.
</commit_message>
<xml_diff>
--- a/docs/huong-dan/nhap-lieu-don-vi-thanh-vien/Huong-dan-nhap-lieu-don-vi-thanh-vien.docx
+++ b/docs/huong-dan/nhap-lieu-don-vi-thanh-vien/Huong-dan-nhap-lieu-don-vi-thanh-vien.docx
@@ -16,7 +16,7 @@
         <w:spacing w:after="200"/>
       </w:pPr>
       <w:r>
-        <w:t xml:space="preserve">Tài liệu dành cho cán bộ đơn vị thành viên VRG nhập số liệu hằng ngày trên Hệ thống Dự báo &amp; Quản trị Giá Cao su. Tài khoản đơn vị chỉ thấy và chỉ nhập được số liệu của chính đơn vị mình. Có 5 mục cần nhập: Báo cáo thu mua, Báo cáo tiêu thụ, Báo cáo tồn kho và Nhu cầu thị trường (nhập theo NGÀY), cùng Kế hoạch năm (nhập 1 lần cho cả năm); ngoài ra có mục Hợp đồng tồn kho chỉ để tra cứu.</w:t>
+        <w:t xml:space="preserve">Tài liệu dành cho cán bộ đơn vị thành viên VRG nhập số liệu hằng ngày trên Hệ thống Dự báo &amp; Quản trị Giá Cao su. Tài khoản đơn vị chỉ thấy và chỉ nhập được số liệu của chính đơn vị mình. Có 5 mục cần nhập: Báo cáo thu mua, Báo cáo tiêu thụ, Báo cáo tồn kho và Nhu cầu thị trường (nhập theo NGÀY), cùng Kế hoạch năm (nhập 1 lần cho cả năm); ngoài ra có mục Thống kê hợp đồng chỉ để tra cứu.</w:t>
       </w:r>
     </w:p>
     <w:p>
@@ -311,7 +311,7 @@
           <w:b/>
           <w:bCs/>
         </w:rPr>
-        <w:t xml:space="preserve">Hợp đồng tồn kho</w:t>
+        <w:t xml:space="preserve">Thống kê hợp đồng</w:t>
       </w:r>
       <w:r>
         <w:t xml:space="preserve"> — </w:t>
@@ -2565,7 +2565,7 @@
         <w:pageBreakBefore/>
       </w:pPr>
       <w:r>
-        <w:t xml:space="preserve">7. Xem Hợp đồng tồn kho</w:t>
+        <w:t xml:space="preserve">7. Thống kê hợp đồng</w:t>
       </w:r>
     </w:p>
     <w:p>
@@ -2580,7 +2580,7 @@
         <w:t xml:space="preserve">Vị trí: </w:t>
       </w:r>
       <w:r>
-        <w:t xml:space="preserve">Menu → Hợp đồng tồn kho</w:t>
+        <w:t xml:space="preserve">Menu → Thống kê hợp đồng</w:t>
       </w:r>
     </w:p>
     <w:p>

</xml_diff>

<commit_message>
docs(huong-dan): refresh member guide screenshots for the latest UI
Re-shoot the six form screenshots to match the current app: the menu
now carries "Thống kê hợp đồng", the excel import buttons are gone, and
every report block title shows its entry-mode hint. List the six menu
items in menu order under the first figure.
</commit_message>
<xml_diff>
--- a/docs/huong-dan/nhap-lieu-don-vi-thanh-vien/Huong-dan-nhap-lieu-don-vi-thanh-vien.docx
+++ b/docs/huong-dan/nhap-lieu-don-vi-thanh-vien/Huong-dan-nhap-lieu-don-vi-thanh-vien.docx
@@ -117,7 +117,7 @@
         <w:spacing w:after="100"/>
       </w:pPr>
       <w:r>
-        <w:t xml:space="preserve">Năm mục cần nhập:</w:t>
+        <w:t xml:space="preserve">Sáu mục trên menu (5 mục để nhập số liệu, 1 mục để tra cứu):</w:t>
       </w:r>
     </w:p>
     <w:p>
@@ -236,6 +236,36 @@
           <w:b/>
           <w:bCs/>
         </w:rPr>
+        <w:t xml:space="preserve">Thống kê hợp đồng</w:t>
+      </w:r>
+      <w:r>
+        <w:t xml:space="preserve"> — tra cứu lịch sử hợp đồng đã ký, </w:t>
+      </w:r>
+      <w:r>
+        <w:rPr>
+          <w:b/>
+          <w:bCs/>
+        </w:rPr>
+        <w:t xml:space="preserve">chỉ để xem, không nhập</w:t>
+      </w:r>
+      <w:r>
+        <w:t xml:space="preserve"> (xem mục 7).</w:t>
+      </w:r>
+    </w:p>
+    <w:p>
+      <w:pPr>
+        <w:pStyle w:val="ListParagraph"/>
+        <w:numPr>
+          <w:ilvl w:val="0"/>
+          <w:numId w:val="2"/>
+        </w:numPr>
+        <w:spacing w:after="100"/>
+      </w:pPr>
+      <w:r>
+        <w:rPr>
+          <w:b/>
+          <w:bCs/>
+        </w:rPr>
         <w:t xml:space="preserve">Nhu cầu thị trường</w:t>
       </w:r>
       <w:r>
@@ -292,39 +322,6 @@
           <w:bCs/>
         </w:rPr>
         <w:t xml:space="preserve">Lưu ý:</w:t>
-      </w:r>
-    </w:p>
-    <w:p>
-      <w:pPr>
-        <w:pStyle w:val="ListParagraph"/>
-        <w:numPr>
-          <w:ilvl w:val="0"/>
-          <w:numId w:val="3"/>
-        </w:numPr>
-        <w:spacing w:after="80"/>
-      </w:pPr>
-      <w:r>
-        <w:t xml:space="preserve">Ngoài 5 mục trên, menu còn mục </w:t>
-      </w:r>
-      <w:r>
-        <w:rPr>
-          <w:b/>
-          <w:bCs/>
-        </w:rPr>
-        <w:t xml:space="preserve">Thống kê hợp đồng</w:t>
-      </w:r>
-      <w:r>
-        <w:t xml:space="preserve"> — </w:t>
-      </w:r>
-      <w:r>
-        <w:rPr>
-          <w:b/>
-          <w:bCs/>
-        </w:rPr>
-        <w:t xml:space="preserve">chỉ để tra cứu</w:t>
-      </w:r>
-      <w:r>
-        <w:t xml:space="preserve">, không nhập số liệu (xem mục 7).</w:t>
       </w:r>
     </w:p>
     <w:p>

</xml_diff>

<commit_message>
docs(huong-dan): refresh the guide for the reworked contract screens
Giao diện hợp đồng đổi nhiều sau khi viết tài liệu: modal rộng hơn, dòng chi tiết bỏ dạng bảng
sang khối tự xuống hàng, ô quy khô và tỷ giá chỉ hiện khi áp dụng. Chụp lại toàn bộ 12 ảnh và
sửa phần chữ cho khớp.

Bổ sung luật cửa sổ sửa cho lần giao: phụ lục quá số ngày cho phép chuyển sang "(chỉ xem)", hợp
đồng mẹ không bị khoá — kèm một dòng trong bảng "Những lỗi hay gặp".

Sửa 2 lỗi của script chụp ảnh:
- Form phụ lục mở CHỒNG lên modal chi tiết nên có 2 `.ant-modal`; script bắt nhầm modal dưới,
  không thấy ô nào để chú thích. Nay lấy modal trên cùng.
- Tách cách dò phần tử: ô nhập tìm theo `.form-field`, tiêu đề khối tìm theo thẻ thường. Dùng
  chung một cách làm khung chú thích ôm nhầm cả khối bên dưới.

Co-Authored-By: Claude Opus 5 <noreply@anthropic.com>
</commit_message>
<xml_diff>
--- a/docs/huong-dan/nhap-lieu-don-vi-thanh-vien/Huong-dan-nhap-lieu-don-vi-thanh-vien.docx
+++ b/docs/huong-dan/nhap-lieu-don-vi-thanh-vien/Huong-dan-nhap-lieu-don-vi-thanh-vien.docx
@@ -1848,7 +1848,27 @@
         <w:t xml:space="preserve">Chi tiết hợp đồng</w:t>
       </w:r>
       <w:r>
-        <w:t xml:space="preserve"> — mỗi chủng loại một dòng: SL · Quy khô · Đơn giá · Loại tiền · Tỷ giá · Chi phí.</w:t>
+        <w:t xml:space="preserve"> — mỗi chủng loại một dòng. Ô </w:t>
+      </w:r>
+      <w:r>
+        <w:rPr>
+          <w:b/>
+          <w:bCs/>
+        </w:rPr>
+        <w:t xml:space="preserve">Quy khô</w:t>
+      </w:r>
+      <w:r>
+        <w:t xml:space="preserve"> chỉ hiện với latex và mủ nguyên liệu; ô </w:t>
+      </w:r>
+      <w:r>
+        <w:rPr>
+          <w:b/>
+          <w:bCs/>
+        </w:rPr>
+        <w:t xml:space="preserve">Tỷ giá</w:t>
+      </w:r>
+      <w:r>
+        <w:t xml:space="preserve"> chỉ hiện khi dòng bán bằng ngoại tệ.</w:t>
       </w:r>
     </w:p>
     <w:p>
@@ -2248,7 +2268,7 @@
         <w:t xml:space="preserve">Chi tiết lần giao</w:t>
       </w:r>
       <w:r>
-        <w:t xml:space="preserve"> — chủng loại, sản lượng, đơn giá thực tế của lần giao này.</w:t>
+        <w:t xml:space="preserve"> — chủng loại, sản lượng, đơn giá thực tế của lần giao này. Ô Quy khô và Tỷ giá chỉ hiện khi áp dụng, giống phiếu hợp đồng.</w:t>
       </w:r>
     </w:p>
     <w:p>
@@ -2357,6 +2377,49 @@
       </w:r>
       <w:r>
         <w:t xml:space="preserve"> cộng vào báo cáo.</w:t>
+      </w:r>
+    </w:p>
+    <w:p>
+      <w:pPr>
+        <w:pStyle w:val="ListParagraph"/>
+        <w:numPr>
+          <w:ilvl w:val="0"/>
+          <w:numId w:val="3"/>
+        </w:numPr>
+        <w:spacing w:after="80"/>
+      </w:pPr>
+      <w:r>
+        <w:t xml:space="preserve">Lần giao đã ghi quá </w:t>
+      </w:r>
+      <w:r>
+        <w:rPr>
+          <w:b/>
+          <w:bCs/>
+        </w:rPr>
+        <w:t xml:space="preserve">số ngày cho phép sửa</w:t>
+      </w:r>
+      <w:r>
+        <w:t xml:space="preserve"> sẽ chuyển sang </w:t>
+      </w:r>
+      <w:r>
+        <w:rPr>
+          <w:b/>
+          <w:bCs/>
+        </w:rPr>
+        <w:t xml:space="preserve">chỉ xem</w:t>
+      </w:r>
+      <w:r>
+        <w:t xml:space="preserve"> (dòng hiện “(chỉ xem)” thay cho nút Sửa/Xoá) — kỳ báo cáo đã chốt thì không sửa lùi được nữa. Hợp đồng mẹ </w:t>
+      </w:r>
+      <w:r>
+        <w:rPr>
+          <w:b/>
+          <w:bCs/>
+        </w:rPr>
+        <w:t xml:space="preserve">không</w:t>
+      </w:r>
+      <w:r>
+        <w:t xml:space="preserve"> bị khoá, vẫn thêm phụ lục mới bình thường.</w:t>
       </w:r>
     </w:p>
     <w:p>
@@ -3275,6 +3338,26 @@
       </w:r>
       <w:r>
         <w:t xml:space="preserve"> → Ngoài cửa sổ sửa cho phép. Báo Ban TTKD nếu cần mở lại.</w:t>
+      </w:r>
+    </w:p>
+    <w:p>
+      <w:pPr>
+        <w:pStyle w:val="ListParagraph"/>
+        <w:numPr>
+          <w:ilvl w:val="0"/>
+          <w:numId w:val="3"/>
+        </w:numPr>
+        <w:spacing w:after="80"/>
+      </w:pPr>
+      <w:r>
+        <w:rPr>
+          <w:b/>
+          <w:bCs/>
+        </w:rPr>
+        <w:t xml:space="preserve">Phụ lục hiện “(chỉ xem)”, không có nút Sửa</w:t>
+      </w:r>
+      <w:r>
+        <w:t xml:space="preserve"> → Lần giao đã quá số ngày cho phép sửa. Báo Ban TTKD nếu thật sự cần chỉnh.</w:t>
       </w:r>
     </w:p>
     <w:sectPr>

</xml_diff>

<commit_message>
docs(huong-dan): add the contract detail screen, fix the empty legacy screenshot
Rà lại từng ảnh sau khi chụp mới, phát hiện 2 chỗ chưa đúng:

- Ảnh màn "Hợp đồng cũ" chụp ra bảng TRỐNG vì đơn vị mẫu không có bản ghi nào ở bảng cũ. Script
  nay seed 2 hợp đồng ở `unit_stock_contract` (1 đã giao, 1 chưa) rồi xoá sau khi chụp.
- THIẾU hẳn ảnh màn chi tiết hợp đồng, trong khi mục hướng dẫn bảo người dùng "bấm Xem" rồi mới
  thêm phụ lục — và đây đúng là màn vừa chia tab. Thêm mục 9 với ảnh chú thích hàng số liệu, 2 tab
  và nút Thêm phụ lục; các mục sau dồn số, hình đánh lại liền mạch 1→13.

Co-Authored-By: Claude Opus 5 <noreply@anthropic.com>
</commit_message>
<xml_diff>
--- a/docs/huong-dan/nhap-lieu-don-vi-thanh-vien/Huong-dan-nhap-lieu-don-vi-thanh-vien.docx
+++ b/docs/huong-dan/nhap-lieu-don-vi-thanh-vien/Huong-dan-nhap-lieu-don-vi-thanh-vien.docx
@@ -1508,7 +1508,7 @@
         <w:t xml:space="preserve">Xem</w:t>
       </w:r>
       <w:r>
-        <w:t xml:space="preserve"> để mở chi tiết và thêm phụ lục.</w:t>
+        <w:t xml:space="preserve"> để mở màn chi tiết (mục 9).</w:t>
       </w:r>
     </w:p>
     <w:p>
@@ -2041,7 +2041,7 @@
         <w:pageBreakBefore/>
       </w:pPr>
       <w:r>
-        <w:t xml:space="preserve">9. Thêm phụ lục — mỗi phụ lục là một lần giao</w:t>
+        <w:t xml:space="preserve">9. Màn chi tiết hợp đồng</w:t>
       </w:r>
     </w:p>
     <w:p>
@@ -2056,7 +2056,7 @@
         <w:t xml:space="preserve">Vị trí: </w:t>
       </w:r>
       <w:r>
-        <w:t xml:space="preserve">Hợp đồng &amp; phụ lục → </w:t>
+        <w:t xml:space="preserve">Quản lý hợp đồng → Hợp đồng &amp; phụ lục → bấm </w:t>
       </w:r>
       <w:r>
         <w:rPr>
@@ -2066,7 +2066,7 @@
         <w:t xml:space="preserve">Xem</w:t>
       </w:r>
       <w:r>
-        <w:t xml:space="preserve"> một hợp đồng giao nhiều lần → Thêm phụ lục</w:t>
+        <w:t xml:space="preserve"> ở dòng hợp đồng</w:t>
       </w:r>
     </w:p>
     <w:p>
@@ -2074,7 +2074,7 @@
         <w:spacing w:after="140"/>
       </w:pPr>
       <w:r>
-        <w:t xml:space="preserve">Mỗi phụ lục = một đợt giao + một lần thanh toán. Đây là cách ghi nhận tiêu thụ của cơ chế mới.</w:t>
+        <w:t xml:space="preserve">Nơi theo dõi tiến độ một hợp đồng và nhập các lần giao của nó.</w:t>
       </w:r>
     </w:p>
     <w:p>
@@ -2087,7 +2087,7 @@
           <wp:inline distT="0" distB="0" distL="0" distR="0">
             <wp:extent cx="6191250" cy="3381375"/>
             <wp:effectExtent t="0" r="0" b="0" l="0"/>
-            <wp:docPr id="1" name="img" descr="Ảnh hướng dẫn có đánh số bước" title="img/08-phu-luc-form.png"/>
+            <wp:docPr id="1" name="img" descr="Ảnh hướng dẫn có đánh số bước" title="img/08-hop-dong-chi-tiet.png"/>
             <wp:cNvGraphicFramePr>
               <a:graphicFrameLocks xmlns:a="http://schemas.openxmlformats.org/drawingml/2006/main" noChangeAspect="1"/>
             </wp:cNvGraphicFramePr>
@@ -2136,7 +2136,7 @@
           <w:sz w:val="17"/>
           <w:szCs w:val="17"/>
         </w:rPr>
-        <w:t xml:space="preserve">Hình 8. Phiếu thêm phụ lục</w:t>
+        <w:t xml:space="preserve">Hình 8. Màn chi tiết hợp đồng</w:t>
       </w:r>
     </w:p>
     <w:p>
@@ -2165,10 +2165,10 @@
           <w:b/>
           <w:bCs/>
         </w:rPr>
-        <w:t xml:space="preserve">Số phụ lục</w:t>
-      </w:r>
-      <w:r>
-        <w:t xml:space="preserve"> — bắt buộc.</w:t>
+        <w:t xml:space="preserve">Hàng số liệu</w:t>
+      </w:r>
+      <w:r>
+        <w:t xml:space="preserve"> — khách hàng, loại hợp đồng, sản lượng cam kết, đã giao, đang chờ giao, chưa mở đợt. Luôn hiện dù đang ở tab nào.</w:t>
       </w:r>
     </w:p>
     <w:p>
@@ -2185,10 +2185,10 @@
           <w:b/>
           <w:bCs/>
         </w:rPr>
-        <w:t xml:space="preserve">Ngày bắt đầu (mở đợt)</w:t>
-      </w:r>
-      <w:r>
-        <w:t xml:space="preserve"> — bắt buộc; từ ngày này hàng của đợt nằm ở “đã ký HĐ chưa giao”.</w:t>
+        <w:t xml:space="preserve">Tab Thông tin hợp đồng</w:t>
+      </w:r>
+      <w:r>
+        <w:t xml:space="preserve"> — sửa hợp đồng, file scan, ghi chú và các dòng chi tiết đã ký.</w:t>
       </w:r>
     </w:p>
     <w:p>
@@ -2205,30 +2205,10 @@
           <w:b/>
           <w:bCs/>
         </w:rPr>
-        <w:t xml:space="preserve">Ngày giao</w:t>
-      </w:r>
-      <w:r>
-        <w:t xml:space="preserve"> — để trống nghĩa là </w:t>
-      </w:r>
-      <w:r>
-        <w:rPr>
-          <w:b/>
-          <w:bCs/>
-        </w:rPr>
-        <w:t xml:space="preserve">đang chờ giao</w:t>
-      </w:r>
-      <w:r>
-        <w:t xml:space="preserve">; điền vào là đợt đã giao xong và </w:t>
-      </w:r>
-      <w:r>
-        <w:rPr>
-          <w:b/>
-          <w:bCs/>
-        </w:rPr>
-        <w:t xml:space="preserve">tính ngay vào tiêu thụ của ngày đó</w:t>
-      </w:r>
-      <w:r>
-        <w:t xml:space="preserve">.</w:t>
+        <w:t xml:space="preserve">Tab Phụ lục</w:t>
+      </w:r>
+      <w:r>
+        <w:t xml:space="preserve"> — danh sách các lần giao; hợp đồng giao nhiều lần mở thẳng vào tab này.</w:t>
       </w:r>
     </w:p>
     <w:p>
@@ -2245,50 +2225,10 @@
           <w:b/>
           <w:bCs/>
         </w:rPr>
-        <w:t xml:space="preserve">Hình thức tiêu thụ</w:t>
-      </w:r>
-      <w:r>
-        <w:t xml:space="preserve"> — “Xuất khẩu / UTXK” · “Tiêu thụ trong nước” · “Tiêu thụ nội bộ”. Bắt buộc khi đã giao.</w:t>
-      </w:r>
-    </w:p>
-    <w:p>
-      <w:pPr>
-        <w:pStyle w:val="ListParagraph"/>
-        <w:numPr>
-          <w:ilvl w:val="0"/>
-          <w:numId w:val="11"/>
-        </w:numPr>
-        <w:spacing w:after="100"/>
-      </w:pPr>
-      <w:r>
-        <w:rPr>
-          <w:b/>
-          <w:bCs/>
-        </w:rPr>
-        <w:t xml:space="preserve">Chi tiết lần giao</w:t>
-      </w:r>
-      <w:r>
-        <w:t xml:space="preserve"> — chủng loại, sản lượng, đơn giá thực tế của lần giao này. Ô Quy khô và Tỷ giá chỉ hiện khi áp dụng, giống phiếu hợp đồng.</w:t>
-      </w:r>
-    </w:p>
-    <w:p>
-      <w:pPr>
-        <w:pStyle w:val="ListParagraph"/>
-        <w:numPr>
-          <w:ilvl w:val="0"/>
-          <w:numId w:val="11"/>
-        </w:numPr>
-        <w:spacing w:after="100"/>
-      </w:pPr>
-      <w:r>
-        <w:rPr>
-          <w:b/>
-          <w:bCs/>
-        </w:rPr>
-        <w:t xml:space="preserve">Thanh toán</w:t>
-      </w:r>
-      <w:r>
-        <w:t xml:space="preserve"> — ngày thanh toán, sản lượng và chi phí của lần thanh toán, kèm chứng từ/hoá đơn.</w:t>
+        <w:t xml:space="preserve">Thêm phụ lục</w:t>
+      </w:r>
+      <w:r>
+        <w:t xml:space="preserve"> — ghi một lần giao mới (xem mục 10).</w:t>
       </w:r>
     </w:p>
     <w:p>
@@ -2313,17 +2253,17 @@
         <w:spacing w:after="80"/>
       </w:pPr>
       <w:r>
-        <w:t xml:space="preserve">Tổng sản lượng các phụ lục </w:t>
-      </w:r>
-      <w:r>
-        <w:rPr>
-          <w:b/>
-          <w:bCs/>
-        </w:rPr>
-        <w:t xml:space="preserve">không được vượt</w:t>
-      </w:r>
-      <w:r>
-        <w:t xml:space="preserve"> cam kết của hợp đồng mẹ; phiếu hiện sẵn dòng “Còn lại của hợp đồng mẹ”.</w:t>
+        <w:t xml:space="preserve">Hợp đồng </w:t>
+      </w:r>
+      <w:r>
+        <w:rPr>
+          <w:b/>
+          <w:bCs/>
+        </w:rPr>
+        <w:t xml:space="preserve">giao 1 lần</w:t>
+      </w:r>
+      <w:r>
+        <w:t xml:space="preserve"> không có tab Phụ lục: chính hợp đồng là một lần giao.</w:t>
       </w:r>
     </w:p>
     <w:p>
@@ -2336,90 +2276,7 @@
         <w:spacing w:after="80"/>
       </w:pPr>
       <w:r>
-        <w:rPr>
-          <w:b/>
-          <w:bCs/>
-        </w:rPr>
-        <w:t xml:space="preserve">Tiêu thụ nội bộ</w:t>
-      </w:r>
-      <w:r>
-        <w:t xml:space="preserve"> chỉ hiện khi đơn vị thuộc một nhóm công ty mẹ–con, và chỉ chọn được đơn vị trong cùng nhóm.</w:t>
-      </w:r>
-    </w:p>
-    <w:p>
-      <w:pPr>
-        <w:pStyle w:val="ListParagraph"/>
-        <w:numPr>
-          <w:ilvl w:val="0"/>
-          <w:numId w:val="3"/>
-        </w:numPr>
-        <w:spacing w:after="80"/>
-      </w:pPr>
-      <w:r>
-        <w:t xml:space="preserve">Chi phí đưa vào báo cáo là ô </w:t>
-      </w:r>
-      <w:r>
-        <w:rPr>
-          <w:b/>
-          <w:bCs/>
-        </w:rPr>
-        <w:t xml:space="preserve">Chi phí</w:t>
-      </w:r>
-      <w:r>
-        <w:t xml:space="preserve"> trên từng dòng chi tiết; ô chi phí ở khối Thanh toán </w:t>
-      </w:r>
-      <w:r>
-        <w:rPr>
-          <w:b/>
-          <w:bCs/>
-        </w:rPr>
-        <w:t xml:space="preserve">không</w:t>
-      </w:r>
-      <w:r>
-        <w:t xml:space="preserve"> cộng vào báo cáo.</w:t>
-      </w:r>
-    </w:p>
-    <w:p>
-      <w:pPr>
-        <w:pStyle w:val="ListParagraph"/>
-        <w:numPr>
-          <w:ilvl w:val="0"/>
-          <w:numId w:val="3"/>
-        </w:numPr>
-        <w:spacing w:after="80"/>
-      </w:pPr>
-      <w:r>
-        <w:t xml:space="preserve">Lần giao đã ghi quá </w:t>
-      </w:r>
-      <w:r>
-        <w:rPr>
-          <w:b/>
-          <w:bCs/>
-        </w:rPr>
-        <w:t xml:space="preserve">số ngày cho phép sửa</w:t>
-      </w:r>
-      <w:r>
-        <w:t xml:space="preserve"> sẽ chuyển sang </w:t>
-      </w:r>
-      <w:r>
-        <w:rPr>
-          <w:b/>
-          <w:bCs/>
-        </w:rPr>
-        <w:t xml:space="preserve">chỉ xem</w:t>
-      </w:r>
-      <w:r>
-        <w:t xml:space="preserve"> (dòng hiện “(chỉ xem)” thay cho nút Sửa/Xoá) — kỳ báo cáo đã chốt thì không sửa lùi được nữa. Hợp đồng mẹ </w:t>
-      </w:r>
-      <w:r>
-        <w:rPr>
-          <w:b/>
-          <w:bCs/>
-        </w:rPr>
-        <w:t xml:space="preserve">không</w:t>
-      </w:r>
-      <w:r>
-        <w:t xml:space="preserve"> bị khoá, vẫn thêm phụ lục mới bình thường.</w:t>
+        <w:t xml:space="preserve">Nút Thêm phụ lục mờ đi khi đã giao đủ sản lượng cam kết.</w:t>
       </w:r>
     </w:p>
     <w:p>
@@ -2428,7 +2285,7 @@
         <w:pageBreakBefore/>
       </w:pPr>
       <w:r>
-        <w:t xml:space="preserve">10. Báo cáo tiêu thụ</w:t>
+        <w:t xml:space="preserve">10. Thêm phụ lục — mỗi phụ lục là một lần giao</w:t>
       </w:r>
     </w:p>
     <w:p>
@@ -2443,7 +2300,7 @@
         <w:t xml:space="preserve">Vị trí: </w:t>
       </w:r>
       <w:r>
-        <w:t xml:space="preserve">Báo cáo → Tiêu thụ</w:t>
+        <w:t xml:space="preserve">Màn chi tiết hợp đồng (mục 9) → tab Phụ lục → Thêm phụ lục</w:t>
       </w:r>
     </w:p>
     <w:p>
@@ -2451,7 +2308,7 @@
         <w:spacing w:after="140"/>
       </w:pPr>
       <w:r>
-        <w:t xml:space="preserve">Bảng chỉ để xem — số do hệ thống tổng hợp từ các lần giao, đơn vị không nhập tay.</w:t>
+        <w:t xml:space="preserve">Mỗi phụ lục = một đợt giao + một lần thanh toán. Đây là cách ghi nhận tiêu thụ của cơ chế mới.</w:t>
       </w:r>
     </w:p>
     <w:p>
@@ -2464,7 +2321,7 @@
           <wp:inline distT="0" distB="0" distL="0" distR="0">
             <wp:extent cx="6191250" cy="3381375"/>
             <wp:effectExtent t="0" r="0" b="0" l="0"/>
-            <wp:docPr id="1" name="img" descr="Ảnh hướng dẫn có đánh số bước" title="img/09-bao-cao-tieu-thu.png"/>
+            <wp:docPr id="1" name="img" descr="Ảnh hướng dẫn có đánh số bước" title="img/09-phu-luc-form.png"/>
             <wp:cNvGraphicFramePr>
               <a:graphicFrameLocks xmlns:a="http://schemas.openxmlformats.org/drawingml/2006/main" noChangeAspect="1"/>
             </wp:cNvGraphicFramePr>
@@ -2513,7 +2370,7 @@
           <w:sz w:val="17"/>
           <w:szCs w:val="17"/>
         </w:rPr>
-        <w:t xml:space="preserve">Hình 9. Báo cáo tiêu thụ theo kỳ</w:t>
+        <w:t xml:space="preserve">Hình 9. Phiếu thêm phụ lục</w:t>
       </w:r>
     </w:p>
     <w:p>
@@ -2542,17 +2399,67 @@
           <w:b/>
           <w:bCs/>
         </w:rPr>
-        <w:t xml:space="preserve">Bảng tổng hợp</w:t>
-      </w:r>
-      <w:r>
-        <w:t xml:space="preserve"> — Lần giao · SL · Quy khô · Xuất khẩu · Trong nước · Nội bộ · Doanh thu · Chi phí · </w:t>
-      </w:r>
-      <w:r>
-        <w:rPr>
-          <w:b/>
-          <w:bCs/>
-        </w:rPr>
-        <w:t xml:space="preserve">Chưa giao</w:t>
+        <w:t xml:space="preserve">Số phụ lục</w:t>
+      </w:r>
+      <w:r>
+        <w:t xml:space="preserve"> — bắt buộc.</w:t>
+      </w:r>
+    </w:p>
+    <w:p>
+      <w:pPr>
+        <w:pStyle w:val="ListParagraph"/>
+        <w:numPr>
+          <w:ilvl w:val="0"/>
+          <w:numId w:val="12"/>
+        </w:numPr>
+        <w:spacing w:after="100"/>
+      </w:pPr>
+      <w:r>
+        <w:rPr>
+          <w:b/>
+          <w:bCs/>
+        </w:rPr>
+        <w:t xml:space="preserve">Ngày bắt đầu (mở đợt)</w:t>
+      </w:r>
+      <w:r>
+        <w:t xml:space="preserve"> — bắt buộc; từ ngày này hàng của đợt nằm ở “đã ký HĐ chưa giao”.</w:t>
+      </w:r>
+    </w:p>
+    <w:p>
+      <w:pPr>
+        <w:pStyle w:val="ListParagraph"/>
+        <w:numPr>
+          <w:ilvl w:val="0"/>
+          <w:numId w:val="12"/>
+        </w:numPr>
+        <w:spacing w:after="100"/>
+      </w:pPr>
+      <w:r>
+        <w:rPr>
+          <w:b/>
+          <w:bCs/>
+        </w:rPr>
+        <w:t xml:space="preserve">Ngày giao</w:t>
+      </w:r>
+      <w:r>
+        <w:t xml:space="preserve"> — để trống nghĩa là </w:t>
+      </w:r>
+      <w:r>
+        <w:rPr>
+          <w:b/>
+          <w:bCs/>
+        </w:rPr>
+        <w:t xml:space="preserve">đang chờ giao</w:t>
+      </w:r>
+      <w:r>
+        <w:t xml:space="preserve">; điền vào là đợt đã giao xong và </w:t>
+      </w:r>
+      <w:r>
+        <w:rPr>
+          <w:b/>
+          <w:bCs/>
+        </w:rPr>
+        <w:t xml:space="preserve">tính ngay vào tiêu thụ của ngày đó</w:t>
       </w:r>
       <w:r>
         <w:t xml:space="preserve">.</w:t>
@@ -2560,6 +2467,66 @@
     </w:p>
     <w:p>
       <w:pPr>
+        <w:pStyle w:val="ListParagraph"/>
+        <w:numPr>
+          <w:ilvl w:val="0"/>
+          <w:numId w:val="12"/>
+        </w:numPr>
+        <w:spacing w:after="100"/>
+      </w:pPr>
+      <w:r>
+        <w:rPr>
+          <w:b/>
+          <w:bCs/>
+        </w:rPr>
+        <w:t xml:space="preserve">Hình thức tiêu thụ</w:t>
+      </w:r>
+      <w:r>
+        <w:t xml:space="preserve"> — “Xuất khẩu / UTXK” · “Tiêu thụ trong nước” · “Tiêu thụ nội bộ”. Bắt buộc khi đã giao.</w:t>
+      </w:r>
+    </w:p>
+    <w:p>
+      <w:pPr>
+        <w:pStyle w:val="ListParagraph"/>
+        <w:numPr>
+          <w:ilvl w:val="0"/>
+          <w:numId w:val="12"/>
+        </w:numPr>
+        <w:spacing w:after="100"/>
+      </w:pPr>
+      <w:r>
+        <w:rPr>
+          <w:b/>
+          <w:bCs/>
+        </w:rPr>
+        <w:t xml:space="preserve">Chi tiết lần giao</w:t>
+      </w:r>
+      <w:r>
+        <w:t xml:space="preserve"> — chủng loại, sản lượng, đơn giá thực tế của lần giao này. Ô Quy khô và Tỷ giá chỉ hiện khi áp dụng, giống phiếu hợp đồng.</w:t>
+      </w:r>
+    </w:p>
+    <w:p>
+      <w:pPr>
+        <w:pStyle w:val="ListParagraph"/>
+        <w:numPr>
+          <w:ilvl w:val="0"/>
+          <w:numId w:val="12"/>
+        </w:numPr>
+        <w:spacing w:after="100"/>
+      </w:pPr>
+      <w:r>
+        <w:rPr>
+          <w:b/>
+          <w:bCs/>
+        </w:rPr>
+        <w:t xml:space="preserve">Thanh toán</w:t>
+      </w:r>
+      <w:r>
+        <w:t xml:space="preserve"> — ngày thanh toán, sản lượng và chi phí của lần thanh toán, kèm chứng từ/hoá đơn.</w:t>
+      </w:r>
+    </w:p>
+    <w:p>
+      <w:pPr>
         <w:spacing w:after="80" w:before="140"/>
       </w:pPr>
       <w:r>
@@ -2580,27 +2547,17 @@
         <w:spacing w:after="80"/>
       </w:pPr>
       <w:r>
-        <w:t xml:space="preserve">Chọn </w:t>
-      </w:r>
-      <w:r>
-        <w:rPr>
-          <w:b/>
-          <w:bCs/>
-        </w:rPr>
-        <w:t xml:space="preserve">Từ ngày / Đến ngày</w:t>
-      </w:r>
-      <w:r>
-        <w:t xml:space="preserve"> để đổi kỳ; lọc thêm theo </w:t>
-      </w:r>
-      <w:r>
-        <w:rPr>
-          <w:b/>
-          <w:bCs/>
-        </w:rPr>
-        <w:t xml:space="preserve">Khách hàng</w:t>
-      </w:r>
-      <w:r>
-        <w:t xml:space="preserve"> nếu cần.</w:t>
+        <w:t xml:space="preserve">Tổng sản lượng các phụ lục </w:t>
+      </w:r>
+      <w:r>
+        <w:rPr>
+          <w:b/>
+          <w:bCs/>
+        </w:rPr>
+        <w:t xml:space="preserve">không được vượt</w:t>
+      </w:r>
+      <w:r>
+        <w:t xml:space="preserve"> cam kết của hợp đồng mẹ; phiếu hiện sẵn dòng “Còn lại của hợp đồng mẹ”.</w:t>
       </w:r>
     </w:p>
     <w:p>
@@ -2613,27 +2570,14 @@
         <w:spacing w:after="80"/>
       </w:pPr>
       <w:r>
-        <w:t xml:space="preserve">Cột </w:t>
-      </w:r>
-      <w:r>
-        <w:rPr>
-          <w:b/>
-          <w:bCs/>
-        </w:rPr>
-        <w:t xml:space="preserve">Chưa giao</w:t>
-      </w:r>
-      <w:r>
-        <w:t xml:space="preserve"> là số </w:t>
-      </w:r>
-      <w:r>
-        <w:rPr>
-          <w:b/>
-          <w:bCs/>
-        </w:rPr>
-        <w:t xml:space="preserve">tại ngày cuối kỳ</w:t>
-      </w:r>
-      <w:r>
-        <w:t xml:space="preserve">, không phải số cộng dồn.</w:t>
+        <w:rPr>
+          <w:b/>
+          <w:bCs/>
+        </w:rPr>
+        <w:t xml:space="preserve">Tiêu thụ nội bộ</w:t>
+      </w:r>
+      <w:r>
+        <w:t xml:space="preserve"> chỉ hiện khi đơn vị thuộc một nhóm công ty mẹ–con, và chỉ chọn được đơn vị trong cùng nhóm.</w:t>
       </w:r>
     </w:p>
     <w:p>
@@ -2646,17 +2590,27 @@
         <w:spacing w:after="80"/>
       </w:pPr>
       <w:r>
-        <w:t xml:space="preserve">Khối </w:t>
-      </w:r>
-      <w:r>
-        <w:rPr>
-          <w:b/>
-          <w:bCs/>
-        </w:rPr>
-        <w:t xml:space="preserve">Theo khách hàng</w:t>
-      </w:r>
-      <w:r>
-        <w:t xml:space="preserve"> bên dưới tách sản lượng và doanh thu theo từng khách.</w:t>
+        <w:t xml:space="preserve">Chi phí đưa vào báo cáo là ô </w:t>
+      </w:r>
+      <w:r>
+        <w:rPr>
+          <w:b/>
+          <w:bCs/>
+        </w:rPr>
+        <w:t xml:space="preserve">Chi phí</w:t>
+      </w:r>
+      <w:r>
+        <w:t xml:space="preserve"> trên từng dòng chi tiết; ô chi phí ở khối Thanh toán </w:t>
+      </w:r>
+      <w:r>
+        <w:rPr>
+          <w:b/>
+          <w:bCs/>
+        </w:rPr>
+        <w:t xml:space="preserve">không</w:t>
+      </w:r>
+      <w:r>
+        <w:t xml:space="preserve"> cộng vào báo cáo.</w:t>
       </w:r>
     </w:p>
     <w:p>
@@ -2669,27 +2623,37 @@
         <w:spacing w:after="80"/>
       </w:pPr>
       <w:r>
-        <w:rPr>
-          <w:b/>
-          <w:bCs/>
-        </w:rPr>
-        <w:t xml:space="preserve">Xuất Excel</w:t>
-      </w:r>
-      <w:r>
-        <w:t xml:space="preserve"> để lấy đúng bảng đang xem.</w:t>
-      </w:r>
-    </w:p>
-    <w:p>
-      <w:pPr>
-        <w:pStyle w:val="ListParagraph"/>
-        <w:numPr>
-          <w:ilvl w:val="0"/>
-          <w:numId w:val="3"/>
-        </w:numPr>
-        <w:spacing w:after="80"/>
-      </w:pPr>
-      <w:r>
-        <w:t xml:space="preserve">Doanh thu hiện “—” khi có lần giao bán ngoại tệ mà chưa nhập tỷ giá — bổ sung tỷ giá trên phụ lục để có số đầy đủ.</w:t>
+        <w:t xml:space="preserve">Lần giao đã ghi quá </w:t>
+      </w:r>
+      <w:r>
+        <w:rPr>
+          <w:b/>
+          <w:bCs/>
+        </w:rPr>
+        <w:t xml:space="preserve">số ngày cho phép sửa</w:t>
+      </w:r>
+      <w:r>
+        <w:t xml:space="preserve"> sẽ chuyển sang </w:t>
+      </w:r>
+      <w:r>
+        <w:rPr>
+          <w:b/>
+          <w:bCs/>
+        </w:rPr>
+        <w:t xml:space="preserve">chỉ xem</w:t>
+      </w:r>
+      <w:r>
+        <w:t xml:space="preserve"> (dòng hiện “(chỉ xem)” thay cho nút Sửa/Xoá) — kỳ báo cáo đã chốt thì không sửa lùi được nữa. Hợp đồng mẹ </w:t>
+      </w:r>
+      <w:r>
+        <w:rPr>
+          <w:b/>
+          <w:bCs/>
+        </w:rPr>
+        <w:t xml:space="preserve">không</w:t>
+      </w:r>
+      <w:r>
+        <w:t xml:space="preserve"> bị khoá, vẫn thêm phụ lục mới bình thường.</w:t>
       </w:r>
     </w:p>
     <w:p>
@@ -2698,7 +2662,7 @@
         <w:pageBreakBefore/>
       </w:pPr>
       <w:r>
-        <w:t xml:space="preserve">11. Nhu cầu thị trường</w:t>
+        <w:t xml:space="preserve">11. Báo cáo tiêu thụ</w:t>
       </w:r>
     </w:p>
     <w:p>
@@ -2713,7 +2677,7 @@
         <w:t xml:space="preserve">Vị trí: </w:t>
       </w:r>
       <w:r>
-        <w:t xml:space="preserve">Nhập liệu số liệu → Nhu cầu thị trường</w:t>
+        <w:t xml:space="preserve">Báo cáo → Tiêu thụ</w:t>
       </w:r>
     </w:p>
     <w:p>
@@ -2721,7 +2685,7 @@
         <w:spacing w:after="140"/>
       </w:pPr>
       <w:r>
-        <w:t xml:space="preserve">Ghi nhận nhu cầu và tín hiệu thị trường của đơn vị, nhập tự do bằng chữ theo ngày.</w:t>
+        <w:t xml:space="preserve">Bảng chỉ để xem — số do hệ thống tổng hợp từ các lần giao, đơn vị không nhập tay.</w:t>
       </w:r>
     </w:p>
     <w:p>
@@ -2734,7 +2698,7 @@
           <wp:inline distT="0" distB="0" distL="0" distR="0">
             <wp:extent cx="6191250" cy="3381375"/>
             <wp:effectExtent t="0" r="0" b="0" l="0"/>
-            <wp:docPr id="1" name="img" descr="Ảnh hướng dẫn có đánh số bước" title="img/10-nhu-cau-thi-truong.png"/>
+            <wp:docPr id="1" name="img" descr="Ảnh hướng dẫn có đánh số bước" title="img/10-bao-cao-tieu-thu.png"/>
             <wp:cNvGraphicFramePr>
               <a:graphicFrameLocks xmlns:a="http://schemas.openxmlformats.org/drawingml/2006/main" noChangeAspect="1"/>
             </wp:cNvGraphicFramePr>
@@ -2783,7 +2747,7 @@
           <w:sz w:val="17"/>
           <w:szCs w:val="17"/>
         </w:rPr>
-        <w:t xml:space="preserve">Hình 10. Nhu cầu thị trường theo ngày</w:t>
+        <w:t xml:space="preserve">Hình 10. Báo cáo tiêu thụ theo kỳ</w:t>
       </w:r>
     </w:p>
     <w:p>
@@ -2808,7 +2772,24 @@
         <w:spacing w:after="100"/>
       </w:pPr>
       <w:r>
-        <w:t xml:space="preserve">Chọn ngày rồi viết nội dung: khách hỏi mua gì, số lượng, mức giá chào, tình hình thương lượng.</w:t>
+        <w:rPr>
+          <w:b/>
+          <w:bCs/>
+        </w:rPr>
+        <w:t xml:space="preserve">Bảng tổng hợp</w:t>
+      </w:r>
+      <w:r>
+        <w:t xml:space="preserve"> — Lần giao · SL · Quy khô · Xuất khẩu · Trong nước · Nội bộ · Doanh thu · Chi phí · </w:t>
+      </w:r>
+      <w:r>
+        <w:rPr>
+          <w:b/>
+          <w:bCs/>
+        </w:rPr>
+        <w:t xml:space="preserve">Chưa giao</w:t>
+      </w:r>
+      <w:r>
+        <w:t xml:space="preserve">.</w:t>
       </w:r>
     </w:p>
     <w:p>
@@ -2833,17 +2814,116 @@
         <w:spacing w:after="80"/>
       </w:pPr>
       <w:r>
-        <w:t xml:space="preserve">Viết ngắn gọn nhưng có </w:t>
-      </w:r>
-      <w:r>
-        <w:rPr>
-          <w:b/>
-          <w:bCs/>
-        </w:rPr>
-        <w:t xml:space="preserve">con số cụ thể</w:t>
-      </w:r>
-      <w:r>
-        <w:t xml:space="preserve"> (chủng loại, sản lượng, mức giá) — Ban TTKD dùng thông tin này để đối chiếu với diễn biến giá sàn.</w:t>
+        <w:t xml:space="preserve">Chọn </w:t>
+      </w:r>
+      <w:r>
+        <w:rPr>
+          <w:b/>
+          <w:bCs/>
+        </w:rPr>
+        <w:t xml:space="preserve">Từ ngày / Đến ngày</w:t>
+      </w:r>
+      <w:r>
+        <w:t xml:space="preserve"> để đổi kỳ; lọc thêm theo </w:t>
+      </w:r>
+      <w:r>
+        <w:rPr>
+          <w:b/>
+          <w:bCs/>
+        </w:rPr>
+        <w:t xml:space="preserve">Khách hàng</w:t>
+      </w:r>
+      <w:r>
+        <w:t xml:space="preserve"> nếu cần.</w:t>
+      </w:r>
+    </w:p>
+    <w:p>
+      <w:pPr>
+        <w:pStyle w:val="ListParagraph"/>
+        <w:numPr>
+          <w:ilvl w:val="0"/>
+          <w:numId w:val="3"/>
+        </w:numPr>
+        <w:spacing w:after="80"/>
+      </w:pPr>
+      <w:r>
+        <w:t xml:space="preserve">Cột </w:t>
+      </w:r>
+      <w:r>
+        <w:rPr>
+          <w:b/>
+          <w:bCs/>
+        </w:rPr>
+        <w:t xml:space="preserve">Chưa giao</w:t>
+      </w:r>
+      <w:r>
+        <w:t xml:space="preserve"> là số </w:t>
+      </w:r>
+      <w:r>
+        <w:rPr>
+          <w:b/>
+          <w:bCs/>
+        </w:rPr>
+        <w:t xml:space="preserve">tại ngày cuối kỳ</w:t>
+      </w:r>
+      <w:r>
+        <w:t xml:space="preserve">, không phải số cộng dồn.</w:t>
+      </w:r>
+    </w:p>
+    <w:p>
+      <w:pPr>
+        <w:pStyle w:val="ListParagraph"/>
+        <w:numPr>
+          <w:ilvl w:val="0"/>
+          <w:numId w:val="3"/>
+        </w:numPr>
+        <w:spacing w:after="80"/>
+      </w:pPr>
+      <w:r>
+        <w:t xml:space="preserve">Khối </w:t>
+      </w:r>
+      <w:r>
+        <w:rPr>
+          <w:b/>
+          <w:bCs/>
+        </w:rPr>
+        <w:t xml:space="preserve">Theo khách hàng</w:t>
+      </w:r>
+      <w:r>
+        <w:t xml:space="preserve"> bên dưới tách sản lượng và doanh thu theo từng khách.</w:t>
+      </w:r>
+    </w:p>
+    <w:p>
+      <w:pPr>
+        <w:pStyle w:val="ListParagraph"/>
+        <w:numPr>
+          <w:ilvl w:val="0"/>
+          <w:numId w:val="3"/>
+        </w:numPr>
+        <w:spacing w:after="80"/>
+      </w:pPr>
+      <w:r>
+        <w:rPr>
+          <w:b/>
+          <w:bCs/>
+        </w:rPr>
+        <w:t xml:space="preserve">Xuất Excel</w:t>
+      </w:r>
+      <w:r>
+        <w:t xml:space="preserve"> để lấy đúng bảng đang xem.</w:t>
+      </w:r>
+    </w:p>
+    <w:p>
+      <w:pPr>
+        <w:pStyle w:val="ListParagraph"/>
+        <w:numPr>
+          <w:ilvl w:val="0"/>
+          <w:numId w:val="3"/>
+        </w:numPr>
+        <w:spacing w:after="80"/>
+      </w:pPr>
+      <w:r>
+        <w:t xml:space="preserve">Doanh thu hiện “—” khi có lần giao bán ngoại tệ mà chưa nhập tỷ giá — bổ sung tỷ giá trên phụ lục để có số đầy đủ.</w:t>
       </w:r>
     </w:p>
     <w:p>
@@ -2852,7 +2932,7 @@
         <w:pageBreakBefore/>
       </w:pPr>
       <w:r>
-        <w:t xml:space="preserve">12. Kế hoạch năm</w:t>
+        <w:t xml:space="preserve">12. Nhu cầu thị trường</w:t>
       </w:r>
     </w:p>
     <w:p>
@@ -2867,7 +2947,7 @@
         <w:t xml:space="preserve">Vị trí: </w:t>
       </w:r>
       <w:r>
-        <w:t xml:space="preserve">Nhập liệu số liệu → Kế hoạch năm</w:t>
+        <w:t xml:space="preserve">Nhập liệu số liệu → Nhu cầu thị trường</w:t>
       </w:r>
     </w:p>
     <w:p>
@@ -2875,7 +2955,7 @@
         <w:spacing w:after="140"/>
       </w:pPr>
       <w:r>
-        <w:t xml:space="preserve">Số liệu nhập một lần cho cả năm, cập nhật khi có điều chỉnh.</w:t>
+        <w:t xml:space="preserve">Ghi nhận nhu cầu và tín hiệu thị trường của đơn vị, nhập tự do bằng chữ theo ngày.</w:t>
       </w:r>
     </w:p>
     <w:p>
@@ -2888,7 +2968,7 @@
           <wp:inline distT="0" distB="0" distL="0" distR="0">
             <wp:extent cx="6191250" cy="3381375"/>
             <wp:effectExtent t="0" r="0" b="0" l="0"/>
-            <wp:docPr id="1" name="img" descr="Ảnh hướng dẫn có đánh số bước" title="img/11-ke-hoach-nam.png"/>
+            <wp:docPr id="1" name="img" descr="Ảnh hướng dẫn có đánh số bước" title="img/11-nhu-cau-thi-truong.png"/>
             <wp:cNvGraphicFramePr>
               <a:graphicFrameLocks xmlns:a="http://schemas.openxmlformats.org/drawingml/2006/main" noChangeAspect="1"/>
             </wp:cNvGraphicFramePr>
@@ -2937,7 +3017,7 @@
           <w:sz w:val="17"/>
           <w:szCs w:val="17"/>
         </w:rPr>
-        <w:t xml:space="preserve">Hình 11. Kế hoạch năm của đơn vị</w:t>
+        <w:t xml:space="preserve">Hình 11. Nhu cầu thị trường theo ngày</w:t>
       </w:r>
     </w:p>
     <w:p>
@@ -2962,54 +3042,42 @@
         <w:spacing w:after="100"/>
       </w:pPr>
       <w:r>
-        <w:rPr>
-          <w:b/>
-          <w:bCs/>
-        </w:rPr>
-        <w:t xml:space="preserve">Kế hoạch thu mua</w:t>
-      </w:r>
-      <w:r>
-        <w:t xml:space="preserve"> (tấn) — dùng để tính % hoàn thành kế hoạch trên báo cáo.</w:t>
-      </w:r>
-    </w:p>
-    <w:p>
-      <w:pPr>
-        <w:pStyle w:val="ListParagraph"/>
-        <w:numPr>
-          <w:ilvl w:val="0"/>
-          <w:numId w:val="14"/>
-        </w:numPr>
-        <w:spacing w:after="100"/>
-      </w:pPr>
-      <w:r>
-        <w:rPr>
-          <w:b/>
-          <w:bCs/>
-        </w:rPr>
-        <w:t xml:space="preserve">HĐ dài hạn đã ký</w:t>
-      </w:r>
-      <w:r>
-        <w:t xml:space="preserve"> (tấn) trong năm.</w:t>
-      </w:r>
-    </w:p>
-    <w:p>
-      <w:pPr>
-        <w:pStyle w:val="ListParagraph"/>
-        <w:numPr>
-          <w:ilvl w:val="0"/>
-          <w:numId w:val="14"/>
-        </w:numPr>
-        <w:spacing w:after="100"/>
-      </w:pPr>
-      <w:r>
-        <w:rPr>
-          <w:b/>
-          <w:bCs/>
-        </w:rPr>
-        <w:t xml:space="preserve">HĐ dài hạn / HĐ chuyến năm trước chuyển sang</w:t>
-      </w:r>
-      <w:r>
-        <w:t xml:space="preserve"> (tấn).</w:t>
+        <w:t xml:space="preserve">Chọn ngày rồi viết nội dung: khách hỏi mua gì, số lượng, mức giá chào, tình hình thương lượng.</w:t>
+      </w:r>
+    </w:p>
+    <w:p>
+      <w:pPr>
+        <w:spacing w:after="80" w:before="140"/>
+      </w:pPr>
+      <w:r>
+        <w:rPr>
+          <w:b/>
+          <w:bCs/>
+        </w:rPr>
+        <w:t xml:space="preserve">Lưu ý:</w:t>
+      </w:r>
+    </w:p>
+    <w:p>
+      <w:pPr>
+        <w:pStyle w:val="ListParagraph"/>
+        <w:numPr>
+          <w:ilvl w:val="0"/>
+          <w:numId w:val="3"/>
+        </w:numPr>
+        <w:spacing w:after="80"/>
+      </w:pPr>
+      <w:r>
+        <w:t xml:space="preserve">Viết ngắn gọn nhưng có </w:t>
+      </w:r>
+      <w:r>
+        <w:rPr>
+          <w:b/>
+          <w:bCs/>
+        </w:rPr>
+        <w:t xml:space="preserve">con số cụ thể</w:t>
+      </w:r>
+      <w:r>
+        <w:t xml:space="preserve"> (chủng loại, sản lượng, mức giá) — Ban TTKD dùng thông tin này để đối chiếu với diễn biến giá sàn.</w:t>
       </w:r>
     </w:p>
     <w:p>
@@ -3018,7 +3086,7 @@
         <w:pageBreakBefore/>
       </w:pPr>
       <w:r>
-        <w:t xml:space="preserve">13. Hợp đồng cũ (trước 30/07)</w:t>
+        <w:t xml:space="preserve">13. Kế hoạch năm</w:t>
       </w:r>
     </w:p>
     <w:p>
@@ -3033,7 +3101,7 @@
         <w:t xml:space="preserve">Vị trí: </w:t>
       </w:r>
       <w:r>
-        <w:t xml:space="preserve">Báo cáo → Hợp đồng cũ (trước 30/07)</w:t>
+        <w:t xml:space="preserve">Nhập liệu số liệu → Kế hoạch năm</w:t>
       </w:r>
     </w:p>
     <w:p>
@@ -3041,7 +3109,7 @@
         <w:spacing w:after="140"/>
       </w:pPr>
       <w:r>
-        <w:t xml:space="preserve">Toàn bộ hợp đồng đã ký nhập theo cách cũ, kể cả hợp đồng đã giao. Màn này chỉ để tra cứu — không có nút sửa.</w:t>
+        <w:t xml:space="preserve">Số liệu nhập một lần cho cả năm, cập nhật khi có điều chỉnh.</w:t>
       </w:r>
     </w:p>
     <w:p>
@@ -3054,7 +3122,7 @@
           <wp:inline distT="0" distB="0" distL="0" distR="0">
             <wp:extent cx="6191250" cy="3381375"/>
             <wp:effectExtent t="0" r="0" b="0" l="0"/>
-            <wp:docPr id="1" name="img" descr="Ảnh hướng dẫn có đánh số bước" title="img/12-hop-dong-cu.png"/>
+            <wp:docPr id="1" name="img" descr="Ảnh hướng dẫn có đánh số bước" title="img/12-ke-hoach-nam.png"/>
             <wp:cNvGraphicFramePr>
               <a:graphicFrameLocks xmlns:a="http://schemas.openxmlformats.org/drawingml/2006/main" noChangeAspect="1"/>
             </wp:cNvGraphicFramePr>
@@ -3103,7 +3171,7 @@
           <w:sz w:val="17"/>
           <w:szCs w:val="17"/>
         </w:rPr>
-        <w:t xml:space="preserve">Hình 12. Tra cứu hợp đồng cũ</w:t>
+        <w:t xml:space="preserve">Hình 12. Kế hoạch năm của đơn vị</w:t>
       </w:r>
     </w:p>
     <w:p>
@@ -3128,55 +3196,54 @@
         <w:spacing w:after="100"/>
       </w:pPr>
       <w:r>
-        <w:t xml:space="preserve">Lọc theo khu vực, đơn vị, chủng loại, trạng thái giao và khoảng thời gian; tìm nhanh theo số HĐ.</w:t>
-      </w:r>
-    </w:p>
-    <w:p>
-      <w:pPr>
-        <w:spacing w:after="80" w:before="140"/>
-      </w:pPr>
-      <w:r>
-        <w:rPr>
-          <w:b/>
-          <w:bCs/>
-        </w:rPr>
-        <w:t xml:space="preserve">Lưu ý:</w:t>
-      </w:r>
-    </w:p>
-    <w:p>
-      <w:pPr>
-        <w:pStyle w:val="ListParagraph"/>
-        <w:numPr>
-          <w:ilvl w:val="0"/>
-          <w:numId w:val="3"/>
-        </w:numPr>
-        <w:spacing w:after="80"/>
-      </w:pPr>
-      <w:r>
-        <w:t xml:space="preserve">Hợp đồng phát sinh từ 30/07 trở đi nằm ở mục </w:t>
-      </w:r>
-      <w:r>
-        <w:rPr>
-          <w:b/>
-          <w:bCs/>
-        </w:rPr>
-        <w:t xml:space="preserve">Hợp đồng &amp; phụ lục</w:t>
-      </w:r>
-      <w:r>
-        <w:t xml:space="preserve">, không nằm ở đây.</w:t>
-      </w:r>
-    </w:p>
-    <w:p>
-      <w:pPr>
-        <w:pStyle w:val="ListParagraph"/>
-        <w:numPr>
-          <w:ilvl w:val="0"/>
-          <w:numId w:val="3"/>
-        </w:numPr>
-        <w:spacing w:after="80"/>
-      </w:pPr>
-      <w:r>
-        <w:t xml:space="preserve">Cần sửa một hợp đồng cũ thì báo Ban TTKD.</w:t>
+        <w:rPr>
+          <w:b/>
+          <w:bCs/>
+        </w:rPr>
+        <w:t xml:space="preserve">Kế hoạch thu mua</w:t>
+      </w:r>
+      <w:r>
+        <w:t xml:space="preserve"> (tấn) — dùng để tính % hoàn thành kế hoạch trên báo cáo.</w:t>
+      </w:r>
+    </w:p>
+    <w:p>
+      <w:pPr>
+        <w:pStyle w:val="ListParagraph"/>
+        <w:numPr>
+          <w:ilvl w:val="0"/>
+          <w:numId w:val="15"/>
+        </w:numPr>
+        <w:spacing w:after="100"/>
+      </w:pPr>
+      <w:r>
+        <w:rPr>
+          <w:b/>
+          <w:bCs/>
+        </w:rPr>
+        <w:t xml:space="preserve">HĐ dài hạn đã ký</w:t>
+      </w:r>
+      <w:r>
+        <w:t xml:space="preserve"> (tấn) trong năm.</w:t>
+      </w:r>
+    </w:p>
+    <w:p>
+      <w:pPr>
+        <w:pStyle w:val="ListParagraph"/>
+        <w:numPr>
+          <w:ilvl w:val="0"/>
+          <w:numId w:val="15"/>
+        </w:numPr>
+        <w:spacing w:after="100"/>
+      </w:pPr>
+      <w:r>
+        <w:rPr>
+          <w:b/>
+          <w:bCs/>
+        </w:rPr>
+        <w:t xml:space="preserve">HĐ dài hạn / HĐ chuyến năm trước chuyển sang</w:t>
+      </w:r>
+      <w:r>
+        <w:t xml:space="preserve"> (tấn).</w:t>
       </w:r>
     </w:p>
     <w:p>
@@ -3185,7 +3252,174 @@
         <w:pageBreakBefore/>
       </w:pPr>
       <w:r>
-        <w:t xml:space="preserve">14. Những lỗi hay gặp</w:t>
+        <w:t xml:space="preserve">14. Hợp đồng cũ (trước 30/07)</w:t>
+      </w:r>
+    </w:p>
+    <w:p>
+      <w:pPr>
+        <w:spacing w:after="60"/>
+      </w:pPr>
+      <w:r>
+        <w:rPr>
+          <w:b/>
+          <w:bCs/>
+        </w:rPr>
+        <w:t xml:space="preserve">Vị trí: </w:t>
+      </w:r>
+      <w:r>
+        <w:t xml:space="preserve">Báo cáo → Hợp đồng cũ (trước 30/07)</w:t>
+      </w:r>
+    </w:p>
+    <w:p>
+      <w:pPr>
+        <w:spacing w:after="140"/>
+      </w:pPr>
+      <w:r>
+        <w:t xml:space="preserve">Toàn bộ hợp đồng đã ký nhập theo cách cũ, kể cả hợp đồng đã giao. Màn này chỉ để tra cứu — không có nút sửa.</w:t>
+      </w:r>
+    </w:p>
+    <w:p>
+      <w:pPr>
+        <w:spacing w:after="60" w:before="60"/>
+        <w:jc w:val="center"/>
+      </w:pPr>
+      <w:r>
+        <w:drawing>
+          <wp:inline distT="0" distB="0" distL="0" distR="0">
+            <wp:extent cx="6191250" cy="3381375"/>
+            <wp:effectExtent t="0" r="0" b="0" l="0"/>
+            <wp:docPr id="1" name="img" descr="Ảnh hướng dẫn có đánh số bước" title="img/13-hop-dong-cu.png"/>
+            <wp:cNvGraphicFramePr>
+              <a:graphicFrameLocks xmlns:a="http://schemas.openxmlformats.org/drawingml/2006/main" noChangeAspect="1"/>
+            </wp:cNvGraphicFramePr>
+            <a:graphic xmlns:a="http://schemas.openxmlformats.org/drawingml/2006/main">
+              <a:graphicData uri="http://schemas.openxmlformats.org/drawingml/2006/picture">
+                <pic:pic xmlns:pic="http://schemas.openxmlformats.org/drawingml/2006/picture">
+                  <pic:nvPicPr>
+                    <pic:cNvPr id="0" name="" descr=""/>
+                    <pic:cNvPicPr>
+                      <a:picLocks noChangeAspect="1" noChangeArrowheads="1"/>
+                    </pic:cNvPicPr>
+                  </pic:nvPicPr>
+                  <pic:blipFill>
+                    <a:blip r:embed="rId20" cstate="none"/>
+                    <a:srcRect/>
+                    <a:stretch>
+                      <a:fillRect/>
+                    </a:stretch>
+                  </pic:blipFill>
+                  <pic:spPr bwMode="auto">
+                    <a:xfrm>
+                      <a:off x="0" y="0"/>
+                      <a:ext cx="6191250" cy="3381375"/>
+                    </a:xfrm>
+                    <a:prstGeom prst="rect">
+                      <a:avLst/>
+                    </a:prstGeom>
+                  </pic:spPr>
+                </pic:pic>
+              </a:graphicData>
+            </a:graphic>
+          </wp:inline>
+        </w:drawing>
+      </w:r>
+    </w:p>
+    <w:p>
+      <w:pPr>
+        <w:spacing w:after="180"/>
+        <w:jc w:val="center"/>
+      </w:pPr>
+      <w:r>
+        <w:rPr>
+          <w:i/>
+          <w:iCs/>
+          <w:color w:val="888888"/>
+          <w:sz w:val="17"/>
+          <w:szCs w:val="17"/>
+        </w:rPr>
+        <w:t xml:space="preserve">Hình 13. Tra cứu hợp đồng cũ</w:t>
+      </w:r>
+    </w:p>
+    <w:p>
+      <w:pPr>
+        <w:spacing w:after="80"/>
+      </w:pPr>
+      <w:r>
+        <w:rPr>
+          <w:b/>
+          <w:bCs/>
+        </w:rPr>
+        <w:t xml:space="preserve">Các bước:</w:t>
+      </w:r>
+    </w:p>
+    <w:p>
+      <w:pPr>
+        <w:pStyle w:val="ListParagraph"/>
+        <w:numPr>
+          <w:ilvl w:val="0"/>
+          <w:numId w:val="16"/>
+        </w:numPr>
+        <w:spacing w:after="100"/>
+      </w:pPr>
+      <w:r>
+        <w:t xml:space="preserve">Lọc theo khu vực, đơn vị, chủng loại, trạng thái giao và khoảng thời gian; tìm nhanh theo số HĐ.</w:t>
+      </w:r>
+    </w:p>
+    <w:p>
+      <w:pPr>
+        <w:spacing w:after="80" w:before="140"/>
+      </w:pPr>
+      <w:r>
+        <w:rPr>
+          <w:b/>
+          <w:bCs/>
+        </w:rPr>
+        <w:t xml:space="preserve">Lưu ý:</w:t>
+      </w:r>
+    </w:p>
+    <w:p>
+      <w:pPr>
+        <w:pStyle w:val="ListParagraph"/>
+        <w:numPr>
+          <w:ilvl w:val="0"/>
+          <w:numId w:val="3"/>
+        </w:numPr>
+        <w:spacing w:after="80"/>
+      </w:pPr>
+      <w:r>
+        <w:t xml:space="preserve">Hợp đồng phát sinh từ 30/07 trở đi nằm ở mục </w:t>
+      </w:r>
+      <w:r>
+        <w:rPr>
+          <w:b/>
+          <w:bCs/>
+        </w:rPr>
+        <w:t xml:space="preserve">Hợp đồng &amp; phụ lục</w:t>
+      </w:r>
+      <w:r>
+        <w:t xml:space="preserve">, không nằm ở đây.</w:t>
+      </w:r>
+    </w:p>
+    <w:p>
+      <w:pPr>
+        <w:pStyle w:val="ListParagraph"/>
+        <w:numPr>
+          <w:ilvl w:val="0"/>
+          <w:numId w:val="3"/>
+        </w:numPr>
+        <w:spacing w:after="80"/>
+      </w:pPr>
+      <w:r>
+        <w:t xml:space="preserve">Cần sửa một hợp đồng cũ thì báo Ban TTKD.</w:t>
+      </w:r>
+    </w:p>
+    <w:p>
+      <w:pPr>
+        <w:pStyle w:val="Heading2"/>
+        <w:pageBreakBefore/>
+      </w:pPr>
+      <w:r>
+        <w:t xml:space="preserve">15. Những lỗi hay gặp</w:t>
       </w:r>
     </w:p>
     <w:p>
@@ -3781,6 +4015,18 @@
     <w:multiLevelType w:val="hybridMultilevel"/>
     <w:lvl w:ilvl="0" w15:tentative="1">
       <w:start w:val="1"/>
+      <w:numFmt w:val="decimal"/>
+      <w:lvlText w:val="%1."/>
+      <w:lvlJc w:val="left"/>
+      <w:pPr>
+        <w:ind w:left="620" w:hanging="360"/>
+      </w:pPr>
+    </w:lvl>
+  </w:abstractNum>
+  <w:abstractNum w:abstractNumId="17" w15:restartNumberingAfterBreak="0">
+    <w:multiLevelType w:val="hybridMultilevel"/>
+    <w:lvl w:ilvl="0" w15:tentative="1">
+      <w:start w:val="1"/>
       <w:numFmt w:val="bullet"/>
       <w:lvlText w:val="•"/>
       <w:lvlJc w:val="left"/>
@@ -3802,7 +4048,7 @@
     </w:lvlOverride>
   </w:num>
   <w:num w:numId="3">
-    <w:abstractNumId w:val="16"/>
+    <w:abstractNumId w:val="17"/>
     <w:lvlOverride w:ilvl="0">
       <w:startOverride w:val="1"/>
     </w:lvlOverride>
@@ -3875,6 +4121,12 @@
   </w:num>
   <w:num w:numId="15">
     <w:abstractNumId w:val="14"/>
+    <w:lvlOverride w:ilvl="0">
+      <w:startOverride w:val="1"/>
+    </w:lvlOverride>
+  </w:num>
+  <w:num w:numId="16">
+    <w:abstractNumId w:val="15"/>
     <w:lvlOverride w:ilvl="0">
       <w:startOverride w:val="1"/>
     </w:lvlOverride>

</xml_diff>

<commit_message>
feat(contract): search customers on the server, filter by several at once
Customer catalogues are per unit, so two units can hold near-identical names
("SINTEX CHEMICAL CORP." vs "SINTEX CHEMICAL CORPORATION"). The filter listed
bare names, so picking the wrong one silently returned an empty list.

Every customer field now uses one picker that queries the server (name, code or
tax code) and shows the owning unit under each name. The contract list and the
consumption report accept several customers at once; the catalogue no longer
ships inside /api/sales-contracts/meta, so screens stay light as the catalogue
grows. Scope stays server-enforced: a unit account only ever searches its own
customers.
</commit_message>
<xml_diff>
--- a/docs/huong-dan/nhap-lieu-don-vi-thanh-vien/Huong-dan-nhap-lieu-don-vi-thanh-vien.docx
+++ b/docs/huong-dan/nhap-lieu-don-vi-thanh-vien/Huong-dan-nhap-lieu-don-vi-thanh-vien.docx
@@ -1605,6 +1605,49 @@
     </w:p>
     <w:p>
       <w:pPr>
+        <w:pStyle w:val="ListParagraph"/>
+        <w:numPr>
+          <w:ilvl w:val="0"/>
+          <w:numId w:val="3"/>
+        </w:numPr>
+        <w:spacing w:after="80"/>
+      </w:pPr>
+      <w:r>
+        <w:t xml:space="preserve">Lọc theo </w:t>
+      </w:r>
+      <w:r>
+        <w:rPr>
+          <w:b/>
+          <w:bCs/>
+        </w:rPr>
+        <w:t xml:space="preserve">Khách hàng</w:t>
+      </w:r>
+      <w:r>
+        <w:t xml:space="preserve">: gõ vài chữ trong tên (hoặc mã khách) để tìm, chọn được </w:t>
+      </w:r>
+      <w:r>
+        <w:rPr>
+          <w:b/>
+          <w:bCs/>
+        </w:rPr>
+        <w:t xml:space="preserve">nhiều khách</w:t>
+      </w:r>
+      <w:r>
+        <w:t xml:space="preserve"> cùng lúc. Mỗi dòng hiện kèm </w:t>
+      </w:r>
+      <w:r>
+        <w:rPr>
+          <w:b/>
+          <w:bCs/>
+        </w:rPr>
+        <w:t xml:space="preserve">tên đơn vị</w:t>
+      </w:r>
+      <w:r>
+        <w:t xml:space="preserve"> sở hữu khách đó.</w:t>
+      </w:r>
+    </w:p>
+    <w:p>
+      <w:pPr>
         <w:pStyle w:val="Heading2"/>
         <w:pageBreakBefore/>
       </w:pPr>
@@ -1738,7 +1781,7 @@
         <w:t xml:space="preserve">Khách hàng</w:t>
       </w:r>
       <w:r>
-        <w:t xml:space="preserve"> — bắt buộc, chọn từ danh mục ở mục 6.</w:t>
+        <w:t xml:space="preserve"> — bắt buộc; gõ vài chữ trong tên (hoặc mã khách) rồi chọn. Danh sách chỉ có khách của chính đơn vị (mục 6).</w:t>
       </w:r>
     </w:p>
     <w:p>
@@ -2834,7 +2877,7 @@
         <w:t xml:space="preserve">Khách hàng</w:t>
       </w:r>
       <w:r>
-        <w:t xml:space="preserve"> nếu cần.</w:t>
+        <w:t xml:space="preserve"> (gõ để tìm, chọn được nhiều khách) nếu cần.</w:t>
       </w:r>
     </w:p>
     <w:p>

</xml_diff>

<commit_message>
docs(huong-dan): refresh screenshots for the revenue-only screens
Shoots again with cost gone: the contract form now annotates the detail block
and the read-only amount box, the consumption report annotates its filter bar
so the new grade filter is visible, and the yearly plan points at each of its
four figures including the spot-sales target.

The admin guide gains a small shoot script of its own for the member-unit
screen — the only screen there that keeps changing — plus the parent-company
column it never documented and a note that the purchase screen is now switched
by the yearly plan figure rather than a checkbox.
</commit_message>
<xml_diff>
--- a/docs/huong-dan/nhap-lieu-don-vi-thanh-vien/Huong-dan-nhap-lieu-don-vi-thanh-vien.docx
+++ b/docs/huong-dan/nhap-lieu-don-vi-thanh-vien/Huong-dan-nhap-lieu-don-vi-thanh-vien.docx
@@ -2810,6 +2810,46 @@
           <w:bCs/>
         </w:rPr>
         <w:t xml:space="preserve">Các bước:</w:t>
+      </w:r>
+    </w:p>
+    <w:p>
+      <w:pPr>
+        <w:pStyle w:val="ListParagraph"/>
+        <w:numPr>
+          <w:ilvl w:val="0"/>
+          <w:numId w:val="13"/>
+        </w:numPr>
+        <w:spacing w:after="100"/>
+      </w:pPr>
+      <w:r>
+        <w:rPr>
+          <w:b/>
+          <w:bCs/>
+        </w:rPr>
+        <w:t xml:space="preserve">Bộ lọc</w:t>
+      </w:r>
+      <w:r>
+        <w:t xml:space="preserve"> — Từ ngày / Đến ngày · Đơn vị · </w:t>
+      </w:r>
+      <w:r>
+        <w:rPr>
+          <w:b/>
+          <w:bCs/>
+        </w:rPr>
+        <w:t xml:space="preserve">Khách hàng</w:t>
+      </w:r>
+      <w:r>
+        <w:t xml:space="preserve"> (gõ để tìm, chọn nhiều) · </w:t>
+      </w:r>
+      <w:r>
+        <w:rPr>
+          <w:b/>
+          <w:bCs/>
+        </w:rPr>
+        <w:t xml:space="preserve">Chủng loại</w:t>
+      </w:r>
+      <w:r>
+        <w:t xml:space="preserve"> (chọn nhiều). Bảng, khối theo khách hàng và file Excel đều theo bộ lọc này.</w:t>
       </w:r>
     </w:p>
     <w:p>

</xml_diff>

<commit_message>
feat(contract): report latex consumption in dry tonnes, bill in wet
Latex and the two raw-material grades are sold by wet weight but consumed as
dry, and the form gave no hint which box meant what. The quantity box now says
"SL nước" for those grades, and every consumption figure — the report, the
period report, the stats screens, the signed-undelivered block — counts the dry
figure, while the amount keeps multiplying the wet quantity by the agreed price.

Contract commitment and delivery progress stay in wet tonnes: that is the
quantity written on the contract, and the annex-cannot-exceed-parent check has
to compare like with like.
</commit_message>
<xml_diff>
--- a/docs/huong-dan/nhap-lieu-don-vi-thanh-vien/Huong-dan-nhap-lieu-don-vi-thanh-vien.docx
+++ b/docs/huong-dan/nhap-lieu-don-vi-thanh-vien/Huong-dan-nhap-lieu-don-vi-thanh-vien.docx
@@ -1891,7 +1891,7 @@
         <w:t xml:space="preserve">Chi tiết hợp đồng</w:t>
       </w:r>
       <w:r>
-        <w:t xml:space="preserve"> — mỗi chủng loại một dòng. Ô </w:t>
+        <w:t xml:space="preserve"> — mỗi chủng loại một dòng (ô SL đổi nhãn thành *SL nước* với latex và mủ nguyên liệu). Ô </w:t>
       </w:r>
       <w:r>
         <w:rPr>
@@ -1944,6 +1944,36 @@
           <w:bCs/>
         </w:rPr>
         <w:t xml:space="preserve">Lưu ý:</w:t>
+      </w:r>
+    </w:p>
+    <w:p>
+      <w:pPr>
+        <w:pStyle w:val="ListParagraph"/>
+        <w:numPr>
+          <w:ilvl w:val="0"/>
+          <w:numId w:val="3"/>
+        </w:numPr>
+        <w:spacing w:after="80"/>
+      </w:pPr>
+      <w:r>
+        <w:rPr>
+          <w:b/>
+          <w:bCs/>
+        </w:rPr>
+        <w:t xml:space="preserve">LATEX và 2 loại mủ nguyên liệu bán theo MỦ NƯỚC:</w:t>
+      </w:r>
+      <w:r>
+        <w:t xml:space="preserve"> ô *SL nước (tấn)* là số để tính </w:t>
+      </w:r>
+      <w:r>
+        <w:rPr>
+          <w:b/>
+          <w:bCs/>
+        </w:rPr>
+        <w:t xml:space="preserve">Thành tiền</w:t>
+      </w:r>
+      <w:r>
+        <w:t xml:space="preserve"> (đơn giá là giá theo tấn mủ nước), còn **sản lượng tiêu thụ trên báo cáo lấy theo ô *Quy khô***. Vì vậy hai ô này phải khai đủ và đúng.</w:t>
       </w:r>
     </w:p>
     <w:p>
@@ -2892,6 +2922,39 @@
           <w:bCs/>
         </w:rPr>
         <w:t xml:space="preserve">Lưu ý:</w:t>
+      </w:r>
+    </w:p>
+    <w:p>
+      <w:pPr>
+        <w:pStyle w:val="ListParagraph"/>
+        <w:numPr>
+          <w:ilvl w:val="0"/>
+          <w:numId w:val="3"/>
+        </w:numPr>
+        <w:spacing w:after="80"/>
+      </w:pPr>
+      <w:r>
+        <w:t xml:space="preserve">Cột </w:t>
+      </w:r>
+      <w:r>
+        <w:rPr>
+          <w:b/>
+          <w:bCs/>
+        </w:rPr>
+        <w:t xml:space="preserve">SL (tấn)</w:t>
+      </w:r>
+      <w:r>
+        <w:t xml:space="preserve"> là sản lượng tiêu thụ thực tế: latex và mủ nguyên liệu tính theo </w:t>
+      </w:r>
+      <w:r>
+        <w:rPr>
+          <w:b/>
+          <w:bCs/>
+        </w:rPr>
+        <w:t xml:space="preserve">quy khô</w:t>
+      </w:r>
+      <w:r>
+        <w:t xml:space="preserve">, các chủng loại thành phẩm tính theo chính số lượng bán.</w:t>
       </w:r>
     </w:p>
     <w:p>

</xml_diff>

<commit_message>
docs(huong-dan): reshoot both guides for the revenue-only screens
The screenshots still showed the cost boxes and the per-unit purchase-plan
switch. The contract form now opens with a latex line selected so the reader
can see the "SL nước" and "Quy khô" pair the new rule talks about, the
consumption report shows its grade filter, the yearly plan shows the
spot-sales target, and the member-unit screen has lost its plan column.

Also stops single-asterisk emphasis from reaching the Word files: the builder
only understands double asterisks, so the readers were seeing raw *stars*.
</commit_message>
<xml_diff>
--- a/docs/huong-dan/nhap-lieu-don-vi-thanh-vien/Huong-dan-nhap-lieu-don-vi-thanh-vien.docx
+++ b/docs/huong-dan/nhap-lieu-don-vi-thanh-vien/Huong-dan-nhap-lieu-don-vi-thanh-vien.docx
@@ -1891,7 +1891,17 @@
         <w:t xml:space="preserve">Chi tiết hợp đồng</w:t>
       </w:r>
       <w:r>
-        <w:t xml:space="preserve"> — mỗi chủng loại một dòng (ô SL đổi nhãn thành *SL nước* với latex và mủ nguyên liệu). Ô </w:t>
+        <w:t xml:space="preserve"> — mỗi chủng loại một dòng (ô SL đổi nhãn thành </w:t>
+      </w:r>
+      <w:r>
+        <w:rPr>
+          <w:b/>
+          <w:bCs/>
+        </w:rPr>
+        <w:t xml:space="preserve">SL nước</w:t>
+      </w:r>
+      <w:r>
+        <w:t xml:space="preserve"> với latex và mủ nguyên liệu). Ô </w:t>
       </w:r>
       <w:r>
         <w:rPr>
@@ -1963,7 +1973,17 @@
         <w:t xml:space="preserve">LATEX và 2 loại mủ nguyên liệu bán theo MỦ NƯỚC:</w:t>
       </w:r>
       <w:r>
-        <w:t xml:space="preserve"> ô *SL nước (tấn)* là số để tính </w:t>
+        <w:t xml:space="preserve"> ô </w:t>
+      </w:r>
+      <w:r>
+        <w:rPr>
+          <w:b/>
+          <w:bCs/>
+        </w:rPr>
+        <w:t xml:space="preserve">SL nước (tấn)</w:t>
+      </w:r>
+      <w:r>
+        <w:t xml:space="preserve"> là số để tính </w:t>
       </w:r>
       <w:r>
         <w:rPr>
@@ -1973,7 +1993,17 @@
         <w:t xml:space="preserve">Thành tiền</w:t>
       </w:r>
       <w:r>
-        <w:t xml:space="preserve"> (đơn giá là giá theo tấn mủ nước), còn **sản lượng tiêu thụ trên báo cáo lấy theo ô *Quy khô***. Vì vậy hai ô này phải khai đủ và đúng.</w:t>
+        <w:t xml:space="preserve"> (đơn giá là giá theo tấn mủ nước), còn </w:t>
+      </w:r>
+      <w:r>
+        <w:rPr>
+          <w:b/>
+          <w:bCs/>
+        </w:rPr>
+        <w:t xml:space="preserve">sản lượng tiêu thụ trên báo cáo lấy theo ô Quy khô</w:t>
+      </w:r>
+      <w:r>
+        <w:t xml:space="preserve">. Vì vậy hai ô này phải khai đủ và đúng.</w:t>
       </w:r>
     </w:p>
     <w:p>

</xml_diff>

<commit_message>
docs(huong-dan): rewrite the member guide around delivery batches
Sixteen sections now, with new shots for the contract list, the detail screen and the
batch form, plus a new section on completing a contract. Also notes that framework
contracts are not managed and that signed-but-undelivered will read higher than before.
</commit_message>
<xml_diff>
--- a/docs/huong-dan/nhap-lieu-don-vi-thanh-vien/Huong-dan-nhap-lieu-don-vi-thanh-vien.docx
+++ b/docs/huong-dan/nhap-lieu-don-vi-thanh-vien/Huong-dan-nhap-lieu-don-vi-thanh-vien.docx
@@ -16,7 +16,7 @@
         <w:spacing w:after="200"/>
       </w:pPr>
       <w:r>
-        <w:t xml:space="preserve">Tài liệu dành cho cán bộ đơn vị thành viên VRG nhập số liệu trên Hệ thống Dự báo &amp; Quản trị Giá Cao su. Tài khoản đơn vị chỉ thấy và chỉ nhập được số liệu của chính đơn vị mình. Từ 30/07/2026, số tiêu thụ KHÔNG còn nhập tay theo ngày — hệ thống tự tính từ các lần giao ghi trên hợp đồng. Đơn vị nhập 4 mục theo ngày/năm và quản lý hợp đồng bán hàng của mình; hai mục còn lại chỉ để xem.</w:t>
+        <w:t xml:space="preserve">Tài liệu dành cho cán bộ đơn vị thành viên VRG nhập số liệu trên Hệ thống Dự báo &amp; Quản trị Giá Cao su. Tài khoản đơn vị chỉ thấy và chỉ nhập được số liệu của chính đơn vị mình. Số tiêu thụ KHÔNG còn nhập tay theo ngày — hệ thống tự tính từ các ĐỢT GIAO ghi trên hợp đồng. Đơn vị nhập 4 mục theo ngày/năm và quản lý hợp đồng bán hàng của mình; hai mục còn lại chỉ để xem.</w:t>
       </w:r>
     </w:p>
     <w:p>
@@ -71,7 +71,7 @@
           <w:b/>
           <w:bCs/>
         </w:rPr>
-        <w:t xml:space="preserve">một phụ lục của hợp đồng</w:t>
+        <w:t xml:space="preserve">một đợt giao của hợp đồng</w:t>
       </w:r>
       <w:r>
         <w:t xml:space="preserve">, hệ thống tự cộng vào tiêu thụ đúng ngày giao.</w:t>
@@ -104,7 +104,7 @@
         <w:t xml:space="preserve">tự tính</w:t>
       </w:r>
       <w:r>
-        <w:t xml:space="preserve"> từ các đợt giao đã mở nhưng chưa tới ngày giao. Phiếu tồn kho còn đúng 3 khối nhập tay.</w:t>
+        <w:t xml:space="preserve"> = sản lượng hợp đồng − đã giao. Phiếu tồn kho còn đúng 3 khối nhập tay.</w:t>
       </w:r>
     </w:p>
     <w:p>
@@ -149,6 +149,46 @@
     </w:p>
     <w:p>
       <w:pPr>
+        <w:pStyle w:val="ListParagraph"/>
+        <w:numPr>
+          <w:ilvl w:val="0"/>
+          <w:numId w:val="2"/>
+        </w:numPr>
+        <w:spacing w:after="100"/>
+      </w:pPr>
+      <w:r>
+        <w:rPr>
+          <w:b/>
+          <w:bCs/>
+        </w:rPr>
+        <w:t xml:space="preserve">Hệ thống không quản lý hợp đồng khung.</w:t>
+      </w:r>
+      <w:r>
+        <w:t xml:space="preserve"> Đơn vị có hợp đồng dài hạn thì nhập </w:t>
+      </w:r>
+      <w:r>
+        <w:rPr>
+          <w:b/>
+          <w:bCs/>
+        </w:rPr>
+        <w:t xml:space="preserve">mỗi phụ lục như một hợp đồng</w:t>
+      </w:r>
+      <w:r>
+        <w:t xml:space="preserve"> và chọn loại </w:t>
+      </w:r>
+      <w:r>
+        <w:rPr>
+          <w:b/>
+          <w:bCs/>
+        </w:rPr>
+        <w:t xml:space="preserve">HĐ dài hạn</w:t>
+      </w:r>
+      <w:r>
+        <w:t xml:space="preserve"> để phân biệt.</w:t>
+      </w:r>
+    </w:p>
+    <w:p>
+      <w:pPr>
         <w:spacing w:after="80" w:before="140"/>
       </w:pPr>
       <w:r>
@@ -169,7 +209,47 @@
         <w:spacing w:after="80"/>
       </w:pPr>
       <w:r>
-        <w:t xml:space="preserve">Số tiêu thụ của các kỳ trước 30/07 chỉ hiện lại trên báo cáo sau khi Ban TTKD chạy chuyển đổi dữ liệu. Trong lúc chờ, báo cáo có dòng cảnh báo màu vàng nói rõ phần nào chưa được tính.</w:t>
+        <w:t xml:space="preserve">Từ 05/08/2026 gọi là </w:t>
+      </w:r>
+      <w:r>
+        <w:rPr>
+          <w:b/>
+          <w:bCs/>
+        </w:rPr>
+        <w:t xml:space="preserve">đợt giao</w:t>
+      </w:r>
+      <w:r>
+        <w:t xml:space="preserve"> thay cho “phụ lục”, và mỗi đợt ghi thêm </w:t>
+      </w:r>
+      <w:r>
+        <w:rPr>
+          <w:b/>
+          <w:bCs/>
+        </w:rPr>
+        <w:t xml:space="preserve">số hoá đơn</w:t>
+      </w:r>
+      <w:r>
+        <w:t xml:space="preserve"> kèm file scan. Hợp đồng đã nhập trước đó giữ nguyên, chỉ đổi tên gọi trên màn hình.</w:t>
+      </w:r>
+    </w:p>
+    <w:p>
+      <w:pPr>
+        <w:pStyle w:val="ListParagraph"/>
+        <w:numPr>
+          <w:ilvl w:val="0"/>
+          <w:numId w:val="3"/>
+        </w:numPr>
+        <w:spacing w:after="80"/>
+      </w:pPr>
+      <w:r>
+        <w:rPr>
+          <w:b/>
+          <w:bCs/>
+        </w:rPr>
+        <w:t xml:space="preserve">“Đã ký HĐ chưa giao” nay tính trên cả hợp đồng</w:t>
+      </w:r>
+      <w:r>
+        <w:t xml:space="preserve"> (trước chỉ tính phần đã chia thành đợt) nên con số này sẽ lớn hơn trước — đó là phần hàng đã ký bán mà chưa giao, kể cả chưa sản xuất.</w:t>
       </w:r>
     </w:p>
     <w:p>
@@ -315,7 +395,7 @@
         <w:t xml:space="preserve">Quản lý hợp đồng</w:t>
       </w:r>
       <w:r>
-        <w:t xml:space="preserve"> — Khách hàng · Hợp đồng &amp; phụ lục. Đây là nơi ghi việc bán hàng.</w:t>
+        <w:t xml:space="preserve"> — Khách hàng · Hợp đồng &amp; đợt giao. Đây là nơi ghi việc bán hàng.</w:t>
       </w:r>
     </w:p>
     <w:p>
@@ -1361,7 +1441,7 @@
         <w:pageBreakBefore/>
       </w:pPr>
       <w:r>
-        <w:t xml:space="preserve">7. Hợp đồng &amp; phụ lục — danh sách</w:t>
+        <w:t xml:space="preserve">7. Hợp đồng &amp; đợt giao — danh sách</w:t>
       </w:r>
     </w:p>
     <w:p>
@@ -1376,7 +1456,7 @@
         <w:t xml:space="preserve">Vị trí: </w:t>
       </w:r>
       <w:r>
-        <w:t xml:space="preserve">Quản lý hợp đồng → Hợp đồng &amp; phụ lục</w:t>
+        <w:t xml:space="preserve">Quản lý hợp đồng → Hợp đồng &amp; đợt giao</w:t>
       </w:r>
     </w:p>
     <w:p>
@@ -1384,7 +1464,7 @@
         <w:spacing w:after="140"/>
       </w:pPr>
       <w:r>
-        <w:t xml:space="preserve">Danh sách các hợp đồng mẹ kèm tiến độ giao hàng.</w:t>
+        <w:t xml:space="preserve">Danh sách các hợp đồng của đơn vị kèm tiến độ giao hàng.</w:t>
       </w:r>
     </w:p>
     <w:p>
@@ -1537,10 +1617,10 @@
           <w:b/>
           <w:bCs/>
         </w:rPr>
-        <w:t xml:space="preserve">Cam kết</w:t>
-      </w:r>
-      <w:r>
-        <w:t xml:space="preserve"> — tổng sản lượng ghi trên hợp đồng.</w:t>
+        <w:t xml:space="preserve">SL hợp đồng</w:t>
+      </w:r>
+      <w:r>
+        <w:t xml:space="preserve"> — tổng sản lượng ghi trên hợp đồng đã ký.</w:t>
       </w:r>
     </w:p>
     <w:p>
@@ -1560,7 +1640,7 @@
         <w:t xml:space="preserve">Đã giao</w:t>
       </w:r>
       <w:r>
-        <w:t xml:space="preserve"> — tổng của các phụ lục đã điền ngày giao.</w:t>
+        <w:t xml:space="preserve"> — tổng của các đợt giao đã điền ngày giao (kèm dòng *vượt …* nếu giao quá hợp đồng).</w:t>
       </w:r>
     </w:p>
     <w:p>
@@ -1577,10 +1657,10 @@
           <w:b/>
           <w:bCs/>
         </w:rPr>
-        <w:t xml:space="preserve">Chờ giao</w:t>
-      </w:r>
-      <w:r>
-        <w:t xml:space="preserve"> — đợt đã mở nhưng chưa tới ngày giao; đây chính là phần “đã ký HĐ chưa giao”.</w:t>
+        <w:t xml:space="preserve">Còn phải giao</w:t>
+      </w:r>
+      <w:r>
+        <w:t xml:space="preserve"> = SL hợp đồng − Đã giao. Đây chính là phần “đã ký HĐ chưa giao”; dòng nhỏ *chờ giao …* cho biết trong đó bao nhiêu đã lập đợt nhưng chưa điền ngày giao.</w:t>
       </w:r>
     </w:p>
     <w:p>
@@ -1597,10 +1677,10 @@
           <w:b/>
           <w:bCs/>
         </w:rPr>
-        <w:t xml:space="preserve">Chưa mở đợt</w:t>
-      </w:r>
-      <w:r>
-        <w:t xml:space="preserve"> — phần cam kết chưa được chia thành phụ lục nào.</w:t>
+        <w:t xml:space="preserve">Trạng thái</w:t>
+      </w:r>
+      <w:r>
+        <w:t xml:space="preserve"> — *Đang thực hiện* hay *Hoàn thành dd/mm/yyyy*. Hợp đồng đã hoàn thành không còn tính vào “đã ký HĐ chưa giao” và bị khoá sửa.</w:t>
       </w:r>
     </w:p>
     <w:p>
@@ -1613,7 +1693,27 @@
         <w:spacing w:after="80"/>
       </w:pPr>
       <w:r>
-        <w:t xml:space="preserve">Lọc theo </w:t>
+        <w:t xml:space="preserve">Bộ lọc </w:t>
+      </w:r>
+      <w:r>
+        <w:rPr>
+          <w:b/>
+          <w:bCs/>
+        </w:rPr>
+        <w:t xml:space="preserve">Trạng thái</w:t>
+      </w:r>
+      <w:r>
+        <w:t xml:space="preserve"> có thêm lựa chọn </w:t>
+      </w:r>
+      <w:r>
+        <w:rPr>
+          <w:b/>
+          <w:bCs/>
+        </w:rPr>
+        <w:t xml:space="preserve">Đã hoàn thành</w:t>
+      </w:r>
+      <w:r>
+        <w:t xml:space="preserve">; lọc theo </w:t>
       </w:r>
       <w:r>
         <w:rPr>
@@ -1623,27 +1723,7 @@
         <w:t xml:space="preserve">Khách hàng</w:t>
       </w:r>
       <w:r>
-        <w:t xml:space="preserve">: gõ vài chữ trong tên (hoặc mã khách) để tìm, chọn được </w:t>
-      </w:r>
-      <w:r>
-        <w:rPr>
-          <w:b/>
-          <w:bCs/>
-        </w:rPr>
-        <w:t xml:space="preserve">nhiều khách</w:t>
-      </w:r>
-      <w:r>
-        <w:t xml:space="preserve"> cùng lúc. Mỗi dòng hiện kèm </w:t>
-      </w:r>
-      <w:r>
-        <w:rPr>
-          <w:b/>
-          <w:bCs/>
-        </w:rPr>
-        <w:t xml:space="preserve">tên đơn vị</w:t>
-      </w:r>
-      <w:r>
-        <w:t xml:space="preserve"> sở hữu khách đó.</w:t>
+        <w:t xml:space="preserve"> thì gõ vài chữ trong tên (hoặc mã khách), chọn được nhiều khách cùng lúc.</w:t>
       </w:r>
     </w:p>
     <w:p>
@@ -1667,7 +1747,7 @@
         <w:t xml:space="preserve">Vị trí: </w:t>
       </w:r>
       <w:r>
-        <w:t xml:space="preserve">Quản lý hợp đồng → Hợp đồng &amp; phụ lục → Thêm hợp đồng</w:t>
+        <w:t xml:space="preserve">Quản lý hợp đồng → Hợp đồng &amp; đợt giao → Thêm hợp đồng</w:t>
       </w:r>
     </w:p>
     <w:p>
@@ -1801,7 +1881,7 @@
         <w:t xml:space="preserve">Loại hợp đồng</w:t>
       </w:r>
       <w:r>
-        <w:t xml:space="preserve"> — bắt buộc: “HĐ dài hạn” hay “HĐ chuyến”. Đây là chỉ tiêu của báo cáo, </w:t>
+        <w:t xml:space="preserve"> — bắt buộc: *HĐ dài hạn* hay *HĐ chuyến*. Đây là chỉ tiêu của báo cáo, </w:t>
       </w:r>
       <w:r>
         <w:rPr>
@@ -1831,7 +1911,7 @@
         <w:t xml:space="preserve">Loại giao</w:t>
       </w:r>
       <w:r>
-        <w:t xml:space="preserve"> — “Giao 1 lần” (cả hợp đồng giao trọn một lần) hay “Giao nhiều lần” (chia thành nhiều phụ lục).</w:t>
+        <w:t xml:space="preserve"> — *Giao 1 lần* (cả hợp đồng giao trọn một lần) hay *Giao nhiều lần* (chia thành nhiều đợt giao). Chọn nhầm vẫn đổi được sau, xem mục 9.</w:t>
       </w:r>
     </w:p>
     <w:p>
@@ -1851,7 +1931,7 @@
         <w:t xml:space="preserve">Ngày ký</w:t>
       </w:r>
       <w:r>
-        <w:t xml:space="preserve"> — bắt buộc.</w:t>
+        <w:t xml:space="preserve"> — bắt buộc. Từ ngày này, sản lượng hợp đồng nằm ở mục “đã ký HĐ chưa giao”.</w:t>
       </w:r>
     </w:p>
     <w:p>
@@ -1868,10 +1948,30 @@
           <w:b/>
           <w:bCs/>
         </w:rPr>
-        <w:t xml:space="preserve">Ngày bắt đầu (mở đợt)</w:t>
-      </w:r>
-      <w:r>
-        <w:t xml:space="preserve"> — ngày hàng bắt đầu gom vào kho cho đợt này; chỉ hiện với hợp đồng giao 1 lần.</w:t>
+        <w:t xml:space="preserve">Ngày giao</w:t>
+      </w:r>
+      <w:r>
+        <w:t xml:space="preserve"> — chỉ hiện với hợp đồng *giao 1 lần*; điền khi đã giao xong. Bên dưới là </w:t>
+      </w:r>
+      <w:r>
+        <w:rPr>
+          <w:b/>
+          <w:bCs/>
+        </w:rPr>
+        <w:t xml:space="preserve">Hình thức tiêu thụ</w:t>
+      </w:r>
+      <w:r>
+        <w:t xml:space="preserve"> và khối </w:t>
+      </w:r>
+      <w:r>
+        <w:rPr>
+          <w:b/>
+          <w:bCs/>
+        </w:rPr>
+        <w:t xml:space="preserve">Hoá đơn</w:t>
+      </w:r>
+      <w:r>
+        <w:t xml:space="preserve"> (số hoá đơn + file scan).</w:t>
       </w:r>
     </w:p>
     <w:p>
@@ -1970,6 +2070,46 @@
           <w:b/>
           <w:bCs/>
         </w:rPr>
+        <w:t xml:space="preserve">Không quản lý hợp đồng khung:</w:t>
+      </w:r>
+      <w:r>
+        <w:t xml:space="preserve"> đơn vị có hợp đồng dài hạn thì nhập </w:t>
+      </w:r>
+      <w:r>
+        <w:rPr>
+          <w:b/>
+          <w:bCs/>
+        </w:rPr>
+        <w:t xml:space="preserve">mỗi phụ lục như một hợp đồng</w:t>
+      </w:r>
+      <w:r>
+        <w:t xml:space="preserve"> và chọn loại </w:t>
+      </w:r>
+      <w:r>
+        <w:rPr>
+          <w:b/>
+          <w:bCs/>
+        </w:rPr>
+        <w:t xml:space="preserve">HĐ dài hạn</w:t>
+      </w:r>
+      <w:r>
+        <w:t xml:space="preserve"> để phân biệt.</w:t>
+      </w:r>
+    </w:p>
+    <w:p>
+      <w:pPr>
+        <w:pStyle w:val="ListParagraph"/>
+        <w:numPr>
+          <w:ilvl w:val="0"/>
+          <w:numId w:val="3"/>
+        </w:numPr>
+        <w:spacing w:after="80"/>
+      </w:pPr>
+      <w:r>
+        <w:rPr>
+          <w:b/>
+          <w:bCs/>
+        </w:rPr>
         <w:t xml:space="preserve">LATEX và 2 loại mủ nguyên liệu bán theo MỦ NƯỚC:</w:t>
       </w:r>
       <w:r>
@@ -2119,43 +2259,10 @@
           <w:b/>
           <w:bCs/>
         </w:rPr>
-        <w:t xml:space="preserve">giao 1 lần</w:t>
-      </w:r>
-      <w:r>
-        <w:t xml:space="preserve">: điền </w:t>
-      </w:r>
-      <w:r>
-        <w:rPr>
-          <w:b/>
-          <w:bCs/>
-        </w:rPr>
-        <w:t xml:space="preserve">Ngày giao</w:t>
-      </w:r>
-      <w:r>
-        <w:t xml:space="preserve"> ngay trên hợp đồng khi đã giao xong.</w:t>
-      </w:r>
-    </w:p>
-    <w:p>
-      <w:pPr>
-        <w:pStyle w:val="ListParagraph"/>
-        <w:numPr>
-          <w:ilvl w:val="0"/>
-          <w:numId w:val="3"/>
-        </w:numPr>
-        <w:spacing w:after="80"/>
-      </w:pPr>
-      <w:r>
-        <w:t xml:space="preserve">Hợp đồng </w:t>
-      </w:r>
-      <w:r>
-        <w:rPr>
-          <w:b/>
-          <w:bCs/>
-        </w:rPr>
         <w:t xml:space="preserve">giao nhiều lần</w:t>
       </w:r>
       <w:r>
-        <w:t xml:space="preserve">: không tự đánh dấu đã giao — mỗi lần giao nhập một phụ lục.</w:t>
+        <w:t xml:space="preserve"> không tự đánh dấu đã giao — mỗi lần giao nhập một đợt giao.</w:t>
       </w:r>
     </w:p>
     <w:p>
@@ -2179,17 +2286,7 @@
         <w:t xml:space="preserve">Vị trí: </w:t>
       </w:r>
       <w:r>
-        <w:t xml:space="preserve">Quản lý hợp đồng → Hợp đồng &amp; phụ lục → bấm </w:t>
-      </w:r>
-      <w:r>
-        <w:rPr>
-          <w:b/>
-          <w:bCs/>
-        </w:rPr>
-        <w:t xml:space="preserve">Xem</w:t>
-      </w:r>
-      <w:r>
-        <w:t xml:space="preserve"> ở dòng hợp đồng</w:t>
+        <w:t xml:space="preserve">Quản lý hợp đồng → Hợp đồng &amp; đợt giao → bấm Xem ở dòng hợp đồng</w:t>
       </w:r>
     </w:p>
     <w:p>
@@ -2197,7 +2294,7 @@
         <w:spacing w:after="140"/>
       </w:pPr>
       <w:r>
-        <w:t xml:space="preserve">Nơi theo dõi tiến độ một hợp đồng và nhập các lần giao của nó.</w:t>
+        <w:t xml:space="preserve">Nơi theo dõi tiến độ một hợp đồng, nhập các đợt giao và chốt hợp đồng khi kết thúc.</w:t>
       </w:r>
     </w:p>
     <w:p>
@@ -2291,7 +2388,7 @@
         <w:t xml:space="preserve">Hàng số liệu</w:t>
       </w:r>
       <w:r>
-        <w:t xml:space="preserve"> — khách hàng, loại hợp đồng, sản lượng cam kết, đã giao, đang chờ giao, chưa mở đợt. Luôn hiện dù đang ở tab nào.</w:t>
+        <w:t xml:space="preserve"> — khách hàng, loại hợp đồng, sản lượng hợp đồng, đã giao, còn phải giao, trạng thái. Luôn hiện dù đang ở tab nào.</w:t>
       </w:r>
     </w:p>
     <w:p>
@@ -2308,6 +2405,66 @@
           <w:b/>
           <w:bCs/>
         </w:rPr>
+        <w:t xml:space="preserve">Chuyển sang giao nhiều lần / Chuyển về giao 1 lần</w:t>
+      </w:r>
+      <w:r>
+        <w:t xml:space="preserve"> — đổi loại giao ngay tại đây, </w:t>
+      </w:r>
+      <w:r>
+        <w:rPr>
+          <w:b/>
+          <w:bCs/>
+        </w:rPr>
+        <w:t xml:space="preserve">không phải xoá hợp đồng nhập lại</w:t>
+      </w:r>
+      <w:r>
+        <w:t xml:space="preserve">. Hợp đồng giao-1-lần đã ghi ngày giao thì lần giao đó tự chuyển thành </w:t>
+      </w:r>
+      <w:r>
+        <w:rPr>
+          <w:b/>
+          <w:bCs/>
+        </w:rPr>
+        <w:t xml:space="preserve">đợt giao đầu tiên</w:t>
+      </w:r>
+      <w:r>
+        <w:t xml:space="preserve"> (giữ nguyên ngày giao, hoá đơn, thanh toán, chi tiết hàng).</w:t>
+      </w:r>
+    </w:p>
+    <w:p>
+      <w:pPr>
+        <w:pStyle w:val="ListParagraph"/>
+        <w:numPr>
+          <w:ilvl w:val="0"/>
+          <w:numId w:val="11"/>
+        </w:numPr>
+        <w:spacing w:after="100"/>
+      </w:pPr>
+      <w:r>
+        <w:rPr>
+          <w:b/>
+          <w:bCs/>
+        </w:rPr>
+        <w:t xml:space="preserve">Hoàn thành hợp đồng</w:t>
+      </w:r>
+      <w:r>
+        <w:t xml:space="preserve"> — chốt thời điểm kết thúc (xem mục 11).</w:t>
+      </w:r>
+    </w:p>
+    <w:p>
+      <w:pPr>
+        <w:pStyle w:val="ListParagraph"/>
+        <w:numPr>
+          <w:ilvl w:val="0"/>
+          <w:numId w:val="11"/>
+        </w:numPr>
+        <w:spacing w:after="100"/>
+      </w:pPr>
+      <w:r>
+        <w:rPr>
+          <w:b/>
+          <w:bCs/>
+        </w:rPr>
         <w:t xml:space="preserve">Tab Thông tin hợp đồng</w:t>
       </w:r>
       <w:r>
@@ -2328,7 +2485,7 @@
           <w:b/>
           <w:bCs/>
         </w:rPr>
-        <w:t xml:space="preserve">Tab Phụ lục</w:t>
+        <w:t xml:space="preserve">Tab Đợt giao</w:t>
       </w:r>
       <w:r>
         <w:t xml:space="preserve"> — danh sách các lần giao; hợp đồng giao nhiều lần mở thẳng vào tab này.</w:t>
@@ -2348,7 +2505,7 @@
           <w:b/>
           <w:bCs/>
         </w:rPr>
-        <w:t xml:space="preserve">Thêm phụ lục</w:t>
+        <w:t xml:space="preserve">Thêm đợt giao</w:t>
       </w:r>
       <w:r>
         <w:t xml:space="preserve"> — ghi một lần giao mới (xem mục 10).</w:t>
@@ -2386,7 +2543,7 @@
         <w:t xml:space="preserve">giao 1 lần</w:t>
       </w:r>
       <w:r>
-        <w:t xml:space="preserve"> không có tab Phụ lục: chính hợp đồng là một lần giao.</w:t>
+        <w:t xml:space="preserve"> không có tab Đợt giao: chính hợp đồng là một lần giao.</w:t>
       </w:r>
     </w:p>
     <w:p>
@@ -2399,7 +2556,50 @@
         <w:spacing w:after="80"/>
       </w:pPr>
       <w:r>
-        <w:t xml:space="preserve">Nút Thêm phụ lục mờ đi khi đã giao đủ sản lượng cam kết.</w:t>
+        <w:t xml:space="preserve">Chỉ chuyển được </w:t>
+      </w:r>
+      <w:r>
+        <w:rPr>
+          <w:b/>
+          <w:bCs/>
+        </w:rPr>
+        <w:t xml:space="preserve">về</w:t>
+      </w:r>
+      <w:r>
+        <w:t xml:space="preserve"> giao 1 lần khi hợp đồng chưa có đợt giao nào.</w:t>
+      </w:r>
+    </w:p>
+    <w:p>
+      <w:pPr>
+        <w:pStyle w:val="ListParagraph"/>
+        <w:numPr>
+          <w:ilvl w:val="0"/>
+          <w:numId w:val="3"/>
+        </w:numPr>
+        <w:spacing w:after="80"/>
+      </w:pPr>
+      <w:r>
+        <w:t xml:space="preserve">Hợp đồng </w:t>
+      </w:r>
+      <w:r>
+        <w:rPr>
+          <w:b/>
+          <w:bCs/>
+        </w:rPr>
+        <w:t xml:space="preserve">đã hoàn thành</w:t>
+      </w:r>
+      <w:r>
+        <w:t xml:space="preserve"> chỉ còn nút </w:t>
+      </w:r>
+      <w:r>
+        <w:rPr>
+          <w:b/>
+          <w:bCs/>
+        </w:rPr>
+        <w:t xml:space="preserve">Mở lại hợp đồng</w:t>
+      </w:r>
+      <w:r>
+        <w:t xml:space="preserve">; muốn sửa hay thêm đợt giao thì phải mở lại trước.</w:t>
       </w:r>
     </w:p>
     <w:p>
@@ -2408,7 +2608,7 @@
         <w:pageBreakBefore/>
       </w:pPr>
       <w:r>
-        <w:t xml:space="preserve">10. Thêm phụ lục — mỗi phụ lục là một lần giao</w:t>
+        <w:t xml:space="preserve">10. Thêm đợt giao — mỗi đợt là một lần giao</w:t>
       </w:r>
     </w:p>
     <w:p>
@@ -2423,7 +2623,7 @@
         <w:t xml:space="preserve">Vị trí: </w:t>
       </w:r>
       <w:r>
-        <w:t xml:space="preserve">Màn chi tiết hợp đồng (mục 9) → tab Phụ lục → Thêm phụ lục</w:t>
+        <w:t xml:space="preserve">Màn chi tiết hợp đồng (mục 9) → tab Đợt giao → Thêm đợt giao</w:t>
       </w:r>
     </w:p>
     <w:p>
@@ -2431,7 +2631,7 @@
         <w:spacing w:after="140"/>
       </w:pPr>
       <w:r>
-        <w:t xml:space="preserve">Mỗi phụ lục = một đợt giao + một lần thanh toán. Đây là cách ghi nhận tiêu thụ của cơ chế mới.</w:t>
+        <w:t xml:space="preserve">Mỗi đợt giao = một lần giao hàng + một lần thanh toán. Đây là cách ghi nhận tiêu thụ của cơ chế mới.</w:t>
       </w:r>
     </w:p>
     <w:p>
@@ -2444,7 +2644,7 @@
           <wp:inline distT="0" distB="0" distL="0" distR="0">
             <wp:extent cx="6191250" cy="3381375"/>
             <wp:effectExtent t="0" r="0" b="0" l="0"/>
-            <wp:docPr id="1" name="img" descr="Ảnh hướng dẫn có đánh số bước" title="img/09-phu-luc-form.png"/>
+            <wp:docPr id="1" name="img" descr="Ảnh hướng dẫn có đánh số bước" title="img/09-dot-giao-form.png"/>
             <wp:cNvGraphicFramePr>
               <a:graphicFrameLocks xmlns:a="http://schemas.openxmlformats.org/drawingml/2006/main" noChangeAspect="1"/>
             </wp:cNvGraphicFramePr>
@@ -2493,7 +2693,7 @@
           <w:sz w:val="17"/>
           <w:szCs w:val="17"/>
         </w:rPr>
-        <w:t xml:space="preserve">Hình 9. Phiếu thêm phụ lục</w:t>
+        <w:t xml:space="preserve">Hình 9. Phiếu thêm đợt giao</w:t>
       </w:r>
     </w:p>
     <w:p>
@@ -2522,10 +2722,10 @@
           <w:b/>
           <w:bCs/>
         </w:rPr>
-        <w:t xml:space="preserve">Số phụ lục</w:t>
-      </w:r>
-      <w:r>
-        <w:t xml:space="preserve"> — bắt buộc.</w:t>
+        <w:t xml:space="preserve">Số đợt giao</w:t>
+      </w:r>
+      <w:r>
+        <w:t xml:space="preserve"> — bắt buộc, không trùng trong cùng đơn vị (ví dụ *Đợt 01/HĐ-102*).</w:t>
       </w:r>
     </w:p>
     <w:p>
@@ -2542,10 +2742,30 @@
           <w:b/>
           <w:bCs/>
         </w:rPr>
-        <w:t xml:space="preserve">Ngày bắt đầu (mở đợt)</w:t>
-      </w:r>
-      <w:r>
-        <w:t xml:space="preserve"> — bắt buộc; từ ngày này hàng của đợt nằm ở “đã ký HĐ chưa giao”.</w:t>
+        <w:t xml:space="preserve">Ngày giao</w:t>
+      </w:r>
+      <w:r>
+        <w:t xml:space="preserve"> — để trống nghĩa là </w:t>
+      </w:r>
+      <w:r>
+        <w:rPr>
+          <w:b/>
+          <w:bCs/>
+        </w:rPr>
+        <w:t xml:space="preserve">đang chờ giao</w:t>
+      </w:r>
+      <w:r>
+        <w:t xml:space="preserve">; điền vào là đợt đã giao xong và </w:t>
+      </w:r>
+      <w:r>
+        <w:rPr>
+          <w:b/>
+          <w:bCs/>
+        </w:rPr>
+        <w:t xml:space="preserve">tính ngay vào tiêu thụ của ngày đó</w:t>
+      </w:r>
+      <w:r>
+        <w:t xml:space="preserve">.</w:t>
       </w:r>
     </w:p>
     <w:p>
@@ -2562,27 +2782,122 @@
           <w:b/>
           <w:bCs/>
         </w:rPr>
-        <w:t xml:space="preserve">Ngày giao</w:t>
-      </w:r>
-      <w:r>
-        <w:t xml:space="preserve"> — để trống nghĩa là </w:t>
-      </w:r>
-      <w:r>
-        <w:rPr>
-          <w:b/>
-          <w:bCs/>
-        </w:rPr>
-        <w:t xml:space="preserve">đang chờ giao</w:t>
-      </w:r>
-      <w:r>
-        <w:t xml:space="preserve">; điền vào là đợt đã giao xong và </w:t>
-      </w:r>
-      <w:r>
-        <w:rPr>
-          <w:b/>
-          <w:bCs/>
-        </w:rPr>
-        <w:t xml:space="preserve">tính ngay vào tiêu thụ của ngày đó</w:t>
+        <w:t xml:space="preserve">Hình thức tiêu thụ</w:t>
+      </w:r>
+      <w:r>
+        <w:t xml:space="preserve"> — *Xuất khẩu / UTXK* · *Tiêu thụ trong nước* · *Tiêu thụ nội bộ*. Bắt buộc khi đã giao.</w:t>
+      </w:r>
+    </w:p>
+    <w:p>
+      <w:pPr>
+        <w:pStyle w:val="ListParagraph"/>
+        <w:numPr>
+          <w:ilvl w:val="0"/>
+          <w:numId w:val="12"/>
+        </w:numPr>
+        <w:spacing w:after="100"/>
+      </w:pPr>
+      <w:r>
+        <w:rPr>
+          <w:b/>
+          <w:bCs/>
+        </w:rPr>
+        <w:t xml:space="preserve">Chi tiết đợt giao</w:t>
+      </w:r>
+      <w:r>
+        <w:t xml:space="preserve"> — chủng loại, sản lượng, đơn giá thực tế của lần giao này. Ô Quy khô và Tỷ giá chỉ hiện khi áp dụng, giống phiếu hợp đồng.</w:t>
+      </w:r>
+    </w:p>
+    <w:p>
+      <w:pPr>
+        <w:pStyle w:val="ListParagraph"/>
+        <w:numPr>
+          <w:ilvl w:val="0"/>
+          <w:numId w:val="12"/>
+        </w:numPr>
+        <w:spacing w:after="100"/>
+      </w:pPr>
+      <w:r>
+        <w:rPr>
+          <w:b/>
+          <w:bCs/>
+        </w:rPr>
+        <w:t xml:space="preserve">Số hoá đơn</w:t>
+      </w:r>
+      <w:r>
+        <w:t xml:space="preserve"> + </w:t>
+      </w:r>
+      <w:r>
+        <w:rPr>
+          <w:b/>
+          <w:bCs/>
+        </w:rPr>
+        <w:t xml:space="preserve">Hoá đơn (scan)</w:t>
+      </w:r>
+      <w:r>
+        <w:t xml:space="preserve"> — số hoá đơn bán hàng của đợt và file đính kèm.</w:t>
+      </w:r>
+    </w:p>
+    <w:p>
+      <w:pPr>
+        <w:pStyle w:val="ListParagraph"/>
+        <w:numPr>
+          <w:ilvl w:val="0"/>
+          <w:numId w:val="12"/>
+        </w:numPr>
+        <w:spacing w:after="100"/>
+      </w:pPr>
+      <w:r>
+        <w:rPr>
+          <w:b/>
+          <w:bCs/>
+        </w:rPr>
+        <w:t xml:space="preserve">Thanh toán</w:t>
+      </w:r>
+      <w:r>
+        <w:t xml:space="preserve"> — ngày thanh toán, sản lượng của lần thanh toán, kèm chứng từ.</w:t>
+      </w:r>
+    </w:p>
+    <w:p>
+      <w:pPr>
+        <w:spacing w:after="80" w:before="140"/>
+      </w:pPr>
+      <w:r>
+        <w:rPr>
+          <w:b/>
+          <w:bCs/>
+        </w:rPr>
+        <w:t xml:space="preserve">Lưu ý:</w:t>
+      </w:r>
+    </w:p>
+    <w:p>
+      <w:pPr>
+        <w:pStyle w:val="ListParagraph"/>
+        <w:numPr>
+          <w:ilvl w:val="0"/>
+          <w:numId w:val="3"/>
+        </w:numPr>
+        <w:spacing w:after="80"/>
+      </w:pPr>
+      <w:r>
+        <w:t xml:space="preserve">Phiếu hiện sẵn dòng *Còn phải giao theo hợp đồng … · tối đa nhập được …*. Sản lượng thực giao </w:t>
+      </w:r>
+      <w:r>
+        <w:rPr>
+          <w:b/>
+          <w:bCs/>
+        </w:rPr>
+        <w:t xml:space="preserve">được phép lệch</w:t>
+      </w:r>
+      <w:r>
+        <w:t xml:space="preserve"> so với hợp đồng: vượt thì có cảnh báo vàng nhưng vẫn lưu, </w:t>
+      </w:r>
+      <w:r>
+        <w:rPr>
+          <w:b/>
+          <w:bCs/>
+        </w:rPr>
+        <w:t xml:space="preserve">quá 110% sản lượng hợp đồng mới bị chặn</w:t>
       </w:r>
       <w:r>
         <w:t xml:space="preserve">.</w:t>
@@ -2593,94 +2908,19 @@
         <w:pStyle w:val="ListParagraph"/>
         <w:numPr>
           <w:ilvl w:val="0"/>
-          <w:numId w:val="12"/>
-        </w:numPr>
-        <w:spacing w:after="100"/>
-      </w:pPr>
-      <w:r>
-        <w:rPr>
-          <w:b/>
-          <w:bCs/>
-        </w:rPr>
-        <w:t xml:space="preserve">Hình thức tiêu thụ</w:t>
-      </w:r>
-      <w:r>
-        <w:t xml:space="preserve"> — “Xuất khẩu / UTXK” · “Tiêu thụ trong nước” · “Tiêu thụ nội bộ”. Bắt buộc khi đã giao.</w:t>
-      </w:r>
-    </w:p>
-    <w:p>
-      <w:pPr>
-        <w:pStyle w:val="ListParagraph"/>
-        <w:numPr>
-          <w:ilvl w:val="0"/>
-          <w:numId w:val="12"/>
-        </w:numPr>
-        <w:spacing w:after="100"/>
-      </w:pPr>
-      <w:r>
-        <w:rPr>
-          <w:b/>
-          <w:bCs/>
-        </w:rPr>
-        <w:t xml:space="preserve">Chi tiết lần giao</w:t>
-      </w:r>
-      <w:r>
-        <w:t xml:space="preserve"> — chủng loại, sản lượng, đơn giá thực tế của lần giao này. Ô Quy khô và Tỷ giá chỉ hiện khi áp dụng, giống phiếu hợp đồng.</w:t>
-      </w:r>
-    </w:p>
-    <w:p>
-      <w:pPr>
-        <w:pStyle w:val="ListParagraph"/>
-        <w:numPr>
-          <w:ilvl w:val="0"/>
-          <w:numId w:val="12"/>
-        </w:numPr>
-        <w:spacing w:after="100"/>
-      </w:pPr>
-      <w:r>
-        <w:rPr>
-          <w:b/>
-          <w:bCs/>
-        </w:rPr>
-        <w:t xml:space="preserve">Thanh toán</w:t>
-      </w:r>
-      <w:r>
-        <w:t xml:space="preserve"> — ngày thanh toán, sản lượng của lần thanh toán, kèm chứng từ/hoá đơn.</w:t>
-      </w:r>
-    </w:p>
-    <w:p>
-      <w:pPr>
-        <w:spacing w:after="80" w:before="140"/>
-      </w:pPr>
-      <w:r>
-        <w:rPr>
-          <w:b/>
-          <w:bCs/>
-        </w:rPr>
-        <w:t xml:space="preserve">Lưu ý:</w:t>
-      </w:r>
-    </w:p>
-    <w:p>
-      <w:pPr>
-        <w:pStyle w:val="ListParagraph"/>
-        <w:numPr>
-          <w:ilvl w:val="0"/>
           <w:numId w:val="3"/>
         </w:numPr>
         <w:spacing w:after="80"/>
       </w:pPr>
       <w:r>
-        <w:t xml:space="preserve">Tổng sản lượng các phụ lục </w:t>
-      </w:r>
-      <w:r>
-        <w:rPr>
-          <w:b/>
-          <w:bCs/>
-        </w:rPr>
-        <w:t xml:space="preserve">không được vượt</w:t>
-      </w:r>
-      <w:r>
-        <w:t xml:space="preserve"> cam kết của hợp đồng mẹ; phiếu hiện sẵn dòng “Còn lại của hợp đồng mẹ”.</w:t>
+        <w:rPr>
+          <w:b/>
+          <w:bCs/>
+        </w:rPr>
+        <w:t xml:space="preserve">Tiêu thụ nội bộ</w:t>
+      </w:r>
+      <w:r>
+        <w:t xml:space="preserve"> chỉ hiện khi đơn vị thuộc một nhóm công ty mẹ–con, và chỉ chọn được đơn vị trong cùng nhóm.</w:t>
       </w:r>
     </w:p>
     <w:p>
@@ -2697,10 +2937,10 @@
           <w:b/>
           <w:bCs/>
         </w:rPr>
-        <w:t xml:space="preserve">Tiêu thụ nội bộ</w:t>
-      </w:r>
-      <w:r>
-        <w:t xml:space="preserve"> chỉ hiện khi đơn vị thuộc một nhóm công ty mẹ–con, và chỉ chọn được đơn vị trong cùng nhóm.</w:t>
+        <w:t xml:space="preserve">Thành tiền</w:t>
+      </w:r>
+      <w:r>
+        <w:t xml:space="preserve"> của mỗi dòng = số lượng × đơn giá, hệ thống tự tính (không nhập tay); tổng của cả đợt hiện ngay dưới bảng chi tiết.</w:t>
       </w:r>
     </w:p>
     <w:p>
@@ -2713,26 +2953,6 @@
         <w:spacing w:after="80"/>
       </w:pPr>
       <w:r>
-        <w:rPr>
-          <w:b/>
-          <w:bCs/>
-        </w:rPr>
-        <w:t xml:space="preserve">Thành tiền</w:t>
-      </w:r>
-      <w:r>
-        <w:t xml:space="preserve"> của mỗi dòng = số lượng × đơn giá, hệ thống tự tính (không nhập tay); tổng của cả hợp đồng hiện ngay dưới bảng chi tiết.</w:t>
-      </w:r>
-    </w:p>
-    <w:p>
-      <w:pPr>
-        <w:pStyle w:val="ListParagraph"/>
-        <w:numPr>
-          <w:ilvl w:val="0"/>
-          <w:numId w:val="3"/>
-        </w:numPr>
-        <w:spacing w:after="80"/>
-      </w:pPr>
-      <w:r>
         <w:t xml:space="preserve">Lần giao đã ghi quá </w:t>
       </w:r>
       <w:r>
@@ -2753,7 +2973,7 @@
         <w:t xml:space="preserve">chỉ xem</w:t>
       </w:r>
       <w:r>
-        <w:t xml:space="preserve"> (dòng hiện “(chỉ xem)” thay cho nút Sửa/Xoá) — kỳ báo cáo đã chốt thì không sửa lùi được nữa. Hợp đồng mẹ </w:t>
+        <w:t xml:space="preserve"> (dòng hiện “(chỉ xem)” thay cho nút Sửa/Xoá). Hợp đồng </w:t>
       </w:r>
       <w:r>
         <w:rPr>
@@ -2763,7 +2983,7 @@
         <w:t xml:space="preserve">không</w:t>
       </w:r>
       <w:r>
-        <w:t xml:space="preserve"> bị khoá, vẫn thêm phụ lục mới bình thường.</w:t>
+        <w:t xml:space="preserve"> bị khoá, vẫn thêm đợt giao mới bình thường.</w:t>
       </w:r>
     </w:p>
     <w:p>
@@ -2772,7 +2992,7 @@
         <w:pageBreakBefore/>
       </w:pPr>
       <w:r>
-        <w:t xml:space="preserve">11. Báo cáo tiêu thụ</w:t>
+        <w:t xml:space="preserve">11. Hoàn thành hợp đồng</w:t>
       </w:r>
     </w:p>
     <w:p>
@@ -2787,7 +3007,7 @@
         <w:t xml:space="preserve">Vị trí: </w:t>
       </w:r>
       <w:r>
-        <w:t xml:space="preserve">Báo cáo → Tiêu thụ</w:t>
+        <w:t xml:space="preserve">Màn chi tiết hợp đồng (mục 9) → Hoàn thành hợp đồng</w:t>
       </w:r>
     </w:p>
     <w:p>
@@ -2795,7 +3015,7 @@
         <w:spacing w:after="140"/>
       </w:pPr>
       <w:r>
-        <w:t xml:space="preserve">Bảng chỉ để xem — số do hệ thống tổng hợp từ các lần giao, đơn vị không nhập tay.</w:t>
+        <w:t xml:space="preserve">Sản lượng thực giao thường lệch vài phần trăm so với hợp đồng đã ký. Khi hai bên đã kết thúc hợp đồng, bấm Hoàn thành hợp đồng để chốt lại — phần chênh còn lại thôi không nằm ở “đã ký HĐ chưa giao” nữa.</w:t>
       </w:r>
     </w:p>
     <w:p>
@@ -2808,7 +3028,7 @@
           <wp:inline distT="0" distB="0" distL="0" distR="0">
             <wp:extent cx="6191250" cy="3381375"/>
             <wp:effectExtent t="0" r="0" b="0" l="0"/>
-            <wp:docPr id="1" name="img" descr="Ảnh hướng dẫn có đánh số bước" title="img/10-bao-cao-tieu-thu.png"/>
+            <wp:docPr id="1" name="img" descr="Ảnh hướng dẫn có đánh số bước" title="img/10-hoan-thanh-hop-dong.png"/>
             <wp:cNvGraphicFramePr>
               <a:graphicFrameLocks xmlns:a="http://schemas.openxmlformats.org/drawingml/2006/main" noChangeAspect="1"/>
             </wp:cNvGraphicFramePr>
@@ -2857,7 +3077,7 @@
           <w:sz w:val="17"/>
           <w:szCs w:val="17"/>
         </w:rPr>
-        <w:t xml:space="preserve">Hình 10. Báo cáo tiêu thụ theo kỳ</w:t>
+        <w:t xml:space="preserve">Hình 10. Chốt hoàn thành hợp đồng</w:t>
       </w:r>
     </w:p>
     <w:p>
@@ -2886,30 +3106,10 @@
           <w:b/>
           <w:bCs/>
         </w:rPr>
-        <w:t xml:space="preserve">Bộ lọc</w:t>
-      </w:r>
-      <w:r>
-        <w:t xml:space="preserve"> — Từ ngày / Đến ngày · Đơn vị · </w:t>
-      </w:r>
-      <w:r>
-        <w:rPr>
-          <w:b/>
-          <w:bCs/>
-        </w:rPr>
-        <w:t xml:space="preserve">Khách hàng</w:t>
-      </w:r>
-      <w:r>
-        <w:t xml:space="preserve"> (gõ để tìm, chọn nhiều) · </w:t>
-      </w:r>
-      <w:r>
-        <w:rPr>
-          <w:b/>
-          <w:bCs/>
-        </w:rPr>
-        <w:t xml:space="preserve">Chủng loại</w:t>
-      </w:r>
-      <w:r>
-        <w:t xml:space="preserve"> (chọn nhiều). Bảng, khối theo khách hàng và file Excel đều theo bộ lọc này.</w:t>
+        <w:t xml:space="preserve">Bảng đối chiếu</w:t>
+      </w:r>
+      <w:r>
+        <w:t xml:space="preserve"> — sản lượng hợp đồng, đã giao (kèm tỷ lệ thực hiện) và phần còn phải giao.</w:t>
       </w:r>
     </w:p>
     <w:p>
@@ -2926,20 +3126,30 @@
           <w:b/>
           <w:bCs/>
         </w:rPr>
-        <w:t xml:space="preserve">Bảng tổng hợp</w:t>
-      </w:r>
-      <w:r>
-        <w:t xml:space="preserve"> — Lần giao · SL · Quy khô · Xuất khẩu · Trong nước · Nội bộ · Doanh thu · </w:t>
-      </w:r>
-      <w:r>
-        <w:rPr>
-          <w:b/>
-          <w:bCs/>
-        </w:rPr>
-        <w:t xml:space="preserve">Chưa giao</w:t>
-      </w:r>
-      <w:r>
-        <w:t xml:space="preserve">.</w:t>
+        <w:t xml:space="preserve">Ngày hoàn thành</w:t>
+      </w:r>
+      <w:r>
+        <w:t xml:space="preserve"> — mặc định là hôm nay; phải từ ngày giao gần nhất trở đi và không được ở tương lai.</w:t>
+      </w:r>
+    </w:p>
+    <w:p>
+      <w:pPr>
+        <w:pStyle w:val="ListParagraph"/>
+        <w:numPr>
+          <w:ilvl w:val="0"/>
+          <w:numId w:val="13"/>
+        </w:numPr>
+        <w:spacing w:after="100"/>
+      </w:pPr>
+      <w:r>
+        <w:rPr>
+          <w:b/>
+          <w:bCs/>
+        </w:rPr>
+        <w:t xml:space="preserve">Hoàn thành</w:t>
+      </w:r>
+      <w:r>
+        <w:t xml:space="preserve"> — chốt hợp đồng. Từ ngày này, phần chưa giao rời khỏi “đã ký HĐ chưa giao”.</w:t>
       </w:r>
     </w:p>
     <w:p>
@@ -2964,27 +3174,17 @@
         <w:spacing w:after="80"/>
       </w:pPr>
       <w:r>
-        <w:t xml:space="preserve">Cột </w:t>
-      </w:r>
-      <w:r>
-        <w:rPr>
-          <w:b/>
-          <w:bCs/>
-        </w:rPr>
-        <w:t xml:space="preserve">SL (tấn)</w:t>
-      </w:r>
-      <w:r>
-        <w:t xml:space="preserve"> là sản lượng tiêu thụ thực tế: latex và mủ nguyên liệu tính theo </w:t>
-      </w:r>
-      <w:r>
-        <w:rPr>
-          <w:b/>
-          <w:bCs/>
-        </w:rPr>
-        <w:t xml:space="preserve">quy khô</w:t>
-      </w:r>
-      <w:r>
-        <w:t xml:space="preserve">, các chủng loại thành phẩm tính theo chính số lượng bán.</w:t>
+        <w:t xml:space="preserve">Chỉ chốt khi </w:t>
+      </w:r>
+      <w:r>
+        <w:rPr>
+          <w:b/>
+          <w:bCs/>
+        </w:rPr>
+        <w:t xml:space="preserve">thật sự kết thúc hợp đồng</w:t>
+      </w:r>
+      <w:r>
+        <w:t xml:space="preserve">. Còn giao tiếp thì để nguyên — chốt rồi hợp đồng bị khoá, không thêm/sửa đợt giao được nữa.</w:t>
       </w:r>
     </w:p>
     <w:p>
@@ -2997,47 +3197,17 @@
         <w:spacing w:after="80"/>
       </w:pPr>
       <w:r>
-        <w:t xml:space="preserve">Chọn </w:t>
-      </w:r>
-      <w:r>
-        <w:rPr>
-          <w:b/>
-          <w:bCs/>
-        </w:rPr>
-        <w:t xml:space="preserve">Từ ngày / Đến ngày</w:t>
-      </w:r>
-      <w:r>
-        <w:t xml:space="preserve"> để đổi kỳ; lọc thêm theo </w:t>
-      </w:r>
-      <w:r>
-        <w:rPr>
-          <w:b/>
-          <w:bCs/>
-        </w:rPr>
-        <w:t xml:space="preserve">Khách hàng</w:t>
-      </w:r>
-      <w:r>
-        <w:t xml:space="preserve"> và </w:t>
-      </w:r>
-      <w:r>
-        <w:rPr>
-          <w:b/>
-          <w:bCs/>
-        </w:rPr>
-        <w:t xml:space="preserve">Chủng loại</w:t>
-      </w:r>
-      <w:r>
-        <w:t xml:space="preserve"> (gõ để tìm, chọn được nhiều khách) và theo </w:t>
-      </w:r>
-      <w:r>
-        <w:rPr>
-          <w:b/>
-          <w:bCs/>
-        </w:rPr>
-        <w:t xml:space="preserve">Chủng loại</w:t>
-      </w:r>
-      <w:r>
-        <w:t xml:space="preserve"> nếu cần.</w:t>
+        <w:t xml:space="preserve">Bấm nhầm thì vào lại màn chi tiết bấm </w:t>
+      </w:r>
+      <w:r>
+        <w:rPr>
+          <w:b/>
+          <w:bCs/>
+        </w:rPr>
+        <w:t xml:space="preserve">Mở lại hợp đồng</w:t>
+      </w:r>
+      <w:r>
+        <w:t xml:space="preserve">, mọi số liệu trở về như cũ.</w:t>
       </w:r>
     </w:p>
     <w:p>
@@ -3050,83 +3220,17 @@
         <w:spacing w:after="80"/>
       </w:pPr>
       <w:r>
-        <w:t xml:space="preserve">Cột </w:t>
-      </w:r>
-      <w:r>
-        <w:rPr>
-          <w:b/>
-          <w:bCs/>
-        </w:rPr>
-        <w:t xml:space="preserve">Chưa giao</w:t>
-      </w:r>
-      <w:r>
-        <w:t xml:space="preserve"> là số </w:t>
-      </w:r>
-      <w:r>
-        <w:rPr>
-          <w:b/>
-          <w:bCs/>
-        </w:rPr>
-        <w:t xml:space="preserve">tại ngày cuối kỳ</w:t>
-      </w:r>
-      <w:r>
-        <w:t xml:space="preserve">, không phải số cộng dồn.</w:t>
-      </w:r>
-    </w:p>
-    <w:p>
-      <w:pPr>
-        <w:pStyle w:val="ListParagraph"/>
-        <w:numPr>
-          <w:ilvl w:val="0"/>
-          <w:numId w:val="3"/>
-        </w:numPr>
-        <w:spacing w:after="80"/>
-      </w:pPr>
-      <w:r>
-        <w:t xml:space="preserve">Khối </w:t>
-      </w:r>
-      <w:r>
-        <w:rPr>
-          <w:b/>
-          <w:bCs/>
-        </w:rPr>
-        <w:t xml:space="preserve">Theo khách hàng</w:t>
-      </w:r>
-      <w:r>
-        <w:t xml:space="preserve"> bên dưới tách sản lượng và doanh thu theo từng khách.</w:t>
-      </w:r>
-    </w:p>
-    <w:p>
-      <w:pPr>
-        <w:pStyle w:val="ListParagraph"/>
-        <w:numPr>
-          <w:ilvl w:val="0"/>
-          <w:numId w:val="3"/>
-        </w:numPr>
-        <w:spacing w:after="80"/>
-      </w:pPr>
-      <w:r>
-        <w:rPr>
-          <w:b/>
-          <w:bCs/>
-        </w:rPr>
-        <w:t xml:space="preserve">Xuất Excel</w:t>
-      </w:r>
-      <w:r>
-        <w:t xml:space="preserve"> để lấy đúng bảng đang xem.</w:t>
-      </w:r>
-    </w:p>
-    <w:p>
-      <w:pPr>
-        <w:pStyle w:val="ListParagraph"/>
-        <w:numPr>
-          <w:ilvl w:val="0"/>
-          <w:numId w:val="3"/>
-        </w:numPr>
-        <w:spacing w:after="80"/>
-      </w:pPr>
-      <w:r>
-        <w:t xml:space="preserve">Doanh thu hiện “—” khi có lần giao bán ngoại tệ mà chưa nhập tỷ giá — bổ sung tỷ giá trên phụ lục để có số đầy đủ.</w:t>
+        <w:t xml:space="preserve">Nếu còn đợt </w:t>
+      </w:r>
+      <w:r>
+        <w:rPr>
+          <w:b/>
+          <w:bCs/>
+        </w:rPr>
+        <w:t xml:space="preserve">chưa điền ngày giao</w:t>
+      </w:r>
+      <w:r>
+        <w:t xml:space="preserve">, màn này báo bằng khung vàng — điền ngày giao trước, nếu không sản lượng đó sẽ không được tính vào tiêu thụ.</w:t>
       </w:r>
     </w:p>
     <w:p>
@@ -3135,7 +3239,7 @@
         <w:pageBreakBefore/>
       </w:pPr>
       <w:r>
-        <w:t xml:space="preserve">12. Nhu cầu thị trường</w:t>
+        <w:t xml:space="preserve">12. Báo cáo tiêu thụ</w:t>
       </w:r>
     </w:p>
     <w:p>
@@ -3150,7 +3254,7 @@
         <w:t xml:space="preserve">Vị trí: </w:t>
       </w:r>
       <w:r>
-        <w:t xml:space="preserve">Nhập liệu số liệu → Nhu cầu thị trường</w:t>
+        <w:t xml:space="preserve">Báo cáo → Tiêu thụ</w:t>
       </w:r>
     </w:p>
     <w:p>
@@ -3158,7 +3262,7 @@
         <w:spacing w:after="140"/>
       </w:pPr>
       <w:r>
-        <w:t xml:space="preserve">Ghi nhận nhu cầu và tín hiệu thị trường của đơn vị, nhập tự do bằng chữ theo ngày.</w:t>
+        <w:t xml:space="preserve">Bảng chỉ để xem — số do hệ thống tổng hợp từ các lần giao, đơn vị không nhập tay.</w:t>
       </w:r>
     </w:p>
     <w:p>
@@ -3171,7 +3275,7 @@
           <wp:inline distT="0" distB="0" distL="0" distR="0">
             <wp:extent cx="6191250" cy="3381375"/>
             <wp:effectExtent t="0" r="0" b="0" l="0"/>
-            <wp:docPr id="1" name="img" descr="Ảnh hướng dẫn có đánh số bước" title="img/11-nhu-cau-thi-truong.png"/>
+            <wp:docPr id="1" name="img" descr="Ảnh hướng dẫn có đánh số bước" title="img/11-bao-cao-tieu-thu.png"/>
             <wp:cNvGraphicFramePr>
               <a:graphicFrameLocks xmlns:a="http://schemas.openxmlformats.org/drawingml/2006/main" noChangeAspect="1"/>
             </wp:cNvGraphicFramePr>
@@ -3220,7 +3324,7 @@
           <w:sz w:val="17"/>
           <w:szCs w:val="17"/>
         </w:rPr>
-        <w:t xml:space="preserve">Hình 11. Nhu cầu thị trường theo ngày</w:t>
+        <w:t xml:space="preserve">Hình 11. Báo cáo tiêu thụ theo kỳ</w:t>
       </w:r>
     </w:p>
     <w:p>
@@ -3245,7 +3349,64 @@
         <w:spacing w:after="100"/>
       </w:pPr>
       <w:r>
-        <w:t xml:space="preserve">Chọn ngày rồi viết nội dung: khách hỏi mua gì, số lượng, mức giá chào, tình hình thương lượng.</w:t>
+        <w:rPr>
+          <w:b/>
+          <w:bCs/>
+        </w:rPr>
+        <w:t xml:space="preserve">Bộ lọc</w:t>
+      </w:r>
+      <w:r>
+        <w:t xml:space="preserve"> — Từ ngày / Đến ngày · Đơn vị · </w:t>
+      </w:r>
+      <w:r>
+        <w:rPr>
+          <w:b/>
+          <w:bCs/>
+        </w:rPr>
+        <w:t xml:space="preserve">Khách hàng</w:t>
+      </w:r>
+      <w:r>
+        <w:t xml:space="preserve"> (gõ để tìm, chọn nhiều) · </w:t>
+      </w:r>
+      <w:r>
+        <w:rPr>
+          <w:b/>
+          <w:bCs/>
+        </w:rPr>
+        <w:t xml:space="preserve">Chủng loại</w:t>
+      </w:r>
+      <w:r>
+        <w:t xml:space="preserve"> (chọn nhiều). Bảng, khối theo khách hàng và file Excel đều theo bộ lọc này.</w:t>
+      </w:r>
+    </w:p>
+    <w:p>
+      <w:pPr>
+        <w:pStyle w:val="ListParagraph"/>
+        <w:numPr>
+          <w:ilvl w:val="0"/>
+          <w:numId w:val="14"/>
+        </w:numPr>
+        <w:spacing w:after="100"/>
+      </w:pPr>
+      <w:r>
+        <w:rPr>
+          <w:b/>
+          <w:bCs/>
+        </w:rPr>
+        <w:t xml:space="preserve">Bảng tổng hợp</w:t>
+      </w:r>
+      <w:r>
+        <w:t xml:space="preserve"> — Lần giao · SL · Quy khô · Xuất khẩu · Trong nước · Nội bộ · Doanh thu · </w:t>
+      </w:r>
+      <w:r>
+        <w:rPr>
+          <w:b/>
+          <w:bCs/>
+        </w:rPr>
+        <w:t xml:space="preserve">Chưa giao</w:t>
+      </w:r>
+      <w:r>
+        <w:t xml:space="preserve">.</w:t>
       </w:r>
     </w:p>
     <w:p>
@@ -3270,17 +3431,116 @@
         <w:spacing w:after="80"/>
       </w:pPr>
       <w:r>
-        <w:t xml:space="preserve">Viết ngắn gọn nhưng có </w:t>
-      </w:r>
-      <w:r>
-        <w:rPr>
-          <w:b/>
-          <w:bCs/>
-        </w:rPr>
-        <w:t xml:space="preserve">con số cụ thể</w:t>
-      </w:r>
-      <w:r>
-        <w:t xml:space="preserve"> (chủng loại, sản lượng, mức giá) — Ban TTKD dùng thông tin này để đối chiếu với diễn biến giá sàn.</w:t>
+        <w:t xml:space="preserve">Cột </w:t>
+      </w:r>
+      <w:r>
+        <w:rPr>
+          <w:b/>
+          <w:bCs/>
+        </w:rPr>
+        <w:t xml:space="preserve">SL (tấn)</w:t>
+      </w:r>
+      <w:r>
+        <w:t xml:space="preserve"> là sản lượng tiêu thụ thực tế: latex và mủ nguyên liệu tính theo </w:t>
+      </w:r>
+      <w:r>
+        <w:rPr>
+          <w:b/>
+          <w:bCs/>
+        </w:rPr>
+        <w:t xml:space="preserve">quy khô</w:t>
+      </w:r>
+      <w:r>
+        <w:t xml:space="preserve">, các chủng loại thành phẩm tính theo chính số lượng bán.</w:t>
+      </w:r>
+    </w:p>
+    <w:p>
+      <w:pPr>
+        <w:pStyle w:val="ListParagraph"/>
+        <w:numPr>
+          <w:ilvl w:val="0"/>
+          <w:numId w:val="3"/>
+        </w:numPr>
+        <w:spacing w:after="80"/>
+      </w:pPr>
+      <w:r>
+        <w:t xml:space="preserve">Cột </w:t>
+      </w:r>
+      <w:r>
+        <w:rPr>
+          <w:b/>
+          <w:bCs/>
+        </w:rPr>
+        <w:t xml:space="preserve">Chưa giao</w:t>
+      </w:r>
+      <w:r>
+        <w:t xml:space="preserve"> là số </w:t>
+      </w:r>
+      <w:r>
+        <w:rPr>
+          <w:b/>
+          <w:bCs/>
+        </w:rPr>
+        <w:t xml:space="preserve">tại ngày cuối kỳ</w:t>
+      </w:r>
+      <w:r>
+        <w:t xml:space="preserve"> = sản lượng các hợp đồng chưa hoàn thành − đã giao; không phải số cộng dồn.</w:t>
+      </w:r>
+    </w:p>
+    <w:p>
+      <w:pPr>
+        <w:pStyle w:val="ListParagraph"/>
+        <w:numPr>
+          <w:ilvl w:val="0"/>
+          <w:numId w:val="3"/>
+        </w:numPr>
+        <w:spacing w:after="80"/>
+      </w:pPr>
+      <w:r>
+        <w:t xml:space="preserve">Khối </w:t>
+      </w:r>
+      <w:r>
+        <w:rPr>
+          <w:b/>
+          <w:bCs/>
+        </w:rPr>
+        <w:t xml:space="preserve">Theo khách hàng</w:t>
+      </w:r>
+      <w:r>
+        <w:t xml:space="preserve"> bên dưới tách sản lượng và doanh thu theo từng khách.</w:t>
+      </w:r>
+    </w:p>
+    <w:p>
+      <w:pPr>
+        <w:pStyle w:val="ListParagraph"/>
+        <w:numPr>
+          <w:ilvl w:val="0"/>
+          <w:numId w:val="3"/>
+        </w:numPr>
+        <w:spacing w:after="80"/>
+      </w:pPr>
+      <w:r>
+        <w:rPr>
+          <w:b/>
+          <w:bCs/>
+        </w:rPr>
+        <w:t xml:space="preserve">Xuất Excel</w:t>
+      </w:r>
+      <w:r>
+        <w:t xml:space="preserve"> để lấy đúng bảng đang xem.</w:t>
+      </w:r>
+    </w:p>
+    <w:p>
+      <w:pPr>
+        <w:pStyle w:val="ListParagraph"/>
+        <w:numPr>
+          <w:ilvl w:val="0"/>
+          <w:numId w:val="3"/>
+        </w:numPr>
+        <w:spacing w:after="80"/>
+      </w:pPr>
+      <w:r>
+        <w:t xml:space="preserve">Doanh thu hiện “—” khi có lần giao bán ngoại tệ mà chưa nhập tỷ giá — bổ sung tỷ giá trên đợt giao để có số đầy đủ.</w:t>
       </w:r>
     </w:p>
     <w:p>
@@ -3289,7 +3549,7 @@
         <w:pageBreakBefore/>
       </w:pPr>
       <w:r>
-        <w:t xml:space="preserve">13. Kế hoạch năm</w:t>
+        <w:t xml:space="preserve">13. Nhu cầu thị trường</w:t>
       </w:r>
     </w:p>
     <w:p>
@@ -3304,7 +3564,7 @@
         <w:t xml:space="preserve">Vị trí: </w:t>
       </w:r>
       <w:r>
-        <w:t xml:space="preserve">Nhập liệu số liệu → Kế hoạch năm</w:t>
+        <w:t xml:space="preserve">Nhập liệu số liệu → Nhu cầu thị trường</w:t>
       </w:r>
     </w:p>
     <w:p>
@@ -3312,7 +3572,7 @@
         <w:spacing w:after="140"/>
       </w:pPr>
       <w:r>
-        <w:t xml:space="preserve">Số liệu nhập một lần cho cả năm, cập nhật khi có điều chỉnh.</w:t>
+        <w:t xml:space="preserve">Ghi nhận nhu cầu và tín hiệu thị trường của đơn vị, nhập tự do bằng chữ theo ngày.</w:t>
       </w:r>
     </w:p>
     <w:p>
@@ -3325,7 +3585,7 @@
           <wp:inline distT="0" distB="0" distL="0" distR="0">
             <wp:extent cx="6191250" cy="3381375"/>
             <wp:effectExtent t="0" r="0" b="0" l="0"/>
-            <wp:docPr id="1" name="img" descr="Ảnh hướng dẫn có đánh số bước" title="img/12-ke-hoach-nam.png"/>
+            <wp:docPr id="1" name="img" descr="Ảnh hướng dẫn có đánh số bước" title="img/12-nhu-cau-thi-truong.png"/>
             <wp:cNvGraphicFramePr>
               <a:graphicFrameLocks xmlns:a="http://schemas.openxmlformats.org/drawingml/2006/main" noChangeAspect="1"/>
             </wp:cNvGraphicFramePr>
@@ -3374,7 +3634,7 @@
           <w:sz w:val="17"/>
           <w:szCs w:val="17"/>
         </w:rPr>
-        <w:t xml:space="preserve">Hình 12. Kế hoạch năm của đơn vị</w:t>
+        <w:t xml:space="preserve">Hình 12. Nhu cầu thị trường theo ngày</w:t>
       </w:r>
     </w:p>
     <w:p>
@@ -3399,74 +3659,7 @@
         <w:spacing w:after="100"/>
       </w:pPr>
       <w:r>
-        <w:rPr>
-          <w:b/>
-          <w:bCs/>
-        </w:rPr>
-        <w:t xml:space="preserve">Kế hoạch thu mua</w:t>
-      </w:r>
-      <w:r>
-        <w:t xml:space="preserve"> (tấn) — dùng để tính % hoàn thành kế hoạch trên báo cáo.</w:t>
-      </w:r>
-    </w:p>
-    <w:p>
-      <w:pPr>
-        <w:pStyle w:val="ListParagraph"/>
-        <w:numPr>
-          <w:ilvl w:val="0"/>
-          <w:numId w:val="15"/>
-        </w:numPr>
-        <w:spacing w:after="100"/>
-      </w:pPr>
-      <w:r>
-        <w:rPr>
-          <w:b/>
-          <w:bCs/>
-        </w:rPr>
-        <w:t xml:space="preserve">Kế hoạch tiêu thụ — HĐ chuyến</w:t>
-      </w:r>
-      <w:r>
-        <w:t xml:space="preserve"> (tấn) — chỉ tiêu tiêu thụ giao cho hợp đồng chuyến trong năm.</w:t>
-      </w:r>
-    </w:p>
-    <w:p>
-      <w:pPr>
-        <w:pStyle w:val="ListParagraph"/>
-        <w:numPr>
-          <w:ilvl w:val="0"/>
-          <w:numId w:val="15"/>
-        </w:numPr>
-        <w:spacing w:after="100"/>
-      </w:pPr>
-      <w:r>
-        <w:rPr>
-          <w:b/>
-          <w:bCs/>
-        </w:rPr>
-        <w:t xml:space="preserve">HĐ dài hạn đã ký</w:t>
-      </w:r>
-      <w:r>
-        <w:t xml:space="preserve"> (tấn) trong năm.</w:t>
-      </w:r>
-    </w:p>
-    <w:p>
-      <w:pPr>
-        <w:pStyle w:val="ListParagraph"/>
-        <w:numPr>
-          <w:ilvl w:val="0"/>
-          <w:numId w:val="15"/>
-        </w:numPr>
-        <w:spacing w:after="100"/>
-      </w:pPr>
-      <w:r>
-        <w:rPr>
-          <w:b/>
-          <w:bCs/>
-        </w:rPr>
-        <w:t xml:space="preserve">HĐ dài hạn / HĐ chuyến năm trước chuyển sang</w:t>
-      </w:r>
-      <w:r>
-        <w:t xml:space="preserve"> (tấn).</w:t>
+        <w:t xml:space="preserve">Chọn ngày rồi viết nội dung: khách hỏi mua gì, số lượng, mức giá chào, tình hình thương lượng.</w:t>
       </w:r>
     </w:p>
     <w:p>
@@ -3491,80 +3684,17 @@
         <w:spacing w:after="80"/>
       </w:pPr>
       <w:r>
-        <w:t xml:space="preserve">Ô </w:t>
-      </w:r>
-      <w:r>
-        <w:rPr>
-          <w:b/>
-          <w:bCs/>
-        </w:rPr>
-        <w:t xml:space="preserve">Kế hoạch thu mua</w:t>
-      </w:r>
-      <w:r>
-        <w:t xml:space="preserve"> chính là công tắc: có số </w:t>
-      </w:r>
-      <w:r>
-        <w:rPr>
-          <w:b/>
-          <w:bCs/>
-        </w:rPr>
-        <w:t xml:space="preserve">&gt; 0</w:t>
-      </w:r>
-      <w:r>
-        <w:t xml:space="preserve"> thì đơn vị mới thấy màn </w:t>
-      </w:r>
-      <w:r>
-        <w:rPr>
-          <w:b/>
-          <w:bCs/>
-        </w:rPr>
-        <w:t xml:space="preserve">Báo cáo thu mua</w:t>
-      </w:r>
-      <w:r>
-        <w:t xml:space="preserve">; để trống hoặc </w:t>
-      </w:r>
-      <w:r>
-        <w:rPr>
-          <w:b/>
-          <w:bCs/>
-        </w:rPr>
-        <w:t xml:space="preserve">0</w:t>
-      </w:r>
-      <w:r>
-        <w:t xml:space="preserve"> = đơn vị không tổ chức thu mua.</w:t>
-      </w:r>
-    </w:p>
-    <w:p>
-      <w:pPr>
-        <w:pStyle w:val="ListParagraph"/>
-        <w:numPr>
-          <w:ilvl w:val="0"/>
-          <w:numId w:val="3"/>
-        </w:numPr>
-        <w:spacing w:after="80"/>
-      </w:pPr>
-      <w:r>
-        <w:t xml:space="preserve">Ô </w:t>
-      </w:r>
-      <w:r>
-        <w:rPr>
-          <w:b/>
-          <w:bCs/>
-        </w:rPr>
-        <w:t xml:space="preserve">Kế hoạch tiêu thụ — HĐ chuyến</w:t>
-      </w:r>
-      <w:r>
-        <w:t xml:space="preserve"> dùng để đối chiếu </w:t>
-      </w:r>
-      <w:r>
-        <w:rPr>
-          <w:b/>
-          <w:bCs/>
-        </w:rPr>
-        <w:t xml:space="preserve">% thực hiện</w:t>
-      </w:r>
-      <w:r>
-        <w:t xml:space="preserve"> trên báo cáo kỳ; ô này KHÔNG bật/tắt màn nào.</w:t>
+        <w:t xml:space="preserve">Viết ngắn gọn nhưng có </w:t>
+      </w:r>
+      <w:r>
+        <w:rPr>
+          <w:b/>
+          <w:bCs/>
+        </w:rPr>
+        <w:t xml:space="preserve">con số cụ thể</w:t>
+      </w:r>
+      <w:r>
+        <w:t xml:space="preserve"> (chủng loại, sản lượng, mức giá) — Ban TTKD dùng thông tin này để đối chiếu với diễn biến giá sàn.</w:t>
       </w:r>
     </w:p>
     <w:p>
@@ -3573,7 +3703,7 @@
         <w:pageBreakBefore/>
       </w:pPr>
       <w:r>
-        <w:t xml:space="preserve">14. Hợp đồng cũ (trước 30/07)</w:t>
+        <w:t xml:space="preserve">14. Kế hoạch năm</w:t>
       </w:r>
     </w:p>
     <w:p>
@@ -3588,7 +3718,7 @@
         <w:t xml:space="preserve">Vị trí: </w:t>
       </w:r>
       <w:r>
-        <w:t xml:space="preserve">Báo cáo → Hợp đồng cũ (trước 30/07)</w:t>
+        <w:t xml:space="preserve">Nhập liệu số liệu → Kế hoạch năm</w:t>
       </w:r>
     </w:p>
     <w:p>
@@ -3596,7 +3726,7 @@
         <w:spacing w:after="140"/>
       </w:pPr>
       <w:r>
-        <w:t xml:space="preserve">Toàn bộ hợp đồng đã ký nhập theo cách cũ, kể cả hợp đồng đã giao. Màn này chỉ để tra cứu — không có nút sửa.</w:t>
+        <w:t xml:space="preserve">Số liệu nhập một lần cho cả năm, cập nhật khi có điều chỉnh.</w:t>
       </w:r>
     </w:p>
     <w:p>
@@ -3609,7 +3739,7 @@
           <wp:inline distT="0" distB="0" distL="0" distR="0">
             <wp:extent cx="6191250" cy="3381375"/>
             <wp:effectExtent t="0" r="0" b="0" l="0"/>
-            <wp:docPr id="1" name="img" descr="Ảnh hướng dẫn có đánh số bước" title="img/13-hop-dong-cu.png"/>
+            <wp:docPr id="1" name="img" descr="Ảnh hướng dẫn có đánh số bước" title="img/13-ke-hoach-nam.png"/>
             <wp:cNvGraphicFramePr>
               <a:graphicFrameLocks xmlns:a="http://schemas.openxmlformats.org/drawingml/2006/main" noChangeAspect="1"/>
             </wp:cNvGraphicFramePr>
@@ -3658,7 +3788,7 @@
           <w:sz w:val="17"/>
           <w:szCs w:val="17"/>
         </w:rPr>
-        <w:t xml:space="preserve">Hình 13. Tra cứu hợp đồng cũ</w:t>
+        <w:t xml:space="preserve">Hình 13. Kế hoạch năm của đơn vị</w:t>
       </w:r>
     </w:p>
     <w:p>
@@ -3683,7 +3813,74 @@
         <w:spacing w:after="100"/>
       </w:pPr>
       <w:r>
-        <w:t xml:space="preserve">Lọc theo khu vực, đơn vị, chủng loại, trạng thái giao và khoảng thời gian; tìm nhanh theo số HĐ.</w:t>
+        <w:rPr>
+          <w:b/>
+          <w:bCs/>
+        </w:rPr>
+        <w:t xml:space="preserve">Kế hoạch thu mua</w:t>
+      </w:r>
+      <w:r>
+        <w:t xml:space="preserve"> (tấn) — dùng để tính % hoàn thành kế hoạch trên báo cáo.</w:t>
+      </w:r>
+    </w:p>
+    <w:p>
+      <w:pPr>
+        <w:pStyle w:val="ListParagraph"/>
+        <w:numPr>
+          <w:ilvl w:val="0"/>
+          <w:numId w:val="16"/>
+        </w:numPr>
+        <w:spacing w:after="100"/>
+      </w:pPr>
+      <w:r>
+        <w:rPr>
+          <w:b/>
+          <w:bCs/>
+        </w:rPr>
+        <w:t xml:space="preserve">Kế hoạch tiêu thụ — HĐ chuyến</w:t>
+      </w:r>
+      <w:r>
+        <w:t xml:space="preserve"> (tấn) — chỉ tiêu tiêu thụ giao cho hợp đồng chuyến trong năm.</w:t>
+      </w:r>
+    </w:p>
+    <w:p>
+      <w:pPr>
+        <w:pStyle w:val="ListParagraph"/>
+        <w:numPr>
+          <w:ilvl w:val="0"/>
+          <w:numId w:val="16"/>
+        </w:numPr>
+        <w:spacing w:after="100"/>
+      </w:pPr>
+      <w:r>
+        <w:rPr>
+          <w:b/>
+          <w:bCs/>
+        </w:rPr>
+        <w:t xml:space="preserve">HĐ dài hạn đã ký</w:t>
+      </w:r>
+      <w:r>
+        <w:t xml:space="preserve"> (tấn) trong năm.</w:t>
+      </w:r>
+    </w:p>
+    <w:p>
+      <w:pPr>
+        <w:pStyle w:val="ListParagraph"/>
+        <w:numPr>
+          <w:ilvl w:val="0"/>
+          <w:numId w:val="16"/>
+        </w:numPr>
+        <w:spacing w:after="100"/>
+      </w:pPr>
+      <w:r>
+        <w:rPr>
+          <w:b/>
+          <w:bCs/>
+        </w:rPr>
+        <w:t xml:space="preserve">HĐ dài hạn / HĐ chuyến năm trước chuyển sang</w:t>
+      </w:r>
+      <w:r>
+        <w:t xml:space="preserve"> (tấn).</w:t>
       </w:r>
     </w:p>
     <w:p>
@@ -3708,17 +3905,47 @@
         <w:spacing w:after="80"/>
       </w:pPr>
       <w:r>
-        <w:t xml:space="preserve">Hợp đồng phát sinh từ 30/07 trở đi nằm ở mục </w:t>
-      </w:r>
-      <w:r>
-        <w:rPr>
-          <w:b/>
-          <w:bCs/>
-        </w:rPr>
-        <w:t xml:space="preserve">Hợp đồng &amp; phụ lục</w:t>
-      </w:r>
-      <w:r>
-        <w:t xml:space="preserve">, không nằm ở đây.</w:t>
+        <w:t xml:space="preserve">Ô </w:t>
+      </w:r>
+      <w:r>
+        <w:rPr>
+          <w:b/>
+          <w:bCs/>
+        </w:rPr>
+        <w:t xml:space="preserve">Kế hoạch thu mua</w:t>
+      </w:r>
+      <w:r>
+        <w:t xml:space="preserve"> chính là công tắc: có số </w:t>
+      </w:r>
+      <w:r>
+        <w:rPr>
+          <w:b/>
+          <w:bCs/>
+        </w:rPr>
+        <w:t xml:space="preserve">&gt; 0</w:t>
+      </w:r>
+      <w:r>
+        <w:t xml:space="preserve"> thì đơn vị mới thấy màn </w:t>
+      </w:r>
+      <w:r>
+        <w:rPr>
+          <w:b/>
+          <w:bCs/>
+        </w:rPr>
+        <w:t xml:space="preserve">Báo cáo thu mua</w:t>
+      </w:r>
+      <w:r>
+        <w:t xml:space="preserve">; để trống hoặc </w:t>
+      </w:r>
+      <w:r>
+        <w:rPr>
+          <w:b/>
+          <w:bCs/>
+        </w:rPr>
+        <w:t xml:space="preserve">0</w:t>
+      </w:r>
+      <w:r>
+        <w:t xml:space="preserve"> = đơn vị không tổ chức thu mua.</w:t>
       </w:r>
     </w:p>
     <w:p>
@@ -3731,7 +3958,27 @@
         <w:spacing w:after="80"/>
       </w:pPr>
       <w:r>
-        <w:t xml:space="preserve">Cần sửa một hợp đồng cũ thì báo Ban TTKD.</w:t>
+        <w:t xml:space="preserve">Ô </w:t>
+      </w:r>
+      <w:r>
+        <w:rPr>
+          <w:b/>
+          <w:bCs/>
+        </w:rPr>
+        <w:t xml:space="preserve">Kế hoạch tiêu thụ — HĐ chuyến</w:t>
+      </w:r>
+      <w:r>
+        <w:t xml:space="preserve"> dùng để đối chiếu </w:t>
+      </w:r>
+      <w:r>
+        <w:rPr>
+          <w:b/>
+          <w:bCs/>
+        </w:rPr>
+        <w:t xml:space="preserve">% thực hiện</w:t>
+      </w:r>
+      <w:r>
+        <w:t xml:space="preserve"> trên báo cáo kỳ; ô này KHÔNG bật/tắt màn nào.</w:t>
       </w:r>
     </w:p>
     <w:p>
@@ -3740,7 +3987,117 @@
         <w:pageBreakBefore/>
       </w:pPr>
       <w:r>
-        <w:t xml:space="preserve">15. Những lỗi hay gặp</w:t>
+        <w:t xml:space="preserve">15. Hợp đồng cũ (trước 30/07)</w:t>
+      </w:r>
+    </w:p>
+    <w:p>
+      <w:pPr>
+        <w:spacing w:after="60"/>
+      </w:pPr>
+      <w:r>
+        <w:rPr>
+          <w:b/>
+          <w:bCs/>
+        </w:rPr>
+        <w:t xml:space="preserve">Vị trí: </w:t>
+      </w:r>
+      <w:r>
+        <w:t xml:space="preserve">Báo cáo → Hợp đồng cũ (trước 30/07)</w:t>
+      </w:r>
+    </w:p>
+    <w:p>
+      <w:pPr>
+        <w:spacing w:after="140"/>
+      </w:pPr>
+      <w:r>
+        <w:t xml:space="preserve">Toàn bộ hợp đồng đã ký nhập theo cách cũ, kể cả hợp đồng đã giao. Màn này chỉ để tra cứu — không có nút sửa.</w:t>
+      </w:r>
+    </w:p>
+    <w:p>
+      <w:pPr>
+        <w:spacing w:after="60" w:before="60"/>
+        <w:jc w:val="center"/>
+      </w:pPr>
+      <w:r>
+        <w:drawing>
+          <wp:inline distT="0" distB="0" distL="0" distR="0">
+            <wp:extent cx="6191250" cy="3381375"/>
+            <wp:effectExtent t="0" r="0" b="0" l="0"/>
+            <wp:docPr id="1" name="img" descr="Ảnh hướng dẫn có đánh số bước" title="img/14-hop-dong-cu.png"/>
+            <wp:cNvGraphicFramePr>
+              <a:graphicFrameLocks xmlns:a="http://schemas.openxmlformats.org/drawingml/2006/main" noChangeAspect="1"/>
+            </wp:cNvGraphicFramePr>
+            <a:graphic xmlns:a="http://schemas.openxmlformats.org/drawingml/2006/main">
+              <a:graphicData uri="http://schemas.openxmlformats.org/drawingml/2006/picture">
+                <pic:pic xmlns:pic="http://schemas.openxmlformats.org/drawingml/2006/picture">
+                  <pic:nvPicPr>
+                    <pic:cNvPr id="0" name="" descr=""/>
+                    <pic:cNvPicPr>
+                      <a:picLocks noChangeAspect="1" noChangeArrowheads="1"/>
+                    </pic:cNvPicPr>
+                  </pic:nvPicPr>
+                  <pic:blipFill>
+                    <a:blip r:embed="rId21" cstate="none"/>
+                    <a:srcRect/>
+                    <a:stretch>
+                      <a:fillRect/>
+                    </a:stretch>
+                  </pic:blipFill>
+                  <pic:spPr bwMode="auto">
+                    <a:xfrm>
+                      <a:off x="0" y="0"/>
+                      <a:ext cx="6191250" cy="3381375"/>
+                    </a:xfrm>
+                    <a:prstGeom prst="rect">
+                      <a:avLst/>
+                    </a:prstGeom>
+                  </pic:spPr>
+                </pic:pic>
+              </a:graphicData>
+            </a:graphic>
+          </wp:inline>
+        </w:drawing>
+      </w:r>
+    </w:p>
+    <w:p>
+      <w:pPr>
+        <w:spacing w:after="180"/>
+        <w:jc w:val="center"/>
+      </w:pPr>
+      <w:r>
+        <w:rPr>
+          <w:i/>
+          <w:iCs/>
+          <w:color w:val="888888"/>
+          <w:sz w:val="17"/>
+          <w:szCs w:val="17"/>
+        </w:rPr>
+        <w:t xml:space="preserve">Hình 14. Tra cứu hợp đồng cũ</w:t>
+      </w:r>
+    </w:p>
+    <w:p>
+      <w:pPr>
+        <w:spacing w:after="80"/>
+      </w:pPr>
+      <w:r>
+        <w:rPr>
+          <w:b/>
+          <w:bCs/>
+        </w:rPr>
+        <w:t xml:space="preserve">Các bước:</w:t>
+      </w:r>
+    </w:p>
+    <w:p>
+      <w:pPr>
+        <w:pStyle w:val="ListParagraph"/>
+        <w:numPr>
+          <w:ilvl w:val="0"/>
+          <w:numId w:val="17"/>
+        </w:numPr>
+        <w:spacing w:after="100"/>
+      </w:pPr>
+      <w:r>
+        <w:t xml:space="preserve">Lọc theo khu vực, đơn vị, chủng loại, trạng thái giao và khoảng thời gian; tìm nhanh theo số HĐ.</w:t>
       </w:r>
     </w:p>
     <w:p>
@@ -3765,6 +4122,63 @@
         <w:spacing w:after="80"/>
       </w:pPr>
       <w:r>
+        <w:t xml:space="preserve">Hợp đồng phát sinh từ 30/07 trở đi nằm ở mục </w:t>
+      </w:r>
+      <w:r>
+        <w:rPr>
+          <w:b/>
+          <w:bCs/>
+        </w:rPr>
+        <w:t xml:space="preserve">Hợp đồng &amp; đợt giao</w:t>
+      </w:r>
+      <w:r>
+        <w:t xml:space="preserve">, không nằm ở đây.</w:t>
+      </w:r>
+    </w:p>
+    <w:p>
+      <w:pPr>
+        <w:pStyle w:val="ListParagraph"/>
+        <w:numPr>
+          <w:ilvl w:val="0"/>
+          <w:numId w:val="3"/>
+        </w:numPr>
+        <w:spacing w:after="80"/>
+      </w:pPr>
+      <w:r>
+        <w:t xml:space="preserve">Cần sửa một hợp đồng cũ thì báo Ban TTKD.</w:t>
+      </w:r>
+    </w:p>
+    <w:p>
+      <w:pPr>
+        <w:pStyle w:val="Heading2"/>
+        <w:pageBreakBefore/>
+      </w:pPr>
+      <w:r>
+        <w:t xml:space="preserve">16. Những lỗi hay gặp</w:t>
+      </w:r>
+    </w:p>
+    <w:p>
+      <w:pPr>
+        <w:spacing w:after="80" w:before="140"/>
+      </w:pPr>
+      <w:r>
+        <w:rPr>
+          <w:b/>
+          <w:bCs/>
+        </w:rPr>
+        <w:t xml:space="preserve">Lưu ý:</w:t>
+      </w:r>
+    </w:p>
+    <w:p>
+      <w:pPr>
+        <w:pStyle w:val="ListParagraph"/>
+        <w:numPr>
+          <w:ilvl w:val="0"/>
+          <w:numId w:val="3"/>
+        </w:numPr>
+        <w:spacing w:after="80"/>
+      </w:pPr>
+      <w:r>
         <w:rPr>
           <w:b/>
           <w:bCs/>
@@ -3802,7 +4216,7 @@
         <w:t xml:space="preserve">Doanh thu trên báo cáo hiện “—”</w:t>
       </w:r>
       <w:r>
-        <w:t xml:space="preserve"> → Có lần giao bán ngoại tệ chưa nhập tỷ giá. Mở phụ lục, điền tỷ giá quy ra VNĐ.</w:t>
+        <w:t xml:space="preserve"> → Có lần giao bán ngoại tệ chưa nhập tỷ giá. Mở đợt giao, điền tỷ giá quy ra VNĐ.</w:t>
       </w:r>
     </w:p>
     <w:p>
@@ -3822,7 +4236,7 @@
         <w:t xml:space="preserve">Báo cáo tiêu thụ ra 0 dù đơn vị có bán</w:t>
       </w:r>
       <w:r>
-        <w:t xml:space="preserve"> → Ngày giao nằm ngoài kỳ đang xem, hoặc phụ lục </w:t>
+        <w:t xml:space="preserve"> → Ngày giao nằm ngoài kỳ đang xem, hoặc đợt giao </w:t>
       </w:r>
       <w:r>
         <w:rPr>
@@ -3869,10 +4283,10 @@
           <w:b/>
           <w:bCs/>
         </w:rPr>
-        <w:t xml:space="preserve">Không lưu được phụ lục, báo vượt sản lượng</w:t>
-      </w:r>
-      <w:r>
-        <w:t xml:space="preserve"> → Tổng các phụ lục vượt cam kết của hợp đồng mẹ. Kiểm lại dòng “Còn lại của hợp đồng mẹ”.</w:t>
+        <w:t xml:space="preserve">Không lưu được đợt giao, báo vượt quá 110%</w:t>
+      </w:r>
+      <w:r>
+        <w:t xml:space="preserve"> → Tổng các đợt giao vượt quá 110% sản lượng hợp đồng. Kiểm lại số cân; nếu hai bên đã thống nhất tăng thì sửa sản lượng trên hợp đồng.</w:t>
       </w:r>
     </w:p>
     <w:p>
@@ -3889,6 +4303,66 @@
           <w:b/>
           <w:bCs/>
         </w:rPr>
+        <w:t xml:space="preserve">Hợp đồng còn treo sản lượng chưa giao dù đã bán xong</w:t>
+      </w:r>
+      <w:r>
+        <w:t xml:space="preserve"> → Giao thiếu vài % là bình thường; bấm </w:t>
+      </w:r>
+      <w:r>
+        <w:rPr>
+          <w:b/>
+          <w:bCs/>
+        </w:rPr>
+        <w:t xml:space="preserve">Hoàn thành hợp đồng</w:t>
+      </w:r>
+      <w:r>
+        <w:t xml:space="preserve"> để chốt, phần chênh sẽ rời khỏi “đã ký HĐ chưa giao”.</w:t>
+      </w:r>
+    </w:p>
+    <w:p>
+      <w:pPr>
+        <w:pStyle w:val="ListParagraph"/>
+        <w:numPr>
+          <w:ilvl w:val="0"/>
+          <w:numId w:val="3"/>
+        </w:numPr>
+        <w:spacing w:after="80"/>
+      </w:pPr>
+      <w:r>
+        <w:rPr>
+          <w:b/>
+          <w:bCs/>
+        </w:rPr>
+        <w:t xml:space="preserve">Không sửa được hợp đồng, báo “đã hoàn thành”</w:t>
+      </w:r>
+      <w:r>
+        <w:t xml:space="preserve"> → Hợp đồng đã chốt. Bấm </w:t>
+      </w:r>
+      <w:r>
+        <w:rPr>
+          <w:b/>
+          <w:bCs/>
+        </w:rPr>
+        <w:t xml:space="preserve">Mở lại hợp đồng</w:t>
+      </w:r>
+      <w:r>
+        <w:t xml:space="preserve"> ở màn chi tiết rồi sửa.</w:t>
+      </w:r>
+    </w:p>
+    <w:p>
+      <w:pPr>
+        <w:pStyle w:val="ListParagraph"/>
+        <w:numPr>
+          <w:ilvl w:val="0"/>
+          <w:numId w:val="3"/>
+        </w:numPr>
+        <w:spacing w:after="80"/>
+      </w:pPr>
+      <w:r>
+        <w:rPr>
+          <w:b/>
+          <w:bCs/>
+        </w:rPr>
         <w:t xml:space="preserve">Không sửa được số liệu ngày cũ</w:t>
       </w:r>
       <w:r>
@@ -3909,7 +4383,7 @@
           <w:b/>
           <w:bCs/>
         </w:rPr>
-        <w:t xml:space="preserve">Phụ lục hiện “(chỉ xem)”, không có nút Sửa</w:t>
+        <w:t xml:space="preserve">Đợt giao hiện “(chỉ xem)”, không có nút Sửa</w:t>
       </w:r>
       <w:r>
         <w:t xml:space="preserve"> → Lần giao đã quá số ngày cho phép sửa. Báo Ban TTKD nếu thật sự cần chỉnh.</w:t>
@@ -4348,6 +4822,18 @@
     <w:multiLevelType w:val="hybridMultilevel"/>
     <w:lvl w:ilvl="0" w15:tentative="1">
       <w:start w:val="1"/>
+      <w:numFmt w:val="decimal"/>
+      <w:lvlText w:val="%1."/>
+      <w:lvlJc w:val="left"/>
+      <w:pPr>
+        <w:ind w:left="620" w:hanging="360"/>
+      </w:pPr>
+    </w:lvl>
+  </w:abstractNum>
+  <w:abstractNum w:abstractNumId="18" w15:restartNumberingAfterBreak="0">
+    <w:multiLevelType w:val="hybridMultilevel"/>
+    <w:lvl w:ilvl="0" w15:tentative="1">
+      <w:start w:val="1"/>
       <w:numFmt w:val="bullet"/>
       <w:lvlText w:val="•"/>
       <w:lvlJc w:val="left"/>
@@ -4369,7 +4855,7 @@
     </w:lvlOverride>
   </w:num>
   <w:num w:numId="3">
-    <w:abstractNumId w:val="17"/>
+    <w:abstractNumId w:val="18"/>
     <w:lvlOverride w:ilvl="0">
       <w:startOverride w:val="1"/>
     </w:lvlOverride>
@@ -4448,6 +4934,12 @@
   </w:num>
   <w:num w:numId="16">
     <w:abstractNumId w:val="15"/>
+    <w:lvlOverride w:ilvl="0">
+      <w:startOverride w:val="1"/>
+    </w:lvlOverride>
+  </w:num>
+  <w:num w:numId="17">
+    <w:abstractNumId w:val="16"/>
     <w:lvlOverride w:ilvl="0">
       <w:startOverride w:val="1"/>
     </w:lvlOverride>

</xml_diff>

<commit_message>
docs(huong-dan): document the sale-channel filter on the contract list
Reshoots the list screenshot so it shows the new filter and the Hình thức column, and spells
out that the channel is recorded on the delivery — a multi-delivery contract therefore lists
every channel its batches carry, and "chưa khai hình thức" finds the old ones still missing it.
</commit_message>
<xml_diff>
--- a/docs/huong-dan/nhap-lieu-don-vi-thanh-vien/Huong-dan-nhap-lieu-don-vi-thanh-vien.docx
+++ b/docs/huong-dan/nhap-lieu-don-vi-thanh-vien/Huong-dan-nhap-lieu-don-vi-thanh-vien.docx
@@ -1575,6 +1575,36 @@
           <w:b/>
           <w:bCs/>
         </w:rPr>
+        <w:t xml:space="preserve">Lọc theo Hình thức</w:t>
+      </w:r>
+      <w:r>
+        <w:t xml:space="preserve"> — *Xuất khẩu / UTXK* · *Tiêu thụ trong nước* · *Tiêu thụ nội bộ*, hoặc </w:t>
+      </w:r>
+      <w:r>
+        <w:rPr>
+          <w:b/>
+          <w:bCs/>
+        </w:rPr>
+        <w:t xml:space="preserve">Chưa khai hình thức</w:t>
+      </w:r>
+      <w:r>
+        <w:t xml:space="preserve"> để tìm nhanh những hợp đồng cũ còn thiếu mục này.</w:t>
+      </w:r>
+    </w:p>
+    <w:p>
+      <w:pPr>
+        <w:pStyle w:val="ListParagraph"/>
+        <w:numPr>
+          <w:ilvl w:val="0"/>
+          <w:numId w:val="9"/>
+        </w:numPr>
+        <w:spacing w:after="100"/>
+      </w:pPr>
+      <w:r>
+        <w:rPr>
+          <w:b/>
+          <w:bCs/>
+        </w:rPr>
         <w:t xml:space="preserve">Xem / Sửa / Xoá</w:t>
       </w:r>
       <w:r>
@@ -1677,6 +1707,46 @@
           <w:b/>
           <w:bCs/>
         </w:rPr>
+        <w:t xml:space="preserve">Hình thức</w:t>
+      </w:r>
+      <w:r>
+        <w:t xml:space="preserve"> — hình thức tiêu thụ khai ở </w:t>
+      </w:r>
+      <w:r>
+        <w:rPr>
+          <w:b/>
+          <w:bCs/>
+        </w:rPr>
+        <w:t xml:space="preserve">lần giao</w:t>
+      </w:r>
+      <w:r>
+        <w:t xml:space="preserve">, nên hợp đồng giao nhiều lần hiện </w:t>
+      </w:r>
+      <w:r>
+        <w:rPr>
+          <w:b/>
+          <w:bCs/>
+        </w:rPr>
+        <w:t xml:space="preserve">tất cả</w:t>
+      </w:r>
+      <w:r>
+        <w:t xml:space="preserve"> hình thức của các đợt; hợp đồng chưa giao lần nào thì để trống.</w:t>
+      </w:r>
+    </w:p>
+    <w:p>
+      <w:pPr>
+        <w:pStyle w:val="ListParagraph"/>
+        <w:numPr>
+          <w:ilvl w:val="0"/>
+          <w:numId w:val="3"/>
+        </w:numPr>
+        <w:spacing w:after="80"/>
+      </w:pPr>
+      <w:r>
+        <w:rPr>
+          <w:b/>
+          <w:bCs/>
+        </w:rPr>
         <w:t xml:space="preserve">Trạng thái</w:t>
       </w:r>
       <w:r>
@@ -1693,37 +1763,37 @@
         <w:spacing w:after="80"/>
       </w:pPr>
       <w:r>
-        <w:t xml:space="preserve">Bộ lọc </w:t>
-      </w:r>
-      <w:r>
-        <w:rPr>
-          <w:b/>
-          <w:bCs/>
-        </w:rPr>
-        <w:t xml:space="preserve">Trạng thái</w:t>
-      </w:r>
-      <w:r>
-        <w:t xml:space="preserve"> có thêm lựa chọn </w:t>
-      </w:r>
-      <w:r>
-        <w:rPr>
-          <w:b/>
-          <w:bCs/>
-        </w:rPr>
-        <w:t xml:space="preserve">Đã hoàn thành</w:t>
-      </w:r>
-      <w:r>
-        <w:t xml:space="preserve">; lọc theo </w:t>
-      </w:r>
-      <w:r>
-        <w:rPr>
-          <w:b/>
-          <w:bCs/>
-        </w:rPr>
-        <w:t xml:space="preserve">Khách hàng</w:t>
-      </w:r>
-      <w:r>
-        <w:t xml:space="preserve"> thì gõ vài chữ trong tên (hoặc mã khách), chọn được nhiều khách cùng lúc.</w:t>
+        <w:t xml:space="preserve">Các bộ lọc dùng chung được: </w:t>
+      </w:r>
+      <w:r>
+        <w:rPr>
+          <w:b/>
+          <w:bCs/>
+        </w:rPr>
+        <w:t xml:space="preserve">Đơn vị · Khách hàng</w:t>
+      </w:r>
+      <w:r>
+        <w:t xml:space="preserve"> (gõ để tìm, chọn nhiều) </w:t>
+      </w:r>
+      <w:r>
+        <w:rPr>
+          <w:b/>
+          <w:bCs/>
+        </w:rPr>
+        <w:t xml:space="preserve">· Trạng thái · Hình thức · Ngày ký</w:t>
+      </w:r>
+      <w:r>
+        <w:t xml:space="preserve"> và ô </w:t>
+      </w:r>
+      <w:r>
+        <w:rPr>
+          <w:b/>
+          <w:bCs/>
+        </w:rPr>
+        <w:t xml:space="preserve">tìm theo số HĐ</w:t>
+      </w:r>
+      <w:r>
+        <w:t xml:space="preserve"> (gõ không dấu vẫn ra).</w:t>
       </w:r>
     </w:p>
     <w:p>

</xml_diff>

<commit_message>
feat(customers): move the add-customer form into a modal
The customer catalogue is per unit, so choosing the unit must be a deliberate
step; an always-open inline form made it easy to file a customer under the
wrong unit. Editing reuses the same modal with the unit locked, and the member
guide gains a screenshot of the popup.
</commit_message>
<xml_diff>
--- a/docs/huong-dan/nhap-lieu-don-vi-thanh-vien/Huong-dan-nhap-lieu-don-vi-thanh-vien.docx
+++ b/docs/huong-dan/nhap-lieu-don-vi-thanh-vien/Huong-dan-nhap-lieu-don-vi-thanh-vien.docx
@@ -250,6 +250,39 @@
       </w:r>
       <w:r>
         <w:t xml:space="preserve"> (trước chỉ tính phần đã chia thành đợt) nên con số này sẽ lớn hơn trước — đó là phần hàng đã ký bán mà chưa giao, kể cả chưa sản xuất.</w:t>
+      </w:r>
+    </w:p>
+    <w:p>
+      <w:pPr>
+        <w:pStyle w:val="ListParagraph"/>
+        <w:numPr>
+          <w:ilvl w:val="0"/>
+          <w:numId w:val="3"/>
+        </w:numPr>
+        <w:spacing w:after="80"/>
+      </w:pPr>
+      <w:r>
+        <w:t xml:space="preserve">Từ 06/08/2026, </w:t>
+      </w:r>
+      <w:r>
+        <w:rPr>
+          <w:b/>
+          <w:bCs/>
+        </w:rPr>
+        <w:t xml:space="preserve">thêm/sửa khách hàng nhập trong popup</w:t>
+      </w:r>
+      <w:r>
+        <w:t xml:space="preserve">: trang Khách hàng chỉ còn nút </w:t>
+      </w:r>
+      <w:r>
+        <w:rPr>
+          <w:b/>
+          <w:bCs/>
+        </w:rPr>
+        <w:t xml:space="preserve">Thêm khách hàng</w:t>
+      </w:r>
+      <w:r>
+        <w:t xml:space="preserve">, bấm vào mới hiện ô nhập. Cách nhập và các quy tắc không đổi.</w:t>
       </w:r>
     </w:p>
     <w:p>
@@ -1347,128 +1380,6 @@
     </w:p>
     <w:p>
       <w:pPr>
-        <w:spacing w:after="80"/>
-      </w:pPr>
-      <w:r>
-        <w:rPr>
-          <w:b/>
-          <w:bCs/>
-        </w:rPr>
-        <w:t xml:space="preserve">Các bước:</w:t>
-      </w:r>
-    </w:p>
-    <w:p>
-      <w:pPr>
-        <w:pStyle w:val="ListParagraph"/>
-        <w:numPr>
-          <w:ilvl w:val="0"/>
-          <w:numId w:val="8"/>
-        </w:numPr>
-        <w:spacing w:after="100"/>
-      </w:pPr>
-      <w:r>
-        <w:rPr>
-          <w:b/>
-          <w:bCs/>
-        </w:rPr>
-        <w:t xml:space="preserve">Thêm khách hàng</w:t>
-      </w:r>
-      <w:r>
-        <w:t xml:space="preserve"> — nhập tên khách, mã khách (tuỳ chọn) và ghi chú.</w:t>
-      </w:r>
-    </w:p>
-    <w:p>
-      <w:pPr>
-        <w:pStyle w:val="ListParagraph"/>
-        <w:numPr>
-          <w:ilvl w:val="0"/>
-          <w:numId w:val="8"/>
-        </w:numPr>
-        <w:spacing w:after="100"/>
-      </w:pPr>
-      <w:r>
-        <w:rPr>
-          <w:b/>
-          <w:bCs/>
-        </w:rPr>
-        <w:t xml:space="preserve">Sửa / Xoá</w:t>
-      </w:r>
-      <w:r>
-        <w:t xml:space="preserve"> ở cuối mỗi dòng.</w:t>
-      </w:r>
-    </w:p>
-    <w:p>
-      <w:pPr>
-        <w:spacing w:after="80" w:before="140"/>
-      </w:pPr>
-      <w:r>
-        <w:rPr>
-          <w:b/>
-          <w:bCs/>
-        </w:rPr>
-        <w:t xml:space="preserve">Lưu ý:</w:t>
-      </w:r>
-    </w:p>
-    <w:p>
-      <w:pPr>
-        <w:pStyle w:val="ListParagraph"/>
-        <w:numPr>
-          <w:ilvl w:val="0"/>
-          <w:numId w:val="3"/>
-        </w:numPr>
-        <w:spacing w:after="80"/>
-      </w:pPr>
-      <w:r>
-        <w:t xml:space="preserve">Trùng tên trong cùng một đơn vị sẽ bị chặn; hai đơn vị khác nhau được phép trùng tên khách.</w:t>
-      </w:r>
-    </w:p>
-    <w:p>
-      <w:pPr>
-        <w:pStyle w:val="ListParagraph"/>
-        <w:numPr>
-          <w:ilvl w:val="0"/>
-          <w:numId w:val="3"/>
-        </w:numPr>
-        <w:spacing w:after="80"/>
-      </w:pPr>
-      <w:r>
-        <w:t xml:space="preserve">Khách hàng đang có hợp đồng thì không xoá được — hãy ngưng sử dụng thay vì xoá.</w:t>
-      </w:r>
-    </w:p>
-    <w:p>
-      <w:pPr>
-        <w:pStyle w:val="Heading2"/>
-        <w:pageBreakBefore/>
-      </w:pPr>
-      <w:r>
-        <w:t xml:space="preserve">7. Hợp đồng &amp; đợt giao — danh sách</w:t>
-      </w:r>
-    </w:p>
-    <w:p>
-      <w:pPr>
-        <w:spacing w:after="60"/>
-      </w:pPr>
-      <w:r>
-        <w:rPr>
-          <w:b/>
-          <w:bCs/>
-        </w:rPr>
-        <w:t xml:space="preserve">Vị trí: </w:t>
-      </w:r>
-      <w:r>
-        <w:t xml:space="preserve">Quản lý hợp đồng → Hợp đồng &amp; đợt giao</w:t>
-      </w:r>
-    </w:p>
-    <w:p>
-      <w:pPr>
-        <w:spacing w:after="140"/>
-      </w:pPr>
-      <w:r>
-        <w:t xml:space="preserve">Danh sách các hợp đồng của đơn vị kèm tiến độ giao hàng.</w:t>
-      </w:r>
-    </w:p>
-    <w:p>
-      <w:pPr>
         <w:spacing w:after="60" w:before="60"/>
         <w:jc w:val="center"/>
       </w:pPr>
@@ -1477,7 +1388,7 @@
           <wp:inline distT="0" distB="0" distL="0" distR="0">
             <wp:extent cx="6191250" cy="3381375"/>
             <wp:effectExtent t="0" r="0" b="0" l="0"/>
-            <wp:docPr id="1" name="img" descr="Ảnh hướng dẫn có đánh số bước" title="img/06-hop-dong-danh-sach.png"/>
+            <wp:docPr id="1" name="img" descr="Ảnh hướng dẫn có đánh số bước" title="img/05b-khach-hang-popup.png"/>
             <wp:cNvGraphicFramePr>
               <a:graphicFrameLocks xmlns:a="http://schemas.openxmlformats.org/drawingml/2006/main" noChangeAspect="1"/>
             </wp:cNvGraphicFramePr>
@@ -1526,7 +1437,7 @@
           <w:sz w:val="17"/>
           <w:szCs w:val="17"/>
         </w:rPr>
-        <w:t xml:space="preserve">Hình 6. Danh sách hợp đồng và tiến độ giao</w:t>
+        <w:t xml:space="preserve">Hình 5b. Popup thêm/sửa khách hàng</w:t>
       </w:r>
     </w:p>
     <w:p>
@@ -1546,79 +1457,112 @@
         <w:pStyle w:val="ListParagraph"/>
         <w:numPr>
           <w:ilvl w:val="0"/>
-          <w:numId w:val="9"/>
-        </w:numPr>
-        <w:spacing w:after="100"/>
-      </w:pPr>
-      <w:r>
-        <w:rPr>
-          <w:b/>
-          <w:bCs/>
-        </w:rPr>
-        <w:t xml:space="preserve">Thêm hợp đồng</w:t>
-      </w:r>
-      <w:r>
-        <w:t xml:space="preserve"> — lập hợp đồng mới (xem mục 8).</w:t>
-      </w:r>
-    </w:p>
-    <w:p>
-      <w:pPr>
-        <w:pStyle w:val="ListParagraph"/>
-        <w:numPr>
-          <w:ilvl w:val="0"/>
-          <w:numId w:val="9"/>
-        </w:numPr>
-        <w:spacing w:after="100"/>
-      </w:pPr>
-      <w:r>
-        <w:rPr>
-          <w:b/>
-          <w:bCs/>
-        </w:rPr>
-        <w:t xml:space="preserve">Lọc theo Hình thức</w:t>
-      </w:r>
-      <w:r>
-        <w:t xml:space="preserve"> — *Xuất khẩu / UTXK* · *Tiêu thụ trong nước* · *Tiêu thụ nội bộ*, hoặc </w:t>
-      </w:r>
-      <w:r>
-        <w:rPr>
-          <w:b/>
-          <w:bCs/>
-        </w:rPr>
-        <w:t xml:space="preserve">Chưa khai hình thức</w:t>
-      </w:r>
-      <w:r>
-        <w:t xml:space="preserve"> để tìm nhanh những hợp đồng cũ còn thiếu mục này.</w:t>
-      </w:r>
-    </w:p>
-    <w:p>
-      <w:pPr>
-        <w:pStyle w:val="ListParagraph"/>
-        <w:numPr>
-          <w:ilvl w:val="0"/>
-          <w:numId w:val="9"/>
-        </w:numPr>
-        <w:spacing w:after="100"/>
-      </w:pPr>
-      <w:r>
-        <w:rPr>
-          <w:b/>
-          <w:bCs/>
-        </w:rPr>
-        <w:t xml:space="preserve">Xem / Sửa / Xoá</w:t>
-      </w:r>
-      <w:r>
-        <w:t xml:space="preserve"> ở cuối mỗi dòng. Bấm </w:t>
-      </w:r>
-      <w:r>
-        <w:rPr>
-          <w:b/>
-          <w:bCs/>
-        </w:rPr>
-        <w:t xml:space="preserve">Xem</w:t>
-      </w:r>
-      <w:r>
-        <w:t xml:space="preserve"> để mở màn chi tiết (mục 9).</w:t>
+          <w:numId w:val="8"/>
+        </w:numPr>
+        <w:spacing w:after="100"/>
+      </w:pPr>
+      <w:r>
+        <w:rPr>
+          <w:b/>
+          <w:bCs/>
+        </w:rPr>
+        <w:t xml:space="preserve">Thêm khách hàng</w:t>
+      </w:r>
+      <w:r>
+        <w:t xml:space="preserve"> — bấm nút ở đầu trang, popup hiện ra để nhập.</w:t>
+      </w:r>
+    </w:p>
+    <w:p>
+      <w:pPr>
+        <w:pStyle w:val="ListParagraph"/>
+        <w:numPr>
+          <w:ilvl w:val="0"/>
+          <w:numId w:val="8"/>
+        </w:numPr>
+        <w:spacing w:after="100"/>
+      </w:pPr>
+      <w:r>
+        <w:t xml:space="preserve">Trong popup: chọn </w:t>
+      </w:r>
+      <w:r>
+        <w:rPr>
+          <w:b/>
+          <w:bCs/>
+        </w:rPr>
+        <w:t xml:space="preserve">Đơn vị</w:t>
+      </w:r>
+      <w:r>
+        <w:t xml:space="preserve"> (1), nhập </w:t>
+      </w:r>
+      <w:r>
+        <w:rPr>
+          <w:b/>
+          <w:bCs/>
+        </w:rPr>
+        <w:t xml:space="preserve">Tên khách hàng</w:t>
+      </w:r>
+      <w:r>
+        <w:t xml:space="preserve"> (2) — bắt buộc; </w:t>
+      </w:r>
+      <w:r>
+        <w:rPr>
+          <w:b/>
+          <w:bCs/>
+        </w:rPr>
+        <w:t xml:space="preserve">Mã KH</w:t>
+      </w:r>
+      <w:r>
+        <w:t xml:space="preserve"> (3) và </w:t>
+      </w:r>
+      <w:r>
+        <w:rPr>
+          <w:b/>
+          <w:bCs/>
+        </w:rPr>
+        <w:t xml:space="preserve">Mã số thuế</w:t>
+      </w:r>
+      <w:r>
+        <w:t xml:space="preserve"> (4) nhập nếu có. Bấm </w:t>
+      </w:r>
+      <w:r>
+        <w:rPr>
+          <w:b/>
+          <w:bCs/>
+        </w:rPr>
+        <w:t xml:space="preserve">Lưu</w:t>
+      </w:r>
+      <w:r>
+        <w:t xml:space="preserve"> (5), popup đóng lại và khách hàng hiện trong bảng.</w:t>
+      </w:r>
+    </w:p>
+    <w:p>
+      <w:pPr>
+        <w:pStyle w:val="ListParagraph"/>
+        <w:numPr>
+          <w:ilvl w:val="0"/>
+          <w:numId w:val="8"/>
+        </w:numPr>
+        <w:spacing w:after="100"/>
+      </w:pPr>
+      <w:r>
+        <w:rPr>
+          <w:b/>
+          <w:bCs/>
+        </w:rPr>
+        <w:t xml:space="preserve">Sửa</w:t>
+      </w:r>
+      <w:r>
+        <w:t xml:space="preserve"> ở cuối mỗi dòng mở lại chính popup đó với dữ liệu đã điền sẵn; </w:t>
+      </w:r>
+      <w:r>
+        <w:rPr>
+          <w:b/>
+          <w:bCs/>
+        </w:rPr>
+        <w:t xml:space="preserve">Ẩn / Xoá</w:t>
+      </w:r>
+      <w:r>
+        <w:t xml:space="preserve"> nằm cạnh bên.</w:t>
       </w:r>
     </w:p>
     <w:p>
@@ -1643,14 +1587,17 @@
         <w:spacing w:after="80"/>
       </w:pPr>
       <w:r>
-        <w:rPr>
-          <w:b/>
-          <w:bCs/>
-        </w:rPr>
-        <w:t xml:space="preserve">SL hợp đồng</w:t>
-      </w:r>
-      <w:r>
-        <w:t xml:space="preserve"> — tổng sản lượng ghi trên hợp đồng đã ký.</w:t>
+        <w:t xml:space="preserve">Ô </w:t>
+      </w:r>
+      <w:r>
+        <w:rPr>
+          <w:b/>
+          <w:bCs/>
+        </w:rPr>
+        <w:t xml:space="preserve">Đơn vị</w:t>
+      </w:r>
+      <w:r>
+        <w:t xml:space="preserve"> bị khoá khi sửa — khách hàng đã tạo không chuyển sang đơn vị khác được (hợp đồng đang gắn sẽ theo sang). Cần khách đó ở đơn vị khác thì tạo mới.</w:t>
       </w:r>
     </w:p>
     <w:p>
@@ -1663,14 +1610,7 @@
         <w:spacing w:after="80"/>
       </w:pPr>
       <w:r>
-        <w:rPr>
-          <w:b/>
-          <w:bCs/>
-        </w:rPr>
-        <w:t xml:space="preserve">Đã giao</w:t>
-      </w:r>
-      <w:r>
-        <w:t xml:space="preserve"> — tổng của các đợt giao đã điền ngày giao (kèm dòng *vượt …* nếu giao quá hợp đồng).</w:t>
+        <w:t xml:space="preserve">Trùng tên trong cùng một đơn vị sẽ bị chặn; hai đơn vị khác nhau được phép trùng tên khách.</w:t>
       </w:r>
     </w:p>
     <w:p>
@@ -1683,117 +1623,7 @@
         <w:spacing w:after="80"/>
       </w:pPr>
       <w:r>
-        <w:rPr>
-          <w:b/>
-          <w:bCs/>
-        </w:rPr>
-        <w:t xml:space="preserve">Còn phải giao</w:t>
-      </w:r>
-      <w:r>
-        <w:t xml:space="preserve"> = SL hợp đồng − Đã giao. Đây chính là phần “đã ký HĐ chưa giao”; dòng nhỏ *chờ giao …* cho biết trong đó bao nhiêu đã lập đợt nhưng chưa điền ngày giao.</w:t>
-      </w:r>
-    </w:p>
-    <w:p>
-      <w:pPr>
-        <w:pStyle w:val="ListParagraph"/>
-        <w:numPr>
-          <w:ilvl w:val="0"/>
-          <w:numId w:val="3"/>
-        </w:numPr>
-        <w:spacing w:after="80"/>
-      </w:pPr>
-      <w:r>
-        <w:rPr>
-          <w:b/>
-          <w:bCs/>
-        </w:rPr>
-        <w:t xml:space="preserve">Hình thức</w:t>
-      </w:r>
-      <w:r>
-        <w:t xml:space="preserve"> — hình thức tiêu thụ khai ở </w:t>
-      </w:r>
-      <w:r>
-        <w:rPr>
-          <w:b/>
-          <w:bCs/>
-        </w:rPr>
-        <w:t xml:space="preserve">lần giao</w:t>
-      </w:r>
-      <w:r>
-        <w:t xml:space="preserve">, nên hợp đồng giao nhiều lần hiện </w:t>
-      </w:r>
-      <w:r>
-        <w:rPr>
-          <w:b/>
-          <w:bCs/>
-        </w:rPr>
-        <w:t xml:space="preserve">tất cả</w:t>
-      </w:r>
-      <w:r>
-        <w:t xml:space="preserve"> hình thức của các đợt; hợp đồng chưa giao lần nào thì để trống.</w:t>
-      </w:r>
-    </w:p>
-    <w:p>
-      <w:pPr>
-        <w:pStyle w:val="ListParagraph"/>
-        <w:numPr>
-          <w:ilvl w:val="0"/>
-          <w:numId w:val="3"/>
-        </w:numPr>
-        <w:spacing w:after="80"/>
-      </w:pPr>
-      <w:r>
-        <w:rPr>
-          <w:b/>
-          <w:bCs/>
-        </w:rPr>
-        <w:t xml:space="preserve">Trạng thái</w:t>
-      </w:r>
-      <w:r>
-        <w:t xml:space="preserve"> — *Đang thực hiện* hay *Hoàn thành dd/mm/yyyy*. Hợp đồng đã hoàn thành không còn tính vào “đã ký HĐ chưa giao” và bị khoá sửa.</w:t>
-      </w:r>
-    </w:p>
-    <w:p>
-      <w:pPr>
-        <w:pStyle w:val="ListParagraph"/>
-        <w:numPr>
-          <w:ilvl w:val="0"/>
-          <w:numId w:val="3"/>
-        </w:numPr>
-        <w:spacing w:after="80"/>
-      </w:pPr>
-      <w:r>
-        <w:t xml:space="preserve">Các bộ lọc dùng chung được: </w:t>
-      </w:r>
-      <w:r>
-        <w:rPr>
-          <w:b/>
-          <w:bCs/>
-        </w:rPr>
-        <w:t xml:space="preserve">Đơn vị · Khách hàng</w:t>
-      </w:r>
-      <w:r>
-        <w:t xml:space="preserve"> (gõ để tìm, chọn nhiều) </w:t>
-      </w:r>
-      <w:r>
-        <w:rPr>
-          <w:b/>
-          <w:bCs/>
-        </w:rPr>
-        <w:t xml:space="preserve">· Trạng thái · Hình thức · Ngày ký</w:t>
-      </w:r>
-      <w:r>
-        <w:t xml:space="preserve"> và ô </w:t>
-      </w:r>
-      <w:r>
-        <w:rPr>
-          <w:b/>
-          <w:bCs/>
-        </w:rPr>
-        <w:t xml:space="preserve">tìm theo số HĐ</w:t>
-      </w:r>
-      <w:r>
-        <w:t xml:space="preserve"> (gõ không dấu vẫn ra).</w:t>
+        <w:t xml:space="preserve">Khách hàng đang có hợp đồng thì không xoá được — hãy ẩn thay vì xoá.</w:t>
       </w:r>
     </w:p>
     <w:p>
@@ -1802,7 +1632,7 @@
         <w:pageBreakBefore/>
       </w:pPr>
       <w:r>
-        <w:t xml:space="preserve">8. Thêm hợp đồng</w:t>
+        <w:t xml:space="preserve">7. Hợp đồng &amp; đợt giao — danh sách</w:t>
       </w:r>
     </w:p>
     <w:p>
@@ -1817,7 +1647,15 @@
         <w:t xml:space="preserve">Vị trí: </w:t>
       </w:r>
       <w:r>
-        <w:t xml:space="preserve">Quản lý hợp đồng → Hợp đồng &amp; đợt giao → Thêm hợp đồng</w:t>
+        <w:t xml:space="preserve">Quản lý hợp đồng → Hợp đồng &amp; đợt giao</w:t>
+      </w:r>
+    </w:p>
+    <w:p>
+      <w:pPr>
+        <w:spacing w:after="140"/>
+      </w:pPr>
+      <w:r>
+        <w:t xml:space="preserve">Danh sách các hợp đồng của đơn vị kèm tiến độ giao hàng.</w:t>
       </w:r>
     </w:p>
     <w:p>
@@ -1830,7 +1668,7 @@
           <wp:inline distT="0" distB="0" distL="0" distR="0">
             <wp:extent cx="6191250" cy="3381375"/>
             <wp:effectExtent t="0" r="0" b="0" l="0"/>
-            <wp:docPr id="1" name="img" descr="Ảnh hướng dẫn có đánh số bước" title="img/07-hop-dong-form.png"/>
+            <wp:docPr id="1" name="img" descr="Ảnh hướng dẫn có đánh số bước" title="img/06-hop-dong-danh-sach.png"/>
             <wp:cNvGraphicFramePr>
               <a:graphicFrameLocks xmlns:a="http://schemas.openxmlformats.org/drawingml/2006/main" noChangeAspect="1"/>
             </wp:cNvGraphicFramePr>
@@ -1879,7 +1717,7 @@
           <w:sz w:val="17"/>
           <w:szCs w:val="17"/>
         </w:rPr>
-        <w:t xml:space="preserve">Hình 7. Phiếu thêm hợp đồng</w:t>
+        <w:t xml:space="preserve">Hình 6. Danh sách hợp đồng và tiến độ giao</w:t>
       </w:r>
     </w:p>
     <w:p>
@@ -1899,219 +1737,79 @@
         <w:pStyle w:val="ListParagraph"/>
         <w:numPr>
           <w:ilvl w:val="0"/>
-          <w:numId w:val="10"/>
-        </w:numPr>
-        <w:spacing w:after="100"/>
-      </w:pPr>
-      <w:r>
-        <w:rPr>
-          <w:b/>
-          <w:bCs/>
-        </w:rPr>
-        <w:t xml:space="preserve">Số hợp đồng</w:t>
-      </w:r>
-      <w:r>
-        <w:t xml:space="preserve"> — bắt buộc, không trùng trong cùng đơn vị.</w:t>
-      </w:r>
-    </w:p>
-    <w:p>
-      <w:pPr>
-        <w:pStyle w:val="ListParagraph"/>
-        <w:numPr>
-          <w:ilvl w:val="0"/>
-          <w:numId w:val="10"/>
-        </w:numPr>
-        <w:spacing w:after="100"/>
-      </w:pPr>
-      <w:r>
-        <w:rPr>
-          <w:b/>
-          <w:bCs/>
-        </w:rPr>
-        <w:t xml:space="preserve">Khách hàng</w:t>
-      </w:r>
-      <w:r>
-        <w:t xml:space="preserve"> — bắt buộc; gõ vài chữ trong tên (hoặc mã khách) rồi chọn. Danh sách chỉ có khách của chính đơn vị (mục 6).</w:t>
-      </w:r>
-    </w:p>
-    <w:p>
-      <w:pPr>
-        <w:pStyle w:val="ListParagraph"/>
-        <w:numPr>
-          <w:ilvl w:val="0"/>
-          <w:numId w:val="10"/>
-        </w:numPr>
-        <w:spacing w:after="100"/>
-      </w:pPr>
-      <w:r>
-        <w:rPr>
-          <w:b/>
-          <w:bCs/>
-        </w:rPr>
-        <w:t xml:space="preserve">Loại hợp đồng</w:t>
-      </w:r>
-      <w:r>
-        <w:t xml:space="preserve"> — bắt buộc: *HĐ dài hạn* hay *HĐ chuyến*. Đây là chỉ tiêu của báo cáo, </w:t>
-      </w:r>
-      <w:r>
-        <w:rPr>
-          <w:b/>
-          <w:bCs/>
-        </w:rPr>
-        <w:t xml:space="preserve">khác</w:t>
-      </w:r>
-      <w:r>
-        <w:t xml:space="preserve"> với Loại giao bên dưới.</w:t>
-      </w:r>
-    </w:p>
-    <w:p>
-      <w:pPr>
-        <w:pStyle w:val="ListParagraph"/>
-        <w:numPr>
-          <w:ilvl w:val="0"/>
-          <w:numId w:val="10"/>
-        </w:numPr>
-        <w:spacing w:after="100"/>
-      </w:pPr>
-      <w:r>
-        <w:rPr>
-          <w:b/>
-          <w:bCs/>
-        </w:rPr>
-        <w:t xml:space="preserve">Loại giao</w:t>
-      </w:r>
-      <w:r>
-        <w:t xml:space="preserve"> — *Giao 1 lần* (cả hợp đồng giao trọn một lần) hay *Giao nhiều lần* (chia thành nhiều đợt giao). Chọn nhầm vẫn đổi được sau, xem mục 9.</w:t>
-      </w:r>
-    </w:p>
-    <w:p>
-      <w:pPr>
-        <w:pStyle w:val="ListParagraph"/>
-        <w:numPr>
-          <w:ilvl w:val="0"/>
-          <w:numId w:val="10"/>
-        </w:numPr>
-        <w:spacing w:after="100"/>
-      </w:pPr>
-      <w:r>
-        <w:rPr>
-          <w:b/>
-          <w:bCs/>
-        </w:rPr>
-        <w:t xml:space="preserve">Ngày ký</w:t>
-      </w:r>
-      <w:r>
-        <w:t xml:space="preserve"> — bắt buộc. Từ ngày này, sản lượng hợp đồng nằm ở mục “đã ký HĐ chưa giao”.</w:t>
-      </w:r>
-    </w:p>
-    <w:p>
-      <w:pPr>
-        <w:pStyle w:val="ListParagraph"/>
-        <w:numPr>
-          <w:ilvl w:val="0"/>
-          <w:numId w:val="10"/>
-        </w:numPr>
-        <w:spacing w:after="100"/>
-      </w:pPr>
-      <w:r>
-        <w:rPr>
-          <w:b/>
-          <w:bCs/>
-        </w:rPr>
-        <w:t xml:space="preserve">Ngày giao</w:t>
-      </w:r>
-      <w:r>
-        <w:t xml:space="preserve"> — chỉ hiện với hợp đồng *giao 1 lần*; điền khi đã giao xong. Bên dưới là </w:t>
-      </w:r>
-      <w:r>
-        <w:rPr>
-          <w:b/>
-          <w:bCs/>
-        </w:rPr>
-        <w:t xml:space="preserve">Hình thức tiêu thụ</w:t>
-      </w:r>
-      <w:r>
-        <w:t xml:space="preserve"> và khối </w:t>
-      </w:r>
-      <w:r>
-        <w:rPr>
-          <w:b/>
-          <w:bCs/>
-        </w:rPr>
-        <w:t xml:space="preserve">Hoá đơn</w:t>
-      </w:r>
-      <w:r>
-        <w:t xml:space="preserve"> (số hoá đơn + file scan).</w:t>
-      </w:r>
-    </w:p>
-    <w:p>
-      <w:pPr>
-        <w:pStyle w:val="ListParagraph"/>
-        <w:numPr>
-          <w:ilvl w:val="0"/>
-          <w:numId w:val="10"/>
-        </w:numPr>
-        <w:spacing w:after="100"/>
-      </w:pPr>
-      <w:r>
-        <w:rPr>
-          <w:b/>
-          <w:bCs/>
-        </w:rPr>
-        <w:t xml:space="preserve">Chi tiết hợp đồng</w:t>
-      </w:r>
-      <w:r>
-        <w:t xml:space="preserve"> — mỗi chủng loại một dòng (ô SL đổi nhãn thành </w:t>
-      </w:r>
-      <w:r>
-        <w:rPr>
-          <w:b/>
-          <w:bCs/>
-        </w:rPr>
-        <w:t xml:space="preserve">SL nước</w:t>
-      </w:r>
-      <w:r>
-        <w:t xml:space="preserve"> với latex và mủ nguyên liệu). Ô </w:t>
-      </w:r>
-      <w:r>
-        <w:rPr>
-          <w:b/>
-          <w:bCs/>
-        </w:rPr>
-        <w:t xml:space="preserve">Quy khô</w:t>
-      </w:r>
-      <w:r>
-        <w:t xml:space="preserve"> chỉ hiện với latex và mủ nguyên liệu; ô </w:t>
-      </w:r>
-      <w:r>
-        <w:rPr>
-          <w:b/>
-          <w:bCs/>
-        </w:rPr>
-        <w:t xml:space="preserve">Tỷ giá</w:t>
-      </w:r>
-      <w:r>
-        <w:t xml:space="preserve"> chỉ hiện khi dòng bán bằng ngoại tệ.</w:t>
-      </w:r>
-    </w:p>
-    <w:p>
-      <w:pPr>
-        <w:pStyle w:val="ListParagraph"/>
-        <w:numPr>
-          <w:ilvl w:val="0"/>
-          <w:numId w:val="10"/>
-        </w:numPr>
-        <w:spacing w:after="100"/>
-      </w:pPr>
-      <w:r>
-        <w:rPr>
-          <w:b/>
-          <w:bCs/>
-        </w:rPr>
-        <w:t xml:space="preserve">Thành tiền</w:t>
-      </w:r>
-      <w:r>
-        <w:t xml:space="preserve"> — ô CHỈ ĐỌC ở cuối mỗi dòng (= số lượng × đơn giá, theo đúng loại tiền của dòng). Tổng thành tiền của hợp đồng hiện ngay dưới bảng, quy về triệu đồng.</w:t>
+          <w:numId w:val="9"/>
+        </w:numPr>
+        <w:spacing w:after="100"/>
+      </w:pPr>
+      <w:r>
+        <w:rPr>
+          <w:b/>
+          <w:bCs/>
+        </w:rPr>
+        <w:t xml:space="preserve">Thêm hợp đồng</w:t>
+      </w:r>
+      <w:r>
+        <w:t xml:space="preserve"> — lập hợp đồng mới (xem mục 8).</w:t>
+      </w:r>
+    </w:p>
+    <w:p>
+      <w:pPr>
+        <w:pStyle w:val="ListParagraph"/>
+        <w:numPr>
+          <w:ilvl w:val="0"/>
+          <w:numId w:val="9"/>
+        </w:numPr>
+        <w:spacing w:after="100"/>
+      </w:pPr>
+      <w:r>
+        <w:rPr>
+          <w:b/>
+          <w:bCs/>
+        </w:rPr>
+        <w:t xml:space="preserve">Lọc theo Hình thức</w:t>
+      </w:r>
+      <w:r>
+        <w:t xml:space="preserve"> — *Xuất khẩu / UTXK* · *Tiêu thụ trong nước* · *Tiêu thụ nội bộ*, hoặc </w:t>
+      </w:r>
+      <w:r>
+        <w:rPr>
+          <w:b/>
+          <w:bCs/>
+        </w:rPr>
+        <w:t xml:space="preserve">Chưa khai hình thức</w:t>
+      </w:r>
+      <w:r>
+        <w:t xml:space="preserve"> để tìm nhanh những hợp đồng cũ còn thiếu mục này.</w:t>
+      </w:r>
+    </w:p>
+    <w:p>
+      <w:pPr>
+        <w:pStyle w:val="ListParagraph"/>
+        <w:numPr>
+          <w:ilvl w:val="0"/>
+          <w:numId w:val="9"/>
+        </w:numPr>
+        <w:spacing w:after="100"/>
+      </w:pPr>
+      <w:r>
+        <w:rPr>
+          <w:b/>
+          <w:bCs/>
+        </w:rPr>
+        <w:t xml:space="preserve">Xem / Sửa / Xoá</w:t>
+      </w:r>
+      <w:r>
+        <w:t xml:space="preserve"> ở cuối mỗi dòng. Bấm </w:t>
+      </w:r>
+      <w:r>
+        <w:rPr>
+          <w:b/>
+          <w:bCs/>
+        </w:rPr>
+        <w:t xml:space="preserve">Xem</w:t>
+      </w:r>
+      <w:r>
+        <w:t xml:space="preserve"> để mở màn chi tiết (mục 9).</w:t>
       </w:r>
     </w:p>
     <w:p>
@@ -2140,30 +1838,10 @@
           <w:b/>
           <w:bCs/>
         </w:rPr>
-        <w:t xml:space="preserve">Không quản lý hợp đồng khung:</w:t>
-      </w:r>
-      <w:r>
-        <w:t xml:space="preserve"> đơn vị có hợp đồng dài hạn thì nhập </w:t>
-      </w:r>
-      <w:r>
-        <w:rPr>
-          <w:b/>
-          <w:bCs/>
-        </w:rPr>
-        <w:t xml:space="preserve">mỗi phụ lục như một hợp đồng</w:t>
-      </w:r>
-      <w:r>
-        <w:t xml:space="preserve"> và chọn loại </w:t>
-      </w:r>
-      <w:r>
-        <w:rPr>
-          <w:b/>
-          <w:bCs/>
-        </w:rPr>
-        <w:t xml:space="preserve">HĐ dài hạn</w:t>
-      </w:r>
-      <w:r>
-        <w:t xml:space="preserve"> để phân biệt.</w:t>
+        <w:t xml:space="preserve">SL hợp đồng</w:t>
+      </w:r>
+      <w:r>
+        <w:t xml:space="preserve"> — tổng sản lượng ghi trên hợp đồng đã ký.</w:t>
       </w:r>
     </w:p>
     <w:p>
@@ -2180,40 +1858,10 @@
           <w:b/>
           <w:bCs/>
         </w:rPr>
-        <w:t xml:space="preserve">LATEX và 2 loại mủ nguyên liệu bán theo MỦ NƯỚC:</w:t>
-      </w:r>
-      <w:r>
-        <w:t xml:space="preserve"> ô </w:t>
-      </w:r>
-      <w:r>
-        <w:rPr>
-          <w:b/>
-          <w:bCs/>
-        </w:rPr>
-        <w:t xml:space="preserve">SL nước (tấn)</w:t>
-      </w:r>
-      <w:r>
-        <w:t xml:space="preserve"> là số để tính </w:t>
-      </w:r>
-      <w:r>
-        <w:rPr>
-          <w:b/>
-          <w:bCs/>
-        </w:rPr>
-        <w:t xml:space="preserve">Thành tiền</w:t>
-      </w:r>
-      <w:r>
-        <w:t xml:space="preserve"> (đơn giá là giá theo tấn mủ nước), còn </w:t>
-      </w:r>
-      <w:r>
-        <w:rPr>
-          <w:b/>
-          <w:bCs/>
-        </w:rPr>
-        <w:t xml:space="preserve">sản lượng tiêu thụ trên báo cáo lấy theo ô Quy khô</w:t>
-      </w:r>
-      <w:r>
-        <w:t xml:space="preserve">. Vì vậy hai ô này phải khai đủ và đúng.</w:t>
+        <w:t xml:space="preserve">Đã giao</w:t>
+      </w:r>
+      <w:r>
+        <w:t xml:space="preserve"> — tổng của các đợt giao đã điền ngày giao (kèm dòng *vượt …* nếu giao quá hợp đồng).</w:t>
       </w:r>
     </w:p>
     <w:p>
@@ -2226,57 +1874,14 @@
         <w:spacing w:after="80"/>
       </w:pPr>
       <w:r>
-        <w:t xml:space="preserve">Bán bằng </w:t>
-      </w:r>
-      <w:r>
-        <w:rPr>
-          <w:b/>
-          <w:bCs/>
-        </w:rPr>
-        <w:t xml:space="preserve">VNĐ</w:t>
-      </w:r>
-      <w:r>
-        <w:t xml:space="preserve"> nhập đơn giá theo </w:t>
-      </w:r>
-      <w:r>
-        <w:rPr>
-          <w:b/>
-          <w:bCs/>
-        </w:rPr>
-        <w:t xml:space="preserve">triệu đồng/tấn</w:t>
-      </w:r>
-      <w:r>
-        <w:t xml:space="preserve">; bán bằng </w:t>
-      </w:r>
-      <w:r>
-        <w:rPr>
-          <w:b/>
-          <w:bCs/>
-        </w:rPr>
-        <w:t xml:space="preserve">ngoại tệ</w:t>
-      </w:r>
-      <w:r>
-        <w:t xml:space="preserve"> nhập theo </w:t>
-      </w:r>
-      <w:r>
-        <w:rPr>
-          <w:b/>
-          <w:bCs/>
-        </w:rPr>
-        <w:t xml:space="preserve">ngoại tệ/tấn</w:t>
-      </w:r>
-      <w:r>
-        <w:t xml:space="preserve"> và </w:t>
-      </w:r>
-      <w:r>
-        <w:rPr>
-          <w:b/>
-          <w:bCs/>
-        </w:rPr>
-        <w:t xml:space="preserve">phải có tỷ giá</w:t>
-      </w:r>
-      <w:r>
-        <w:t xml:space="preserve"> quy ra VNĐ, nếu không doanh thu sẽ hiện “—”.</w:t>
+        <w:rPr>
+          <w:b/>
+          <w:bCs/>
+        </w:rPr>
+        <w:t xml:space="preserve">Còn phải giao</w:t>
+      </w:r>
+      <w:r>
+        <w:t xml:space="preserve"> = SL hợp đồng − Đã giao. Đây chính là phần “đã ký HĐ chưa giao”; dòng nhỏ *chờ giao …* cho biết trong đó bao nhiêu đã lập đợt nhưng chưa điền ngày giao.</w:t>
       </w:r>
     </w:p>
     <w:p>
@@ -2289,27 +1894,34 @@
         <w:spacing w:after="80"/>
       </w:pPr>
       <w:r>
-        <w:t xml:space="preserve">Bán </w:t>
-      </w:r>
-      <w:r>
-        <w:rPr>
-          <w:b/>
-          <w:bCs/>
-        </w:rPr>
-        <w:t xml:space="preserve">LATEX</w:t>
-      </w:r>
-      <w:r>
-        <w:t xml:space="preserve"> và 2 loại mủ nguyên liệu thì </w:t>
-      </w:r>
-      <w:r>
-        <w:rPr>
-          <w:b/>
-          <w:bCs/>
-        </w:rPr>
-        <w:t xml:space="preserve">bắt buộc nhập quy khô</w:t>
-      </w:r>
-      <w:r>
-        <w:t xml:space="preserve"> mới lưu được.</w:t>
+        <w:rPr>
+          <w:b/>
+          <w:bCs/>
+        </w:rPr>
+        <w:t xml:space="preserve">Hình thức</w:t>
+      </w:r>
+      <w:r>
+        <w:t xml:space="preserve"> — hình thức tiêu thụ khai ở </w:t>
+      </w:r>
+      <w:r>
+        <w:rPr>
+          <w:b/>
+          <w:bCs/>
+        </w:rPr>
+        <w:t xml:space="preserve">lần giao</w:t>
+      </w:r>
+      <w:r>
+        <w:t xml:space="preserve">, nên hợp đồng giao nhiều lần hiện </w:t>
+      </w:r>
+      <w:r>
+        <w:rPr>
+          <w:b/>
+          <w:bCs/>
+        </w:rPr>
+        <w:t xml:space="preserve">tất cả</w:t>
+      </w:r>
+      <w:r>
+        <w:t xml:space="preserve"> hình thức của các đợt; hợp đồng chưa giao lần nào thì để trống.</w:t>
       </w:r>
     </w:p>
     <w:p>
@@ -2322,17 +1934,57 @@
         <w:spacing w:after="80"/>
       </w:pPr>
       <w:r>
-        <w:t xml:space="preserve">Hợp đồng </w:t>
-      </w:r>
-      <w:r>
-        <w:rPr>
-          <w:b/>
-          <w:bCs/>
-        </w:rPr>
-        <w:t xml:space="preserve">giao nhiều lần</w:t>
-      </w:r>
-      <w:r>
-        <w:t xml:space="preserve"> không tự đánh dấu đã giao — mỗi lần giao nhập một đợt giao.</w:t>
+        <w:rPr>
+          <w:b/>
+          <w:bCs/>
+        </w:rPr>
+        <w:t xml:space="preserve">Trạng thái</w:t>
+      </w:r>
+      <w:r>
+        <w:t xml:space="preserve"> — *Đang thực hiện* hay *Hoàn thành dd/mm/yyyy*. Hợp đồng đã hoàn thành không còn tính vào “đã ký HĐ chưa giao” và bị khoá sửa.</w:t>
+      </w:r>
+    </w:p>
+    <w:p>
+      <w:pPr>
+        <w:pStyle w:val="ListParagraph"/>
+        <w:numPr>
+          <w:ilvl w:val="0"/>
+          <w:numId w:val="3"/>
+        </w:numPr>
+        <w:spacing w:after="80"/>
+      </w:pPr>
+      <w:r>
+        <w:t xml:space="preserve">Các bộ lọc dùng chung được: </w:t>
+      </w:r>
+      <w:r>
+        <w:rPr>
+          <w:b/>
+          <w:bCs/>
+        </w:rPr>
+        <w:t xml:space="preserve">Đơn vị · Khách hàng</w:t>
+      </w:r>
+      <w:r>
+        <w:t xml:space="preserve"> (gõ để tìm, chọn nhiều) </w:t>
+      </w:r>
+      <w:r>
+        <w:rPr>
+          <w:b/>
+          <w:bCs/>
+        </w:rPr>
+        <w:t xml:space="preserve">· Trạng thái · Hình thức · Ngày ký</w:t>
+      </w:r>
+      <w:r>
+        <w:t xml:space="preserve"> và ô </w:t>
+      </w:r>
+      <w:r>
+        <w:rPr>
+          <w:b/>
+          <w:bCs/>
+        </w:rPr>
+        <w:t xml:space="preserve">tìm theo số HĐ</w:t>
+      </w:r>
+      <w:r>
+        <w:t xml:space="preserve"> (gõ không dấu vẫn ra).</w:t>
       </w:r>
     </w:p>
     <w:p>
@@ -2341,7 +1993,7 @@
         <w:pageBreakBefore/>
       </w:pPr>
       <w:r>
-        <w:t xml:space="preserve">9. Màn chi tiết hợp đồng</w:t>
+        <w:t xml:space="preserve">8. Thêm hợp đồng</w:t>
       </w:r>
     </w:p>
     <w:p>
@@ -2356,15 +2008,7 @@
         <w:t xml:space="preserve">Vị trí: </w:t>
       </w:r>
       <w:r>
-        <w:t xml:space="preserve">Quản lý hợp đồng → Hợp đồng &amp; đợt giao → bấm Xem ở dòng hợp đồng</w:t>
-      </w:r>
-    </w:p>
-    <w:p>
-      <w:pPr>
-        <w:spacing w:after="140"/>
-      </w:pPr>
-      <w:r>
-        <w:t xml:space="preserve">Nơi theo dõi tiến độ một hợp đồng, nhập các đợt giao và chốt hợp đồng khi kết thúc.</w:t>
+        <w:t xml:space="preserve">Quản lý hợp đồng → Hợp đồng &amp; đợt giao → Thêm hợp đồng</w:t>
       </w:r>
     </w:p>
     <w:p>
@@ -2377,7 +2021,7 @@
           <wp:inline distT="0" distB="0" distL="0" distR="0">
             <wp:extent cx="6191250" cy="3381375"/>
             <wp:effectExtent t="0" r="0" b="0" l="0"/>
-            <wp:docPr id="1" name="img" descr="Ảnh hướng dẫn có đánh số bước" title="img/08-hop-dong-chi-tiet.png"/>
+            <wp:docPr id="1" name="img" descr="Ảnh hướng dẫn có đánh số bước" title="img/07-hop-dong-form.png"/>
             <wp:cNvGraphicFramePr>
               <a:graphicFrameLocks xmlns:a="http://schemas.openxmlformats.org/drawingml/2006/main" noChangeAspect="1"/>
             </wp:cNvGraphicFramePr>
@@ -2426,7 +2070,7 @@
           <w:sz w:val="17"/>
           <w:szCs w:val="17"/>
         </w:rPr>
-        <w:t xml:space="preserve">Hình 8. Màn chi tiết hợp đồng</w:t>
+        <w:t xml:space="preserve">Hình 7. Phiếu thêm hợp đồng</w:t>
       </w:r>
     </w:p>
     <w:p>
@@ -2446,139 +2090,219 @@
         <w:pStyle w:val="ListParagraph"/>
         <w:numPr>
           <w:ilvl w:val="0"/>
-          <w:numId w:val="11"/>
-        </w:numPr>
-        <w:spacing w:after="100"/>
-      </w:pPr>
-      <w:r>
-        <w:rPr>
-          <w:b/>
-          <w:bCs/>
-        </w:rPr>
-        <w:t xml:space="preserve">Hàng số liệu</w:t>
-      </w:r>
-      <w:r>
-        <w:t xml:space="preserve"> — khách hàng, loại hợp đồng, sản lượng hợp đồng, đã giao, còn phải giao, trạng thái. Luôn hiện dù đang ở tab nào.</w:t>
-      </w:r>
-    </w:p>
-    <w:p>
-      <w:pPr>
-        <w:pStyle w:val="ListParagraph"/>
-        <w:numPr>
-          <w:ilvl w:val="0"/>
-          <w:numId w:val="11"/>
-        </w:numPr>
-        <w:spacing w:after="100"/>
-      </w:pPr>
-      <w:r>
-        <w:rPr>
-          <w:b/>
-          <w:bCs/>
-        </w:rPr>
-        <w:t xml:space="preserve">Chuyển sang giao nhiều lần / Chuyển về giao 1 lần</w:t>
-      </w:r>
-      <w:r>
-        <w:t xml:space="preserve"> — đổi loại giao ngay tại đây, </w:t>
-      </w:r>
-      <w:r>
-        <w:rPr>
-          <w:b/>
-          <w:bCs/>
-        </w:rPr>
-        <w:t xml:space="preserve">không phải xoá hợp đồng nhập lại</w:t>
-      </w:r>
-      <w:r>
-        <w:t xml:space="preserve">. Hợp đồng giao-1-lần đã ghi ngày giao thì lần giao đó tự chuyển thành </w:t>
-      </w:r>
-      <w:r>
-        <w:rPr>
-          <w:b/>
-          <w:bCs/>
-        </w:rPr>
-        <w:t xml:space="preserve">đợt giao đầu tiên</w:t>
-      </w:r>
-      <w:r>
-        <w:t xml:space="preserve"> (giữ nguyên ngày giao, hoá đơn, thanh toán, chi tiết hàng).</w:t>
-      </w:r>
-    </w:p>
-    <w:p>
-      <w:pPr>
-        <w:pStyle w:val="ListParagraph"/>
-        <w:numPr>
-          <w:ilvl w:val="0"/>
-          <w:numId w:val="11"/>
-        </w:numPr>
-        <w:spacing w:after="100"/>
-      </w:pPr>
-      <w:r>
-        <w:rPr>
-          <w:b/>
-          <w:bCs/>
-        </w:rPr>
-        <w:t xml:space="preserve">Hoàn thành hợp đồng</w:t>
-      </w:r>
-      <w:r>
-        <w:t xml:space="preserve"> — chốt thời điểm kết thúc (xem mục 11).</w:t>
-      </w:r>
-    </w:p>
-    <w:p>
-      <w:pPr>
-        <w:pStyle w:val="ListParagraph"/>
-        <w:numPr>
-          <w:ilvl w:val="0"/>
-          <w:numId w:val="11"/>
-        </w:numPr>
-        <w:spacing w:after="100"/>
-      </w:pPr>
-      <w:r>
-        <w:rPr>
-          <w:b/>
-          <w:bCs/>
-        </w:rPr>
-        <w:t xml:space="preserve">Tab Thông tin hợp đồng</w:t>
-      </w:r>
-      <w:r>
-        <w:t xml:space="preserve"> — sửa hợp đồng, file scan, ghi chú và các dòng chi tiết đã ký.</w:t>
-      </w:r>
-    </w:p>
-    <w:p>
-      <w:pPr>
-        <w:pStyle w:val="ListParagraph"/>
-        <w:numPr>
-          <w:ilvl w:val="0"/>
-          <w:numId w:val="11"/>
-        </w:numPr>
-        <w:spacing w:after="100"/>
-      </w:pPr>
-      <w:r>
-        <w:rPr>
-          <w:b/>
-          <w:bCs/>
-        </w:rPr>
-        <w:t xml:space="preserve">Tab Đợt giao</w:t>
-      </w:r>
-      <w:r>
-        <w:t xml:space="preserve"> — danh sách các lần giao; hợp đồng giao nhiều lần mở thẳng vào tab này.</w:t>
-      </w:r>
-    </w:p>
-    <w:p>
-      <w:pPr>
-        <w:pStyle w:val="ListParagraph"/>
-        <w:numPr>
-          <w:ilvl w:val="0"/>
-          <w:numId w:val="11"/>
-        </w:numPr>
-        <w:spacing w:after="100"/>
-      </w:pPr>
-      <w:r>
-        <w:rPr>
-          <w:b/>
-          <w:bCs/>
-        </w:rPr>
-        <w:t xml:space="preserve">Thêm đợt giao</w:t>
-      </w:r>
-      <w:r>
-        <w:t xml:space="preserve"> — ghi một lần giao mới (xem mục 10).</w:t>
+          <w:numId w:val="10"/>
+        </w:numPr>
+        <w:spacing w:after="100"/>
+      </w:pPr>
+      <w:r>
+        <w:rPr>
+          <w:b/>
+          <w:bCs/>
+        </w:rPr>
+        <w:t xml:space="preserve">Số hợp đồng</w:t>
+      </w:r>
+      <w:r>
+        <w:t xml:space="preserve"> — bắt buộc, không trùng trong cùng đơn vị.</w:t>
+      </w:r>
+    </w:p>
+    <w:p>
+      <w:pPr>
+        <w:pStyle w:val="ListParagraph"/>
+        <w:numPr>
+          <w:ilvl w:val="0"/>
+          <w:numId w:val="10"/>
+        </w:numPr>
+        <w:spacing w:after="100"/>
+      </w:pPr>
+      <w:r>
+        <w:rPr>
+          <w:b/>
+          <w:bCs/>
+        </w:rPr>
+        <w:t xml:space="preserve">Khách hàng</w:t>
+      </w:r>
+      <w:r>
+        <w:t xml:space="preserve"> — bắt buộc; gõ vài chữ trong tên (hoặc mã khách) rồi chọn. Danh sách chỉ có khách của chính đơn vị (mục 6).</w:t>
+      </w:r>
+    </w:p>
+    <w:p>
+      <w:pPr>
+        <w:pStyle w:val="ListParagraph"/>
+        <w:numPr>
+          <w:ilvl w:val="0"/>
+          <w:numId w:val="10"/>
+        </w:numPr>
+        <w:spacing w:after="100"/>
+      </w:pPr>
+      <w:r>
+        <w:rPr>
+          <w:b/>
+          <w:bCs/>
+        </w:rPr>
+        <w:t xml:space="preserve">Loại hợp đồng</w:t>
+      </w:r>
+      <w:r>
+        <w:t xml:space="preserve"> — bắt buộc: *HĐ dài hạn* hay *HĐ chuyến*. Đây là chỉ tiêu của báo cáo, </w:t>
+      </w:r>
+      <w:r>
+        <w:rPr>
+          <w:b/>
+          <w:bCs/>
+        </w:rPr>
+        <w:t xml:space="preserve">khác</w:t>
+      </w:r>
+      <w:r>
+        <w:t xml:space="preserve"> với Loại giao bên dưới.</w:t>
+      </w:r>
+    </w:p>
+    <w:p>
+      <w:pPr>
+        <w:pStyle w:val="ListParagraph"/>
+        <w:numPr>
+          <w:ilvl w:val="0"/>
+          <w:numId w:val="10"/>
+        </w:numPr>
+        <w:spacing w:after="100"/>
+      </w:pPr>
+      <w:r>
+        <w:rPr>
+          <w:b/>
+          <w:bCs/>
+        </w:rPr>
+        <w:t xml:space="preserve">Loại giao</w:t>
+      </w:r>
+      <w:r>
+        <w:t xml:space="preserve"> — *Giao 1 lần* (cả hợp đồng giao trọn một lần) hay *Giao nhiều lần* (chia thành nhiều đợt giao). Chọn nhầm vẫn đổi được sau, xem mục 9.</w:t>
+      </w:r>
+    </w:p>
+    <w:p>
+      <w:pPr>
+        <w:pStyle w:val="ListParagraph"/>
+        <w:numPr>
+          <w:ilvl w:val="0"/>
+          <w:numId w:val="10"/>
+        </w:numPr>
+        <w:spacing w:after="100"/>
+      </w:pPr>
+      <w:r>
+        <w:rPr>
+          <w:b/>
+          <w:bCs/>
+        </w:rPr>
+        <w:t xml:space="preserve">Ngày ký</w:t>
+      </w:r>
+      <w:r>
+        <w:t xml:space="preserve"> — bắt buộc. Từ ngày này, sản lượng hợp đồng nằm ở mục “đã ký HĐ chưa giao”.</w:t>
+      </w:r>
+    </w:p>
+    <w:p>
+      <w:pPr>
+        <w:pStyle w:val="ListParagraph"/>
+        <w:numPr>
+          <w:ilvl w:val="0"/>
+          <w:numId w:val="10"/>
+        </w:numPr>
+        <w:spacing w:after="100"/>
+      </w:pPr>
+      <w:r>
+        <w:rPr>
+          <w:b/>
+          <w:bCs/>
+        </w:rPr>
+        <w:t xml:space="preserve">Ngày giao</w:t>
+      </w:r>
+      <w:r>
+        <w:t xml:space="preserve"> — chỉ hiện với hợp đồng *giao 1 lần*; điền khi đã giao xong. Bên dưới là </w:t>
+      </w:r>
+      <w:r>
+        <w:rPr>
+          <w:b/>
+          <w:bCs/>
+        </w:rPr>
+        <w:t xml:space="preserve">Hình thức tiêu thụ</w:t>
+      </w:r>
+      <w:r>
+        <w:t xml:space="preserve"> và khối </w:t>
+      </w:r>
+      <w:r>
+        <w:rPr>
+          <w:b/>
+          <w:bCs/>
+        </w:rPr>
+        <w:t xml:space="preserve">Hoá đơn</w:t>
+      </w:r>
+      <w:r>
+        <w:t xml:space="preserve"> (số hoá đơn + file scan).</w:t>
+      </w:r>
+    </w:p>
+    <w:p>
+      <w:pPr>
+        <w:pStyle w:val="ListParagraph"/>
+        <w:numPr>
+          <w:ilvl w:val="0"/>
+          <w:numId w:val="10"/>
+        </w:numPr>
+        <w:spacing w:after="100"/>
+      </w:pPr>
+      <w:r>
+        <w:rPr>
+          <w:b/>
+          <w:bCs/>
+        </w:rPr>
+        <w:t xml:space="preserve">Chi tiết hợp đồng</w:t>
+      </w:r>
+      <w:r>
+        <w:t xml:space="preserve"> — mỗi chủng loại một dòng (ô SL đổi nhãn thành </w:t>
+      </w:r>
+      <w:r>
+        <w:rPr>
+          <w:b/>
+          <w:bCs/>
+        </w:rPr>
+        <w:t xml:space="preserve">SL nước</w:t>
+      </w:r>
+      <w:r>
+        <w:t xml:space="preserve"> với latex và mủ nguyên liệu). Ô </w:t>
+      </w:r>
+      <w:r>
+        <w:rPr>
+          <w:b/>
+          <w:bCs/>
+        </w:rPr>
+        <w:t xml:space="preserve">Quy khô</w:t>
+      </w:r>
+      <w:r>
+        <w:t xml:space="preserve"> chỉ hiện với latex và mủ nguyên liệu; ô </w:t>
+      </w:r>
+      <w:r>
+        <w:rPr>
+          <w:b/>
+          <w:bCs/>
+        </w:rPr>
+        <w:t xml:space="preserve">Tỷ giá</w:t>
+      </w:r>
+      <w:r>
+        <w:t xml:space="preserve"> chỉ hiện khi dòng bán bằng ngoại tệ.</w:t>
+      </w:r>
+    </w:p>
+    <w:p>
+      <w:pPr>
+        <w:pStyle w:val="ListParagraph"/>
+        <w:numPr>
+          <w:ilvl w:val="0"/>
+          <w:numId w:val="10"/>
+        </w:numPr>
+        <w:spacing w:after="100"/>
+      </w:pPr>
+      <w:r>
+        <w:rPr>
+          <w:b/>
+          <w:bCs/>
+        </w:rPr>
+        <w:t xml:space="preserve">Thành tiền</w:t>
+      </w:r>
+      <w:r>
+        <w:t xml:space="preserve"> — ô CHỈ ĐỌC ở cuối mỗi dòng (= số lượng × đơn giá, theo đúng loại tiền của dòng). Tổng thành tiền của hợp đồng hiện ngay dưới bảng, quy về triệu đồng.</w:t>
       </w:r>
     </w:p>
     <w:p>
@@ -2603,6 +2327,192 @@
         <w:spacing w:after="80"/>
       </w:pPr>
       <w:r>
+        <w:rPr>
+          <w:b/>
+          <w:bCs/>
+        </w:rPr>
+        <w:t xml:space="preserve">Không quản lý hợp đồng khung:</w:t>
+      </w:r>
+      <w:r>
+        <w:t xml:space="preserve"> đơn vị có hợp đồng dài hạn thì nhập </w:t>
+      </w:r>
+      <w:r>
+        <w:rPr>
+          <w:b/>
+          <w:bCs/>
+        </w:rPr>
+        <w:t xml:space="preserve">mỗi phụ lục như một hợp đồng</w:t>
+      </w:r>
+      <w:r>
+        <w:t xml:space="preserve"> và chọn loại </w:t>
+      </w:r>
+      <w:r>
+        <w:rPr>
+          <w:b/>
+          <w:bCs/>
+        </w:rPr>
+        <w:t xml:space="preserve">HĐ dài hạn</w:t>
+      </w:r>
+      <w:r>
+        <w:t xml:space="preserve"> để phân biệt.</w:t>
+      </w:r>
+    </w:p>
+    <w:p>
+      <w:pPr>
+        <w:pStyle w:val="ListParagraph"/>
+        <w:numPr>
+          <w:ilvl w:val="0"/>
+          <w:numId w:val="3"/>
+        </w:numPr>
+        <w:spacing w:after="80"/>
+      </w:pPr>
+      <w:r>
+        <w:rPr>
+          <w:b/>
+          <w:bCs/>
+        </w:rPr>
+        <w:t xml:space="preserve">LATEX và 2 loại mủ nguyên liệu bán theo MỦ NƯỚC:</w:t>
+      </w:r>
+      <w:r>
+        <w:t xml:space="preserve"> ô </w:t>
+      </w:r>
+      <w:r>
+        <w:rPr>
+          <w:b/>
+          <w:bCs/>
+        </w:rPr>
+        <w:t xml:space="preserve">SL nước (tấn)</w:t>
+      </w:r>
+      <w:r>
+        <w:t xml:space="preserve"> là số để tính </w:t>
+      </w:r>
+      <w:r>
+        <w:rPr>
+          <w:b/>
+          <w:bCs/>
+        </w:rPr>
+        <w:t xml:space="preserve">Thành tiền</w:t>
+      </w:r>
+      <w:r>
+        <w:t xml:space="preserve"> (đơn giá là giá theo tấn mủ nước), còn </w:t>
+      </w:r>
+      <w:r>
+        <w:rPr>
+          <w:b/>
+          <w:bCs/>
+        </w:rPr>
+        <w:t xml:space="preserve">sản lượng tiêu thụ trên báo cáo lấy theo ô Quy khô</w:t>
+      </w:r>
+      <w:r>
+        <w:t xml:space="preserve">. Vì vậy hai ô này phải khai đủ và đúng.</w:t>
+      </w:r>
+    </w:p>
+    <w:p>
+      <w:pPr>
+        <w:pStyle w:val="ListParagraph"/>
+        <w:numPr>
+          <w:ilvl w:val="0"/>
+          <w:numId w:val="3"/>
+        </w:numPr>
+        <w:spacing w:after="80"/>
+      </w:pPr>
+      <w:r>
+        <w:t xml:space="preserve">Bán bằng </w:t>
+      </w:r>
+      <w:r>
+        <w:rPr>
+          <w:b/>
+          <w:bCs/>
+        </w:rPr>
+        <w:t xml:space="preserve">VNĐ</w:t>
+      </w:r>
+      <w:r>
+        <w:t xml:space="preserve"> nhập đơn giá theo </w:t>
+      </w:r>
+      <w:r>
+        <w:rPr>
+          <w:b/>
+          <w:bCs/>
+        </w:rPr>
+        <w:t xml:space="preserve">triệu đồng/tấn</w:t>
+      </w:r>
+      <w:r>
+        <w:t xml:space="preserve">; bán bằng </w:t>
+      </w:r>
+      <w:r>
+        <w:rPr>
+          <w:b/>
+          <w:bCs/>
+        </w:rPr>
+        <w:t xml:space="preserve">ngoại tệ</w:t>
+      </w:r>
+      <w:r>
+        <w:t xml:space="preserve"> nhập theo </w:t>
+      </w:r>
+      <w:r>
+        <w:rPr>
+          <w:b/>
+          <w:bCs/>
+        </w:rPr>
+        <w:t xml:space="preserve">ngoại tệ/tấn</w:t>
+      </w:r>
+      <w:r>
+        <w:t xml:space="preserve"> và </w:t>
+      </w:r>
+      <w:r>
+        <w:rPr>
+          <w:b/>
+          <w:bCs/>
+        </w:rPr>
+        <w:t xml:space="preserve">phải có tỷ giá</w:t>
+      </w:r>
+      <w:r>
+        <w:t xml:space="preserve"> quy ra VNĐ, nếu không doanh thu sẽ hiện “—”.</w:t>
+      </w:r>
+    </w:p>
+    <w:p>
+      <w:pPr>
+        <w:pStyle w:val="ListParagraph"/>
+        <w:numPr>
+          <w:ilvl w:val="0"/>
+          <w:numId w:val="3"/>
+        </w:numPr>
+        <w:spacing w:after="80"/>
+      </w:pPr>
+      <w:r>
+        <w:t xml:space="preserve">Bán </w:t>
+      </w:r>
+      <w:r>
+        <w:rPr>
+          <w:b/>
+          <w:bCs/>
+        </w:rPr>
+        <w:t xml:space="preserve">LATEX</w:t>
+      </w:r>
+      <w:r>
+        <w:t xml:space="preserve"> và 2 loại mủ nguyên liệu thì </w:t>
+      </w:r>
+      <w:r>
+        <w:rPr>
+          <w:b/>
+          <w:bCs/>
+        </w:rPr>
+        <w:t xml:space="preserve">bắt buộc nhập quy khô</w:t>
+      </w:r>
+      <w:r>
+        <w:t xml:space="preserve"> mới lưu được.</w:t>
+      </w:r>
+    </w:p>
+    <w:p>
+      <w:pPr>
+        <w:pStyle w:val="ListParagraph"/>
+        <w:numPr>
+          <w:ilvl w:val="0"/>
+          <w:numId w:val="3"/>
+        </w:numPr>
+        <w:spacing w:after="80"/>
+      </w:pPr>
+      <w:r>
         <w:t xml:space="preserve">Hợp đồng </w:t>
       </w:r>
       <w:r>
@@ -2610,66 +2520,10 @@
           <w:b/>
           <w:bCs/>
         </w:rPr>
-        <w:t xml:space="preserve">giao 1 lần</w:t>
-      </w:r>
-      <w:r>
-        <w:t xml:space="preserve"> không có tab Đợt giao: chính hợp đồng là một lần giao.</w:t>
-      </w:r>
-    </w:p>
-    <w:p>
-      <w:pPr>
-        <w:pStyle w:val="ListParagraph"/>
-        <w:numPr>
-          <w:ilvl w:val="0"/>
-          <w:numId w:val="3"/>
-        </w:numPr>
-        <w:spacing w:after="80"/>
-      </w:pPr>
-      <w:r>
-        <w:t xml:space="preserve">Chỉ chuyển được </w:t>
-      </w:r>
-      <w:r>
-        <w:rPr>
-          <w:b/>
-          <w:bCs/>
-        </w:rPr>
-        <w:t xml:space="preserve">về</w:t>
-      </w:r>
-      <w:r>
-        <w:t xml:space="preserve"> giao 1 lần khi hợp đồng chưa có đợt giao nào.</w:t>
-      </w:r>
-    </w:p>
-    <w:p>
-      <w:pPr>
-        <w:pStyle w:val="ListParagraph"/>
-        <w:numPr>
-          <w:ilvl w:val="0"/>
-          <w:numId w:val="3"/>
-        </w:numPr>
-        <w:spacing w:after="80"/>
-      </w:pPr>
-      <w:r>
-        <w:t xml:space="preserve">Hợp đồng </w:t>
-      </w:r>
-      <w:r>
-        <w:rPr>
-          <w:b/>
-          <w:bCs/>
-        </w:rPr>
-        <w:t xml:space="preserve">đã hoàn thành</w:t>
-      </w:r>
-      <w:r>
-        <w:t xml:space="preserve"> chỉ còn nút </w:t>
-      </w:r>
-      <w:r>
-        <w:rPr>
-          <w:b/>
-          <w:bCs/>
-        </w:rPr>
-        <w:t xml:space="preserve">Mở lại hợp đồng</w:t>
-      </w:r>
-      <w:r>
-        <w:t xml:space="preserve">; muốn sửa hay thêm đợt giao thì phải mở lại trước.</w:t>
+        <w:t xml:space="preserve">giao nhiều lần</w:t>
+      </w:r>
+      <w:r>
+        <w:t xml:space="preserve"> không tự đánh dấu đã giao — mỗi lần giao nhập một đợt giao.</w:t>
       </w:r>
     </w:p>
     <w:p>
@@ -2678,7 +2532,7 @@
         <w:pageBreakBefore/>
       </w:pPr>
       <w:r>
-        <w:t xml:space="preserve">10. Thêm đợt giao — mỗi đợt là một lần giao</w:t>
+        <w:t xml:space="preserve">9. Màn chi tiết hợp đồng</w:t>
       </w:r>
     </w:p>
     <w:p>
@@ -2693,7 +2547,7 @@
         <w:t xml:space="preserve">Vị trí: </w:t>
       </w:r>
       <w:r>
-        <w:t xml:space="preserve">Màn chi tiết hợp đồng (mục 9) → tab Đợt giao → Thêm đợt giao</w:t>
+        <w:t xml:space="preserve">Quản lý hợp đồng → Hợp đồng &amp; đợt giao → bấm Xem ở dòng hợp đồng</w:t>
       </w:r>
     </w:p>
     <w:p>
@@ -2701,7 +2555,7 @@
         <w:spacing w:after="140"/>
       </w:pPr>
       <w:r>
-        <w:t xml:space="preserve">Mỗi đợt giao = một lần giao hàng + một lần thanh toán. Đây là cách ghi nhận tiêu thụ của cơ chế mới.</w:t>
+        <w:t xml:space="preserve">Nơi theo dõi tiến độ một hợp đồng, nhập các đợt giao và chốt hợp đồng khi kết thúc.</w:t>
       </w:r>
     </w:p>
     <w:p>
@@ -2714,7 +2568,7 @@
           <wp:inline distT="0" distB="0" distL="0" distR="0">
             <wp:extent cx="6191250" cy="3381375"/>
             <wp:effectExtent t="0" r="0" b="0" l="0"/>
-            <wp:docPr id="1" name="img" descr="Ảnh hướng dẫn có đánh số bước" title="img/09-dot-giao-form.png"/>
+            <wp:docPr id="1" name="img" descr="Ảnh hướng dẫn có đánh số bước" title="img/08-hop-dong-chi-tiet.png"/>
             <wp:cNvGraphicFramePr>
               <a:graphicFrameLocks xmlns:a="http://schemas.openxmlformats.org/drawingml/2006/main" noChangeAspect="1"/>
             </wp:cNvGraphicFramePr>
@@ -2763,7 +2617,7 @@
           <w:sz w:val="17"/>
           <w:szCs w:val="17"/>
         </w:rPr>
-        <w:t xml:space="preserve">Hình 9. Phiếu thêm đợt giao</w:t>
+        <w:t xml:space="preserve">Hình 8. Màn chi tiết hợp đồng</w:t>
       </w:r>
     </w:p>
     <w:p>
@@ -2783,149 +2637,139 @@
         <w:pStyle w:val="ListParagraph"/>
         <w:numPr>
           <w:ilvl w:val="0"/>
-          <w:numId w:val="12"/>
-        </w:numPr>
-        <w:spacing w:after="100"/>
-      </w:pPr>
-      <w:r>
-        <w:rPr>
-          <w:b/>
-          <w:bCs/>
-        </w:rPr>
-        <w:t xml:space="preserve">Số đợt giao</w:t>
-      </w:r>
-      <w:r>
-        <w:t xml:space="preserve"> — bắt buộc, không trùng trong cùng đơn vị (ví dụ *Đợt 01/HĐ-102*).</w:t>
-      </w:r>
-    </w:p>
-    <w:p>
-      <w:pPr>
-        <w:pStyle w:val="ListParagraph"/>
-        <w:numPr>
-          <w:ilvl w:val="0"/>
-          <w:numId w:val="12"/>
-        </w:numPr>
-        <w:spacing w:after="100"/>
-      </w:pPr>
-      <w:r>
-        <w:rPr>
-          <w:b/>
-          <w:bCs/>
-        </w:rPr>
-        <w:t xml:space="preserve">Ngày giao</w:t>
-      </w:r>
-      <w:r>
-        <w:t xml:space="preserve"> — để trống nghĩa là </w:t>
-      </w:r>
-      <w:r>
-        <w:rPr>
-          <w:b/>
-          <w:bCs/>
-        </w:rPr>
-        <w:t xml:space="preserve">đang chờ giao</w:t>
-      </w:r>
-      <w:r>
-        <w:t xml:space="preserve">; điền vào là đợt đã giao xong và </w:t>
-      </w:r>
-      <w:r>
-        <w:rPr>
-          <w:b/>
-          <w:bCs/>
-        </w:rPr>
-        <w:t xml:space="preserve">tính ngay vào tiêu thụ của ngày đó</w:t>
-      </w:r>
-      <w:r>
-        <w:t xml:space="preserve">.</w:t>
-      </w:r>
-    </w:p>
-    <w:p>
-      <w:pPr>
-        <w:pStyle w:val="ListParagraph"/>
-        <w:numPr>
-          <w:ilvl w:val="0"/>
-          <w:numId w:val="12"/>
-        </w:numPr>
-        <w:spacing w:after="100"/>
-      </w:pPr>
-      <w:r>
-        <w:rPr>
-          <w:b/>
-          <w:bCs/>
-        </w:rPr>
-        <w:t xml:space="preserve">Hình thức tiêu thụ</w:t>
-      </w:r>
-      <w:r>
-        <w:t xml:space="preserve"> — *Xuất khẩu / UTXK* · *Tiêu thụ trong nước* · *Tiêu thụ nội bộ*. Bắt buộc khi đã giao.</w:t>
-      </w:r>
-    </w:p>
-    <w:p>
-      <w:pPr>
-        <w:pStyle w:val="ListParagraph"/>
-        <w:numPr>
-          <w:ilvl w:val="0"/>
-          <w:numId w:val="12"/>
-        </w:numPr>
-        <w:spacing w:after="100"/>
-      </w:pPr>
-      <w:r>
-        <w:rPr>
-          <w:b/>
-          <w:bCs/>
-        </w:rPr>
-        <w:t xml:space="preserve">Chi tiết đợt giao</w:t>
-      </w:r>
-      <w:r>
-        <w:t xml:space="preserve"> — chủng loại, sản lượng, đơn giá thực tế của lần giao này. Ô Quy khô và Tỷ giá chỉ hiện khi áp dụng, giống phiếu hợp đồng.</w:t>
-      </w:r>
-    </w:p>
-    <w:p>
-      <w:pPr>
-        <w:pStyle w:val="ListParagraph"/>
-        <w:numPr>
-          <w:ilvl w:val="0"/>
-          <w:numId w:val="12"/>
-        </w:numPr>
-        <w:spacing w:after="100"/>
-      </w:pPr>
-      <w:r>
-        <w:rPr>
-          <w:b/>
-          <w:bCs/>
-        </w:rPr>
-        <w:t xml:space="preserve">Số hoá đơn</w:t>
-      </w:r>
-      <w:r>
-        <w:t xml:space="preserve"> + </w:t>
-      </w:r>
-      <w:r>
-        <w:rPr>
-          <w:b/>
-          <w:bCs/>
-        </w:rPr>
-        <w:t xml:space="preserve">Hoá đơn (scan)</w:t>
-      </w:r>
-      <w:r>
-        <w:t xml:space="preserve"> — số hoá đơn bán hàng của đợt và file đính kèm.</w:t>
-      </w:r>
-    </w:p>
-    <w:p>
-      <w:pPr>
-        <w:pStyle w:val="ListParagraph"/>
-        <w:numPr>
-          <w:ilvl w:val="0"/>
-          <w:numId w:val="12"/>
-        </w:numPr>
-        <w:spacing w:after="100"/>
-      </w:pPr>
-      <w:r>
-        <w:rPr>
-          <w:b/>
-          <w:bCs/>
-        </w:rPr>
-        <w:t xml:space="preserve">Thanh toán</w:t>
-      </w:r>
-      <w:r>
-        <w:t xml:space="preserve"> — ngày thanh toán, sản lượng của lần thanh toán, kèm chứng từ.</w:t>
+          <w:numId w:val="11"/>
+        </w:numPr>
+        <w:spacing w:after="100"/>
+      </w:pPr>
+      <w:r>
+        <w:rPr>
+          <w:b/>
+          <w:bCs/>
+        </w:rPr>
+        <w:t xml:space="preserve">Hàng số liệu</w:t>
+      </w:r>
+      <w:r>
+        <w:t xml:space="preserve"> — khách hàng, loại hợp đồng, sản lượng hợp đồng, đã giao, còn phải giao, trạng thái. Luôn hiện dù đang ở tab nào.</w:t>
+      </w:r>
+    </w:p>
+    <w:p>
+      <w:pPr>
+        <w:pStyle w:val="ListParagraph"/>
+        <w:numPr>
+          <w:ilvl w:val="0"/>
+          <w:numId w:val="11"/>
+        </w:numPr>
+        <w:spacing w:after="100"/>
+      </w:pPr>
+      <w:r>
+        <w:rPr>
+          <w:b/>
+          <w:bCs/>
+        </w:rPr>
+        <w:t xml:space="preserve">Chuyển sang giao nhiều lần / Chuyển về giao 1 lần</w:t>
+      </w:r>
+      <w:r>
+        <w:t xml:space="preserve"> — đổi loại giao ngay tại đây, </w:t>
+      </w:r>
+      <w:r>
+        <w:rPr>
+          <w:b/>
+          <w:bCs/>
+        </w:rPr>
+        <w:t xml:space="preserve">không phải xoá hợp đồng nhập lại</w:t>
+      </w:r>
+      <w:r>
+        <w:t xml:space="preserve">. Hợp đồng giao-1-lần đã ghi ngày giao thì lần giao đó tự chuyển thành </w:t>
+      </w:r>
+      <w:r>
+        <w:rPr>
+          <w:b/>
+          <w:bCs/>
+        </w:rPr>
+        <w:t xml:space="preserve">đợt giao đầu tiên</w:t>
+      </w:r>
+      <w:r>
+        <w:t xml:space="preserve"> (giữ nguyên ngày giao, hoá đơn, thanh toán, chi tiết hàng).</w:t>
+      </w:r>
+    </w:p>
+    <w:p>
+      <w:pPr>
+        <w:pStyle w:val="ListParagraph"/>
+        <w:numPr>
+          <w:ilvl w:val="0"/>
+          <w:numId w:val="11"/>
+        </w:numPr>
+        <w:spacing w:after="100"/>
+      </w:pPr>
+      <w:r>
+        <w:rPr>
+          <w:b/>
+          <w:bCs/>
+        </w:rPr>
+        <w:t xml:space="preserve">Hoàn thành hợp đồng</w:t>
+      </w:r>
+      <w:r>
+        <w:t xml:space="preserve"> — chốt thời điểm kết thúc (xem mục 11).</w:t>
+      </w:r>
+    </w:p>
+    <w:p>
+      <w:pPr>
+        <w:pStyle w:val="ListParagraph"/>
+        <w:numPr>
+          <w:ilvl w:val="0"/>
+          <w:numId w:val="11"/>
+        </w:numPr>
+        <w:spacing w:after="100"/>
+      </w:pPr>
+      <w:r>
+        <w:rPr>
+          <w:b/>
+          <w:bCs/>
+        </w:rPr>
+        <w:t xml:space="preserve">Tab Thông tin hợp đồng</w:t>
+      </w:r>
+      <w:r>
+        <w:t xml:space="preserve"> — sửa hợp đồng, file scan, ghi chú và các dòng chi tiết đã ký.</w:t>
+      </w:r>
+    </w:p>
+    <w:p>
+      <w:pPr>
+        <w:pStyle w:val="ListParagraph"/>
+        <w:numPr>
+          <w:ilvl w:val="0"/>
+          <w:numId w:val="11"/>
+        </w:numPr>
+        <w:spacing w:after="100"/>
+      </w:pPr>
+      <w:r>
+        <w:rPr>
+          <w:b/>
+          <w:bCs/>
+        </w:rPr>
+        <w:t xml:space="preserve">Tab Đợt giao</w:t>
+      </w:r>
+      <w:r>
+        <w:t xml:space="preserve"> — danh sách các lần giao; hợp đồng giao nhiều lần mở thẳng vào tab này.</w:t>
+      </w:r>
+    </w:p>
+    <w:p>
+      <w:pPr>
+        <w:pStyle w:val="ListParagraph"/>
+        <w:numPr>
+          <w:ilvl w:val="0"/>
+          <w:numId w:val="11"/>
+        </w:numPr>
+        <w:spacing w:after="100"/>
+      </w:pPr>
+      <w:r>
+        <w:rPr>
+          <w:b/>
+          <w:bCs/>
+        </w:rPr>
+        <w:t xml:space="preserve">Thêm đợt giao</w:t>
+      </w:r>
+      <w:r>
+        <w:t xml:space="preserve"> — ghi một lần giao mới (xem mục 10).</w:t>
       </w:r>
     </w:p>
     <w:p>
@@ -2950,27 +2794,17 @@
         <w:spacing w:after="80"/>
       </w:pPr>
       <w:r>
-        <w:t xml:space="preserve">Phiếu hiện sẵn dòng *Còn phải giao theo hợp đồng … · tối đa nhập được …*. Sản lượng thực giao </w:t>
-      </w:r>
-      <w:r>
-        <w:rPr>
-          <w:b/>
-          <w:bCs/>
-        </w:rPr>
-        <w:t xml:space="preserve">được phép lệch</w:t>
-      </w:r>
-      <w:r>
-        <w:t xml:space="preserve"> so với hợp đồng: vượt thì có cảnh báo vàng nhưng vẫn lưu, </w:t>
-      </w:r>
-      <w:r>
-        <w:rPr>
-          <w:b/>
-          <w:bCs/>
-        </w:rPr>
-        <w:t xml:space="preserve">quá 110% sản lượng hợp đồng mới bị chặn</w:t>
-      </w:r>
-      <w:r>
-        <w:t xml:space="preserve">.</w:t>
+        <w:t xml:space="preserve">Hợp đồng </w:t>
+      </w:r>
+      <w:r>
+        <w:rPr>
+          <w:b/>
+          <w:bCs/>
+        </w:rPr>
+        <w:t xml:space="preserve">giao 1 lần</w:t>
+      </w:r>
+      <w:r>
+        <w:t xml:space="preserve"> không có tab Đợt giao: chính hợp đồng là một lần giao.</w:t>
       </w:r>
     </w:p>
     <w:p>
@@ -2983,14 +2817,17 @@
         <w:spacing w:after="80"/>
       </w:pPr>
       <w:r>
-        <w:rPr>
-          <w:b/>
-          <w:bCs/>
-        </w:rPr>
-        <w:t xml:space="preserve">Tiêu thụ nội bộ</w:t>
-      </w:r>
-      <w:r>
-        <w:t xml:space="preserve"> chỉ hiện khi đơn vị thuộc một nhóm công ty mẹ–con, và chỉ chọn được đơn vị trong cùng nhóm.</w:t>
+        <w:t xml:space="preserve">Chỉ chuyển được </w:t>
+      </w:r>
+      <w:r>
+        <w:rPr>
+          <w:b/>
+          <w:bCs/>
+        </w:rPr>
+        <w:t xml:space="preserve">về</w:t>
+      </w:r>
+      <w:r>
+        <w:t xml:space="preserve"> giao 1 lần khi hợp đồng chưa có đợt giao nào.</w:t>
       </w:r>
     </w:p>
     <w:p>
@@ -3003,57 +2840,27 @@
         <w:spacing w:after="80"/>
       </w:pPr>
       <w:r>
-        <w:rPr>
-          <w:b/>
-          <w:bCs/>
-        </w:rPr>
-        <w:t xml:space="preserve">Thành tiền</w:t>
-      </w:r>
-      <w:r>
-        <w:t xml:space="preserve"> của mỗi dòng = số lượng × đơn giá, hệ thống tự tính (không nhập tay); tổng của cả đợt hiện ngay dưới bảng chi tiết.</w:t>
-      </w:r>
-    </w:p>
-    <w:p>
-      <w:pPr>
-        <w:pStyle w:val="ListParagraph"/>
-        <w:numPr>
-          <w:ilvl w:val="0"/>
-          <w:numId w:val="3"/>
-        </w:numPr>
-        <w:spacing w:after="80"/>
-      </w:pPr>
-      <w:r>
-        <w:t xml:space="preserve">Lần giao đã ghi quá </w:t>
-      </w:r>
-      <w:r>
-        <w:rPr>
-          <w:b/>
-          <w:bCs/>
-        </w:rPr>
-        <w:t xml:space="preserve">số ngày cho phép sửa</w:t>
-      </w:r>
-      <w:r>
-        <w:t xml:space="preserve"> sẽ chuyển sang </w:t>
-      </w:r>
-      <w:r>
-        <w:rPr>
-          <w:b/>
-          <w:bCs/>
-        </w:rPr>
-        <w:t xml:space="preserve">chỉ xem</w:t>
-      </w:r>
-      <w:r>
-        <w:t xml:space="preserve"> (dòng hiện “(chỉ xem)” thay cho nút Sửa/Xoá). Hợp đồng </w:t>
-      </w:r>
-      <w:r>
-        <w:rPr>
-          <w:b/>
-          <w:bCs/>
-        </w:rPr>
-        <w:t xml:space="preserve">không</w:t>
-      </w:r>
-      <w:r>
-        <w:t xml:space="preserve"> bị khoá, vẫn thêm đợt giao mới bình thường.</w:t>
+        <w:t xml:space="preserve">Hợp đồng </w:t>
+      </w:r>
+      <w:r>
+        <w:rPr>
+          <w:b/>
+          <w:bCs/>
+        </w:rPr>
+        <w:t xml:space="preserve">đã hoàn thành</w:t>
+      </w:r>
+      <w:r>
+        <w:t xml:space="preserve"> chỉ còn nút </w:t>
+      </w:r>
+      <w:r>
+        <w:rPr>
+          <w:b/>
+          <w:bCs/>
+        </w:rPr>
+        <w:t xml:space="preserve">Mở lại hợp đồng</w:t>
+      </w:r>
+      <w:r>
+        <w:t xml:space="preserve">; muốn sửa hay thêm đợt giao thì phải mở lại trước.</w:t>
       </w:r>
     </w:p>
     <w:p>
@@ -3062,7 +2869,7 @@
         <w:pageBreakBefore/>
       </w:pPr>
       <w:r>
-        <w:t xml:space="preserve">11. Hoàn thành hợp đồng</w:t>
+        <w:t xml:space="preserve">10. Thêm đợt giao — mỗi đợt là một lần giao</w:t>
       </w:r>
     </w:p>
     <w:p>
@@ -3077,7 +2884,7 @@
         <w:t xml:space="preserve">Vị trí: </w:t>
       </w:r>
       <w:r>
-        <w:t xml:space="preserve">Màn chi tiết hợp đồng (mục 9) → Hoàn thành hợp đồng</w:t>
+        <w:t xml:space="preserve">Màn chi tiết hợp đồng (mục 9) → tab Đợt giao → Thêm đợt giao</w:t>
       </w:r>
     </w:p>
     <w:p>
@@ -3085,7 +2892,7 @@
         <w:spacing w:after="140"/>
       </w:pPr>
       <w:r>
-        <w:t xml:space="preserve">Sản lượng thực giao thường lệch vài phần trăm so với hợp đồng đã ký. Khi hai bên đã kết thúc hợp đồng, bấm Hoàn thành hợp đồng để chốt lại — phần chênh còn lại thôi không nằm ở “đã ký HĐ chưa giao” nữa.</w:t>
+        <w:t xml:space="preserve">Mỗi đợt giao = một lần giao hàng + một lần thanh toán. Đây là cách ghi nhận tiêu thụ của cơ chế mới.</w:t>
       </w:r>
     </w:p>
     <w:p>
@@ -3098,7 +2905,7 @@
           <wp:inline distT="0" distB="0" distL="0" distR="0">
             <wp:extent cx="6191250" cy="3381375"/>
             <wp:effectExtent t="0" r="0" b="0" l="0"/>
-            <wp:docPr id="1" name="img" descr="Ảnh hướng dẫn có đánh số bước" title="img/10-hoan-thanh-hop-dong.png"/>
+            <wp:docPr id="1" name="img" descr="Ảnh hướng dẫn có đánh số bước" title="img/09-dot-giao-form.png"/>
             <wp:cNvGraphicFramePr>
               <a:graphicFrameLocks xmlns:a="http://schemas.openxmlformats.org/drawingml/2006/main" noChangeAspect="1"/>
             </wp:cNvGraphicFramePr>
@@ -3147,7 +2954,7 @@
           <w:sz w:val="17"/>
           <w:szCs w:val="17"/>
         </w:rPr>
-        <w:t xml:space="preserve">Hình 10. Chốt hoàn thành hợp đồng</w:t>
+        <w:t xml:space="preserve">Hình 9. Phiếu thêm đợt giao</w:t>
       </w:r>
     </w:p>
     <w:p>
@@ -3167,59 +2974,149 @@
         <w:pStyle w:val="ListParagraph"/>
         <w:numPr>
           <w:ilvl w:val="0"/>
-          <w:numId w:val="13"/>
-        </w:numPr>
-        <w:spacing w:after="100"/>
-      </w:pPr>
-      <w:r>
-        <w:rPr>
-          <w:b/>
-          <w:bCs/>
-        </w:rPr>
-        <w:t xml:space="preserve">Bảng đối chiếu</w:t>
-      </w:r>
-      <w:r>
-        <w:t xml:space="preserve"> — sản lượng hợp đồng, đã giao (kèm tỷ lệ thực hiện) và phần còn phải giao.</w:t>
-      </w:r>
-    </w:p>
-    <w:p>
-      <w:pPr>
-        <w:pStyle w:val="ListParagraph"/>
-        <w:numPr>
-          <w:ilvl w:val="0"/>
-          <w:numId w:val="13"/>
-        </w:numPr>
-        <w:spacing w:after="100"/>
-      </w:pPr>
-      <w:r>
-        <w:rPr>
-          <w:b/>
-          <w:bCs/>
-        </w:rPr>
-        <w:t xml:space="preserve">Ngày hoàn thành</w:t>
-      </w:r>
-      <w:r>
-        <w:t xml:space="preserve"> — mặc định là hôm nay; phải từ ngày giao gần nhất trở đi và không được ở tương lai.</w:t>
-      </w:r>
-    </w:p>
-    <w:p>
-      <w:pPr>
-        <w:pStyle w:val="ListParagraph"/>
-        <w:numPr>
-          <w:ilvl w:val="0"/>
-          <w:numId w:val="13"/>
-        </w:numPr>
-        <w:spacing w:after="100"/>
-      </w:pPr>
-      <w:r>
-        <w:rPr>
-          <w:b/>
-          <w:bCs/>
-        </w:rPr>
-        <w:t xml:space="preserve">Hoàn thành</w:t>
-      </w:r>
-      <w:r>
-        <w:t xml:space="preserve"> — chốt hợp đồng. Từ ngày này, phần chưa giao rời khỏi “đã ký HĐ chưa giao”.</w:t>
+          <w:numId w:val="12"/>
+        </w:numPr>
+        <w:spacing w:after="100"/>
+      </w:pPr>
+      <w:r>
+        <w:rPr>
+          <w:b/>
+          <w:bCs/>
+        </w:rPr>
+        <w:t xml:space="preserve">Số đợt giao</w:t>
+      </w:r>
+      <w:r>
+        <w:t xml:space="preserve"> — bắt buộc, không trùng trong cùng đơn vị (ví dụ *Đợt 01/HĐ-102*).</w:t>
+      </w:r>
+    </w:p>
+    <w:p>
+      <w:pPr>
+        <w:pStyle w:val="ListParagraph"/>
+        <w:numPr>
+          <w:ilvl w:val="0"/>
+          <w:numId w:val="12"/>
+        </w:numPr>
+        <w:spacing w:after="100"/>
+      </w:pPr>
+      <w:r>
+        <w:rPr>
+          <w:b/>
+          <w:bCs/>
+        </w:rPr>
+        <w:t xml:space="preserve">Ngày giao</w:t>
+      </w:r>
+      <w:r>
+        <w:t xml:space="preserve"> — để trống nghĩa là </w:t>
+      </w:r>
+      <w:r>
+        <w:rPr>
+          <w:b/>
+          <w:bCs/>
+        </w:rPr>
+        <w:t xml:space="preserve">đang chờ giao</w:t>
+      </w:r>
+      <w:r>
+        <w:t xml:space="preserve">; điền vào là đợt đã giao xong và </w:t>
+      </w:r>
+      <w:r>
+        <w:rPr>
+          <w:b/>
+          <w:bCs/>
+        </w:rPr>
+        <w:t xml:space="preserve">tính ngay vào tiêu thụ của ngày đó</w:t>
+      </w:r>
+      <w:r>
+        <w:t xml:space="preserve">.</w:t>
+      </w:r>
+    </w:p>
+    <w:p>
+      <w:pPr>
+        <w:pStyle w:val="ListParagraph"/>
+        <w:numPr>
+          <w:ilvl w:val="0"/>
+          <w:numId w:val="12"/>
+        </w:numPr>
+        <w:spacing w:after="100"/>
+      </w:pPr>
+      <w:r>
+        <w:rPr>
+          <w:b/>
+          <w:bCs/>
+        </w:rPr>
+        <w:t xml:space="preserve">Hình thức tiêu thụ</w:t>
+      </w:r>
+      <w:r>
+        <w:t xml:space="preserve"> — *Xuất khẩu / UTXK* · *Tiêu thụ trong nước* · *Tiêu thụ nội bộ*. Bắt buộc khi đã giao.</w:t>
+      </w:r>
+    </w:p>
+    <w:p>
+      <w:pPr>
+        <w:pStyle w:val="ListParagraph"/>
+        <w:numPr>
+          <w:ilvl w:val="0"/>
+          <w:numId w:val="12"/>
+        </w:numPr>
+        <w:spacing w:after="100"/>
+      </w:pPr>
+      <w:r>
+        <w:rPr>
+          <w:b/>
+          <w:bCs/>
+        </w:rPr>
+        <w:t xml:space="preserve">Chi tiết đợt giao</w:t>
+      </w:r>
+      <w:r>
+        <w:t xml:space="preserve"> — chủng loại, sản lượng, đơn giá thực tế của lần giao này. Ô Quy khô và Tỷ giá chỉ hiện khi áp dụng, giống phiếu hợp đồng.</w:t>
+      </w:r>
+    </w:p>
+    <w:p>
+      <w:pPr>
+        <w:pStyle w:val="ListParagraph"/>
+        <w:numPr>
+          <w:ilvl w:val="0"/>
+          <w:numId w:val="12"/>
+        </w:numPr>
+        <w:spacing w:after="100"/>
+      </w:pPr>
+      <w:r>
+        <w:rPr>
+          <w:b/>
+          <w:bCs/>
+        </w:rPr>
+        <w:t xml:space="preserve">Số hoá đơn</w:t>
+      </w:r>
+      <w:r>
+        <w:t xml:space="preserve"> + </w:t>
+      </w:r>
+      <w:r>
+        <w:rPr>
+          <w:b/>
+          <w:bCs/>
+        </w:rPr>
+        <w:t xml:space="preserve">Hoá đơn (scan)</w:t>
+      </w:r>
+      <w:r>
+        <w:t xml:space="preserve"> — số hoá đơn bán hàng của đợt và file đính kèm.</w:t>
+      </w:r>
+    </w:p>
+    <w:p>
+      <w:pPr>
+        <w:pStyle w:val="ListParagraph"/>
+        <w:numPr>
+          <w:ilvl w:val="0"/>
+          <w:numId w:val="12"/>
+        </w:numPr>
+        <w:spacing w:after="100"/>
+      </w:pPr>
+      <w:r>
+        <w:rPr>
+          <w:b/>
+          <w:bCs/>
+        </w:rPr>
+        <w:t xml:space="preserve">Thanh toán</w:t>
+      </w:r>
+      <w:r>
+        <w:t xml:space="preserve"> — ngày thanh toán, sản lượng của lần thanh toán, kèm chứng từ.</w:t>
       </w:r>
     </w:p>
     <w:p>
@@ -3244,17 +3141,27 @@
         <w:spacing w:after="80"/>
       </w:pPr>
       <w:r>
-        <w:t xml:space="preserve">Chỉ chốt khi </w:t>
-      </w:r>
-      <w:r>
-        <w:rPr>
-          <w:b/>
-          <w:bCs/>
-        </w:rPr>
-        <w:t xml:space="preserve">thật sự kết thúc hợp đồng</w:t>
-      </w:r>
-      <w:r>
-        <w:t xml:space="preserve">. Còn giao tiếp thì để nguyên — chốt rồi hợp đồng bị khoá, không thêm/sửa đợt giao được nữa.</w:t>
+        <w:t xml:space="preserve">Phiếu hiện sẵn dòng *Còn phải giao theo hợp đồng … · tối đa nhập được …*. Sản lượng thực giao </w:t>
+      </w:r>
+      <w:r>
+        <w:rPr>
+          <w:b/>
+          <w:bCs/>
+        </w:rPr>
+        <w:t xml:space="preserve">được phép lệch</w:t>
+      </w:r>
+      <w:r>
+        <w:t xml:space="preserve"> so với hợp đồng: vượt thì có cảnh báo vàng nhưng vẫn lưu, </w:t>
+      </w:r>
+      <w:r>
+        <w:rPr>
+          <w:b/>
+          <w:bCs/>
+        </w:rPr>
+        <w:t xml:space="preserve">quá 110% sản lượng hợp đồng mới bị chặn</w:t>
+      </w:r>
+      <w:r>
+        <w:t xml:space="preserve">.</w:t>
       </w:r>
     </w:p>
     <w:p>
@@ -3267,17 +3174,14 @@
         <w:spacing w:after="80"/>
       </w:pPr>
       <w:r>
-        <w:t xml:space="preserve">Bấm nhầm thì vào lại màn chi tiết bấm </w:t>
-      </w:r>
-      <w:r>
-        <w:rPr>
-          <w:b/>
-          <w:bCs/>
-        </w:rPr>
-        <w:t xml:space="preserve">Mở lại hợp đồng</w:t>
-      </w:r>
-      <w:r>
-        <w:t xml:space="preserve">, mọi số liệu trở về như cũ.</w:t>
+        <w:rPr>
+          <w:b/>
+          <w:bCs/>
+        </w:rPr>
+        <w:t xml:space="preserve">Tiêu thụ nội bộ</w:t>
+      </w:r>
+      <w:r>
+        <w:t xml:space="preserve"> chỉ hiện khi đơn vị thuộc một nhóm công ty mẹ–con, và chỉ chọn được đơn vị trong cùng nhóm.</w:t>
       </w:r>
     </w:p>
     <w:p>
@@ -3290,17 +3194,57 @@
         <w:spacing w:after="80"/>
       </w:pPr>
       <w:r>
-        <w:t xml:space="preserve">Nếu còn đợt </w:t>
-      </w:r>
-      <w:r>
-        <w:rPr>
-          <w:b/>
-          <w:bCs/>
-        </w:rPr>
-        <w:t xml:space="preserve">chưa điền ngày giao</w:t>
-      </w:r>
-      <w:r>
-        <w:t xml:space="preserve">, màn này báo bằng khung vàng — điền ngày giao trước, nếu không sản lượng đó sẽ không được tính vào tiêu thụ.</w:t>
+        <w:rPr>
+          <w:b/>
+          <w:bCs/>
+        </w:rPr>
+        <w:t xml:space="preserve">Thành tiền</w:t>
+      </w:r>
+      <w:r>
+        <w:t xml:space="preserve"> của mỗi dòng = số lượng × đơn giá, hệ thống tự tính (không nhập tay); tổng của cả đợt hiện ngay dưới bảng chi tiết.</w:t>
+      </w:r>
+    </w:p>
+    <w:p>
+      <w:pPr>
+        <w:pStyle w:val="ListParagraph"/>
+        <w:numPr>
+          <w:ilvl w:val="0"/>
+          <w:numId w:val="3"/>
+        </w:numPr>
+        <w:spacing w:after="80"/>
+      </w:pPr>
+      <w:r>
+        <w:t xml:space="preserve">Lần giao đã ghi quá </w:t>
+      </w:r>
+      <w:r>
+        <w:rPr>
+          <w:b/>
+          <w:bCs/>
+        </w:rPr>
+        <w:t xml:space="preserve">số ngày cho phép sửa</w:t>
+      </w:r>
+      <w:r>
+        <w:t xml:space="preserve"> sẽ chuyển sang </w:t>
+      </w:r>
+      <w:r>
+        <w:rPr>
+          <w:b/>
+          <w:bCs/>
+        </w:rPr>
+        <w:t xml:space="preserve">chỉ xem</w:t>
+      </w:r>
+      <w:r>
+        <w:t xml:space="preserve"> (dòng hiện “(chỉ xem)” thay cho nút Sửa/Xoá). Hợp đồng </w:t>
+      </w:r>
+      <w:r>
+        <w:rPr>
+          <w:b/>
+          <w:bCs/>
+        </w:rPr>
+        <w:t xml:space="preserve">không</w:t>
+      </w:r>
+      <w:r>
+        <w:t xml:space="preserve"> bị khoá, vẫn thêm đợt giao mới bình thường.</w:t>
       </w:r>
     </w:p>
     <w:p>
@@ -3309,7 +3253,7 @@
         <w:pageBreakBefore/>
       </w:pPr>
       <w:r>
-        <w:t xml:space="preserve">12. Báo cáo tiêu thụ</w:t>
+        <w:t xml:space="preserve">11. Hoàn thành hợp đồng</w:t>
       </w:r>
     </w:p>
     <w:p>
@@ -3324,7 +3268,7 @@
         <w:t xml:space="preserve">Vị trí: </w:t>
       </w:r>
       <w:r>
-        <w:t xml:space="preserve">Báo cáo → Tiêu thụ</w:t>
+        <w:t xml:space="preserve">Màn chi tiết hợp đồng (mục 9) → Hoàn thành hợp đồng</w:t>
       </w:r>
     </w:p>
     <w:p>
@@ -3332,7 +3276,7 @@
         <w:spacing w:after="140"/>
       </w:pPr>
       <w:r>
-        <w:t xml:space="preserve">Bảng chỉ để xem — số do hệ thống tổng hợp từ các lần giao, đơn vị không nhập tay.</w:t>
+        <w:t xml:space="preserve">Sản lượng thực giao thường lệch vài phần trăm so với hợp đồng đã ký. Khi hai bên đã kết thúc hợp đồng, bấm Hoàn thành hợp đồng để chốt lại — phần chênh còn lại thôi không nằm ở “đã ký HĐ chưa giao” nữa.</w:t>
       </w:r>
     </w:p>
     <w:p>
@@ -3345,7 +3289,7 @@
           <wp:inline distT="0" distB="0" distL="0" distR="0">
             <wp:extent cx="6191250" cy="3381375"/>
             <wp:effectExtent t="0" r="0" b="0" l="0"/>
-            <wp:docPr id="1" name="img" descr="Ảnh hướng dẫn có đánh số bước" title="img/11-bao-cao-tieu-thu.png"/>
+            <wp:docPr id="1" name="img" descr="Ảnh hướng dẫn có đánh số bước" title="img/10-hoan-thanh-hop-dong.png"/>
             <wp:cNvGraphicFramePr>
               <a:graphicFrameLocks xmlns:a="http://schemas.openxmlformats.org/drawingml/2006/main" noChangeAspect="1"/>
             </wp:cNvGraphicFramePr>
@@ -3394,7 +3338,7 @@
           <w:sz w:val="17"/>
           <w:szCs w:val="17"/>
         </w:rPr>
-        <w:t xml:space="preserve">Hình 11. Báo cáo tiêu thụ theo kỳ</w:t>
+        <w:t xml:space="preserve">Hình 10. Chốt hoàn thành hợp đồng</w:t>
       </w:r>
     </w:p>
     <w:p>
@@ -3414,69 +3358,59 @@
         <w:pStyle w:val="ListParagraph"/>
         <w:numPr>
           <w:ilvl w:val="0"/>
-          <w:numId w:val="14"/>
-        </w:numPr>
-        <w:spacing w:after="100"/>
-      </w:pPr>
-      <w:r>
-        <w:rPr>
-          <w:b/>
-          <w:bCs/>
-        </w:rPr>
-        <w:t xml:space="preserve">Bộ lọc</w:t>
-      </w:r>
-      <w:r>
-        <w:t xml:space="preserve"> — Từ ngày / Đến ngày · Đơn vị · </w:t>
-      </w:r>
-      <w:r>
-        <w:rPr>
-          <w:b/>
-          <w:bCs/>
-        </w:rPr>
-        <w:t xml:space="preserve">Khách hàng</w:t>
-      </w:r>
-      <w:r>
-        <w:t xml:space="preserve"> (gõ để tìm, chọn nhiều) · </w:t>
-      </w:r>
-      <w:r>
-        <w:rPr>
-          <w:b/>
-          <w:bCs/>
-        </w:rPr>
-        <w:t xml:space="preserve">Chủng loại</w:t>
-      </w:r>
-      <w:r>
-        <w:t xml:space="preserve"> (chọn nhiều). Bảng, khối theo khách hàng và file Excel đều theo bộ lọc này.</w:t>
-      </w:r>
-    </w:p>
-    <w:p>
-      <w:pPr>
-        <w:pStyle w:val="ListParagraph"/>
-        <w:numPr>
-          <w:ilvl w:val="0"/>
-          <w:numId w:val="14"/>
-        </w:numPr>
-        <w:spacing w:after="100"/>
-      </w:pPr>
-      <w:r>
-        <w:rPr>
-          <w:b/>
-          <w:bCs/>
-        </w:rPr>
-        <w:t xml:space="preserve">Bảng tổng hợp</w:t>
-      </w:r>
-      <w:r>
-        <w:t xml:space="preserve"> — Lần giao · SL · Quy khô · Xuất khẩu · Trong nước · Nội bộ · Doanh thu · </w:t>
-      </w:r>
-      <w:r>
-        <w:rPr>
-          <w:b/>
-          <w:bCs/>
-        </w:rPr>
-        <w:t xml:space="preserve">Chưa giao</w:t>
-      </w:r>
-      <w:r>
-        <w:t xml:space="preserve">.</w:t>
+          <w:numId w:val="13"/>
+        </w:numPr>
+        <w:spacing w:after="100"/>
+      </w:pPr>
+      <w:r>
+        <w:rPr>
+          <w:b/>
+          <w:bCs/>
+        </w:rPr>
+        <w:t xml:space="preserve">Bảng đối chiếu</w:t>
+      </w:r>
+      <w:r>
+        <w:t xml:space="preserve"> — sản lượng hợp đồng, đã giao (kèm tỷ lệ thực hiện) và phần còn phải giao.</w:t>
+      </w:r>
+    </w:p>
+    <w:p>
+      <w:pPr>
+        <w:pStyle w:val="ListParagraph"/>
+        <w:numPr>
+          <w:ilvl w:val="0"/>
+          <w:numId w:val="13"/>
+        </w:numPr>
+        <w:spacing w:after="100"/>
+      </w:pPr>
+      <w:r>
+        <w:rPr>
+          <w:b/>
+          <w:bCs/>
+        </w:rPr>
+        <w:t xml:space="preserve">Ngày hoàn thành</w:t>
+      </w:r>
+      <w:r>
+        <w:t xml:space="preserve"> — mặc định là hôm nay; phải từ ngày giao gần nhất trở đi và không được ở tương lai.</w:t>
+      </w:r>
+    </w:p>
+    <w:p>
+      <w:pPr>
+        <w:pStyle w:val="ListParagraph"/>
+        <w:numPr>
+          <w:ilvl w:val="0"/>
+          <w:numId w:val="13"/>
+        </w:numPr>
+        <w:spacing w:after="100"/>
+      </w:pPr>
+      <w:r>
+        <w:rPr>
+          <w:b/>
+          <w:bCs/>
+        </w:rPr>
+        <w:t xml:space="preserve">Hoàn thành</w:t>
+      </w:r>
+      <w:r>
+        <w:t xml:space="preserve"> — chốt hợp đồng. Từ ngày này, phần chưa giao rời khỏi “đã ký HĐ chưa giao”.</w:t>
       </w:r>
     </w:p>
     <w:p>
@@ -3501,27 +3435,17 @@
         <w:spacing w:after="80"/>
       </w:pPr>
       <w:r>
-        <w:t xml:space="preserve">Cột </w:t>
-      </w:r>
-      <w:r>
-        <w:rPr>
-          <w:b/>
-          <w:bCs/>
-        </w:rPr>
-        <w:t xml:space="preserve">SL (tấn)</w:t>
-      </w:r>
-      <w:r>
-        <w:t xml:space="preserve"> là sản lượng tiêu thụ thực tế: latex và mủ nguyên liệu tính theo </w:t>
-      </w:r>
-      <w:r>
-        <w:rPr>
-          <w:b/>
-          <w:bCs/>
-        </w:rPr>
-        <w:t xml:space="preserve">quy khô</w:t>
-      </w:r>
-      <w:r>
-        <w:t xml:space="preserve">, các chủng loại thành phẩm tính theo chính số lượng bán.</w:t>
+        <w:t xml:space="preserve">Chỉ chốt khi </w:t>
+      </w:r>
+      <w:r>
+        <w:rPr>
+          <w:b/>
+          <w:bCs/>
+        </w:rPr>
+        <w:t xml:space="preserve">thật sự kết thúc hợp đồng</w:t>
+      </w:r>
+      <w:r>
+        <w:t xml:space="preserve">. Còn giao tiếp thì để nguyên — chốt rồi hợp đồng bị khoá, không thêm/sửa đợt giao được nữa.</w:t>
       </w:r>
     </w:p>
     <w:p>
@@ -3534,27 +3458,17 @@
         <w:spacing w:after="80"/>
       </w:pPr>
       <w:r>
-        <w:t xml:space="preserve">Cột </w:t>
-      </w:r>
-      <w:r>
-        <w:rPr>
-          <w:b/>
-          <w:bCs/>
-        </w:rPr>
-        <w:t xml:space="preserve">Chưa giao</w:t>
-      </w:r>
-      <w:r>
-        <w:t xml:space="preserve"> là số </w:t>
-      </w:r>
-      <w:r>
-        <w:rPr>
-          <w:b/>
-          <w:bCs/>
-        </w:rPr>
-        <w:t xml:space="preserve">tại ngày cuối kỳ</w:t>
-      </w:r>
-      <w:r>
-        <w:t xml:space="preserve"> = sản lượng các hợp đồng chưa hoàn thành − đã giao; không phải số cộng dồn.</w:t>
+        <w:t xml:space="preserve">Bấm nhầm thì vào lại màn chi tiết bấm </w:t>
+      </w:r>
+      <w:r>
+        <w:rPr>
+          <w:b/>
+          <w:bCs/>
+        </w:rPr>
+        <w:t xml:space="preserve">Mở lại hợp đồng</w:t>
+      </w:r>
+      <w:r>
+        <w:t xml:space="preserve">, mọi số liệu trở về như cũ.</w:t>
       </w:r>
     </w:p>
     <w:p>
@@ -3567,50 +3481,17 @@
         <w:spacing w:after="80"/>
       </w:pPr>
       <w:r>
-        <w:t xml:space="preserve">Khối </w:t>
-      </w:r>
-      <w:r>
-        <w:rPr>
-          <w:b/>
-          <w:bCs/>
-        </w:rPr>
-        <w:t xml:space="preserve">Theo khách hàng</w:t>
-      </w:r>
-      <w:r>
-        <w:t xml:space="preserve"> bên dưới tách sản lượng và doanh thu theo từng khách.</w:t>
-      </w:r>
-    </w:p>
-    <w:p>
-      <w:pPr>
-        <w:pStyle w:val="ListParagraph"/>
-        <w:numPr>
-          <w:ilvl w:val="0"/>
-          <w:numId w:val="3"/>
-        </w:numPr>
-        <w:spacing w:after="80"/>
-      </w:pPr>
-      <w:r>
-        <w:rPr>
-          <w:b/>
-          <w:bCs/>
-        </w:rPr>
-        <w:t xml:space="preserve">Xuất Excel</w:t>
-      </w:r>
-      <w:r>
-        <w:t xml:space="preserve"> để lấy đúng bảng đang xem.</w:t>
-      </w:r>
-    </w:p>
-    <w:p>
-      <w:pPr>
-        <w:pStyle w:val="ListParagraph"/>
-        <w:numPr>
-          <w:ilvl w:val="0"/>
-          <w:numId w:val="3"/>
-        </w:numPr>
-        <w:spacing w:after="80"/>
-      </w:pPr>
-      <w:r>
-        <w:t xml:space="preserve">Doanh thu hiện “—” khi có lần giao bán ngoại tệ mà chưa nhập tỷ giá — bổ sung tỷ giá trên đợt giao để có số đầy đủ.</w:t>
+        <w:t xml:space="preserve">Nếu còn đợt </w:t>
+      </w:r>
+      <w:r>
+        <w:rPr>
+          <w:b/>
+          <w:bCs/>
+        </w:rPr>
+        <w:t xml:space="preserve">chưa điền ngày giao</w:t>
+      </w:r>
+      <w:r>
+        <w:t xml:space="preserve">, màn này báo bằng khung vàng — điền ngày giao trước, nếu không sản lượng đó sẽ không được tính vào tiêu thụ.</w:t>
       </w:r>
     </w:p>
     <w:p>
@@ -3619,7 +3500,7 @@
         <w:pageBreakBefore/>
       </w:pPr>
       <w:r>
-        <w:t xml:space="preserve">13. Nhu cầu thị trường</w:t>
+        <w:t xml:space="preserve">12. Báo cáo tiêu thụ</w:t>
       </w:r>
     </w:p>
     <w:p>
@@ -3634,7 +3515,7 @@
         <w:t xml:space="preserve">Vị trí: </w:t>
       </w:r>
       <w:r>
-        <w:t xml:space="preserve">Nhập liệu số liệu → Nhu cầu thị trường</w:t>
+        <w:t xml:space="preserve">Báo cáo → Tiêu thụ</w:t>
       </w:r>
     </w:p>
     <w:p>
@@ -3642,7 +3523,7 @@
         <w:spacing w:after="140"/>
       </w:pPr>
       <w:r>
-        <w:t xml:space="preserve">Ghi nhận nhu cầu và tín hiệu thị trường của đơn vị, nhập tự do bằng chữ theo ngày.</w:t>
+        <w:t xml:space="preserve">Bảng chỉ để xem — số do hệ thống tổng hợp từ các lần giao, đơn vị không nhập tay.</w:t>
       </w:r>
     </w:p>
     <w:p>
@@ -3655,7 +3536,7 @@
           <wp:inline distT="0" distB="0" distL="0" distR="0">
             <wp:extent cx="6191250" cy="3381375"/>
             <wp:effectExtent t="0" r="0" b="0" l="0"/>
-            <wp:docPr id="1" name="img" descr="Ảnh hướng dẫn có đánh số bước" title="img/12-nhu-cau-thi-truong.png"/>
+            <wp:docPr id="1" name="img" descr="Ảnh hướng dẫn có đánh số bước" title="img/11-bao-cao-tieu-thu.png"/>
             <wp:cNvGraphicFramePr>
               <a:graphicFrameLocks xmlns:a="http://schemas.openxmlformats.org/drawingml/2006/main" noChangeAspect="1"/>
             </wp:cNvGraphicFramePr>
@@ -3704,7 +3585,7 @@
           <w:sz w:val="17"/>
           <w:szCs w:val="17"/>
         </w:rPr>
-        <w:t xml:space="preserve">Hình 12. Nhu cầu thị trường theo ngày</w:t>
+        <w:t xml:space="preserve">Hình 11. Báo cáo tiêu thụ theo kỳ</w:t>
       </w:r>
     </w:p>
     <w:p>
@@ -3724,12 +3605,69 @@
         <w:pStyle w:val="ListParagraph"/>
         <w:numPr>
           <w:ilvl w:val="0"/>
-          <w:numId w:val="15"/>
-        </w:numPr>
-        <w:spacing w:after="100"/>
-      </w:pPr>
-      <w:r>
-        <w:t xml:space="preserve">Chọn ngày rồi viết nội dung: khách hỏi mua gì, số lượng, mức giá chào, tình hình thương lượng.</w:t>
+          <w:numId w:val="14"/>
+        </w:numPr>
+        <w:spacing w:after="100"/>
+      </w:pPr>
+      <w:r>
+        <w:rPr>
+          <w:b/>
+          <w:bCs/>
+        </w:rPr>
+        <w:t xml:space="preserve">Bộ lọc</w:t>
+      </w:r>
+      <w:r>
+        <w:t xml:space="preserve"> — Từ ngày / Đến ngày · Đơn vị · </w:t>
+      </w:r>
+      <w:r>
+        <w:rPr>
+          <w:b/>
+          <w:bCs/>
+        </w:rPr>
+        <w:t xml:space="preserve">Khách hàng</w:t>
+      </w:r>
+      <w:r>
+        <w:t xml:space="preserve"> (gõ để tìm, chọn nhiều) · </w:t>
+      </w:r>
+      <w:r>
+        <w:rPr>
+          <w:b/>
+          <w:bCs/>
+        </w:rPr>
+        <w:t xml:space="preserve">Chủng loại</w:t>
+      </w:r>
+      <w:r>
+        <w:t xml:space="preserve"> (chọn nhiều). Bảng, khối theo khách hàng và file Excel đều theo bộ lọc này.</w:t>
+      </w:r>
+    </w:p>
+    <w:p>
+      <w:pPr>
+        <w:pStyle w:val="ListParagraph"/>
+        <w:numPr>
+          <w:ilvl w:val="0"/>
+          <w:numId w:val="14"/>
+        </w:numPr>
+        <w:spacing w:after="100"/>
+      </w:pPr>
+      <w:r>
+        <w:rPr>
+          <w:b/>
+          <w:bCs/>
+        </w:rPr>
+        <w:t xml:space="preserve">Bảng tổng hợp</w:t>
+      </w:r>
+      <w:r>
+        <w:t xml:space="preserve"> — Lần giao · SL · Quy khô · Xuất khẩu · Trong nước · Nội bộ · Doanh thu · </w:t>
+      </w:r>
+      <w:r>
+        <w:rPr>
+          <w:b/>
+          <w:bCs/>
+        </w:rPr>
+        <w:t xml:space="preserve">Chưa giao</w:t>
+      </w:r>
+      <w:r>
+        <w:t xml:space="preserve">.</w:t>
       </w:r>
     </w:p>
     <w:p>
@@ -3754,17 +3692,116 @@
         <w:spacing w:after="80"/>
       </w:pPr>
       <w:r>
-        <w:t xml:space="preserve">Viết ngắn gọn nhưng có </w:t>
-      </w:r>
-      <w:r>
-        <w:rPr>
-          <w:b/>
-          <w:bCs/>
-        </w:rPr>
-        <w:t xml:space="preserve">con số cụ thể</w:t>
-      </w:r>
-      <w:r>
-        <w:t xml:space="preserve"> (chủng loại, sản lượng, mức giá) — Ban TTKD dùng thông tin này để đối chiếu với diễn biến giá sàn.</w:t>
+        <w:t xml:space="preserve">Cột </w:t>
+      </w:r>
+      <w:r>
+        <w:rPr>
+          <w:b/>
+          <w:bCs/>
+        </w:rPr>
+        <w:t xml:space="preserve">SL (tấn)</w:t>
+      </w:r>
+      <w:r>
+        <w:t xml:space="preserve"> là sản lượng tiêu thụ thực tế: latex và mủ nguyên liệu tính theo </w:t>
+      </w:r>
+      <w:r>
+        <w:rPr>
+          <w:b/>
+          <w:bCs/>
+        </w:rPr>
+        <w:t xml:space="preserve">quy khô</w:t>
+      </w:r>
+      <w:r>
+        <w:t xml:space="preserve">, các chủng loại thành phẩm tính theo chính số lượng bán.</w:t>
+      </w:r>
+    </w:p>
+    <w:p>
+      <w:pPr>
+        <w:pStyle w:val="ListParagraph"/>
+        <w:numPr>
+          <w:ilvl w:val="0"/>
+          <w:numId w:val="3"/>
+        </w:numPr>
+        <w:spacing w:after="80"/>
+      </w:pPr>
+      <w:r>
+        <w:t xml:space="preserve">Cột </w:t>
+      </w:r>
+      <w:r>
+        <w:rPr>
+          <w:b/>
+          <w:bCs/>
+        </w:rPr>
+        <w:t xml:space="preserve">Chưa giao</w:t>
+      </w:r>
+      <w:r>
+        <w:t xml:space="preserve"> là số </w:t>
+      </w:r>
+      <w:r>
+        <w:rPr>
+          <w:b/>
+          <w:bCs/>
+        </w:rPr>
+        <w:t xml:space="preserve">tại ngày cuối kỳ</w:t>
+      </w:r>
+      <w:r>
+        <w:t xml:space="preserve"> = sản lượng các hợp đồng chưa hoàn thành − đã giao; không phải số cộng dồn.</w:t>
+      </w:r>
+    </w:p>
+    <w:p>
+      <w:pPr>
+        <w:pStyle w:val="ListParagraph"/>
+        <w:numPr>
+          <w:ilvl w:val="0"/>
+          <w:numId w:val="3"/>
+        </w:numPr>
+        <w:spacing w:after="80"/>
+      </w:pPr>
+      <w:r>
+        <w:t xml:space="preserve">Khối </w:t>
+      </w:r>
+      <w:r>
+        <w:rPr>
+          <w:b/>
+          <w:bCs/>
+        </w:rPr>
+        <w:t xml:space="preserve">Theo khách hàng</w:t>
+      </w:r>
+      <w:r>
+        <w:t xml:space="preserve"> bên dưới tách sản lượng và doanh thu theo từng khách.</w:t>
+      </w:r>
+    </w:p>
+    <w:p>
+      <w:pPr>
+        <w:pStyle w:val="ListParagraph"/>
+        <w:numPr>
+          <w:ilvl w:val="0"/>
+          <w:numId w:val="3"/>
+        </w:numPr>
+        <w:spacing w:after="80"/>
+      </w:pPr>
+      <w:r>
+        <w:rPr>
+          <w:b/>
+          <w:bCs/>
+        </w:rPr>
+        <w:t xml:space="preserve">Xuất Excel</w:t>
+      </w:r>
+      <w:r>
+        <w:t xml:space="preserve"> để lấy đúng bảng đang xem.</w:t>
+      </w:r>
+    </w:p>
+    <w:p>
+      <w:pPr>
+        <w:pStyle w:val="ListParagraph"/>
+        <w:numPr>
+          <w:ilvl w:val="0"/>
+          <w:numId w:val="3"/>
+        </w:numPr>
+        <w:spacing w:after="80"/>
+      </w:pPr>
+      <w:r>
+        <w:t xml:space="preserve">Doanh thu hiện “—” khi có lần giao bán ngoại tệ mà chưa nhập tỷ giá — bổ sung tỷ giá trên đợt giao để có số đầy đủ.</w:t>
       </w:r>
     </w:p>
     <w:p>
@@ -3773,7 +3810,7 @@
         <w:pageBreakBefore/>
       </w:pPr>
       <w:r>
-        <w:t xml:space="preserve">14. Kế hoạch năm</w:t>
+        <w:t xml:space="preserve">13. Nhu cầu thị trường</w:t>
       </w:r>
     </w:p>
     <w:p>
@@ -3788,7 +3825,7 @@
         <w:t xml:space="preserve">Vị trí: </w:t>
       </w:r>
       <w:r>
-        <w:t xml:space="preserve">Nhập liệu số liệu → Kế hoạch năm</w:t>
+        <w:t xml:space="preserve">Nhập liệu số liệu → Nhu cầu thị trường</w:t>
       </w:r>
     </w:p>
     <w:p>
@@ -3796,7 +3833,7 @@
         <w:spacing w:after="140"/>
       </w:pPr>
       <w:r>
-        <w:t xml:space="preserve">Số liệu nhập một lần cho cả năm, cập nhật khi có điều chỉnh.</w:t>
+        <w:t xml:space="preserve">Ghi nhận nhu cầu và tín hiệu thị trường của đơn vị, nhập tự do bằng chữ theo ngày.</w:t>
       </w:r>
     </w:p>
     <w:p>
@@ -3809,7 +3846,7 @@
           <wp:inline distT="0" distB="0" distL="0" distR="0">
             <wp:extent cx="6191250" cy="3381375"/>
             <wp:effectExtent t="0" r="0" b="0" l="0"/>
-            <wp:docPr id="1" name="img" descr="Ảnh hướng dẫn có đánh số bước" title="img/13-ke-hoach-nam.png"/>
+            <wp:docPr id="1" name="img" descr="Ảnh hướng dẫn có đánh số bước" title="img/12-nhu-cau-thi-truong.png"/>
             <wp:cNvGraphicFramePr>
               <a:graphicFrameLocks xmlns:a="http://schemas.openxmlformats.org/drawingml/2006/main" noChangeAspect="1"/>
             </wp:cNvGraphicFramePr>
@@ -3858,6 +3895,160 @@
           <w:sz w:val="17"/>
           <w:szCs w:val="17"/>
         </w:rPr>
+        <w:t xml:space="preserve">Hình 12. Nhu cầu thị trường theo ngày</w:t>
+      </w:r>
+    </w:p>
+    <w:p>
+      <w:pPr>
+        <w:spacing w:after="80"/>
+      </w:pPr>
+      <w:r>
+        <w:rPr>
+          <w:b/>
+          <w:bCs/>
+        </w:rPr>
+        <w:t xml:space="preserve">Các bước:</w:t>
+      </w:r>
+    </w:p>
+    <w:p>
+      <w:pPr>
+        <w:pStyle w:val="ListParagraph"/>
+        <w:numPr>
+          <w:ilvl w:val="0"/>
+          <w:numId w:val="15"/>
+        </w:numPr>
+        <w:spacing w:after="100"/>
+      </w:pPr>
+      <w:r>
+        <w:t xml:space="preserve">Chọn ngày rồi viết nội dung: khách hỏi mua gì, số lượng, mức giá chào, tình hình thương lượng.</w:t>
+      </w:r>
+    </w:p>
+    <w:p>
+      <w:pPr>
+        <w:spacing w:after="80" w:before="140"/>
+      </w:pPr>
+      <w:r>
+        <w:rPr>
+          <w:b/>
+          <w:bCs/>
+        </w:rPr>
+        <w:t xml:space="preserve">Lưu ý:</w:t>
+      </w:r>
+    </w:p>
+    <w:p>
+      <w:pPr>
+        <w:pStyle w:val="ListParagraph"/>
+        <w:numPr>
+          <w:ilvl w:val="0"/>
+          <w:numId w:val="3"/>
+        </w:numPr>
+        <w:spacing w:after="80"/>
+      </w:pPr>
+      <w:r>
+        <w:t xml:space="preserve">Viết ngắn gọn nhưng có </w:t>
+      </w:r>
+      <w:r>
+        <w:rPr>
+          <w:b/>
+          <w:bCs/>
+        </w:rPr>
+        <w:t xml:space="preserve">con số cụ thể</w:t>
+      </w:r>
+      <w:r>
+        <w:t xml:space="preserve"> (chủng loại, sản lượng, mức giá) — Ban TTKD dùng thông tin này để đối chiếu với diễn biến giá sàn.</w:t>
+      </w:r>
+    </w:p>
+    <w:p>
+      <w:pPr>
+        <w:pStyle w:val="Heading2"/>
+        <w:pageBreakBefore/>
+      </w:pPr>
+      <w:r>
+        <w:t xml:space="preserve">14. Kế hoạch năm</w:t>
+      </w:r>
+    </w:p>
+    <w:p>
+      <w:pPr>
+        <w:spacing w:after="60"/>
+      </w:pPr>
+      <w:r>
+        <w:rPr>
+          <w:b/>
+          <w:bCs/>
+        </w:rPr>
+        <w:t xml:space="preserve">Vị trí: </w:t>
+      </w:r>
+      <w:r>
+        <w:t xml:space="preserve">Nhập liệu số liệu → Kế hoạch năm</w:t>
+      </w:r>
+    </w:p>
+    <w:p>
+      <w:pPr>
+        <w:spacing w:after="140"/>
+      </w:pPr>
+      <w:r>
+        <w:t xml:space="preserve">Số liệu nhập một lần cho cả năm, cập nhật khi có điều chỉnh.</w:t>
+      </w:r>
+    </w:p>
+    <w:p>
+      <w:pPr>
+        <w:spacing w:after="60" w:before="60"/>
+        <w:jc w:val="center"/>
+      </w:pPr>
+      <w:r>
+        <w:drawing>
+          <wp:inline distT="0" distB="0" distL="0" distR="0">
+            <wp:extent cx="6191250" cy="3381375"/>
+            <wp:effectExtent t="0" r="0" b="0" l="0"/>
+            <wp:docPr id="1" name="img" descr="Ảnh hướng dẫn có đánh số bước" title="img/13-ke-hoach-nam.png"/>
+            <wp:cNvGraphicFramePr>
+              <a:graphicFrameLocks xmlns:a="http://schemas.openxmlformats.org/drawingml/2006/main" noChangeAspect="1"/>
+            </wp:cNvGraphicFramePr>
+            <a:graphic xmlns:a="http://schemas.openxmlformats.org/drawingml/2006/main">
+              <a:graphicData uri="http://schemas.openxmlformats.org/drawingml/2006/picture">
+                <pic:pic xmlns:pic="http://schemas.openxmlformats.org/drawingml/2006/picture">
+                  <pic:nvPicPr>
+                    <pic:cNvPr id="0" name="" descr=""/>
+                    <pic:cNvPicPr>
+                      <a:picLocks noChangeAspect="1" noChangeArrowheads="1"/>
+                    </pic:cNvPicPr>
+                  </pic:nvPicPr>
+                  <pic:blipFill>
+                    <a:blip r:embed="rId21" cstate="none"/>
+                    <a:srcRect/>
+                    <a:stretch>
+                      <a:fillRect/>
+                    </a:stretch>
+                  </pic:blipFill>
+                  <pic:spPr bwMode="auto">
+                    <a:xfrm>
+                      <a:off x="0" y="0"/>
+                      <a:ext cx="6191250" cy="3381375"/>
+                    </a:xfrm>
+                    <a:prstGeom prst="rect">
+                      <a:avLst/>
+                    </a:prstGeom>
+                  </pic:spPr>
+                </pic:pic>
+              </a:graphicData>
+            </a:graphic>
+          </wp:inline>
+        </w:drawing>
+      </w:r>
+    </w:p>
+    <w:p>
+      <w:pPr>
+        <w:spacing w:after="180"/>
+        <w:jc w:val="center"/>
+      </w:pPr>
+      <w:r>
+        <w:rPr>
+          <w:i/>
+          <w:iCs/>
+          <w:color w:val="888888"/>
+          <w:sz w:val="17"/>
+          <w:szCs w:val="17"/>
+        </w:rPr>
         <w:t xml:space="preserve">Hình 13. Kế hoạch năm của đơn vị</w:t>
       </w:r>
     </w:p>
@@ -4107,7 +4298,7 @@
                     </pic:cNvPicPr>
                   </pic:nvPicPr>
                   <pic:blipFill>
-                    <a:blip r:embed="rId21" cstate="none"/>
+                    <a:blip r:embed="rId22" cstate="none"/>
                     <a:srcRect/>
                     <a:stretch>
                       <a:fillRect/>

</xml_diff>

<commit_message>
docs(huong-dan): point the customer steps at the right figure
</commit_message>
<xml_diff>
--- a/docs/huong-dan/nhap-lieu-don-vi-thanh-vien/Huong-dan-nhap-lieu-don-vi-thanh-vien.docx
+++ b/docs/huong-dan/nhap-lieu-don-vi-thanh-vien/Huong-dan-nhap-lieu-don-vi-thanh-vien.docx
@@ -1469,7 +1469,7 @@
         <w:t xml:space="preserve">Thêm khách hàng</w:t>
       </w:r>
       <w:r>
-        <w:t xml:space="preserve"> — bấm nút ở đầu trang, popup hiện ra để nhập.</w:t>
+        <w:t xml:space="preserve"> — bấm nút ở đầu trang (Hình 5 · ①), popup hiện ra để nhập.</w:t>
       </w:r>
     </w:p>
     <w:p>
@@ -1482,7 +1482,7 @@
         <w:spacing w:after="100"/>
       </w:pPr>
       <w:r>
-        <w:t xml:space="preserve">Trong popup: chọn </w:t>
+        <w:t xml:space="preserve">Trong popup (Hình 5b): chọn </w:t>
       </w:r>
       <w:r>
         <w:rPr>
@@ -1552,7 +1552,7 @@
         <w:t xml:space="preserve">Sửa</w:t>
       </w:r>
       <w:r>
-        <w:t xml:space="preserve"> ở cuối mỗi dòng mở lại chính popup đó với dữ liệu đã điền sẵn; </w:t>
+        <w:t xml:space="preserve"> ở cuối mỗi dòng (Hình 5 · ②) mở lại chính popup đó với dữ liệu đã điền sẵn; </w:t>
       </w:r>
       <w:r>
         <w:rPr>

</xml_diff>

<commit_message>
feat(member): warn units about the data they still owe
Units were entering data blind: nobody could see whether a day had been missed,
and the submission tracker lived on the HQ side only. The layout now shows every
member account what is still missing, using the same rules as that tracker, and
limited to days the edit window still lets them fix. Clicking a date opens the
form for that day; the banner refreshes itself after any save.
</commit_message>
<xml_diff>
--- a/docs/huong-dan/nhap-lieu-don-vi-thanh-vien/Huong-dan-nhap-lieu-don-vi-thanh-vien.docx
+++ b/docs/huong-dan/nhap-lieu-don-vi-thanh-vien/Huong-dan-nhap-lieu-don-vi-thanh-vien.docx
@@ -32,7 +32,7 @@
         <w:spacing w:after="140"/>
       </w:pPr>
       <w:r>
-        <w:t xml:space="preserve">Đơn vị đã quen hệ thống trước 30/07 cần nắm 4 thay đổi sau.</w:t>
+        <w:t xml:space="preserve">Đơn vị đã quen hệ thống trước 30/07 cần nắm 5 thay đổi sau.</w:t>
       </w:r>
     </w:p>
     <w:p>
@@ -283,6 +283,29 @@
       </w:r>
       <w:r>
         <w:t xml:space="preserve">, bấm vào mới hiện ô nhập. Cách nhập và các quy tắc không đổi.</w:t>
+      </w:r>
+    </w:p>
+    <w:p>
+      <w:pPr>
+        <w:pStyle w:val="ListParagraph"/>
+        <w:numPr>
+          <w:ilvl w:val="0"/>
+          <w:numId w:val="3"/>
+        </w:numPr>
+        <w:spacing w:after="80"/>
+      </w:pPr>
+      <w:r>
+        <w:t xml:space="preserve">Từ 06/08/2026, mọi màn của đơn vị có thêm </w:t>
+      </w:r>
+      <w:r>
+        <w:rPr>
+          <w:b/>
+          <w:bCs/>
+        </w:rPr>
+        <w:t xml:space="preserve">bảng nhắc “còn thiếu gì”</w:t>
+      </w:r>
+      <w:r>
+        <w:t xml:space="preserve"> ở đầu trang — xem mục 3. Đơn vị không phải tự dò xem mình đã nộp đủ chưa.</w:t>
       </w:r>
     </w:p>
     <w:p>
@@ -505,7 +528,7 @@
         <w:pageBreakBefore/>
       </w:pPr>
       <w:r>
-        <w:t xml:space="preserve">3. Màn hình danh sách và nút thao tác</w:t>
+        <w:t xml:space="preserve">3. Bảng nhắc “còn thiếu gì”</w:t>
       </w:r>
     </w:p>
     <w:p>
@@ -520,7 +543,7 @@
         <w:t xml:space="preserve">Vị trí: </w:t>
       </w:r>
       <w:r>
-        <w:t xml:space="preserve">Nhập liệu số liệu → Thu mua (các màn khác bố trí tương tự)</w:t>
+        <w:t xml:space="preserve">Hiện sẵn ở đầu mọi màn hình</w:t>
       </w:r>
     </w:p>
     <w:p>
@@ -528,7 +551,7 @@
         <w:spacing w:after="140"/>
       </w:pPr>
       <w:r>
-        <w:t xml:space="preserve">Mỗi màn nhập theo ngày đều có danh sách các ngày đã nhập kèm dòng luỹ kế.</w:t>
+        <w:t xml:space="preserve">Ngay khi đăng nhập, hệ thống tự đối chiếu số liệu đơn vị đã nộp và hiện một bảng nhắc ở đầu màn hình: còn thiếu biểu nào, ngày nào. Bảng chỉ liệt kê những ngày ĐANG CÒN SỬA ĐƯỢC — hết hạn đó thì ngày cũ chuyển sang chỉ xem, có muốn bổ sung cũng không được nữa.</w:t>
       </w:r>
     </w:p>
     <w:p>
@@ -541,7 +564,7 @@
           <wp:inline distT="0" distB="0" distL="0" distR="0">
             <wp:extent cx="6191250" cy="3381375"/>
             <wp:effectExtent t="0" r="0" b="0" l="0"/>
-            <wp:docPr id="1" name="img" descr="Ảnh hướng dẫn có đánh số bước" title="img/02-thu-mua-danh-sach.png"/>
+            <wp:docPr id="1" name="img" descr="Ảnh hướng dẫn có đánh số bước" title="img/01b-nhac-viec.png"/>
             <wp:cNvGraphicFramePr>
               <a:graphicFrameLocks xmlns:a="http://schemas.openxmlformats.org/drawingml/2006/main" noChangeAspect="1"/>
             </wp:cNvGraphicFramePr>
@@ -590,7 +613,7 @@
           <w:sz w:val="17"/>
           <w:szCs w:val="17"/>
         </w:rPr>
-        <w:t xml:space="preserve">Hình 2. Danh sách theo ngày và các nút thao tác</w:t>
+        <w:t xml:space="preserve">Hình 1b. Bảng nhắc việc hiện ở đầu mọi màn hình</w:t>
       </w:r>
     </w:p>
     <w:p>
@@ -619,10 +642,20 @@
           <w:b/>
           <w:bCs/>
         </w:rPr>
-        <w:t xml:space="preserve">Thêm số liệu ngày</w:t>
-      </w:r>
-      <w:r>
-        <w:t xml:space="preserve"> — mở phiếu nhập cho một ngày mới.</w:t>
+        <w:t xml:space="preserve">Số việc còn thiếu</w:t>
+      </w:r>
+      <w:r>
+        <w:t xml:space="preserve"> — tổng số việc đơn vị chưa làm. Nếu đã nộp đủ, chỗ này là dòng xanh </w:t>
+      </w:r>
+      <w:r>
+        <w:rPr>
+          <w:b/>
+          <w:bCs/>
+        </w:rPr>
+        <w:t xml:space="preserve">“Đã nhập đủ”</w:t>
+      </w:r>
+      <w:r>
+        <w:t xml:space="preserve">.</w:t>
       </w:r>
     </w:p>
     <w:p>
@@ -639,10 +672,50 @@
           <w:b/>
           <w:bCs/>
         </w:rPr>
-        <w:t xml:space="preserve">Biểu tượng bút</w:t>
-      </w:r>
-      <w:r>
-        <w:t xml:space="preserve"> ở cuối mỗi dòng — mở lại phiếu của ngày đó để sửa.</w:t>
+        <w:t xml:space="preserve">Thu mua</w:t>
+      </w:r>
+      <w:r>
+        <w:t xml:space="preserve"> — các ngày chưa nhập biểu Thu mua. Chỉ hiện với đơn vị được giao kế hoạch thu mua.</w:t>
+      </w:r>
+    </w:p>
+    <w:p>
+      <w:pPr>
+        <w:pStyle w:val="ListParagraph"/>
+        <w:numPr>
+          <w:ilvl w:val="0"/>
+          <w:numId w:val="5"/>
+        </w:numPr>
+        <w:spacing w:after="100"/>
+      </w:pPr>
+      <w:r>
+        <w:rPr>
+          <w:b/>
+          <w:bCs/>
+        </w:rPr>
+        <w:t xml:space="preserve">Tồn kho</w:t>
+      </w:r>
+      <w:r>
+        <w:t xml:space="preserve"> — các ngày chưa nhập biểu Tồn kho.</w:t>
+      </w:r>
+    </w:p>
+    <w:p>
+      <w:pPr>
+        <w:pStyle w:val="ListParagraph"/>
+        <w:numPr>
+          <w:ilvl w:val="0"/>
+          <w:numId w:val="5"/>
+        </w:numPr>
+        <w:spacing w:after="100"/>
+      </w:pPr>
+      <w:r>
+        <w:rPr>
+          <w:b/>
+          <w:bCs/>
+        </w:rPr>
+        <w:t xml:space="preserve">Thu gọn / Xem chi tiết</w:t>
+      </w:r>
+      <w:r>
+        <w:t xml:space="preserve"> — thu bảng lại còn một dòng khi đang tập trung làm việc khác.</w:t>
       </w:r>
     </w:p>
     <w:p>
@@ -667,40 +740,83 @@
         <w:spacing w:after="80"/>
       </w:pPr>
       <w:r>
-        <w:t xml:space="preserve">Danh sách chỉ hiện những ngày </w:t>
-      </w:r>
-      <w:r>
-        <w:rPr>
-          <w:b/>
-          <w:bCs/>
-        </w:rPr>
-        <w:t xml:space="preserve">đã có số liệu</w:t>
-      </w:r>
-      <w:r>
-        <w:t xml:space="preserve">; ngày chưa nhập sẽ không xuất hiện.</w:t>
-      </w:r>
-    </w:p>
-    <w:p>
-      <w:pPr>
-        <w:pStyle w:val="ListParagraph"/>
-        <w:numPr>
-          <w:ilvl w:val="0"/>
-          <w:numId w:val="3"/>
-        </w:numPr>
-        <w:spacing w:after="80"/>
-      </w:pPr>
-      <w:r>
-        <w:t xml:space="preserve">Chọn </w:t>
-      </w:r>
-      <w:r>
-        <w:rPr>
-          <w:b/>
-          <w:bCs/>
-        </w:rPr>
-        <w:t xml:space="preserve">Khoảng thời gian</w:t>
-      </w:r>
-      <w:r>
-        <w:t xml:space="preserve"> ở góc trái để xem xa hơn 90 ngày.</w:t>
+        <w:rPr>
+          <w:b/>
+          <w:bCs/>
+        </w:rPr>
+        <w:t xml:space="preserve">Bấm thẳng vào ngày</w:t>
+      </w:r>
+      <w:r>
+        <w:t xml:space="preserve"> (ô màu cam) là mở luôn phiếu nhập của đúng ngày đó — không phải tự đi tìm trong danh sách.</w:t>
+      </w:r>
+    </w:p>
+    <w:p>
+      <w:pPr>
+        <w:pStyle w:val="ListParagraph"/>
+        <w:numPr>
+          <w:ilvl w:val="0"/>
+          <w:numId w:val="3"/>
+        </w:numPr>
+        <w:spacing w:after="80"/>
+      </w:pPr>
+      <w:r>
+        <w:t xml:space="preserve">Nhập xong bảng tự trừ ngay việc đó, không cần tải lại trang.</w:t>
+      </w:r>
+    </w:p>
+    <w:p>
+      <w:pPr>
+        <w:pStyle w:val="ListParagraph"/>
+        <w:numPr>
+          <w:ilvl w:val="0"/>
+          <w:numId w:val="3"/>
+        </w:numPr>
+        <w:spacing w:after="80"/>
+      </w:pPr>
+      <w:r>
+        <w:t xml:space="preserve">Bảng còn nhắc: </w:t>
+      </w:r>
+      <w:r>
+        <w:rPr>
+          <w:b/>
+          <w:bCs/>
+        </w:rPr>
+        <w:t xml:space="preserve">chưa khai Kế hoạch năm</w:t>
+      </w:r>
+      <w:r>
+        <w:t xml:space="preserve"> và </w:t>
+      </w:r>
+      <w:r>
+        <w:rPr>
+          <w:b/>
+          <w:bCs/>
+        </w:rPr>
+        <w:t xml:space="preserve">đợt giao bỏ trống ngày giao</w:t>
+      </w:r>
+      <w:r>
+        <w:t xml:space="preserve"> (sản lượng của đợt đó chưa được tính vào tiêu thụ cho tới khi điền ngày giao).</w:t>
+      </w:r>
+    </w:p>
+    <w:p>
+      <w:pPr>
+        <w:pStyle w:val="ListParagraph"/>
+        <w:numPr>
+          <w:ilvl w:val="0"/>
+          <w:numId w:val="3"/>
+        </w:numPr>
+        <w:spacing w:after="80"/>
+      </w:pPr>
+      <w:r>
+        <w:t xml:space="preserve">Ngày đã tích “không tổ chức thu mua” / “không phát sinh tồn kho” được tính là </w:t>
+      </w:r>
+      <w:r>
+        <w:rPr>
+          <w:b/>
+          <w:bCs/>
+        </w:rPr>
+        <w:t xml:space="preserve">đã nộp</w:t>
+      </w:r>
+      <w:r>
+        <w:t xml:space="preserve"> — không bị nhắc nữa.</w:t>
       </w:r>
     </w:p>
     <w:p>
@@ -709,7 +825,7 @@
         <w:pageBreakBefore/>
       </w:pPr>
       <w:r>
-        <w:t xml:space="preserve">4. Nhập Thu mua</w:t>
+        <w:t xml:space="preserve">4. Màn hình danh sách và nút thao tác</w:t>
       </w:r>
     </w:p>
     <w:p>
@@ -724,7 +840,7 @@
         <w:t xml:space="preserve">Vị trí: </w:t>
       </w:r>
       <w:r>
-        <w:t xml:space="preserve">Nhập liệu số liệu → Thu mua → Thêm số liệu ngày</w:t>
+        <w:t xml:space="preserve">Nhập liệu số liệu → Thu mua (các màn khác bố trí tương tự)</w:t>
       </w:r>
     </w:p>
     <w:p>
@@ -732,7 +848,7 @@
         <w:spacing w:after="140"/>
       </w:pPr>
       <w:r>
-        <w:t xml:space="preserve">Phiếu chia theo loại mủ, mỗi loại nhập sản lượng và đơn giá đi liền nhau.</w:t>
+        <w:t xml:space="preserve">Mỗi màn nhập theo ngày đều có danh sách các ngày đã nhập kèm dòng luỹ kế.</w:t>
       </w:r>
     </w:p>
     <w:p>
@@ -745,7 +861,7 @@
           <wp:inline distT="0" distB="0" distL="0" distR="0">
             <wp:extent cx="6191250" cy="3381375"/>
             <wp:effectExtent t="0" r="0" b="0" l="0"/>
-            <wp:docPr id="1" name="img" descr="Ảnh hướng dẫn có đánh số bước" title="img/03-thu-mua-form.png"/>
+            <wp:docPr id="1" name="img" descr="Ảnh hướng dẫn có đánh số bước" title="img/02-thu-mua-danh-sach.png"/>
             <wp:cNvGraphicFramePr>
               <a:graphicFrameLocks xmlns:a="http://schemas.openxmlformats.org/drawingml/2006/main" noChangeAspect="1"/>
             </wp:cNvGraphicFramePr>
@@ -794,7 +910,7 @@
           <w:sz w:val="17"/>
           <w:szCs w:val="17"/>
         </w:rPr>
-        <w:t xml:space="preserve">Hình 3. Phiếu Thu mua theo ngày</w:t>
+        <w:t xml:space="preserve">Hình 2. Danh sách theo ngày và các nút thao tác</w:t>
       </w:r>
     </w:p>
     <w:p>
@@ -823,20 +939,10 @@
           <w:b/>
           <w:bCs/>
         </w:rPr>
-        <w:t xml:space="preserve">Hôm nay đơn vị KHÔNG tổ chức thu mua</w:t>
-      </w:r>
-      <w:r>
-        <w:t xml:space="preserve"> — chỉ tích khi thật sự không tổ chức mua. Có công bố giá và có tổ chức mua nhưng không mua được thì </w:t>
-      </w:r>
-      <w:r>
-        <w:rPr>
-          <w:b/>
-          <w:bCs/>
-        </w:rPr>
-        <w:t xml:space="preserve">đừng tích</w:t>
-      </w:r>
-      <w:r>
-        <w:t xml:space="preserve">: nhập sản lượng 0 kèm đúng mức giá đã công bố. Hai trường hợp này khác nhau khi tổng hợp báo cáo.</w:t>
+        <w:t xml:space="preserve">Thêm số liệu ngày</w:t>
+      </w:r>
+      <w:r>
+        <w:t xml:space="preserve"> — mở phiếu nhập cho một ngày mới.</w:t>
       </w:r>
     </w:p>
     <w:p>
@@ -853,110 +959,10 @@
           <w:b/>
           <w:bCs/>
         </w:rPr>
-        <w:t xml:space="preserve">Mủ nước</w:t>
-      </w:r>
-      <w:r>
-        <w:t xml:space="preserve"> — sản lượng (tấn, quy khô) và đơn giá (đồng/độ TSC).</w:t>
-      </w:r>
-    </w:p>
-    <w:p>
-      <w:pPr>
-        <w:pStyle w:val="ListParagraph"/>
-        <w:numPr>
-          <w:ilvl w:val="0"/>
-          <w:numId w:val="6"/>
-        </w:numPr>
-        <w:spacing w:after="100"/>
-      </w:pPr>
-      <w:r>
-        <w:rPr>
-          <w:b/>
-          <w:bCs/>
-        </w:rPr>
-        <w:t xml:space="preserve">Mủ chén</w:t>
-      </w:r>
-      <w:r>
-        <w:t xml:space="preserve"> — sản lượng, chọn </w:t>
-      </w:r>
-      <w:r>
-        <w:rPr>
-          <w:b/>
-          <w:bCs/>
-        </w:rPr>
-        <w:t xml:space="preserve">Đơn giá tính theo</w:t>
-      </w:r>
-      <w:r>
-        <w:t xml:space="preserve"> “Độ TSC” hay “Độ DRC”; nhãn ô đơn giá đổi theo lựa chọn này.</w:t>
-      </w:r>
-    </w:p>
-    <w:p>
-      <w:pPr>
-        <w:pStyle w:val="ListParagraph"/>
-        <w:numPr>
-          <w:ilvl w:val="0"/>
-          <w:numId w:val="6"/>
-        </w:numPr>
-        <w:spacing w:after="100"/>
-      </w:pPr>
-      <w:r>
-        <w:rPr>
-          <w:b/>
-          <w:bCs/>
-        </w:rPr>
-        <w:t xml:space="preserve">Mủ nguyên liệu nước chưa cán vắt (chén)</w:t>
-      </w:r>
-      <w:r>
-        <w:t xml:space="preserve"> và </w:t>
-      </w:r>
-      <w:r>
-        <w:rPr>
-          <w:b/>
-          <w:bCs/>
-        </w:rPr>
-        <w:t xml:space="preserve">Mủ nguyên liệu đã cán vắt (RSS)</w:t>
-      </w:r>
-      <w:r>
-        <w:t xml:space="preserve"> — hai loại này nhập </w:t>
-      </w:r>
-      <w:r>
-        <w:rPr>
-          <w:b/>
-          <w:bCs/>
-        </w:rPr>
-        <w:t xml:space="preserve">đơn giá theo đồng/kg</w:t>
-      </w:r>
-      <w:r>
-        <w:t xml:space="preserve">, tính riêng từng loại.</w:t>
-      </w:r>
-    </w:p>
-    <w:p>
-      <w:pPr>
-        <w:pStyle w:val="ListParagraph"/>
-        <w:numPr>
-          <w:ilvl w:val="0"/>
-          <w:numId w:val="6"/>
-        </w:numPr>
-        <w:spacing w:after="100"/>
-      </w:pPr>
-      <w:r>
-        <w:rPr>
-          <w:b/>
-          <w:bCs/>
-        </w:rPr>
-        <w:t xml:space="preserve">Thu mua thành phẩm</w:t>
-      </w:r>
-      <w:r>
-        <w:t xml:space="preserve"> — bảng nhập, </w:t>
-      </w:r>
-      <w:r>
-        <w:rPr>
-          <w:b/>
-          <w:bCs/>
-        </w:rPr>
-        <w:t xml:space="preserve">mỗi chủng loại mua trong ngày là một dòng riêng</w:t>
-      </w:r>
-      <w:r>
-        <w:t xml:space="preserve">: Chủng loại · SL · Đơn giá · Loại tiền · Tỷ giá (chỉ hiện khi dòng chọn ngoại tệ). Cột Thành tiền tự tính.</w:t>
+        <w:t xml:space="preserve">Biểu tượng bút</w:t>
+      </w:r>
+      <w:r>
+        <w:t xml:space="preserve"> ở cuối mỗi dòng — mở lại phiếu của ngày đó để sửa.</w:t>
       </w:r>
     </w:p>
     <w:p>
@@ -981,30 +987,40 @@
         <w:spacing w:after="80"/>
       </w:pPr>
       <w:r>
-        <w:t xml:space="preserve">Ngày nào không phát sinh loại nào thì để trống loại đó, không nhập số 0.</w:t>
-      </w:r>
-    </w:p>
-    <w:p>
-      <w:pPr>
-        <w:pStyle w:val="ListParagraph"/>
-        <w:numPr>
-          <w:ilvl w:val="0"/>
-          <w:numId w:val="3"/>
-        </w:numPr>
-        <w:spacing w:after="80"/>
-      </w:pPr>
-      <w:r>
-        <w:t xml:space="preserve">Nút </w:t>
-      </w:r>
-      <w:r>
-        <w:rPr>
-          <w:b/>
-          <w:bCs/>
-        </w:rPr>
-        <w:t xml:space="preserve">Lấy tỷ giá VCB cho các dòng USD</w:t>
-      </w:r>
-      <w:r>
-        <w:t xml:space="preserve"> điền tỷ giá Vietcombank cho mọi dòng đang chọn USD.</w:t>
+        <w:t xml:space="preserve">Danh sách chỉ hiện những ngày </w:t>
+      </w:r>
+      <w:r>
+        <w:rPr>
+          <w:b/>
+          <w:bCs/>
+        </w:rPr>
+        <w:t xml:space="preserve">đã có số liệu</w:t>
+      </w:r>
+      <w:r>
+        <w:t xml:space="preserve">; ngày chưa nhập sẽ không xuất hiện.</w:t>
+      </w:r>
+    </w:p>
+    <w:p>
+      <w:pPr>
+        <w:pStyle w:val="ListParagraph"/>
+        <w:numPr>
+          <w:ilvl w:val="0"/>
+          <w:numId w:val="3"/>
+        </w:numPr>
+        <w:spacing w:after="80"/>
+      </w:pPr>
+      <w:r>
+        <w:t xml:space="preserve">Chọn </w:t>
+      </w:r>
+      <w:r>
+        <w:rPr>
+          <w:b/>
+          <w:bCs/>
+        </w:rPr>
+        <w:t xml:space="preserve">Khoảng thời gian</w:t>
+      </w:r>
+      <w:r>
+        <w:t xml:space="preserve"> ở góc trái để xem xa hơn 90 ngày.</w:t>
       </w:r>
     </w:p>
     <w:p>
@@ -1013,7 +1029,7 @@
         <w:pageBreakBefore/>
       </w:pPr>
       <w:r>
-        <w:t xml:space="preserve">5. Nhập Tồn kho</w:t>
+        <w:t xml:space="preserve">5. Nhập Thu mua</w:t>
       </w:r>
     </w:p>
     <w:p>
@@ -1028,7 +1044,7 @@
         <w:t xml:space="preserve">Vị trí: </w:t>
       </w:r>
       <w:r>
-        <w:t xml:space="preserve">Nhập liệu số liệu → Tồn kho → Thêm số liệu ngày</w:t>
+        <w:t xml:space="preserve">Nhập liệu số liệu → Thu mua → Thêm số liệu ngày</w:t>
       </w:r>
     </w:p>
     <w:p>
@@ -1036,7 +1052,7 @@
         <w:spacing w:after="140"/>
       </w:pPr>
       <w:r>
-        <w:t xml:space="preserve">Tồn kho là số tại thời điểm cuối ngày, không cộng dồn giữa các ngày. Phiếu còn đúng 3 khối nhập tay.</w:t>
+        <w:t xml:space="preserve">Phiếu chia theo loại mủ, mỗi loại nhập sản lượng và đơn giá đi liền nhau.</w:t>
       </w:r>
     </w:p>
     <w:p>
@@ -1049,7 +1065,7 @@
           <wp:inline distT="0" distB="0" distL="0" distR="0">
             <wp:extent cx="6191250" cy="3381375"/>
             <wp:effectExtent t="0" r="0" b="0" l="0"/>
-            <wp:docPr id="1" name="img" descr="Ảnh hướng dẫn có đánh số bước" title="img/04-ton-kho.png"/>
+            <wp:docPr id="1" name="img" descr="Ảnh hướng dẫn có đánh số bước" title="img/03-thu-mua-form.png"/>
             <wp:cNvGraphicFramePr>
               <a:graphicFrameLocks xmlns:a="http://schemas.openxmlformats.org/drawingml/2006/main" noChangeAspect="1"/>
             </wp:cNvGraphicFramePr>
@@ -1098,7 +1114,7 @@
           <w:sz w:val="17"/>
           <w:szCs w:val="17"/>
         </w:rPr>
-        <w:t xml:space="preserve">Hình 4. Phiếu Tồn kho theo ngày</w:t>
+        <w:t xml:space="preserve">Hình 3. Phiếu Thu mua theo ngày</w:t>
       </w:r>
     </w:p>
     <w:p>
@@ -1127,10 +1143,20 @@
           <w:b/>
           <w:bCs/>
         </w:rPr>
-        <w:t xml:space="preserve">Lấy tồn ngày trước</w:t>
-      </w:r>
-      <w:r>
-        <w:t xml:space="preserve"> — chép số tồn của ngày gần nhất sang rồi sửa cho đúng ngày này.</w:t>
+        <w:t xml:space="preserve">Hôm nay đơn vị KHÔNG tổ chức thu mua</w:t>
+      </w:r>
+      <w:r>
+        <w:t xml:space="preserve"> — chỉ tích khi thật sự không tổ chức mua. Có công bố giá và có tổ chức mua nhưng không mua được thì </w:t>
+      </w:r>
+      <w:r>
+        <w:rPr>
+          <w:b/>
+          <w:bCs/>
+        </w:rPr>
+        <w:t xml:space="preserve">đừng tích</w:t>
+      </w:r>
+      <w:r>
+        <w:t xml:space="preserve">: nhập sản lượng 0 kèm đúng mức giá đã công bố. Hai trường hợp này khác nhau khi tổng hợp báo cáo.</w:t>
       </w:r>
     </w:p>
     <w:p>
@@ -1147,10 +1173,10 @@
           <w:b/>
           <w:bCs/>
         </w:rPr>
-        <w:t xml:space="preserve">Khối 1 — Tồn kho thành phẩm chế biến chưa nhập kho</w:t>
-      </w:r>
-      <w:r>
-        <w:t xml:space="preserve">: mỗi chủng loại một dòng.</w:t>
+        <w:t xml:space="preserve">Mủ nước</w:t>
+      </w:r>
+      <w:r>
+        <w:t xml:space="preserve"> — sản lượng (tấn, quy khô) và đơn giá (đồng/độ TSC).</w:t>
       </w:r>
     </w:p>
     <w:p>
@@ -1167,10 +1193,20 @@
           <w:b/>
           <w:bCs/>
         </w:rPr>
-        <w:t xml:space="preserve">Khối 2 — Tồn kho thành phẩm đã nhập kho</w:t>
-      </w:r>
-      <w:r>
-        <w:t xml:space="preserve">: mỗi chủng loại một dòng.</w:t>
+        <w:t xml:space="preserve">Mủ chén</w:t>
+      </w:r>
+      <w:r>
+        <w:t xml:space="preserve"> — sản lượng, chọn </w:t>
+      </w:r>
+      <w:r>
+        <w:rPr>
+          <w:b/>
+          <w:bCs/>
+        </w:rPr>
+        <w:t xml:space="preserve">Đơn giá tính theo</w:t>
+      </w:r>
+      <w:r>
+        <w:t xml:space="preserve"> “Độ TSC” hay “Độ DRC”; nhãn ô đơn giá đổi theo lựa chọn này.</w:t>
       </w:r>
     </w:p>
     <w:p>
@@ -1187,10 +1223,60 @@
           <w:b/>
           <w:bCs/>
         </w:rPr>
-        <w:t xml:space="preserve">Khối 3 — Tồn kho nguyên liệu chưa sản xuất (quy khô)</w:t>
-      </w:r>
-      <w:r>
-        <w:t xml:space="preserve">: một ô tổng.</w:t>
+        <w:t xml:space="preserve">Mủ nguyên liệu nước chưa cán vắt (chén)</w:t>
+      </w:r>
+      <w:r>
+        <w:t xml:space="preserve"> và </w:t>
+      </w:r>
+      <w:r>
+        <w:rPr>
+          <w:b/>
+          <w:bCs/>
+        </w:rPr>
+        <w:t xml:space="preserve">Mủ nguyên liệu đã cán vắt (RSS)</w:t>
+      </w:r>
+      <w:r>
+        <w:t xml:space="preserve"> — hai loại này nhập </w:t>
+      </w:r>
+      <w:r>
+        <w:rPr>
+          <w:b/>
+          <w:bCs/>
+        </w:rPr>
+        <w:t xml:space="preserve">đơn giá theo đồng/kg</w:t>
+      </w:r>
+      <w:r>
+        <w:t xml:space="preserve">, tính riêng từng loại.</w:t>
+      </w:r>
+    </w:p>
+    <w:p>
+      <w:pPr>
+        <w:pStyle w:val="ListParagraph"/>
+        <w:numPr>
+          <w:ilvl w:val="0"/>
+          <w:numId w:val="7"/>
+        </w:numPr>
+        <w:spacing w:after="100"/>
+      </w:pPr>
+      <w:r>
+        <w:rPr>
+          <w:b/>
+          <w:bCs/>
+        </w:rPr>
+        <w:t xml:space="preserve">Thu mua thành phẩm</w:t>
+      </w:r>
+      <w:r>
+        <w:t xml:space="preserve"> — bảng nhập, </w:t>
+      </w:r>
+      <w:r>
+        <w:rPr>
+          <w:b/>
+          <w:bCs/>
+        </w:rPr>
+        <w:t xml:space="preserve">mỗi chủng loại mua trong ngày là một dòng riêng</w:t>
+      </w:r>
+      <w:r>
+        <w:t xml:space="preserve">: Chủng loại · SL · Đơn giá · Loại tiền · Tỷ giá (chỉ hiện khi dòng chọn ngoại tệ). Cột Thành tiền tự tính.</w:t>
       </w:r>
     </w:p>
     <w:p>
@@ -1215,73 +1301,30 @@
         <w:spacing w:after="80"/>
       </w:pPr>
       <w:r>
-        <w:t xml:space="preserve">Ô </w:t>
-      </w:r>
-      <w:r>
-        <w:rPr>
-          <w:b/>
-          <w:bCs/>
-        </w:rPr>
-        <w:t xml:space="preserve">Tồn kho thành phẩm</w:t>
-      </w:r>
-      <w:r>
-        <w:t xml:space="preserve"> ở cuối phiếu là số </w:t>
-      </w:r>
-      <w:r>
-        <w:rPr>
-          <w:b/>
-          <w:bCs/>
-        </w:rPr>
-        <w:t xml:space="preserve">tự tính</w:t>
-      </w:r>
-      <w:r>
-        <w:t xml:space="preserve"> = khối 1 + khối 2.</w:t>
-      </w:r>
-    </w:p>
-    <w:p>
-      <w:pPr>
-        <w:pStyle w:val="ListParagraph"/>
-        <w:numPr>
-          <w:ilvl w:val="0"/>
-          <w:numId w:val="3"/>
-        </w:numPr>
-        <w:spacing w:after="80"/>
-      </w:pPr>
-      <w:r>
-        <w:t xml:space="preserve">Sản lượng </w:t>
-      </w:r>
-      <w:r>
-        <w:rPr>
-          <w:b/>
-          <w:bCs/>
-        </w:rPr>
-        <w:t xml:space="preserve">đã ký hợp đồng nhưng chưa giao</w:t>
-      </w:r>
-      <w:r>
-        <w:t xml:space="preserve"> không còn nhập ở đây — hệ thống tự tính từ hợp đồng, xem ở cột “Chưa giao” trên màn Báo cáo tiêu thụ.</w:t>
-      </w:r>
-    </w:p>
-    <w:p>
-      <w:pPr>
-        <w:pStyle w:val="ListParagraph"/>
-        <w:numPr>
-          <w:ilvl w:val="0"/>
-          <w:numId w:val="3"/>
-        </w:numPr>
-        <w:spacing w:after="80"/>
-      </w:pPr>
-      <w:r>
-        <w:t xml:space="preserve">Tích </w:t>
-      </w:r>
-      <w:r>
-        <w:rPr>
-          <w:b/>
-          <w:bCs/>
-        </w:rPr>
-        <w:t xml:space="preserve">Hôm nay không phát sinh tồn kho để khai</w:t>
-      </w:r>
-      <w:r>
-        <w:t xml:space="preserve"> nếu ngày đó đơn vị không có gì để báo.</w:t>
+        <w:t xml:space="preserve">Ngày nào không phát sinh loại nào thì để trống loại đó, không nhập số 0.</w:t>
+      </w:r>
+    </w:p>
+    <w:p>
+      <w:pPr>
+        <w:pStyle w:val="ListParagraph"/>
+        <w:numPr>
+          <w:ilvl w:val="0"/>
+          <w:numId w:val="3"/>
+        </w:numPr>
+        <w:spacing w:after="80"/>
+      </w:pPr>
+      <w:r>
+        <w:t xml:space="preserve">Nút </w:t>
+      </w:r>
+      <w:r>
+        <w:rPr>
+          <w:b/>
+          <w:bCs/>
+        </w:rPr>
+        <w:t xml:space="preserve">Lấy tỷ giá VCB cho các dòng USD</w:t>
+      </w:r>
+      <w:r>
+        <w:t xml:space="preserve"> điền tỷ giá Vietcombank cho mọi dòng đang chọn USD.</w:t>
       </w:r>
     </w:p>
     <w:p>
@@ -1290,7 +1333,7 @@
         <w:pageBreakBefore/>
       </w:pPr>
       <w:r>
-        <w:t xml:space="preserve">6. Khách hàng</w:t>
+        <w:t xml:space="preserve">6. Nhập Tồn kho</w:t>
       </w:r>
     </w:p>
     <w:p>
@@ -1305,7 +1348,7 @@
         <w:t xml:space="preserve">Vị trí: </w:t>
       </w:r>
       <w:r>
-        <w:t xml:space="preserve">Quản lý hợp đồng → Khách hàng</w:t>
+        <w:t xml:space="preserve">Nhập liệu số liệu → Tồn kho → Thêm số liệu ngày</w:t>
       </w:r>
     </w:p>
     <w:p>
@@ -1313,7 +1356,7 @@
         <w:spacing w:after="140"/>
       </w:pPr>
       <w:r>
-        <w:t xml:space="preserve">Danh mục khách hàng riêng của từng đơn vị — đơn vị khác không thấy danh mục của đơn vị mình. Phải có khách hàng trước thì mới lập được hợp đồng.</w:t>
+        <w:t xml:space="preserve">Tồn kho là số tại thời điểm cuối ngày, không cộng dồn giữa các ngày. Phiếu còn đúng 3 khối nhập tay.</w:t>
       </w:r>
     </w:p>
     <w:p>
@@ -1326,7 +1369,7 @@
           <wp:inline distT="0" distB="0" distL="0" distR="0">
             <wp:extent cx="6191250" cy="3381375"/>
             <wp:effectExtent t="0" r="0" b="0" l="0"/>
-            <wp:docPr id="1" name="img" descr="Ảnh hướng dẫn có đánh số bước" title="img/05-khach-hang.png"/>
+            <wp:docPr id="1" name="img" descr="Ảnh hướng dẫn có đánh số bước" title="img/04-ton-kho.png"/>
             <wp:cNvGraphicFramePr>
               <a:graphicFrameLocks xmlns:a="http://schemas.openxmlformats.org/drawingml/2006/main" noChangeAspect="1"/>
             </wp:cNvGraphicFramePr>
@@ -1375,7 +1418,222 @@
           <w:sz w:val="17"/>
           <w:szCs w:val="17"/>
         </w:rPr>
-        <w:t xml:space="preserve">Hình 5. Danh mục khách hàng của đơn vị</w:t>
+        <w:t xml:space="preserve">Hình 4. Phiếu Tồn kho theo ngày</w:t>
+      </w:r>
+    </w:p>
+    <w:p>
+      <w:pPr>
+        <w:spacing w:after="80"/>
+      </w:pPr>
+      <w:r>
+        <w:rPr>
+          <w:b/>
+          <w:bCs/>
+        </w:rPr>
+        <w:t xml:space="preserve">Các bước:</w:t>
+      </w:r>
+    </w:p>
+    <w:p>
+      <w:pPr>
+        <w:pStyle w:val="ListParagraph"/>
+        <w:numPr>
+          <w:ilvl w:val="0"/>
+          <w:numId w:val="8"/>
+        </w:numPr>
+        <w:spacing w:after="100"/>
+      </w:pPr>
+      <w:r>
+        <w:rPr>
+          <w:b/>
+          <w:bCs/>
+        </w:rPr>
+        <w:t xml:space="preserve">Lấy tồn ngày trước</w:t>
+      </w:r>
+      <w:r>
+        <w:t xml:space="preserve"> — chép số tồn của ngày gần nhất sang rồi sửa cho đúng ngày này.</w:t>
+      </w:r>
+    </w:p>
+    <w:p>
+      <w:pPr>
+        <w:pStyle w:val="ListParagraph"/>
+        <w:numPr>
+          <w:ilvl w:val="0"/>
+          <w:numId w:val="8"/>
+        </w:numPr>
+        <w:spacing w:after="100"/>
+      </w:pPr>
+      <w:r>
+        <w:rPr>
+          <w:b/>
+          <w:bCs/>
+        </w:rPr>
+        <w:t xml:space="preserve">Khối 1 — Tồn kho thành phẩm chế biến chưa nhập kho</w:t>
+      </w:r>
+      <w:r>
+        <w:t xml:space="preserve">: mỗi chủng loại một dòng.</w:t>
+      </w:r>
+    </w:p>
+    <w:p>
+      <w:pPr>
+        <w:pStyle w:val="ListParagraph"/>
+        <w:numPr>
+          <w:ilvl w:val="0"/>
+          <w:numId w:val="8"/>
+        </w:numPr>
+        <w:spacing w:after="100"/>
+      </w:pPr>
+      <w:r>
+        <w:rPr>
+          <w:b/>
+          <w:bCs/>
+        </w:rPr>
+        <w:t xml:space="preserve">Khối 2 — Tồn kho thành phẩm đã nhập kho</w:t>
+      </w:r>
+      <w:r>
+        <w:t xml:space="preserve">: mỗi chủng loại một dòng.</w:t>
+      </w:r>
+    </w:p>
+    <w:p>
+      <w:pPr>
+        <w:pStyle w:val="ListParagraph"/>
+        <w:numPr>
+          <w:ilvl w:val="0"/>
+          <w:numId w:val="8"/>
+        </w:numPr>
+        <w:spacing w:after="100"/>
+      </w:pPr>
+      <w:r>
+        <w:rPr>
+          <w:b/>
+          <w:bCs/>
+        </w:rPr>
+        <w:t xml:space="preserve">Khối 3 — Tồn kho nguyên liệu chưa sản xuất (quy khô)</w:t>
+      </w:r>
+      <w:r>
+        <w:t xml:space="preserve">: một ô tổng.</w:t>
+      </w:r>
+    </w:p>
+    <w:p>
+      <w:pPr>
+        <w:spacing w:after="80" w:before="140"/>
+      </w:pPr>
+      <w:r>
+        <w:rPr>
+          <w:b/>
+          <w:bCs/>
+        </w:rPr>
+        <w:t xml:space="preserve">Lưu ý:</w:t>
+      </w:r>
+    </w:p>
+    <w:p>
+      <w:pPr>
+        <w:pStyle w:val="ListParagraph"/>
+        <w:numPr>
+          <w:ilvl w:val="0"/>
+          <w:numId w:val="3"/>
+        </w:numPr>
+        <w:spacing w:after="80"/>
+      </w:pPr>
+      <w:r>
+        <w:t xml:space="preserve">Ô </w:t>
+      </w:r>
+      <w:r>
+        <w:rPr>
+          <w:b/>
+          <w:bCs/>
+        </w:rPr>
+        <w:t xml:space="preserve">Tồn kho thành phẩm</w:t>
+      </w:r>
+      <w:r>
+        <w:t xml:space="preserve"> ở cuối phiếu là số </w:t>
+      </w:r>
+      <w:r>
+        <w:rPr>
+          <w:b/>
+          <w:bCs/>
+        </w:rPr>
+        <w:t xml:space="preserve">tự tính</w:t>
+      </w:r>
+      <w:r>
+        <w:t xml:space="preserve"> = khối 1 + khối 2.</w:t>
+      </w:r>
+    </w:p>
+    <w:p>
+      <w:pPr>
+        <w:pStyle w:val="ListParagraph"/>
+        <w:numPr>
+          <w:ilvl w:val="0"/>
+          <w:numId w:val="3"/>
+        </w:numPr>
+        <w:spacing w:after="80"/>
+      </w:pPr>
+      <w:r>
+        <w:t xml:space="preserve">Sản lượng </w:t>
+      </w:r>
+      <w:r>
+        <w:rPr>
+          <w:b/>
+          <w:bCs/>
+        </w:rPr>
+        <w:t xml:space="preserve">đã ký hợp đồng nhưng chưa giao</w:t>
+      </w:r>
+      <w:r>
+        <w:t xml:space="preserve"> không còn nhập ở đây — hệ thống tự tính từ hợp đồng, xem ở cột “Chưa giao” trên màn Báo cáo tiêu thụ.</w:t>
+      </w:r>
+    </w:p>
+    <w:p>
+      <w:pPr>
+        <w:pStyle w:val="ListParagraph"/>
+        <w:numPr>
+          <w:ilvl w:val="0"/>
+          <w:numId w:val="3"/>
+        </w:numPr>
+        <w:spacing w:after="80"/>
+      </w:pPr>
+      <w:r>
+        <w:t xml:space="preserve">Tích </w:t>
+      </w:r>
+      <w:r>
+        <w:rPr>
+          <w:b/>
+          <w:bCs/>
+        </w:rPr>
+        <w:t xml:space="preserve">Hôm nay không phát sinh tồn kho để khai</w:t>
+      </w:r>
+      <w:r>
+        <w:t xml:space="preserve"> nếu ngày đó đơn vị không có gì để báo.</w:t>
+      </w:r>
+    </w:p>
+    <w:p>
+      <w:pPr>
+        <w:pStyle w:val="Heading2"/>
+        <w:pageBreakBefore/>
+      </w:pPr>
+      <w:r>
+        <w:t xml:space="preserve">7. Khách hàng</w:t>
+      </w:r>
+    </w:p>
+    <w:p>
+      <w:pPr>
+        <w:spacing w:after="60"/>
+      </w:pPr>
+      <w:r>
+        <w:rPr>
+          <w:b/>
+          <w:bCs/>
+        </w:rPr>
+        <w:t xml:space="preserve">Vị trí: </w:t>
+      </w:r>
+      <w:r>
+        <w:t xml:space="preserve">Quản lý hợp đồng → Khách hàng</w:t>
+      </w:r>
+    </w:p>
+    <w:p>
+      <w:pPr>
+        <w:spacing w:after="140"/>
+      </w:pPr>
+      <w:r>
+        <w:t xml:space="preserve">Danh mục khách hàng riêng của từng đơn vị — đơn vị khác không thấy danh mục của đơn vị mình. Phải có khách hàng trước thì mới lập được hợp đồng.</w:t>
       </w:r>
     </w:p>
     <w:p>
@@ -1388,7 +1646,7 @@
           <wp:inline distT="0" distB="0" distL="0" distR="0">
             <wp:extent cx="6191250" cy="3381375"/>
             <wp:effectExtent t="0" r="0" b="0" l="0"/>
-            <wp:docPr id="1" name="img" descr="Ảnh hướng dẫn có đánh số bước" title="img/05b-khach-hang-popup.png"/>
+            <wp:docPr id="1" name="img" descr="Ảnh hướng dẫn có đánh số bước" title="img/05-khach-hang.png"/>
             <wp:cNvGraphicFramePr>
               <a:graphicFrameLocks xmlns:a="http://schemas.openxmlformats.org/drawingml/2006/main" noChangeAspect="1"/>
             </wp:cNvGraphicFramePr>
@@ -1437,225 +1695,7 @@
           <w:sz w:val="17"/>
           <w:szCs w:val="17"/>
         </w:rPr>
-        <w:t xml:space="preserve">Hình 5b. Popup thêm/sửa khách hàng</w:t>
-      </w:r>
-    </w:p>
-    <w:p>
-      <w:pPr>
-        <w:spacing w:after="80"/>
-      </w:pPr>
-      <w:r>
-        <w:rPr>
-          <w:b/>
-          <w:bCs/>
-        </w:rPr>
-        <w:t xml:space="preserve">Các bước:</w:t>
-      </w:r>
-    </w:p>
-    <w:p>
-      <w:pPr>
-        <w:pStyle w:val="ListParagraph"/>
-        <w:numPr>
-          <w:ilvl w:val="0"/>
-          <w:numId w:val="8"/>
-        </w:numPr>
-        <w:spacing w:after="100"/>
-      </w:pPr>
-      <w:r>
-        <w:rPr>
-          <w:b/>
-          <w:bCs/>
-        </w:rPr>
-        <w:t xml:space="preserve">Thêm khách hàng</w:t>
-      </w:r>
-      <w:r>
-        <w:t xml:space="preserve"> — bấm nút ở đầu trang (Hình 5 · ①), popup hiện ra để nhập.</w:t>
-      </w:r>
-    </w:p>
-    <w:p>
-      <w:pPr>
-        <w:pStyle w:val="ListParagraph"/>
-        <w:numPr>
-          <w:ilvl w:val="0"/>
-          <w:numId w:val="8"/>
-        </w:numPr>
-        <w:spacing w:after="100"/>
-      </w:pPr>
-      <w:r>
-        <w:t xml:space="preserve">Trong popup (Hình 5b): chọn </w:t>
-      </w:r>
-      <w:r>
-        <w:rPr>
-          <w:b/>
-          <w:bCs/>
-        </w:rPr>
-        <w:t xml:space="preserve">Đơn vị</w:t>
-      </w:r>
-      <w:r>
-        <w:t xml:space="preserve"> (1), nhập </w:t>
-      </w:r>
-      <w:r>
-        <w:rPr>
-          <w:b/>
-          <w:bCs/>
-        </w:rPr>
-        <w:t xml:space="preserve">Tên khách hàng</w:t>
-      </w:r>
-      <w:r>
-        <w:t xml:space="preserve"> (2) — bắt buộc; </w:t>
-      </w:r>
-      <w:r>
-        <w:rPr>
-          <w:b/>
-          <w:bCs/>
-        </w:rPr>
-        <w:t xml:space="preserve">Mã KH</w:t>
-      </w:r>
-      <w:r>
-        <w:t xml:space="preserve"> (3) và </w:t>
-      </w:r>
-      <w:r>
-        <w:rPr>
-          <w:b/>
-          <w:bCs/>
-        </w:rPr>
-        <w:t xml:space="preserve">Mã số thuế</w:t>
-      </w:r>
-      <w:r>
-        <w:t xml:space="preserve"> (4) nhập nếu có. Bấm </w:t>
-      </w:r>
-      <w:r>
-        <w:rPr>
-          <w:b/>
-          <w:bCs/>
-        </w:rPr>
-        <w:t xml:space="preserve">Lưu</w:t>
-      </w:r>
-      <w:r>
-        <w:t xml:space="preserve"> (5), popup đóng lại và khách hàng hiện trong bảng.</w:t>
-      </w:r>
-    </w:p>
-    <w:p>
-      <w:pPr>
-        <w:pStyle w:val="ListParagraph"/>
-        <w:numPr>
-          <w:ilvl w:val="0"/>
-          <w:numId w:val="8"/>
-        </w:numPr>
-        <w:spacing w:after="100"/>
-      </w:pPr>
-      <w:r>
-        <w:rPr>
-          <w:b/>
-          <w:bCs/>
-        </w:rPr>
-        <w:t xml:space="preserve">Sửa</w:t>
-      </w:r>
-      <w:r>
-        <w:t xml:space="preserve"> ở cuối mỗi dòng (Hình 5 · ②) mở lại chính popup đó với dữ liệu đã điền sẵn; </w:t>
-      </w:r>
-      <w:r>
-        <w:rPr>
-          <w:b/>
-          <w:bCs/>
-        </w:rPr>
-        <w:t xml:space="preserve">Ẩn / Xoá</w:t>
-      </w:r>
-      <w:r>
-        <w:t xml:space="preserve"> nằm cạnh bên.</w:t>
-      </w:r>
-    </w:p>
-    <w:p>
-      <w:pPr>
-        <w:spacing w:after="80" w:before="140"/>
-      </w:pPr>
-      <w:r>
-        <w:rPr>
-          <w:b/>
-          <w:bCs/>
-        </w:rPr>
-        <w:t xml:space="preserve">Lưu ý:</w:t>
-      </w:r>
-    </w:p>
-    <w:p>
-      <w:pPr>
-        <w:pStyle w:val="ListParagraph"/>
-        <w:numPr>
-          <w:ilvl w:val="0"/>
-          <w:numId w:val="3"/>
-        </w:numPr>
-        <w:spacing w:after="80"/>
-      </w:pPr>
-      <w:r>
-        <w:t xml:space="preserve">Ô </w:t>
-      </w:r>
-      <w:r>
-        <w:rPr>
-          <w:b/>
-          <w:bCs/>
-        </w:rPr>
-        <w:t xml:space="preserve">Đơn vị</w:t>
-      </w:r>
-      <w:r>
-        <w:t xml:space="preserve"> bị khoá khi sửa — khách hàng đã tạo không chuyển sang đơn vị khác được (hợp đồng đang gắn sẽ theo sang). Cần khách đó ở đơn vị khác thì tạo mới.</w:t>
-      </w:r>
-    </w:p>
-    <w:p>
-      <w:pPr>
-        <w:pStyle w:val="ListParagraph"/>
-        <w:numPr>
-          <w:ilvl w:val="0"/>
-          <w:numId w:val="3"/>
-        </w:numPr>
-        <w:spacing w:after="80"/>
-      </w:pPr>
-      <w:r>
-        <w:t xml:space="preserve">Trùng tên trong cùng một đơn vị sẽ bị chặn; hai đơn vị khác nhau được phép trùng tên khách.</w:t>
-      </w:r>
-    </w:p>
-    <w:p>
-      <w:pPr>
-        <w:pStyle w:val="ListParagraph"/>
-        <w:numPr>
-          <w:ilvl w:val="0"/>
-          <w:numId w:val="3"/>
-        </w:numPr>
-        <w:spacing w:after="80"/>
-      </w:pPr>
-      <w:r>
-        <w:t xml:space="preserve">Khách hàng đang có hợp đồng thì không xoá được — hãy ẩn thay vì xoá.</w:t>
-      </w:r>
-    </w:p>
-    <w:p>
-      <w:pPr>
-        <w:pStyle w:val="Heading2"/>
-        <w:pageBreakBefore/>
-      </w:pPr>
-      <w:r>
-        <w:t xml:space="preserve">7. Hợp đồng &amp; đợt giao — danh sách</w:t>
-      </w:r>
-    </w:p>
-    <w:p>
-      <w:pPr>
-        <w:spacing w:after="60"/>
-      </w:pPr>
-      <w:r>
-        <w:rPr>
-          <w:b/>
-          <w:bCs/>
-        </w:rPr>
-        <w:t xml:space="preserve">Vị trí: </w:t>
-      </w:r>
-      <w:r>
-        <w:t xml:space="preserve">Quản lý hợp đồng → Hợp đồng &amp; đợt giao</w:t>
-      </w:r>
-    </w:p>
-    <w:p>
-      <w:pPr>
-        <w:spacing w:after="140"/>
-      </w:pPr>
-      <w:r>
-        <w:t xml:space="preserve">Danh sách các hợp đồng của đơn vị kèm tiến độ giao hàng.</w:t>
+        <w:t xml:space="preserve">Hình 5. Danh mục khách hàng của đơn vị</w:t>
       </w:r>
     </w:p>
     <w:p>
@@ -1668,7 +1708,7 @@
           <wp:inline distT="0" distB="0" distL="0" distR="0">
             <wp:extent cx="6191250" cy="3381375"/>
             <wp:effectExtent t="0" r="0" b="0" l="0"/>
-            <wp:docPr id="1" name="img" descr="Ảnh hướng dẫn có đánh số bước" title="img/06-hop-dong-danh-sach.png"/>
+            <wp:docPr id="1" name="img" descr="Ảnh hướng dẫn có đánh số bước" title="img/05b-khach-hang-popup.png"/>
             <wp:cNvGraphicFramePr>
               <a:graphicFrameLocks xmlns:a="http://schemas.openxmlformats.org/drawingml/2006/main" noChangeAspect="1"/>
             </wp:cNvGraphicFramePr>
@@ -1717,7 +1757,7 @@
           <w:sz w:val="17"/>
           <w:szCs w:val="17"/>
         </w:rPr>
-        <w:t xml:space="preserve">Hình 6. Danh sách hợp đồng và tiến độ giao</w:t>
+        <w:t xml:space="preserve">Hình 5b. Popup thêm/sửa khách hàng</w:t>
       </w:r>
     </w:p>
     <w:p>
@@ -1746,10 +1786,10 @@
           <w:b/>
           <w:bCs/>
         </w:rPr>
-        <w:t xml:space="preserve">Thêm hợp đồng</w:t>
-      </w:r>
-      <w:r>
-        <w:t xml:space="preserve"> — lập hợp đồng mới (xem mục 8).</w:t>
+        <w:t xml:space="preserve">Thêm khách hàng</w:t>
+      </w:r>
+      <w:r>
+        <w:t xml:space="preserve"> — bấm nút ở đầu trang (Hình 5 · ①), popup hiện ra để nhập.</w:t>
       </w:r>
     </w:p>
     <w:p>
@@ -1762,24 +1802,57 @@
         <w:spacing w:after="100"/>
       </w:pPr>
       <w:r>
-        <w:rPr>
-          <w:b/>
-          <w:bCs/>
-        </w:rPr>
-        <w:t xml:space="preserve">Lọc theo Hình thức</w:t>
-      </w:r>
-      <w:r>
-        <w:t xml:space="preserve"> — *Xuất khẩu / UTXK* · *Tiêu thụ trong nước* · *Tiêu thụ nội bộ*, hoặc </w:t>
-      </w:r>
-      <w:r>
-        <w:rPr>
-          <w:b/>
-          <w:bCs/>
-        </w:rPr>
-        <w:t xml:space="preserve">Chưa khai hình thức</w:t>
-      </w:r>
-      <w:r>
-        <w:t xml:space="preserve"> để tìm nhanh những hợp đồng cũ còn thiếu mục này.</w:t>
+        <w:t xml:space="preserve">Trong popup (Hình 5b): chọn </w:t>
+      </w:r>
+      <w:r>
+        <w:rPr>
+          <w:b/>
+          <w:bCs/>
+        </w:rPr>
+        <w:t xml:space="preserve">Đơn vị</w:t>
+      </w:r>
+      <w:r>
+        <w:t xml:space="preserve"> (1), nhập </w:t>
+      </w:r>
+      <w:r>
+        <w:rPr>
+          <w:b/>
+          <w:bCs/>
+        </w:rPr>
+        <w:t xml:space="preserve">Tên khách hàng</w:t>
+      </w:r>
+      <w:r>
+        <w:t xml:space="preserve"> (2) — bắt buộc; </w:t>
+      </w:r>
+      <w:r>
+        <w:rPr>
+          <w:b/>
+          <w:bCs/>
+        </w:rPr>
+        <w:t xml:space="preserve">Mã KH</w:t>
+      </w:r>
+      <w:r>
+        <w:t xml:space="preserve"> (3) và </w:t>
+      </w:r>
+      <w:r>
+        <w:rPr>
+          <w:b/>
+          <w:bCs/>
+        </w:rPr>
+        <w:t xml:space="preserve">Mã số thuế</w:t>
+      </w:r>
+      <w:r>
+        <w:t xml:space="preserve"> (4) nhập nếu có. Bấm </w:t>
+      </w:r>
+      <w:r>
+        <w:rPr>
+          <w:b/>
+          <w:bCs/>
+        </w:rPr>
+        <w:t xml:space="preserve">Lưu</w:t>
+      </w:r>
+      <w:r>
+        <w:t xml:space="preserve"> (5), popup đóng lại và khách hàng hiện trong bảng.</w:t>
       </w:r>
     </w:p>
     <w:p>
@@ -1796,20 +1869,20 @@
           <w:b/>
           <w:bCs/>
         </w:rPr>
-        <w:t xml:space="preserve">Xem / Sửa / Xoá</w:t>
-      </w:r>
-      <w:r>
-        <w:t xml:space="preserve"> ở cuối mỗi dòng. Bấm </w:t>
-      </w:r>
-      <w:r>
-        <w:rPr>
-          <w:b/>
-          <w:bCs/>
-        </w:rPr>
-        <w:t xml:space="preserve">Xem</w:t>
-      </w:r>
-      <w:r>
-        <w:t xml:space="preserve"> để mở màn chi tiết (mục 9).</w:t>
+        <w:t xml:space="preserve">Sửa</w:t>
+      </w:r>
+      <w:r>
+        <w:t xml:space="preserve"> ở cuối mỗi dòng (Hình 5 · ②) mở lại chính popup đó với dữ liệu đã điền sẵn; </w:t>
+      </w:r>
+      <w:r>
+        <w:rPr>
+          <w:b/>
+          <w:bCs/>
+        </w:rPr>
+        <w:t xml:space="preserve">Ẩn / Xoá</w:t>
+      </w:r>
+      <w:r>
+        <w:t xml:space="preserve"> nằm cạnh bên.</w:t>
       </w:r>
     </w:p>
     <w:p>
@@ -1834,157 +1907,43 @@
         <w:spacing w:after="80"/>
       </w:pPr>
       <w:r>
-        <w:rPr>
-          <w:b/>
-          <w:bCs/>
-        </w:rPr>
-        <w:t xml:space="preserve">SL hợp đồng</w:t>
-      </w:r>
-      <w:r>
-        <w:t xml:space="preserve"> — tổng sản lượng ghi trên hợp đồng đã ký.</w:t>
-      </w:r>
-    </w:p>
-    <w:p>
-      <w:pPr>
-        <w:pStyle w:val="ListParagraph"/>
-        <w:numPr>
-          <w:ilvl w:val="0"/>
-          <w:numId w:val="3"/>
-        </w:numPr>
-        <w:spacing w:after="80"/>
-      </w:pPr>
-      <w:r>
-        <w:rPr>
-          <w:b/>
-          <w:bCs/>
-        </w:rPr>
-        <w:t xml:space="preserve">Đã giao</w:t>
-      </w:r>
-      <w:r>
-        <w:t xml:space="preserve"> — tổng của các đợt giao đã điền ngày giao (kèm dòng *vượt …* nếu giao quá hợp đồng).</w:t>
-      </w:r>
-    </w:p>
-    <w:p>
-      <w:pPr>
-        <w:pStyle w:val="ListParagraph"/>
-        <w:numPr>
-          <w:ilvl w:val="0"/>
-          <w:numId w:val="3"/>
-        </w:numPr>
-        <w:spacing w:after="80"/>
-      </w:pPr>
-      <w:r>
-        <w:rPr>
-          <w:b/>
-          <w:bCs/>
-        </w:rPr>
-        <w:t xml:space="preserve">Còn phải giao</w:t>
-      </w:r>
-      <w:r>
-        <w:t xml:space="preserve"> = SL hợp đồng − Đã giao. Đây chính là phần “đã ký HĐ chưa giao”; dòng nhỏ *chờ giao …* cho biết trong đó bao nhiêu đã lập đợt nhưng chưa điền ngày giao.</w:t>
-      </w:r>
-    </w:p>
-    <w:p>
-      <w:pPr>
-        <w:pStyle w:val="ListParagraph"/>
-        <w:numPr>
-          <w:ilvl w:val="0"/>
-          <w:numId w:val="3"/>
-        </w:numPr>
-        <w:spacing w:after="80"/>
-      </w:pPr>
-      <w:r>
-        <w:rPr>
-          <w:b/>
-          <w:bCs/>
-        </w:rPr>
-        <w:t xml:space="preserve">Hình thức</w:t>
-      </w:r>
-      <w:r>
-        <w:t xml:space="preserve"> — hình thức tiêu thụ khai ở </w:t>
-      </w:r>
-      <w:r>
-        <w:rPr>
-          <w:b/>
-          <w:bCs/>
-        </w:rPr>
-        <w:t xml:space="preserve">lần giao</w:t>
-      </w:r>
-      <w:r>
-        <w:t xml:space="preserve">, nên hợp đồng giao nhiều lần hiện </w:t>
-      </w:r>
-      <w:r>
-        <w:rPr>
-          <w:b/>
-          <w:bCs/>
-        </w:rPr>
-        <w:t xml:space="preserve">tất cả</w:t>
-      </w:r>
-      <w:r>
-        <w:t xml:space="preserve"> hình thức của các đợt; hợp đồng chưa giao lần nào thì để trống.</w:t>
-      </w:r>
-    </w:p>
-    <w:p>
-      <w:pPr>
-        <w:pStyle w:val="ListParagraph"/>
-        <w:numPr>
-          <w:ilvl w:val="0"/>
-          <w:numId w:val="3"/>
-        </w:numPr>
-        <w:spacing w:after="80"/>
-      </w:pPr>
-      <w:r>
-        <w:rPr>
-          <w:b/>
-          <w:bCs/>
-        </w:rPr>
-        <w:t xml:space="preserve">Trạng thái</w:t>
-      </w:r>
-      <w:r>
-        <w:t xml:space="preserve"> — *Đang thực hiện* hay *Hoàn thành dd/mm/yyyy*. Hợp đồng đã hoàn thành không còn tính vào “đã ký HĐ chưa giao” và bị khoá sửa.</w:t>
-      </w:r>
-    </w:p>
-    <w:p>
-      <w:pPr>
-        <w:pStyle w:val="ListParagraph"/>
-        <w:numPr>
-          <w:ilvl w:val="0"/>
-          <w:numId w:val="3"/>
-        </w:numPr>
-        <w:spacing w:after="80"/>
-      </w:pPr>
-      <w:r>
-        <w:t xml:space="preserve">Các bộ lọc dùng chung được: </w:t>
-      </w:r>
-      <w:r>
-        <w:rPr>
-          <w:b/>
-          <w:bCs/>
-        </w:rPr>
-        <w:t xml:space="preserve">Đơn vị · Khách hàng</w:t>
-      </w:r>
-      <w:r>
-        <w:t xml:space="preserve"> (gõ để tìm, chọn nhiều) </w:t>
-      </w:r>
-      <w:r>
-        <w:rPr>
-          <w:b/>
-          <w:bCs/>
-        </w:rPr>
-        <w:t xml:space="preserve">· Trạng thái · Hình thức · Ngày ký</w:t>
-      </w:r>
-      <w:r>
-        <w:t xml:space="preserve"> và ô </w:t>
-      </w:r>
-      <w:r>
-        <w:rPr>
-          <w:b/>
-          <w:bCs/>
-        </w:rPr>
-        <w:t xml:space="preserve">tìm theo số HĐ</w:t>
-      </w:r>
-      <w:r>
-        <w:t xml:space="preserve"> (gõ không dấu vẫn ra).</w:t>
+        <w:t xml:space="preserve">Ô </w:t>
+      </w:r>
+      <w:r>
+        <w:rPr>
+          <w:b/>
+          <w:bCs/>
+        </w:rPr>
+        <w:t xml:space="preserve">Đơn vị</w:t>
+      </w:r>
+      <w:r>
+        <w:t xml:space="preserve"> bị khoá khi sửa — khách hàng đã tạo không chuyển sang đơn vị khác được (hợp đồng đang gắn sẽ theo sang). Cần khách đó ở đơn vị khác thì tạo mới.</w:t>
+      </w:r>
+    </w:p>
+    <w:p>
+      <w:pPr>
+        <w:pStyle w:val="ListParagraph"/>
+        <w:numPr>
+          <w:ilvl w:val="0"/>
+          <w:numId w:val="3"/>
+        </w:numPr>
+        <w:spacing w:after="80"/>
+      </w:pPr>
+      <w:r>
+        <w:t xml:space="preserve">Trùng tên trong cùng một đơn vị sẽ bị chặn; hai đơn vị khác nhau được phép trùng tên khách.</w:t>
+      </w:r>
+    </w:p>
+    <w:p>
+      <w:pPr>
+        <w:pStyle w:val="ListParagraph"/>
+        <w:numPr>
+          <w:ilvl w:val="0"/>
+          <w:numId w:val="3"/>
+        </w:numPr>
+        <w:spacing w:after="80"/>
+      </w:pPr>
+      <w:r>
+        <w:t xml:space="preserve">Khách hàng đang có hợp đồng thì không xoá được — hãy ẩn thay vì xoá.</w:t>
       </w:r>
     </w:p>
     <w:p>
@@ -1993,7 +1952,7 @@
         <w:pageBreakBefore/>
       </w:pPr>
       <w:r>
-        <w:t xml:space="preserve">8. Thêm hợp đồng</w:t>
+        <w:t xml:space="preserve">8. Hợp đồng &amp; đợt giao — danh sách</w:t>
       </w:r>
     </w:p>
     <w:p>
@@ -2008,7 +1967,15 @@
         <w:t xml:space="preserve">Vị trí: </w:t>
       </w:r>
       <w:r>
-        <w:t xml:space="preserve">Quản lý hợp đồng → Hợp đồng &amp; đợt giao → Thêm hợp đồng</w:t>
+        <w:t xml:space="preserve">Quản lý hợp đồng → Hợp đồng &amp; đợt giao</w:t>
+      </w:r>
+    </w:p>
+    <w:p>
+      <w:pPr>
+        <w:spacing w:after="140"/>
+      </w:pPr>
+      <w:r>
+        <w:t xml:space="preserve">Danh sách các hợp đồng của đơn vị kèm tiến độ giao hàng.</w:t>
       </w:r>
     </w:p>
     <w:p>
@@ -2021,7 +1988,7 @@
           <wp:inline distT="0" distB="0" distL="0" distR="0">
             <wp:extent cx="6191250" cy="3381375"/>
             <wp:effectExtent t="0" r="0" b="0" l="0"/>
-            <wp:docPr id="1" name="img" descr="Ảnh hướng dẫn có đánh số bước" title="img/07-hop-dong-form.png"/>
+            <wp:docPr id="1" name="img" descr="Ảnh hướng dẫn có đánh số bước" title="img/06-hop-dong-danh-sach.png"/>
             <wp:cNvGraphicFramePr>
               <a:graphicFrameLocks xmlns:a="http://schemas.openxmlformats.org/drawingml/2006/main" noChangeAspect="1"/>
             </wp:cNvGraphicFramePr>
@@ -2070,7 +2037,7 @@
           <w:sz w:val="17"/>
           <w:szCs w:val="17"/>
         </w:rPr>
-        <w:t xml:space="preserve">Hình 7. Phiếu thêm hợp đồng</w:t>
+        <w:t xml:space="preserve">Hình 6. Danh sách hợp đồng và tiến độ giao</w:t>
       </w:r>
     </w:p>
     <w:p>
@@ -2099,10 +2066,10 @@
           <w:b/>
           <w:bCs/>
         </w:rPr>
-        <w:t xml:space="preserve">Số hợp đồng</w:t>
-      </w:r>
-      <w:r>
-        <w:t xml:space="preserve"> — bắt buộc, không trùng trong cùng đơn vị.</w:t>
+        <w:t xml:space="preserve">Thêm hợp đồng</w:t>
+      </w:r>
+      <w:r>
+        <w:t xml:space="preserve"> — lập hợp đồng mới (xem mục 9).</w:t>
       </w:r>
     </w:p>
     <w:p>
@@ -2119,10 +2086,20 @@
           <w:b/>
           <w:bCs/>
         </w:rPr>
-        <w:t xml:space="preserve">Khách hàng</w:t>
-      </w:r>
-      <w:r>
-        <w:t xml:space="preserve"> — bắt buộc; gõ vài chữ trong tên (hoặc mã khách) rồi chọn. Danh sách chỉ có khách của chính đơn vị (mục 6).</w:t>
+        <w:t xml:space="preserve">Lọc theo Hình thức</w:t>
+      </w:r>
+      <w:r>
+        <w:t xml:space="preserve"> — *Xuất khẩu / UTXK* · *Tiêu thụ trong nước* · *Tiêu thụ nội bộ*, hoặc </w:t>
+      </w:r>
+      <w:r>
+        <w:rPr>
+          <w:b/>
+          <w:bCs/>
+        </w:rPr>
+        <w:t xml:space="preserve">Chưa khai hình thức</w:t>
+      </w:r>
+      <w:r>
+        <w:t xml:space="preserve"> để tìm nhanh những hợp đồng cũ còn thiếu mục này.</w:t>
       </w:r>
     </w:p>
     <w:p>
@@ -2139,170 +2116,20 @@
           <w:b/>
           <w:bCs/>
         </w:rPr>
-        <w:t xml:space="preserve">Loại hợp đồng</w:t>
-      </w:r>
-      <w:r>
-        <w:t xml:space="preserve"> — bắt buộc: *HĐ dài hạn* hay *HĐ chuyến*. Đây là chỉ tiêu của báo cáo, </w:t>
-      </w:r>
-      <w:r>
-        <w:rPr>
-          <w:b/>
-          <w:bCs/>
-        </w:rPr>
-        <w:t xml:space="preserve">khác</w:t>
-      </w:r>
-      <w:r>
-        <w:t xml:space="preserve"> với Loại giao bên dưới.</w:t>
-      </w:r>
-    </w:p>
-    <w:p>
-      <w:pPr>
-        <w:pStyle w:val="ListParagraph"/>
-        <w:numPr>
-          <w:ilvl w:val="0"/>
-          <w:numId w:val="10"/>
-        </w:numPr>
-        <w:spacing w:after="100"/>
-      </w:pPr>
-      <w:r>
-        <w:rPr>
-          <w:b/>
-          <w:bCs/>
-        </w:rPr>
-        <w:t xml:space="preserve">Loại giao</w:t>
-      </w:r>
-      <w:r>
-        <w:t xml:space="preserve"> — *Giao 1 lần* (cả hợp đồng giao trọn một lần) hay *Giao nhiều lần* (chia thành nhiều đợt giao). Chọn nhầm vẫn đổi được sau, xem mục 9.</w:t>
-      </w:r>
-    </w:p>
-    <w:p>
-      <w:pPr>
-        <w:pStyle w:val="ListParagraph"/>
-        <w:numPr>
-          <w:ilvl w:val="0"/>
-          <w:numId w:val="10"/>
-        </w:numPr>
-        <w:spacing w:after="100"/>
-      </w:pPr>
-      <w:r>
-        <w:rPr>
-          <w:b/>
-          <w:bCs/>
-        </w:rPr>
-        <w:t xml:space="preserve">Ngày ký</w:t>
-      </w:r>
-      <w:r>
-        <w:t xml:space="preserve"> — bắt buộc. Từ ngày này, sản lượng hợp đồng nằm ở mục “đã ký HĐ chưa giao”.</w:t>
-      </w:r>
-    </w:p>
-    <w:p>
-      <w:pPr>
-        <w:pStyle w:val="ListParagraph"/>
-        <w:numPr>
-          <w:ilvl w:val="0"/>
-          <w:numId w:val="10"/>
-        </w:numPr>
-        <w:spacing w:after="100"/>
-      </w:pPr>
-      <w:r>
-        <w:rPr>
-          <w:b/>
-          <w:bCs/>
-        </w:rPr>
-        <w:t xml:space="preserve">Ngày giao</w:t>
-      </w:r>
-      <w:r>
-        <w:t xml:space="preserve"> — chỉ hiện với hợp đồng *giao 1 lần*; điền khi đã giao xong. Bên dưới là </w:t>
-      </w:r>
-      <w:r>
-        <w:rPr>
-          <w:b/>
-          <w:bCs/>
-        </w:rPr>
-        <w:t xml:space="preserve">Hình thức tiêu thụ</w:t>
-      </w:r>
-      <w:r>
-        <w:t xml:space="preserve"> và khối </w:t>
-      </w:r>
-      <w:r>
-        <w:rPr>
-          <w:b/>
-          <w:bCs/>
-        </w:rPr>
-        <w:t xml:space="preserve">Hoá đơn</w:t>
-      </w:r>
-      <w:r>
-        <w:t xml:space="preserve"> (số hoá đơn + file scan).</w:t>
-      </w:r>
-    </w:p>
-    <w:p>
-      <w:pPr>
-        <w:pStyle w:val="ListParagraph"/>
-        <w:numPr>
-          <w:ilvl w:val="0"/>
-          <w:numId w:val="10"/>
-        </w:numPr>
-        <w:spacing w:after="100"/>
-      </w:pPr>
-      <w:r>
-        <w:rPr>
-          <w:b/>
-          <w:bCs/>
-        </w:rPr>
-        <w:t xml:space="preserve">Chi tiết hợp đồng</w:t>
-      </w:r>
-      <w:r>
-        <w:t xml:space="preserve"> — mỗi chủng loại một dòng (ô SL đổi nhãn thành </w:t>
-      </w:r>
-      <w:r>
-        <w:rPr>
-          <w:b/>
-          <w:bCs/>
-        </w:rPr>
-        <w:t xml:space="preserve">SL nước</w:t>
-      </w:r>
-      <w:r>
-        <w:t xml:space="preserve"> với latex và mủ nguyên liệu). Ô </w:t>
-      </w:r>
-      <w:r>
-        <w:rPr>
-          <w:b/>
-          <w:bCs/>
-        </w:rPr>
-        <w:t xml:space="preserve">Quy khô</w:t>
-      </w:r>
-      <w:r>
-        <w:t xml:space="preserve"> chỉ hiện với latex và mủ nguyên liệu; ô </w:t>
-      </w:r>
-      <w:r>
-        <w:rPr>
-          <w:b/>
-          <w:bCs/>
-        </w:rPr>
-        <w:t xml:space="preserve">Tỷ giá</w:t>
-      </w:r>
-      <w:r>
-        <w:t xml:space="preserve"> chỉ hiện khi dòng bán bằng ngoại tệ.</w:t>
-      </w:r>
-    </w:p>
-    <w:p>
-      <w:pPr>
-        <w:pStyle w:val="ListParagraph"/>
-        <w:numPr>
-          <w:ilvl w:val="0"/>
-          <w:numId w:val="10"/>
-        </w:numPr>
-        <w:spacing w:after="100"/>
-      </w:pPr>
-      <w:r>
-        <w:rPr>
-          <w:b/>
-          <w:bCs/>
-        </w:rPr>
-        <w:t xml:space="preserve">Thành tiền</w:t>
-      </w:r>
-      <w:r>
-        <w:t xml:space="preserve"> — ô CHỈ ĐỌC ở cuối mỗi dòng (= số lượng × đơn giá, theo đúng loại tiền của dòng). Tổng thành tiền của hợp đồng hiện ngay dưới bảng, quy về triệu đồng.</w:t>
+        <w:t xml:space="preserve">Xem / Sửa / Xoá</w:t>
+      </w:r>
+      <w:r>
+        <w:t xml:space="preserve"> ở cuối mỗi dòng. Bấm </w:t>
+      </w:r>
+      <w:r>
+        <w:rPr>
+          <w:b/>
+          <w:bCs/>
+        </w:rPr>
+        <w:t xml:space="preserve">Xem</w:t>
+      </w:r>
+      <w:r>
+        <w:t xml:space="preserve"> để mở màn chi tiết (mục 10).</w:t>
       </w:r>
     </w:p>
     <w:p>
@@ -2331,199 +2158,153 @@
           <w:b/>
           <w:bCs/>
         </w:rPr>
-        <w:t xml:space="preserve">Không quản lý hợp đồng khung:</w:t>
-      </w:r>
-      <w:r>
-        <w:t xml:space="preserve"> đơn vị có hợp đồng dài hạn thì nhập </w:t>
-      </w:r>
-      <w:r>
-        <w:rPr>
-          <w:b/>
-          <w:bCs/>
-        </w:rPr>
-        <w:t xml:space="preserve">mỗi phụ lục như một hợp đồng</w:t>
-      </w:r>
-      <w:r>
-        <w:t xml:space="preserve"> và chọn loại </w:t>
-      </w:r>
-      <w:r>
-        <w:rPr>
-          <w:b/>
-          <w:bCs/>
-        </w:rPr>
-        <w:t xml:space="preserve">HĐ dài hạn</w:t>
-      </w:r>
-      <w:r>
-        <w:t xml:space="preserve"> để phân biệt.</w:t>
-      </w:r>
-    </w:p>
-    <w:p>
-      <w:pPr>
-        <w:pStyle w:val="ListParagraph"/>
-        <w:numPr>
-          <w:ilvl w:val="0"/>
-          <w:numId w:val="3"/>
-        </w:numPr>
-        <w:spacing w:after="80"/>
-      </w:pPr>
-      <w:r>
-        <w:rPr>
-          <w:b/>
-          <w:bCs/>
-        </w:rPr>
-        <w:t xml:space="preserve">LATEX và 2 loại mủ nguyên liệu bán theo MỦ NƯỚC:</w:t>
-      </w:r>
-      <w:r>
-        <w:t xml:space="preserve"> ô </w:t>
-      </w:r>
-      <w:r>
-        <w:rPr>
-          <w:b/>
-          <w:bCs/>
-        </w:rPr>
-        <w:t xml:space="preserve">SL nước (tấn)</w:t>
-      </w:r>
-      <w:r>
-        <w:t xml:space="preserve"> là số để tính </w:t>
-      </w:r>
-      <w:r>
-        <w:rPr>
-          <w:b/>
-          <w:bCs/>
-        </w:rPr>
-        <w:t xml:space="preserve">Thành tiền</w:t>
-      </w:r>
-      <w:r>
-        <w:t xml:space="preserve"> (đơn giá là giá theo tấn mủ nước), còn </w:t>
-      </w:r>
-      <w:r>
-        <w:rPr>
-          <w:b/>
-          <w:bCs/>
-        </w:rPr>
-        <w:t xml:space="preserve">sản lượng tiêu thụ trên báo cáo lấy theo ô Quy khô</w:t>
-      </w:r>
-      <w:r>
-        <w:t xml:space="preserve">. Vì vậy hai ô này phải khai đủ và đúng.</w:t>
-      </w:r>
-    </w:p>
-    <w:p>
-      <w:pPr>
-        <w:pStyle w:val="ListParagraph"/>
-        <w:numPr>
-          <w:ilvl w:val="0"/>
-          <w:numId w:val="3"/>
-        </w:numPr>
-        <w:spacing w:after="80"/>
-      </w:pPr>
-      <w:r>
-        <w:t xml:space="preserve">Bán bằng </w:t>
-      </w:r>
-      <w:r>
-        <w:rPr>
-          <w:b/>
-          <w:bCs/>
-        </w:rPr>
-        <w:t xml:space="preserve">VNĐ</w:t>
-      </w:r>
-      <w:r>
-        <w:t xml:space="preserve"> nhập đơn giá theo </w:t>
-      </w:r>
-      <w:r>
-        <w:rPr>
-          <w:b/>
-          <w:bCs/>
-        </w:rPr>
-        <w:t xml:space="preserve">triệu đồng/tấn</w:t>
-      </w:r>
-      <w:r>
-        <w:t xml:space="preserve">; bán bằng </w:t>
-      </w:r>
-      <w:r>
-        <w:rPr>
-          <w:b/>
-          <w:bCs/>
-        </w:rPr>
-        <w:t xml:space="preserve">ngoại tệ</w:t>
-      </w:r>
-      <w:r>
-        <w:t xml:space="preserve"> nhập theo </w:t>
-      </w:r>
-      <w:r>
-        <w:rPr>
-          <w:b/>
-          <w:bCs/>
-        </w:rPr>
-        <w:t xml:space="preserve">ngoại tệ/tấn</w:t>
-      </w:r>
-      <w:r>
-        <w:t xml:space="preserve"> và </w:t>
-      </w:r>
-      <w:r>
-        <w:rPr>
-          <w:b/>
-          <w:bCs/>
-        </w:rPr>
-        <w:t xml:space="preserve">phải có tỷ giá</w:t>
-      </w:r>
-      <w:r>
-        <w:t xml:space="preserve"> quy ra VNĐ, nếu không doanh thu sẽ hiện “—”.</w:t>
-      </w:r>
-    </w:p>
-    <w:p>
-      <w:pPr>
-        <w:pStyle w:val="ListParagraph"/>
-        <w:numPr>
-          <w:ilvl w:val="0"/>
-          <w:numId w:val="3"/>
-        </w:numPr>
-        <w:spacing w:after="80"/>
-      </w:pPr>
-      <w:r>
-        <w:t xml:space="preserve">Bán </w:t>
-      </w:r>
-      <w:r>
-        <w:rPr>
-          <w:b/>
-          <w:bCs/>
-        </w:rPr>
-        <w:t xml:space="preserve">LATEX</w:t>
-      </w:r>
-      <w:r>
-        <w:t xml:space="preserve"> và 2 loại mủ nguyên liệu thì </w:t>
-      </w:r>
-      <w:r>
-        <w:rPr>
-          <w:b/>
-          <w:bCs/>
-        </w:rPr>
-        <w:t xml:space="preserve">bắt buộc nhập quy khô</w:t>
-      </w:r>
-      <w:r>
-        <w:t xml:space="preserve"> mới lưu được.</w:t>
-      </w:r>
-    </w:p>
-    <w:p>
-      <w:pPr>
-        <w:pStyle w:val="ListParagraph"/>
-        <w:numPr>
-          <w:ilvl w:val="0"/>
-          <w:numId w:val="3"/>
-        </w:numPr>
-        <w:spacing w:after="80"/>
-      </w:pPr>
-      <w:r>
-        <w:t xml:space="preserve">Hợp đồng </w:t>
-      </w:r>
-      <w:r>
-        <w:rPr>
-          <w:b/>
-          <w:bCs/>
-        </w:rPr>
-        <w:t xml:space="preserve">giao nhiều lần</w:t>
-      </w:r>
-      <w:r>
-        <w:t xml:space="preserve"> không tự đánh dấu đã giao — mỗi lần giao nhập một đợt giao.</w:t>
+        <w:t xml:space="preserve">SL hợp đồng</w:t>
+      </w:r>
+      <w:r>
+        <w:t xml:space="preserve"> — tổng sản lượng ghi trên hợp đồng đã ký.</w:t>
+      </w:r>
+    </w:p>
+    <w:p>
+      <w:pPr>
+        <w:pStyle w:val="ListParagraph"/>
+        <w:numPr>
+          <w:ilvl w:val="0"/>
+          <w:numId w:val="3"/>
+        </w:numPr>
+        <w:spacing w:after="80"/>
+      </w:pPr>
+      <w:r>
+        <w:rPr>
+          <w:b/>
+          <w:bCs/>
+        </w:rPr>
+        <w:t xml:space="preserve">Đã giao</w:t>
+      </w:r>
+      <w:r>
+        <w:t xml:space="preserve"> — tổng của các đợt giao đã điền ngày giao (kèm dòng *vượt …* nếu giao quá hợp đồng).</w:t>
+      </w:r>
+    </w:p>
+    <w:p>
+      <w:pPr>
+        <w:pStyle w:val="ListParagraph"/>
+        <w:numPr>
+          <w:ilvl w:val="0"/>
+          <w:numId w:val="3"/>
+        </w:numPr>
+        <w:spacing w:after="80"/>
+      </w:pPr>
+      <w:r>
+        <w:rPr>
+          <w:b/>
+          <w:bCs/>
+        </w:rPr>
+        <w:t xml:space="preserve">Còn phải giao</w:t>
+      </w:r>
+      <w:r>
+        <w:t xml:space="preserve"> = SL hợp đồng − Đã giao. Đây chính là phần “đã ký HĐ chưa giao”; dòng nhỏ *chờ giao …* cho biết trong đó bao nhiêu đã lập đợt nhưng chưa điền ngày giao.</w:t>
+      </w:r>
+    </w:p>
+    <w:p>
+      <w:pPr>
+        <w:pStyle w:val="ListParagraph"/>
+        <w:numPr>
+          <w:ilvl w:val="0"/>
+          <w:numId w:val="3"/>
+        </w:numPr>
+        <w:spacing w:after="80"/>
+      </w:pPr>
+      <w:r>
+        <w:rPr>
+          <w:b/>
+          <w:bCs/>
+        </w:rPr>
+        <w:t xml:space="preserve">Hình thức</w:t>
+      </w:r>
+      <w:r>
+        <w:t xml:space="preserve"> — hình thức tiêu thụ khai ở </w:t>
+      </w:r>
+      <w:r>
+        <w:rPr>
+          <w:b/>
+          <w:bCs/>
+        </w:rPr>
+        <w:t xml:space="preserve">lần giao</w:t>
+      </w:r>
+      <w:r>
+        <w:t xml:space="preserve">, nên hợp đồng giao nhiều lần hiện </w:t>
+      </w:r>
+      <w:r>
+        <w:rPr>
+          <w:b/>
+          <w:bCs/>
+        </w:rPr>
+        <w:t xml:space="preserve">tất cả</w:t>
+      </w:r>
+      <w:r>
+        <w:t xml:space="preserve"> hình thức của các đợt; hợp đồng chưa giao lần nào thì để trống.</w:t>
+      </w:r>
+    </w:p>
+    <w:p>
+      <w:pPr>
+        <w:pStyle w:val="ListParagraph"/>
+        <w:numPr>
+          <w:ilvl w:val="0"/>
+          <w:numId w:val="3"/>
+        </w:numPr>
+        <w:spacing w:after="80"/>
+      </w:pPr>
+      <w:r>
+        <w:rPr>
+          <w:b/>
+          <w:bCs/>
+        </w:rPr>
+        <w:t xml:space="preserve">Trạng thái</w:t>
+      </w:r>
+      <w:r>
+        <w:t xml:space="preserve"> — *Đang thực hiện* hay *Hoàn thành dd/mm/yyyy*. Hợp đồng đã hoàn thành không còn tính vào “đã ký HĐ chưa giao” và bị khoá sửa.</w:t>
+      </w:r>
+    </w:p>
+    <w:p>
+      <w:pPr>
+        <w:pStyle w:val="ListParagraph"/>
+        <w:numPr>
+          <w:ilvl w:val="0"/>
+          <w:numId w:val="3"/>
+        </w:numPr>
+        <w:spacing w:after="80"/>
+      </w:pPr>
+      <w:r>
+        <w:t xml:space="preserve">Các bộ lọc dùng chung được: </w:t>
+      </w:r>
+      <w:r>
+        <w:rPr>
+          <w:b/>
+          <w:bCs/>
+        </w:rPr>
+        <w:t xml:space="preserve">Đơn vị · Khách hàng</w:t>
+      </w:r>
+      <w:r>
+        <w:t xml:space="preserve"> (gõ để tìm, chọn nhiều) </w:t>
+      </w:r>
+      <w:r>
+        <w:rPr>
+          <w:b/>
+          <w:bCs/>
+        </w:rPr>
+        <w:t xml:space="preserve">· Trạng thái · Hình thức · Ngày ký</w:t>
+      </w:r>
+      <w:r>
+        <w:t xml:space="preserve"> và ô </w:t>
+      </w:r>
+      <w:r>
+        <w:rPr>
+          <w:b/>
+          <w:bCs/>
+        </w:rPr>
+        <w:t xml:space="preserve">tìm theo số HĐ</w:t>
+      </w:r>
+      <w:r>
+        <w:t xml:space="preserve"> (gõ không dấu vẫn ra).</w:t>
       </w:r>
     </w:p>
     <w:p>
@@ -2532,7 +2313,7 @@
         <w:pageBreakBefore/>
       </w:pPr>
       <w:r>
-        <w:t xml:space="preserve">9. Màn chi tiết hợp đồng</w:t>
+        <w:t xml:space="preserve">9. Thêm hợp đồng</w:t>
       </w:r>
     </w:p>
     <w:p>
@@ -2547,15 +2328,7 @@
         <w:t xml:space="preserve">Vị trí: </w:t>
       </w:r>
       <w:r>
-        <w:t xml:space="preserve">Quản lý hợp đồng → Hợp đồng &amp; đợt giao → bấm Xem ở dòng hợp đồng</w:t>
-      </w:r>
-    </w:p>
-    <w:p>
-      <w:pPr>
-        <w:spacing w:after="140"/>
-      </w:pPr>
-      <w:r>
-        <w:t xml:space="preserve">Nơi theo dõi tiến độ một hợp đồng, nhập các đợt giao và chốt hợp đồng khi kết thúc.</w:t>
+        <w:t xml:space="preserve">Quản lý hợp đồng → Hợp đồng &amp; đợt giao → Thêm hợp đồng</w:t>
       </w:r>
     </w:p>
     <w:p>
@@ -2568,7 +2341,7 @@
           <wp:inline distT="0" distB="0" distL="0" distR="0">
             <wp:extent cx="6191250" cy="3381375"/>
             <wp:effectExtent t="0" r="0" b="0" l="0"/>
-            <wp:docPr id="1" name="img" descr="Ảnh hướng dẫn có đánh số bước" title="img/08-hop-dong-chi-tiet.png"/>
+            <wp:docPr id="1" name="img" descr="Ảnh hướng dẫn có đánh số bước" title="img/07-hop-dong-form.png"/>
             <wp:cNvGraphicFramePr>
               <a:graphicFrameLocks xmlns:a="http://schemas.openxmlformats.org/drawingml/2006/main" noChangeAspect="1"/>
             </wp:cNvGraphicFramePr>
@@ -2617,7 +2390,7 @@
           <w:sz w:val="17"/>
           <w:szCs w:val="17"/>
         </w:rPr>
-        <w:t xml:space="preserve">Hình 8. Màn chi tiết hợp đồng</w:t>
+        <w:t xml:space="preserve">Hình 7. Phiếu thêm hợp đồng</w:t>
       </w:r>
     </w:p>
     <w:p>
@@ -2646,10 +2419,10 @@
           <w:b/>
           <w:bCs/>
         </w:rPr>
-        <w:t xml:space="preserve">Hàng số liệu</w:t>
-      </w:r>
-      <w:r>
-        <w:t xml:space="preserve"> — khách hàng, loại hợp đồng, sản lượng hợp đồng, đã giao, còn phải giao, trạng thái. Luôn hiện dù đang ở tab nào.</w:t>
+        <w:t xml:space="preserve">Số hợp đồng</w:t>
+      </w:r>
+      <w:r>
+        <w:t xml:space="preserve"> — bắt buộc, không trùng trong cùng đơn vị.</w:t>
       </w:r>
     </w:p>
     <w:p>
@@ -2666,30 +2439,10 @@
           <w:b/>
           <w:bCs/>
         </w:rPr>
-        <w:t xml:space="preserve">Chuyển sang giao nhiều lần / Chuyển về giao 1 lần</w:t>
-      </w:r>
-      <w:r>
-        <w:t xml:space="preserve"> — đổi loại giao ngay tại đây, </w:t>
-      </w:r>
-      <w:r>
-        <w:rPr>
-          <w:b/>
-          <w:bCs/>
-        </w:rPr>
-        <w:t xml:space="preserve">không phải xoá hợp đồng nhập lại</w:t>
-      </w:r>
-      <w:r>
-        <w:t xml:space="preserve">. Hợp đồng giao-1-lần đã ghi ngày giao thì lần giao đó tự chuyển thành </w:t>
-      </w:r>
-      <w:r>
-        <w:rPr>
-          <w:b/>
-          <w:bCs/>
-        </w:rPr>
-        <w:t xml:space="preserve">đợt giao đầu tiên</w:t>
-      </w:r>
-      <w:r>
-        <w:t xml:space="preserve"> (giữ nguyên ngày giao, hoá đơn, thanh toán, chi tiết hàng).</w:t>
+        <w:t xml:space="preserve">Khách hàng</w:t>
+      </w:r>
+      <w:r>
+        <w:t xml:space="preserve"> — bắt buộc; gõ vài chữ trong tên (hoặc mã khách) rồi chọn. Danh sách chỉ có khách của chính đơn vị (mục 7).</w:t>
       </w:r>
     </w:p>
     <w:p>
@@ -2706,10 +2459,20 @@
           <w:b/>
           <w:bCs/>
         </w:rPr>
-        <w:t xml:space="preserve">Hoàn thành hợp đồng</w:t>
-      </w:r>
-      <w:r>
-        <w:t xml:space="preserve"> — chốt thời điểm kết thúc (xem mục 11).</w:t>
+        <w:t xml:space="preserve">Loại hợp đồng</w:t>
+      </w:r>
+      <w:r>
+        <w:t xml:space="preserve"> — bắt buộc: *HĐ dài hạn* hay *HĐ chuyến*. Đây là chỉ tiêu của báo cáo, </w:t>
+      </w:r>
+      <w:r>
+        <w:rPr>
+          <w:b/>
+          <w:bCs/>
+        </w:rPr>
+        <w:t xml:space="preserve">khác</w:t>
+      </w:r>
+      <w:r>
+        <w:t xml:space="preserve"> với Loại giao bên dưới.</w:t>
       </w:r>
     </w:p>
     <w:p>
@@ -2726,10 +2489,10 @@
           <w:b/>
           <w:bCs/>
         </w:rPr>
-        <w:t xml:space="preserve">Tab Thông tin hợp đồng</w:t>
-      </w:r>
-      <w:r>
-        <w:t xml:space="preserve"> — sửa hợp đồng, file scan, ghi chú và các dòng chi tiết đã ký.</w:t>
+        <w:t xml:space="preserve">Loại giao</w:t>
+      </w:r>
+      <w:r>
+        <w:t xml:space="preserve"> — *Giao 1 lần* (cả hợp đồng giao trọn một lần) hay *Giao nhiều lần* (chia thành nhiều đợt giao). Chọn nhầm vẫn đổi được sau, xem mục 10.</w:t>
       </w:r>
     </w:p>
     <w:p>
@@ -2746,10 +2509,10 @@
           <w:b/>
           <w:bCs/>
         </w:rPr>
-        <w:t xml:space="preserve">Tab Đợt giao</w:t>
-      </w:r>
-      <w:r>
-        <w:t xml:space="preserve"> — danh sách các lần giao; hợp đồng giao nhiều lần mở thẳng vào tab này.</w:t>
+        <w:t xml:space="preserve">Ngày ký</w:t>
+      </w:r>
+      <w:r>
+        <w:t xml:space="preserve"> — bắt buộc. Từ ngày này, sản lượng hợp đồng nằm ở mục “đã ký HĐ chưa giao”.</w:t>
       </w:r>
     </w:p>
     <w:p>
@@ -2766,10 +2529,100 @@
           <w:b/>
           <w:bCs/>
         </w:rPr>
-        <w:t xml:space="preserve">Thêm đợt giao</w:t>
-      </w:r>
-      <w:r>
-        <w:t xml:space="preserve"> — ghi một lần giao mới (xem mục 10).</w:t>
+        <w:t xml:space="preserve">Ngày giao</w:t>
+      </w:r>
+      <w:r>
+        <w:t xml:space="preserve"> — chỉ hiện với hợp đồng *giao 1 lần*; điền khi đã giao xong. Bên dưới là </w:t>
+      </w:r>
+      <w:r>
+        <w:rPr>
+          <w:b/>
+          <w:bCs/>
+        </w:rPr>
+        <w:t xml:space="preserve">Hình thức tiêu thụ</w:t>
+      </w:r>
+      <w:r>
+        <w:t xml:space="preserve"> và khối </w:t>
+      </w:r>
+      <w:r>
+        <w:rPr>
+          <w:b/>
+          <w:bCs/>
+        </w:rPr>
+        <w:t xml:space="preserve">Hoá đơn</w:t>
+      </w:r>
+      <w:r>
+        <w:t xml:space="preserve"> (số hoá đơn + file scan).</w:t>
+      </w:r>
+    </w:p>
+    <w:p>
+      <w:pPr>
+        <w:pStyle w:val="ListParagraph"/>
+        <w:numPr>
+          <w:ilvl w:val="0"/>
+          <w:numId w:val="11"/>
+        </w:numPr>
+        <w:spacing w:after="100"/>
+      </w:pPr>
+      <w:r>
+        <w:rPr>
+          <w:b/>
+          <w:bCs/>
+        </w:rPr>
+        <w:t xml:space="preserve">Chi tiết hợp đồng</w:t>
+      </w:r>
+      <w:r>
+        <w:t xml:space="preserve"> — mỗi chủng loại một dòng (ô SL đổi nhãn thành </w:t>
+      </w:r>
+      <w:r>
+        <w:rPr>
+          <w:b/>
+          <w:bCs/>
+        </w:rPr>
+        <w:t xml:space="preserve">SL nước</w:t>
+      </w:r>
+      <w:r>
+        <w:t xml:space="preserve"> với latex và mủ nguyên liệu). Ô </w:t>
+      </w:r>
+      <w:r>
+        <w:rPr>
+          <w:b/>
+          <w:bCs/>
+        </w:rPr>
+        <w:t xml:space="preserve">Quy khô</w:t>
+      </w:r>
+      <w:r>
+        <w:t xml:space="preserve"> chỉ hiện với latex và mủ nguyên liệu; ô </w:t>
+      </w:r>
+      <w:r>
+        <w:rPr>
+          <w:b/>
+          <w:bCs/>
+        </w:rPr>
+        <w:t xml:space="preserve">Tỷ giá</w:t>
+      </w:r>
+      <w:r>
+        <w:t xml:space="preserve"> chỉ hiện khi dòng bán bằng ngoại tệ.</w:t>
+      </w:r>
+    </w:p>
+    <w:p>
+      <w:pPr>
+        <w:pStyle w:val="ListParagraph"/>
+        <w:numPr>
+          <w:ilvl w:val="0"/>
+          <w:numId w:val="11"/>
+        </w:numPr>
+        <w:spacing w:after="100"/>
+      </w:pPr>
+      <w:r>
+        <w:rPr>
+          <w:b/>
+          <w:bCs/>
+        </w:rPr>
+        <w:t xml:space="preserve">Thành tiền</w:t>
+      </w:r>
+      <w:r>
+        <w:t xml:space="preserve"> — ô CHỈ ĐỌC ở cuối mỗi dòng (= số lượng × đơn giá, theo đúng loại tiền của dòng). Tổng thành tiền của hợp đồng hiện ngay dưới bảng, quy về triệu đồng.</w:t>
       </w:r>
     </w:p>
     <w:p>
@@ -2794,6 +2647,192 @@
         <w:spacing w:after="80"/>
       </w:pPr>
       <w:r>
+        <w:rPr>
+          <w:b/>
+          <w:bCs/>
+        </w:rPr>
+        <w:t xml:space="preserve">Không quản lý hợp đồng khung:</w:t>
+      </w:r>
+      <w:r>
+        <w:t xml:space="preserve"> đơn vị có hợp đồng dài hạn thì nhập </w:t>
+      </w:r>
+      <w:r>
+        <w:rPr>
+          <w:b/>
+          <w:bCs/>
+        </w:rPr>
+        <w:t xml:space="preserve">mỗi phụ lục như một hợp đồng</w:t>
+      </w:r>
+      <w:r>
+        <w:t xml:space="preserve"> và chọn loại </w:t>
+      </w:r>
+      <w:r>
+        <w:rPr>
+          <w:b/>
+          <w:bCs/>
+        </w:rPr>
+        <w:t xml:space="preserve">HĐ dài hạn</w:t>
+      </w:r>
+      <w:r>
+        <w:t xml:space="preserve"> để phân biệt.</w:t>
+      </w:r>
+    </w:p>
+    <w:p>
+      <w:pPr>
+        <w:pStyle w:val="ListParagraph"/>
+        <w:numPr>
+          <w:ilvl w:val="0"/>
+          <w:numId w:val="3"/>
+        </w:numPr>
+        <w:spacing w:after="80"/>
+      </w:pPr>
+      <w:r>
+        <w:rPr>
+          <w:b/>
+          <w:bCs/>
+        </w:rPr>
+        <w:t xml:space="preserve">LATEX và 2 loại mủ nguyên liệu bán theo MỦ NƯỚC:</w:t>
+      </w:r>
+      <w:r>
+        <w:t xml:space="preserve"> ô </w:t>
+      </w:r>
+      <w:r>
+        <w:rPr>
+          <w:b/>
+          <w:bCs/>
+        </w:rPr>
+        <w:t xml:space="preserve">SL nước (tấn)</w:t>
+      </w:r>
+      <w:r>
+        <w:t xml:space="preserve"> là số để tính </w:t>
+      </w:r>
+      <w:r>
+        <w:rPr>
+          <w:b/>
+          <w:bCs/>
+        </w:rPr>
+        <w:t xml:space="preserve">Thành tiền</w:t>
+      </w:r>
+      <w:r>
+        <w:t xml:space="preserve"> (đơn giá là giá theo tấn mủ nước), còn </w:t>
+      </w:r>
+      <w:r>
+        <w:rPr>
+          <w:b/>
+          <w:bCs/>
+        </w:rPr>
+        <w:t xml:space="preserve">sản lượng tiêu thụ trên báo cáo lấy theo ô Quy khô</w:t>
+      </w:r>
+      <w:r>
+        <w:t xml:space="preserve">. Vì vậy hai ô này phải khai đủ và đúng.</w:t>
+      </w:r>
+    </w:p>
+    <w:p>
+      <w:pPr>
+        <w:pStyle w:val="ListParagraph"/>
+        <w:numPr>
+          <w:ilvl w:val="0"/>
+          <w:numId w:val="3"/>
+        </w:numPr>
+        <w:spacing w:after="80"/>
+      </w:pPr>
+      <w:r>
+        <w:t xml:space="preserve">Bán bằng </w:t>
+      </w:r>
+      <w:r>
+        <w:rPr>
+          <w:b/>
+          <w:bCs/>
+        </w:rPr>
+        <w:t xml:space="preserve">VNĐ</w:t>
+      </w:r>
+      <w:r>
+        <w:t xml:space="preserve"> nhập đơn giá theo </w:t>
+      </w:r>
+      <w:r>
+        <w:rPr>
+          <w:b/>
+          <w:bCs/>
+        </w:rPr>
+        <w:t xml:space="preserve">triệu đồng/tấn</w:t>
+      </w:r>
+      <w:r>
+        <w:t xml:space="preserve">; bán bằng </w:t>
+      </w:r>
+      <w:r>
+        <w:rPr>
+          <w:b/>
+          <w:bCs/>
+        </w:rPr>
+        <w:t xml:space="preserve">ngoại tệ</w:t>
+      </w:r>
+      <w:r>
+        <w:t xml:space="preserve"> nhập theo </w:t>
+      </w:r>
+      <w:r>
+        <w:rPr>
+          <w:b/>
+          <w:bCs/>
+        </w:rPr>
+        <w:t xml:space="preserve">ngoại tệ/tấn</w:t>
+      </w:r>
+      <w:r>
+        <w:t xml:space="preserve"> và </w:t>
+      </w:r>
+      <w:r>
+        <w:rPr>
+          <w:b/>
+          <w:bCs/>
+        </w:rPr>
+        <w:t xml:space="preserve">phải có tỷ giá</w:t>
+      </w:r>
+      <w:r>
+        <w:t xml:space="preserve"> quy ra VNĐ, nếu không doanh thu sẽ hiện “—”.</w:t>
+      </w:r>
+    </w:p>
+    <w:p>
+      <w:pPr>
+        <w:pStyle w:val="ListParagraph"/>
+        <w:numPr>
+          <w:ilvl w:val="0"/>
+          <w:numId w:val="3"/>
+        </w:numPr>
+        <w:spacing w:after="80"/>
+      </w:pPr>
+      <w:r>
+        <w:t xml:space="preserve">Bán </w:t>
+      </w:r>
+      <w:r>
+        <w:rPr>
+          <w:b/>
+          <w:bCs/>
+        </w:rPr>
+        <w:t xml:space="preserve">LATEX</w:t>
+      </w:r>
+      <w:r>
+        <w:t xml:space="preserve"> và 2 loại mủ nguyên liệu thì </w:t>
+      </w:r>
+      <w:r>
+        <w:rPr>
+          <w:b/>
+          <w:bCs/>
+        </w:rPr>
+        <w:t xml:space="preserve">bắt buộc nhập quy khô</w:t>
+      </w:r>
+      <w:r>
+        <w:t xml:space="preserve"> mới lưu được.</w:t>
+      </w:r>
+    </w:p>
+    <w:p>
+      <w:pPr>
+        <w:pStyle w:val="ListParagraph"/>
+        <w:numPr>
+          <w:ilvl w:val="0"/>
+          <w:numId w:val="3"/>
+        </w:numPr>
+        <w:spacing w:after="80"/>
+      </w:pPr>
+      <w:r>
         <w:t xml:space="preserve">Hợp đồng </w:t>
       </w:r>
       <w:r>
@@ -2801,66 +2840,10 @@
           <w:b/>
           <w:bCs/>
         </w:rPr>
-        <w:t xml:space="preserve">giao 1 lần</w:t>
-      </w:r>
-      <w:r>
-        <w:t xml:space="preserve"> không có tab Đợt giao: chính hợp đồng là một lần giao.</w:t>
-      </w:r>
-    </w:p>
-    <w:p>
-      <w:pPr>
-        <w:pStyle w:val="ListParagraph"/>
-        <w:numPr>
-          <w:ilvl w:val="0"/>
-          <w:numId w:val="3"/>
-        </w:numPr>
-        <w:spacing w:after="80"/>
-      </w:pPr>
-      <w:r>
-        <w:t xml:space="preserve">Chỉ chuyển được </w:t>
-      </w:r>
-      <w:r>
-        <w:rPr>
-          <w:b/>
-          <w:bCs/>
-        </w:rPr>
-        <w:t xml:space="preserve">về</w:t>
-      </w:r>
-      <w:r>
-        <w:t xml:space="preserve"> giao 1 lần khi hợp đồng chưa có đợt giao nào.</w:t>
-      </w:r>
-    </w:p>
-    <w:p>
-      <w:pPr>
-        <w:pStyle w:val="ListParagraph"/>
-        <w:numPr>
-          <w:ilvl w:val="0"/>
-          <w:numId w:val="3"/>
-        </w:numPr>
-        <w:spacing w:after="80"/>
-      </w:pPr>
-      <w:r>
-        <w:t xml:space="preserve">Hợp đồng </w:t>
-      </w:r>
-      <w:r>
-        <w:rPr>
-          <w:b/>
-          <w:bCs/>
-        </w:rPr>
-        <w:t xml:space="preserve">đã hoàn thành</w:t>
-      </w:r>
-      <w:r>
-        <w:t xml:space="preserve"> chỉ còn nút </w:t>
-      </w:r>
-      <w:r>
-        <w:rPr>
-          <w:b/>
-          <w:bCs/>
-        </w:rPr>
-        <w:t xml:space="preserve">Mở lại hợp đồng</w:t>
-      </w:r>
-      <w:r>
-        <w:t xml:space="preserve">; muốn sửa hay thêm đợt giao thì phải mở lại trước.</w:t>
+        <w:t xml:space="preserve">giao nhiều lần</w:t>
+      </w:r>
+      <w:r>
+        <w:t xml:space="preserve"> không tự đánh dấu đã giao — mỗi lần giao nhập một đợt giao.</w:t>
       </w:r>
     </w:p>
     <w:p>
@@ -2869,7 +2852,7 @@
         <w:pageBreakBefore/>
       </w:pPr>
       <w:r>
-        <w:t xml:space="preserve">10. Thêm đợt giao — mỗi đợt là một lần giao</w:t>
+        <w:t xml:space="preserve">10. Màn chi tiết hợp đồng</w:t>
       </w:r>
     </w:p>
     <w:p>
@@ -2884,7 +2867,7 @@
         <w:t xml:space="preserve">Vị trí: </w:t>
       </w:r>
       <w:r>
-        <w:t xml:space="preserve">Màn chi tiết hợp đồng (mục 9) → tab Đợt giao → Thêm đợt giao</w:t>
+        <w:t xml:space="preserve">Quản lý hợp đồng → Hợp đồng &amp; đợt giao → bấm Xem ở dòng hợp đồng</w:t>
       </w:r>
     </w:p>
     <w:p>
@@ -2892,7 +2875,7 @@
         <w:spacing w:after="140"/>
       </w:pPr>
       <w:r>
-        <w:t xml:space="preserve">Mỗi đợt giao = một lần giao hàng + một lần thanh toán. Đây là cách ghi nhận tiêu thụ của cơ chế mới.</w:t>
+        <w:t xml:space="preserve">Nơi theo dõi tiến độ một hợp đồng, nhập các đợt giao và chốt hợp đồng khi kết thúc.</w:t>
       </w:r>
     </w:p>
     <w:p>
@@ -2905,7 +2888,7 @@
           <wp:inline distT="0" distB="0" distL="0" distR="0">
             <wp:extent cx="6191250" cy="3381375"/>
             <wp:effectExtent t="0" r="0" b="0" l="0"/>
-            <wp:docPr id="1" name="img" descr="Ảnh hướng dẫn có đánh số bước" title="img/09-dot-giao-form.png"/>
+            <wp:docPr id="1" name="img" descr="Ảnh hướng dẫn có đánh số bước" title="img/08-hop-dong-chi-tiet.png"/>
             <wp:cNvGraphicFramePr>
               <a:graphicFrameLocks xmlns:a="http://schemas.openxmlformats.org/drawingml/2006/main" noChangeAspect="1"/>
             </wp:cNvGraphicFramePr>
@@ -2954,7 +2937,7 @@
           <w:sz w:val="17"/>
           <w:szCs w:val="17"/>
         </w:rPr>
-        <w:t xml:space="preserve">Hình 9. Phiếu thêm đợt giao</w:t>
+        <w:t xml:space="preserve">Hình 8. Màn chi tiết hợp đồng</w:t>
       </w:r>
     </w:p>
     <w:p>
@@ -2983,10 +2966,10 @@
           <w:b/>
           <w:bCs/>
         </w:rPr>
-        <w:t xml:space="preserve">Số đợt giao</w:t>
-      </w:r>
-      <w:r>
-        <w:t xml:space="preserve"> — bắt buộc, không trùng trong cùng đơn vị (ví dụ *Đợt 01/HĐ-102*).</w:t>
+        <w:t xml:space="preserve">Hàng số liệu</w:t>
+      </w:r>
+      <w:r>
+        <w:t xml:space="preserve"> — khách hàng, loại hợp đồng, sản lượng hợp đồng, đã giao, còn phải giao, trạng thái. Luôn hiện dù đang ở tab nào.</w:t>
       </w:r>
     </w:p>
     <w:p>
@@ -3003,30 +2986,30 @@
           <w:b/>
           <w:bCs/>
         </w:rPr>
-        <w:t xml:space="preserve">Ngày giao</w:t>
-      </w:r>
-      <w:r>
-        <w:t xml:space="preserve"> — để trống nghĩa là </w:t>
-      </w:r>
-      <w:r>
-        <w:rPr>
-          <w:b/>
-          <w:bCs/>
-        </w:rPr>
-        <w:t xml:space="preserve">đang chờ giao</w:t>
-      </w:r>
-      <w:r>
-        <w:t xml:space="preserve">; điền vào là đợt đã giao xong và </w:t>
-      </w:r>
-      <w:r>
-        <w:rPr>
-          <w:b/>
-          <w:bCs/>
-        </w:rPr>
-        <w:t xml:space="preserve">tính ngay vào tiêu thụ của ngày đó</w:t>
-      </w:r>
-      <w:r>
-        <w:t xml:space="preserve">.</w:t>
+        <w:t xml:space="preserve">Chuyển sang giao nhiều lần / Chuyển về giao 1 lần</w:t>
+      </w:r>
+      <w:r>
+        <w:t xml:space="preserve"> — đổi loại giao ngay tại đây, </w:t>
+      </w:r>
+      <w:r>
+        <w:rPr>
+          <w:b/>
+          <w:bCs/>
+        </w:rPr>
+        <w:t xml:space="preserve">không phải xoá hợp đồng nhập lại</w:t>
+      </w:r>
+      <w:r>
+        <w:t xml:space="preserve">. Hợp đồng giao-1-lần đã ghi ngày giao thì lần giao đó tự chuyển thành </w:t>
+      </w:r>
+      <w:r>
+        <w:rPr>
+          <w:b/>
+          <w:bCs/>
+        </w:rPr>
+        <w:t xml:space="preserve">đợt giao đầu tiên</w:t>
+      </w:r>
+      <w:r>
+        <w:t xml:space="preserve"> (giữ nguyên ngày giao, hoá đơn, thanh toán, chi tiết hàng).</w:t>
       </w:r>
     </w:p>
     <w:p>
@@ -3043,10 +3026,10 @@
           <w:b/>
           <w:bCs/>
         </w:rPr>
-        <w:t xml:space="preserve">Hình thức tiêu thụ</w:t>
-      </w:r>
-      <w:r>
-        <w:t xml:space="preserve"> — *Xuất khẩu / UTXK* · *Tiêu thụ trong nước* · *Tiêu thụ nội bộ*. Bắt buộc khi đã giao.</w:t>
+        <w:t xml:space="preserve">Hoàn thành hợp đồng</w:t>
+      </w:r>
+      <w:r>
+        <w:t xml:space="preserve"> — chốt thời điểm kết thúc (xem mục 12).</w:t>
       </w:r>
     </w:p>
     <w:p>
@@ -3063,10 +3046,10 @@
           <w:b/>
           <w:bCs/>
         </w:rPr>
-        <w:t xml:space="preserve">Chi tiết đợt giao</w:t>
-      </w:r>
-      <w:r>
-        <w:t xml:space="preserve"> — chủng loại, sản lượng, đơn giá thực tế của lần giao này. Ô Quy khô và Tỷ giá chỉ hiện khi áp dụng, giống phiếu hợp đồng.</w:t>
+        <w:t xml:space="preserve">Tab Thông tin hợp đồng</w:t>
+      </w:r>
+      <w:r>
+        <w:t xml:space="preserve"> — sửa hợp đồng, file scan, ghi chú và các dòng chi tiết đã ký.</w:t>
       </w:r>
     </w:p>
     <w:p>
@@ -3083,20 +3066,10 @@
           <w:b/>
           <w:bCs/>
         </w:rPr>
-        <w:t xml:space="preserve">Số hoá đơn</w:t>
-      </w:r>
-      <w:r>
-        <w:t xml:space="preserve"> + </w:t>
-      </w:r>
-      <w:r>
-        <w:rPr>
-          <w:b/>
-          <w:bCs/>
-        </w:rPr>
-        <w:t xml:space="preserve">Hoá đơn (scan)</w:t>
-      </w:r>
-      <w:r>
-        <w:t xml:space="preserve"> — số hoá đơn bán hàng của đợt và file đính kèm.</w:t>
+        <w:t xml:space="preserve">Tab Đợt giao</w:t>
+      </w:r>
+      <w:r>
+        <w:t xml:space="preserve"> — danh sách các lần giao; hợp đồng giao nhiều lần mở thẳng vào tab này.</w:t>
       </w:r>
     </w:p>
     <w:p>
@@ -3113,10 +3086,10 @@
           <w:b/>
           <w:bCs/>
         </w:rPr>
-        <w:t xml:space="preserve">Thanh toán</w:t>
-      </w:r>
-      <w:r>
-        <w:t xml:space="preserve"> — ngày thanh toán, sản lượng của lần thanh toán, kèm chứng từ.</w:t>
+        <w:t xml:space="preserve">Thêm đợt giao</w:t>
+      </w:r>
+      <w:r>
+        <w:t xml:space="preserve"> — ghi một lần giao mới (xem mục 11).</w:t>
       </w:r>
     </w:p>
     <w:p>
@@ -3141,110 +3114,73 @@
         <w:spacing w:after="80"/>
       </w:pPr>
       <w:r>
-        <w:t xml:space="preserve">Phiếu hiện sẵn dòng *Còn phải giao theo hợp đồng … · tối đa nhập được …*. Sản lượng thực giao </w:t>
-      </w:r>
-      <w:r>
-        <w:rPr>
-          <w:b/>
-          <w:bCs/>
-        </w:rPr>
-        <w:t xml:space="preserve">được phép lệch</w:t>
-      </w:r>
-      <w:r>
-        <w:t xml:space="preserve"> so với hợp đồng: vượt thì có cảnh báo vàng nhưng vẫn lưu, </w:t>
-      </w:r>
-      <w:r>
-        <w:rPr>
-          <w:b/>
-          <w:bCs/>
-        </w:rPr>
-        <w:t xml:space="preserve">quá 110% sản lượng hợp đồng mới bị chặn</w:t>
-      </w:r>
-      <w:r>
-        <w:t xml:space="preserve">.</w:t>
-      </w:r>
-    </w:p>
-    <w:p>
-      <w:pPr>
-        <w:pStyle w:val="ListParagraph"/>
-        <w:numPr>
-          <w:ilvl w:val="0"/>
-          <w:numId w:val="3"/>
-        </w:numPr>
-        <w:spacing w:after="80"/>
-      </w:pPr>
-      <w:r>
-        <w:rPr>
-          <w:b/>
-          <w:bCs/>
-        </w:rPr>
-        <w:t xml:space="preserve">Tiêu thụ nội bộ</w:t>
-      </w:r>
-      <w:r>
-        <w:t xml:space="preserve"> chỉ hiện khi đơn vị thuộc một nhóm công ty mẹ–con, và chỉ chọn được đơn vị trong cùng nhóm.</w:t>
-      </w:r>
-    </w:p>
-    <w:p>
-      <w:pPr>
-        <w:pStyle w:val="ListParagraph"/>
-        <w:numPr>
-          <w:ilvl w:val="0"/>
-          <w:numId w:val="3"/>
-        </w:numPr>
-        <w:spacing w:after="80"/>
-      </w:pPr>
-      <w:r>
-        <w:rPr>
-          <w:b/>
-          <w:bCs/>
-        </w:rPr>
-        <w:t xml:space="preserve">Thành tiền</w:t>
-      </w:r>
-      <w:r>
-        <w:t xml:space="preserve"> của mỗi dòng = số lượng × đơn giá, hệ thống tự tính (không nhập tay); tổng của cả đợt hiện ngay dưới bảng chi tiết.</w:t>
-      </w:r>
-    </w:p>
-    <w:p>
-      <w:pPr>
-        <w:pStyle w:val="ListParagraph"/>
-        <w:numPr>
-          <w:ilvl w:val="0"/>
-          <w:numId w:val="3"/>
-        </w:numPr>
-        <w:spacing w:after="80"/>
-      </w:pPr>
-      <w:r>
-        <w:t xml:space="preserve">Lần giao đã ghi quá </w:t>
-      </w:r>
-      <w:r>
-        <w:rPr>
-          <w:b/>
-          <w:bCs/>
-        </w:rPr>
-        <w:t xml:space="preserve">số ngày cho phép sửa</w:t>
-      </w:r>
-      <w:r>
-        <w:t xml:space="preserve"> sẽ chuyển sang </w:t>
-      </w:r>
-      <w:r>
-        <w:rPr>
-          <w:b/>
-          <w:bCs/>
-        </w:rPr>
-        <w:t xml:space="preserve">chỉ xem</w:t>
-      </w:r>
-      <w:r>
-        <w:t xml:space="preserve"> (dòng hiện “(chỉ xem)” thay cho nút Sửa/Xoá). Hợp đồng </w:t>
-      </w:r>
-      <w:r>
-        <w:rPr>
-          <w:b/>
-          <w:bCs/>
-        </w:rPr>
-        <w:t xml:space="preserve">không</w:t>
-      </w:r>
-      <w:r>
-        <w:t xml:space="preserve"> bị khoá, vẫn thêm đợt giao mới bình thường.</w:t>
+        <w:t xml:space="preserve">Hợp đồng </w:t>
+      </w:r>
+      <w:r>
+        <w:rPr>
+          <w:b/>
+          <w:bCs/>
+        </w:rPr>
+        <w:t xml:space="preserve">giao 1 lần</w:t>
+      </w:r>
+      <w:r>
+        <w:t xml:space="preserve"> không có tab Đợt giao: chính hợp đồng là một lần giao.</w:t>
+      </w:r>
+    </w:p>
+    <w:p>
+      <w:pPr>
+        <w:pStyle w:val="ListParagraph"/>
+        <w:numPr>
+          <w:ilvl w:val="0"/>
+          <w:numId w:val="3"/>
+        </w:numPr>
+        <w:spacing w:after="80"/>
+      </w:pPr>
+      <w:r>
+        <w:t xml:space="preserve">Chỉ chuyển được </w:t>
+      </w:r>
+      <w:r>
+        <w:rPr>
+          <w:b/>
+          <w:bCs/>
+        </w:rPr>
+        <w:t xml:space="preserve">về</w:t>
+      </w:r>
+      <w:r>
+        <w:t xml:space="preserve"> giao 1 lần khi hợp đồng chưa có đợt giao nào.</w:t>
+      </w:r>
+    </w:p>
+    <w:p>
+      <w:pPr>
+        <w:pStyle w:val="ListParagraph"/>
+        <w:numPr>
+          <w:ilvl w:val="0"/>
+          <w:numId w:val="3"/>
+        </w:numPr>
+        <w:spacing w:after="80"/>
+      </w:pPr>
+      <w:r>
+        <w:t xml:space="preserve">Hợp đồng </w:t>
+      </w:r>
+      <w:r>
+        <w:rPr>
+          <w:b/>
+          <w:bCs/>
+        </w:rPr>
+        <w:t xml:space="preserve">đã hoàn thành</w:t>
+      </w:r>
+      <w:r>
+        <w:t xml:space="preserve"> chỉ còn nút </w:t>
+      </w:r>
+      <w:r>
+        <w:rPr>
+          <w:b/>
+          <w:bCs/>
+        </w:rPr>
+        <w:t xml:space="preserve">Mở lại hợp đồng</w:t>
+      </w:r>
+      <w:r>
+        <w:t xml:space="preserve">; muốn sửa hay thêm đợt giao thì phải mở lại trước.</w:t>
       </w:r>
     </w:p>
     <w:p>
@@ -3253,7 +3189,7 @@
         <w:pageBreakBefore/>
       </w:pPr>
       <w:r>
-        <w:t xml:space="preserve">11. Hoàn thành hợp đồng</w:t>
+        <w:t xml:space="preserve">11. Thêm đợt giao — mỗi đợt là một lần giao</w:t>
       </w:r>
     </w:p>
     <w:p>
@@ -3268,7 +3204,7 @@
         <w:t xml:space="preserve">Vị trí: </w:t>
       </w:r>
       <w:r>
-        <w:t xml:space="preserve">Màn chi tiết hợp đồng (mục 9) → Hoàn thành hợp đồng</w:t>
+        <w:t xml:space="preserve">Màn chi tiết hợp đồng (mục 10) → tab Đợt giao → Thêm đợt giao</w:t>
       </w:r>
     </w:p>
     <w:p>
@@ -3276,7 +3212,7 @@
         <w:spacing w:after="140"/>
       </w:pPr>
       <w:r>
-        <w:t xml:space="preserve">Sản lượng thực giao thường lệch vài phần trăm so với hợp đồng đã ký. Khi hai bên đã kết thúc hợp đồng, bấm Hoàn thành hợp đồng để chốt lại — phần chênh còn lại thôi không nằm ở “đã ký HĐ chưa giao” nữa.</w:t>
+        <w:t xml:space="preserve">Mỗi đợt giao = một lần giao hàng + một lần thanh toán. Đây là cách ghi nhận tiêu thụ của cơ chế mới.</w:t>
       </w:r>
     </w:p>
     <w:p>
@@ -3289,7 +3225,7 @@
           <wp:inline distT="0" distB="0" distL="0" distR="0">
             <wp:extent cx="6191250" cy="3381375"/>
             <wp:effectExtent t="0" r="0" b="0" l="0"/>
-            <wp:docPr id="1" name="img" descr="Ảnh hướng dẫn có đánh số bước" title="img/10-hoan-thanh-hop-dong.png"/>
+            <wp:docPr id="1" name="img" descr="Ảnh hướng dẫn có đánh số bước" title="img/09-dot-giao-form.png"/>
             <wp:cNvGraphicFramePr>
               <a:graphicFrameLocks xmlns:a="http://schemas.openxmlformats.org/drawingml/2006/main" noChangeAspect="1"/>
             </wp:cNvGraphicFramePr>
@@ -3338,7 +3274,7 @@
           <w:sz w:val="17"/>
           <w:szCs w:val="17"/>
         </w:rPr>
-        <w:t xml:space="preserve">Hình 10. Chốt hoàn thành hợp đồng</w:t>
+        <w:t xml:space="preserve">Hình 9. Phiếu thêm đợt giao</w:t>
       </w:r>
     </w:p>
     <w:p>
@@ -3367,10 +3303,10 @@
           <w:b/>
           <w:bCs/>
         </w:rPr>
-        <w:t xml:space="preserve">Bảng đối chiếu</w:t>
-      </w:r>
-      <w:r>
-        <w:t xml:space="preserve"> — sản lượng hợp đồng, đã giao (kèm tỷ lệ thực hiện) và phần còn phải giao.</w:t>
+        <w:t xml:space="preserve">Số đợt giao</w:t>
+      </w:r>
+      <w:r>
+        <w:t xml:space="preserve"> — bắt buộc, không trùng trong cùng đơn vị (ví dụ *Đợt 01/HĐ-102*).</w:t>
       </w:r>
     </w:p>
     <w:p>
@@ -3387,10 +3323,30 @@
           <w:b/>
           <w:bCs/>
         </w:rPr>
-        <w:t xml:space="preserve">Ngày hoàn thành</w:t>
-      </w:r>
-      <w:r>
-        <w:t xml:space="preserve"> — mặc định là hôm nay; phải từ ngày giao gần nhất trở đi và không được ở tương lai.</w:t>
+        <w:t xml:space="preserve">Ngày giao</w:t>
+      </w:r>
+      <w:r>
+        <w:t xml:space="preserve"> — để trống nghĩa là </w:t>
+      </w:r>
+      <w:r>
+        <w:rPr>
+          <w:b/>
+          <w:bCs/>
+        </w:rPr>
+        <w:t xml:space="preserve">đang chờ giao</w:t>
+      </w:r>
+      <w:r>
+        <w:t xml:space="preserve">; điền vào là đợt đã giao xong và </w:t>
+      </w:r>
+      <w:r>
+        <w:rPr>
+          <w:b/>
+          <w:bCs/>
+        </w:rPr>
+        <w:t xml:space="preserve">tính ngay vào tiêu thụ của ngày đó</w:t>
+      </w:r>
+      <w:r>
+        <w:t xml:space="preserve">.</w:t>
       </w:r>
     </w:p>
     <w:p>
@@ -3407,10 +3363,80 @@
           <w:b/>
           <w:bCs/>
         </w:rPr>
-        <w:t xml:space="preserve">Hoàn thành</w:t>
-      </w:r>
-      <w:r>
-        <w:t xml:space="preserve"> — chốt hợp đồng. Từ ngày này, phần chưa giao rời khỏi “đã ký HĐ chưa giao”.</w:t>
+        <w:t xml:space="preserve">Hình thức tiêu thụ</w:t>
+      </w:r>
+      <w:r>
+        <w:t xml:space="preserve"> — *Xuất khẩu / UTXK* · *Tiêu thụ trong nước* · *Tiêu thụ nội bộ*. Bắt buộc khi đã giao.</w:t>
+      </w:r>
+    </w:p>
+    <w:p>
+      <w:pPr>
+        <w:pStyle w:val="ListParagraph"/>
+        <w:numPr>
+          <w:ilvl w:val="0"/>
+          <w:numId w:val="13"/>
+        </w:numPr>
+        <w:spacing w:after="100"/>
+      </w:pPr>
+      <w:r>
+        <w:rPr>
+          <w:b/>
+          <w:bCs/>
+        </w:rPr>
+        <w:t xml:space="preserve">Chi tiết đợt giao</w:t>
+      </w:r>
+      <w:r>
+        <w:t xml:space="preserve"> — chủng loại, sản lượng, đơn giá thực tế của lần giao này. Ô Quy khô và Tỷ giá chỉ hiện khi áp dụng, giống phiếu hợp đồng.</w:t>
+      </w:r>
+    </w:p>
+    <w:p>
+      <w:pPr>
+        <w:pStyle w:val="ListParagraph"/>
+        <w:numPr>
+          <w:ilvl w:val="0"/>
+          <w:numId w:val="13"/>
+        </w:numPr>
+        <w:spacing w:after="100"/>
+      </w:pPr>
+      <w:r>
+        <w:rPr>
+          <w:b/>
+          <w:bCs/>
+        </w:rPr>
+        <w:t xml:space="preserve">Số hoá đơn</w:t>
+      </w:r>
+      <w:r>
+        <w:t xml:space="preserve"> + </w:t>
+      </w:r>
+      <w:r>
+        <w:rPr>
+          <w:b/>
+          <w:bCs/>
+        </w:rPr>
+        <w:t xml:space="preserve">Hoá đơn (scan)</w:t>
+      </w:r>
+      <w:r>
+        <w:t xml:space="preserve"> — số hoá đơn bán hàng của đợt và file đính kèm.</w:t>
+      </w:r>
+    </w:p>
+    <w:p>
+      <w:pPr>
+        <w:pStyle w:val="ListParagraph"/>
+        <w:numPr>
+          <w:ilvl w:val="0"/>
+          <w:numId w:val="13"/>
+        </w:numPr>
+        <w:spacing w:after="100"/>
+      </w:pPr>
+      <w:r>
+        <w:rPr>
+          <w:b/>
+          <w:bCs/>
+        </w:rPr>
+        <w:t xml:space="preserve">Thanh toán</w:t>
+      </w:r>
+      <w:r>
+        <w:t xml:space="preserve"> — ngày thanh toán, sản lượng của lần thanh toán, kèm chứng từ.</w:t>
       </w:r>
     </w:p>
     <w:p>
@@ -3435,63 +3461,110 @@
         <w:spacing w:after="80"/>
       </w:pPr>
       <w:r>
-        <w:t xml:space="preserve">Chỉ chốt khi </w:t>
-      </w:r>
-      <w:r>
-        <w:rPr>
-          <w:b/>
-          <w:bCs/>
-        </w:rPr>
-        <w:t xml:space="preserve">thật sự kết thúc hợp đồng</w:t>
-      </w:r>
-      <w:r>
-        <w:t xml:space="preserve">. Còn giao tiếp thì để nguyên — chốt rồi hợp đồng bị khoá, không thêm/sửa đợt giao được nữa.</w:t>
-      </w:r>
-    </w:p>
-    <w:p>
-      <w:pPr>
-        <w:pStyle w:val="ListParagraph"/>
-        <w:numPr>
-          <w:ilvl w:val="0"/>
-          <w:numId w:val="3"/>
-        </w:numPr>
-        <w:spacing w:after="80"/>
-      </w:pPr>
-      <w:r>
-        <w:t xml:space="preserve">Bấm nhầm thì vào lại màn chi tiết bấm </w:t>
-      </w:r>
-      <w:r>
-        <w:rPr>
-          <w:b/>
-          <w:bCs/>
-        </w:rPr>
-        <w:t xml:space="preserve">Mở lại hợp đồng</w:t>
-      </w:r>
-      <w:r>
-        <w:t xml:space="preserve">, mọi số liệu trở về như cũ.</w:t>
-      </w:r>
-    </w:p>
-    <w:p>
-      <w:pPr>
-        <w:pStyle w:val="ListParagraph"/>
-        <w:numPr>
-          <w:ilvl w:val="0"/>
-          <w:numId w:val="3"/>
-        </w:numPr>
-        <w:spacing w:after="80"/>
-      </w:pPr>
-      <w:r>
-        <w:t xml:space="preserve">Nếu còn đợt </w:t>
-      </w:r>
-      <w:r>
-        <w:rPr>
-          <w:b/>
-          <w:bCs/>
-        </w:rPr>
-        <w:t xml:space="preserve">chưa điền ngày giao</w:t>
-      </w:r>
-      <w:r>
-        <w:t xml:space="preserve">, màn này báo bằng khung vàng — điền ngày giao trước, nếu không sản lượng đó sẽ không được tính vào tiêu thụ.</w:t>
+        <w:t xml:space="preserve">Phiếu hiện sẵn dòng *Còn phải giao theo hợp đồng … · tối đa nhập được …*. Sản lượng thực giao </w:t>
+      </w:r>
+      <w:r>
+        <w:rPr>
+          <w:b/>
+          <w:bCs/>
+        </w:rPr>
+        <w:t xml:space="preserve">được phép lệch</w:t>
+      </w:r>
+      <w:r>
+        <w:t xml:space="preserve"> so với hợp đồng: vượt thì có cảnh báo vàng nhưng vẫn lưu, </w:t>
+      </w:r>
+      <w:r>
+        <w:rPr>
+          <w:b/>
+          <w:bCs/>
+        </w:rPr>
+        <w:t xml:space="preserve">quá 110% sản lượng hợp đồng mới bị chặn</w:t>
+      </w:r>
+      <w:r>
+        <w:t xml:space="preserve">.</w:t>
+      </w:r>
+    </w:p>
+    <w:p>
+      <w:pPr>
+        <w:pStyle w:val="ListParagraph"/>
+        <w:numPr>
+          <w:ilvl w:val="0"/>
+          <w:numId w:val="3"/>
+        </w:numPr>
+        <w:spacing w:after="80"/>
+      </w:pPr>
+      <w:r>
+        <w:rPr>
+          <w:b/>
+          <w:bCs/>
+        </w:rPr>
+        <w:t xml:space="preserve">Tiêu thụ nội bộ</w:t>
+      </w:r>
+      <w:r>
+        <w:t xml:space="preserve"> chỉ hiện khi đơn vị thuộc một nhóm công ty mẹ–con, và chỉ chọn được đơn vị trong cùng nhóm.</w:t>
+      </w:r>
+    </w:p>
+    <w:p>
+      <w:pPr>
+        <w:pStyle w:val="ListParagraph"/>
+        <w:numPr>
+          <w:ilvl w:val="0"/>
+          <w:numId w:val="3"/>
+        </w:numPr>
+        <w:spacing w:after="80"/>
+      </w:pPr>
+      <w:r>
+        <w:rPr>
+          <w:b/>
+          <w:bCs/>
+        </w:rPr>
+        <w:t xml:space="preserve">Thành tiền</w:t>
+      </w:r>
+      <w:r>
+        <w:t xml:space="preserve"> của mỗi dòng = số lượng × đơn giá, hệ thống tự tính (không nhập tay); tổng của cả đợt hiện ngay dưới bảng chi tiết.</w:t>
+      </w:r>
+    </w:p>
+    <w:p>
+      <w:pPr>
+        <w:pStyle w:val="ListParagraph"/>
+        <w:numPr>
+          <w:ilvl w:val="0"/>
+          <w:numId w:val="3"/>
+        </w:numPr>
+        <w:spacing w:after="80"/>
+      </w:pPr>
+      <w:r>
+        <w:t xml:space="preserve">Lần giao đã ghi quá </w:t>
+      </w:r>
+      <w:r>
+        <w:rPr>
+          <w:b/>
+          <w:bCs/>
+        </w:rPr>
+        <w:t xml:space="preserve">số ngày cho phép sửa</w:t>
+      </w:r>
+      <w:r>
+        <w:t xml:space="preserve"> sẽ chuyển sang </w:t>
+      </w:r>
+      <w:r>
+        <w:rPr>
+          <w:b/>
+          <w:bCs/>
+        </w:rPr>
+        <w:t xml:space="preserve">chỉ xem</w:t>
+      </w:r>
+      <w:r>
+        <w:t xml:space="preserve"> (dòng hiện “(chỉ xem)” thay cho nút Sửa/Xoá). Hợp đồng </w:t>
+      </w:r>
+      <w:r>
+        <w:rPr>
+          <w:b/>
+          <w:bCs/>
+        </w:rPr>
+        <w:t xml:space="preserve">không</w:t>
+      </w:r>
+      <w:r>
+        <w:t xml:space="preserve"> bị khoá, vẫn thêm đợt giao mới bình thường.</w:t>
       </w:r>
     </w:p>
     <w:p>
@@ -3500,7 +3573,7 @@
         <w:pageBreakBefore/>
       </w:pPr>
       <w:r>
-        <w:t xml:space="preserve">12. Báo cáo tiêu thụ</w:t>
+        <w:t xml:space="preserve">12. Hoàn thành hợp đồng</w:t>
       </w:r>
     </w:p>
     <w:p>
@@ -3515,7 +3588,7 @@
         <w:t xml:space="preserve">Vị trí: </w:t>
       </w:r>
       <w:r>
-        <w:t xml:space="preserve">Báo cáo → Tiêu thụ</w:t>
+        <w:t xml:space="preserve">Màn chi tiết hợp đồng (mục 10) → Hoàn thành hợp đồng</w:t>
       </w:r>
     </w:p>
     <w:p>
@@ -3523,7 +3596,7 @@
         <w:spacing w:after="140"/>
       </w:pPr>
       <w:r>
-        <w:t xml:space="preserve">Bảng chỉ để xem — số do hệ thống tổng hợp từ các lần giao, đơn vị không nhập tay.</w:t>
+        <w:t xml:space="preserve">Sản lượng thực giao thường lệch vài phần trăm so với hợp đồng đã ký. Khi hai bên đã kết thúc hợp đồng, bấm Hoàn thành hợp đồng để chốt lại — phần chênh còn lại thôi không nằm ở “đã ký HĐ chưa giao” nữa.</w:t>
       </w:r>
     </w:p>
     <w:p>
@@ -3536,7 +3609,7 @@
           <wp:inline distT="0" distB="0" distL="0" distR="0">
             <wp:extent cx="6191250" cy="3381375"/>
             <wp:effectExtent t="0" r="0" b="0" l="0"/>
-            <wp:docPr id="1" name="img" descr="Ảnh hướng dẫn có đánh số bước" title="img/11-bao-cao-tieu-thu.png"/>
+            <wp:docPr id="1" name="img" descr="Ảnh hướng dẫn có đánh số bước" title="img/10-hoan-thanh-hop-dong.png"/>
             <wp:cNvGraphicFramePr>
               <a:graphicFrameLocks xmlns:a="http://schemas.openxmlformats.org/drawingml/2006/main" noChangeAspect="1"/>
             </wp:cNvGraphicFramePr>
@@ -3585,7 +3658,7 @@
           <w:sz w:val="17"/>
           <w:szCs w:val="17"/>
         </w:rPr>
-        <w:t xml:space="preserve">Hình 11. Báo cáo tiêu thụ theo kỳ</w:t>
+        <w:t xml:space="preserve">Hình 10. Chốt hoàn thành hợp đồng</w:t>
       </w:r>
     </w:p>
     <w:p>
@@ -3614,30 +3687,10 @@
           <w:b/>
           <w:bCs/>
         </w:rPr>
-        <w:t xml:space="preserve">Bộ lọc</w:t>
-      </w:r>
-      <w:r>
-        <w:t xml:space="preserve"> — Từ ngày / Đến ngày · Đơn vị · </w:t>
-      </w:r>
-      <w:r>
-        <w:rPr>
-          <w:b/>
-          <w:bCs/>
-        </w:rPr>
-        <w:t xml:space="preserve">Khách hàng</w:t>
-      </w:r>
-      <w:r>
-        <w:t xml:space="preserve"> (gõ để tìm, chọn nhiều) · </w:t>
-      </w:r>
-      <w:r>
-        <w:rPr>
-          <w:b/>
-          <w:bCs/>
-        </w:rPr>
-        <w:t xml:space="preserve">Chủng loại</w:t>
-      </w:r>
-      <w:r>
-        <w:t xml:space="preserve"> (chọn nhiều). Bảng, khối theo khách hàng và file Excel đều theo bộ lọc này.</w:t>
+        <w:t xml:space="preserve">Bảng đối chiếu</w:t>
+      </w:r>
+      <w:r>
+        <w:t xml:space="preserve"> — sản lượng hợp đồng, đã giao (kèm tỷ lệ thực hiện) và phần còn phải giao.</w:t>
       </w:r>
     </w:p>
     <w:p>
@@ -3654,20 +3707,30 @@
           <w:b/>
           <w:bCs/>
         </w:rPr>
-        <w:t xml:space="preserve">Bảng tổng hợp</w:t>
-      </w:r>
-      <w:r>
-        <w:t xml:space="preserve"> — Lần giao · SL · Quy khô · Xuất khẩu · Trong nước · Nội bộ · Doanh thu · </w:t>
-      </w:r>
-      <w:r>
-        <w:rPr>
-          <w:b/>
-          <w:bCs/>
-        </w:rPr>
-        <w:t xml:space="preserve">Chưa giao</w:t>
-      </w:r>
-      <w:r>
-        <w:t xml:space="preserve">.</w:t>
+        <w:t xml:space="preserve">Ngày hoàn thành</w:t>
+      </w:r>
+      <w:r>
+        <w:t xml:space="preserve"> — mặc định là hôm nay; phải từ ngày giao gần nhất trở đi và không được ở tương lai.</w:t>
+      </w:r>
+    </w:p>
+    <w:p>
+      <w:pPr>
+        <w:pStyle w:val="ListParagraph"/>
+        <w:numPr>
+          <w:ilvl w:val="0"/>
+          <w:numId w:val="14"/>
+        </w:numPr>
+        <w:spacing w:after="100"/>
+      </w:pPr>
+      <w:r>
+        <w:rPr>
+          <w:b/>
+          <w:bCs/>
+        </w:rPr>
+        <w:t xml:space="preserve">Hoàn thành</w:t>
+      </w:r>
+      <w:r>
+        <w:t xml:space="preserve"> — chốt hợp đồng. Từ ngày này, phần chưa giao rời khỏi “đã ký HĐ chưa giao”.</w:t>
       </w:r>
     </w:p>
     <w:p>
@@ -3692,116 +3755,63 @@
         <w:spacing w:after="80"/>
       </w:pPr>
       <w:r>
-        <w:t xml:space="preserve">Cột </w:t>
-      </w:r>
-      <w:r>
-        <w:rPr>
-          <w:b/>
-          <w:bCs/>
-        </w:rPr>
-        <w:t xml:space="preserve">SL (tấn)</w:t>
-      </w:r>
-      <w:r>
-        <w:t xml:space="preserve"> là sản lượng tiêu thụ thực tế: latex và mủ nguyên liệu tính theo </w:t>
-      </w:r>
-      <w:r>
-        <w:rPr>
-          <w:b/>
-          <w:bCs/>
-        </w:rPr>
-        <w:t xml:space="preserve">quy khô</w:t>
-      </w:r>
-      <w:r>
-        <w:t xml:space="preserve">, các chủng loại thành phẩm tính theo chính số lượng bán.</w:t>
-      </w:r>
-    </w:p>
-    <w:p>
-      <w:pPr>
-        <w:pStyle w:val="ListParagraph"/>
-        <w:numPr>
-          <w:ilvl w:val="0"/>
-          <w:numId w:val="3"/>
-        </w:numPr>
-        <w:spacing w:after="80"/>
-      </w:pPr>
-      <w:r>
-        <w:t xml:space="preserve">Cột </w:t>
-      </w:r>
-      <w:r>
-        <w:rPr>
-          <w:b/>
-          <w:bCs/>
-        </w:rPr>
-        <w:t xml:space="preserve">Chưa giao</w:t>
-      </w:r>
-      <w:r>
-        <w:t xml:space="preserve"> là số </w:t>
-      </w:r>
-      <w:r>
-        <w:rPr>
-          <w:b/>
-          <w:bCs/>
-        </w:rPr>
-        <w:t xml:space="preserve">tại ngày cuối kỳ</w:t>
-      </w:r>
-      <w:r>
-        <w:t xml:space="preserve"> = sản lượng các hợp đồng chưa hoàn thành − đã giao; không phải số cộng dồn.</w:t>
-      </w:r>
-    </w:p>
-    <w:p>
-      <w:pPr>
-        <w:pStyle w:val="ListParagraph"/>
-        <w:numPr>
-          <w:ilvl w:val="0"/>
-          <w:numId w:val="3"/>
-        </w:numPr>
-        <w:spacing w:after="80"/>
-      </w:pPr>
-      <w:r>
-        <w:t xml:space="preserve">Khối </w:t>
-      </w:r>
-      <w:r>
-        <w:rPr>
-          <w:b/>
-          <w:bCs/>
-        </w:rPr>
-        <w:t xml:space="preserve">Theo khách hàng</w:t>
-      </w:r>
-      <w:r>
-        <w:t xml:space="preserve"> bên dưới tách sản lượng và doanh thu theo từng khách.</w:t>
-      </w:r>
-    </w:p>
-    <w:p>
-      <w:pPr>
-        <w:pStyle w:val="ListParagraph"/>
-        <w:numPr>
-          <w:ilvl w:val="0"/>
-          <w:numId w:val="3"/>
-        </w:numPr>
-        <w:spacing w:after="80"/>
-      </w:pPr>
-      <w:r>
-        <w:rPr>
-          <w:b/>
-          <w:bCs/>
-        </w:rPr>
-        <w:t xml:space="preserve">Xuất Excel</w:t>
-      </w:r>
-      <w:r>
-        <w:t xml:space="preserve"> để lấy đúng bảng đang xem.</w:t>
-      </w:r>
-    </w:p>
-    <w:p>
-      <w:pPr>
-        <w:pStyle w:val="ListParagraph"/>
-        <w:numPr>
-          <w:ilvl w:val="0"/>
-          <w:numId w:val="3"/>
-        </w:numPr>
-        <w:spacing w:after="80"/>
-      </w:pPr>
-      <w:r>
-        <w:t xml:space="preserve">Doanh thu hiện “—” khi có lần giao bán ngoại tệ mà chưa nhập tỷ giá — bổ sung tỷ giá trên đợt giao để có số đầy đủ.</w:t>
+        <w:t xml:space="preserve">Chỉ chốt khi </w:t>
+      </w:r>
+      <w:r>
+        <w:rPr>
+          <w:b/>
+          <w:bCs/>
+        </w:rPr>
+        <w:t xml:space="preserve">thật sự kết thúc hợp đồng</w:t>
+      </w:r>
+      <w:r>
+        <w:t xml:space="preserve">. Còn giao tiếp thì để nguyên — chốt rồi hợp đồng bị khoá, không thêm/sửa đợt giao được nữa.</w:t>
+      </w:r>
+    </w:p>
+    <w:p>
+      <w:pPr>
+        <w:pStyle w:val="ListParagraph"/>
+        <w:numPr>
+          <w:ilvl w:val="0"/>
+          <w:numId w:val="3"/>
+        </w:numPr>
+        <w:spacing w:after="80"/>
+      </w:pPr>
+      <w:r>
+        <w:t xml:space="preserve">Bấm nhầm thì vào lại màn chi tiết bấm </w:t>
+      </w:r>
+      <w:r>
+        <w:rPr>
+          <w:b/>
+          <w:bCs/>
+        </w:rPr>
+        <w:t xml:space="preserve">Mở lại hợp đồng</w:t>
+      </w:r>
+      <w:r>
+        <w:t xml:space="preserve">, mọi số liệu trở về như cũ.</w:t>
+      </w:r>
+    </w:p>
+    <w:p>
+      <w:pPr>
+        <w:pStyle w:val="ListParagraph"/>
+        <w:numPr>
+          <w:ilvl w:val="0"/>
+          <w:numId w:val="3"/>
+        </w:numPr>
+        <w:spacing w:after="80"/>
+      </w:pPr>
+      <w:r>
+        <w:t xml:space="preserve">Nếu còn đợt </w:t>
+      </w:r>
+      <w:r>
+        <w:rPr>
+          <w:b/>
+          <w:bCs/>
+        </w:rPr>
+        <w:t xml:space="preserve">chưa điền ngày giao</w:t>
+      </w:r>
+      <w:r>
+        <w:t xml:space="preserve">, màn này báo bằng khung vàng — điền ngày giao trước, nếu không sản lượng đó sẽ không được tính vào tiêu thụ.</w:t>
       </w:r>
     </w:p>
     <w:p>
@@ -3810,7 +3820,7 @@
         <w:pageBreakBefore/>
       </w:pPr>
       <w:r>
-        <w:t xml:space="preserve">13. Nhu cầu thị trường</w:t>
+        <w:t xml:space="preserve">13. Báo cáo tiêu thụ</w:t>
       </w:r>
     </w:p>
     <w:p>
@@ -3825,7 +3835,7 @@
         <w:t xml:space="preserve">Vị trí: </w:t>
       </w:r>
       <w:r>
-        <w:t xml:space="preserve">Nhập liệu số liệu → Nhu cầu thị trường</w:t>
+        <w:t xml:space="preserve">Báo cáo → Tiêu thụ</w:t>
       </w:r>
     </w:p>
     <w:p>
@@ -3833,7 +3843,7 @@
         <w:spacing w:after="140"/>
       </w:pPr>
       <w:r>
-        <w:t xml:space="preserve">Ghi nhận nhu cầu và tín hiệu thị trường của đơn vị, nhập tự do bằng chữ theo ngày.</w:t>
+        <w:t xml:space="preserve">Bảng chỉ để xem — số do hệ thống tổng hợp từ các lần giao, đơn vị không nhập tay.</w:t>
       </w:r>
     </w:p>
     <w:p>
@@ -3846,7 +3856,7 @@
           <wp:inline distT="0" distB="0" distL="0" distR="0">
             <wp:extent cx="6191250" cy="3381375"/>
             <wp:effectExtent t="0" r="0" b="0" l="0"/>
-            <wp:docPr id="1" name="img" descr="Ảnh hướng dẫn có đánh số bước" title="img/12-nhu-cau-thi-truong.png"/>
+            <wp:docPr id="1" name="img" descr="Ảnh hướng dẫn có đánh số bước" title="img/11-bao-cao-tieu-thu.png"/>
             <wp:cNvGraphicFramePr>
               <a:graphicFrameLocks xmlns:a="http://schemas.openxmlformats.org/drawingml/2006/main" noChangeAspect="1"/>
             </wp:cNvGraphicFramePr>
@@ -3895,7 +3905,7 @@
           <w:sz w:val="17"/>
           <w:szCs w:val="17"/>
         </w:rPr>
-        <w:t xml:space="preserve">Hình 12. Nhu cầu thị trường theo ngày</w:t>
+        <w:t xml:space="preserve">Hình 11. Báo cáo tiêu thụ theo kỳ</w:t>
       </w:r>
     </w:p>
     <w:p>
@@ -3920,7 +3930,64 @@
         <w:spacing w:after="100"/>
       </w:pPr>
       <w:r>
-        <w:t xml:space="preserve">Chọn ngày rồi viết nội dung: khách hỏi mua gì, số lượng, mức giá chào, tình hình thương lượng.</w:t>
+        <w:rPr>
+          <w:b/>
+          <w:bCs/>
+        </w:rPr>
+        <w:t xml:space="preserve">Bộ lọc</w:t>
+      </w:r>
+      <w:r>
+        <w:t xml:space="preserve"> — Từ ngày / Đến ngày · Đơn vị · </w:t>
+      </w:r>
+      <w:r>
+        <w:rPr>
+          <w:b/>
+          <w:bCs/>
+        </w:rPr>
+        <w:t xml:space="preserve">Khách hàng</w:t>
+      </w:r>
+      <w:r>
+        <w:t xml:space="preserve"> (gõ để tìm, chọn nhiều) · </w:t>
+      </w:r>
+      <w:r>
+        <w:rPr>
+          <w:b/>
+          <w:bCs/>
+        </w:rPr>
+        <w:t xml:space="preserve">Chủng loại</w:t>
+      </w:r>
+      <w:r>
+        <w:t xml:space="preserve"> (chọn nhiều). Bảng, khối theo khách hàng và file Excel đều theo bộ lọc này.</w:t>
+      </w:r>
+    </w:p>
+    <w:p>
+      <w:pPr>
+        <w:pStyle w:val="ListParagraph"/>
+        <w:numPr>
+          <w:ilvl w:val="0"/>
+          <w:numId w:val="15"/>
+        </w:numPr>
+        <w:spacing w:after="100"/>
+      </w:pPr>
+      <w:r>
+        <w:rPr>
+          <w:b/>
+          <w:bCs/>
+        </w:rPr>
+        <w:t xml:space="preserve">Bảng tổng hợp</w:t>
+      </w:r>
+      <w:r>
+        <w:t xml:space="preserve"> — Lần giao · SL · Quy khô · Xuất khẩu · Trong nước · Nội bộ · Doanh thu · </w:t>
+      </w:r>
+      <w:r>
+        <w:rPr>
+          <w:b/>
+          <w:bCs/>
+        </w:rPr>
+        <w:t xml:space="preserve">Chưa giao</w:t>
+      </w:r>
+      <w:r>
+        <w:t xml:space="preserve">.</w:t>
       </w:r>
     </w:p>
     <w:p>
@@ -3945,17 +4012,116 @@
         <w:spacing w:after="80"/>
       </w:pPr>
       <w:r>
-        <w:t xml:space="preserve">Viết ngắn gọn nhưng có </w:t>
-      </w:r>
-      <w:r>
-        <w:rPr>
-          <w:b/>
-          <w:bCs/>
-        </w:rPr>
-        <w:t xml:space="preserve">con số cụ thể</w:t>
-      </w:r>
-      <w:r>
-        <w:t xml:space="preserve"> (chủng loại, sản lượng, mức giá) — Ban TTKD dùng thông tin này để đối chiếu với diễn biến giá sàn.</w:t>
+        <w:t xml:space="preserve">Cột </w:t>
+      </w:r>
+      <w:r>
+        <w:rPr>
+          <w:b/>
+          <w:bCs/>
+        </w:rPr>
+        <w:t xml:space="preserve">SL (tấn)</w:t>
+      </w:r>
+      <w:r>
+        <w:t xml:space="preserve"> là sản lượng tiêu thụ thực tế: latex và mủ nguyên liệu tính theo </w:t>
+      </w:r>
+      <w:r>
+        <w:rPr>
+          <w:b/>
+          <w:bCs/>
+        </w:rPr>
+        <w:t xml:space="preserve">quy khô</w:t>
+      </w:r>
+      <w:r>
+        <w:t xml:space="preserve">, các chủng loại thành phẩm tính theo chính số lượng bán.</w:t>
+      </w:r>
+    </w:p>
+    <w:p>
+      <w:pPr>
+        <w:pStyle w:val="ListParagraph"/>
+        <w:numPr>
+          <w:ilvl w:val="0"/>
+          <w:numId w:val="3"/>
+        </w:numPr>
+        <w:spacing w:after="80"/>
+      </w:pPr>
+      <w:r>
+        <w:t xml:space="preserve">Cột </w:t>
+      </w:r>
+      <w:r>
+        <w:rPr>
+          <w:b/>
+          <w:bCs/>
+        </w:rPr>
+        <w:t xml:space="preserve">Chưa giao</w:t>
+      </w:r>
+      <w:r>
+        <w:t xml:space="preserve"> là số </w:t>
+      </w:r>
+      <w:r>
+        <w:rPr>
+          <w:b/>
+          <w:bCs/>
+        </w:rPr>
+        <w:t xml:space="preserve">tại ngày cuối kỳ</w:t>
+      </w:r>
+      <w:r>
+        <w:t xml:space="preserve"> = sản lượng các hợp đồng chưa hoàn thành − đã giao; không phải số cộng dồn.</w:t>
+      </w:r>
+    </w:p>
+    <w:p>
+      <w:pPr>
+        <w:pStyle w:val="ListParagraph"/>
+        <w:numPr>
+          <w:ilvl w:val="0"/>
+          <w:numId w:val="3"/>
+        </w:numPr>
+        <w:spacing w:after="80"/>
+      </w:pPr>
+      <w:r>
+        <w:t xml:space="preserve">Khối </w:t>
+      </w:r>
+      <w:r>
+        <w:rPr>
+          <w:b/>
+          <w:bCs/>
+        </w:rPr>
+        <w:t xml:space="preserve">Theo khách hàng</w:t>
+      </w:r>
+      <w:r>
+        <w:t xml:space="preserve"> bên dưới tách sản lượng và doanh thu theo từng khách.</w:t>
+      </w:r>
+    </w:p>
+    <w:p>
+      <w:pPr>
+        <w:pStyle w:val="ListParagraph"/>
+        <w:numPr>
+          <w:ilvl w:val="0"/>
+          <w:numId w:val="3"/>
+        </w:numPr>
+        <w:spacing w:after="80"/>
+      </w:pPr>
+      <w:r>
+        <w:rPr>
+          <w:b/>
+          <w:bCs/>
+        </w:rPr>
+        <w:t xml:space="preserve">Xuất Excel</w:t>
+      </w:r>
+      <w:r>
+        <w:t xml:space="preserve"> để lấy đúng bảng đang xem.</w:t>
+      </w:r>
+    </w:p>
+    <w:p>
+      <w:pPr>
+        <w:pStyle w:val="ListParagraph"/>
+        <w:numPr>
+          <w:ilvl w:val="0"/>
+          <w:numId w:val="3"/>
+        </w:numPr>
+        <w:spacing w:after="80"/>
+      </w:pPr>
+      <w:r>
+        <w:t xml:space="preserve">Doanh thu hiện “—” khi có lần giao bán ngoại tệ mà chưa nhập tỷ giá — bổ sung tỷ giá trên đợt giao để có số đầy đủ.</w:t>
       </w:r>
     </w:p>
     <w:p>
@@ -3964,7 +4130,7 @@
         <w:pageBreakBefore/>
       </w:pPr>
       <w:r>
-        <w:t xml:space="preserve">14. Kế hoạch năm</w:t>
+        <w:t xml:space="preserve">14. Nhu cầu thị trường</w:t>
       </w:r>
     </w:p>
     <w:p>
@@ -3979,7 +4145,7 @@
         <w:t xml:space="preserve">Vị trí: </w:t>
       </w:r>
       <w:r>
-        <w:t xml:space="preserve">Nhập liệu số liệu → Kế hoạch năm</w:t>
+        <w:t xml:space="preserve">Nhập liệu số liệu → Nhu cầu thị trường</w:t>
       </w:r>
     </w:p>
     <w:p>
@@ -3987,7 +4153,7 @@
         <w:spacing w:after="140"/>
       </w:pPr>
       <w:r>
-        <w:t xml:space="preserve">Số liệu nhập một lần cho cả năm, cập nhật khi có điều chỉnh.</w:t>
+        <w:t xml:space="preserve">Ghi nhận nhu cầu và tín hiệu thị trường của đơn vị, nhập tự do bằng chữ theo ngày.</w:t>
       </w:r>
     </w:p>
     <w:p>
@@ -4000,7 +4166,7 @@
           <wp:inline distT="0" distB="0" distL="0" distR="0">
             <wp:extent cx="6191250" cy="3381375"/>
             <wp:effectExtent t="0" r="0" b="0" l="0"/>
-            <wp:docPr id="1" name="img" descr="Ảnh hướng dẫn có đánh số bước" title="img/13-ke-hoach-nam.png"/>
+            <wp:docPr id="1" name="img" descr="Ảnh hướng dẫn có đánh số bước" title="img/12-nhu-cau-thi-truong.png"/>
             <wp:cNvGraphicFramePr>
               <a:graphicFrameLocks xmlns:a="http://schemas.openxmlformats.org/drawingml/2006/main" noChangeAspect="1"/>
             </wp:cNvGraphicFramePr>
@@ -4049,7 +4215,7 @@
           <w:sz w:val="17"/>
           <w:szCs w:val="17"/>
         </w:rPr>
-        <w:t xml:space="preserve">Hình 13. Kế hoạch năm của đơn vị</w:t>
+        <w:t xml:space="preserve">Hình 12. Nhu cầu thị trường theo ngày</w:t>
       </w:r>
     </w:p>
     <w:p>
@@ -4074,74 +4240,7 @@
         <w:spacing w:after="100"/>
       </w:pPr>
       <w:r>
-        <w:rPr>
-          <w:b/>
-          <w:bCs/>
-        </w:rPr>
-        <w:t xml:space="preserve">Kế hoạch thu mua</w:t>
-      </w:r>
-      <w:r>
-        <w:t xml:space="preserve"> (tấn) — dùng để tính % hoàn thành kế hoạch trên báo cáo.</w:t>
-      </w:r>
-    </w:p>
-    <w:p>
-      <w:pPr>
-        <w:pStyle w:val="ListParagraph"/>
-        <w:numPr>
-          <w:ilvl w:val="0"/>
-          <w:numId w:val="16"/>
-        </w:numPr>
-        <w:spacing w:after="100"/>
-      </w:pPr>
-      <w:r>
-        <w:rPr>
-          <w:b/>
-          <w:bCs/>
-        </w:rPr>
-        <w:t xml:space="preserve">Kế hoạch tiêu thụ — HĐ chuyến</w:t>
-      </w:r>
-      <w:r>
-        <w:t xml:space="preserve"> (tấn) — chỉ tiêu tiêu thụ giao cho hợp đồng chuyến trong năm.</w:t>
-      </w:r>
-    </w:p>
-    <w:p>
-      <w:pPr>
-        <w:pStyle w:val="ListParagraph"/>
-        <w:numPr>
-          <w:ilvl w:val="0"/>
-          <w:numId w:val="16"/>
-        </w:numPr>
-        <w:spacing w:after="100"/>
-      </w:pPr>
-      <w:r>
-        <w:rPr>
-          <w:b/>
-          <w:bCs/>
-        </w:rPr>
-        <w:t xml:space="preserve">HĐ dài hạn đã ký</w:t>
-      </w:r>
-      <w:r>
-        <w:t xml:space="preserve"> (tấn) trong năm.</w:t>
-      </w:r>
-    </w:p>
-    <w:p>
-      <w:pPr>
-        <w:pStyle w:val="ListParagraph"/>
-        <w:numPr>
-          <w:ilvl w:val="0"/>
-          <w:numId w:val="16"/>
-        </w:numPr>
-        <w:spacing w:after="100"/>
-      </w:pPr>
-      <w:r>
-        <w:rPr>
-          <w:b/>
-          <w:bCs/>
-        </w:rPr>
-        <w:t xml:space="preserve">HĐ dài hạn / HĐ chuyến năm trước chuyển sang</w:t>
-      </w:r>
-      <w:r>
-        <w:t xml:space="preserve"> (tấn).</w:t>
+        <w:t xml:space="preserve">Chọn ngày rồi viết nội dung: khách hỏi mua gì, số lượng, mức giá chào, tình hình thương lượng.</w:t>
       </w:r>
     </w:p>
     <w:p>
@@ -4166,80 +4265,17 @@
         <w:spacing w:after="80"/>
       </w:pPr>
       <w:r>
-        <w:t xml:space="preserve">Ô </w:t>
-      </w:r>
-      <w:r>
-        <w:rPr>
-          <w:b/>
-          <w:bCs/>
-        </w:rPr>
-        <w:t xml:space="preserve">Kế hoạch thu mua</w:t>
-      </w:r>
-      <w:r>
-        <w:t xml:space="preserve"> chính là công tắc: có số </w:t>
-      </w:r>
-      <w:r>
-        <w:rPr>
-          <w:b/>
-          <w:bCs/>
-        </w:rPr>
-        <w:t xml:space="preserve">&gt; 0</w:t>
-      </w:r>
-      <w:r>
-        <w:t xml:space="preserve"> thì đơn vị mới thấy màn </w:t>
-      </w:r>
-      <w:r>
-        <w:rPr>
-          <w:b/>
-          <w:bCs/>
-        </w:rPr>
-        <w:t xml:space="preserve">Báo cáo thu mua</w:t>
-      </w:r>
-      <w:r>
-        <w:t xml:space="preserve">; để trống hoặc </w:t>
-      </w:r>
-      <w:r>
-        <w:rPr>
-          <w:b/>
-          <w:bCs/>
-        </w:rPr>
-        <w:t xml:space="preserve">0</w:t>
-      </w:r>
-      <w:r>
-        <w:t xml:space="preserve"> = đơn vị không tổ chức thu mua.</w:t>
-      </w:r>
-    </w:p>
-    <w:p>
-      <w:pPr>
-        <w:pStyle w:val="ListParagraph"/>
-        <w:numPr>
-          <w:ilvl w:val="0"/>
-          <w:numId w:val="3"/>
-        </w:numPr>
-        <w:spacing w:after="80"/>
-      </w:pPr>
-      <w:r>
-        <w:t xml:space="preserve">Ô </w:t>
-      </w:r>
-      <w:r>
-        <w:rPr>
-          <w:b/>
-          <w:bCs/>
-        </w:rPr>
-        <w:t xml:space="preserve">Kế hoạch tiêu thụ — HĐ chuyến</w:t>
-      </w:r>
-      <w:r>
-        <w:t xml:space="preserve"> dùng để đối chiếu </w:t>
-      </w:r>
-      <w:r>
-        <w:rPr>
-          <w:b/>
-          <w:bCs/>
-        </w:rPr>
-        <w:t xml:space="preserve">% thực hiện</w:t>
-      </w:r>
-      <w:r>
-        <w:t xml:space="preserve"> trên báo cáo kỳ; ô này KHÔNG bật/tắt màn nào.</w:t>
+        <w:t xml:space="preserve">Viết ngắn gọn nhưng có </w:t>
+      </w:r>
+      <w:r>
+        <w:rPr>
+          <w:b/>
+          <w:bCs/>
+        </w:rPr>
+        <w:t xml:space="preserve">con số cụ thể</w:t>
+      </w:r>
+      <w:r>
+        <w:t xml:space="preserve"> (chủng loại, sản lượng, mức giá) — Ban TTKD dùng thông tin này để đối chiếu với diễn biến giá sàn.</w:t>
       </w:r>
     </w:p>
     <w:p>
@@ -4248,7 +4284,7 @@
         <w:pageBreakBefore/>
       </w:pPr>
       <w:r>
-        <w:t xml:space="preserve">15. Hợp đồng cũ (trước 30/07)</w:t>
+        <w:t xml:space="preserve">15. Kế hoạch năm</w:t>
       </w:r>
     </w:p>
     <w:p>
@@ -4263,7 +4299,7 @@
         <w:t xml:space="preserve">Vị trí: </w:t>
       </w:r>
       <w:r>
-        <w:t xml:space="preserve">Báo cáo → Hợp đồng cũ (trước 30/07)</w:t>
+        <w:t xml:space="preserve">Nhập liệu số liệu → Kế hoạch năm</w:t>
       </w:r>
     </w:p>
     <w:p>
@@ -4271,7 +4307,7 @@
         <w:spacing w:after="140"/>
       </w:pPr>
       <w:r>
-        <w:t xml:space="preserve">Toàn bộ hợp đồng đã ký nhập theo cách cũ, kể cả hợp đồng đã giao. Màn này chỉ để tra cứu — không có nút sửa.</w:t>
+        <w:t xml:space="preserve">Số liệu nhập một lần cho cả năm, cập nhật khi có điều chỉnh.</w:t>
       </w:r>
     </w:p>
     <w:p>
@@ -4284,7 +4320,7 @@
           <wp:inline distT="0" distB="0" distL="0" distR="0">
             <wp:extent cx="6191250" cy="3381375"/>
             <wp:effectExtent t="0" r="0" b="0" l="0"/>
-            <wp:docPr id="1" name="img" descr="Ảnh hướng dẫn có đánh số bước" title="img/14-hop-dong-cu.png"/>
+            <wp:docPr id="1" name="img" descr="Ảnh hướng dẫn có đánh số bước" title="img/13-ke-hoach-nam.png"/>
             <wp:cNvGraphicFramePr>
               <a:graphicFrameLocks xmlns:a="http://schemas.openxmlformats.org/drawingml/2006/main" noChangeAspect="1"/>
             </wp:cNvGraphicFramePr>
@@ -4333,7 +4369,7 @@
           <w:sz w:val="17"/>
           <w:szCs w:val="17"/>
         </w:rPr>
-        <w:t xml:space="preserve">Hình 14. Tra cứu hợp đồng cũ</w:t>
+        <w:t xml:space="preserve">Hình 13. Kế hoạch năm của đơn vị</w:t>
       </w:r>
     </w:p>
     <w:p>
@@ -4358,7 +4394,74 @@
         <w:spacing w:after="100"/>
       </w:pPr>
       <w:r>
-        <w:t xml:space="preserve">Lọc theo khu vực, đơn vị, chủng loại, trạng thái giao và khoảng thời gian; tìm nhanh theo số HĐ.</w:t>
+        <w:rPr>
+          <w:b/>
+          <w:bCs/>
+        </w:rPr>
+        <w:t xml:space="preserve">Kế hoạch thu mua</w:t>
+      </w:r>
+      <w:r>
+        <w:t xml:space="preserve"> (tấn) — dùng để tính % hoàn thành kế hoạch trên báo cáo.</w:t>
+      </w:r>
+    </w:p>
+    <w:p>
+      <w:pPr>
+        <w:pStyle w:val="ListParagraph"/>
+        <w:numPr>
+          <w:ilvl w:val="0"/>
+          <w:numId w:val="17"/>
+        </w:numPr>
+        <w:spacing w:after="100"/>
+      </w:pPr>
+      <w:r>
+        <w:rPr>
+          <w:b/>
+          <w:bCs/>
+        </w:rPr>
+        <w:t xml:space="preserve">Kế hoạch tiêu thụ — HĐ chuyến</w:t>
+      </w:r>
+      <w:r>
+        <w:t xml:space="preserve"> (tấn) — chỉ tiêu tiêu thụ giao cho hợp đồng chuyến trong năm.</w:t>
+      </w:r>
+    </w:p>
+    <w:p>
+      <w:pPr>
+        <w:pStyle w:val="ListParagraph"/>
+        <w:numPr>
+          <w:ilvl w:val="0"/>
+          <w:numId w:val="17"/>
+        </w:numPr>
+        <w:spacing w:after="100"/>
+      </w:pPr>
+      <w:r>
+        <w:rPr>
+          <w:b/>
+          <w:bCs/>
+        </w:rPr>
+        <w:t xml:space="preserve">HĐ dài hạn đã ký</w:t>
+      </w:r>
+      <w:r>
+        <w:t xml:space="preserve"> (tấn) trong năm.</w:t>
+      </w:r>
+    </w:p>
+    <w:p>
+      <w:pPr>
+        <w:pStyle w:val="ListParagraph"/>
+        <w:numPr>
+          <w:ilvl w:val="0"/>
+          <w:numId w:val="17"/>
+        </w:numPr>
+        <w:spacing w:after="100"/>
+      </w:pPr>
+      <w:r>
+        <w:rPr>
+          <w:b/>
+          <w:bCs/>
+        </w:rPr>
+        <w:t xml:space="preserve">HĐ dài hạn / HĐ chuyến năm trước chuyển sang</w:t>
+      </w:r>
+      <w:r>
+        <w:t xml:space="preserve"> (tấn).</w:t>
       </w:r>
     </w:p>
     <w:p>
@@ -4383,30 +4486,80 @@
         <w:spacing w:after="80"/>
       </w:pPr>
       <w:r>
-        <w:t xml:space="preserve">Hợp đồng phát sinh từ 30/07 trở đi nằm ở mục </w:t>
-      </w:r>
-      <w:r>
-        <w:rPr>
-          <w:b/>
-          <w:bCs/>
-        </w:rPr>
-        <w:t xml:space="preserve">Hợp đồng &amp; đợt giao</w:t>
-      </w:r>
-      <w:r>
-        <w:t xml:space="preserve">, không nằm ở đây.</w:t>
-      </w:r>
-    </w:p>
-    <w:p>
-      <w:pPr>
-        <w:pStyle w:val="ListParagraph"/>
-        <w:numPr>
-          <w:ilvl w:val="0"/>
-          <w:numId w:val="3"/>
-        </w:numPr>
-        <w:spacing w:after="80"/>
-      </w:pPr>
-      <w:r>
-        <w:t xml:space="preserve">Cần sửa một hợp đồng cũ thì báo Ban TTKD.</w:t>
+        <w:t xml:space="preserve">Ô </w:t>
+      </w:r>
+      <w:r>
+        <w:rPr>
+          <w:b/>
+          <w:bCs/>
+        </w:rPr>
+        <w:t xml:space="preserve">Kế hoạch thu mua</w:t>
+      </w:r>
+      <w:r>
+        <w:t xml:space="preserve"> chính là công tắc: có số </w:t>
+      </w:r>
+      <w:r>
+        <w:rPr>
+          <w:b/>
+          <w:bCs/>
+        </w:rPr>
+        <w:t xml:space="preserve">&gt; 0</w:t>
+      </w:r>
+      <w:r>
+        <w:t xml:space="preserve"> thì đơn vị mới thấy màn </w:t>
+      </w:r>
+      <w:r>
+        <w:rPr>
+          <w:b/>
+          <w:bCs/>
+        </w:rPr>
+        <w:t xml:space="preserve">Báo cáo thu mua</w:t>
+      </w:r>
+      <w:r>
+        <w:t xml:space="preserve">; để trống hoặc </w:t>
+      </w:r>
+      <w:r>
+        <w:rPr>
+          <w:b/>
+          <w:bCs/>
+        </w:rPr>
+        <w:t xml:space="preserve">0</w:t>
+      </w:r>
+      <w:r>
+        <w:t xml:space="preserve"> = đơn vị không tổ chức thu mua.</w:t>
+      </w:r>
+    </w:p>
+    <w:p>
+      <w:pPr>
+        <w:pStyle w:val="ListParagraph"/>
+        <w:numPr>
+          <w:ilvl w:val="0"/>
+          <w:numId w:val="3"/>
+        </w:numPr>
+        <w:spacing w:after="80"/>
+      </w:pPr>
+      <w:r>
+        <w:t xml:space="preserve">Ô </w:t>
+      </w:r>
+      <w:r>
+        <w:rPr>
+          <w:b/>
+          <w:bCs/>
+        </w:rPr>
+        <w:t xml:space="preserve">Kế hoạch tiêu thụ — HĐ chuyến</w:t>
+      </w:r>
+      <w:r>
+        <w:t xml:space="preserve"> dùng để đối chiếu </w:t>
+      </w:r>
+      <w:r>
+        <w:rPr>
+          <w:b/>
+          <w:bCs/>
+        </w:rPr>
+        <w:t xml:space="preserve">% thực hiện</w:t>
+      </w:r>
+      <w:r>
+        <w:t xml:space="preserve"> trên báo cáo kỳ; ô này KHÔNG bật/tắt màn nào.</w:t>
       </w:r>
     </w:p>
     <w:p>
@@ -4415,7 +4568,174 @@
         <w:pageBreakBefore/>
       </w:pPr>
       <w:r>
-        <w:t xml:space="preserve">16. Những lỗi hay gặp</w:t>
+        <w:t xml:space="preserve">16. Hợp đồng cũ (trước 30/07)</w:t>
+      </w:r>
+    </w:p>
+    <w:p>
+      <w:pPr>
+        <w:spacing w:after="60"/>
+      </w:pPr>
+      <w:r>
+        <w:rPr>
+          <w:b/>
+          <w:bCs/>
+        </w:rPr>
+        <w:t xml:space="preserve">Vị trí: </w:t>
+      </w:r>
+      <w:r>
+        <w:t xml:space="preserve">Báo cáo → Hợp đồng cũ (trước 30/07)</w:t>
+      </w:r>
+    </w:p>
+    <w:p>
+      <w:pPr>
+        <w:spacing w:after="140"/>
+      </w:pPr>
+      <w:r>
+        <w:t xml:space="preserve">Toàn bộ hợp đồng đã ký nhập theo cách cũ, kể cả hợp đồng đã giao. Màn này chỉ để tra cứu — không có nút sửa.</w:t>
+      </w:r>
+    </w:p>
+    <w:p>
+      <w:pPr>
+        <w:spacing w:after="60" w:before="60"/>
+        <w:jc w:val="center"/>
+      </w:pPr>
+      <w:r>
+        <w:drawing>
+          <wp:inline distT="0" distB="0" distL="0" distR="0">
+            <wp:extent cx="6191250" cy="3381375"/>
+            <wp:effectExtent t="0" r="0" b="0" l="0"/>
+            <wp:docPr id="1" name="img" descr="Ảnh hướng dẫn có đánh số bước" title="img/14-hop-dong-cu.png"/>
+            <wp:cNvGraphicFramePr>
+              <a:graphicFrameLocks xmlns:a="http://schemas.openxmlformats.org/drawingml/2006/main" noChangeAspect="1"/>
+            </wp:cNvGraphicFramePr>
+            <a:graphic xmlns:a="http://schemas.openxmlformats.org/drawingml/2006/main">
+              <a:graphicData uri="http://schemas.openxmlformats.org/drawingml/2006/picture">
+                <pic:pic xmlns:pic="http://schemas.openxmlformats.org/drawingml/2006/picture">
+                  <pic:nvPicPr>
+                    <pic:cNvPr id="0" name="" descr=""/>
+                    <pic:cNvPicPr>
+                      <a:picLocks noChangeAspect="1" noChangeArrowheads="1"/>
+                    </pic:cNvPicPr>
+                  </pic:nvPicPr>
+                  <pic:blipFill>
+                    <a:blip r:embed="rId23" cstate="none"/>
+                    <a:srcRect/>
+                    <a:stretch>
+                      <a:fillRect/>
+                    </a:stretch>
+                  </pic:blipFill>
+                  <pic:spPr bwMode="auto">
+                    <a:xfrm>
+                      <a:off x="0" y="0"/>
+                      <a:ext cx="6191250" cy="3381375"/>
+                    </a:xfrm>
+                    <a:prstGeom prst="rect">
+                      <a:avLst/>
+                    </a:prstGeom>
+                  </pic:spPr>
+                </pic:pic>
+              </a:graphicData>
+            </a:graphic>
+          </wp:inline>
+        </w:drawing>
+      </w:r>
+    </w:p>
+    <w:p>
+      <w:pPr>
+        <w:spacing w:after="180"/>
+        <w:jc w:val="center"/>
+      </w:pPr>
+      <w:r>
+        <w:rPr>
+          <w:i/>
+          <w:iCs/>
+          <w:color w:val="888888"/>
+          <w:sz w:val="17"/>
+          <w:szCs w:val="17"/>
+        </w:rPr>
+        <w:t xml:space="preserve">Hình 14. Tra cứu hợp đồng cũ</w:t>
+      </w:r>
+    </w:p>
+    <w:p>
+      <w:pPr>
+        <w:spacing w:after="80"/>
+      </w:pPr>
+      <w:r>
+        <w:rPr>
+          <w:b/>
+          <w:bCs/>
+        </w:rPr>
+        <w:t xml:space="preserve">Các bước:</w:t>
+      </w:r>
+    </w:p>
+    <w:p>
+      <w:pPr>
+        <w:pStyle w:val="ListParagraph"/>
+        <w:numPr>
+          <w:ilvl w:val="0"/>
+          <w:numId w:val="18"/>
+        </w:numPr>
+        <w:spacing w:after="100"/>
+      </w:pPr>
+      <w:r>
+        <w:t xml:space="preserve">Lọc theo khu vực, đơn vị, chủng loại, trạng thái giao và khoảng thời gian; tìm nhanh theo số HĐ.</w:t>
+      </w:r>
+    </w:p>
+    <w:p>
+      <w:pPr>
+        <w:spacing w:after="80" w:before="140"/>
+      </w:pPr>
+      <w:r>
+        <w:rPr>
+          <w:b/>
+          <w:bCs/>
+        </w:rPr>
+        <w:t xml:space="preserve">Lưu ý:</w:t>
+      </w:r>
+    </w:p>
+    <w:p>
+      <w:pPr>
+        <w:pStyle w:val="ListParagraph"/>
+        <w:numPr>
+          <w:ilvl w:val="0"/>
+          <w:numId w:val="3"/>
+        </w:numPr>
+        <w:spacing w:after="80"/>
+      </w:pPr>
+      <w:r>
+        <w:t xml:space="preserve">Hợp đồng phát sinh từ 30/07 trở đi nằm ở mục </w:t>
+      </w:r>
+      <w:r>
+        <w:rPr>
+          <w:b/>
+          <w:bCs/>
+        </w:rPr>
+        <w:t xml:space="preserve">Hợp đồng &amp; đợt giao</w:t>
+      </w:r>
+      <w:r>
+        <w:t xml:space="preserve">, không nằm ở đây.</w:t>
+      </w:r>
+    </w:p>
+    <w:p>
+      <w:pPr>
+        <w:pStyle w:val="ListParagraph"/>
+        <w:numPr>
+          <w:ilvl w:val="0"/>
+          <w:numId w:val="3"/>
+        </w:numPr>
+        <w:spacing w:after="80"/>
+      </w:pPr>
+      <w:r>
+        <w:t xml:space="preserve">Cần sửa một hợp đồng cũ thì báo Ban TTKD.</w:t>
+      </w:r>
+    </w:p>
+    <w:p>
+      <w:pPr>
+        <w:pStyle w:val="Heading2"/>
+        <w:pageBreakBefore/>
+      </w:pPr>
+      <w:r>
+        <w:t xml:space="preserve">17. Những lỗi hay gặp</w:t>
       </w:r>
     </w:p>
     <w:p>
@@ -5095,6 +5415,18 @@
     <w:multiLevelType w:val="hybridMultilevel"/>
     <w:lvl w:ilvl="0" w15:tentative="1">
       <w:start w:val="1"/>
+      <w:numFmt w:val="decimal"/>
+      <w:lvlText w:val="%1."/>
+      <w:lvlJc w:val="left"/>
+      <w:pPr>
+        <w:ind w:left="620" w:hanging="360"/>
+      </w:pPr>
+    </w:lvl>
+  </w:abstractNum>
+  <w:abstractNum w:abstractNumId="19" w15:restartNumberingAfterBreak="0">
+    <w:multiLevelType w:val="hybridMultilevel"/>
+    <w:lvl w:ilvl="0" w15:tentative="1">
+      <w:start w:val="1"/>
       <w:numFmt w:val="bullet"/>
       <w:lvlText w:val="•"/>
       <w:lvlJc w:val="left"/>
@@ -5116,7 +5448,7 @@
     </w:lvlOverride>
   </w:num>
   <w:num w:numId="3">
-    <w:abstractNumId w:val="18"/>
+    <w:abstractNumId w:val="19"/>
     <w:lvlOverride w:ilvl="0">
       <w:startOverride w:val="1"/>
     </w:lvlOverride>
@@ -5201,6 +5533,12 @@
   </w:num>
   <w:num w:numId="17">
     <w:abstractNumId w:val="16"/>
+    <w:lvlOverride w:ilvl="0">
+      <w:startOverride w:val="1"/>
+    </w:lvlOverride>
+  </w:num>
+  <w:num w:numId="18">
+    <w:abstractNumId w:val="17"/>
     <w:lvlOverride w:ilvl="0">
       <w:startOverride w:val="1"/>
     </w:lvlOverride>

</xml_diff>

<commit_message>
feat(member): let admin set how far back the shortfall warning looks
Fourteen days is only a starting point — how far back a unit should be chased
depends on how the group runs, so the range is a config value (0 turns the
warning off entirely, negatives fall back to the default). The range may now
exceed the edit window, so days the unit can no longer fix are shown greyed out
and are not clickable rather than promising an edit that would be refused.
</commit_message>
<xml_diff>
--- a/docs/huong-dan/nhap-lieu-don-vi-thanh-vien/Huong-dan-nhap-lieu-don-vi-thanh-vien.docx
+++ b/docs/huong-dan/nhap-lieu-don-vi-thanh-vien/Huong-dan-nhap-lieu-don-vi-thanh-vien.docx
@@ -551,7 +551,7 @@
         <w:spacing w:after="140"/>
       </w:pPr>
       <w:r>
-        <w:t xml:space="preserve">Ngay khi đăng nhập, hệ thống tự đối chiếu số liệu đơn vị đã nộp và hiện một bảng nhắc ở đầu màn hình: còn thiếu biểu nào, ngày nào. Bảng chỉ liệt kê những ngày ĐANG CÒN SỬA ĐƯỢC — hết hạn đó thì ngày cũ chuyển sang chỉ xem, có muốn bổ sung cũng không được nữa.</w:t>
+        <w:t xml:space="preserve">Ngay khi đăng nhập, hệ thống tự đối chiếu số liệu đơn vị đã nộp và hiện một bảng nhắc ở đầu màn hình: còn thiếu biểu nào, ngày nào. Mặc định bảng rà lại 14 ngày gần nhất — quản trị viên đổi được số ngày này (30, 300… tuỳ yêu cầu quản lý).</w:t>
       </w:r>
     </w:p>
     <w:p>
@@ -740,14 +740,27 @@
         <w:spacing w:after="80"/>
       </w:pPr>
       <w:r>
-        <w:rPr>
-          <w:b/>
-          <w:bCs/>
-        </w:rPr>
-        <w:t xml:space="preserve">Bấm thẳng vào ngày</w:t>
-      </w:r>
-      <w:r>
-        <w:t xml:space="preserve"> (ô màu cam) là mở luôn phiếu nhập của đúng ngày đó — không phải tự đi tìm trong danh sách.</w:t>
+        <w:t xml:space="preserve">Ngày </w:t>
+      </w:r>
+      <w:r>
+        <w:rPr>
+          <w:b/>
+          <w:bCs/>
+        </w:rPr>
+        <w:t xml:space="preserve">màu cam</w:t>
+      </w:r>
+      <w:r>
+        <w:t xml:space="preserve"> bấm vào là mở luôn phiếu nhập của đúng ngày đó — không phải tự đi tìm trong danh sách. Ngày </w:t>
+      </w:r>
+      <w:r>
+        <w:rPr>
+          <w:b/>
+          <w:bCs/>
+        </w:rPr>
+        <w:t xml:space="preserve">màu xám</w:t>
+      </w:r>
+      <w:r>
+        <w:t xml:space="preserve"> là đã quá hạn sửa: đơn vị không tự nhập được nữa, phải báo Ban TTKD nhập hộ.</w:t>
       </w:r>
     </w:p>
     <w:p>

</xml_diff>

<commit_message>
fix(member): open the yearly plan to every unit, factory or not
The screen was hidden unless the unit already had a purchase-plan figure — but
that figure is entered on this very screen, so a unit that had never filed one
could never reach it. Thirty-two units on production are stuck in exactly that
loop. The backend has allowed every assigned unit since August; only the menu
and the route still gated it. Having a factory was never part of the rule.
</commit_message>
<xml_diff>
--- a/docs/huong-dan/nhap-lieu-don-vi-thanh-vien/Huong-dan-nhap-lieu-don-vi-thanh-vien.docx
+++ b/docs/huong-dan/nhap-lieu-don-vi-thanh-vien/Huong-dan-nhap-lieu-don-vi-thanh-vien.docx
@@ -506,7 +506,17 @@
         <w:t xml:space="preserve">không được giao kế hoạch thu mua</w:t>
       </w:r>
       <w:r>
-        <w:t xml:space="preserve"> sẽ không thấy mục “Thu mua” và “Kế hoạch năm”.</w:t>
+        <w:t xml:space="preserve"> sẽ không thấy mục “Thu mua”. Mục </w:t>
+      </w:r>
+      <w:r>
+        <w:rPr>
+          <w:b/>
+          <w:bCs/>
+        </w:rPr>
+        <w:t xml:space="preserve">Kế hoạch năm luôn hiện</w:t>
+      </w:r>
+      <w:r>
+        <w:t xml:space="preserve"> cho mọi đơn vị — chính số khai ở đó mới bật màn Thu mua.</w:t>
       </w:r>
     </w:p>
     <w:p>

</xml_diff>